<commit_message>
1. Refactored the template_generation into a class. 2. Update main.py to use the new class.
</commit_message>
<xml_diff>
--- a/res/template_new.docx
+++ b/res/template_new.docx
@@ -2,6 +2,255 @@
 <file path=word/document.xml><?xml version="1.0" encoding="utf-8"?>
 <w:document xmlns:wpc="http://schemas.microsoft.com/office/word/2010/wordprocessingCanvas" xmlns:cx="http://schemas.microsoft.com/office/drawing/2014/chartex" xmlns:cx1="http://schemas.microsoft.com/office/drawing/2015/9/8/chartex" xmlns:cx2="http://schemas.microsoft.com/office/drawing/2015/10/21/chartex" xmlns:cx3="http://schemas.microsoft.com/office/drawing/2016/5/9/chartex" xmlns:cx4="http://schemas.microsoft.com/office/drawing/2016/5/10/chartex" xmlns:cx5="http://schemas.microsoft.com/office/drawing/2016/5/11/chartex" xmlns:cx6="http://schemas.microsoft.com/office/drawing/2016/5/12/chartex" xmlns:cx7="http://schemas.microsoft.com/office/drawing/2016/5/13/chartex" xmlns:cx8="http://schemas.microsoft.com/office/drawing/2016/5/14/chartex" xmlns:mc="http://schemas.openxmlformats.org/markup-compatibility/2006" xmlns:aink="http://schemas.microsoft.com/office/drawing/2016/ink" xmlns:am3d="http://schemas.microsoft.com/office/drawing/2017/model3d" xmlns:o="urn:schemas-microsoft-com:office:office" xmlns:oel="http://schemas.microsoft.com/office/2019/extlst" xmlns:r="http://schemas.openxmlformats.org/officeDocument/2006/relationships" xmlns:m="http://schemas.openxmlformats.org/officeDocument/2006/math" xmlns:v="urn:schemas-microsoft-com:vml" xmlns:wp14="http://schemas.microsoft.com/office/word/2010/wordprocessingDrawing" xmlns:wp="http://schemas.openxmlformats.org/drawingml/2006/wordprocessingDrawing" xmlns:w10="urn:schemas-microsoft-com:office:word" xmlns:w="http://schemas.openxmlformats.org/wordprocessingml/2006/main" xmlns:w14="http://schemas.microsoft.com/office/word/2010/wordml" xmlns:w15="http://schemas.microsoft.com/office/word/2012/wordml" xmlns:w16cex="http://schemas.microsoft.com/office/word/2018/wordml/cex" xmlns:w16cid="http://schemas.microsoft.com/office/word/2016/wordml/cid" xmlns:w16="http://schemas.microsoft.com/office/word/2018/wordml" xmlns:w16du="http://schemas.microsoft.com/office/word/2023/wordml/word16du" xmlns:w16sdtdh="http://schemas.microsoft.com/office/word/2020/wordml/sdtdatahash" xmlns:w16sdtfl="http://schemas.microsoft.com/office/word/2024/wordml/sdtformatlock" xmlns:w16se="http://schemas.microsoft.com/office/word/2015/wordml/symex" xmlns:wpg="http://schemas.microsoft.com/office/word/2010/wordprocessingGroup" xmlns:wpi="http://schemas.microsoft.com/office/word/2010/wordprocessingInk" xmlns:wne="http://schemas.microsoft.com/office/word/2006/wordml" xmlns:wps="http://schemas.microsoft.com/office/word/2010/wordprocessingShape" mc:Ignorable="w14 w15 w16se w16cid w16 w16cex w16sdtdh w16sdtfl w16du wp14">
   <w:body>
+    <w:p>
+      <w:pPr>
+        <w:jc w:val="center"/>
+        <w:rPr>
+          <w:rFonts w:hint="eastAsia"/>
+          <w:b/>
+          <w:bCs/>
+          <w:sz w:val="40"/>
+          <w:szCs w:val="40"/>
+          <w:u w:val="single"/>
+        </w:rPr>
+      </w:pPr>
+      <w:r>
+        <w:rPr>
+          <w:rFonts w:hint="eastAsia"/>
+          <w:b/>
+          <w:bCs/>
+          <w:sz w:val="40"/>
+          <w:szCs w:val="40"/>
+          <w:u w:val="single"/>
+        </w:rPr>
+        <w:t>Curation log</w:t>
+      </w:r>
+    </w:p>
+    <w:p>
+      <w:pPr>
+        <w:rPr>
+          <w:rFonts w:hint="eastAsia"/>
+        </w:rPr>
+      </w:pPr>
+      <w:r>
+        <w:rPr>
+          <w:rFonts w:hint="eastAsia"/>
+        </w:rPr>
+        <w:t xml:space="preserve">Ticket number: </w:t>
+      </w:r>
+      <w:proofErr w:type="gramStart"/>
+      <w:r>
+        <w:rPr>
+          <w:rFonts w:hint="eastAsia"/>
+        </w:rPr>
+        <w:t>{ curator</w:t>
+      </w:r>
+      <w:proofErr w:type="gramEnd"/>
+      <w:r>
+        <w:rPr>
+          <w:rFonts w:hint="eastAsia"/>
+        </w:rPr>
+        <w:t>_info.</w:t>
+      </w:r>
+      <w:r>
+        <w:rPr>
+          <w:rFonts w:hint="eastAsia"/>
+        </w:rPr>
+        <w:t>ticket_no</w:t>
+      </w:r>
+      <w:r>
+        <w:rPr>
+          <w:rFonts w:hint="eastAsia"/>
+        </w:rPr>
+        <w:t xml:space="preserve"> }</w:t>
+      </w:r>
+    </w:p>
+    <w:p>
+      <w:r>
+        <w:rPr>
+          <w:rFonts w:hint="eastAsia"/>
+        </w:rPr>
+        <w:t xml:space="preserve">Curator Name: </w:t>
+      </w:r>
+      <w:proofErr w:type="gramStart"/>
+      <w:r>
+        <w:rPr>
+          <w:rFonts w:hint="eastAsia"/>
+        </w:rPr>
+        <w:t>{ curator_info.name</w:t>
+      </w:r>
+      <w:proofErr w:type="gramEnd"/>
+      <w:r>
+        <w:rPr>
+          <w:rFonts w:hint="eastAsia"/>
+        </w:rPr>
+        <w:t xml:space="preserve"> }</w:t>
+      </w:r>
+    </w:p>
+    <w:p>
+      <w:r>
+        <w:rPr>
+          <w:rFonts w:hint="eastAsia"/>
+        </w:rPr>
+        <w:t xml:space="preserve">Curator </w:t>
+      </w:r>
+      <w:r>
+        <w:rPr>
+          <w:rFonts w:hint="eastAsia"/>
+        </w:rPr>
+        <w:t xml:space="preserve">Contact: </w:t>
+      </w:r>
+      <w:proofErr w:type="gramStart"/>
+      <w:r>
+        <w:rPr>
+          <w:rFonts w:hint="eastAsia"/>
+        </w:rPr>
+        <w:t>{ curator</w:t>
+      </w:r>
+      <w:proofErr w:type="gramEnd"/>
+      <w:r>
+        <w:rPr>
+          <w:rFonts w:hint="eastAsia"/>
+        </w:rPr>
+        <w:t>_</w:t>
+      </w:r>
+      <w:r>
+        <w:rPr>
+          <w:rFonts w:hint="eastAsia"/>
+        </w:rPr>
+        <w:t>info</w:t>
+      </w:r>
+      <w:r>
+        <w:rPr>
+          <w:rFonts w:hint="eastAsia"/>
+        </w:rPr>
+        <w:t xml:space="preserve">.email </w:t>
+      </w:r>
+      <w:r>
+        <w:t>}</w:t>
+      </w:r>
+    </w:p>
+    <w:p>
+      <w:r>
+        <w:rPr>
+          <w:rFonts w:hint="eastAsia"/>
+        </w:rPr>
+        <w:t xml:space="preserve">Dataset title: </w:t>
+      </w:r>
+      <w:proofErr w:type="gramStart"/>
+      <w:r>
+        <w:rPr>
+          <w:rFonts w:hint="eastAsia"/>
+        </w:rPr>
+        <w:t>( dataset</w:t>
+      </w:r>
+      <w:proofErr w:type="gramEnd"/>
+      <w:r>
+        <w:rPr>
+          <w:rFonts w:hint="eastAsia"/>
+        </w:rPr>
+        <w:t xml:space="preserve">.title  </w:t>
+      </w:r>
+      <w:r>
+        <w:t>)</w:t>
+      </w:r>
+    </w:p>
+    <w:p>
+      <w:r>
+        <w:rPr>
+          <w:rFonts w:hint="eastAsia"/>
+        </w:rPr>
+        <w:t xml:space="preserve">Dataset doi: </w:t>
+      </w:r>
+      <w:proofErr w:type="gramStart"/>
+      <w:r>
+        <w:rPr>
+          <w:rFonts w:hint="eastAsia"/>
+        </w:rPr>
+        <w:t xml:space="preserve">{ </w:t>
+      </w:r>
+      <w:r>
+        <w:rPr>
+          <w:rFonts w:hint="eastAsia"/>
+        </w:rPr>
+        <w:t>dataset.doi</w:t>
+      </w:r>
+      <w:proofErr w:type="gramEnd"/>
+      <w:r>
+        <w:rPr>
+          <w:rFonts w:hint="eastAsia"/>
+        </w:rPr>
+        <w:t xml:space="preserve">  }</w:t>
+      </w:r>
+    </w:p>
+    <w:p>
+      <w:r>
+        <w:rPr>
+          <w:rFonts w:hint="eastAsia"/>
+        </w:rPr>
+        <w:t xml:space="preserve">Dataset access URL: </w:t>
+      </w:r>
+      <w:proofErr w:type="gramStart"/>
+      <w:r>
+        <w:rPr>
+          <w:rFonts w:hint="eastAsia"/>
+        </w:rPr>
+        <w:t>{ dataset.url</w:t>
+      </w:r>
+      <w:proofErr w:type="gramEnd"/>
+      <w:r>
+        <w:rPr>
+          <w:rFonts w:hint="eastAsia"/>
+        </w:rPr>
+        <w:t xml:space="preserve"> }</w:t>
+      </w:r>
+    </w:p>
+    <w:p>
+      <w:pPr>
+        <w:rPr>
+          <w:rFonts w:hint="eastAsia"/>
+        </w:rPr>
+      </w:pPr>
+      <w:r>
+        <w:rPr>
+          <w:rFonts w:hint="eastAsia"/>
+        </w:rPr>
+        <w:t xml:space="preserve">Log generated date: </w:t>
+      </w:r>
+      <w:proofErr w:type="gramStart"/>
+      <w:r>
+        <w:rPr>
+          <w:rFonts w:hint="eastAsia"/>
+        </w:rPr>
+        <w:t>{</w:t>
+      </w:r>
+      <w:r>
+        <w:rPr>
+          <w:rFonts w:hint="eastAsia"/>
+        </w:rPr>
+        <w:t xml:space="preserve"> </w:t>
+      </w:r>
+      <w:r>
+        <w:rPr>
+          <w:rFonts w:hint="eastAsia"/>
+        </w:rPr>
+        <w:t>date</w:t>
+      </w:r>
+      <w:proofErr w:type="gramEnd"/>
+      <w:r>
+        <w:rPr>
+          <w:rFonts w:hint="eastAsia"/>
+        </w:rPr>
+        <w:t>.</w:t>
+      </w:r>
+      <w:r>
+        <w:rPr>
+          <w:rFonts w:hint="eastAsia"/>
+        </w:rPr>
+        <w:t>date }</w:t>
+      </w:r>
+    </w:p>
+    <w:p/>
     <w:tbl>
       <w:tblPr>
         <w:tblW w:w="0" w:type="auto"/>
@@ -14,17 +263,17 @@
         <w:tblLook w:val="04A0" w:firstRow="1" w:lastRow="0" w:firstColumn="1" w:lastColumn="0" w:noHBand="0" w:noVBand="1"/>
       </w:tblPr>
       <w:tblGrid>
-        <w:gridCol w:w="624"/>
-        <w:gridCol w:w="5786"/>
-        <w:gridCol w:w="6806"/>
-        <w:gridCol w:w="725"/>
-        <w:gridCol w:w="486"/>
-        <w:gridCol w:w="721"/>
-        <w:gridCol w:w="491"/>
-        <w:gridCol w:w="496"/>
-        <w:gridCol w:w="3538"/>
-        <w:gridCol w:w="1422"/>
-        <w:gridCol w:w="1256"/>
+        <w:gridCol w:w="603"/>
+        <w:gridCol w:w="1689"/>
+        <w:gridCol w:w="2275"/>
+        <w:gridCol w:w="4883"/>
+        <w:gridCol w:w="472"/>
+        <w:gridCol w:w="4883"/>
+        <w:gridCol w:w="477"/>
+        <w:gridCol w:w="482"/>
+        <w:gridCol w:w="4260"/>
+        <w:gridCol w:w="1363"/>
+        <w:gridCol w:w="964"/>
       </w:tblGrid>
       <w:tr>
         <w:trPr>
@@ -692,25 +941,7 @@
                 <w:bCs/>
                 <w:lang w:val="en-US"/>
               </w:rPr>
-              <w:t xml:space="preserve">Has the depositor (or their research group) previously created or submitted to a </w:t>
-            </w:r>
-            <w:proofErr w:type="spellStart"/>
-            <w:r>
-              <w:rPr>
-                <w:b/>
-                <w:bCs/>
-                <w:lang w:val="en-US"/>
-              </w:rPr>
-              <w:t>dataverse</w:t>
-            </w:r>
-            <w:proofErr w:type="spellEnd"/>
-            <w:r>
-              <w:rPr>
-                <w:b/>
-                <w:bCs/>
-                <w:lang w:val="en-US"/>
-              </w:rPr>
-              <w:t>?</w:t>
+              <w:t>Has the depositor (or their research group) previously created or submitted to a dataverse?</w:t>
             </w:r>
           </w:p>
         </w:tc>
@@ -765,159 +996,139 @@
           <w:p>
             <w:pPr>
               <w:rPr>
-                <w:sz w:val="2"/>
-                <w:szCs w:val="2"/>
-                <w:lang w:val="en-US"/>
-              </w:rPr>
-            </w:pPr>
-          </w:p>
-        </w:tc>
-        <w:tc>
-          <w:tcPr>
-            <w:tcW w:w="0" w:type="auto"/>
-            <w:tcBorders>
-              <w:top w:val="single" w:sz="8" w:space="0" w:color="000000"/>
-              <w:left w:val="single" w:sz="8" w:space="0" w:color="000000"/>
-              <w:bottom w:val="single" w:sz="8" w:space="0" w:color="000000"/>
-              <w:right w:val="single" w:sz="8" w:space="0" w:color="000000"/>
-            </w:tcBorders>
-            <w:tcMar>
-              <w:top w:w="100" w:type="dxa"/>
-              <w:left w:w="100" w:type="dxa"/>
-              <w:bottom w:w="100" w:type="dxa"/>
-              <w:right w:w="100" w:type="dxa"/>
-            </w:tcMar>
-            <w:hideMark/>
-          </w:tcPr>
-          <w:p>
-            <w:pPr>
-              <w:rPr>
-                <w:sz w:val="2"/>
-                <w:szCs w:val="2"/>
-                <w:lang w:val="en-US"/>
-              </w:rPr>
-            </w:pPr>
-          </w:p>
-        </w:tc>
-        <w:tc>
-          <w:tcPr>
-            <w:tcW w:w="0" w:type="auto"/>
-            <w:tcBorders>
-              <w:top w:val="single" w:sz="8" w:space="0" w:color="000000"/>
-              <w:left w:val="single" w:sz="8" w:space="0" w:color="000000"/>
-              <w:bottom w:val="single" w:sz="8" w:space="0" w:color="000000"/>
-              <w:right w:val="single" w:sz="8" w:space="0" w:color="000000"/>
-            </w:tcBorders>
-            <w:tcMar>
-              <w:top w:w="100" w:type="dxa"/>
-              <w:left w:w="100" w:type="dxa"/>
-              <w:bottom w:w="100" w:type="dxa"/>
-              <w:right w:w="100" w:type="dxa"/>
-            </w:tcMar>
-            <w:hideMark/>
-          </w:tcPr>
-          <w:p>
-            <w:pPr>
-              <w:rPr>
-                <w:sz w:val="2"/>
-                <w:szCs w:val="2"/>
-                <w:lang w:val="en-US"/>
-              </w:rPr>
-            </w:pPr>
-          </w:p>
-        </w:tc>
-        <w:tc>
-          <w:tcPr>
-            <w:tcW w:w="0" w:type="auto"/>
-            <w:tcBorders>
-              <w:top w:val="single" w:sz="8" w:space="0" w:color="000000"/>
-              <w:left w:val="single" w:sz="8" w:space="0" w:color="000000"/>
-              <w:bottom w:val="single" w:sz="8" w:space="0" w:color="000000"/>
-              <w:right w:val="single" w:sz="8" w:space="0" w:color="000000"/>
-            </w:tcBorders>
-            <w:tcMar>
-              <w:top w:w="100" w:type="dxa"/>
-              <w:left w:w="100" w:type="dxa"/>
-              <w:bottom w:w="100" w:type="dxa"/>
-              <w:right w:w="100" w:type="dxa"/>
-            </w:tcMar>
-            <w:hideMark/>
-          </w:tcPr>
-          <w:p>
-            <w:pPr>
-              <w:rPr>
-                <w:lang w:val="en-US"/>
-              </w:rPr>
-            </w:pPr>
-          </w:p>
-        </w:tc>
-        <w:tc>
-          <w:tcPr>
-            <w:tcW w:w="0" w:type="auto"/>
-            <w:tcBorders>
-              <w:top w:val="single" w:sz="8" w:space="0" w:color="000000"/>
-              <w:left w:val="single" w:sz="8" w:space="0" w:color="000000"/>
-              <w:bottom w:val="single" w:sz="8" w:space="0" w:color="000000"/>
-              <w:right w:val="single" w:sz="8" w:space="0" w:color="000000"/>
-            </w:tcBorders>
-            <w:tcMar>
-              <w:top w:w="100" w:type="dxa"/>
-              <w:left w:w="100" w:type="dxa"/>
-              <w:bottom w:w="100" w:type="dxa"/>
-              <w:right w:w="100" w:type="dxa"/>
-            </w:tcMar>
-            <w:hideMark/>
-          </w:tcPr>
-          <w:p>
-            <w:pPr>
-              <w:rPr>
-                <w:lang w:val="en-US"/>
-              </w:rPr>
-            </w:pPr>
-          </w:p>
-        </w:tc>
-        <w:tc>
-          <w:tcPr>
-            <w:tcW w:w="0" w:type="auto"/>
-            <w:tcBorders>
-              <w:top w:val="single" w:sz="8" w:space="0" w:color="000000"/>
-              <w:left w:val="single" w:sz="8" w:space="0" w:color="000000"/>
-              <w:bottom w:val="single" w:sz="8" w:space="0" w:color="000000"/>
-              <w:right w:val="single" w:sz="8" w:space="0" w:color="000000"/>
-            </w:tcBorders>
-            <w:tcMar>
-              <w:top w:w="100" w:type="dxa"/>
-              <w:left w:w="100" w:type="dxa"/>
-              <w:bottom w:w="100" w:type="dxa"/>
-              <w:right w:w="100" w:type="dxa"/>
-            </w:tcMar>
-            <w:hideMark/>
-          </w:tcPr>
-          <w:p>
-            <w:pPr>
-              <w:rPr>
-                <w:lang w:val="en-US"/>
-              </w:rPr>
-            </w:pPr>
-            <w:r>
-              <w:rPr>
-                <w:lang w:val="en-US"/>
-              </w:rPr>
-              <w:t xml:space="preserve">If relevant, list previously created </w:t>
-            </w:r>
-            <w:proofErr w:type="spellStart"/>
-            <w:r>
-              <w:rPr>
-                <w:lang w:val="en-US"/>
-              </w:rPr>
-              <w:t>dataverse</w:t>
-            </w:r>
-            <w:proofErr w:type="spellEnd"/>
-            <w:r>
-              <w:rPr>
-                <w:lang w:val="en-US"/>
-              </w:rPr>
-              <w:t>:</w:t>
+                <w:lang w:val="en-US"/>
+              </w:rPr>
+            </w:pPr>
+          </w:p>
+        </w:tc>
+        <w:tc>
+          <w:tcPr>
+            <w:tcW w:w="0" w:type="auto"/>
+            <w:tcBorders>
+              <w:top w:val="single" w:sz="8" w:space="0" w:color="000000"/>
+              <w:left w:val="single" w:sz="8" w:space="0" w:color="000000"/>
+              <w:bottom w:val="single" w:sz="8" w:space="0" w:color="000000"/>
+              <w:right w:val="single" w:sz="8" w:space="0" w:color="000000"/>
+            </w:tcBorders>
+            <w:tcMar>
+              <w:top w:w="100" w:type="dxa"/>
+              <w:left w:w="100" w:type="dxa"/>
+              <w:bottom w:w="100" w:type="dxa"/>
+              <w:right w:w="100" w:type="dxa"/>
+            </w:tcMar>
+            <w:hideMark/>
+          </w:tcPr>
+          <w:p>
+            <w:pPr>
+              <w:rPr>
+                <w:lang w:val="en-US"/>
+              </w:rPr>
+            </w:pPr>
+          </w:p>
+        </w:tc>
+        <w:tc>
+          <w:tcPr>
+            <w:tcW w:w="0" w:type="auto"/>
+            <w:tcBorders>
+              <w:top w:val="single" w:sz="8" w:space="0" w:color="000000"/>
+              <w:left w:val="single" w:sz="8" w:space="0" w:color="000000"/>
+              <w:bottom w:val="single" w:sz="8" w:space="0" w:color="000000"/>
+              <w:right w:val="single" w:sz="8" w:space="0" w:color="000000"/>
+            </w:tcBorders>
+            <w:tcMar>
+              <w:top w:w="100" w:type="dxa"/>
+              <w:left w:w="100" w:type="dxa"/>
+              <w:bottom w:w="100" w:type="dxa"/>
+              <w:right w:w="100" w:type="dxa"/>
+            </w:tcMar>
+            <w:hideMark/>
+          </w:tcPr>
+          <w:p>
+            <w:pPr>
+              <w:rPr>
+                <w:lang w:val="en-US"/>
+              </w:rPr>
+            </w:pPr>
+          </w:p>
+        </w:tc>
+        <w:tc>
+          <w:tcPr>
+            <w:tcW w:w="0" w:type="auto"/>
+            <w:tcBorders>
+              <w:top w:val="single" w:sz="8" w:space="0" w:color="000000"/>
+              <w:left w:val="single" w:sz="8" w:space="0" w:color="000000"/>
+              <w:bottom w:val="single" w:sz="8" w:space="0" w:color="000000"/>
+              <w:right w:val="single" w:sz="8" w:space="0" w:color="000000"/>
+            </w:tcBorders>
+            <w:tcMar>
+              <w:top w:w="100" w:type="dxa"/>
+              <w:left w:w="100" w:type="dxa"/>
+              <w:bottom w:w="100" w:type="dxa"/>
+              <w:right w:w="100" w:type="dxa"/>
+            </w:tcMar>
+            <w:hideMark/>
+          </w:tcPr>
+          <w:p>
+            <w:pPr>
+              <w:rPr>
+                <w:lang w:val="en-US"/>
+              </w:rPr>
+            </w:pPr>
+          </w:p>
+        </w:tc>
+        <w:tc>
+          <w:tcPr>
+            <w:tcW w:w="0" w:type="auto"/>
+            <w:tcBorders>
+              <w:top w:val="single" w:sz="8" w:space="0" w:color="000000"/>
+              <w:left w:val="single" w:sz="8" w:space="0" w:color="000000"/>
+              <w:bottom w:val="single" w:sz="8" w:space="0" w:color="000000"/>
+              <w:right w:val="single" w:sz="8" w:space="0" w:color="000000"/>
+            </w:tcBorders>
+            <w:tcMar>
+              <w:top w:w="100" w:type="dxa"/>
+              <w:left w:w="100" w:type="dxa"/>
+              <w:bottom w:w="100" w:type="dxa"/>
+              <w:right w:w="100" w:type="dxa"/>
+            </w:tcMar>
+            <w:hideMark/>
+          </w:tcPr>
+          <w:p>
+            <w:pPr>
+              <w:rPr>
+                <w:lang w:val="en-US"/>
+              </w:rPr>
+            </w:pPr>
+          </w:p>
+        </w:tc>
+        <w:tc>
+          <w:tcPr>
+            <w:tcW w:w="0" w:type="auto"/>
+            <w:tcBorders>
+              <w:top w:val="single" w:sz="8" w:space="0" w:color="000000"/>
+              <w:left w:val="single" w:sz="8" w:space="0" w:color="000000"/>
+              <w:bottom w:val="single" w:sz="8" w:space="0" w:color="000000"/>
+              <w:right w:val="single" w:sz="8" w:space="0" w:color="000000"/>
+            </w:tcBorders>
+            <w:tcMar>
+              <w:top w:w="100" w:type="dxa"/>
+              <w:left w:w="100" w:type="dxa"/>
+              <w:bottom w:w="100" w:type="dxa"/>
+              <w:right w:w="100" w:type="dxa"/>
+            </w:tcMar>
+            <w:hideMark/>
+          </w:tcPr>
+          <w:p>
+            <w:pPr>
+              <w:rPr>
+                <w:lang w:val="en-US"/>
+              </w:rPr>
+            </w:pPr>
+            <w:r>
+              <w:rPr>
+                <w:lang w:val="en-US"/>
+              </w:rPr>
+              <w:t>If relevant, list previously created dataverse:</w:t>
             </w:r>
           </w:p>
         </w:tc>
@@ -1108,328 +1319,210 @@
               <w:rPr>
                 <w:lang w:val="en-US"/>
               </w:rPr>
-              <w:t>If the dataset is deposited in a sub-</w:t>
-            </w:r>
-            <w:proofErr w:type="spellStart"/>
-            <w:r>
-              <w:rPr>
-                <w:lang w:val="en-US"/>
-              </w:rPr>
-              <w:t>dataverse</w:t>
-            </w:r>
-            <w:proofErr w:type="spellEnd"/>
-            <w:r>
-              <w:rPr>
-                <w:lang w:val="en-US"/>
-              </w:rPr>
-              <w:t xml:space="preserve"> collection, include the name of the collection. </w:t>
-            </w:r>
-          </w:p>
-          <w:p>
-            <w:pPr>
-              <w:rPr>
-                <w:lang w:val="en-US"/>
-              </w:rPr>
-            </w:pPr>
-          </w:p>
-        </w:tc>
-        <w:tc>
-          <w:tcPr>
-            <w:tcW w:w="0" w:type="auto"/>
-            <w:tcBorders>
-              <w:top w:val="single" w:sz="8" w:space="0" w:color="000000"/>
-              <w:left w:val="single" w:sz="8" w:space="0" w:color="000000"/>
-              <w:bottom w:val="single" w:sz="8" w:space="0" w:color="000000"/>
-              <w:right w:val="single" w:sz="8" w:space="0" w:color="000000"/>
-            </w:tcBorders>
-            <w:tcMar>
-              <w:top w:w="100" w:type="dxa"/>
-              <w:left w:w="100" w:type="dxa"/>
-              <w:bottom w:w="100" w:type="dxa"/>
-              <w:right w:w="100" w:type="dxa"/>
-            </w:tcMar>
-            <w:hideMark/>
-          </w:tcPr>
-          <w:p>
-            <w:pPr>
-              <w:rPr>
-                <w:sz w:val="2"/>
-                <w:szCs w:val="2"/>
-                <w:lang w:val="en-US"/>
-              </w:rPr>
-            </w:pPr>
-            <w:r>
-              <w:rPr>
-                <w:sz w:val="2"/>
-                <w:szCs w:val="2"/>
-                <w:lang w:val="en-US"/>
-              </w:rPr>
-              <w:t xml:space="preserve">{% if </w:t>
-            </w:r>
-            <w:proofErr w:type="spellStart"/>
-            <w:r>
-              <w:rPr>
-                <w:sz w:val="2"/>
-                <w:szCs w:val="2"/>
-                <w:lang w:val="en-US"/>
-              </w:rPr>
-              <w:t>template_</w:t>
-            </w:r>
-            <w:proofErr w:type="gramStart"/>
-            <w:r>
-              <w:rPr>
-                <w:sz w:val="2"/>
-                <w:szCs w:val="2"/>
-                <w:lang w:val="en-US"/>
-              </w:rPr>
-              <w:t>dict.file</w:t>
-            </w:r>
-            <w:proofErr w:type="gramEnd"/>
-            <w:r>
-              <w:rPr>
-                <w:sz w:val="2"/>
-                <w:szCs w:val="2"/>
-                <w:lang w:val="en-US"/>
-              </w:rPr>
-              <w:t>_open.comments|length</w:t>
-            </w:r>
-            <w:proofErr w:type="spellEnd"/>
-            <w:r>
-              <w:rPr>
-                <w:sz w:val="2"/>
-                <w:szCs w:val="2"/>
-                <w:lang w:val="en-US"/>
-              </w:rPr>
-              <w:t xml:space="preserve"> == 0 %}X{% endif %}</w:t>
-            </w:r>
-          </w:p>
-          <w:p>
-            <w:pPr>
-              <w:rPr>
-                <w:sz w:val="2"/>
-                <w:szCs w:val="2"/>
-                <w:lang w:val="en-US"/>
-              </w:rPr>
-            </w:pPr>
-          </w:p>
-          <w:p>
-            <w:pPr>
-              <w:rPr>
-                <w:sz w:val="2"/>
-                <w:szCs w:val="2"/>
-                <w:lang w:val="en-US"/>
-              </w:rPr>
-            </w:pPr>
-          </w:p>
-        </w:tc>
-        <w:tc>
-          <w:tcPr>
-            <w:tcW w:w="0" w:type="auto"/>
-            <w:tcBorders>
-              <w:top w:val="single" w:sz="8" w:space="0" w:color="000000"/>
-              <w:left w:val="single" w:sz="8" w:space="0" w:color="000000"/>
-              <w:bottom w:val="single" w:sz="8" w:space="0" w:color="000000"/>
-              <w:right w:val="single" w:sz="8" w:space="0" w:color="000000"/>
-            </w:tcBorders>
-            <w:tcMar>
-              <w:top w:w="100" w:type="dxa"/>
-              <w:left w:w="100" w:type="dxa"/>
-              <w:bottom w:w="100" w:type="dxa"/>
-              <w:right w:w="100" w:type="dxa"/>
-            </w:tcMar>
-            <w:hideMark/>
-          </w:tcPr>
-          <w:p>
-            <w:pPr>
-              <w:rPr>
-                <w:sz w:val="2"/>
-                <w:szCs w:val="2"/>
-                <w:lang w:val="en-US"/>
-              </w:rPr>
-            </w:pPr>
-          </w:p>
-        </w:tc>
-        <w:tc>
-          <w:tcPr>
-            <w:tcW w:w="0" w:type="auto"/>
-            <w:tcBorders>
-              <w:top w:val="single" w:sz="8" w:space="0" w:color="000000"/>
-              <w:left w:val="single" w:sz="8" w:space="0" w:color="000000"/>
-              <w:bottom w:val="single" w:sz="8" w:space="0" w:color="000000"/>
-              <w:right w:val="single" w:sz="8" w:space="0" w:color="000000"/>
-            </w:tcBorders>
-            <w:tcMar>
-              <w:top w:w="100" w:type="dxa"/>
-              <w:left w:w="100" w:type="dxa"/>
-              <w:bottom w:w="100" w:type="dxa"/>
-              <w:right w:w="100" w:type="dxa"/>
-            </w:tcMar>
-            <w:hideMark/>
-          </w:tcPr>
-          <w:p>
-            <w:pPr>
-              <w:rPr>
-                <w:sz w:val="2"/>
-                <w:szCs w:val="2"/>
-                <w:lang w:val="en-US"/>
-              </w:rPr>
-            </w:pPr>
-            <w:r>
-              <w:rPr>
-                <w:sz w:val="2"/>
-                <w:szCs w:val="2"/>
-                <w:lang w:val="en-US"/>
-              </w:rPr>
-              <w:t xml:space="preserve">{% if </w:t>
-            </w:r>
-            <w:proofErr w:type="spellStart"/>
-            <w:r>
-              <w:rPr>
-                <w:sz w:val="2"/>
-                <w:szCs w:val="2"/>
-                <w:lang w:val="en-US"/>
-              </w:rPr>
-              <w:t>template_</w:t>
-            </w:r>
-            <w:proofErr w:type="gramStart"/>
-            <w:r>
-              <w:rPr>
-                <w:sz w:val="2"/>
-                <w:szCs w:val="2"/>
-                <w:lang w:val="en-US"/>
-              </w:rPr>
-              <w:t>dict.file</w:t>
-            </w:r>
-            <w:proofErr w:type="gramEnd"/>
-            <w:r>
-              <w:rPr>
-                <w:sz w:val="2"/>
-                <w:szCs w:val="2"/>
-                <w:lang w:val="en-US"/>
-              </w:rPr>
-              <w:t>_open.comments|length</w:t>
-            </w:r>
-            <w:proofErr w:type="spellEnd"/>
-            <w:r>
-              <w:rPr>
-                <w:sz w:val="2"/>
-                <w:szCs w:val="2"/>
-                <w:lang w:val="en-US"/>
-              </w:rPr>
-              <w:t xml:space="preserve"> &gt; 0 %}X{% endif %}</w:t>
-            </w:r>
-          </w:p>
-          <w:p>
-            <w:pPr>
-              <w:rPr>
-                <w:sz w:val="2"/>
-                <w:szCs w:val="2"/>
-                <w:lang w:val="en-US"/>
-              </w:rPr>
-            </w:pPr>
-          </w:p>
-          <w:p>
-            <w:pPr>
-              <w:rPr>
-                <w:sz w:val="2"/>
-                <w:szCs w:val="2"/>
-                <w:lang w:val="en-US"/>
-              </w:rPr>
-            </w:pPr>
-          </w:p>
-        </w:tc>
-        <w:tc>
-          <w:tcPr>
-            <w:tcW w:w="0" w:type="auto"/>
-            <w:tcBorders>
-              <w:top w:val="single" w:sz="8" w:space="0" w:color="000000"/>
-              <w:left w:val="single" w:sz="8" w:space="0" w:color="000000"/>
-              <w:bottom w:val="single" w:sz="8" w:space="0" w:color="000000"/>
-              <w:right w:val="single" w:sz="8" w:space="0" w:color="000000"/>
-            </w:tcBorders>
-            <w:tcMar>
-              <w:top w:w="100" w:type="dxa"/>
-              <w:left w:w="100" w:type="dxa"/>
-              <w:bottom w:w="100" w:type="dxa"/>
-              <w:right w:w="100" w:type="dxa"/>
-            </w:tcMar>
-            <w:hideMark/>
-          </w:tcPr>
-          <w:p>
-            <w:pPr>
-              <w:rPr>
-                <w:lang w:val="en-US"/>
-              </w:rPr>
-            </w:pPr>
-          </w:p>
-        </w:tc>
-        <w:tc>
-          <w:tcPr>
-            <w:tcW w:w="0" w:type="auto"/>
-            <w:tcBorders>
-              <w:top w:val="single" w:sz="8" w:space="0" w:color="000000"/>
-              <w:left w:val="single" w:sz="8" w:space="0" w:color="000000"/>
-              <w:bottom w:val="single" w:sz="8" w:space="0" w:color="000000"/>
-              <w:right w:val="single" w:sz="8" w:space="0" w:color="000000"/>
-            </w:tcBorders>
-            <w:tcMar>
-              <w:top w:w="100" w:type="dxa"/>
-              <w:left w:w="100" w:type="dxa"/>
-              <w:bottom w:w="100" w:type="dxa"/>
-              <w:right w:w="100" w:type="dxa"/>
-            </w:tcMar>
-            <w:hideMark/>
-          </w:tcPr>
-          <w:p>
-            <w:pPr>
-              <w:rPr>
-                <w:lang w:val="en-US"/>
-              </w:rPr>
-            </w:pPr>
-          </w:p>
-        </w:tc>
-        <w:tc>
-          <w:tcPr>
-            <w:tcW w:w="0" w:type="auto"/>
-            <w:tcBorders>
-              <w:top w:val="single" w:sz="8" w:space="0" w:color="000000"/>
-              <w:left w:val="single" w:sz="8" w:space="0" w:color="000000"/>
-              <w:bottom w:val="single" w:sz="8" w:space="0" w:color="000000"/>
-              <w:right w:val="single" w:sz="8" w:space="0" w:color="000000"/>
-            </w:tcBorders>
-            <w:tcMar>
-              <w:top w:w="100" w:type="dxa"/>
-              <w:left w:w="100" w:type="dxa"/>
-              <w:bottom w:w="100" w:type="dxa"/>
-              <w:right w:w="100" w:type="dxa"/>
-            </w:tcMar>
-            <w:hideMark/>
-          </w:tcPr>
-          <w:p>
-            <w:pPr>
-              <w:rPr>
-                <w:lang w:val="en-US"/>
-              </w:rPr>
-            </w:pPr>
-            <w:r>
-              <w:rPr>
-                <w:lang w:val="en-US"/>
-              </w:rPr>
-              <w:t>If relevant, name of sub-</w:t>
-            </w:r>
-            <w:proofErr w:type="spellStart"/>
-            <w:r>
-              <w:rPr>
-                <w:lang w:val="en-US"/>
-              </w:rPr>
-              <w:t>dataverse</w:t>
-            </w:r>
-            <w:proofErr w:type="spellEnd"/>
-            <w:r>
-              <w:rPr>
-                <w:lang w:val="en-US"/>
-              </w:rPr>
-              <w:t xml:space="preserve"> collection:</w:t>
+              <w:t>If the dataset is deposited in a sub-dataverse collection, include the name of the collection. </w:t>
+            </w:r>
+          </w:p>
+          <w:p>
+            <w:pPr>
+              <w:rPr>
+                <w:lang w:val="en-US"/>
+              </w:rPr>
+            </w:pPr>
+          </w:p>
+        </w:tc>
+        <w:tc>
+          <w:tcPr>
+            <w:tcW w:w="0" w:type="auto"/>
+            <w:tcBorders>
+              <w:top w:val="single" w:sz="8" w:space="0" w:color="000000"/>
+              <w:left w:val="single" w:sz="8" w:space="0" w:color="000000"/>
+              <w:bottom w:val="single" w:sz="8" w:space="0" w:color="000000"/>
+              <w:right w:val="single" w:sz="8" w:space="0" w:color="000000"/>
+            </w:tcBorders>
+            <w:tcMar>
+              <w:top w:w="100" w:type="dxa"/>
+              <w:left w:w="100" w:type="dxa"/>
+              <w:bottom w:w="100" w:type="dxa"/>
+              <w:right w:w="100" w:type="dxa"/>
+            </w:tcMar>
+            <w:hideMark/>
+          </w:tcPr>
+          <w:p>
+            <w:pPr>
+              <w:rPr>
+                <w:lang w:val="en-US"/>
+              </w:rPr>
+            </w:pPr>
+            <w:r>
+              <w:rPr>
+                <w:lang w:val="en-US"/>
+              </w:rPr>
+              <w:t>{% if template_dict.file_open.comments|length == 0 %}X{% endif %}</w:t>
+            </w:r>
+          </w:p>
+          <w:p>
+            <w:pPr>
+              <w:rPr>
+                <w:lang w:val="en-US"/>
+              </w:rPr>
+            </w:pPr>
+          </w:p>
+          <w:p>
+            <w:pPr>
+              <w:rPr>
+                <w:lang w:val="en-US"/>
+              </w:rPr>
+            </w:pPr>
+          </w:p>
+        </w:tc>
+        <w:tc>
+          <w:tcPr>
+            <w:tcW w:w="0" w:type="auto"/>
+            <w:tcBorders>
+              <w:top w:val="single" w:sz="8" w:space="0" w:color="000000"/>
+              <w:left w:val="single" w:sz="8" w:space="0" w:color="000000"/>
+              <w:bottom w:val="single" w:sz="8" w:space="0" w:color="000000"/>
+              <w:right w:val="single" w:sz="8" w:space="0" w:color="000000"/>
+            </w:tcBorders>
+            <w:tcMar>
+              <w:top w:w="100" w:type="dxa"/>
+              <w:left w:w="100" w:type="dxa"/>
+              <w:bottom w:w="100" w:type="dxa"/>
+              <w:right w:w="100" w:type="dxa"/>
+            </w:tcMar>
+            <w:hideMark/>
+          </w:tcPr>
+          <w:p>
+            <w:pPr>
+              <w:rPr>
+                <w:lang w:val="en-US"/>
+              </w:rPr>
+            </w:pPr>
+          </w:p>
+        </w:tc>
+        <w:tc>
+          <w:tcPr>
+            <w:tcW w:w="0" w:type="auto"/>
+            <w:tcBorders>
+              <w:top w:val="single" w:sz="8" w:space="0" w:color="000000"/>
+              <w:left w:val="single" w:sz="8" w:space="0" w:color="000000"/>
+              <w:bottom w:val="single" w:sz="8" w:space="0" w:color="000000"/>
+              <w:right w:val="single" w:sz="8" w:space="0" w:color="000000"/>
+            </w:tcBorders>
+            <w:tcMar>
+              <w:top w:w="100" w:type="dxa"/>
+              <w:left w:w="100" w:type="dxa"/>
+              <w:bottom w:w="100" w:type="dxa"/>
+              <w:right w:w="100" w:type="dxa"/>
+            </w:tcMar>
+            <w:hideMark/>
+          </w:tcPr>
+          <w:p>
+            <w:pPr>
+              <w:rPr>
+                <w:lang w:val="en-US"/>
+              </w:rPr>
+            </w:pPr>
+            <w:r>
+              <w:rPr>
+                <w:lang w:val="en-US"/>
+              </w:rPr>
+              <w:t>{% if template_dict.file_open.comments|length &gt; 0 %}X{% endif %}</w:t>
+            </w:r>
+          </w:p>
+          <w:p>
+            <w:pPr>
+              <w:rPr>
+                <w:lang w:val="en-US"/>
+              </w:rPr>
+            </w:pPr>
+          </w:p>
+          <w:p>
+            <w:pPr>
+              <w:rPr>
+                <w:lang w:val="en-US"/>
+              </w:rPr>
+            </w:pPr>
+          </w:p>
+        </w:tc>
+        <w:tc>
+          <w:tcPr>
+            <w:tcW w:w="0" w:type="auto"/>
+            <w:tcBorders>
+              <w:top w:val="single" w:sz="8" w:space="0" w:color="000000"/>
+              <w:left w:val="single" w:sz="8" w:space="0" w:color="000000"/>
+              <w:bottom w:val="single" w:sz="8" w:space="0" w:color="000000"/>
+              <w:right w:val="single" w:sz="8" w:space="0" w:color="000000"/>
+            </w:tcBorders>
+            <w:tcMar>
+              <w:top w:w="100" w:type="dxa"/>
+              <w:left w:w="100" w:type="dxa"/>
+              <w:bottom w:w="100" w:type="dxa"/>
+              <w:right w:w="100" w:type="dxa"/>
+            </w:tcMar>
+            <w:hideMark/>
+          </w:tcPr>
+          <w:p>
+            <w:pPr>
+              <w:rPr>
+                <w:lang w:val="en-US"/>
+              </w:rPr>
+            </w:pPr>
+          </w:p>
+        </w:tc>
+        <w:tc>
+          <w:tcPr>
+            <w:tcW w:w="0" w:type="auto"/>
+            <w:tcBorders>
+              <w:top w:val="single" w:sz="8" w:space="0" w:color="000000"/>
+              <w:left w:val="single" w:sz="8" w:space="0" w:color="000000"/>
+              <w:bottom w:val="single" w:sz="8" w:space="0" w:color="000000"/>
+              <w:right w:val="single" w:sz="8" w:space="0" w:color="000000"/>
+            </w:tcBorders>
+            <w:tcMar>
+              <w:top w:w="100" w:type="dxa"/>
+              <w:left w:w="100" w:type="dxa"/>
+              <w:bottom w:w="100" w:type="dxa"/>
+              <w:right w:w="100" w:type="dxa"/>
+            </w:tcMar>
+            <w:hideMark/>
+          </w:tcPr>
+          <w:p>
+            <w:pPr>
+              <w:rPr>
+                <w:lang w:val="en-US"/>
+              </w:rPr>
+            </w:pPr>
+          </w:p>
+        </w:tc>
+        <w:tc>
+          <w:tcPr>
+            <w:tcW w:w="0" w:type="auto"/>
+            <w:tcBorders>
+              <w:top w:val="single" w:sz="8" w:space="0" w:color="000000"/>
+              <w:left w:val="single" w:sz="8" w:space="0" w:color="000000"/>
+              <w:bottom w:val="single" w:sz="8" w:space="0" w:color="000000"/>
+              <w:right w:val="single" w:sz="8" w:space="0" w:color="000000"/>
+            </w:tcBorders>
+            <w:tcMar>
+              <w:top w:w="100" w:type="dxa"/>
+              <w:left w:w="100" w:type="dxa"/>
+              <w:bottom w:w="100" w:type="dxa"/>
+              <w:right w:w="100" w:type="dxa"/>
+            </w:tcMar>
+            <w:hideMark/>
+          </w:tcPr>
+          <w:p>
+            <w:pPr>
+              <w:rPr>
+                <w:lang w:val="en-US"/>
+              </w:rPr>
+            </w:pPr>
+            <w:r>
+              <w:rPr>
+                <w:lang w:val="en-US"/>
+              </w:rPr>
+              <w:t>If relevant, name of sub-dataverse collection:</w:t>
             </w:r>
           </w:p>
         </w:tc>
@@ -1559,88 +1652,48 @@
                 <w:bCs/>
                 <w:lang w:val="en-US"/>
               </w:rPr>
-              <w:t>*If the dataset was deposited in a sub-</w:t>
-            </w:r>
-            <w:proofErr w:type="spellStart"/>
+              <w:t xml:space="preserve">*If the dataset was deposited in a sub-dataverse collection, does it require </w:t>
+            </w:r>
             <w:r>
               <w:rPr>
                 <w:b/>
                 <w:bCs/>
                 <w:lang w:val="en-US"/>
               </w:rPr>
-              <w:t>dataverse</w:t>
-            </w:r>
-            <w:proofErr w:type="spellEnd"/>
-            <w:r>
-              <w:rPr>
-                <w:b/>
-                <w:bCs/>
-                <w:lang w:val="en-US"/>
-              </w:rPr>
-              <w:t xml:space="preserve"> collection, does it require its own </w:t>
-            </w:r>
-            <w:proofErr w:type="spellStart"/>
-            <w:r>
-              <w:rPr>
-                <w:b/>
-                <w:bCs/>
-                <w:lang w:val="en-US"/>
-              </w:rPr>
-              <w:t>dataverse</w:t>
-            </w:r>
-            <w:proofErr w:type="spellEnd"/>
-            <w:r>
-              <w:rPr>
-                <w:b/>
-                <w:bCs/>
-                <w:lang w:val="en-US"/>
-              </w:rPr>
-              <w:t>?</w:t>
-            </w:r>
-          </w:p>
-        </w:tc>
-        <w:tc>
-          <w:tcPr>
-            <w:tcW w:w="0" w:type="auto"/>
-            <w:tcBorders>
-              <w:top w:val="single" w:sz="8" w:space="0" w:color="000000"/>
-              <w:left w:val="single" w:sz="8" w:space="0" w:color="000000"/>
-              <w:bottom w:val="single" w:sz="8" w:space="0" w:color="000000"/>
-              <w:right w:val="single" w:sz="8" w:space="0" w:color="000000"/>
-            </w:tcBorders>
-            <w:tcMar>
-              <w:top w:w="100" w:type="dxa"/>
-              <w:left w:w="100" w:type="dxa"/>
-              <w:bottom w:w="100" w:type="dxa"/>
-              <w:right w:w="100" w:type="dxa"/>
-            </w:tcMar>
-            <w:hideMark/>
-          </w:tcPr>
-          <w:p>
-            <w:pPr>
-              <w:rPr>
-                <w:lang w:val="en-US"/>
-              </w:rPr>
-            </w:pPr>
-            <w:r>
-              <w:rPr>
-                <w:lang w:val="en-US"/>
-              </w:rPr>
-              <w:t xml:space="preserve">If the depositor created a </w:t>
-            </w:r>
-            <w:proofErr w:type="spellStart"/>
-            <w:r>
-              <w:rPr>
-                <w:lang w:val="en-US"/>
-              </w:rPr>
-              <w:t>dataverse</w:t>
-            </w:r>
-            <w:proofErr w:type="spellEnd"/>
-            <w:r>
-              <w:rPr>
-                <w:lang w:val="en-US"/>
-              </w:rPr>
-              <w:t xml:space="preserve"> with one dataset:</w:t>
+              <w:lastRenderedPageBreak/>
+              <w:t>its own dataverse?</w:t>
+            </w:r>
+          </w:p>
+        </w:tc>
+        <w:tc>
+          <w:tcPr>
+            <w:tcW w:w="0" w:type="auto"/>
+            <w:tcBorders>
+              <w:top w:val="single" w:sz="8" w:space="0" w:color="000000"/>
+              <w:left w:val="single" w:sz="8" w:space="0" w:color="000000"/>
+              <w:bottom w:val="single" w:sz="8" w:space="0" w:color="000000"/>
+              <w:right w:val="single" w:sz="8" w:space="0" w:color="000000"/>
+            </w:tcBorders>
+            <w:tcMar>
+              <w:top w:w="100" w:type="dxa"/>
+              <w:left w:w="100" w:type="dxa"/>
+              <w:bottom w:w="100" w:type="dxa"/>
+              <w:right w:w="100" w:type="dxa"/>
+            </w:tcMar>
+            <w:hideMark/>
+          </w:tcPr>
+          <w:p>
+            <w:pPr>
+              <w:rPr>
+                <w:lang w:val="en-US"/>
+              </w:rPr>
+            </w:pPr>
+            <w:r>
+              <w:rPr>
+                <w:lang w:val="en-US"/>
+              </w:rPr>
+              <w:lastRenderedPageBreak/>
+              <w:t>If the depositor created a dataverse with one dataset:</w:t>
             </w:r>
           </w:p>
           <w:p>
@@ -1659,19 +1712,12 @@
               </w:rPr>
               <w:t>Is it the only dataset in the sub-</w:t>
             </w:r>
-            <w:proofErr w:type="spellStart"/>
-            <w:r>
-              <w:rPr>
-                <w:lang w:val="en-US"/>
-              </w:rPr>
-              <w:t>dataverse</w:t>
-            </w:r>
-            <w:proofErr w:type="spellEnd"/>
-            <w:r>
-              <w:rPr>
-                <w:lang w:val="en-US"/>
-              </w:rPr>
-              <w:t xml:space="preserve"> collection?</w:t>
+            <w:r>
+              <w:rPr>
+                <w:lang w:val="en-US"/>
+              </w:rPr>
+              <w:lastRenderedPageBreak/>
+              <w:t>dataverse collection?</w:t>
             </w:r>
           </w:p>
           <w:p>
@@ -1688,21 +1734,7 @@
               <w:rPr>
                 <w:lang w:val="en-US"/>
               </w:rPr>
-              <w:t>Is there another sub-</w:t>
-            </w:r>
-            <w:proofErr w:type="spellStart"/>
-            <w:r>
-              <w:rPr>
-                <w:lang w:val="en-US"/>
-              </w:rPr>
-              <w:t>dataverse</w:t>
-            </w:r>
-            <w:proofErr w:type="spellEnd"/>
-            <w:r>
-              <w:rPr>
-                <w:lang w:val="en-US"/>
-              </w:rPr>
-              <w:t xml:space="preserve"> collection it should be in?</w:t>
+              <w:t>Is there another sub-dataverse collection it should be in?</w:t>
             </w:r>
           </w:p>
           <w:p>
@@ -1750,206 +1782,107 @@
               <w:rPr>
                 <w:lang w:val="en-US"/>
               </w:rPr>
-              <w:t xml:space="preserve"> a </w:t>
-            </w:r>
-            <w:proofErr w:type="spellStart"/>
-            <w:r>
-              <w:rPr>
-                <w:lang w:val="en-US"/>
-              </w:rPr>
-              <w:t>dataverse</w:t>
-            </w:r>
-            <w:proofErr w:type="spellEnd"/>
-            <w:r>
-              <w:rPr>
-                <w:lang w:val="en-US"/>
-              </w:rPr>
-              <w:t xml:space="preserve"> (e.g., will there be future deposits?)</w:t>
-            </w:r>
-          </w:p>
-        </w:tc>
-        <w:tc>
-          <w:tcPr>
-            <w:tcW w:w="0" w:type="auto"/>
-            <w:tcBorders>
-              <w:top w:val="single" w:sz="8" w:space="0" w:color="000000"/>
-              <w:left w:val="single" w:sz="8" w:space="0" w:color="000000"/>
-              <w:bottom w:val="single" w:sz="8" w:space="0" w:color="000000"/>
-              <w:right w:val="single" w:sz="8" w:space="0" w:color="000000"/>
-            </w:tcBorders>
-            <w:tcMar>
-              <w:top w:w="100" w:type="dxa"/>
-              <w:left w:w="100" w:type="dxa"/>
-              <w:bottom w:w="100" w:type="dxa"/>
-              <w:right w:w="100" w:type="dxa"/>
-            </w:tcMar>
-            <w:hideMark/>
-          </w:tcPr>
-          <w:p>
-            <w:pPr>
-              <w:rPr>
-                <w:sz w:val="2"/>
-                <w:szCs w:val="2"/>
-                <w:lang w:val="en-US"/>
-              </w:rPr>
-            </w:pPr>
-            <w:r>
-              <w:rPr>
-                <w:sz w:val="2"/>
-                <w:szCs w:val="2"/>
-                <w:lang w:val="en-US"/>
-              </w:rPr>
-              <w:t xml:space="preserve">{% if </w:t>
-            </w:r>
-            <w:proofErr w:type="spellStart"/>
-            <w:r>
-              <w:rPr>
-                <w:sz w:val="2"/>
-                <w:szCs w:val="2"/>
-                <w:lang w:val="en-US"/>
-              </w:rPr>
-              <w:t>template_</w:t>
-            </w:r>
-            <w:proofErr w:type="gramStart"/>
-            <w:r>
-              <w:rPr>
-                <w:sz w:val="2"/>
-                <w:szCs w:val="2"/>
-                <w:lang w:val="en-US"/>
-              </w:rPr>
-              <w:t>dict.special</w:t>
-            </w:r>
-            <w:proofErr w:type="gramEnd"/>
-            <w:r>
-              <w:rPr>
-                <w:sz w:val="2"/>
-                <w:szCs w:val="2"/>
-                <w:lang w:val="en-US"/>
-              </w:rPr>
-              <w:t>_characters.comments|length</w:t>
-            </w:r>
-            <w:proofErr w:type="spellEnd"/>
-            <w:r>
-              <w:rPr>
-                <w:sz w:val="2"/>
-                <w:szCs w:val="2"/>
-                <w:lang w:val="en-US"/>
-              </w:rPr>
-              <w:t xml:space="preserve"> == 0 %}X{% endif %}</w:t>
-            </w:r>
-          </w:p>
-          <w:p>
-            <w:pPr>
-              <w:rPr>
-                <w:sz w:val="2"/>
-                <w:szCs w:val="2"/>
-                <w:lang w:val="en-US"/>
-              </w:rPr>
-            </w:pPr>
-          </w:p>
-        </w:tc>
-        <w:tc>
-          <w:tcPr>
-            <w:tcW w:w="0" w:type="auto"/>
-            <w:tcBorders>
-              <w:top w:val="single" w:sz="8" w:space="0" w:color="000000"/>
-              <w:left w:val="single" w:sz="8" w:space="0" w:color="000000"/>
-              <w:bottom w:val="single" w:sz="8" w:space="0" w:color="000000"/>
-              <w:right w:val="single" w:sz="8" w:space="0" w:color="000000"/>
-            </w:tcBorders>
-            <w:tcMar>
-              <w:top w:w="100" w:type="dxa"/>
-              <w:left w:w="100" w:type="dxa"/>
-              <w:bottom w:w="100" w:type="dxa"/>
-              <w:right w:w="100" w:type="dxa"/>
-            </w:tcMar>
-            <w:hideMark/>
-          </w:tcPr>
-          <w:p>
-            <w:pPr>
-              <w:rPr>
-                <w:sz w:val="2"/>
-                <w:szCs w:val="2"/>
-                <w:lang w:val="en-US"/>
-              </w:rPr>
-            </w:pPr>
-          </w:p>
-        </w:tc>
-        <w:tc>
-          <w:tcPr>
-            <w:tcW w:w="0" w:type="auto"/>
-            <w:tcBorders>
-              <w:top w:val="single" w:sz="8" w:space="0" w:color="000000"/>
-              <w:left w:val="single" w:sz="8" w:space="0" w:color="000000"/>
-              <w:bottom w:val="single" w:sz="8" w:space="0" w:color="000000"/>
-              <w:right w:val="single" w:sz="8" w:space="0" w:color="000000"/>
-            </w:tcBorders>
-            <w:tcMar>
-              <w:top w:w="100" w:type="dxa"/>
-              <w:left w:w="100" w:type="dxa"/>
-              <w:bottom w:w="100" w:type="dxa"/>
-              <w:right w:w="100" w:type="dxa"/>
-            </w:tcMar>
-            <w:hideMark/>
-          </w:tcPr>
-          <w:p>
-            <w:pPr>
-              <w:rPr>
-                <w:sz w:val="2"/>
-                <w:szCs w:val="2"/>
-                <w:lang w:val="en-US"/>
-              </w:rPr>
-            </w:pPr>
-            <w:r>
-              <w:rPr>
-                <w:sz w:val="2"/>
-                <w:szCs w:val="2"/>
-                <w:lang w:val="en-US"/>
-              </w:rPr>
-              <w:t xml:space="preserve">{% if </w:t>
-            </w:r>
-            <w:proofErr w:type="spellStart"/>
-            <w:r>
-              <w:rPr>
-                <w:sz w:val="2"/>
-                <w:szCs w:val="2"/>
-                <w:lang w:val="en-US"/>
-              </w:rPr>
-              <w:t>template_</w:t>
-            </w:r>
-            <w:proofErr w:type="gramStart"/>
-            <w:r>
-              <w:rPr>
-                <w:sz w:val="2"/>
-                <w:szCs w:val="2"/>
-                <w:lang w:val="en-US"/>
-              </w:rPr>
-              <w:t>dict.special</w:t>
-            </w:r>
-            <w:proofErr w:type="gramEnd"/>
-            <w:r>
-              <w:rPr>
-                <w:sz w:val="2"/>
-                <w:szCs w:val="2"/>
-                <w:lang w:val="en-US"/>
-              </w:rPr>
-              <w:t>_characters.comments|length</w:t>
-            </w:r>
-            <w:proofErr w:type="spellEnd"/>
-            <w:r>
-              <w:rPr>
-                <w:sz w:val="2"/>
-                <w:szCs w:val="2"/>
-                <w:lang w:val="en-US"/>
-              </w:rPr>
-              <w:t xml:space="preserve"> &gt; 0 %}X{% endif %}</w:t>
-            </w:r>
-          </w:p>
-          <w:p>
-            <w:pPr>
-              <w:rPr>
-                <w:sz w:val="2"/>
-                <w:szCs w:val="2"/>
+              <w:t xml:space="preserve"> a dataverse (e.g., will there be future deposits?)</w:t>
+            </w:r>
+          </w:p>
+        </w:tc>
+        <w:tc>
+          <w:tcPr>
+            <w:tcW w:w="0" w:type="auto"/>
+            <w:tcBorders>
+              <w:top w:val="single" w:sz="8" w:space="0" w:color="000000"/>
+              <w:left w:val="single" w:sz="8" w:space="0" w:color="000000"/>
+              <w:bottom w:val="single" w:sz="8" w:space="0" w:color="000000"/>
+              <w:right w:val="single" w:sz="8" w:space="0" w:color="000000"/>
+            </w:tcBorders>
+            <w:tcMar>
+              <w:top w:w="100" w:type="dxa"/>
+              <w:left w:w="100" w:type="dxa"/>
+              <w:bottom w:w="100" w:type="dxa"/>
+              <w:right w:w="100" w:type="dxa"/>
+            </w:tcMar>
+            <w:hideMark/>
+          </w:tcPr>
+          <w:p>
+            <w:pPr>
+              <w:rPr>
+                <w:lang w:val="en-US"/>
+              </w:rPr>
+            </w:pPr>
+            <w:r>
+              <w:rPr>
+                <w:lang w:val="en-US"/>
+              </w:rPr>
+              <w:lastRenderedPageBreak/>
+              <w:t>{% if template_dict.special_characters.comments|length == 0 %}X{% endif %}</w:t>
+            </w:r>
+          </w:p>
+          <w:p>
+            <w:pPr>
+              <w:rPr>
+                <w:lang w:val="en-US"/>
+              </w:rPr>
+            </w:pPr>
+          </w:p>
+        </w:tc>
+        <w:tc>
+          <w:tcPr>
+            <w:tcW w:w="0" w:type="auto"/>
+            <w:tcBorders>
+              <w:top w:val="single" w:sz="8" w:space="0" w:color="000000"/>
+              <w:left w:val="single" w:sz="8" w:space="0" w:color="000000"/>
+              <w:bottom w:val="single" w:sz="8" w:space="0" w:color="000000"/>
+              <w:right w:val="single" w:sz="8" w:space="0" w:color="000000"/>
+            </w:tcBorders>
+            <w:tcMar>
+              <w:top w:w="100" w:type="dxa"/>
+              <w:left w:w="100" w:type="dxa"/>
+              <w:bottom w:w="100" w:type="dxa"/>
+              <w:right w:w="100" w:type="dxa"/>
+            </w:tcMar>
+            <w:hideMark/>
+          </w:tcPr>
+          <w:p>
+            <w:pPr>
+              <w:rPr>
+                <w:lang w:val="en-US"/>
+              </w:rPr>
+            </w:pPr>
+          </w:p>
+        </w:tc>
+        <w:tc>
+          <w:tcPr>
+            <w:tcW w:w="0" w:type="auto"/>
+            <w:tcBorders>
+              <w:top w:val="single" w:sz="8" w:space="0" w:color="000000"/>
+              <w:left w:val="single" w:sz="8" w:space="0" w:color="000000"/>
+              <w:bottom w:val="single" w:sz="8" w:space="0" w:color="000000"/>
+              <w:right w:val="single" w:sz="8" w:space="0" w:color="000000"/>
+            </w:tcBorders>
+            <w:tcMar>
+              <w:top w:w="100" w:type="dxa"/>
+              <w:left w:w="100" w:type="dxa"/>
+              <w:bottom w:w="100" w:type="dxa"/>
+              <w:right w:w="100" w:type="dxa"/>
+            </w:tcMar>
+            <w:hideMark/>
+          </w:tcPr>
+          <w:p>
+            <w:pPr>
+              <w:rPr>
+                <w:lang w:val="en-US"/>
+              </w:rPr>
+            </w:pPr>
+            <w:r>
+              <w:rPr>
+                <w:lang w:val="en-US"/>
+              </w:rPr>
+              <w:t>{% if template_dict.special_characters.comments|length &gt; 0 %}X{% endif %}</w:t>
+            </w:r>
+          </w:p>
+          <w:p>
+            <w:pPr>
+              <w:rPr>
                 <w:lang w:val="en-US"/>
               </w:rPr>
             </w:pPr>
@@ -2555,366 +2488,198 @@
           <w:p>
             <w:pPr>
               <w:rPr>
-                <w:sz w:val="2"/>
-                <w:szCs w:val="2"/>
-                <w:lang w:val="en-US"/>
-              </w:rPr>
-            </w:pPr>
-            <w:r>
-              <w:rPr>
-                <w:sz w:val="2"/>
-                <w:szCs w:val="2"/>
-                <w:lang w:val="en-US"/>
-              </w:rPr>
-              <w:t xml:space="preserve">{% if </w:t>
-            </w:r>
-            <w:proofErr w:type="spellStart"/>
-            <w:r>
-              <w:rPr>
-                <w:sz w:val="2"/>
-                <w:szCs w:val="2"/>
-                <w:lang w:val="en-US"/>
-              </w:rPr>
-              <w:t>template_</w:t>
+                <w:lang w:val="en-US"/>
+              </w:rPr>
+            </w:pPr>
+            <w:r>
+              <w:rPr>
+                <w:lang w:val="en-US"/>
+              </w:rPr>
+              <w:t>{% if template_dict.file_ext.comments|length == 0 %}X{% endif %}</w:t>
+            </w:r>
+          </w:p>
+        </w:tc>
+        <w:tc>
+          <w:tcPr>
+            <w:tcW w:w="0" w:type="auto"/>
+            <w:tcBorders>
+              <w:top w:val="single" w:sz="8" w:space="0" w:color="000000"/>
+              <w:left w:val="single" w:sz="8" w:space="0" w:color="000000"/>
+              <w:bottom w:val="single" w:sz="8" w:space="0" w:color="000000"/>
+              <w:right w:val="single" w:sz="8" w:space="0" w:color="000000"/>
+            </w:tcBorders>
+            <w:tcMar>
+              <w:top w:w="100" w:type="dxa"/>
+              <w:left w:w="100" w:type="dxa"/>
+              <w:bottom w:w="100" w:type="dxa"/>
+              <w:right w:w="100" w:type="dxa"/>
+            </w:tcMar>
+            <w:hideMark/>
+          </w:tcPr>
+          <w:p>
+            <w:pPr>
+              <w:rPr>
+                <w:lang w:val="en-US"/>
+              </w:rPr>
+            </w:pPr>
+          </w:p>
+        </w:tc>
+        <w:tc>
+          <w:tcPr>
+            <w:tcW w:w="0" w:type="auto"/>
+            <w:tcBorders>
+              <w:top w:val="single" w:sz="8" w:space="0" w:color="000000"/>
+              <w:left w:val="single" w:sz="8" w:space="0" w:color="000000"/>
+              <w:bottom w:val="single" w:sz="8" w:space="0" w:color="000000"/>
+              <w:right w:val="single" w:sz="8" w:space="0" w:color="000000"/>
+            </w:tcBorders>
+            <w:tcMar>
+              <w:top w:w="100" w:type="dxa"/>
+              <w:left w:w="100" w:type="dxa"/>
+              <w:bottom w:w="100" w:type="dxa"/>
+              <w:right w:w="100" w:type="dxa"/>
+            </w:tcMar>
+            <w:hideMark/>
+          </w:tcPr>
+          <w:p>
+            <w:pPr>
+              <w:rPr>
+                <w:lang w:val="en-US"/>
+              </w:rPr>
+            </w:pPr>
+            <w:r>
+              <w:rPr>
+                <w:lang w:val="en-US"/>
+              </w:rPr>
+              <w:t>{% if template_dict.file_ext.comments|length &gt; 0 %}X{% endif %}</w:t>
+            </w:r>
+          </w:p>
+        </w:tc>
+        <w:tc>
+          <w:tcPr>
+            <w:tcW w:w="0" w:type="auto"/>
+            <w:tcBorders>
+              <w:top w:val="single" w:sz="8" w:space="0" w:color="000000"/>
+              <w:left w:val="single" w:sz="8" w:space="0" w:color="000000"/>
+              <w:bottom w:val="single" w:sz="8" w:space="0" w:color="000000"/>
+              <w:right w:val="single" w:sz="8" w:space="0" w:color="000000"/>
+            </w:tcBorders>
+            <w:tcMar>
+              <w:top w:w="100" w:type="dxa"/>
+              <w:left w:w="100" w:type="dxa"/>
+              <w:bottom w:w="100" w:type="dxa"/>
+              <w:right w:w="100" w:type="dxa"/>
+            </w:tcMar>
+            <w:hideMark/>
+          </w:tcPr>
+          <w:p>
+            <w:pPr>
+              <w:rPr>
+                <w:lang w:val="en-US"/>
+              </w:rPr>
+            </w:pPr>
+          </w:p>
+        </w:tc>
+        <w:tc>
+          <w:tcPr>
+            <w:tcW w:w="0" w:type="auto"/>
+            <w:tcBorders>
+              <w:top w:val="single" w:sz="8" w:space="0" w:color="000000"/>
+              <w:left w:val="single" w:sz="8" w:space="0" w:color="000000"/>
+              <w:bottom w:val="single" w:sz="8" w:space="0" w:color="000000"/>
+              <w:right w:val="single" w:sz="8" w:space="0" w:color="000000"/>
+            </w:tcBorders>
+            <w:tcMar>
+              <w:top w:w="100" w:type="dxa"/>
+              <w:left w:w="100" w:type="dxa"/>
+              <w:bottom w:w="100" w:type="dxa"/>
+              <w:right w:w="100" w:type="dxa"/>
+            </w:tcMar>
+            <w:hideMark/>
+          </w:tcPr>
+          <w:p>
+            <w:pPr>
+              <w:rPr>
+                <w:lang w:val="en-US"/>
+              </w:rPr>
+            </w:pPr>
+          </w:p>
+        </w:tc>
+        <w:tc>
+          <w:tcPr>
+            <w:tcW w:w="0" w:type="auto"/>
+            <w:tcBorders>
+              <w:top w:val="single" w:sz="8" w:space="0" w:color="000000"/>
+              <w:left w:val="single" w:sz="8" w:space="0" w:color="000000"/>
+              <w:bottom w:val="single" w:sz="8" w:space="0" w:color="000000"/>
+              <w:right w:val="single" w:sz="8" w:space="0" w:color="000000"/>
+            </w:tcBorders>
+            <w:tcMar>
+              <w:top w:w="100" w:type="dxa"/>
+              <w:left w:w="100" w:type="dxa"/>
+              <w:bottom w:w="100" w:type="dxa"/>
+              <w:right w:w="100" w:type="dxa"/>
+            </w:tcMar>
+            <w:hideMark/>
+          </w:tcPr>
+          <w:p>
+            <w:pPr>
+              <w:rPr>
+                <w:lang w:val="en-US"/>
+              </w:rPr>
+            </w:pPr>
+            <w:r>
+              <w:rPr>
+                <w:lang w:val="en-US"/>
+              </w:rPr>
+              <w:t>List all files that did not open correctly:</w:t>
+            </w:r>
+          </w:p>
+          <w:p>
+            <w:pPr>
+              <w:rPr>
+                <w:lang w:val="en-US"/>
+              </w:rPr>
+            </w:pPr>
+            <w:r>
+              <w:rPr>
+                <w:lang w:val="en-US"/>
+              </w:rPr>
+              <w:t>{% for item in template_dict.file_open.</w:t>
             </w:r>
             <w:proofErr w:type="gramStart"/>
             <w:r>
               <w:rPr>
-                <w:sz w:val="2"/>
-                <w:szCs w:val="2"/>
-                <w:lang w:val="en-US"/>
-              </w:rPr>
-              <w:t>dict.file</w:t>
+                <w:lang w:val="en-US"/>
+              </w:rPr>
+              <w:t>comments %}</w:t>
             </w:r>
             <w:proofErr w:type="gramEnd"/>
-            <w:r>
-              <w:rPr>
-                <w:sz w:val="2"/>
-                <w:szCs w:val="2"/>
-                <w:lang w:val="en-US"/>
-              </w:rPr>
-              <w:t>_ext.comments|length</w:t>
-            </w:r>
-            <w:proofErr w:type="spellEnd"/>
-            <w:r>
-              <w:rPr>
-                <w:sz w:val="2"/>
-                <w:szCs w:val="2"/>
-                <w:lang w:val="en-US"/>
-              </w:rPr>
-              <w:t xml:space="preserve"> == 0 %}X{% endif %}</w:t>
-            </w:r>
-          </w:p>
-        </w:tc>
-        <w:tc>
-          <w:tcPr>
-            <w:tcW w:w="0" w:type="auto"/>
-            <w:tcBorders>
-              <w:top w:val="single" w:sz="8" w:space="0" w:color="000000"/>
-              <w:left w:val="single" w:sz="8" w:space="0" w:color="000000"/>
-              <w:bottom w:val="single" w:sz="8" w:space="0" w:color="000000"/>
-              <w:right w:val="single" w:sz="8" w:space="0" w:color="000000"/>
-            </w:tcBorders>
-            <w:tcMar>
-              <w:top w:w="100" w:type="dxa"/>
-              <w:left w:w="100" w:type="dxa"/>
-              <w:bottom w:w="100" w:type="dxa"/>
-              <w:right w:w="100" w:type="dxa"/>
-            </w:tcMar>
-            <w:hideMark/>
-          </w:tcPr>
-          <w:p>
-            <w:pPr>
-              <w:rPr>
-                <w:sz w:val="2"/>
-                <w:szCs w:val="2"/>
-                <w:lang w:val="en-US"/>
-              </w:rPr>
-            </w:pPr>
-          </w:p>
-        </w:tc>
-        <w:tc>
-          <w:tcPr>
-            <w:tcW w:w="0" w:type="auto"/>
-            <w:tcBorders>
-              <w:top w:val="single" w:sz="8" w:space="0" w:color="000000"/>
-              <w:left w:val="single" w:sz="8" w:space="0" w:color="000000"/>
-              <w:bottom w:val="single" w:sz="8" w:space="0" w:color="000000"/>
-              <w:right w:val="single" w:sz="8" w:space="0" w:color="000000"/>
-            </w:tcBorders>
-            <w:tcMar>
-              <w:top w:w="100" w:type="dxa"/>
-              <w:left w:w="100" w:type="dxa"/>
-              <w:bottom w:w="100" w:type="dxa"/>
-              <w:right w:w="100" w:type="dxa"/>
-            </w:tcMar>
-            <w:hideMark/>
-          </w:tcPr>
-          <w:p>
-            <w:pPr>
-              <w:rPr>
-                <w:sz w:val="2"/>
-                <w:szCs w:val="2"/>
-                <w:lang w:val="en-US"/>
-              </w:rPr>
-            </w:pPr>
-            <w:r>
-              <w:rPr>
-                <w:sz w:val="2"/>
-                <w:szCs w:val="2"/>
-                <w:lang w:val="en-US"/>
-              </w:rPr>
-              <w:t xml:space="preserve">{% if </w:t>
-            </w:r>
-            <w:proofErr w:type="spellStart"/>
-            <w:r>
-              <w:rPr>
-                <w:sz w:val="2"/>
-                <w:szCs w:val="2"/>
-                <w:lang w:val="en-US"/>
-              </w:rPr>
-              <w:t>template_</w:t>
-            </w:r>
-            <w:proofErr w:type="gramStart"/>
-            <w:r>
-              <w:rPr>
-                <w:sz w:val="2"/>
-                <w:szCs w:val="2"/>
-                <w:lang w:val="en-US"/>
-              </w:rPr>
-              <w:t>dict.file</w:t>
-            </w:r>
-            <w:proofErr w:type="gramEnd"/>
-            <w:r>
-              <w:rPr>
-                <w:sz w:val="2"/>
-                <w:szCs w:val="2"/>
-                <w:lang w:val="en-US"/>
-              </w:rPr>
-              <w:t>_ext.comments|length</w:t>
-            </w:r>
-            <w:proofErr w:type="spellEnd"/>
-            <w:r>
-              <w:rPr>
-                <w:sz w:val="2"/>
-                <w:szCs w:val="2"/>
-                <w:lang w:val="en-US"/>
-              </w:rPr>
-              <w:t xml:space="preserve"> &gt; 0 %}X{% endif %}</w:t>
-            </w:r>
-          </w:p>
-        </w:tc>
-        <w:tc>
-          <w:tcPr>
-            <w:tcW w:w="0" w:type="auto"/>
-            <w:tcBorders>
-              <w:top w:val="single" w:sz="8" w:space="0" w:color="000000"/>
-              <w:left w:val="single" w:sz="8" w:space="0" w:color="000000"/>
-              <w:bottom w:val="single" w:sz="8" w:space="0" w:color="000000"/>
-              <w:right w:val="single" w:sz="8" w:space="0" w:color="000000"/>
-            </w:tcBorders>
-            <w:tcMar>
-              <w:top w:w="100" w:type="dxa"/>
-              <w:left w:w="100" w:type="dxa"/>
-              <w:bottom w:w="100" w:type="dxa"/>
-              <w:right w:w="100" w:type="dxa"/>
-            </w:tcMar>
-            <w:hideMark/>
-          </w:tcPr>
-          <w:p>
-            <w:pPr>
-              <w:rPr>
-                <w:lang w:val="en-US"/>
-              </w:rPr>
-            </w:pPr>
-          </w:p>
-        </w:tc>
-        <w:tc>
-          <w:tcPr>
-            <w:tcW w:w="0" w:type="auto"/>
-            <w:tcBorders>
-              <w:top w:val="single" w:sz="8" w:space="0" w:color="000000"/>
-              <w:left w:val="single" w:sz="8" w:space="0" w:color="000000"/>
-              <w:bottom w:val="single" w:sz="8" w:space="0" w:color="000000"/>
-              <w:right w:val="single" w:sz="8" w:space="0" w:color="000000"/>
-            </w:tcBorders>
-            <w:tcMar>
-              <w:top w:w="100" w:type="dxa"/>
-              <w:left w:w="100" w:type="dxa"/>
-              <w:bottom w:w="100" w:type="dxa"/>
-              <w:right w:w="100" w:type="dxa"/>
-            </w:tcMar>
-            <w:hideMark/>
-          </w:tcPr>
-          <w:p>
-            <w:pPr>
-              <w:rPr>
-                <w:lang w:val="en-US"/>
-              </w:rPr>
-            </w:pPr>
-          </w:p>
-        </w:tc>
-        <w:tc>
-          <w:tcPr>
-            <w:tcW w:w="0" w:type="auto"/>
-            <w:tcBorders>
-              <w:top w:val="single" w:sz="8" w:space="0" w:color="000000"/>
-              <w:left w:val="single" w:sz="8" w:space="0" w:color="000000"/>
-              <w:bottom w:val="single" w:sz="8" w:space="0" w:color="000000"/>
-              <w:right w:val="single" w:sz="8" w:space="0" w:color="000000"/>
-            </w:tcBorders>
-            <w:tcMar>
-              <w:top w:w="100" w:type="dxa"/>
-              <w:left w:w="100" w:type="dxa"/>
-              <w:bottom w:w="100" w:type="dxa"/>
-              <w:right w:w="100" w:type="dxa"/>
-            </w:tcMar>
-            <w:hideMark/>
-          </w:tcPr>
-          <w:p>
-            <w:pPr>
-              <w:rPr>
-                <w:lang w:val="en-US"/>
-              </w:rPr>
-            </w:pPr>
-            <w:r>
-              <w:rPr>
-                <w:lang w:val="en-US"/>
-              </w:rPr>
-              <w:t>List all files that did not open correctly:</w:t>
-            </w:r>
-          </w:p>
-          <w:p>
-            <w:pPr>
-              <w:rPr>
-                <w:sz w:val="2"/>
-                <w:szCs w:val="2"/>
-                <w:lang w:val="en-US"/>
-              </w:rPr>
-            </w:pPr>
-            <w:r>
-              <w:rPr>
-                <w:sz w:val="2"/>
-                <w:szCs w:val="2"/>
-                <w:lang w:val="en-US"/>
-              </w:rPr>
-              <w:t xml:space="preserve">{% for item in </w:t>
-            </w:r>
-            <w:proofErr w:type="spellStart"/>
-            <w:r>
-              <w:rPr>
-                <w:sz w:val="2"/>
-                <w:szCs w:val="2"/>
-                <w:lang w:val="en-US"/>
-              </w:rPr>
-              <w:t>template_</w:t>
-            </w:r>
-            <w:proofErr w:type="gramStart"/>
-            <w:r>
-              <w:rPr>
-                <w:sz w:val="2"/>
-                <w:szCs w:val="2"/>
-                <w:lang w:val="en-US"/>
-              </w:rPr>
-              <w:t>dict.file</w:t>
-            </w:r>
-            <w:proofErr w:type="gramEnd"/>
-            <w:r>
-              <w:rPr>
-                <w:sz w:val="2"/>
-                <w:szCs w:val="2"/>
-                <w:lang w:val="en-US"/>
-              </w:rPr>
-              <w:t>_open.comments</w:t>
-            </w:r>
-            <w:proofErr w:type="spellEnd"/>
-            <w:r>
-              <w:rPr>
-                <w:sz w:val="2"/>
-                <w:szCs w:val="2"/>
-                <w:lang w:val="en-US"/>
-              </w:rPr>
-              <w:t xml:space="preserve"> %}</w:t>
-            </w:r>
-          </w:p>
-          <w:p>
-            <w:pPr>
-              <w:rPr>
-                <w:sz w:val="2"/>
-                <w:szCs w:val="2"/>
-                <w:lang w:val="en-US"/>
-              </w:rPr>
-            </w:pPr>
-            <w:proofErr w:type="gramStart"/>
-            <w:r>
-              <w:rPr>
-                <w:sz w:val="2"/>
-                <w:szCs w:val="2"/>
-                <w:lang w:val="en-US"/>
-              </w:rPr>
-              <w:t xml:space="preserve">{{ </w:t>
-            </w:r>
-            <w:proofErr w:type="spellStart"/>
-            <w:r>
-              <w:rPr>
-                <w:sz w:val="2"/>
-                <w:szCs w:val="2"/>
-                <w:lang w:val="en-US"/>
-              </w:rPr>
-              <w:t>item</w:t>
-            </w:r>
-            <w:proofErr w:type="gramEnd"/>
-            <w:r>
-              <w:rPr>
-                <w:sz w:val="2"/>
-                <w:szCs w:val="2"/>
-                <w:lang w:val="en-US"/>
-              </w:rPr>
-              <w:t>.file_name</w:t>
-            </w:r>
-            <w:proofErr w:type="spellEnd"/>
-            <w:r>
-              <w:rPr>
-                <w:sz w:val="2"/>
-                <w:szCs w:val="2"/>
-                <w:lang w:val="en-US"/>
-              </w:rPr>
-              <w:t xml:space="preserve"> }}</w:t>
-            </w:r>
-          </w:p>
-          <w:p>
-            <w:pPr>
-              <w:rPr>
-                <w:sz w:val="2"/>
-                <w:szCs w:val="2"/>
-                <w:lang w:val="en-US"/>
-              </w:rPr>
-            </w:pPr>
-            <w:r>
-              <w:rPr>
-                <w:sz w:val="2"/>
-                <w:szCs w:val="2"/>
-                <w:lang w:val="en-US"/>
-              </w:rPr>
-              <w:t xml:space="preserve">{% </w:t>
-            </w:r>
-            <w:proofErr w:type="spellStart"/>
-            <w:r>
-              <w:rPr>
-                <w:sz w:val="2"/>
-                <w:szCs w:val="2"/>
-                <w:lang w:val="en-US"/>
-              </w:rPr>
-              <w:t>endfor</w:t>
-            </w:r>
-            <w:proofErr w:type="spellEnd"/>
-            <w:r>
-              <w:rPr>
-                <w:sz w:val="2"/>
-                <w:szCs w:val="2"/>
-                <w:lang w:val="en-US"/>
-              </w:rPr>
-              <w:t xml:space="preserve"> %}</w:t>
+          </w:p>
+          <w:p>
+            <w:pPr>
+              <w:rPr>
+                <w:lang w:val="en-US"/>
+              </w:rPr>
+            </w:pPr>
+            <w:r>
+              <w:rPr>
+                <w:lang w:val="en-US"/>
+              </w:rPr>
+              <w:t>{{ item.file_name }}</w:t>
+            </w:r>
+          </w:p>
+          <w:p>
+            <w:pPr>
+              <w:rPr>
+                <w:lang w:val="en-US"/>
+              </w:rPr>
+            </w:pPr>
+            <w:r>
+              <w:rPr>
+                <w:lang w:val="en-US"/>
+              </w:rPr>
+              <w:t>{% endfor %}</w:t>
             </w:r>
           </w:p>
           <w:p>
@@ -3083,21 +2848,30 @@
                 <w:bCs/>
                 <w:lang w:val="en-US"/>
               </w:rPr>
-              <w:t>Are all files free of the following special characters (</w:t>
-            </w:r>
-          </w:p>
-          <w:p>
-            <w:pPr>
-              <w:rPr>
-                <w:lang w:val="en-US"/>
-              </w:rPr>
-            </w:pPr>
+              <w:t xml:space="preserve">Are all files free of the following </w:t>
+            </w:r>
             <w:r>
               <w:rPr>
                 <w:b/>
                 <w:bCs/>
                 <w:lang w:val="en-US"/>
               </w:rPr>
+              <w:lastRenderedPageBreak/>
+              <w:t>special characters (</w:t>
+            </w:r>
+          </w:p>
+          <w:p>
+            <w:pPr>
+              <w:rPr>
+                <w:lang w:val="en-US"/>
+              </w:rPr>
+            </w:pPr>
+            <w:r>
+              <w:rPr>
+                <w:b/>
+                <w:bCs/>
+                <w:lang w:val="en-US"/>
+              </w:rPr>
               <w:t>&amp; , * , % , . , # , * , ( ) , ! , @$ , ^ , ~ , ‘ , { } , [ ] , ? , &lt; &gt;) ?</w:t>
             </w:r>
           </w:p>
@@ -3129,6 +2903,7 @@
               <w:rPr>
                 <w:lang w:val="en-US"/>
               </w:rPr>
+              <w:lastRenderedPageBreak/>
               <w:t>Python scripted.</w:t>
             </w:r>
           </w:p>
@@ -3291,162 +3066,80 @@
           <w:p>
             <w:pPr>
               <w:rPr>
-                <w:sz w:val="2"/>
-                <w:szCs w:val="2"/>
-                <w:lang w:val="en-US"/>
-              </w:rPr>
-            </w:pPr>
-            <w:r>
-              <w:rPr>
-                <w:sz w:val="2"/>
-                <w:szCs w:val="2"/>
-                <w:lang w:val="en-US"/>
-              </w:rPr>
-              <w:t xml:space="preserve">{% for item in </w:t>
-            </w:r>
-            <w:proofErr w:type="spellStart"/>
-            <w:r>
-              <w:rPr>
-                <w:sz w:val="2"/>
-                <w:szCs w:val="2"/>
-                <w:lang w:val="en-US"/>
-              </w:rPr>
-              <w:t>template_</w:t>
+                <w:lang w:val="en-US"/>
+              </w:rPr>
+            </w:pPr>
+            <w:r>
+              <w:rPr>
+                <w:lang w:val="en-US"/>
+              </w:rPr>
+              <w:lastRenderedPageBreak/>
+              <w:t>{% for item in template_dict.special_characters.</w:t>
             </w:r>
             <w:proofErr w:type="gramStart"/>
             <w:r>
               <w:rPr>
-                <w:sz w:val="2"/>
-                <w:szCs w:val="2"/>
-                <w:lang w:val="en-US"/>
-              </w:rPr>
-              <w:t>dict.special</w:t>
+                <w:lang w:val="en-US"/>
+              </w:rPr>
+              <w:t>comments %}</w:t>
             </w:r>
             <w:proofErr w:type="gramEnd"/>
-            <w:r>
-              <w:rPr>
-                <w:sz w:val="2"/>
-                <w:szCs w:val="2"/>
-                <w:lang w:val="en-US"/>
-              </w:rPr>
-              <w:t>_characters.comments</w:t>
-            </w:r>
-            <w:proofErr w:type="spellEnd"/>
-            <w:r>
-              <w:rPr>
-                <w:sz w:val="2"/>
-                <w:szCs w:val="2"/>
-                <w:lang w:val="en-US"/>
-              </w:rPr>
-              <w:t xml:space="preserve"> %}</w:t>
-            </w:r>
-          </w:p>
-          <w:p>
-            <w:pPr>
-              <w:rPr>
-                <w:sz w:val="2"/>
-                <w:szCs w:val="2"/>
-                <w:lang w:val="en-US"/>
-              </w:rPr>
-            </w:pPr>
-            <w:proofErr w:type="gramStart"/>
-            <w:r>
-              <w:rPr>
-                <w:sz w:val="2"/>
-                <w:szCs w:val="2"/>
-                <w:lang w:val="en-US"/>
-              </w:rPr>
-              <w:t xml:space="preserve">{{ </w:t>
-            </w:r>
-            <w:proofErr w:type="spellStart"/>
-            <w:r>
-              <w:rPr>
-                <w:sz w:val="2"/>
-                <w:szCs w:val="2"/>
-                <w:lang w:val="en-US"/>
-              </w:rPr>
-              <w:t>item</w:t>
-            </w:r>
-            <w:proofErr w:type="gramEnd"/>
-            <w:r>
-              <w:rPr>
-                <w:sz w:val="2"/>
-                <w:szCs w:val="2"/>
-                <w:lang w:val="en-US"/>
-              </w:rPr>
-              <w:t>.file_name</w:t>
-            </w:r>
-            <w:proofErr w:type="spellEnd"/>
-            <w:r>
-              <w:rPr>
-                <w:sz w:val="2"/>
-                <w:szCs w:val="2"/>
-                <w:lang w:val="en-US"/>
-              </w:rPr>
-              <w:t xml:space="preserve"> }}</w:t>
-            </w:r>
-          </w:p>
-          <w:p>
-            <w:pPr>
-              <w:rPr>
-                <w:lang w:val="en-US"/>
-              </w:rPr>
-            </w:pPr>
-            <w:r>
-              <w:rPr>
-                <w:sz w:val="2"/>
-                <w:szCs w:val="2"/>
-                <w:lang w:val="en-US"/>
-              </w:rPr>
-              <w:t xml:space="preserve">{% </w:t>
-            </w:r>
-            <w:proofErr w:type="spellStart"/>
-            <w:r>
-              <w:rPr>
-                <w:sz w:val="2"/>
-                <w:szCs w:val="2"/>
-                <w:lang w:val="en-US"/>
-              </w:rPr>
-              <w:t>endfor</w:t>
-            </w:r>
-            <w:proofErr w:type="spellEnd"/>
-            <w:r>
-              <w:rPr>
-                <w:sz w:val="2"/>
-                <w:szCs w:val="2"/>
-                <w:lang w:val="en-US"/>
-              </w:rPr>
-              <w:t xml:space="preserve"> %}</w:t>
-            </w:r>
-          </w:p>
-        </w:tc>
-        <w:tc>
-          <w:tcPr>
-            <w:tcW w:w="0" w:type="auto"/>
-            <w:tcBorders>
-              <w:top w:val="single" w:sz="8" w:space="0" w:color="000000"/>
-              <w:left w:val="single" w:sz="8" w:space="0" w:color="000000"/>
-              <w:bottom w:val="single" w:sz="8" w:space="0" w:color="000000"/>
-              <w:right w:val="single" w:sz="8" w:space="0" w:color="000000"/>
-            </w:tcBorders>
-            <w:tcMar>
-              <w:top w:w="100" w:type="dxa"/>
-              <w:left w:w="100" w:type="dxa"/>
-              <w:bottom w:w="100" w:type="dxa"/>
-              <w:right w:w="100" w:type="dxa"/>
-            </w:tcMar>
-            <w:hideMark/>
-          </w:tcPr>
-          <w:p>
-            <w:pPr>
-              <w:rPr>
-                <w:lang w:val="en-US"/>
-              </w:rPr>
-            </w:pPr>
-            <w:r>
-              <w:rPr>
-                <w:lang w:val="en-US"/>
-              </w:rPr>
+          </w:p>
+          <w:p>
+            <w:pPr>
+              <w:rPr>
+                <w:lang w:val="en-US"/>
+              </w:rPr>
+            </w:pPr>
+            <w:r>
+              <w:rPr>
+                <w:lang w:val="en-US"/>
+              </w:rPr>
+              <w:t>{{ item.file_name }}</w:t>
+            </w:r>
+          </w:p>
+          <w:p>
+            <w:pPr>
+              <w:rPr>
+                <w:lang w:val="en-US"/>
+              </w:rPr>
+            </w:pPr>
+            <w:r>
+              <w:rPr>
+                <w:lang w:val="en-US"/>
+              </w:rPr>
+              <w:t>{% endfor %}</w:t>
+            </w:r>
+          </w:p>
+        </w:tc>
+        <w:tc>
+          <w:tcPr>
+            <w:tcW w:w="0" w:type="auto"/>
+            <w:tcBorders>
+              <w:top w:val="single" w:sz="8" w:space="0" w:color="000000"/>
+              <w:left w:val="single" w:sz="8" w:space="0" w:color="000000"/>
+              <w:bottom w:val="single" w:sz="8" w:space="0" w:color="000000"/>
+              <w:right w:val="single" w:sz="8" w:space="0" w:color="000000"/>
+            </w:tcBorders>
+            <w:tcMar>
+              <w:top w:w="100" w:type="dxa"/>
+              <w:left w:w="100" w:type="dxa"/>
+              <w:bottom w:w="100" w:type="dxa"/>
+              <w:right w:w="100" w:type="dxa"/>
+            </w:tcMar>
+            <w:hideMark/>
+          </w:tcPr>
+          <w:p>
+            <w:pPr>
+              <w:rPr>
+                <w:lang w:val="en-US"/>
+              </w:rPr>
+            </w:pPr>
+            <w:r>
+              <w:rPr>
+                <w:lang w:val="en-US"/>
+              </w:rPr>
+              <w:lastRenderedPageBreak/>
               <w:t>Recommend</w:t>
             </w:r>
           </w:p>
@@ -3601,54 +3294,14 @@
           <w:p>
             <w:pPr>
               <w:rPr>
-                <w:sz w:val="2"/>
-                <w:szCs w:val="2"/>
-                <w:lang w:val="en-US"/>
-              </w:rPr>
-            </w:pPr>
-            <w:r>
-              <w:rPr>
-                <w:sz w:val="2"/>
-                <w:szCs w:val="2"/>
-                <w:lang w:val="en-US"/>
-              </w:rPr>
-              <w:t xml:space="preserve">{% if </w:t>
-            </w:r>
-            <w:proofErr w:type="spellStart"/>
-            <w:r>
-              <w:rPr>
-                <w:sz w:val="2"/>
-                <w:szCs w:val="2"/>
-                <w:lang w:val="en-US"/>
-              </w:rPr>
-              <w:t>template_</w:t>
-            </w:r>
-            <w:proofErr w:type="gramStart"/>
-            <w:r>
-              <w:rPr>
-                <w:sz w:val="2"/>
-                <w:szCs w:val="2"/>
-                <w:lang w:val="en-US"/>
-              </w:rPr>
-              <w:t>dict.readme</w:t>
-            </w:r>
-            <w:proofErr w:type="gramEnd"/>
-            <w:r>
-              <w:rPr>
-                <w:sz w:val="2"/>
-                <w:szCs w:val="2"/>
-                <w:lang w:val="en-US"/>
-              </w:rPr>
-              <w:t>_file.comments|length</w:t>
-            </w:r>
-            <w:proofErr w:type="spellEnd"/>
-            <w:r>
-              <w:rPr>
-                <w:sz w:val="2"/>
-                <w:szCs w:val="2"/>
-                <w:lang w:val="en-US"/>
-              </w:rPr>
-              <w:t xml:space="preserve"> &gt; 0 %}X{% endif %}</w:t>
+                <w:lang w:val="en-US"/>
+              </w:rPr>
+            </w:pPr>
+            <w:r>
+              <w:rPr>
+                <w:lang w:val="en-US"/>
+              </w:rPr>
+              <w:t>{% if template_dict.readme_file.comments|length &gt; 0 %}X{% endif %}</w:t>
             </w:r>
           </w:p>
         </w:tc>
@@ -4149,7 +3802,6 @@
               <w:rPr>
                 <w:lang w:val="en-US"/>
               </w:rPr>
-              <w:lastRenderedPageBreak/>
               <w:t>Info</w:t>
             </w:r>
           </w:p>
@@ -5149,90 +4801,28 @@
           <w:p>
             <w:pPr>
               <w:rPr>
-                <w:sz w:val="2"/>
-                <w:szCs w:val="2"/>
-                <w:lang w:val="en-US"/>
-              </w:rPr>
-            </w:pPr>
-            <w:r>
-              <w:rPr>
-                <w:sz w:val="2"/>
-                <w:szCs w:val="2"/>
-                <w:lang w:val="en-US"/>
-              </w:rPr>
-              <w:t xml:space="preserve">{% for item in </w:t>
-            </w:r>
-            <w:proofErr w:type="spellStart"/>
-            <w:r>
-              <w:rPr>
-                <w:sz w:val="2"/>
-                <w:szCs w:val="2"/>
-                <w:lang w:val="en-US"/>
-              </w:rPr>
-              <w:t>template_</w:t>
+                <w:lang w:val="en-US"/>
+              </w:rPr>
+            </w:pPr>
+            <w:r>
+              <w:rPr>
+                <w:lang w:val="en-US"/>
+              </w:rPr>
+              <w:t>{% for item in template_dict.readme_file.</w:t>
             </w:r>
             <w:proofErr w:type="gramStart"/>
             <w:r>
               <w:rPr>
-                <w:sz w:val="2"/>
-                <w:szCs w:val="2"/>
-                <w:lang w:val="en-US"/>
-              </w:rPr>
-              <w:t>dict.readme</w:t>
+                <w:lang w:val="en-US"/>
+              </w:rPr>
+              <w:t>comments %}{{</w:t>
             </w:r>
             <w:proofErr w:type="gramEnd"/>
             <w:r>
               <w:rPr>
-                <w:sz w:val="2"/>
-                <w:szCs w:val="2"/>
-                <w:lang w:val="en-US"/>
-              </w:rPr>
-              <w:t>_file.comments</w:t>
-            </w:r>
-            <w:proofErr w:type="spellEnd"/>
-            <w:r>
-              <w:rPr>
-                <w:sz w:val="2"/>
-                <w:szCs w:val="2"/>
-                <w:lang w:val="en-US"/>
-              </w:rPr>
-              <w:t xml:space="preserve"> %}{{ </w:t>
-            </w:r>
-            <w:proofErr w:type="spellStart"/>
-            <w:r>
-              <w:rPr>
-                <w:sz w:val="2"/>
-                <w:szCs w:val="2"/>
-                <w:lang w:val="en-US"/>
-              </w:rPr>
-              <w:t>item.file_name</w:t>
-            </w:r>
-            <w:proofErr w:type="spellEnd"/>
-            <w:r>
-              <w:rPr>
-                <w:sz w:val="2"/>
-                <w:szCs w:val="2"/>
-                <w:lang w:val="en-US"/>
-              </w:rPr>
-              <w:t xml:space="preserve"> }}{% </w:t>
-            </w:r>
-            <w:proofErr w:type="spellStart"/>
-            <w:r>
-              <w:rPr>
-                <w:sz w:val="2"/>
-                <w:szCs w:val="2"/>
-                <w:lang w:val="en-US"/>
-              </w:rPr>
-              <w:t>endfor</w:t>
-            </w:r>
-            <w:proofErr w:type="spellEnd"/>
-            <w:r>
-              <w:rPr>
-                <w:sz w:val="2"/>
-                <w:szCs w:val="2"/>
-                <w:lang w:val="en-US"/>
-              </w:rPr>
-              <w:t xml:space="preserve"> %}</w:t>
+                <w:lang w:val="en-US"/>
+              </w:rPr>
+              <w:t xml:space="preserve"> item.file_name }}{% endfor %}</w:t>
             </w:r>
           </w:p>
         </w:tc>
@@ -5712,37 +5302,47 @@
                 <w:bCs/>
                 <w:lang w:val="en-US"/>
               </w:rPr>
-              <w:t>Are all metadata fields free of typos?</w:t>
-            </w:r>
-          </w:p>
-        </w:tc>
-        <w:tc>
-          <w:tcPr>
-            <w:tcW w:w="0" w:type="auto"/>
-            <w:tcBorders>
-              <w:top w:val="single" w:sz="8" w:space="0" w:color="000000"/>
-              <w:left w:val="single" w:sz="8" w:space="0" w:color="000000"/>
-              <w:bottom w:val="single" w:sz="8" w:space="0" w:color="000000"/>
-              <w:right w:val="single" w:sz="8" w:space="0" w:color="000000"/>
-            </w:tcBorders>
-            <w:tcMar>
-              <w:top w:w="100" w:type="dxa"/>
-              <w:left w:w="100" w:type="dxa"/>
-              <w:bottom w:w="100" w:type="dxa"/>
-              <w:right w:w="100" w:type="dxa"/>
-            </w:tcMar>
-            <w:hideMark/>
-          </w:tcPr>
-          <w:p>
-            <w:pPr>
-              <w:rPr>
-                <w:lang w:val="en-US"/>
-              </w:rPr>
-            </w:pPr>
-            <w:r>
-              <w:rPr>
-                <w:lang w:val="en-US"/>
-              </w:rPr>
+              <w:t xml:space="preserve">Are all metadata </w:t>
+            </w:r>
+            <w:r>
+              <w:rPr>
+                <w:b/>
+                <w:bCs/>
+                <w:lang w:val="en-US"/>
+              </w:rPr>
+              <w:lastRenderedPageBreak/>
+              <w:t>fields free of typos?</w:t>
+            </w:r>
+          </w:p>
+        </w:tc>
+        <w:tc>
+          <w:tcPr>
+            <w:tcW w:w="0" w:type="auto"/>
+            <w:tcBorders>
+              <w:top w:val="single" w:sz="8" w:space="0" w:color="000000"/>
+              <w:left w:val="single" w:sz="8" w:space="0" w:color="000000"/>
+              <w:bottom w:val="single" w:sz="8" w:space="0" w:color="000000"/>
+              <w:right w:val="single" w:sz="8" w:space="0" w:color="000000"/>
+            </w:tcBorders>
+            <w:tcMar>
+              <w:top w:w="100" w:type="dxa"/>
+              <w:left w:w="100" w:type="dxa"/>
+              <w:bottom w:w="100" w:type="dxa"/>
+              <w:right w:w="100" w:type="dxa"/>
+            </w:tcMar>
+            <w:hideMark/>
+          </w:tcPr>
+          <w:p>
+            <w:pPr>
+              <w:rPr>
+                <w:lang w:val="en-US"/>
+              </w:rPr>
+            </w:pPr>
+            <w:r>
+              <w:rPr>
+                <w:lang w:val="en-US"/>
+              </w:rPr>
+              <w:lastRenderedPageBreak/>
               <w:t>Python scripted.</w:t>
             </w:r>
           </w:p>
@@ -5763,6 +5363,7 @@
               <w:rPr>
                 <w:lang w:val="en-US"/>
               </w:rPr>
+              <w:lastRenderedPageBreak/>
               <w:t>Only check the following fields:</w:t>
             </w:r>
           </w:p>
@@ -6060,6 +5661,7 @@
               <w:rPr>
                 <w:lang w:val="en-US"/>
               </w:rPr>
+              <w:lastRenderedPageBreak/>
               <w:t>Require</w:t>
             </w:r>
           </w:p>
@@ -6549,7 +6151,6 @@
                 <w:bCs/>
                 <w:lang w:val="en-US"/>
               </w:rPr>
-              <w:lastRenderedPageBreak/>
               <w:t>4.3</w:t>
             </w:r>
           </w:p>
@@ -7279,7 +6880,14 @@
               <w:rPr>
                 <w:lang w:val="en-US"/>
               </w:rPr>
-              <w:t>Review documentation and file names and see if there are any that should be opened and reviewed (e.g. if a file is named “participant survey”, etc.) </w:t>
+              <w:t xml:space="preserve">Review documentation and file names and see if there are any that should be opened and reviewed (e.g. if a file is named </w:t>
+            </w:r>
+            <w:r>
+              <w:rPr>
+                <w:lang w:val="en-US"/>
+              </w:rPr>
+              <w:lastRenderedPageBreak/>
+              <w:t>“participant survey”, etc.) </w:t>
             </w:r>
           </w:p>
           <w:p>
@@ -8314,37 +7922,47 @@
                 <w:bCs/>
                 <w:lang w:val="en-US"/>
               </w:rPr>
-              <w:t>*If there are restricted files in the dataset, is the Terms of Access field complete?</w:t>
-            </w:r>
-          </w:p>
-        </w:tc>
-        <w:tc>
-          <w:tcPr>
-            <w:tcW w:w="0" w:type="auto"/>
-            <w:tcBorders>
-              <w:top w:val="single" w:sz="8" w:space="0" w:color="000000"/>
-              <w:left w:val="single" w:sz="8" w:space="0" w:color="000000"/>
-              <w:bottom w:val="single" w:sz="8" w:space="0" w:color="000000"/>
-              <w:right w:val="single" w:sz="8" w:space="0" w:color="000000"/>
-            </w:tcBorders>
-            <w:tcMar>
-              <w:top w:w="100" w:type="dxa"/>
-              <w:left w:w="100" w:type="dxa"/>
-              <w:bottom w:w="100" w:type="dxa"/>
-              <w:right w:w="100" w:type="dxa"/>
-            </w:tcMar>
-            <w:hideMark/>
-          </w:tcPr>
-          <w:p>
-            <w:pPr>
-              <w:rPr>
-                <w:lang w:val="en-US"/>
-              </w:rPr>
-            </w:pPr>
-            <w:r>
-              <w:rPr>
-                <w:lang w:val="en-US"/>
-              </w:rPr>
+              <w:t xml:space="preserve">*If there are restricted files in the dataset, </w:t>
+            </w:r>
+            <w:r>
+              <w:rPr>
+                <w:b/>
+                <w:bCs/>
+                <w:lang w:val="en-US"/>
+              </w:rPr>
+              <w:lastRenderedPageBreak/>
+              <w:t>is the Terms of Access field complete?</w:t>
+            </w:r>
+          </w:p>
+        </w:tc>
+        <w:tc>
+          <w:tcPr>
+            <w:tcW w:w="0" w:type="auto"/>
+            <w:tcBorders>
+              <w:top w:val="single" w:sz="8" w:space="0" w:color="000000"/>
+              <w:left w:val="single" w:sz="8" w:space="0" w:color="000000"/>
+              <w:bottom w:val="single" w:sz="8" w:space="0" w:color="000000"/>
+              <w:right w:val="single" w:sz="8" w:space="0" w:color="000000"/>
+            </w:tcBorders>
+            <w:tcMar>
+              <w:top w:w="100" w:type="dxa"/>
+              <w:left w:w="100" w:type="dxa"/>
+              <w:bottom w:w="100" w:type="dxa"/>
+              <w:right w:w="100" w:type="dxa"/>
+            </w:tcMar>
+            <w:hideMark/>
+          </w:tcPr>
+          <w:p>
+            <w:pPr>
+              <w:rPr>
+                <w:lang w:val="en-US"/>
+              </w:rPr>
+            </w:pPr>
+            <w:r>
+              <w:rPr>
+                <w:lang w:val="en-US"/>
+              </w:rPr>
+              <w:lastRenderedPageBreak/>
               <w:t>Python scripted.</w:t>
             </w:r>
           </w:p>
@@ -8358,6 +7976,7 @@
               <w:rPr>
                 <w:lang w:val="en-US"/>
               </w:rPr>
+              <w:lastRenderedPageBreak/>
               <w:br/>
             </w:r>
           </w:p>

</xml_diff>

<commit_message>
1. Added support for extracting dataset metadata to the word file.
</commit_message>
<xml_diff>
--- a/res/template_new.docx
+++ b/res/template_new.docx
@@ -6,7 +6,6 @@
       <w:pPr>
         <w:jc w:val="center"/>
         <w:rPr>
-          <w:rFonts w:hint="eastAsia"/>
           <w:b/>
           <w:bCs/>
           <w:sz w:val="40"/>
@@ -27,42 +26,11 @@
       </w:r>
     </w:p>
     <w:p>
-      <w:pPr>
-        <w:rPr>
-          <w:rFonts w:hint="eastAsia"/>
-        </w:rPr>
-      </w:pPr>
       <w:r>
         <w:rPr>
           <w:rFonts w:hint="eastAsia"/>
         </w:rPr>
-        <w:t xml:space="preserve">Ticket number: </w:t>
-      </w:r>
-      <w:proofErr w:type="gramStart"/>
-      <w:r>
-        <w:rPr>
-          <w:rFonts w:hint="eastAsia"/>
-        </w:rPr>
-        <w:t>{ curator</w:t>
-      </w:r>
-      <w:proofErr w:type="gramEnd"/>
-      <w:r>
-        <w:rPr>
-          <w:rFonts w:hint="eastAsia"/>
-        </w:rPr>
-        <w:t>_info.</w:t>
-      </w:r>
-      <w:r>
-        <w:rPr>
-          <w:rFonts w:hint="eastAsia"/>
-        </w:rPr>
-        <w:t>ticket_no</w:t>
-      </w:r>
-      <w:r>
-        <w:rPr>
-          <w:rFonts w:hint="eastAsia"/>
-        </w:rPr>
-        <w:t xml:space="preserve"> }</w:t>
+        <w:t>Ticket number: { curator_info.ticket_no }</w:t>
       </w:r>
     </w:p>
     <w:p>
@@ -70,21 +38,7 @@
         <w:rPr>
           <w:rFonts w:hint="eastAsia"/>
         </w:rPr>
-        <w:t xml:space="preserve">Curator Name: </w:t>
-      </w:r>
-      <w:proofErr w:type="gramStart"/>
-      <w:r>
-        <w:rPr>
-          <w:rFonts w:hint="eastAsia"/>
-        </w:rPr>
-        <w:t>{ curator_info.name</w:t>
-      </w:r>
-      <w:proofErr w:type="gramEnd"/>
-      <w:r>
-        <w:rPr>
-          <w:rFonts w:hint="eastAsia"/>
-        </w:rPr>
-        <w:t xml:space="preserve"> }</w:t>
+        <w:t>Curator Name: { curator_info.name }</w:t>
       </w:r>
     </w:p>
     <w:p>
@@ -92,27 +46,7 @@
         <w:rPr>
           <w:rFonts w:hint="eastAsia"/>
         </w:rPr>
-        <w:t xml:space="preserve">Curator </w:t>
-      </w:r>
-      <w:r>
-        <w:rPr>
-          <w:rFonts w:hint="eastAsia"/>
-        </w:rPr>
-        <w:t xml:space="preserve">Contact: </w:t>
-      </w:r>
-      <w:proofErr w:type="gramStart"/>
-      <w:r>
-        <w:rPr>
-          <w:rFonts w:hint="eastAsia"/>
-        </w:rPr>
-        <w:t>{ curator</w:t>
-      </w:r>
-      <w:proofErr w:type="gramEnd"/>
-      <w:r>
-        <w:rPr>
-          <w:rFonts w:hint="eastAsia"/>
-        </w:rPr>
-        <w:t>_</w:t>
+        <w:t>Curator Contact: { curator_</w:t>
       </w:r>
       <w:r>
         <w:rPr>
@@ -131,28 +65,43 @@
       </w:r>
     </w:p>
     <w:p>
+      <w:pPr>
+        <w:rPr>
+          <w:rFonts w:hint="eastAsia"/>
+        </w:rPr>
+      </w:pPr>
       <w:r>
         <w:rPr>
           <w:rFonts w:hint="eastAsia"/>
         </w:rPr>
         <w:t xml:space="preserve">Dataset title: </w:t>
       </w:r>
-      <w:proofErr w:type="gramStart"/>
       <w:r>
         <w:rPr>
           <w:rFonts w:hint="eastAsia"/>
         </w:rPr>
-        <w:t>( dataset</w:t>
+        <w:t xml:space="preserve">{{ </w:t>
       </w:r>
-      <w:proofErr w:type="gramEnd"/>
       <w:r>
         <w:rPr>
           <w:rFonts w:hint="eastAsia"/>
         </w:rPr>
-        <w:t xml:space="preserve">.title  </w:t>
+        <w:t>dataset.</w:t>
       </w:r>
       <w:r>
-        <w:t>)</w:t>
+        <w:t>DatasetTitle</w:t>
+      </w:r>
+      <w:r>
+        <w:rPr>
+          <w:rFonts w:hint="eastAsia"/>
+        </w:rPr>
+        <w:t xml:space="preserve"> </w:t>
+      </w:r>
+      <w:r>
+        <w:rPr>
+          <w:rFonts w:hint="eastAsia"/>
+        </w:rPr>
+        <w:t>}}</w:t>
       </w:r>
     </w:p>
     <w:p>
@@ -160,64 +109,23 @@
         <w:rPr>
           <w:rFonts w:hint="eastAsia"/>
         </w:rPr>
-        <w:t xml:space="preserve">Dataset doi: </w:t>
+        <w:t xml:space="preserve">Dataset </w:t>
       </w:r>
-      <w:proofErr w:type="gramStart"/>
       <w:r>
-        <w:rPr>
-          <w:rFonts w:hint="eastAsia"/>
-        </w:rPr>
-        <w:t xml:space="preserve">{ </w:t>
+        <w:t>persistent</w:t>
       </w:r>
       <w:r>
         <w:rPr>
           <w:rFonts w:hint="eastAsia"/>
         </w:rPr>
-        <w:t>dataset.doi</w:t>
+        <w:t xml:space="preserve"> identifier</w:t>
       </w:r>
-      <w:proofErr w:type="gramEnd"/>
       <w:r>
         <w:rPr>
           <w:rFonts w:hint="eastAsia"/>
         </w:rPr>
-        <w:t xml:space="preserve">  }</w:t>
+        <w:t>: {</w:t>
       </w:r>
-    </w:p>
-    <w:p>
-      <w:r>
-        <w:rPr>
-          <w:rFonts w:hint="eastAsia"/>
-        </w:rPr>
-        <w:t xml:space="preserve">Dataset access URL: </w:t>
-      </w:r>
-      <w:proofErr w:type="gramStart"/>
-      <w:r>
-        <w:rPr>
-          <w:rFonts w:hint="eastAsia"/>
-        </w:rPr>
-        <w:t>{ dataset.url</w:t>
-      </w:r>
-      <w:proofErr w:type="gramEnd"/>
-      <w:r>
-        <w:rPr>
-          <w:rFonts w:hint="eastAsia"/>
-        </w:rPr>
-        <w:t xml:space="preserve"> }</w:t>
-      </w:r>
-    </w:p>
-    <w:p>
-      <w:pPr>
-        <w:rPr>
-          <w:rFonts w:hint="eastAsia"/>
-        </w:rPr>
-      </w:pPr>
-      <w:r>
-        <w:rPr>
-          <w:rFonts w:hint="eastAsia"/>
-        </w:rPr>
-        <w:t xml:space="preserve">Log generated date: </w:t>
-      </w:r>
-      <w:proofErr w:type="gramStart"/>
       <w:r>
         <w:rPr>
           <w:rFonts w:hint="eastAsia"/>
@@ -234,20 +142,128 @@
         <w:rPr>
           <w:rFonts w:hint="eastAsia"/>
         </w:rPr>
-        <w:t>date</w:t>
+        <w:t>dataset.</w:t>
       </w:r>
-      <w:proofErr w:type="gramEnd"/>
       <w:r>
-        <w:rPr>
-          <w:rFonts w:hint="eastAsia"/>
-        </w:rPr>
-        <w:t>.</w:t>
+        <w:t>DatasetPersistentId</w:t>
       </w:r>
       <w:r>
         <w:rPr>
           <w:rFonts w:hint="eastAsia"/>
         </w:rPr>
-        <w:t>date }</w:t>
+        <w:t xml:space="preserve">  }</w:t>
+      </w:r>
+      <w:r>
+        <w:rPr>
+          <w:rFonts w:hint="eastAsia"/>
+        </w:rPr>
+        <w:t>}</w:t>
+      </w:r>
+    </w:p>
+    <w:p>
+      <w:r>
+        <w:rPr>
+          <w:rFonts w:hint="eastAsia"/>
+        </w:rPr>
+        <w:t>Dataset access URL: {</w:t>
+      </w:r>
+      <w:r>
+        <w:rPr>
+          <w:rFonts w:hint="eastAsia"/>
+        </w:rPr>
+        <w:t>{</w:t>
+      </w:r>
+      <w:r>
+        <w:rPr>
+          <w:rFonts w:hint="eastAsia"/>
+        </w:rPr>
+        <w:t xml:space="preserve"> dataset.</w:t>
+      </w:r>
+      <w:r>
+        <w:t>DatasetURL</w:t>
+      </w:r>
+      <w:r>
+        <w:rPr>
+          <w:rFonts w:hint="eastAsia"/>
+        </w:rPr>
+        <w:t xml:space="preserve"> }</w:t>
+      </w:r>
+      <w:r>
+        <w:rPr>
+          <w:rFonts w:hint="eastAsia"/>
+        </w:rPr>
+        <w:t>}</w:t>
+      </w:r>
+    </w:p>
+    <w:p>
+      <w:r>
+        <w:rPr>
+          <w:rFonts w:hint="eastAsia"/>
+        </w:rPr>
+        <w:t>Log</w:t>
+      </w:r>
+      <w:r>
+        <w:rPr>
+          <w:rFonts w:hint="eastAsia"/>
+        </w:rPr>
+        <w:t xml:space="preserve"> </w:t>
+      </w:r>
+      <w:r>
+        <w:t>initial</w:t>
+      </w:r>
+      <w:r>
+        <w:rPr>
+          <w:rFonts w:hint="eastAsia"/>
+        </w:rPr>
+        <w:t xml:space="preserve"> generated</w:t>
+      </w:r>
+      <w:r>
+        <w:rPr>
+          <w:rFonts w:hint="eastAsia"/>
+        </w:rPr>
+        <w:t xml:space="preserve"> </w:t>
+      </w:r>
+      <w:r>
+        <w:rPr>
+          <w:rFonts w:hint="eastAsia"/>
+        </w:rPr>
+        <w:t xml:space="preserve">date: </w:t>
+      </w:r>
+      <w:r>
+        <w:rPr>
+          <w:rFonts w:hint="eastAsia"/>
+        </w:rPr>
+        <w:t>{</w:t>
+      </w:r>
+      <w:r>
+        <w:rPr>
+          <w:rFonts w:hint="eastAsia"/>
+        </w:rPr>
+        <w:t>{</w:t>
+      </w:r>
+      <w:r>
+        <w:rPr>
+          <w:rFonts w:hint="eastAsia"/>
+        </w:rPr>
+        <w:t xml:space="preserve"> </w:t>
+      </w:r>
+      <w:r>
+        <w:rPr>
+          <w:rFonts w:hint="eastAsia"/>
+        </w:rPr>
+        <w:t>timestamp</w:t>
+      </w:r>
+      <w:r>
+        <w:rPr>
+          <w:rFonts w:hint="eastAsia"/>
+        </w:rPr>
+        <w:t xml:space="preserve"> }</w:t>
+      </w:r>
+      <w:r>
+        <w:rPr>
+          <w:rFonts w:hint="eastAsia"/>
+        </w:rPr>
+        <w:t>}</w:t>
       </w:r>
     </w:p>
     <w:p/>
@@ -1768,21 +1784,7 @@
               <w:rPr>
                 <w:lang w:val="en-US"/>
               </w:rPr>
-              <w:t xml:space="preserve">Confirm with the depositor that they </w:t>
-            </w:r>
-            <w:proofErr w:type="gramStart"/>
-            <w:r>
-              <w:rPr>
-                <w:lang w:val="en-US"/>
-              </w:rPr>
-              <w:t>actually require</w:t>
-            </w:r>
-            <w:proofErr w:type="gramEnd"/>
-            <w:r>
-              <w:rPr>
-                <w:lang w:val="en-US"/>
-              </w:rPr>
-              <w:t xml:space="preserve"> a dataverse (e.g., will there be future deposits?)</w:t>
+              <w:t>Confirm with the depositor that they actually require a dataverse (e.g., will there be future deposits?)</w:t>
             </w:r>
           </w:p>
         </w:tc>
@@ -2645,16 +2647,8 @@
               <w:rPr>
                 <w:lang w:val="en-US"/>
               </w:rPr>
-              <w:t>{% for item in template_dict.file_open.</w:t>
-            </w:r>
-            <w:proofErr w:type="gramStart"/>
-            <w:r>
-              <w:rPr>
-                <w:lang w:val="en-US"/>
-              </w:rPr>
-              <w:t>comments %}</w:t>
-            </w:r>
-            <w:proofErr w:type="gramEnd"/>
+              <w:t>{% for item in template_dict.file_open.comments %}</w:t>
+            </w:r>
           </w:p>
           <w:p>
             <w:pPr>
@@ -2695,19 +2689,11 @@
                 <w:lang w:val="en-US"/>
               </w:rPr>
             </w:pPr>
-            <w:proofErr w:type="gramStart"/>
-            <w:r>
-              <w:rPr>
-                <w:lang w:val="en-US"/>
-              </w:rPr>
-              <w:t>List</w:t>
-            </w:r>
-            <w:proofErr w:type="gramEnd"/>
-            <w:r>
-              <w:rPr>
-                <w:lang w:val="en-US"/>
-              </w:rPr>
-              <w:t xml:space="preserve"> all files that were not checked:</w:t>
+            <w:r>
+              <w:rPr>
+                <w:lang w:val="en-US"/>
+              </w:rPr>
+              <w:t>List all files that were not checked:</w:t>
             </w:r>
           </w:p>
           <w:p>
@@ -3074,16 +3060,8 @@
                 <w:lang w:val="en-US"/>
               </w:rPr>
               <w:lastRenderedPageBreak/>
-              <w:t>{% for item in template_dict.special_characters.</w:t>
-            </w:r>
-            <w:proofErr w:type="gramStart"/>
-            <w:r>
-              <w:rPr>
-                <w:lang w:val="en-US"/>
-              </w:rPr>
-              <w:t>comments %}</w:t>
-            </w:r>
-            <w:proofErr w:type="gramEnd"/>
+              <w:t>{% for item in template_dict.special_characters.comments %}</w:t>
+            </w:r>
           </w:p>
           <w:p>
             <w:pPr>
@@ -4808,21 +4786,7 @@
               <w:rPr>
                 <w:lang w:val="en-US"/>
               </w:rPr>
-              <w:t>{% for item in template_dict.readme_file.</w:t>
-            </w:r>
-            <w:proofErr w:type="gramStart"/>
-            <w:r>
-              <w:rPr>
-                <w:lang w:val="en-US"/>
-              </w:rPr>
-              <w:t>comments %}{{</w:t>
-            </w:r>
-            <w:proofErr w:type="gramEnd"/>
-            <w:r>
-              <w:rPr>
-                <w:lang w:val="en-US"/>
-              </w:rPr>
-              <w:t xml:space="preserve"> item.file_name }}{% endfor %}</w:t>
+              <w:t>{% for item in template_dict.readme_file.comments %}{{ item.file_name }}{% endfor %}</w:t>
             </w:r>
           </w:p>
         </w:tc>
@@ -7994,21 +7958,7 @@
               <w:rPr>
                 <w:lang w:val="en-US"/>
               </w:rPr>
-              <w:t xml:space="preserve">If there are restricted files and no Terms of Access, </w:t>
-            </w:r>
-            <w:proofErr w:type="gramStart"/>
-            <w:r>
-              <w:rPr>
-                <w:lang w:val="en-US"/>
-              </w:rPr>
-              <w:t>recommend</w:t>
-            </w:r>
-            <w:proofErr w:type="gramEnd"/>
-            <w:r>
-              <w:rPr>
-                <w:lang w:val="en-US"/>
-              </w:rPr>
-              <w:t xml:space="preserve"> including terms of access.</w:t>
+              <w:t>If there are restricted files and no Terms of Access, recommend including terms of access.</w:t>
             </w:r>
           </w:p>
         </w:tc>

</xml_diff>

<commit_message>
1. Added support for parsing res/config.yaml as metadata of the project.
</commit_message>
<xml_diff>
--- a/res/template_new.docx
+++ b/res/template_new.docx
@@ -30,38 +30,121 @@
         <w:rPr>
           <w:rFonts w:hint="eastAsia"/>
         </w:rPr>
-        <w:t>Ticket number: { curator_info.ticket_no }</w:t>
-      </w:r>
-    </w:p>
-    <w:p>
-      <w:r>
-        <w:rPr>
-          <w:rFonts w:hint="eastAsia"/>
-        </w:rPr>
-        <w:t>Curator Name: { curator_info.name }</w:t>
-      </w:r>
-    </w:p>
-    <w:p>
-      <w:r>
-        <w:rPr>
-          <w:rFonts w:hint="eastAsia"/>
-        </w:rPr>
-        <w:t>Curator Contact: { curator_</w:t>
+        <w:t>Ticket number: {</w:t>
       </w:r>
       <w:r>
         <w:rPr>
           <w:rFonts w:hint="eastAsia"/>
         </w:rPr>
-        <w:t>info</w:t>
+        <w:t>{</w:t>
       </w:r>
       <w:r>
         <w:rPr>
           <w:rFonts w:hint="eastAsia"/>
         </w:rPr>
-        <w:t xml:space="preserve">.email </w:t>
+        <w:t xml:space="preserve"> </w:t>
+      </w:r>
+      <w:proofErr w:type="spellStart"/>
+      <w:r>
+        <w:rPr>
+          <w:rFonts w:hint="eastAsia"/>
+        </w:rPr>
+        <w:t>curator_info.ticket_n</w:t>
       </w:r>
       <w:r>
+        <w:rPr>
+          <w:rFonts w:hint="eastAsia"/>
+        </w:rPr>
+        <w:t>umber</w:t>
+      </w:r>
+      <w:proofErr w:type="spellEnd"/>
+      <w:r>
+        <w:rPr>
+          <w:rFonts w:hint="eastAsia"/>
+        </w:rPr>
+        <w:t xml:space="preserve"> }</w:t>
+      </w:r>
+      <w:r>
+        <w:rPr>
+          <w:rFonts w:hint="eastAsia"/>
+        </w:rPr>
         <w:t>}</w:t>
+      </w:r>
+    </w:p>
+    <w:p>
+      <w:r>
+        <w:t xml:space="preserve">Curator </w:t>
+      </w:r>
+      <w:r>
+        <w:rPr>
+          <w:rFonts w:hint="eastAsia"/>
+        </w:rPr>
+        <w:t>name</w:t>
+      </w:r>
+      <w:r>
+        <w:t>:</w:t>
+      </w:r>
+      <w:r>
+        <w:rPr>
+          <w:rFonts w:hint="eastAsia"/>
+        </w:rPr>
+        <w:t xml:space="preserve"> {{ </w:t>
+      </w:r>
+      <w:proofErr w:type="spellStart"/>
+      <w:r>
+        <w:rPr>
+          <w:rFonts w:hint="eastAsia"/>
+        </w:rPr>
+        <w:t>curator_info</w:t>
+      </w:r>
+      <w:r>
+        <w:rPr>
+          <w:rFonts w:hint="eastAsia"/>
+        </w:rPr>
+        <w:t>.curator_name</w:t>
+      </w:r>
+      <w:proofErr w:type="spellEnd"/>
+      <w:r>
+        <w:rPr>
+          <w:rFonts w:hint="eastAsia"/>
+        </w:rPr>
+        <w:t xml:space="preserve"> }}</w:t>
+      </w:r>
+    </w:p>
+    <w:p>
+      <w:pPr>
+        <w:rPr>
+          <w:rFonts w:hint="eastAsia"/>
+        </w:rPr>
+      </w:pPr>
+      <w:r>
+        <w:rPr>
+          <w:rFonts w:hint="eastAsia"/>
+        </w:rPr>
+        <w:t xml:space="preserve">Curator email: </w:t>
+      </w:r>
+      <w:r>
+        <w:rPr>
+          <w:rFonts w:hint="eastAsia"/>
+        </w:rPr>
+        <w:t xml:space="preserve">{{ </w:t>
+      </w:r>
+      <w:proofErr w:type="spellStart"/>
+      <w:r>
+        <w:rPr>
+          <w:rFonts w:hint="eastAsia"/>
+        </w:rPr>
+        <w:t>curator_info.</w:t>
+      </w:r>
+      <w:r>
+        <w:t>curator_email</w:t>
+      </w:r>
+      <w:proofErr w:type="spellEnd"/>
+      <w:r>
+        <w:rPr>
+          <w:rFonts w:hint="eastAsia"/>
+        </w:rPr>
+        <w:t xml:space="preserve"> }}</w:t>
       </w:r>
     </w:p>
     <w:p>
@@ -82,6 +165,7 @@
         </w:rPr>
         <w:t xml:space="preserve">{{ </w:t>
       </w:r>
+      <w:proofErr w:type="spellStart"/>
       <w:r>
         <w:rPr>
           <w:rFonts w:hint="eastAsia"/>
@@ -91,6 +175,7 @@
       <w:r>
         <w:t>DatasetTitle</w:t>
       </w:r>
+      <w:proofErr w:type="spellEnd"/>
       <w:r>
         <w:rPr>
           <w:rFonts w:hint="eastAsia"/>
@@ -138,6 +223,7 @@
         </w:rPr>
         <w:t xml:space="preserve"> </w:t>
       </w:r>
+      <w:proofErr w:type="spellStart"/>
       <w:r>
         <w:rPr>
           <w:rFonts w:hint="eastAsia"/>
@@ -147,6 +233,7 @@
       <w:r>
         <w:t>DatasetPersistentId</w:t>
       </w:r>
+      <w:proofErr w:type="spellEnd"/>
       <w:r>
         <w:rPr>
           <w:rFonts w:hint="eastAsia"/>
@@ -158,6 +245,37 @@
           <w:rFonts w:hint="eastAsia"/>
         </w:rPr>
         <w:t>}</w:t>
+      </w:r>
+    </w:p>
+    <w:p>
+      <w:pPr>
+        <w:rPr>
+          <w:rFonts w:hint="eastAsia"/>
+        </w:rPr>
+      </w:pPr>
+      <w:r>
+        <w:rPr>
+          <w:rFonts w:hint="eastAsia"/>
+        </w:rPr>
+        <w:t xml:space="preserve">Dataset ID (versioned): </w:t>
+      </w:r>
+      <w:r>
+        <w:rPr>
+          <w:rFonts w:hint="eastAsia"/>
+        </w:rPr>
+        <w:t>{{ dataset.</w:t>
+      </w:r>
+      <w:r>
+        <w:rPr>
+          <w:rFonts w:hint="eastAsia"/>
+        </w:rPr>
+        <w:t>ID</w:t>
+      </w:r>
+      <w:r>
+        <w:rPr>
+          <w:rFonts w:hint="eastAsia"/>
+        </w:rPr>
+        <w:t xml:space="preserve">  }}</w:t>
       </w:r>
     </w:p>
     <w:p>
@@ -177,11 +295,19 @@
         <w:rPr>
           <w:rFonts w:hint="eastAsia"/>
         </w:rPr>
-        <w:t xml:space="preserve"> dataset.</w:t>
+        <w:t xml:space="preserve"> </w:t>
+      </w:r>
+      <w:proofErr w:type="spellStart"/>
+      <w:r>
+        <w:rPr>
+          <w:rFonts w:hint="eastAsia"/>
+        </w:rPr>
+        <w:t>dataset.</w:t>
       </w:r>
       <w:r>
         <w:t>DatasetURL</w:t>
       </w:r>
+      <w:proofErr w:type="spellEnd"/>
       <w:r>
         <w:rPr>
           <w:rFonts w:hint="eastAsia"/>
@@ -957,7 +1083,25 @@
                 <w:bCs/>
                 <w:lang w:val="en-US"/>
               </w:rPr>
-              <w:t>Has the depositor (or their research group) previously created or submitted to a dataverse?</w:t>
+              <w:t xml:space="preserve">Has the depositor (or their research group) previously created or submitted to a </w:t>
+            </w:r>
+            <w:proofErr w:type="spellStart"/>
+            <w:r>
+              <w:rPr>
+                <w:b/>
+                <w:bCs/>
+                <w:lang w:val="en-US"/>
+              </w:rPr>
+              <w:t>dataverse</w:t>
+            </w:r>
+            <w:proofErr w:type="spellEnd"/>
+            <w:r>
+              <w:rPr>
+                <w:b/>
+                <w:bCs/>
+                <w:lang w:val="en-US"/>
+              </w:rPr>
+              <w:t>?</w:t>
             </w:r>
           </w:p>
         </w:tc>
@@ -1144,7 +1288,21 @@
               <w:rPr>
                 <w:lang w:val="en-US"/>
               </w:rPr>
-              <w:t>If relevant, list previously created dataverse:</w:t>
+              <w:t xml:space="preserve">If relevant, list previously created </w:t>
+            </w:r>
+            <w:proofErr w:type="spellStart"/>
+            <w:r>
+              <w:rPr>
+                <w:lang w:val="en-US"/>
+              </w:rPr>
+              <w:t>dataverse</w:t>
+            </w:r>
+            <w:proofErr w:type="spellEnd"/>
+            <w:r>
+              <w:rPr>
+                <w:lang w:val="en-US"/>
+              </w:rPr>
+              <w:t>:</w:t>
             </w:r>
           </w:p>
         </w:tc>
@@ -1335,210 +1493,266 @@
               <w:rPr>
                 <w:lang w:val="en-US"/>
               </w:rPr>
-              <w:t>If the dataset is deposited in a sub-dataverse collection, include the name of the collection. </w:t>
-            </w:r>
-          </w:p>
-          <w:p>
-            <w:pPr>
-              <w:rPr>
-                <w:lang w:val="en-US"/>
-              </w:rPr>
-            </w:pPr>
-          </w:p>
-        </w:tc>
-        <w:tc>
-          <w:tcPr>
-            <w:tcW w:w="0" w:type="auto"/>
-            <w:tcBorders>
-              <w:top w:val="single" w:sz="8" w:space="0" w:color="000000"/>
-              <w:left w:val="single" w:sz="8" w:space="0" w:color="000000"/>
-              <w:bottom w:val="single" w:sz="8" w:space="0" w:color="000000"/>
-              <w:right w:val="single" w:sz="8" w:space="0" w:color="000000"/>
-            </w:tcBorders>
-            <w:tcMar>
-              <w:top w:w="100" w:type="dxa"/>
-              <w:left w:w="100" w:type="dxa"/>
-              <w:bottom w:w="100" w:type="dxa"/>
-              <w:right w:w="100" w:type="dxa"/>
-            </w:tcMar>
-            <w:hideMark/>
-          </w:tcPr>
-          <w:p>
-            <w:pPr>
-              <w:rPr>
-                <w:lang w:val="en-US"/>
-              </w:rPr>
-            </w:pPr>
-            <w:r>
-              <w:rPr>
-                <w:lang w:val="en-US"/>
-              </w:rPr>
-              <w:t>{% if template_dict.file_open.comments|length == 0 %}X{% endif %}</w:t>
-            </w:r>
-          </w:p>
-          <w:p>
-            <w:pPr>
-              <w:rPr>
-                <w:lang w:val="en-US"/>
-              </w:rPr>
-            </w:pPr>
-          </w:p>
-          <w:p>
-            <w:pPr>
-              <w:rPr>
-                <w:lang w:val="en-US"/>
-              </w:rPr>
-            </w:pPr>
-          </w:p>
-        </w:tc>
-        <w:tc>
-          <w:tcPr>
-            <w:tcW w:w="0" w:type="auto"/>
-            <w:tcBorders>
-              <w:top w:val="single" w:sz="8" w:space="0" w:color="000000"/>
-              <w:left w:val="single" w:sz="8" w:space="0" w:color="000000"/>
-              <w:bottom w:val="single" w:sz="8" w:space="0" w:color="000000"/>
-              <w:right w:val="single" w:sz="8" w:space="0" w:color="000000"/>
-            </w:tcBorders>
-            <w:tcMar>
-              <w:top w:w="100" w:type="dxa"/>
-              <w:left w:w="100" w:type="dxa"/>
-              <w:bottom w:w="100" w:type="dxa"/>
-              <w:right w:w="100" w:type="dxa"/>
-            </w:tcMar>
-            <w:hideMark/>
-          </w:tcPr>
-          <w:p>
-            <w:pPr>
-              <w:rPr>
-                <w:lang w:val="en-US"/>
-              </w:rPr>
-            </w:pPr>
-          </w:p>
-        </w:tc>
-        <w:tc>
-          <w:tcPr>
-            <w:tcW w:w="0" w:type="auto"/>
-            <w:tcBorders>
-              <w:top w:val="single" w:sz="8" w:space="0" w:color="000000"/>
-              <w:left w:val="single" w:sz="8" w:space="0" w:color="000000"/>
-              <w:bottom w:val="single" w:sz="8" w:space="0" w:color="000000"/>
-              <w:right w:val="single" w:sz="8" w:space="0" w:color="000000"/>
-            </w:tcBorders>
-            <w:tcMar>
-              <w:top w:w="100" w:type="dxa"/>
-              <w:left w:w="100" w:type="dxa"/>
-              <w:bottom w:w="100" w:type="dxa"/>
-              <w:right w:w="100" w:type="dxa"/>
-            </w:tcMar>
-            <w:hideMark/>
-          </w:tcPr>
-          <w:p>
-            <w:pPr>
-              <w:rPr>
-                <w:lang w:val="en-US"/>
-              </w:rPr>
-            </w:pPr>
-            <w:r>
-              <w:rPr>
-                <w:lang w:val="en-US"/>
-              </w:rPr>
-              <w:t>{% if template_dict.file_open.comments|length &gt; 0 %}X{% endif %}</w:t>
-            </w:r>
-          </w:p>
-          <w:p>
-            <w:pPr>
-              <w:rPr>
-                <w:lang w:val="en-US"/>
-              </w:rPr>
-            </w:pPr>
-          </w:p>
-          <w:p>
-            <w:pPr>
-              <w:rPr>
-                <w:lang w:val="en-US"/>
-              </w:rPr>
-            </w:pPr>
-          </w:p>
-        </w:tc>
-        <w:tc>
-          <w:tcPr>
-            <w:tcW w:w="0" w:type="auto"/>
-            <w:tcBorders>
-              <w:top w:val="single" w:sz="8" w:space="0" w:color="000000"/>
-              <w:left w:val="single" w:sz="8" w:space="0" w:color="000000"/>
-              <w:bottom w:val="single" w:sz="8" w:space="0" w:color="000000"/>
-              <w:right w:val="single" w:sz="8" w:space="0" w:color="000000"/>
-            </w:tcBorders>
-            <w:tcMar>
-              <w:top w:w="100" w:type="dxa"/>
-              <w:left w:w="100" w:type="dxa"/>
-              <w:bottom w:w="100" w:type="dxa"/>
-              <w:right w:w="100" w:type="dxa"/>
-            </w:tcMar>
-            <w:hideMark/>
-          </w:tcPr>
-          <w:p>
-            <w:pPr>
-              <w:rPr>
-                <w:lang w:val="en-US"/>
-              </w:rPr>
-            </w:pPr>
-          </w:p>
-        </w:tc>
-        <w:tc>
-          <w:tcPr>
-            <w:tcW w:w="0" w:type="auto"/>
-            <w:tcBorders>
-              <w:top w:val="single" w:sz="8" w:space="0" w:color="000000"/>
-              <w:left w:val="single" w:sz="8" w:space="0" w:color="000000"/>
-              <w:bottom w:val="single" w:sz="8" w:space="0" w:color="000000"/>
-              <w:right w:val="single" w:sz="8" w:space="0" w:color="000000"/>
-            </w:tcBorders>
-            <w:tcMar>
-              <w:top w:w="100" w:type="dxa"/>
-              <w:left w:w="100" w:type="dxa"/>
-              <w:bottom w:w="100" w:type="dxa"/>
-              <w:right w:w="100" w:type="dxa"/>
-            </w:tcMar>
-            <w:hideMark/>
-          </w:tcPr>
-          <w:p>
-            <w:pPr>
-              <w:rPr>
-                <w:lang w:val="en-US"/>
-              </w:rPr>
-            </w:pPr>
-          </w:p>
-        </w:tc>
-        <w:tc>
-          <w:tcPr>
-            <w:tcW w:w="0" w:type="auto"/>
-            <w:tcBorders>
-              <w:top w:val="single" w:sz="8" w:space="0" w:color="000000"/>
-              <w:left w:val="single" w:sz="8" w:space="0" w:color="000000"/>
-              <w:bottom w:val="single" w:sz="8" w:space="0" w:color="000000"/>
-              <w:right w:val="single" w:sz="8" w:space="0" w:color="000000"/>
-            </w:tcBorders>
-            <w:tcMar>
-              <w:top w:w="100" w:type="dxa"/>
-              <w:left w:w="100" w:type="dxa"/>
-              <w:bottom w:w="100" w:type="dxa"/>
-              <w:right w:w="100" w:type="dxa"/>
-            </w:tcMar>
-            <w:hideMark/>
-          </w:tcPr>
-          <w:p>
-            <w:pPr>
-              <w:rPr>
-                <w:lang w:val="en-US"/>
-              </w:rPr>
-            </w:pPr>
-            <w:r>
-              <w:rPr>
-                <w:lang w:val="en-US"/>
-              </w:rPr>
-              <w:t>If relevant, name of sub-dataverse collection:</w:t>
+              <w:t>If the dataset is deposited in a sub-</w:t>
+            </w:r>
+            <w:proofErr w:type="spellStart"/>
+            <w:r>
+              <w:rPr>
+                <w:lang w:val="en-US"/>
+              </w:rPr>
+              <w:t>dataverse</w:t>
+            </w:r>
+            <w:proofErr w:type="spellEnd"/>
+            <w:r>
+              <w:rPr>
+                <w:lang w:val="en-US"/>
+              </w:rPr>
+              <w:t xml:space="preserve"> collection, include the name of the collection. </w:t>
+            </w:r>
+          </w:p>
+          <w:p>
+            <w:pPr>
+              <w:rPr>
+                <w:lang w:val="en-US"/>
+              </w:rPr>
+            </w:pPr>
+          </w:p>
+        </w:tc>
+        <w:tc>
+          <w:tcPr>
+            <w:tcW w:w="0" w:type="auto"/>
+            <w:tcBorders>
+              <w:top w:val="single" w:sz="8" w:space="0" w:color="000000"/>
+              <w:left w:val="single" w:sz="8" w:space="0" w:color="000000"/>
+              <w:bottom w:val="single" w:sz="8" w:space="0" w:color="000000"/>
+              <w:right w:val="single" w:sz="8" w:space="0" w:color="000000"/>
+            </w:tcBorders>
+            <w:tcMar>
+              <w:top w:w="100" w:type="dxa"/>
+              <w:left w:w="100" w:type="dxa"/>
+              <w:bottom w:w="100" w:type="dxa"/>
+              <w:right w:w="100" w:type="dxa"/>
+            </w:tcMar>
+            <w:hideMark/>
+          </w:tcPr>
+          <w:p>
+            <w:pPr>
+              <w:rPr>
+                <w:lang w:val="en-US"/>
+              </w:rPr>
+            </w:pPr>
+            <w:r>
+              <w:rPr>
+                <w:lang w:val="en-US"/>
+              </w:rPr>
+              <w:t xml:space="preserve">{% if </w:t>
+            </w:r>
+            <w:proofErr w:type="spellStart"/>
+            <w:r>
+              <w:rPr>
+                <w:lang w:val="en-US"/>
+              </w:rPr>
+              <w:t>template_dict.file_open.comments|length</w:t>
+            </w:r>
+            <w:proofErr w:type="spellEnd"/>
+            <w:r>
+              <w:rPr>
+                <w:lang w:val="en-US"/>
+              </w:rPr>
+              <w:t xml:space="preserve"> == 0 %}X{% endif %}</w:t>
+            </w:r>
+          </w:p>
+          <w:p>
+            <w:pPr>
+              <w:rPr>
+                <w:lang w:val="en-US"/>
+              </w:rPr>
+            </w:pPr>
+          </w:p>
+          <w:p>
+            <w:pPr>
+              <w:rPr>
+                <w:lang w:val="en-US"/>
+              </w:rPr>
+            </w:pPr>
+          </w:p>
+        </w:tc>
+        <w:tc>
+          <w:tcPr>
+            <w:tcW w:w="0" w:type="auto"/>
+            <w:tcBorders>
+              <w:top w:val="single" w:sz="8" w:space="0" w:color="000000"/>
+              <w:left w:val="single" w:sz="8" w:space="0" w:color="000000"/>
+              <w:bottom w:val="single" w:sz="8" w:space="0" w:color="000000"/>
+              <w:right w:val="single" w:sz="8" w:space="0" w:color="000000"/>
+            </w:tcBorders>
+            <w:tcMar>
+              <w:top w:w="100" w:type="dxa"/>
+              <w:left w:w="100" w:type="dxa"/>
+              <w:bottom w:w="100" w:type="dxa"/>
+              <w:right w:w="100" w:type="dxa"/>
+            </w:tcMar>
+            <w:hideMark/>
+          </w:tcPr>
+          <w:p>
+            <w:pPr>
+              <w:rPr>
+                <w:lang w:val="en-US"/>
+              </w:rPr>
+            </w:pPr>
+          </w:p>
+        </w:tc>
+        <w:tc>
+          <w:tcPr>
+            <w:tcW w:w="0" w:type="auto"/>
+            <w:tcBorders>
+              <w:top w:val="single" w:sz="8" w:space="0" w:color="000000"/>
+              <w:left w:val="single" w:sz="8" w:space="0" w:color="000000"/>
+              <w:bottom w:val="single" w:sz="8" w:space="0" w:color="000000"/>
+              <w:right w:val="single" w:sz="8" w:space="0" w:color="000000"/>
+            </w:tcBorders>
+            <w:tcMar>
+              <w:top w:w="100" w:type="dxa"/>
+              <w:left w:w="100" w:type="dxa"/>
+              <w:bottom w:w="100" w:type="dxa"/>
+              <w:right w:w="100" w:type="dxa"/>
+            </w:tcMar>
+            <w:hideMark/>
+          </w:tcPr>
+          <w:p>
+            <w:pPr>
+              <w:rPr>
+                <w:lang w:val="en-US"/>
+              </w:rPr>
+            </w:pPr>
+            <w:r>
+              <w:rPr>
+                <w:lang w:val="en-US"/>
+              </w:rPr>
+              <w:t xml:space="preserve">{% if </w:t>
+            </w:r>
+            <w:proofErr w:type="spellStart"/>
+            <w:r>
+              <w:rPr>
+                <w:lang w:val="en-US"/>
+              </w:rPr>
+              <w:t>template_dict.file_open.comments|length</w:t>
+            </w:r>
+            <w:proofErr w:type="spellEnd"/>
+            <w:r>
+              <w:rPr>
+                <w:lang w:val="en-US"/>
+              </w:rPr>
+              <w:t xml:space="preserve"> &gt; 0 %}X{% endif %}</w:t>
+            </w:r>
+          </w:p>
+          <w:p>
+            <w:pPr>
+              <w:rPr>
+                <w:lang w:val="en-US"/>
+              </w:rPr>
+            </w:pPr>
+          </w:p>
+          <w:p>
+            <w:pPr>
+              <w:rPr>
+                <w:lang w:val="en-US"/>
+              </w:rPr>
+            </w:pPr>
+          </w:p>
+        </w:tc>
+        <w:tc>
+          <w:tcPr>
+            <w:tcW w:w="0" w:type="auto"/>
+            <w:tcBorders>
+              <w:top w:val="single" w:sz="8" w:space="0" w:color="000000"/>
+              <w:left w:val="single" w:sz="8" w:space="0" w:color="000000"/>
+              <w:bottom w:val="single" w:sz="8" w:space="0" w:color="000000"/>
+              <w:right w:val="single" w:sz="8" w:space="0" w:color="000000"/>
+            </w:tcBorders>
+            <w:tcMar>
+              <w:top w:w="100" w:type="dxa"/>
+              <w:left w:w="100" w:type="dxa"/>
+              <w:bottom w:w="100" w:type="dxa"/>
+              <w:right w:w="100" w:type="dxa"/>
+            </w:tcMar>
+            <w:hideMark/>
+          </w:tcPr>
+          <w:p>
+            <w:pPr>
+              <w:rPr>
+                <w:lang w:val="en-US"/>
+              </w:rPr>
+            </w:pPr>
+          </w:p>
+        </w:tc>
+        <w:tc>
+          <w:tcPr>
+            <w:tcW w:w="0" w:type="auto"/>
+            <w:tcBorders>
+              <w:top w:val="single" w:sz="8" w:space="0" w:color="000000"/>
+              <w:left w:val="single" w:sz="8" w:space="0" w:color="000000"/>
+              <w:bottom w:val="single" w:sz="8" w:space="0" w:color="000000"/>
+              <w:right w:val="single" w:sz="8" w:space="0" w:color="000000"/>
+            </w:tcBorders>
+            <w:tcMar>
+              <w:top w:w="100" w:type="dxa"/>
+              <w:left w:w="100" w:type="dxa"/>
+              <w:bottom w:w="100" w:type="dxa"/>
+              <w:right w:w="100" w:type="dxa"/>
+            </w:tcMar>
+            <w:hideMark/>
+          </w:tcPr>
+          <w:p>
+            <w:pPr>
+              <w:rPr>
+                <w:lang w:val="en-US"/>
+              </w:rPr>
+            </w:pPr>
+          </w:p>
+        </w:tc>
+        <w:tc>
+          <w:tcPr>
+            <w:tcW w:w="0" w:type="auto"/>
+            <w:tcBorders>
+              <w:top w:val="single" w:sz="8" w:space="0" w:color="000000"/>
+              <w:left w:val="single" w:sz="8" w:space="0" w:color="000000"/>
+              <w:bottom w:val="single" w:sz="8" w:space="0" w:color="000000"/>
+              <w:right w:val="single" w:sz="8" w:space="0" w:color="000000"/>
+            </w:tcBorders>
+            <w:tcMar>
+              <w:top w:w="100" w:type="dxa"/>
+              <w:left w:w="100" w:type="dxa"/>
+              <w:bottom w:w="100" w:type="dxa"/>
+              <w:right w:w="100" w:type="dxa"/>
+            </w:tcMar>
+            <w:hideMark/>
+          </w:tcPr>
+          <w:p>
+            <w:pPr>
+              <w:rPr>
+                <w:lang w:val="en-US"/>
+              </w:rPr>
+            </w:pPr>
+            <w:r>
+              <w:rPr>
+                <w:lang w:val="en-US"/>
+              </w:rPr>
+              <w:t>If relevant, name of sub-</w:t>
+            </w:r>
+            <w:proofErr w:type="spellStart"/>
+            <w:r>
+              <w:rPr>
+                <w:lang w:val="en-US"/>
+              </w:rPr>
+              <w:t>dataverse</w:t>
+            </w:r>
+            <w:proofErr w:type="spellEnd"/>
+            <w:r>
+              <w:rPr>
+                <w:lang w:val="en-US"/>
+              </w:rPr>
+              <w:t xml:space="preserve"> collection:</w:t>
             </w:r>
           </w:p>
         </w:tc>
@@ -1668,16 +1882,52 @@
                 <w:bCs/>
                 <w:lang w:val="en-US"/>
               </w:rPr>
-              <w:t xml:space="preserve">*If the dataset was deposited in a sub-dataverse collection, does it require </w:t>
-            </w:r>
+              <w:t>*If the dataset was deposited in a sub-</w:t>
+            </w:r>
+            <w:proofErr w:type="spellStart"/>
             <w:r>
               <w:rPr>
                 <w:b/>
                 <w:bCs/>
                 <w:lang w:val="en-US"/>
               </w:rPr>
+              <w:t>dataverse</w:t>
+            </w:r>
+            <w:proofErr w:type="spellEnd"/>
+            <w:r>
+              <w:rPr>
+                <w:b/>
+                <w:bCs/>
+                <w:lang w:val="en-US"/>
+              </w:rPr>
+              <w:t xml:space="preserve"> collection, does it require </w:t>
+            </w:r>
+            <w:r>
+              <w:rPr>
+                <w:b/>
+                <w:bCs/>
+                <w:lang w:val="en-US"/>
+              </w:rPr>
               <w:lastRenderedPageBreak/>
-              <w:t>its own dataverse?</w:t>
+              <w:t xml:space="preserve">its own </w:t>
+            </w:r>
+            <w:proofErr w:type="spellStart"/>
+            <w:r>
+              <w:rPr>
+                <w:b/>
+                <w:bCs/>
+                <w:lang w:val="en-US"/>
+              </w:rPr>
+              <w:t>dataverse</w:t>
+            </w:r>
+            <w:proofErr w:type="spellEnd"/>
+            <w:r>
+              <w:rPr>
+                <w:b/>
+                <w:bCs/>
+                <w:lang w:val="en-US"/>
+              </w:rPr>
+              <w:t>?</w:t>
             </w:r>
           </w:p>
         </w:tc>
@@ -1709,7 +1959,21 @@
                 <w:lang w:val="en-US"/>
               </w:rPr>
               <w:lastRenderedPageBreak/>
-              <w:t>If the depositor created a dataverse with one dataset:</w:t>
+              <w:t xml:space="preserve">If the depositor created a </w:t>
+            </w:r>
+            <w:proofErr w:type="spellStart"/>
+            <w:r>
+              <w:rPr>
+                <w:lang w:val="en-US"/>
+              </w:rPr>
+              <w:t>dataverse</w:t>
+            </w:r>
+            <w:proofErr w:type="spellEnd"/>
+            <w:r>
+              <w:rPr>
+                <w:lang w:val="en-US"/>
+              </w:rPr>
+              <w:t xml:space="preserve"> with one dataset:</w:t>
             </w:r>
           </w:p>
           <w:p>
@@ -1728,12 +1992,20 @@
               </w:rPr>
               <w:t>Is it the only dataset in the sub-</w:t>
             </w:r>
+            <w:proofErr w:type="spellStart"/>
             <w:r>
               <w:rPr>
                 <w:lang w:val="en-US"/>
               </w:rPr>
               <w:lastRenderedPageBreak/>
-              <w:t>dataverse collection?</w:t>
+              <w:t>dataverse</w:t>
+            </w:r>
+            <w:proofErr w:type="spellEnd"/>
+            <w:r>
+              <w:rPr>
+                <w:lang w:val="en-US"/>
+              </w:rPr>
+              <w:t xml:space="preserve"> collection?</w:t>
             </w:r>
           </w:p>
           <w:p>
@@ -1750,7 +2022,21 @@
               <w:rPr>
                 <w:lang w:val="en-US"/>
               </w:rPr>
-              <w:t>Is there another sub-dataverse collection it should be in?</w:t>
+              <w:t>Is there another sub-</w:t>
+            </w:r>
+            <w:proofErr w:type="spellStart"/>
+            <w:r>
+              <w:rPr>
+                <w:lang w:val="en-US"/>
+              </w:rPr>
+              <w:t>dataverse</w:t>
+            </w:r>
+            <w:proofErr w:type="spellEnd"/>
+            <w:r>
+              <w:rPr>
+                <w:lang w:val="en-US"/>
+              </w:rPr>
+              <w:t xml:space="preserve"> collection it should be in?</w:t>
             </w:r>
           </w:p>
           <w:p>
@@ -1784,7 +2070,21 @@
               <w:rPr>
                 <w:lang w:val="en-US"/>
               </w:rPr>
-              <w:t>Confirm with the depositor that they actually require a dataverse (e.g., will there be future deposits?)</w:t>
+              <w:t xml:space="preserve">Confirm with the depositor that they actually require a </w:t>
+            </w:r>
+            <w:proofErr w:type="spellStart"/>
+            <w:r>
+              <w:rPr>
+                <w:lang w:val="en-US"/>
+              </w:rPr>
+              <w:t>dataverse</w:t>
+            </w:r>
+            <w:proofErr w:type="spellEnd"/>
+            <w:r>
+              <w:rPr>
+                <w:lang w:val="en-US"/>
+              </w:rPr>
+              <w:t xml:space="preserve"> (e.g., will there be future deposits?)</w:t>
             </w:r>
           </w:p>
         </w:tc>
@@ -1816,70 +2116,98 @@
                 <w:lang w:val="en-US"/>
               </w:rPr>
               <w:lastRenderedPageBreak/>
-              <w:t>{% if template_dict.special_characters.comments|length == 0 %}X{% endif %}</w:t>
-            </w:r>
-          </w:p>
-          <w:p>
-            <w:pPr>
-              <w:rPr>
-                <w:lang w:val="en-US"/>
-              </w:rPr>
-            </w:pPr>
-          </w:p>
-        </w:tc>
-        <w:tc>
-          <w:tcPr>
-            <w:tcW w:w="0" w:type="auto"/>
-            <w:tcBorders>
-              <w:top w:val="single" w:sz="8" w:space="0" w:color="000000"/>
-              <w:left w:val="single" w:sz="8" w:space="0" w:color="000000"/>
-              <w:bottom w:val="single" w:sz="8" w:space="0" w:color="000000"/>
-              <w:right w:val="single" w:sz="8" w:space="0" w:color="000000"/>
-            </w:tcBorders>
-            <w:tcMar>
-              <w:top w:w="100" w:type="dxa"/>
-              <w:left w:w="100" w:type="dxa"/>
-              <w:bottom w:w="100" w:type="dxa"/>
-              <w:right w:w="100" w:type="dxa"/>
-            </w:tcMar>
-            <w:hideMark/>
-          </w:tcPr>
-          <w:p>
-            <w:pPr>
-              <w:rPr>
-                <w:lang w:val="en-US"/>
-              </w:rPr>
-            </w:pPr>
-          </w:p>
-        </w:tc>
-        <w:tc>
-          <w:tcPr>
-            <w:tcW w:w="0" w:type="auto"/>
-            <w:tcBorders>
-              <w:top w:val="single" w:sz="8" w:space="0" w:color="000000"/>
-              <w:left w:val="single" w:sz="8" w:space="0" w:color="000000"/>
-              <w:bottom w:val="single" w:sz="8" w:space="0" w:color="000000"/>
-              <w:right w:val="single" w:sz="8" w:space="0" w:color="000000"/>
-            </w:tcBorders>
-            <w:tcMar>
-              <w:top w:w="100" w:type="dxa"/>
-              <w:left w:w="100" w:type="dxa"/>
-              <w:bottom w:w="100" w:type="dxa"/>
-              <w:right w:w="100" w:type="dxa"/>
-            </w:tcMar>
-            <w:hideMark/>
-          </w:tcPr>
-          <w:p>
-            <w:pPr>
-              <w:rPr>
-                <w:lang w:val="en-US"/>
-              </w:rPr>
-            </w:pPr>
-            <w:r>
-              <w:rPr>
-                <w:lang w:val="en-US"/>
-              </w:rPr>
-              <w:t>{% if template_dict.special_characters.comments|length &gt; 0 %}X{% endif %}</w:t>
+              <w:t xml:space="preserve">{% if </w:t>
+            </w:r>
+            <w:proofErr w:type="spellStart"/>
+            <w:r>
+              <w:rPr>
+                <w:lang w:val="en-US"/>
+              </w:rPr>
+              <w:t>template_dict.special_characters.comments|length</w:t>
+            </w:r>
+            <w:proofErr w:type="spellEnd"/>
+            <w:r>
+              <w:rPr>
+                <w:lang w:val="en-US"/>
+              </w:rPr>
+              <w:t xml:space="preserve"> == 0 %}X{% endif %}</w:t>
+            </w:r>
+          </w:p>
+          <w:p>
+            <w:pPr>
+              <w:rPr>
+                <w:lang w:val="en-US"/>
+              </w:rPr>
+            </w:pPr>
+          </w:p>
+        </w:tc>
+        <w:tc>
+          <w:tcPr>
+            <w:tcW w:w="0" w:type="auto"/>
+            <w:tcBorders>
+              <w:top w:val="single" w:sz="8" w:space="0" w:color="000000"/>
+              <w:left w:val="single" w:sz="8" w:space="0" w:color="000000"/>
+              <w:bottom w:val="single" w:sz="8" w:space="0" w:color="000000"/>
+              <w:right w:val="single" w:sz="8" w:space="0" w:color="000000"/>
+            </w:tcBorders>
+            <w:tcMar>
+              <w:top w:w="100" w:type="dxa"/>
+              <w:left w:w="100" w:type="dxa"/>
+              <w:bottom w:w="100" w:type="dxa"/>
+              <w:right w:w="100" w:type="dxa"/>
+            </w:tcMar>
+            <w:hideMark/>
+          </w:tcPr>
+          <w:p>
+            <w:pPr>
+              <w:rPr>
+                <w:lang w:val="en-US"/>
+              </w:rPr>
+            </w:pPr>
+          </w:p>
+        </w:tc>
+        <w:tc>
+          <w:tcPr>
+            <w:tcW w:w="0" w:type="auto"/>
+            <w:tcBorders>
+              <w:top w:val="single" w:sz="8" w:space="0" w:color="000000"/>
+              <w:left w:val="single" w:sz="8" w:space="0" w:color="000000"/>
+              <w:bottom w:val="single" w:sz="8" w:space="0" w:color="000000"/>
+              <w:right w:val="single" w:sz="8" w:space="0" w:color="000000"/>
+            </w:tcBorders>
+            <w:tcMar>
+              <w:top w:w="100" w:type="dxa"/>
+              <w:left w:w="100" w:type="dxa"/>
+              <w:bottom w:w="100" w:type="dxa"/>
+              <w:right w:w="100" w:type="dxa"/>
+            </w:tcMar>
+            <w:hideMark/>
+          </w:tcPr>
+          <w:p>
+            <w:pPr>
+              <w:rPr>
+                <w:lang w:val="en-US"/>
+              </w:rPr>
+            </w:pPr>
+            <w:r>
+              <w:rPr>
+                <w:lang w:val="en-US"/>
+              </w:rPr>
+              <w:t xml:space="preserve">{% if </w:t>
+            </w:r>
+            <w:proofErr w:type="spellStart"/>
+            <w:r>
+              <w:rPr>
+                <w:lang w:val="en-US"/>
+              </w:rPr>
+              <w:t>template_dict.special_characters.comments|length</w:t>
+            </w:r>
+            <w:proofErr w:type="spellEnd"/>
+            <w:r>
+              <w:rPr>
+                <w:lang w:val="en-US"/>
+              </w:rPr>
+              <w:t xml:space="preserve"> &gt; 0 %}X{% endif %}</w:t>
             </w:r>
           </w:p>
           <w:p>
@@ -2497,63 +2825,91 @@
               <w:rPr>
                 <w:lang w:val="en-US"/>
               </w:rPr>
-              <w:t>{% if template_dict.file_ext.comments|length == 0 %}X{% endif %}</w:t>
-            </w:r>
-          </w:p>
-        </w:tc>
-        <w:tc>
-          <w:tcPr>
-            <w:tcW w:w="0" w:type="auto"/>
-            <w:tcBorders>
-              <w:top w:val="single" w:sz="8" w:space="0" w:color="000000"/>
-              <w:left w:val="single" w:sz="8" w:space="0" w:color="000000"/>
-              <w:bottom w:val="single" w:sz="8" w:space="0" w:color="000000"/>
-              <w:right w:val="single" w:sz="8" w:space="0" w:color="000000"/>
-            </w:tcBorders>
-            <w:tcMar>
-              <w:top w:w="100" w:type="dxa"/>
-              <w:left w:w="100" w:type="dxa"/>
-              <w:bottom w:w="100" w:type="dxa"/>
-              <w:right w:w="100" w:type="dxa"/>
-            </w:tcMar>
-            <w:hideMark/>
-          </w:tcPr>
-          <w:p>
-            <w:pPr>
-              <w:rPr>
-                <w:lang w:val="en-US"/>
-              </w:rPr>
-            </w:pPr>
-          </w:p>
-        </w:tc>
-        <w:tc>
-          <w:tcPr>
-            <w:tcW w:w="0" w:type="auto"/>
-            <w:tcBorders>
-              <w:top w:val="single" w:sz="8" w:space="0" w:color="000000"/>
-              <w:left w:val="single" w:sz="8" w:space="0" w:color="000000"/>
-              <w:bottom w:val="single" w:sz="8" w:space="0" w:color="000000"/>
-              <w:right w:val="single" w:sz="8" w:space="0" w:color="000000"/>
-            </w:tcBorders>
-            <w:tcMar>
-              <w:top w:w="100" w:type="dxa"/>
-              <w:left w:w="100" w:type="dxa"/>
-              <w:bottom w:w="100" w:type="dxa"/>
-              <w:right w:w="100" w:type="dxa"/>
-            </w:tcMar>
-            <w:hideMark/>
-          </w:tcPr>
-          <w:p>
-            <w:pPr>
-              <w:rPr>
-                <w:lang w:val="en-US"/>
-              </w:rPr>
-            </w:pPr>
-            <w:r>
-              <w:rPr>
-                <w:lang w:val="en-US"/>
-              </w:rPr>
-              <w:t>{% if template_dict.file_ext.comments|length &gt; 0 %}X{% endif %}</w:t>
+              <w:t xml:space="preserve">{% if </w:t>
+            </w:r>
+            <w:proofErr w:type="spellStart"/>
+            <w:r>
+              <w:rPr>
+                <w:lang w:val="en-US"/>
+              </w:rPr>
+              <w:t>template_dict.file_ext.comments|length</w:t>
+            </w:r>
+            <w:proofErr w:type="spellEnd"/>
+            <w:r>
+              <w:rPr>
+                <w:lang w:val="en-US"/>
+              </w:rPr>
+              <w:t xml:space="preserve"> == 0 %}X{% endif %}</w:t>
+            </w:r>
+          </w:p>
+        </w:tc>
+        <w:tc>
+          <w:tcPr>
+            <w:tcW w:w="0" w:type="auto"/>
+            <w:tcBorders>
+              <w:top w:val="single" w:sz="8" w:space="0" w:color="000000"/>
+              <w:left w:val="single" w:sz="8" w:space="0" w:color="000000"/>
+              <w:bottom w:val="single" w:sz="8" w:space="0" w:color="000000"/>
+              <w:right w:val="single" w:sz="8" w:space="0" w:color="000000"/>
+            </w:tcBorders>
+            <w:tcMar>
+              <w:top w:w="100" w:type="dxa"/>
+              <w:left w:w="100" w:type="dxa"/>
+              <w:bottom w:w="100" w:type="dxa"/>
+              <w:right w:w="100" w:type="dxa"/>
+            </w:tcMar>
+            <w:hideMark/>
+          </w:tcPr>
+          <w:p>
+            <w:pPr>
+              <w:rPr>
+                <w:lang w:val="en-US"/>
+              </w:rPr>
+            </w:pPr>
+          </w:p>
+        </w:tc>
+        <w:tc>
+          <w:tcPr>
+            <w:tcW w:w="0" w:type="auto"/>
+            <w:tcBorders>
+              <w:top w:val="single" w:sz="8" w:space="0" w:color="000000"/>
+              <w:left w:val="single" w:sz="8" w:space="0" w:color="000000"/>
+              <w:bottom w:val="single" w:sz="8" w:space="0" w:color="000000"/>
+              <w:right w:val="single" w:sz="8" w:space="0" w:color="000000"/>
+            </w:tcBorders>
+            <w:tcMar>
+              <w:top w:w="100" w:type="dxa"/>
+              <w:left w:w="100" w:type="dxa"/>
+              <w:bottom w:w="100" w:type="dxa"/>
+              <w:right w:w="100" w:type="dxa"/>
+            </w:tcMar>
+            <w:hideMark/>
+          </w:tcPr>
+          <w:p>
+            <w:pPr>
+              <w:rPr>
+                <w:lang w:val="en-US"/>
+              </w:rPr>
+            </w:pPr>
+            <w:r>
+              <w:rPr>
+                <w:lang w:val="en-US"/>
+              </w:rPr>
+              <w:t xml:space="preserve">{% if </w:t>
+            </w:r>
+            <w:proofErr w:type="spellStart"/>
+            <w:r>
+              <w:rPr>
+                <w:lang w:val="en-US"/>
+              </w:rPr>
+              <w:t>template_dict.file_ext.comments|length</w:t>
+            </w:r>
+            <w:proofErr w:type="spellEnd"/>
+            <w:r>
+              <w:rPr>
+                <w:lang w:val="en-US"/>
+              </w:rPr>
+              <w:t xml:space="preserve"> &gt; 0 %}X{% endif %}</w:t>
             </w:r>
           </w:p>
         </w:tc>
@@ -2647,33 +3003,75 @@
               <w:rPr>
                 <w:lang w:val="en-US"/>
               </w:rPr>
-              <w:t>{% for item in template_dict.file_open.comments %}</w:t>
-            </w:r>
-          </w:p>
-          <w:p>
-            <w:pPr>
-              <w:rPr>
-                <w:lang w:val="en-US"/>
-              </w:rPr>
-            </w:pPr>
-            <w:r>
-              <w:rPr>
-                <w:lang w:val="en-US"/>
-              </w:rPr>
-              <w:t>{{ item.file_name }}</w:t>
-            </w:r>
-          </w:p>
-          <w:p>
-            <w:pPr>
-              <w:rPr>
-                <w:lang w:val="en-US"/>
-              </w:rPr>
-            </w:pPr>
-            <w:r>
-              <w:rPr>
-                <w:lang w:val="en-US"/>
-              </w:rPr>
-              <w:t>{% endfor %}</w:t>
+              <w:t xml:space="preserve">{% for item in </w:t>
+            </w:r>
+            <w:proofErr w:type="spellStart"/>
+            <w:r>
+              <w:rPr>
+                <w:lang w:val="en-US"/>
+              </w:rPr>
+              <w:t>template_dict.file_open.comments</w:t>
+            </w:r>
+            <w:proofErr w:type="spellEnd"/>
+            <w:r>
+              <w:rPr>
+                <w:lang w:val="en-US"/>
+              </w:rPr>
+              <w:t xml:space="preserve"> %}</w:t>
+            </w:r>
+          </w:p>
+          <w:p>
+            <w:pPr>
+              <w:rPr>
+                <w:lang w:val="en-US"/>
+              </w:rPr>
+            </w:pPr>
+            <w:r>
+              <w:rPr>
+                <w:lang w:val="en-US"/>
+              </w:rPr>
+              <w:t xml:space="preserve">{{ </w:t>
+            </w:r>
+            <w:proofErr w:type="spellStart"/>
+            <w:r>
+              <w:rPr>
+                <w:lang w:val="en-US"/>
+              </w:rPr>
+              <w:t>item.file_name</w:t>
+            </w:r>
+            <w:proofErr w:type="spellEnd"/>
+            <w:r>
+              <w:rPr>
+                <w:lang w:val="en-US"/>
+              </w:rPr>
+              <w:t xml:space="preserve"> }}</w:t>
+            </w:r>
+          </w:p>
+          <w:p>
+            <w:pPr>
+              <w:rPr>
+                <w:lang w:val="en-US"/>
+              </w:rPr>
+            </w:pPr>
+            <w:r>
+              <w:rPr>
+                <w:lang w:val="en-US"/>
+              </w:rPr>
+              <w:t xml:space="preserve">{% </w:t>
+            </w:r>
+            <w:proofErr w:type="spellStart"/>
+            <w:r>
+              <w:rPr>
+                <w:lang w:val="en-US"/>
+              </w:rPr>
+              <w:t>endfor</w:t>
+            </w:r>
+            <w:proofErr w:type="spellEnd"/>
+            <w:r>
+              <w:rPr>
+                <w:lang w:val="en-US"/>
+              </w:rPr>
+              <w:t xml:space="preserve"> %}</w:t>
             </w:r>
           </w:p>
           <w:p>
@@ -3060,33 +3458,75 @@
                 <w:lang w:val="en-US"/>
               </w:rPr>
               <w:lastRenderedPageBreak/>
-              <w:t>{% for item in template_dict.special_characters.comments %}</w:t>
-            </w:r>
-          </w:p>
-          <w:p>
-            <w:pPr>
-              <w:rPr>
-                <w:lang w:val="en-US"/>
-              </w:rPr>
-            </w:pPr>
-            <w:r>
-              <w:rPr>
-                <w:lang w:val="en-US"/>
-              </w:rPr>
-              <w:t>{{ item.file_name }}</w:t>
-            </w:r>
-          </w:p>
-          <w:p>
-            <w:pPr>
-              <w:rPr>
-                <w:lang w:val="en-US"/>
-              </w:rPr>
-            </w:pPr>
-            <w:r>
-              <w:rPr>
-                <w:lang w:val="en-US"/>
-              </w:rPr>
-              <w:t>{% endfor %}</w:t>
+              <w:t xml:space="preserve">{% for item in </w:t>
+            </w:r>
+            <w:proofErr w:type="spellStart"/>
+            <w:r>
+              <w:rPr>
+                <w:lang w:val="en-US"/>
+              </w:rPr>
+              <w:t>template_dict.special_characters.comments</w:t>
+            </w:r>
+            <w:proofErr w:type="spellEnd"/>
+            <w:r>
+              <w:rPr>
+                <w:lang w:val="en-US"/>
+              </w:rPr>
+              <w:t xml:space="preserve"> %}</w:t>
+            </w:r>
+          </w:p>
+          <w:p>
+            <w:pPr>
+              <w:rPr>
+                <w:lang w:val="en-US"/>
+              </w:rPr>
+            </w:pPr>
+            <w:r>
+              <w:rPr>
+                <w:lang w:val="en-US"/>
+              </w:rPr>
+              <w:t xml:space="preserve">{{ </w:t>
+            </w:r>
+            <w:proofErr w:type="spellStart"/>
+            <w:r>
+              <w:rPr>
+                <w:lang w:val="en-US"/>
+              </w:rPr>
+              <w:t>item.file_name</w:t>
+            </w:r>
+            <w:proofErr w:type="spellEnd"/>
+            <w:r>
+              <w:rPr>
+                <w:lang w:val="en-US"/>
+              </w:rPr>
+              <w:t xml:space="preserve"> }}</w:t>
+            </w:r>
+          </w:p>
+          <w:p>
+            <w:pPr>
+              <w:rPr>
+                <w:lang w:val="en-US"/>
+              </w:rPr>
+            </w:pPr>
+            <w:r>
+              <w:rPr>
+                <w:lang w:val="en-US"/>
+              </w:rPr>
+              <w:t xml:space="preserve">{% </w:t>
+            </w:r>
+            <w:proofErr w:type="spellStart"/>
+            <w:r>
+              <w:rPr>
+                <w:lang w:val="en-US"/>
+              </w:rPr>
+              <w:t>endfor</w:t>
+            </w:r>
+            <w:proofErr w:type="spellEnd"/>
+            <w:r>
+              <w:rPr>
+                <w:lang w:val="en-US"/>
+              </w:rPr>
+              <w:t xml:space="preserve"> %}</w:t>
             </w:r>
           </w:p>
         </w:tc>
@@ -3279,7 +3719,21 @@
               <w:rPr>
                 <w:lang w:val="en-US"/>
               </w:rPr>
-              <w:t>{% if template_dict.readme_file.comments|length &gt; 0 %}X{% endif %}</w:t>
+              <w:t xml:space="preserve">{% if </w:t>
+            </w:r>
+            <w:proofErr w:type="spellStart"/>
+            <w:r>
+              <w:rPr>
+                <w:lang w:val="en-US"/>
+              </w:rPr>
+              <w:t>template_dict.readme_file.comments|length</w:t>
+            </w:r>
+            <w:proofErr w:type="spellEnd"/>
+            <w:r>
+              <w:rPr>
+                <w:lang w:val="en-US"/>
+              </w:rPr>
+              <w:t xml:space="preserve"> &gt; 0 %}X{% endif %}</w:t>
             </w:r>
           </w:p>
         </w:tc>
@@ -4786,7 +5240,49 @@
               <w:rPr>
                 <w:lang w:val="en-US"/>
               </w:rPr>
-              <w:t>{% for item in template_dict.readme_file.comments %}{{ item.file_name }}{% endfor %}</w:t>
+              <w:t xml:space="preserve">{% for item in </w:t>
+            </w:r>
+            <w:proofErr w:type="spellStart"/>
+            <w:r>
+              <w:rPr>
+                <w:lang w:val="en-US"/>
+              </w:rPr>
+              <w:t>template_dict.readme_file.comments</w:t>
+            </w:r>
+            <w:proofErr w:type="spellEnd"/>
+            <w:r>
+              <w:rPr>
+                <w:lang w:val="en-US"/>
+              </w:rPr>
+              <w:t xml:space="preserve"> %}{{ </w:t>
+            </w:r>
+            <w:proofErr w:type="spellStart"/>
+            <w:r>
+              <w:rPr>
+                <w:lang w:val="en-US"/>
+              </w:rPr>
+              <w:t>item.file_name</w:t>
+            </w:r>
+            <w:proofErr w:type="spellEnd"/>
+            <w:r>
+              <w:rPr>
+                <w:lang w:val="en-US"/>
+              </w:rPr>
+              <w:t xml:space="preserve"> }}{% </w:t>
+            </w:r>
+            <w:proofErr w:type="spellStart"/>
+            <w:r>
+              <w:rPr>
+                <w:lang w:val="en-US"/>
+              </w:rPr>
+              <w:t>endfor</w:t>
+            </w:r>
+            <w:proofErr w:type="spellEnd"/>
+            <w:r>
+              <w:rPr>
+                <w:lang w:val="en-US"/>
+              </w:rPr>
+              <w:t xml:space="preserve"> %}</w:t>
             </w:r>
           </w:p>
         </w:tc>

</xml_diff>

<commit_message>
1. Added searching of author previously deposited datasets into any of the dataverse collection.
</commit_message>
<xml_diff>
--- a/res/template_new.docx
+++ b/res/template_new.docx
@@ -30,7 +30,14 @@
         <w:rPr>
           <w:rFonts w:hint="eastAsia"/>
         </w:rPr>
-        <w:t>Ticket number: {</w:t>
+        <w:t xml:space="preserve">Ticket number: </w:t>
+      </w:r>
+      <w:proofErr w:type="gramStart"/>
+      <w:r>
+        <w:rPr>
+          <w:rFonts w:hint="eastAsia"/>
+        </w:rPr>
+        <w:t>{</w:t>
       </w:r>
       <w:r>
         <w:rPr>
@@ -49,7 +56,14 @@
         <w:rPr>
           <w:rFonts w:hint="eastAsia"/>
         </w:rPr>
-        <w:t>curator_info.ticket_n</w:t>
+        <w:t>curator</w:t>
+      </w:r>
+      <w:proofErr w:type="gramEnd"/>
+      <w:r>
+        <w:rPr>
+          <w:rFonts w:hint="eastAsia"/>
+        </w:rPr>
+        <w:t>_info.ticket_n</w:t>
       </w:r>
       <w:r>
         <w:rPr>
@@ -88,41 +102,9 @@
         <w:rPr>
           <w:rFonts w:hint="eastAsia"/>
         </w:rPr>
-        <w:t xml:space="preserve"> {{ </w:t>
+        <w:t xml:space="preserve"> </w:t>
       </w:r>
-      <w:proofErr w:type="spellStart"/>
-      <w:r>
-        <w:rPr>
-          <w:rFonts w:hint="eastAsia"/>
-        </w:rPr>
-        <w:t>curator_info</w:t>
-      </w:r>
-      <w:r>
-        <w:rPr>
-          <w:rFonts w:hint="eastAsia"/>
-        </w:rPr>
-        <w:t>.curator_name</w:t>
-      </w:r>
-      <w:proofErr w:type="spellEnd"/>
-      <w:r>
-        <w:rPr>
-          <w:rFonts w:hint="eastAsia"/>
-        </w:rPr>
-        <w:t xml:space="preserve"> }}</w:t>
-      </w:r>
-    </w:p>
-    <w:p>
-      <w:pPr>
-        <w:rPr>
-          <w:rFonts w:hint="eastAsia"/>
-        </w:rPr>
-      </w:pPr>
-      <w:r>
-        <w:rPr>
-          <w:rFonts w:hint="eastAsia"/>
-        </w:rPr>
-        <w:t xml:space="preserve">Curator email: </w:t>
-      </w:r>
+      <w:proofErr w:type="gramStart"/>
       <w:r>
         <w:rPr>
           <w:rFonts w:hint="eastAsia"/>
@@ -134,7 +116,50 @@
         <w:rPr>
           <w:rFonts w:hint="eastAsia"/>
         </w:rPr>
-        <w:t>curator_info.</w:t>
+        <w:t>curator</w:t>
+      </w:r>
+      <w:proofErr w:type="gramEnd"/>
+      <w:r>
+        <w:rPr>
+          <w:rFonts w:hint="eastAsia"/>
+        </w:rPr>
+        <w:t>_info.curator_name</w:t>
+      </w:r>
+      <w:proofErr w:type="spellEnd"/>
+      <w:r>
+        <w:rPr>
+          <w:rFonts w:hint="eastAsia"/>
+        </w:rPr>
+        <w:t xml:space="preserve"> }}</w:t>
+      </w:r>
+    </w:p>
+    <w:p>
+      <w:r>
+        <w:rPr>
+          <w:rFonts w:hint="eastAsia"/>
+        </w:rPr>
+        <w:t xml:space="preserve">Curator email: </w:t>
+      </w:r>
+      <w:proofErr w:type="gramStart"/>
+      <w:r>
+        <w:rPr>
+          <w:rFonts w:hint="eastAsia"/>
+        </w:rPr>
+        <w:t xml:space="preserve">{{ </w:t>
+      </w:r>
+      <w:proofErr w:type="spellStart"/>
+      <w:r>
+        <w:rPr>
+          <w:rFonts w:hint="eastAsia"/>
+        </w:rPr>
+        <w:t>curator</w:t>
+      </w:r>
+      <w:proofErr w:type="gramEnd"/>
+      <w:r>
+        <w:rPr>
+          <w:rFonts w:hint="eastAsia"/>
+        </w:rPr>
+        <w:t>_info.</w:t>
       </w:r>
       <w:r>
         <w:t>curator_email</w:t>
@@ -148,17 +173,13 @@
       </w:r>
     </w:p>
     <w:p>
-      <w:pPr>
-        <w:rPr>
-          <w:rFonts w:hint="eastAsia"/>
-        </w:rPr>
-      </w:pPr>
       <w:r>
         <w:rPr>
           <w:rFonts w:hint="eastAsia"/>
         </w:rPr>
         <w:t xml:space="preserve">Dataset title: </w:t>
       </w:r>
+      <w:proofErr w:type="gramStart"/>
       <w:r>
         <w:rPr>
           <w:rFonts w:hint="eastAsia"/>
@@ -170,7 +191,14 @@
         <w:rPr>
           <w:rFonts w:hint="eastAsia"/>
         </w:rPr>
-        <w:t>dataset.</w:t>
+        <w:t>dataset</w:t>
+      </w:r>
+      <w:proofErr w:type="gramEnd"/>
+      <w:r>
+        <w:rPr>
+          <w:rFonts w:hint="eastAsia"/>
+        </w:rPr>
+        <w:t>.</w:t>
       </w:r>
       <w:r>
         <w:t>DatasetTitle</w:t>
@@ -209,7 +237,14 @@
         <w:rPr>
           <w:rFonts w:hint="eastAsia"/>
         </w:rPr>
-        <w:t>: {</w:t>
+        <w:t xml:space="preserve">: </w:t>
+      </w:r>
+      <w:proofErr w:type="gramStart"/>
+      <w:r>
+        <w:rPr>
+          <w:rFonts w:hint="eastAsia"/>
+        </w:rPr>
+        <w:t>{</w:t>
       </w:r>
       <w:r>
         <w:rPr>
@@ -228,7 +263,14 @@
         <w:rPr>
           <w:rFonts w:hint="eastAsia"/>
         </w:rPr>
-        <w:t>dataset.</w:t>
+        <w:t>dataset</w:t>
+      </w:r>
+      <w:proofErr w:type="gramEnd"/>
+      <w:r>
+        <w:rPr>
+          <w:rFonts w:hint="eastAsia"/>
+        </w:rPr>
+        <w:t>.</w:t>
       </w:r>
       <w:r>
         <w:t>DatasetPersistentId</w:t>
@@ -248,29 +290,20 @@
       </w:r>
     </w:p>
     <w:p>
-      <w:pPr>
-        <w:rPr>
-          <w:rFonts w:hint="eastAsia"/>
-        </w:rPr>
-      </w:pPr>
       <w:r>
         <w:rPr>
           <w:rFonts w:hint="eastAsia"/>
         </w:rPr>
         <w:t xml:space="preserve">Dataset ID (versioned): </w:t>
       </w:r>
+      <w:proofErr w:type="gramStart"/>
       <w:r>
         <w:rPr>
           <w:rFonts w:hint="eastAsia"/>
         </w:rPr>
-        <w:t>{{ dataset.</w:t>
+        <w:t>{{ dataset.ID</w:t>
       </w:r>
-      <w:r>
-        <w:rPr>
-          <w:rFonts w:hint="eastAsia"/>
-        </w:rPr>
-        <w:t>ID</w:t>
-      </w:r>
+      <w:proofErr w:type="gramEnd"/>
       <w:r>
         <w:rPr>
           <w:rFonts w:hint="eastAsia"/>
@@ -283,7 +316,14 @@
         <w:rPr>
           <w:rFonts w:hint="eastAsia"/>
         </w:rPr>
-        <w:t>Dataset access URL: {</w:t>
+        <w:t xml:space="preserve">Dataset access URL: </w:t>
+      </w:r>
+      <w:proofErr w:type="gramStart"/>
+      <w:r>
+        <w:rPr>
+          <w:rFonts w:hint="eastAsia"/>
+        </w:rPr>
+        <w:t>{</w:t>
       </w:r>
       <w:r>
         <w:rPr>
@@ -302,7 +342,14 @@
         <w:rPr>
           <w:rFonts w:hint="eastAsia"/>
         </w:rPr>
-        <w:t>dataset.</w:t>
+        <w:t>dataset</w:t>
+      </w:r>
+      <w:proofErr w:type="gramEnd"/>
+      <w:r>
+        <w:rPr>
+          <w:rFonts w:hint="eastAsia"/>
+        </w:rPr>
+        <w:t>.</w:t>
       </w:r>
       <w:r>
         <w:t>DatasetURL</w:t>
@@ -355,6 +402,7 @@
         </w:rPr>
         <w:t xml:space="preserve">date: </w:t>
       </w:r>
+      <w:proofErr w:type="gramStart"/>
       <w:r>
         <w:rPr>
           <w:rFonts w:hint="eastAsia"/>
@@ -379,6 +427,7 @@
         </w:rPr>
         <w:t>timestamp</w:t>
       </w:r>
+      <w:proofErr w:type="gramEnd"/>
       <w:r>
         <w:rPr>
           <w:rFonts w:hint="eastAsia"/>
@@ -1541,218 +1590,283 @@
                 <w:lang w:val="en-US"/>
               </w:rPr>
             </w:pPr>
-            <w:r>
-              <w:rPr>
-                <w:lang w:val="en-US"/>
-              </w:rPr>
-              <w:t xml:space="preserve">{% if </w:t>
+          </w:p>
+          <w:p>
+            <w:pPr>
+              <w:rPr>
+                <w:lang w:val="en-US"/>
+              </w:rPr>
+            </w:pPr>
+          </w:p>
+        </w:tc>
+        <w:tc>
+          <w:tcPr>
+            <w:tcW w:w="0" w:type="auto"/>
+            <w:tcBorders>
+              <w:top w:val="single" w:sz="8" w:space="0" w:color="000000"/>
+              <w:left w:val="single" w:sz="8" w:space="0" w:color="000000"/>
+              <w:bottom w:val="single" w:sz="8" w:space="0" w:color="000000"/>
+              <w:right w:val="single" w:sz="8" w:space="0" w:color="000000"/>
+            </w:tcBorders>
+            <w:tcMar>
+              <w:top w:w="100" w:type="dxa"/>
+              <w:left w:w="100" w:type="dxa"/>
+              <w:bottom w:w="100" w:type="dxa"/>
+              <w:right w:w="100" w:type="dxa"/>
+            </w:tcMar>
+            <w:hideMark/>
+          </w:tcPr>
+          <w:p>
+            <w:pPr>
+              <w:rPr>
+                <w:lang w:val="en-US"/>
+              </w:rPr>
+            </w:pPr>
+          </w:p>
+        </w:tc>
+        <w:tc>
+          <w:tcPr>
+            <w:tcW w:w="0" w:type="auto"/>
+            <w:tcBorders>
+              <w:top w:val="single" w:sz="8" w:space="0" w:color="000000"/>
+              <w:left w:val="single" w:sz="8" w:space="0" w:color="000000"/>
+              <w:bottom w:val="single" w:sz="8" w:space="0" w:color="000000"/>
+              <w:right w:val="single" w:sz="8" w:space="0" w:color="000000"/>
+            </w:tcBorders>
+            <w:tcMar>
+              <w:top w:w="100" w:type="dxa"/>
+              <w:left w:w="100" w:type="dxa"/>
+              <w:bottom w:w="100" w:type="dxa"/>
+              <w:right w:w="100" w:type="dxa"/>
+            </w:tcMar>
+            <w:hideMark/>
+          </w:tcPr>
+          <w:p>
+            <w:pPr>
+              <w:rPr>
+                <w:lang w:val="en-US"/>
+              </w:rPr>
+            </w:pPr>
+          </w:p>
+          <w:p>
+            <w:pPr>
+              <w:rPr>
+                <w:lang w:val="en-US"/>
+              </w:rPr>
+            </w:pPr>
+          </w:p>
+        </w:tc>
+        <w:tc>
+          <w:tcPr>
+            <w:tcW w:w="0" w:type="auto"/>
+            <w:tcBorders>
+              <w:top w:val="single" w:sz="8" w:space="0" w:color="000000"/>
+              <w:left w:val="single" w:sz="8" w:space="0" w:color="000000"/>
+              <w:bottom w:val="single" w:sz="8" w:space="0" w:color="000000"/>
+              <w:right w:val="single" w:sz="8" w:space="0" w:color="000000"/>
+            </w:tcBorders>
+            <w:tcMar>
+              <w:top w:w="100" w:type="dxa"/>
+              <w:left w:w="100" w:type="dxa"/>
+              <w:bottom w:w="100" w:type="dxa"/>
+              <w:right w:w="100" w:type="dxa"/>
+            </w:tcMar>
+            <w:hideMark/>
+          </w:tcPr>
+          <w:p>
+            <w:pPr>
+              <w:rPr>
+                <w:lang w:val="en-US"/>
+              </w:rPr>
+            </w:pPr>
+          </w:p>
+        </w:tc>
+        <w:tc>
+          <w:tcPr>
+            <w:tcW w:w="0" w:type="auto"/>
+            <w:tcBorders>
+              <w:top w:val="single" w:sz="8" w:space="0" w:color="000000"/>
+              <w:left w:val="single" w:sz="8" w:space="0" w:color="000000"/>
+              <w:bottom w:val="single" w:sz="8" w:space="0" w:color="000000"/>
+              <w:right w:val="single" w:sz="8" w:space="0" w:color="000000"/>
+            </w:tcBorders>
+            <w:tcMar>
+              <w:top w:w="100" w:type="dxa"/>
+              <w:left w:w="100" w:type="dxa"/>
+              <w:bottom w:w="100" w:type="dxa"/>
+              <w:right w:w="100" w:type="dxa"/>
+            </w:tcMar>
+            <w:hideMark/>
+          </w:tcPr>
+          <w:p>
+            <w:pPr>
+              <w:rPr>
+                <w:lang w:val="en-US"/>
+              </w:rPr>
+            </w:pPr>
+          </w:p>
+        </w:tc>
+        <w:tc>
+          <w:tcPr>
+            <w:tcW w:w="0" w:type="auto"/>
+            <w:tcBorders>
+              <w:top w:val="single" w:sz="8" w:space="0" w:color="000000"/>
+              <w:left w:val="single" w:sz="8" w:space="0" w:color="000000"/>
+              <w:bottom w:val="single" w:sz="8" w:space="0" w:color="000000"/>
+              <w:right w:val="single" w:sz="8" w:space="0" w:color="000000"/>
+            </w:tcBorders>
+            <w:tcMar>
+              <w:top w:w="100" w:type="dxa"/>
+              <w:left w:w="100" w:type="dxa"/>
+              <w:bottom w:w="100" w:type="dxa"/>
+              <w:right w:w="100" w:type="dxa"/>
+            </w:tcMar>
+            <w:hideMark/>
+          </w:tcPr>
+          <w:p>
+            <w:pPr>
+              <w:rPr>
+                <w:lang w:val="en-US"/>
+              </w:rPr>
+            </w:pPr>
+            <w:r>
+              <w:rPr>
+                <w:lang w:val="en-US"/>
+              </w:rPr>
+              <w:t>If relevant, name of sub-</w:t>
             </w:r>
             <w:proofErr w:type="spellStart"/>
             <w:r>
               <w:rPr>
                 <w:lang w:val="en-US"/>
               </w:rPr>
-              <w:t>template_dict.file_open.comments|length</w:t>
+              <w:t>dataverse</w:t>
             </w:r>
             <w:proofErr w:type="spellEnd"/>
             <w:r>
               <w:rPr>
                 <w:lang w:val="en-US"/>
               </w:rPr>
-              <w:t xml:space="preserve"> == 0 %}X{% endif %}</w:t>
-            </w:r>
-          </w:p>
-          <w:p>
-            <w:pPr>
-              <w:rPr>
-                <w:lang w:val="en-US"/>
-              </w:rPr>
-            </w:pPr>
-          </w:p>
-          <w:p>
-            <w:pPr>
-              <w:rPr>
-                <w:lang w:val="en-US"/>
-              </w:rPr>
-            </w:pPr>
-          </w:p>
-        </w:tc>
-        <w:tc>
-          <w:tcPr>
-            <w:tcW w:w="0" w:type="auto"/>
-            <w:tcBorders>
-              <w:top w:val="single" w:sz="8" w:space="0" w:color="000000"/>
-              <w:left w:val="single" w:sz="8" w:space="0" w:color="000000"/>
-              <w:bottom w:val="single" w:sz="8" w:space="0" w:color="000000"/>
-              <w:right w:val="single" w:sz="8" w:space="0" w:color="000000"/>
-            </w:tcBorders>
-            <w:tcMar>
-              <w:top w:w="100" w:type="dxa"/>
-              <w:left w:w="100" w:type="dxa"/>
-              <w:bottom w:w="100" w:type="dxa"/>
-              <w:right w:w="100" w:type="dxa"/>
-            </w:tcMar>
-            <w:hideMark/>
-          </w:tcPr>
-          <w:p>
-            <w:pPr>
-              <w:rPr>
-                <w:lang w:val="en-US"/>
-              </w:rPr>
-            </w:pPr>
-          </w:p>
-        </w:tc>
-        <w:tc>
-          <w:tcPr>
-            <w:tcW w:w="0" w:type="auto"/>
-            <w:tcBorders>
-              <w:top w:val="single" w:sz="8" w:space="0" w:color="000000"/>
-              <w:left w:val="single" w:sz="8" w:space="0" w:color="000000"/>
-              <w:bottom w:val="single" w:sz="8" w:space="0" w:color="000000"/>
-              <w:right w:val="single" w:sz="8" w:space="0" w:color="000000"/>
-            </w:tcBorders>
-            <w:tcMar>
-              <w:top w:w="100" w:type="dxa"/>
-              <w:left w:w="100" w:type="dxa"/>
-              <w:bottom w:w="100" w:type="dxa"/>
-              <w:right w:w="100" w:type="dxa"/>
-            </w:tcMar>
-            <w:hideMark/>
-          </w:tcPr>
-          <w:p>
-            <w:pPr>
-              <w:rPr>
-                <w:lang w:val="en-US"/>
-              </w:rPr>
-            </w:pPr>
-            <w:r>
-              <w:rPr>
-                <w:lang w:val="en-US"/>
-              </w:rPr>
-              <w:t xml:space="preserve">{% if </w:t>
+              <w:t xml:space="preserve"> collection:</w:t>
+            </w:r>
+          </w:p>
+          <w:p>
+            <w:r>
+              <w:t xml:space="preserve">{% for item in </w:t>
             </w:r>
             <w:proofErr w:type="spellStart"/>
             <w:r>
-              <w:rPr>
-                <w:lang w:val="en-US"/>
-              </w:rPr>
-              <w:t>template_dict.file_open.comments|length</w:t>
+              <w:t>template_</w:t>
+            </w:r>
+            <w:proofErr w:type="gramStart"/>
+            <w:r>
+              <w:t>dict.dv</w:t>
+            </w:r>
+            <w:proofErr w:type="gramEnd"/>
+            <w:r>
+              <w:t>_record.comments</w:t>
             </w:r>
             <w:proofErr w:type="spellEnd"/>
             <w:r>
-              <w:rPr>
-                <w:lang w:val="en-US"/>
-              </w:rPr>
-              <w:t xml:space="preserve"> &gt; 0 %}X{% endif %}</w:t>
-            </w:r>
-          </w:p>
-          <w:p>
-            <w:pPr>
-              <w:rPr>
-                <w:lang w:val="en-US"/>
-              </w:rPr>
-            </w:pPr>
-          </w:p>
-          <w:p>
-            <w:pPr>
-              <w:rPr>
-                <w:lang w:val="en-US"/>
-              </w:rPr>
-            </w:pPr>
-          </w:p>
-        </w:tc>
-        <w:tc>
-          <w:tcPr>
-            <w:tcW w:w="0" w:type="auto"/>
-            <w:tcBorders>
-              <w:top w:val="single" w:sz="8" w:space="0" w:color="000000"/>
-              <w:left w:val="single" w:sz="8" w:space="0" w:color="000000"/>
-              <w:bottom w:val="single" w:sz="8" w:space="0" w:color="000000"/>
-              <w:right w:val="single" w:sz="8" w:space="0" w:color="000000"/>
-            </w:tcBorders>
-            <w:tcMar>
-              <w:top w:w="100" w:type="dxa"/>
-              <w:left w:w="100" w:type="dxa"/>
-              <w:bottom w:w="100" w:type="dxa"/>
-              <w:right w:w="100" w:type="dxa"/>
-            </w:tcMar>
-            <w:hideMark/>
-          </w:tcPr>
-          <w:p>
-            <w:pPr>
-              <w:rPr>
-                <w:lang w:val="en-US"/>
-              </w:rPr>
-            </w:pPr>
-          </w:p>
-        </w:tc>
-        <w:tc>
-          <w:tcPr>
-            <w:tcW w:w="0" w:type="auto"/>
-            <w:tcBorders>
-              <w:top w:val="single" w:sz="8" w:space="0" w:color="000000"/>
-              <w:left w:val="single" w:sz="8" w:space="0" w:color="000000"/>
-              <w:bottom w:val="single" w:sz="8" w:space="0" w:color="000000"/>
-              <w:right w:val="single" w:sz="8" w:space="0" w:color="000000"/>
-            </w:tcBorders>
-            <w:tcMar>
-              <w:top w:w="100" w:type="dxa"/>
-              <w:left w:w="100" w:type="dxa"/>
-              <w:bottom w:w="100" w:type="dxa"/>
-              <w:right w:w="100" w:type="dxa"/>
-            </w:tcMar>
-            <w:hideMark/>
-          </w:tcPr>
-          <w:p>
-            <w:pPr>
-              <w:rPr>
-                <w:lang w:val="en-US"/>
-              </w:rPr>
-            </w:pPr>
-          </w:p>
-        </w:tc>
-        <w:tc>
-          <w:tcPr>
-            <w:tcW w:w="0" w:type="auto"/>
-            <w:tcBorders>
-              <w:top w:val="single" w:sz="8" w:space="0" w:color="000000"/>
-              <w:left w:val="single" w:sz="8" w:space="0" w:color="000000"/>
-              <w:bottom w:val="single" w:sz="8" w:space="0" w:color="000000"/>
-              <w:right w:val="single" w:sz="8" w:space="0" w:color="000000"/>
-            </w:tcBorders>
-            <w:tcMar>
-              <w:top w:w="100" w:type="dxa"/>
-              <w:left w:w="100" w:type="dxa"/>
-              <w:bottom w:w="100" w:type="dxa"/>
-              <w:right w:w="100" w:type="dxa"/>
-            </w:tcMar>
-            <w:hideMark/>
-          </w:tcPr>
-          <w:p>
-            <w:pPr>
-              <w:rPr>
-                <w:lang w:val="en-US"/>
-              </w:rPr>
-            </w:pPr>
-            <w:r>
-              <w:rPr>
-                <w:lang w:val="en-US"/>
-              </w:rPr>
-              <w:t>If relevant, name of sub-</w:t>
+              <w:t xml:space="preserve"> %} </w:t>
+            </w:r>
+          </w:p>
+          <w:p>
+            <w:r>
+              <w:t xml:space="preserve">{% for author, </w:t>
             </w:r>
             <w:proofErr w:type="spellStart"/>
             <w:r>
-              <w:rPr>
-                <w:lang w:val="en-US"/>
-              </w:rPr>
+              <w:t>dataverses</w:t>
+            </w:r>
+            <w:proofErr w:type="spellEnd"/>
+            <w:r>
+              <w:t xml:space="preserve"> in </w:t>
+            </w:r>
+            <w:proofErr w:type="spellStart"/>
+            <w:proofErr w:type="gramStart"/>
+            <w:r>
+              <w:t>item.items</w:t>
+            </w:r>
+            <w:proofErr w:type="spellEnd"/>
+            <w:proofErr w:type="gramEnd"/>
+            <w:r>
+              <w:t>() %} {{ author }}</w:t>
+            </w:r>
+          </w:p>
+          <w:p>
+            <w:r>
+              <w:t xml:space="preserve">{% for </w:t>
+            </w:r>
+            <w:proofErr w:type="spellStart"/>
+            <w:r>
               <w:t>dataverse</w:t>
             </w:r>
             <w:proofErr w:type="spellEnd"/>
             <w:r>
-              <w:rPr>
-                <w:lang w:val="en-US"/>
-              </w:rPr>
-              <w:t xml:space="preserve"> collection:</w:t>
+              <w:t xml:space="preserve"> in </w:t>
+            </w:r>
+            <w:proofErr w:type="spellStart"/>
+            <w:r>
+              <w:t>dataverses</w:t>
+            </w:r>
+            <w:proofErr w:type="spellEnd"/>
+            <w:r>
+              <w:t xml:space="preserve"> %} </w:t>
+            </w:r>
+            <w:proofErr w:type="gramStart"/>
+            <w:r>
+              <w:t xml:space="preserve">{{ </w:t>
+            </w:r>
+            <w:proofErr w:type="spellStart"/>
+            <w:r>
+              <w:t>dataverse</w:t>
+            </w:r>
+            <w:proofErr w:type="spellEnd"/>
+            <w:proofErr w:type="gramEnd"/>
+            <w:r>
+              <w:t xml:space="preserve"> }}</w:t>
+            </w:r>
+            <w:r>
+              <w:br/>
+            </w:r>
+            <w:r>
+              <w:t xml:space="preserve">{% </w:t>
+            </w:r>
+            <w:proofErr w:type="spellStart"/>
+            <w:r>
+              <w:t>endfor</w:t>
+            </w:r>
+            <w:proofErr w:type="spellEnd"/>
+            <w:r>
+              <w:t xml:space="preserve"> %} </w:t>
+            </w:r>
+          </w:p>
+          <w:p>
+            <w:pPr>
+              <w:rPr>
+                <w:rFonts w:hint="eastAsia"/>
+                <w:lang w:val="en-US"/>
+              </w:rPr>
+            </w:pPr>
+            <w:r>
+              <w:t xml:space="preserve">{% </w:t>
+            </w:r>
+            <w:proofErr w:type="spellStart"/>
+            <w:r>
+              <w:t>endfor</w:t>
+            </w:r>
+            <w:proofErr w:type="spellEnd"/>
+            <w:r>
+              <w:t xml:space="preserve"> %} {% </w:t>
+            </w:r>
+            <w:proofErr w:type="spellStart"/>
+            <w:r>
+              <w:t>endfor</w:t>
+            </w:r>
+            <w:proofErr w:type="spellEnd"/>
+            <w:r>
+              <w:t xml:space="preserve"> %}</w:t>
             </w:r>
           </w:p>
         </w:tc>
@@ -1990,14 +2104,20 @@
               <w:rPr>
                 <w:lang w:val="en-US"/>
               </w:rPr>
-              <w:t>Is it the only dataset in the sub-</w:t>
+              <w:t xml:space="preserve">Is it the only dataset in the </w:t>
+            </w:r>
+            <w:r>
+              <w:rPr>
+                <w:lang w:val="en-US"/>
+              </w:rPr>
+              <w:lastRenderedPageBreak/>
+              <w:t>sub-</w:t>
             </w:r>
             <w:proofErr w:type="spellStart"/>
             <w:r>
               <w:rPr>
                 <w:lang w:val="en-US"/>
               </w:rPr>
-              <w:lastRenderedPageBreak/>
               <w:t>dataverse</w:t>
             </w:r>
             <w:proofErr w:type="spellEnd"/>
@@ -2070,7 +2190,21 @@
               <w:rPr>
                 <w:lang w:val="en-US"/>
               </w:rPr>
-              <w:t xml:space="preserve">Confirm with the depositor that they actually require a </w:t>
+              <w:t xml:space="preserve">Confirm with the depositor that they </w:t>
+            </w:r>
+            <w:proofErr w:type="gramStart"/>
+            <w:r>
+              <w:rPr>
+                <w:lang w:val="en-US"/>
+              </w:rPr>
+              <w:t>actually require</w:t>
+            </w:r>
+            <w:proofErr w:type="gramEnd"/>
+            <w:r>
+              <w:rPr>
+                <w:lang w:val="en-US"/>
+              </w:rPr>
+              <w:t xml:space="preserve"> a </w:t>
             </w:r>
             <w:proofErr w:type="spellStart"/>
             <w:r>
@@ -3010,7 +3144,14 @@
               <w:rPr>
                 <w:lang w:val="en-US"/>
               </w:rPr>
-              <w:t>template_dict.file_open.comments</w:t>
+              <w:t>template_dict.file_open.</w:t>
+            </w:r>
+            <w:proofErr w:type="gramStart"/>
+            <w:r>
+              <w:rPr>
+                <w:lang w:val="en-US"/>
+              </w:rPr>
+              <w:t>comments</w:t>
             </w:r>
             <w:proofErr w:type="spellEnd"/>
             <w:r>
@@ -3019,6 +3160,7 @@
               </w:rPr>
               <w:t xml:space="preserve"> %}</w:t>
             </w:r>
+            <w:proofErr w:type="gramEnd"/>
           </w:p>
           <w:p>
             <w:pPr>
@@ -3087,11 +3229,19 @@
                 <w:lang w:val="en-US"/>
               </w:rPr>
             </w:pPr>
-            <w:r>
-              <w:rPr>
-                <w:lang w:val="en-US"/>
-              </w:rPr>
-              <w:t>List all files that were not checked:</w:t>
+            <w:proofErr w:type="gramStart"/>
+            <w:r>
+              <w:rPr>
+                <w:lang w:val="en-US"/>
+              </w:rPr>
+              <w:t>List</w:t>
+            </w:r>
+            <w:proofErr w:type="gramEnd"/>
+            <w:r>
+              <w:rPr>
+                <w:lang w:val="en-US"/>
+              </w:rPr>
+              <w:t xml:space="preserve"> all files that were not checked:</w:t>
             </w:r>
           </w:p>
           <w:p>
@@ -3465,7 +3615,14 @@
               <w:rPr>
                 <w:lang w:val="en-US"/>
               </w:rPr>
-              <w:t>template_dict.special_characters.comments</w:t>
+              <w:t>template_dict.special_characters.</w:t>
+            </w:r>
+            <w:proofErr w:type="gramStart"/>
+            <w:r>
+              <w:rPr>
+                <w:lang w:val="en-US"/>
+              </w:rPr>
+              <w:t>comments</w:t>
             </w:r>
             <w:proofErr w:type="spellEnd"/>
             <w:r>
@@ -3474,6 +3631,7 @@
               </w:rPr>
               <w:t xml:space="preserve"> %}</w:t>
             </w:r>
+            <w:proofErr w:type="gramEnd"/>
           </w:p>
           <w:p>
             <w:pPr>
@@ -5247,14 +5405,28 @@
               <w:rPr>
                 <w:lang w:val="en-US"/>
               </w:rPr>
-              <w:t>template_dict.readme_file.comments</w:t>
+              <w:t>template_dict.readme_file.</w:t>
+            </w:r>
+            <w:proofErr w:type="gramStart"/>
+            <w:r>
+              <w:rPr>
+                <w:lang w:val="en-US"/>
+              </w:rPr>
+              <w:t>comments</w:t>
             </w:r>
             <w:proofErr w:type="spellEnd"/>
             <w:r>
               <w:rPr>
                 <w:lang w:val="en-US"/>
               </w:rPr>
-              <w:t xml:space="preserve"> %}{{ </w:t>
+              <w:t xml:space="preserve"> %}{{</w:t>
+            </w:r>
+            <w:proofErr w:type="gramEnd"/>
+            <w:r>
+              <w:rPr>
+                <w:lang w:val="en-US"/>
+              </w:rPr>
+              <w:t xml:space="preserve"> </w:t>
             </w:r>
             <w:proofErr w:type="spellStart"/>
             <w:r>
@@ -8454,7 +8626,21 @@
               <w:rPr>
                 <w:lang w:val="en-US"/>
               </w:rPr>
-              <w:t>If there are restricted files and no Terms of Access, recommend including terms of access.</w:t>
+              <w:t xml:space="preserve">If there are restricted files and no Terms of Access, </w:t>
+            </w:r>
+            <w:proofErr w:type="gramStart"/>
+            <w:r>
+              <w:rPr>
+                <w:lang w:val="en-US"/>
+              </w:rPr>
+              <w:t>recommend</w:t>
+            </w:r>
+            <w:proofErr w:type="gramEnd"/>
+            <w:r>
+              <w:rPr>
+                <w:lang w:val="en-US"/>
+              </w:rPr>
+              <w:t xml:space="preserve"> including terms of access.</w:t>
             </w:r>
           </w:p>
         </w:tc>

</xml_diff>

<commit_message>
1. Updated template_new.docx for specifying the work scripting needs to be done.
</commit_message>
<xml_diff>
--- a/res/template_new.docx
+++ b/res/template_new.docx
@@ -42,7 +42,14 @@
         <w:rPr>
           <w:rFonts w:hint="eastAsia"/>
         </w:rPr>
-        <w:t xml:space="preserve"> curator_info.ticket_n</w:t>
+        <w:t xml:space="preserve"> </w:t>
+      </w:r>
+      <w:proofErr w:type="spellStart"/>
+      <w:r>
+        <w:rPr>
+          <w:rFonts w:hint="eastAsia"/>
+        </w:rPr>
+        <w:t>curator_info.ticket_n</w:t>
       </w:r>
       <w:r>
         <w:rPr>
@@ -50,6 +57,7 @@
         </w:rPr>
         <w:t>umber</w:t>
       </w:r>
+      <w:proofErr w:type="spellEnd"/>
       <w:r>
         <w:rPr>
           <w:rFonts w:hint="eastAsia"/>
@@ -80,7 +88,21 @@
         <w:rPr>
           <w:rFonts w:hint="eastAsia"/>
         </w:rPr>
-        <w:t xml:space="preserve"> {{ curator_info.curator_name }}</w:t>
+        <w:t xml:space="preserve"> {{ </w:t>
+      </w:r>
+      <w:proofErr w:type="spellStart"/>
+      <w:r>
+        <w:rPr>
+          <w:rFonts w:hint="eastAsia"/>
+        </w:rPr>
+        <w:t>curator_info.curator_name</w:t>
+      </w:r>
+      <w:proofErr w:type="spellEnd"/>
+      <w:r>
+        <w:rPr>
+          <w:rFonts w:hint="eastAsia"/>
+        </w:rPr>
+        <w:t xml:space="preserve"> }}</w:t>
       </w:r>
     </w:p>
     <w:p>
@@ -88,11 +110,19 @@
         <w:rPr>
           <w:rFonts w:hint="eastAsia"/>
         </w:rPr>
-        <w:t>Curator email: {{ curator_info.</w:t>
+        <w:t xml:space="preserve">Curator email: {{ </w:t>
+      </w:r>
+      <w:proofErr w:type="spellStart"/>
+      <w:r>
+        <w:rPr>
+          <w:rFonts w:hint="eastAsia"/>
+        </w:rPr>
+        <w:t>curator_info.</w:t>
       </w:r>
       <w:r>
         <w:t>curator_email</w:t>
       </w:r>
+      <w:proofErr w:type="spellEnd"/>
       <w:r>
         <w:rPr>
           <w:rFonts w:hint="eastAsia"/>
@@ -113,6 +143,7 @@
         </w:rPr>
         <w:t xml:space="preserve">{{ </w:t>
       </w:r>
+      <w:proofErr w:type="spellStart"/>
       <w:r>
         <w:rPr>
           <w:rFonts w:hint="eastAsia"/>
@@ -122,6 +153,7 @@
       <w:r>
         <w:t>DatasetTitle</w:t>
       </w:r>
+      <w:proofErr w:type="spellEnd"/>
       <w:r>
         <w:rPr>
           <w:rFonts w:hint="eastAsia"/>
@@ -169,6 +201,7 @@
         </w:rPr>
         <w:t xml:space="preserve"> </w:t>
       </w:r>
+      <w:proofErr w:type="spellStart"/>
       <w:r>
         <w:rPr>
           <w:rFonts w:hint="eastAsia"/>
@@ -178,6 +211,7 @@
       <w:r>
         <w:t>DatasetPersistentId</w:t>
       </w:r>
+      <w:proofErr w:type="spellEnd"/>
       <w:r>
         <w:rPr>
           <w:rFonts w:hint="eastAsia"/>
@@ -216,11 +250,19 @@
         <w:rPr>
           <w:rFonts w:hint="eastAsia"/>
         </w:rPr>
-        <w:t xml:space="preserve"> dataset.</w:t>
+        <w:t xml:space="preserve"> </w:t>
+      </w:r>
+      <w:proofErr w:type="spellStart"/>
+      <w:r>
+        <w:rPr>
+          <w:rFonts w:hint="eastAsia"/>
+        </w:rPr>
+        <w:t>dataset.</w:t>
       </w:r>
       <w:r>
         <w:t>DatasetURL</w:t>
       </w:r>
+      <w:proofErr w:type="spellEnd"/>
       <w:r>
         <w:rPr>
           <w:rFonts w:hint="eastAsia"/>
@@ -318,17 +360,17 @@
         <w:tblLook w:val="04A0" w:firstRow="1" w:lastRow="0" w:firstColumn="1" w:lastColumn="0" w:noHBand="0" w:noVBand="1"/>
       </w:tblPr>
       <w:tblGrid>
-        <w:gridCol w:w="543"/>
-        <w:gridCol w:w="1464"/>
-        <w:gridCol w:w="1961"/>
-        <w:gridCol w:w="4175"/>
-        <w:gridCol w:w="3476"/>
-        <w:gridCol w:w="4175"/>
-        <w:gridCol w:w="435"/>
-        <w:gridCol w:w="439"/>
-        <w:gridCol w:w="3647"/>
-        <w:gridCol w:w="1188"/>
-        <w:gridCol w:w="848"/>
+        <w:gridCol w:w="540"/>
+        <w:gridCol w:w="1455"/>
+        <w:gridCol w:w="1948"/>
+        <w:gridCol w:w="4147"/>
+        <w:gridCol w:w="3599"/>
+        <w:gridCol w:w="4147"/>
+        <w:gridCol w:w="433"/>
+        <w:gridCol w:w="437"/>
+        <w:gridCol w:w="3622"/>
+        <w:gridCol w:w="1180"/>
+        <w:gridCol w:w="843"/>
       </w:tblGrid>
       <w:tr>
         <w:trPr>
@@ -996,7 +1038,25 @@
                 <w:bCs/>
                 <w:lang w:val="en-US"/>
               </w:rPr>
-              <w:t>Has the depositor (or their research group) previously created or submitted to a dataverse?</w:t>
+              <w:t xml:space="preserve">Has the depositor (or their research group) previously created or submitted to a </w:t>
+            </w:r>
+            <w:proofErr w:type="spellStart"/>
+            <w:r>
+              <w:rPr>
+                <w:b/>
+                <w:bCs/>
+                <w:lang w:val="en-US"/>
+              </w:rPr>
+              <w:t>dataverse</w:t>
+            </w:r>
+            <w:proofErr w:type="spellEnd"/>
+            <w:r>
+              <w:rPr>
+                <w:b/>
+                <w:bCs/>
+                <w:lang w:val="en-US"/>
+              </w:rPr>
+              <w:t>?</w:t>
             </w:r>
           </w:p>
         </w:tc>
@@ -1058,7 +1118,14 @@
               <w:rPr>
                 <w:lang w:val="en-US"/>
               </w:rPr>
-              <w:t>{% if template_dict.</w:t>
+              <w:t xml:space="preserve">{% if </w:t>
+            </w:r>
+            <w:proofErr w:type="spellStart"/>
+            <w:r>
+              <w:rPr>
+                <w:lang w:val="en-US"/>
+              </w:rPr>
+              <w:t>template_dict.</w:t>
             </w:r>
             <w:r>
               <w:rPr>
@@ -1071,7 +1138,14 @@
               <w:rPr>
                 <w:lang w:val="en-US"/>
               </w:rPr>
-              <w:t xml:space="preserve">.comments|length </w:t>
+              <w:t>.comments|length</w:t>
+            </w:r>
+            <w:proofErr w:type="spellEnd"/>
+            <w:r>
+              <w:rPr>
+                <w:lang w:val="en-US"/>
+              </w:rPr>
+              <w:t xml:space="preserve"> </w:t>
             </w:r>
             <w:r>
               <w:rPr>
@@ -1122,7 +1196,14 @@
               <w:rPr>
                 <w:lang w:val="en-US"/>
               </w:rPr>
-              <w:t>{% if template_dict.</w:t>
+              <w:t xml:space="preserve">{% if </w:t>
+            </w:r>
+            <w:proofErr w:type="spellStart"/>
+            <w:r>
+              <w:rPr>
+                <w:lang w:val="en-US"/>
+              </w:rPr>
+              <w:t>template_dict.</w:t>
             </w:r>
             <w:r>
               <w:rPr>
@@ -1135,7 +1216,14 @@
               <w:rPr>
                 <w:lang w:val="en-US"/>
               </w:rPr>
-              <w:t xml:space="preserve">.comments|length </w:t>
+              <w:t>.comments|length</w:t>
+            </w:r>
+            <w:proofErr w:type="spellEnd"/>
+            <w:r>
+              <w:rPr>
+                <w:lang w:val="en-US"/>
+              </w:rPr>
+              <w:t xml:space="preserve"> </w:t>
             </w:r>
             <w:r>
               <w:rPr>
@@ -1261,38 +1349,124 @@
               <w:rPr>
                 <w:lang w:val="en-US"/>
               </w:rPr>
-              <w:t>If relevant, list previously created dataverse:</w:t>
-            </w:r>
-          </w:p>
-          <w:p>
-            <w:r>
-              <w:t xml:space="preserve">{% for item in template_dict.dv_record.comments %} </w:t>
-            </w:r>
-          </w:p>
-          <w:p>
-            <w:r>
-              <w:t>{% for author, dataverses in item.items() %} {{ author }}</w:t>
-            </w:r>
-          </w:p>
-          <w:p>
-            <w:r>
-              <w:t>{% for dataverse in dataverses %} {{ dataverse }}</w:t>
+              <w:t xml:space="preserve">If relevant, list previously created </w:t>
+            </w:r>
+            <w:proofErr w:type="spellStart"/>
+            <w:r>
+              <w:rPr>
+                <w:lang w:val="en-US"/>
+              </w:rPr>
+              <w:t>dataverse</w:t>
+            </w:r>
+            <w:proofErr w:type="spellEnd"/>
+            <w:r>
+              <w:rPr>
+                <w:lang w:val="en-US"/>
+              </w:rPr>
+              <w:t>:</w:t>
+            </w:r>
+          </w:p>
+          <w:p>
+            <w:r>
+              <w:t xml:space="preserve">{% for item in </w:t>
+            </w:r>
+            <w:proofErr w:type="spellStart"/>
+            <w:r>
+              <w:t>template_dict.dv_record.comments</w:t>
+            </w:r>
+            <w:proofErr w:type="spellEnd"/>
+            <w:r>
+              <w:t xml:space="preserve"> %} </w:t>
+            </w:r>
+          </w:p>
+          <w:p>
+            <w:r>
+              <w:t xml:space="preserve">{% for author, </w:t>
+            </w:r>
+            <w:proofErr w:type="spellStart"/>
+            <w:r>
+              <w:t>dataverses</w:t>
+            </w:r>
+            <w:proofErr w:type="spellEnd"/>
+            <w:r>
+              <w:t xml:space="preserve"> in </w:t>
+            </w:r>
+            <w:proofErr w:type="spellStart"/>
+            <w:r>
+              <w:t>item.items</w:t>
+            </w:r>
+            <w:proofErr w:type="spellEnd"/>
+            <w:r>
+              <w:t>() %} {{ author }}</w:t>
+            </w:r>
+          </w:p>
+          <w:p>
+            <w:r>
+              <w:t xml:space="preserve">{% for </w:t>
+            </w:r>
+            <w:proofErr w:type="spellStart"/>
+            <w:r>
+              <w:t>dataverse</w:t>
+            </w:r>
+            <w:proofErr w:type="spellEnd"/>
+            <w:r>
+              <w:t xml:space="preserve"> in </w:t>
+            </w:r>
+            <w:proofErr w:type="spellStart"/>
+            <w:r>
+              <w:t>dataverses</w:t>
+            </w:r>
+            <w:proofErr w:type="spellEnd"/>
+            <w:r>
+              <w:t xml:space="preserve"> %} {{ </w:t>
+            </w:r>
+            <w:proofErr w:type="spellStart"/>
+            <w:r>
+              <w:t>dataverse</w:t>
+            </w:r>
+            <w:proofErr w:type="spellEnd"/>
+            <w:r>
+              <w:t xml:space="preserve"> }}</w:t>
             </w:r>
             <w:r>
               <w:br/>
             </w:r>
             <w:r>
-              <w:t xml:space="preserve">{% endfor %} </w:t>
-            </w:r>
-          </w:p>
-          <w:p>
-            <w:pPr>
-              <w:rPr>
-                <w:lang w:val="en-US"/>
-              </w:rPr>
-            </w:pPr>
-            <w:r>
-              <w:t>{% endfor %} {% endfor %}</w:t>
+              <w:t xml:space="preserve">{% </w:t>
+            </w:r>
+            <w:proofErr w:type="spellStart"/>
+            <w:r>
+              <w:t>endfor</w:t>
+            </w:r>
+            <w:proofErr w:type="spellEnd"/>
+            <w:r>
+              <w:t xml:space="preserve"> %} </w:t>
+            </w:r>
+          </w:p>
+          <w:p>
+            <w:pPr>
+              <w:rPr>
+                <w:lang w:val="en-US"/>
+              </w:rPr>
+            </w:pPr>
+            <w:r>
+              <w:t xml:space="preserve">{% </w:t>
+            </w:r>
+            <w:proofErr w:type="spellStart"/>
+            <w:r>
+              <w:t>endfor</w:t>
+            </w:r>
+            <w:proofErr w:type="spellEnd"/>
+            <w:r>
+              <w:t xml:space="preserve"> %} {% </w:t>
+            </w:r>
+            <w:proofErr w:type="spellStart"/>
+            <w:r>
+              <w:t>endfor</w:t>
+            </w:r>
+            <w:proofErr w:type="spellEnd"/>
+            <w:r>
+              <w:t xml:space="preserve"> %}</w:t>
             </w:r>
           </w:p>
         </w:tc>
@@ -1483,7 +1657,21 @@
               <w:rPr>
                 <w:lang w:val="en-US"/>
               </w:rPr>
-              <w:t xml:space="preserve">If the dataset is deposited in a sub-dataverse collection, include the name of the </w:t>
+              <w:t>If the dataset is deposited in a sub-</w:t>
+            </w:r>
+            <w:proofErr w:type="spellStart"/>
+            <w:r>
+              <w:rPr>
+                <w:lang w:val="en-US"/>
+              </w:rPr>
+              <w:t>dataverse</w:t>
+            </w:r>
+            <w:proofErr w:type="spellEnd"/>
+            <w:r>
+              <w:rPr>
+                <w:lang w:val="en-US"/>
+              </w:rPr>
+              <w:t xml:space="preserve"> collection, include the name of the </w:t>
             </w:r>
             <w:r>
               <w:rPr>
@@ -1660,16 +1848,31 @@
           <w:p>
             <w:pPr>
               <w:rPr>
+                <w:lang w:val="en-US"/>
+              </w:rPr>
+            </w:pPr>
+            <w:r>
+              <w:rPr>
                 <w:rFonts w:hint="eastAsia"/>
                 <w:lang w:val="en-US"/>
               </w:rPr>
-            </w:pPr>
+              <w:t xml:space="preserve">List the </w:t>
+            </w:r>
+            <w:proofErr w:type="spellStart"/>
             <w:r>
               <w:rPr>
                 <w:rFonts w:hint="eastAsia"/>
                 <w:lang w:val="en-US"/>
               </w:rPr>
-              <w:t xml:space="preserve">List the dataverse </w:t>
+              <w:t>dataverse</w:t>
+            </w:r>
+            <w:proofErr w:type="spellEnd"/>
+            <w:r>
+              <w:rPr>
+                <w:rFonts w:hint="eastAsia"/>
+                <w:lang w:val="en-US"/>
+              </w:rPr>
+              <w:t xml:space="preserve"> </w:t>
             </w:r>
             <w:r>
               <w:rPr>
@@ -1688,10 +1891,29 @@
           <w:p>
             <w:pPr>
               <w:rPr>
+                <w:lang w:val="en-US"/>
+              </w:rPr>
+            </w:pPr>
+          </w:p>
+          <w:p>
+            <w:pPr>
+              <w:rPr>
                 <w:rFonts w:hint="eastAsia"/>
-                <w:lang w:val="en-US"/>
-              </w:rPr>
-            </w:pPr>
+                <w:sz w:val="40"/>
+                <w:szCs w:val="40"/>
+                <w:lang w:val="en-US"/>
+              </w:rPr>
+            </w:pPr>
+            <w:r>
+              <w:rPr>
+                <w:rFonts w:hint="eastAsia"/>
+                <w:color w:val="FF0000"/>
+                <w:sz w:val="40"/>
+                <w:szCs w:val="40"/>
+                <w:lang w:val="en-US"/>
+              </w:rPr>
+              <w:t>TBD</w:t>
+            </w:r>
           </w:p>
         </w:tc>
         <w:tc>
@@ -1820,38 +2042,88 @@
                 <w:bCs/>
                 <w:lang w:val="en-US"/>
               </w:rPr>
-              <w:t>*If the dataset was deposited in a sub-dataverse collection, does it require its own dataverse?</w:t>
-            </w:r>
-          </w:p>
-        </w:tc>
-        <w:tc>
-          <w:tcPr>
-            <w:tcW w:w="0" w:type="auto"/>
-            <w:tcBorders>
-              <w:top w:val="single" w:sz="8" w:space="0" w:color="000000"/>
-              <w:left w:val="single" w:sz="8" w:space="0" w:color="000000"/>
-              <w:bottom w:val="single" w:sz="8" w:space="0" w:color="000000"/>
-              <w:right w:val="single" w:sz="8" w:space="0" w:color="000000"/>
-            </w:tcBorders>
-            <w:tcMar>
-              <w:top w:w="100" w:type="dxa"/>
-              <w:left w:w="100" w:type="dxa"/>
-              <w:bottom w:w="100" w:type="dxa"/>
-              <w:right w:w="100" w:type="dxa"/>
-            </w:tcMar>
-            <w:hideMark/>
-          </w:tcPr>
-          <w:p>
-            <w:pPr>
-              <w:rPr>
-                <w:lang w:val="en-US"/>
-              </w:rPr>
-            </w:pPr>
-            <w:r>
-              <w:rPr>
-                <w:lang w:val="en-US"/>
-              </w:rPr>
-              <w:t>If the depositor created a dataverse with one dataset:</w:t>
+              <w:t>*If the dataset was deposited in a sub-</w:t>
+            </w:r>
+            <w:proofErr w:type="spellStart"/>
+            <w:r>
+              <w:rPr>
+                <w:b/>
+                <w:bCs/>
+                <w:lang w:val="en-US"/>
+              </w:rPr>
+              <w:t>dataverse</w:t>
+            </w:r>
+            <w:proofErr w:type="spellEnd"/>
+            <w:r>
+              <w:rPr>
+                <w:b/>
+                <w:bCs/>
+                <w:lang w:val="en-US"/>
+              </w:rPr>
+              <w:t xml:space="preserve"> collection, does it require its own </w:t>
+            </w:r>
+            <w:proofErr w:type="spellStart"/>
+            <w:r>
+              <w:rPr>
+                <w:b/>
+                <w:bCs/>
+                <w:lang w:val="en-US"/>
+              </w:rPr>
+              <w:t>dataverse</w:t>
+            </w:r>
+            <w:proofErr w:type="spellEnd"/>
+            <w:r>
+              <w:rPr>
+                <w:b/>
+                <w:bCs/>
+                <w:lang w:val="en-US"/>
+              </w:rPr>
+              <w:t>?</w:t>
+            </w:r>
+          </w:p>
+        </w:tc>
+        <w:tc>
+          <w:tcPr>
+            <w:tcW w:w="0" w:type="auto"/>
+            <w:tcBorders>
+              <w:top w:val="single" w:sz="8" w:space="0" w:color="000000"/>
+              <w:left w:val="single" w:sz="8" w:space="0" w:color="000000"/>
+              <w:bottom w:val="single" w:sz="8" w:space="0" w:color="000000"/>
+              <w:right w:val="single" w:sz="8" w:space="0" w:color="000000"/>
+            </w:tcBorders>
+            <w:tcMar>
+              <w:top w:w="100" w:type="dxa"/>
+              <w:left w:w="100" w:type="dxa"/>
+              <w:bottom w:w="100" w:type="dxa"/>
+              <w:right w:w="100" w:type="dxa"/>
+            </w:tcMar>
+            <w:hideMark/>
+          </w:tcPr>
+          <w:p>
+            <w:pPr>
+              <w:rPr>
+                <w:lang w:val="en-US"/>
+              </w:rPr>
+            </w:pPr>
+            <w:r>
+              <w:rPr>
+                <w:lang w:val="en-US"/>
+              </w:rPr>
+              <w:t xml:space="preserve">If the depositor created a </w:t>
+            </w:r>
+            <w:proofErr w:type="spellStart"/>
+            <w:r>
+              <w:rPr>
+                <w:lang w:val="en-US"/>
+              </w:rPr>
+              <w:t>dataverse</w:t>
+            </w:r>
+            <w:proofErr w:type="spellEnd"/>
+            <w:r>
+              <w:rPr>
+                <w:lang w:val="en-US"/>
+              </w:rPr>
+              <w:t xml:space="preserve"> with one dataset:</w:t>
             </w:r>
           </w:p>
           <w:p>
@@ -1868,7 +2140,21 @@
               <w:rPr>
                 <w:lang w:val="en-US"/>
               </w:rPr>
-              <w:t>Is it the only dataset in the sub-dataverse collection?</w:t>
+              <w:t>Is it the only dataset in the sub-</w:t>
+            </w:r>
+            <w:proofErr w:type="spellStart"/>
+            <w:r>
+              <w:rPr>
+                <w:lang w:val="en-US"/>
+              </w:rPr>
+              <w:t>dataverse</w:t>
+            </w:r>
+            <w:proofErr w:type="spellEnd"/>
+            <w:r>
+              <w:rPr>
+                <w:lang w:val="en-US"/>
+              </w:rPr>
+              <w:t xml:space="preserve"> collection?</w:t>
             </w:r>
           </w:p>
           <w:p>
@@ -1885,7 +2171,21 @@
               <w:rPr>
                 <w:lang w:val="en-US"/>
               </w:rPr>
-              <w:t>Is there another sub-dataverse collection it should be in?</w:t>
+              <w:t>Is there another sub-</w:t>
+            </w:r>
+            <w:proofErr w:type="spellStart"/>
+            <w:r>
+              <w:rPr>
+                <w:lang w:val="en-US"/>
+              </w:rPr>
+              <w:t>dataverse</w:t>
+            </w:r>
+            <w:proofErr w:type="spellEnd"/>
+            <w:r>
+              <w:rPr>
+                <w:lang w:val="en-US"/>
+              </w:rPr>
+              <w:t xml:space="preserve"> collection it should be in?</w:t>
             </w:r>
           </w:p>
           <w:p>
@@ -1919,7 +2219,21 @@
               <w:rPr>
                 <w:lang w:val="en-US"/>
               </w:rPr>
-              <w:t>Confirm with the depositor that they actually require a dataverse (e.g., will there be future deposits?)</w:t>
+              <w:t xml:space="preserve">Confirm with the depositor that they actually require a </w:t>
+            </w:r>
+            <w:proofErr w:type="spellStart"/>
+            <w:r>
+              <w:rPr>
+                <w:lang w:val="en-US"/>
+              </w:rPr>
+              <w:t>dataverse</w:t>
+            </w:r>
+            <w:proofErr w:type="spellEnd"/>
+            <w:r>
+              <w:rPr>
+                <w:lang w:val="en-US"/>
+              </w:rPr>
+              <w:t xml:space="preserve"> (e.g., will there be future deposits?)</w:t>
             </w:r>
           </w:p>
         </w:tc>
@@ -2167,6 +2481,7 @@
                 <w:bCs/>
                 <w:lang w:val="en-US"/>
               </w:rPr>
+              <w:lastRenderedPageBreak/>
               <w:t>2.0</w:t>
             </w:r>
           </w:p>
@@ -2510,7 +2825,6 @@
                 <w:bCs/>
                 <w:lang w:val="en-US"/>
               </w:rPr>
-              <w:lastRenderedPageBreak/>
               <w:t>2.1a</w:t>
             </w:r>
           </w:p>
@@ -2606,63 +2920,91 @@
               <w:rPr>
                 <w:lang w:val="en-US"/>
               </w:rPr>
-              <w:t>{% if template_dict.file_ext.comments|length == 0 %}X{% endif %}</w:t>
-            </w:r>
-          </w:p>
-        </w:tc>
-        <w:tc>
-          <w:tcPr>
-            <w:tcW w:w="0" w:type="auto"/>
-            <w:tcBorders>
-              <w:top w:val="single" w:sz="8" w:space="0" w:color="000000"/>
-              <w:left w:val="single" w:sz="8" w:space="0" w:color="000000"/>
-              <w:bottom w:val="single" w:sz="8" w:space="0" w:color="000000"/>
-              <w:right w:val="single" w:sz="8" w:space="0" w:color="000000"/>
-            </w:tcBorders>
-            <w:tcMar>
-              <w:top w:w="100" w:type="dxa"/>
-              <w:left w:w="100" w:type="dxa"/>
-              <w:bottom w:w="100" w:type="dxa"/>
-              <w:right w:w="100" w:type="dxa"/>
-            </w:tcMar>
-            <w:hideMark/>
-          </w:tcPr>
-          <w:p>
-            <w:pPr>
-              <w:rPr>
-                <w:lang w:val="en-US"/>
-              </w:rPr>
-            </w:pPr>
-          </w:p>
-        </w:tc>
-        <w:tc>
-          <w:tcPr>
-            <w:tcW w:w="0" w:type="auto"/>
-            <w:tcBorders>
-              <w:top w:val="single" w:sz="8" w:space="0" w:color="000000"/>
-              <w:left w:val="single" w:sz="8" w:space="0" w:color="000000"/>
-              <w:bottom w:val="single" w:sz="8" w:space="0" w:color="000000"/>
-              <w:right w:val="single" w:sz="8" w:space="0" w:color="000000"/>
-            </w:tcBorders>
-            <w:tcMar>
-              <w:top w:w="100" w:type="dxa"/>
-              <w:left w:w="100" w:type="dxa"/>
-              <w:bottom w:w="100" w:type="dxa"/>
-              <w:right w:w="100" w:type="dxa"/>
-            </w:tcMar>
-            <w:hideMark/>
-          </w:tcPr>
-          <w:p>
-            <w:pPr>
-              <w:rPr>
-                <w:lang w:val="en-US"/>
-              </w:rPr>
-            </w:pPr>
-            <w:r>
-              <w:rPr>
-                <w:lang w:val="en-US"/>
-              </w:rPr>
-              <w:t>{% if template_dict.file_ext.comments|length &gt; 0 %}X{% endif %}</w:t>
+              <w:t xml:space="preserve">{% if </w:t>
+            </w:r>
+            <w:proofErr w:type="spellStart"/>
+            <w:r>
+              <w:rPr>
+                <w:lang w:val="en-US"/>
+              </w:rPr>
+              <w:t>template_dict.file_ext.comments|length</w:t>
+            </w:r>
+            <w:proofErr w:type="spellEnd"/>
+            <w:r>
+              <w:rPr>
+                <w:lang w:val="en-US"/>
+              </w:rPr>
+              <w:t xml:space="preserve"> == 0 %}X{% endif %}</w:t>
+            </w:r>
+          </w:p>
+        </w:tc>
+        <w:tc>
+          <w:tcPr>
+            <w:tcW w:w="0" w:type="auto"/>
+            <w:tcBorders>
+              <w:top w:val="single" w:sz="8" w:space="0" w:color="000000"/>
+              <w:left w:val="single" w:sz="8" w:space="0" w:color="000000"/>
+              <w:bottom w:val="single" w:sz="8" w:space="0" w:color="000000"/>
+              <w:right w:val="single" w:sz="8" w:space="0" w:color="000000"/>
+            </w:tcBorders>
+            <w:tcMar>
+              <w:top w:w="100" w:type="dxa"/>
+              <w:left w:w="100" w:type="dxa"/>
+              <w:bottom w:w="100" w:type="dxa"/>
+              <w:right w:w="100" w:type="dxa"/>
+            </w:tcMar>
+            <w:hideMark/>
+          </w:tcPr>
+          <w:p>
+            <w:pPr>
+              <w:rPr>
+                <w:lang w:val="en-US"/>
+              </w:rPr>
+            </w:pPr>
+          </w:p>
+        </w:tc>
+        <w:tc>
+          <w:tcPr>
+            <w:tcW w:w="0" w:type="auto"/>
+            <w:tcBorders>
+              <w:top w:val="single" w:sz="8" w:space="0" w:color="000000"/>
+              <w:left w:val="single" w:sz="8" w:space="0" w:color="000000"/>
+              <w:bottom w:val="single" w:sz="8" w:space="0" w:color="000000"/>
+              <w:right w:val="single" w:sz="8" w:space="0" w:color="000000"/>
+            </w:tcBorders>
+            <w:tcMar>
+              <w:top w:w="100" w:type="dxa"/>
+              <w:left w:w="100" w:type="dxa"/>
+              <w:bottom w:w="100" w:type="dxa"/>
+              <w:right w:w="100" w:type="dxa"/>
+            </w:tcMar>
+            <w:hideMark/>
+          </w:tcPr>
+          <w:p>
+            <w:pPr>
+              <w:rPr>
+                <w:lang w:val="en-US"/>
+              </w:rPr>
+            </w:pPr>
+            <w:r>
+              <w:rPr>
+                <w:lang w:val="en-US"/>
+              </w:rPr>
+              <w:t xml:space="preserve">{% if </w:t>
+            </w:r>
+            <w:proofErr w:type="spellStart"/>
+            <w:r>
+              <w:rPr>
+                <w:lang w:val="en-US"/>
+              </w:rPr>
+              <w:t>template_dict.file_ext.comments|length</w:t>
+            </w:r>
+            <w:proofErr w:type="spellEnd"/>
+            <w:r>
+              <w:rPr>
+                <w:lang w:val="en-US"/>
+              </w:rPr>
+              <w:t xml:space="preserve"> &gt; 0 %}X{% endif %}</w:t>
             </w:r>
           </w:p>
         </w:tc>
@@ -2756,7 +3098,21 @@
               <w:rPr>
                 <w:lang w:val="en-US"/>
               </w:rPr>
-              <w:t>{% for item in template_dict.file_open.comments %}</w:t>
+              <w:t xml:space="preserve">{% for item in </w:t>
+            </w:r>
+            <w:proofErr w:type="spellStart"/>
+            <w:r>
+              <w:rPr>
+                <w:lang w:val="en-US"/>
+              </w:rPr>
+              <w:t>template_dict.file_open.comments</w:t>
+            </w:r>
+            <w:proofErr w:type="spellEnd"/>
+            <w:r>
+              <w:rPr>
+                <w:lang w:val="en-US"/>
+              </w:rPr>
+              <w:t xml:space="preserve"> %}</w:t>
             </w:r>
             <w:r>
               <w:rPr>
@@ -2768,7 +3124,21 @@
               <w:rPr>
                 <w:lang w:val="en-US"/>
               </w:rPr>
-              <w:t>{{ item.file_name }}</w:t>
+              <w:t xml:space="preserve">{{ </w:t>
+            </w:r>
+            <w:proofErr w:type="spellStart"/>
+            <w:r>
+              <w:rPr>
+                <w:lang w:val="en-US"/>
+              </w:rPr>
+              <w:t>item.file_name</w:t>
+            </w:r>
+            <w:proofErr w:type="spellEnd"/>
+            <w:r>
+              <w:rPr>
+                <w:lang w:val="en-US"/>
+              </w:rPr>
+              <w:t xml:space="preserve"> }}</w:t>
             </w:r>
             <w:r>
               <w:rPr>
@@ -2780,7 +3150,21 @@
               <w:rPr>
                 <w:lang w:val="en-US"/>
               </w:rPr>
-              <w:t>{% endfor %}</w:t>
+              <w:t xml:space="preserve">{% </w:t>
+            </w:r>
+            <w:proofErr w:type="spellStart"/>
+            <w:r>
+              <w:rPr>
+                <w:lang w:val="en-US"/>
+              </w:rPr>
+              <w:t>endfor</w:t>
+            </w:r>
+            <w:proofErr w:type="spellEnd"/>
+            <w:r>
+              <w:rPr>
+                <w:lang w:val="en-US"/>
+              </w:rPr>
+              <w:t xml:space="preserve"> %}</w:t>
             </w:r>
           </w:p>
           <w:p>
@@ -2805,14 +3189,82 @@
           </w:p>
           <w:p>
             <w:pPr>
-              <w:numPr>
-                <w:ilvl w:val="0"/>
-                <w:numId w:val="4"/>
-              </w:numPr>
-              <w:rPr>
-                <w:lang w:val="en-US"/>
-              </w:rPr>
-            </w:pPr>
+              <w:rPr>
+                <w:lang w:val="en-US"/>
+              </w:rPr>
+            </w:pPr>
+            <w:r>
+              <w:rPr>
+                <w:lang w:val="en-US"/>
+              </w:rPr>
+              <w:t xml:space="preserve">{% for item in </w:t>
+            </w:r>
+            <w:proofErr w:type="spellStart"/>
+            <w:r>
+              <w:rPr>
+                <w:lang w:val="en-US"/>
+              </w:rPr>
+              <w:t>template_dict.file_open.not_checked</w:t>
+            </w:r>
+            <w:proofErr w:type="spellEnd"/>
+            <w:r>
+              <w:rPr>
+                <w:lang w:val="en-US"/>
+              </w:rPr>
+              <w:t xml:space="preserve"> %}</w:t>
+            </w:r>
+            <w:r>
+              <w:rPr>
+                <w:lang w:val="en-US"/>
+              </w:rPr>
+              <w:br/>
+            </w:r>
+            <w:r>
+              <w:rPr>
+                <w:lang w:val="en-US"/>
+              </w:rPr>
+              <w:t xml:space="preserve">{{ </w:t>
+            </w:r>
+            <w:proofErr w:type="spellStart"/>
+            <w:r>
+              <w:rPr>
+                <w:lang w:val="en-US"/>
+              </w:rPr>
+              <w:t>item.file_name</w:t>
+            </w:r>
+            <w:proofErr w:type="spellEnd"/>
+            <w:r>
+              <w:rPr>
+                <w:lang w:val="en-US"/>
+              </w:rPr>
+              <w:t xml:space="preserve"> }}</w:t>
+            </w:r>
+            <w:r>
+              <w:rPr>
+                <w:lang w:val="en-US"/>
+              </w:rPr>
+              <w:br/>
+            </w:r>
+            <w:r>
+              <w:rPr>
+                <w:lang w:val="en-US"/>
+              </w:rPr>
+              <w:t xml:space="preserve">{% </w:t>
+            </w:r>
+            <w:proofErr w:type="spellStart"/>
+            <w:r>
+              <w:rPr>
+                <w:lang w:val="en-US"/>
+              </w:rPr>
+              <w:t>endfor</w:t>
+            </w:r>
+            <w:proofErr w:type="spellEnd"/>
+            <w:r>
+              <w:rPr>
+                <w:lang w:val="en-US"/>
+              </w:rPr>
+              <w:t xml:space="preserve"> %}</w:t>
+            </w:r>
           </w:p>
         </w:tc>
         <w:tc>
@@ -3018,63 +3470,91 @@
               <w:rPr>
                 <w:lang w:val="en-US"/>
               </w:rPr>
-              <w:t>{% if template_dict.special_characters.comments|length == 0 %}X{% endif %}</w:t>
-            </w:r>
-          </w:p>
-        </w:tc>
-        <w:tc>
-          <w:tcPr>
-            <w:tcW w:w="0" w:type="auto"/>
-            <w:tcBorders>
-              <w:top w:val="single" w:sz="8" w:space="0" w:color="000000"/>
-              <w:left w:val="single" w:sz="8" w:space="0" w:color="000000"/>
-              <w:bottom w:val="single" w:sz="8" w:space="0" w:color="000000"/>
-              <w:right w:val="single" w:sz="8" w:space="0" w:color="000000"/>
-            </w:tcBorders>
-            <w:tcMar>
-              <w:top w:w="100" w:type="dxa"/>
-              <w:left w:w="100" w:type="dxa"/>
-              <w:bottom w:w="100" w:type="dxa"/>
-              <w:right w:w="100" w:type="dxa"/>
-            </w:tcMar>
-            <w:hideMark/>
-          </w:tcPr>
-          <w:p>
-            <w:pPr>
-              <w:rPr>
-                <w:lang w:val="en-US"/>
-              </w:rPr>
-            </w:pPr>
-          </w:p>
-        </w:tc>
-        <w:tc>
-          <w:tcPr>
-            <w:tcW w:w="0" w:type="auto"/>
-            <w:tcBorders>
-              <w:top w:val="single" w:sz="8" w:space="0" w:color="000000"/>
-              <w:left w:val="single" w:sz="8" w:space="0" w:color="000000"/>
-              <w:bottom w:val="single" w:sz="8" w:space="0" w:color="000000"/>
-              <w:right w:val="single" w:sz="8" w:space="0" w:color="000000"/>
-            </w:tcBorders>
-            <w:tcMar>
-              <w:top w:w="100" w:type="dxa"/>
-              <w:left w:w="100" w:type="dxa"/>
-              <w:bottom w:w="100" w:type="dxa"/>
-              <w:right w:w="100" w:type="dxa"/>
-            </w:tcMar>
-            <w:hideMark/>
-          </w:tcPr>
-          <w:p>
-            <w:pPr>
-              <w:rPr>
-                <w:lang w:val="en-US"/>
-              </w:rPr>
-            </w:pPr>
-            <w:r>
-              <w:rPr>
-                <w:lang w:val="en-US"/>
-              </w:rPr>
-              <w:t>{% if template_dict.special_characters.comments|length &gt; 0 %}X{% endif %}</w:t>
+              <w:t xml:space="preserve">{% if </w:t>
+            </w:r>
+            <w:proofErr w:type="spellStart"/>
+            <w:r>
+              <w:rPr>
+                <w:lang w:val="en-US"/>
+              </w:rPr>
+              <w:t>template_dict.special_characters.comments|length</w:t>
+            </w:r>
+            <w:proofErr w:type="spellEnd"/>
+            <w:r>
+              <w:rPr>
+                <w:lang w:val="en-US"/>
+              </w:rPr>
+              <w:t xml:space="preserve"> == 0 %}X{% endif %}</w:t>
+            </w:r>
+          </w:p>
+        </w:tc>
+        <w:tc>
+          <w:tcPr>
+            <w:tcW w:w="0" w:type="auto"/>
+            <w:tcBorders>
+              <w:top w:val="single" w:sz="8" w:space="0" w:color="000000"/>
+              <w:left w:val="single" w:sz="8" w:space="0" w:color="000000"/>
+              <w:bottom w:val="single" w:sz="8" w:space="0" w:color="000000"/>
+              <w:right w:val="single" w:sz="8" w:space="0" w:color="000000"/>
+            </w:tcBorders>
+            <w:tcMar>
+              <w:top w:w="100" w:type="dxa"/>
+              <w:left w:w="100" w:type="dxa"/>
+              <w:bottom w:w="100" w:type="dxa"/>
+              <w:right w:w="100" w:type="dxa"/>
+            </w:tcMar>
+            <w:hideMark/>
+          </w:tcPr>
+          <w:p>
+            <w:pPr>
+              <w:rPr>
+                <w:lang w:val="en-US"/>
+              </w:rPr>
+            </w:pPr>
+          </w:p>
+        </w:tc>
+        <w:tc>
+          <w:tcPr>
+            <w:tcW w:w="0" w:type="auto"/>
+            <w:tcBorders>
+              <w:top w:val="single" w:sz="8" w:space="0" w:color="000000"/>
+              <w:left w:val="single" w:sz="8" w:space="0" w:color="000000"/>
+              <w:bottom w:val="single" w:sz="8" w:space="0" w:color="000000"/>
+              <w:right w:val="single" w:sz="8" w:space="0" w:color="000000"/>
+            </w:tcBorders>
+            <w:tcMar>
+              <w:top w:w="100" w:type="dxa"/>
+              <w:left w:w="100" w:type="dxa"/>
+              <w:bottom w:w="100" w:type="dxa"/>
+              <w:right w:w="100" w:type="dxa"/>
+            </w:tcMar>
+            <w:hideMark/>
+          </w:tcPr>
+          <w:p>
+            <w:pPr>
+              <w:rPr>
+                <w:lang w:val="en-US"/>
+              </w:rPr>
+            </w:pPr>
+            <w:r>
+              <w:rPr>
+                <w:lang w:val="en-US"/>
+              </w:rPr>
+              <w:t xml:space="preserve">{% if </w:t>
+            </w:r>
+            <w:proofErr w:type="spellStart"/>
+            <w:r>
+              <w:rPr>
+                <w:lang w:val="en-US"/>
+              </w:rPr>
+              <w:t>template_dict.special_characters.comments|length</w:t>
+            </w:r>
+            <w:proofErr w:type="spellEnd"/>
+            <w:r>
+              <w:rPr>
+                <w:lang w:val="en-US"/>
+              </w:rPr>
+              <w:t xml:space="preserve"> &gt; 0 %}X{% endif %}</w:t>
             </w:r>
           </w:p>
         </w:tc>
@@ -3168,33 +3648,75 @@
               <w:rPr>
                 <w:lang w:val="en-US"/>
               </w:rPr>
-              <w:t>{% for item in template_dict.special_characters.comments %}</w:t>
-            </w:r>
-          </w:p>
-          <w:p>
-            <w:pPr>
-              <w:rPr>
-                <w:lang w:val="en-US"/>
-              </w:rPr>
-            </w:pPr>
-            <w:r>
-              <w:rPr>
-                <w:lang w:val="en-US"/>
-              </w:rPr>
-              <w:t>{{ item.file_name }}</w:t>
-            </w:r>
-          </w:p>
-          <w:p>
-            <w:pPr>
-              <w:rPr>
-                <w:lang w:val="en-US"/>
-              </w:rPr>
-            </w:pPr>
-            <w:r>
-              <w:rPr>
-                <w:lang w:val="en-US"/>
-              </w:rPr>
-              <w:t>{% endfor %}</w:t>
+              <w:t xml:space="preserve">{% for item in </w:t>
+            </w:r>
+            <w:proofErr w:type="spellStart"/>
+            <w:r>
+              <w:rPr>
+                <w:lang w:val="en-US"/>
+              </w:rPr>
+              <w:t>template_dict.special_characters.comments</w:t>
+            </w:r>
+            <w:proofErr w:type="spellEnd"/>
+            <w:r>
+              <w:rPr>
+                <w:lang w:val="en-US"/>
+              </w:rPr>
+              <w:t xml:space="preserve"> %}</w:t>
+            </w:r>
+          </w:p>
+          <w:p>
+            <w:pPr>
+              <w:rPr>
+                <w:lang w:val="en-US"/>
+              </w:rPr>
+            </w:pPr>
+            <w:r>
+              <w:rPr>
+                <w:lang w:val="en-US"/>
+              </w:rPr>
+              <w:t xml:space="preserve">{{ </w:t>
+            </w:r>
+            <w:proofErr w:type="spellStart"/>
+            <w:r>
+              <w:rPr>
+                <w:lang w:val="en-US"/>
+              </w:rPr>
+              <w:t>item.file_name</w:t>
+            </w:r>
+            <w:proofErr w:type="spellEnd"/>
+            <w:r>
+              <w:rPr>
+                <w:lang w:val="en-US"/>
+              </w:rPr>
+              <w:t xml:space="preserve"> }}</w:t>
+            </w:r>
+          </w:p>
+          <w:p>
+            <w:pPr>
+              <w:rPr>
+                <w:lang w:val="en-US"/>
+              </w:rPr>
+            </w:pPr>
+            <w:r>
+              <w:rPr>
+                <w:lang w:val="en-US"/>
+              </w:rPr>
+              <w:t xml:space="preserve">{% </w:t>
+            </w:r>
+            <w:proofErr w:type="spellStart"/>
+            <w:r>
+              <w:rPr>
+                <w:lang w:val="en-US"/>
+              </w:rPr>
+              <w:t>endfor</w:t>
+            </w:r>
+            <w:proofErr w:type="spellEnd"/>
+            <w:r>
+              <w:rPr>
+                <w:lang w:val="en-US"/>
+              </w:rPr>
+              <w:t xml:space="preserve"> %}</w:t>
             </w:r>
           </w:p>
         </w:tc>
@@ -3386,58 +3908,92 @@
               <w:rPr>
                 <w:lang w:val="en-US"/>
               </w:rPr>
-              <w:t>{% if template_dict.readme_file.comments|length &gt; 0 %}X{% endif %}</w:t>
-            </w:r>
-          </w:p>
-        </w:tc>
-        <w:tc>
-          <w:tcPr>
-            <w:tcW w:w="0" w:type="auto"/>
-            <w:tcBorders>
-              <w:top w:val="single" w:sz="8" w:space="0" w:color="000000"/>
-              <w:left w:val="single" w:sz="8" w:space="0" w:color="000000"/>
-              <w:bottom w:val="single" w:sz="8" w:space="0" w:color="000000"/>
-              <w:right w:val="single" w:sz="8" w:space="0" w:color="000000"/>
-            </w:tcBorders>
-            <w:tcMar>
-              <w:top w:w="100" w:type="dxa"/>
-              <w:left w:w="100" w:type="dxa"/>
-              <w:bottom w:w="100" w:type="dxa"/>
-              <w:right w:w="100" w:type="dxa"/>
-            </w:tcMar>
-            <w:hideMark/>
-          </w:tcPr>
-          <w:p>
-            <w:pPr>
-              <w:rPr>
-                <w:lang w:val="en-US"/>
-              </w:rPr>
-            </w:pPr>
-          </w:p>
-        </w:tc>
-        <w:tc>
-          <w:tcPr>
-            <w:tcW w:w="0" w:type="auto"/>
-            <w:tcBorders>
-              <w:top w:val="single" w:sz="8" w:space="0" w:color="000000"/>
-              <w:left w:val="single" w:sz="8" w:space="0" w:color="000000"/>
-              <w:bottom w:val="single" w:sz="8" w:space="0" w:color="000000"/>
-              <w:right w:val="single" w:sz="8" w:space="0" w:color="000000"/>
-            </w:tcBorders>
-            <w:tcMar>
-              <w:top w:w="100" w:type="dxa"/>
-              <w:left w:w="100" w:type="dxa"/>
-              <w:bottom w:w="100" w:type="dxa"/>
-              <w:right w:w="100" w:type="dxa"/>
-            </w:tcMar>
-            <w:hideMark/>
-          </w:tcPr>
-          <w:p>
-            <w:pPr>
-              <w:rPr>
-                <w:lang w:val="en-US"/>
-              </w:rPr>
-            </w:pPr>
+              <w:t xml:space="preserve">{% if </w:t>
+            </w:r>
+            <w:proofErr w:type="spellStart"/>
+            <w:r>
+              <w:rPr>
+                <w:lang w:val="en-US"/>
+              </w:rPr>
+              <w:t>template_dict.readme_file.comments|length</w:t>
+            </w:r>
+            <w:proofErr w:type="spellEnd"/>
+            <w:r>
+              <w:rPr>
+                <w:lang w:val="en-US"/>
+              </w:rPr>
+              <w:t xml:space="preserve"> &gt; 0 %}X{% endif %}</w:t>
+            </w:r>
+          </w:p>
+        </w:tc>
+        <w:tc>
+          <w:tcPr>
+            <w:tcW w:w="0" w:type="auto"/>
+            <w:tcBorders>
+              <w:top w:val="single" w:sz="8" w:space="0" w:color="000000"/>
+              <w:left w:val="single" w:sz="8" w:space="0" w:color="000000"/>
+              <w:bottom w:val="single" w:sz="8" w:space="0" w:color="000000"/>
+              <w:right w:val="single" w:sz="8" w:space="0" w:color="000000"/>
+            </w:tcBorders>
+            <w:tcMar>
+              <w:top w:w="100" w:type="dxa"/>
+              <w:left w:w="100" w:type="dxa"/>
+              <w:bottom w:w="100" w:type="dxa"/>
+              <w:right w:w="100" w:type="dxa"/>
+            </w:tcMar>
+            <w:hideMark/>
+          </w:tcPr>
+          <w:p>
+            <w:pPr>
+              <w:rPr>
+                <w:lang w:val="en-US"/>
+              </w:rPr>
+            </w:pPr>
+          </w:p>
+        </w:tc>
+        <w:tc>
+          <w:tcPr>
+            <w:tcW w:w="0" w:type="auto"/>
+            <w:tcBorders>
+              <w:top w:val="single" w:sz="8" w:space="0" w:color="000000"/>
+              <w:left w:val="single" w:sz="8" w:space="0" w:color="000000"/>
+              <w:bottom w:val="single" w:sz="8" w:space="0" w:color="000000"/>
+              <w:right w:val="single" w:sz="8" w:space="0" w:color="000000"/>
+            </w:tcBorders>
+            <w:tcMar>
+              <w:top w:w="100" w:type="dxa"/>
+              <w:left w:w="100" w:type="dxa"/>
+              <w:bottom w:w="100" w:type="dxa"/>
+              <w:right w:w="100" w:type="dxa"/>
+            </w:tcMar>
+            <w:hideMark/>
+          </w:tcPr>
+          <w:p>
+            <w:pPr>
+              <w:rPr>
+                <w:lang w:val="en-US"/>
+              </w:rPr>
+            </w:pPr>
+            <w:r>
+              <w:rPr>
+                <w:lang w:val="en-US"/>
+              </w:rPr>
+              <w:t xml:space="preserve">{% if </w:t>
+            </w:r>
+            <w:proofErr w:type="spellStart"/>
+            <w:r>
+              <w:rPr>
+                <w:lang w:val="en-US"/>
+              </w:rPr>
+              <w:t>template_dict.file_ext.comments|length</w:t>
+            </w:r>
+            <w:proofErr w:type="spellEnd"/>
+            <w:r>
+              <w:rPr>
+                <w:lang w:val="en-US"/>
+              </w:rPr>
+              <w:t xml:space="preserve"> &gt; 0 %}X{% endif %}</w:t>
+            </w:r>
           </w:p>
         </w:tc>
         <w:tc>
@@ -3522,14 +4078,82 @@
           </w:p>
           <w:p>
             <w:pPr>
-              <w:numPr>
-                <w:ilvl w:val="0"/>
-                <w:numId w:val="6"/>
-              </w:numPr>
-              <w:rPr>
-                <w:lang w:val="en-US"/>
-              </w:rPr>
-            </w:pPr>
+              <w:rPr>
+                <w:lang w:val="en-US"/>
+              </w:rPr>
+            </w:pPr>
+            <w:r>
+              <w:rPr>
+                <w:lang w:val="en-US"/>
+              </w:rPr>
+              <w:t xml:space="preserve">{% for item in </w:t>
+            </w:r>
+            <w:proofErr w:type="spellStart"/>
+            <w:r>
+              <w:rPr>
+                <w:lang w:val="en-US"/>
+              </w:rPr>
+              <w:t>template_dict.file_ext.comments</w:t>
+            </w:r>
+            <w:proofErr w:type="spellEnd"/>
+            <w:r>
+              <w:rPr>
+                <w:lang w:val="en-US"/>
+              </w:rPr>
+              <w:t xml:space="preserve"> %}</w:t>
+            </w:r>
+            <w:r>
+              <w:rPr>
+                <w:lang w:val="en-US"/>
+              </w:rPr>
+              <w:br/>
+            </w:r>
+            <w:r>
+              <w:rPr>
+                <w:lang w:val="en-US"/>
+              </w:rPr>
+              <w:t xml:space="preserve">{{ </w:t>
+            </w:r>
+            <w:proofErr w:type="spellStart"/>
+            <w:r>
+              <w:rPr>
+                <w:lang w:val="en-US"/>
+              </w:rPr>
+              <w:t>item.file_name</w:t>
+            </w:r>
+            <w:proofErr w:type="spellEnd"/>
+            <w:r>
+              <w:rPr>
+                <w:lang w:val="en-US"/>
+              </w:rPr>
+              <w:t xml:space="preserve"> }}</w:t>
+            </w:r>
+            <w:r>
+              <w:rPr>
+                <w:lang w:val="en-US"/>
+              </w:rPr>
+              <w:br/>
+            </w:r>
+            <w:r>
+              <w:rPr>
+                <w:lang w:val="en-US"/>
+              </w:rPr>
+              <w:t xml:space="preserve">{% </w:t>
+            </w:r>
+            <w:proofErr w:type="spellStart"/>
+            <w:r>
+              <w:rPr>
+                <w:lang w:val="en-US"/>
+              </w:rPr>
+              <w:t>endfor</w:t>
+            </w:r>
+            <w:proofErr w:type="spellEnd"/>
+            <w:r>
+              <w:rPr>
+                <w:lang w:val="en-US"/>
+              </w:rPr>
+              <w:t xml:space="preserve"> %}</w:t>
+            </w:r>
           </w:p>
         </w:tc>
         <w:tc>
@@ -3850,14 +4474,43 @@
           </w:p>
           <w:p>
             <w:pPr>
-              <w:numPr>
-                <w:ilvl w:val="0"/>
-                <w:numId w:val="7"/>
-              </w:numPr>
-              <w:rPr>
-                <w:lang w:val="en-US"/>
-              </w:rPr>
-            </w:pPr>
+              <w:ind w:left="720"/>
+              <w:rPr>
+                <w:sz w:val="40"/>
+                <w:szCs w:val="40"/>
+                <w:lang w:val="en-US"/>
+              </w:rPr>
+            </w:pPr>
+            <w:r>
+              <w:rPr>
+                <w:rFonts w:hint="eastAsia"/>
+                <w:color w:val="FF0000"/>
+                <w:sz w:val="40"/>
+                <w:szCs w:val="40"/>
+                <w:lang w:val="en-US"/>
+              </w:rPr>
+              <w:t>-</w:t>
+            </w:r>
+            <w:r>
+              <w:rPr>
+                <w:rFonts w:hint="eastAsia"/>
+                <w:color w:val="FF0000"/>
+                <w:sz w:val="40"/>
+                <w:szCs w:val="40"/>
+                <w:lang w:val="en-US"/>
+              </w:rPr>
+              <w:t>TBD</w:t>
+            </w:r>
+            <w:r>
+              <w:rPr>
+                <w:rFonts w:hint="eastAsia"/>
+                <w:color w:val="FF0000"/>
+                <w:sz w:val="40"/>
+                <w:szCs w:val="40"/>
+                <w:lang w:val="en-US"/>
+              </w:rPr>
+              <w:t>-</w:t>
+            </w:r>
           </w:p>
         </w:tc>
         <w:tc>
@@ -3953,6 +4606,7 @@
                 <w:bCs/>
                 <w:lang w:val="en-US"/>
               </w:rPr>
+              <w:lastRenderedPageBreak/>
               <w:t>2.5</w:t>
             </w:r>
           </w:p>
@@ -3986,16 +4640,7 @@
                 <w:bCs/>
                 <w:lang w:val="en-US"/>
               </w:rPr>
-              <w:t xml:space="preserve">*If some files do not appear on the common file format list, is there information or documentation about </w:t>
-            </w:r>
-            <w:r>
-              <w:rPr>
-                <w:b/>
-                <w:bCs/>
-                <w:lang w:val="en-US"/>
-              </w:rPr>
-              <w:lastRenderedPageBreak/>
-              <w:t>how to open the files(s)?</w:t>
+              <w:t>*If some files do not appear on the common file format list, is there information or documentation about how to open the files(s)?</w:t>
             </w:r>
           </w:p>
         </w:tc>
@@ -4030,15 +4675,7 @@
               <w:rPr>
                 <w:lang w:val="en-US"/>
               </w:rPr>
-              <w:lastRenderedPageBreak/>
-              <w:t xml:space="preserve">Review documentation files (e.g., README, other relevant files based on name) to determine </w:t>
-            </w:r>
-            <w:r>
-              <w:rPr>
-                <w:lang w:val="en-US"/>
-              </w:rPr>
-              <w:lastRenderedPageBreak/>
-              <w:t>if there is information about uncommon file types. </w:t>
+              <w:t>Review documentation files (e.g., README, other relevant files based on name) to determine if there is information about uncommon file types. </w:t>
             </w:r>
           </w:p>
         </w:tc>
@@ -4768,31 +5405,71 @@
                 <w:lang w:val="en-US"/>
               </w:rPr>
             </w:pPr>
-          </w:p>
-        </w:tc>
-        <w:tc>
-          <w:tcPr>
-            <w:tcW w:w="0" w:type="auto"/>
-            <w:tcBorders>
-              <w:top w:val="single" w:sz="8" w:space="0" w:color="000000"/>
-              <w:left w:val="single" w:sz="8" w:space="0" w:color="000000"/>
-              <w:bottom w:val="single" w:sz="8" w:space="0" w:color="000000"/>
-              <w:right w:val="single" w:sz="8" w:space="0" w:color="000000"/>
-            </w:tcBorders>
-            <w:tcMar>
-              <w:top w:w="100" w:type="dxa"/>
-              <w:left w:w="100" w:type="dxa"/>
-              <w:bottom w:w="100" w:type="dxa"/>
-              <w:right w:w="100" w:type="dxa"/>
-            </w:tcMar>
-            <w:hideMark/>
-          </w:tcPr>
-          <w:p>
-            <w:pPr>
-              <w:rPr>
-                <w:lang w:val="en-US"/>
-              </w:rPr>
-            </w:pPr>
+            <w:r>
+              <w:rPr>
+                <w:lang w:val="en-US"/>
+              </w:rPr>
+              <w:t xml:space="preserve">{% if </w:t>
+            </w:r>
+            <w:proofErr w:type="spellStart"/>
+            <w:r>
+              <w:rPr>
+                <w:lang w:val="en-US"/>
+              </w:rPr>
+              <w:t>template_dict.readme_file.comments|length</w:t>
+            </w:r>
+            <w:proofErr w:type="spellEnd"/>
+            <w:r>
+              <w:rPr>
+                <w:lang w:val="en-US"/>
+              </w:rPr>
+              <w:t xml:space="preserve"> &gt; 0 %}X{% endif %}</w:t>
+            </w:r>
+          </w:p>
+        </w:tc>
+        <w:tc>
+          <w:tcPr>
+            <w:tcW w:w="0" w:type="auto"/>
+            <w:tcBorders>
+              <w:top w:val="single" w:sz="8" w:space="0" w:color="000000"/>
+              <w:left w:val="single" w:sz="8" w:space="0" w:color="000000"/>
+              <w:bottom w:val="single" w:sz="8" w:space="0" w:color="000000"/>
+              <w:right w:val="single" w:sz="8" w:space="0" w:color="000000"/>
+            </w:tcBorders>
+            <w:tcMar>
+              <w:top w:w="100" w:type="dxa"/>
+              <w:left w:w="100" w:type="dxa"/>
+              <w:bottom w:w="100" w:type="dxa"/>
+              <w:right w:w="100" w:type="dxa"/>
+            </w:tcMar>
+            <w:hideMark/>
+          </w:tcPr>
+          <w:p>
+            <w:pPr>
+              <w:rPr>
+                <w:lang w:val="en-US"/>
+              </w:rPr>
+            </w:pPr>
+            <w:r>
+              <w:rPr>
+                <w:lang w:val="en-US"/>
+              </w:rPr>
+              <w:t xml:space="preserve">{% if </w:t>
+            </w:r>
+            <w:proofErr w:type="spellStart"/>
+            <w:r>
+              <w:rPr>
+                <w:lang w:val="en-US"/>
+              </w:rPr>
+              <w:t>template_dict.readme_file.comments|length</w:t>
+            </w:r>
+            <w:proofErr w:type="spellEnd"/>
+            <w:r>
+              <w:rPr>
+                <w:lang w:val="en-US"/>
+              </w:rPr>
+              <w:t xml:space="preserve"> == 0 %}X{% endif %}</w:t>
+            </w:r>
           </w:p>
         </w:tc>
         <w:tc>
@@ -4910,7 +5587,73 @@
               <w:rPr>
                 <w:lang w:val="en-US"/>
               </w:rPr>
-              <w:t>{% for item in template_dict.readme_file.comments %}{{ item.file_name }}{% endfor %}</w:t>
+              <w:t xml:space="preserve">{% for item in </w:t>
+            </w:r>
+            <w:proofErr w:type="spellStart"/>
+            <w:r>
+              <w:rPr>
+                <w:lang w:val="en-US"/>
+              </w:rPr>
+              <w:t>template_dict.readme_file.comments</w:t>
+            </w:r>
+            <w:proofErr w:type="spellEnd"/>
+            <w:r>
+              <w:rPr>
+                <w:lang w:val="en-US"/>
+              </w:rPr>
+              <w:t xml:space="preserve"> %}</w:t>
+            </w:r>
+            <w:r>
+              <w:rPr>
+                <w:lang w:val="en-US"/>
+              </w:rPr>
+              <w:br/>
+            </w:r>
+            <w:r>
+              <w:rPr>
+                <w:lang w:val="en-US"/>
+              </w:rPr>
+              <w:t xml:space="preserve">{{ </w:t>
+            </w:r>
+            <w:proofErr w:type="spellStart"/>
+            <w:r>
+              <w:rPr>
+                <w:lang w:val="en-US"/>
+              </w:rPr>
+              <w:t>item.file_name</w:t>
+            </w:r>
+            <w:proofErr w:type="spellEnd"/>
+            <w:r>
+              <w:rPr>
+                <w:lang w:val="en-US"/>
+              </w:rPr>
+              <w:t xml:space="preserve"> }}</w:t>
+            </w:r>
+            <w:r>
+              <w:rPr>
+                <w:lang w:val="en-US"/>
+              </w:rPr>
+              <w:br/>
+            </w:r>
+            <w:r>
+              <w:rPr>
+                <w:lang w:val="en-US"/>
+              </w:rPr>
+              <w:t xml:space="preserve">{% </w:t>
+            </w:r>
+            <w:proofErr w:type="spellStart"/>
+            <w:r>
+              <w:rPr>
+                <w:lang w:val="en-US"/>
+              </w:rPr>
+              <w:t>endfor</w:t>
+            </w:r>
+            <w:proofErr w:type="spellEnd"/>
+            <w:r>
+              <w:rPr>
+                <w:lang w:val="en-US"/>
+              </w:rPr>
+              <w:t xml:space="preserve"> %}</w:t>
             </w:r>
           </w:p>
         </w:tc>
@@ -5701,14 +6444,100 @@
           </w:p>
           <w:p>
             <w:pPr>
-              <w:numPr>
-                <w:ilvl w:val="0"/>
-                <w:numId w:val="13"/>
-              </w:numPr>
-              <w:rPr>
-                <w:lang w:val="en-US"/>
-              </w:rPr>
-            </w:pPr>
+              <w:rPr>
+                <w:lang w:val="en-US"/>
+              </w:rPr>
+            </w:pPr>
+            <w:r>
+              <w:rPr>
+                <w:lang w:val="en-US"/>
+              </w:rPr>
+              <w:t xml:space="preserve">{% for item in </w:t>
+            </w:r>
+            <w:proofErr w:type="spellStart"/>
+            <w:r>
+              <w:rPr>
+                <w:lang w:val="en-US"/>
+              </w:rPr>
+              <w:t>template_dict.typo.comments</w:t>
+            </w:r>
+            <w:proofErr w:type="spellEnd"/>
+            <w:r>
+              <w:rPr>
+                <w:lang w:val="en-US"/>
+              </w:rPr>
+              <w:t xml:space="preserve"> %}</w:t>
+            </w:r>
+          </w:p>
+          <w:p>
+            <w:pPr>
+              <w:rPr>
+                <w:lang w:val="en-US"/>
+              </w:rPr>
+            </w:pPr>
+            <w:r>
+              <w:rPr>
+                <w:lang w:val="en-US"/>
+              </w:rPr>
+              <w:t>{{ item }}</w:t>
+            </w:r>
+          </w:p>
+          <w:p>
+            <w:pPr>
+              <w:rPr>
+                <w:lang w:val="en-US"/>
+              </w:rPr>
+            </w:pPr>
+            <w:r>
+              <w:rPr>
+                <w:lang w:val="en-US"/>
+              </w:rPr>
+              <w:t xml:space="preserve">{% </w:t>
+            </w:r>
+            <w:proofErr w:type="spellStart"/>
+            <w:r>
+              <w:rPr>
+                <w:lang w:val="en-US"/>
+              </w:rPr>
+              <w:t>endfor</w:t>
+            </w:r>
+            <w:proofErr w:type="spellEnd"/>
+            <w:r>
+              <w:rPr>
+                <w:lang w:val="en-US"/>
+              </w:rPr>
+              <w:t xml:space="preserve"> %}</w:t>
+            </w:r>
+          </w:p>
+          <w:p>
+            <w:pPr>
+              <w:rPr>
+                <w:lang w:val="en-US"/>
+              </w:rPr>
+            </w:pPr>
+          </w:p>
+          <w:p>
+            <w:pPr>
+              <w:rPr>
+                <w:b/>
+                <w:bCs/>
+                <w:sz w:val="40"/>
+                <w:szCs w:val="40"/>
+                <w:lang w:val="en-US"/>
+              </w:rPr>
+            </w:pPr>
+            <w:r>
+              <w:rPr>
+                <w:rFonts w:hint="eastAsia"/>
+                <w:b/>
+                <w:bCs/>
+                <w:color w:val="FF0000"/>
+                <w:sz w:val="40"/>
+                <w:szCs w:val="40"/>
+                <w:lang w:val="en-US"/>
+              </w:rPr>
+              <w:t>Format to be Fixed</w:t>
+            </w:r>
           </w:p>
         </w:tc>
         <w:tc>
@@ -5807,6 +6636,7 @@
                 <w:bCs/>
                 <w:lang w:val="en-US"/>
               </w:rPr>
+              <w:lastRenderedPageBreak/>
               <w:t>4.2</w:t>
             </w:r>
           </w:p>
@@ -5918,7 +6748,6 @@
               <w:rPr>
                 <w:lang w:val="en-US"/>
               </w:rPr>
-              <w:lastRenderedPageBreak/>
               <w:t>Description</w:t>
             </w:r>
           </w:p>
@@ -6974,6 +7803,7 @@
               <w:rPr>
                 <w:lang w:val="en-US"/>
               </w:rPr>
+              <w:lastRenderedPageBreak/>
               <w:t>Review description, notes, and terms of access metadata fields.</w:t>
             </w:r>
           </w:p>
@@ -7282,16 +8112,7 @@
                 <w:bCs/>
                 <w:lang w:val="en-US"/>
               </w:rPr>
-              <w:t xml:space="preserve">*If something is flagged in </w:t>
-            </w:r>
-            <w:r>
-              <w:rPr>
-                <w:b/>
-                <w:bCs/>
-                <w:lang w:val="en-US"/>
-              </w:rPr>
-              <w:lastRenderedPageBreak/>
-              <w:t>the sensitive data review, does the depositor have REB approval to share the dataset?</w:t>
+              <w:t>*If something is flagged in the sensitive data review, does the depositor have REB approval to share the dataset?</w:t>
             </w:r>
           </w:p>
         </w:tc>
@@ -7326,15 +8147,7 @@
               <w:rPr>
                 <w:lang w:val="en-US"/>
               </w:rPr>
-              <w:lastRenderedPageBreak/>
-              <w:t xml:space="preserve">If something is flagged </w:t>
-            </w:r>
-            <w:r>
-              <w:rPr>
-                <w:lang w:val="en-US"/>
-              </w:rPr>
-              <w:lastRenderedPageBreak/>
-              <w:t>in the sensitive data review (see question above), check the intake form to confirm information about their REB status.</w:t>
+              <w:t>If something is flagged in the sensitive data review (see question above), check the intake form to confirm information about their REB status.</w:t>
             </w:r>
           </w:p>
         </w:tc>
@@ -7689,7 +8502,14 @@
               <w:rPr>
                 <w:lang w:val="en-US"/>
               </w:rPr>
-              <w:t>Check if the deposit includes restricted files (if yes, recommend they use custom terms)</w:t>
+              <w:t>Check if the deposit includes restricted files (if yes, recomme</w:t>
+            </w:r>
+            <w:r>
+              <w:rPr>
+                <w:lang w:val="en-US"/>
+              </w:rPr>
+              <w:lastRenderedPageBreak/>
+              <w:t>nd they use custom terms)</w:t>
             </w:r>
           </w:p>
         </w:tc>
@@ -7862,9 +8682,26 @@
           <w:p>
             <w:pPr>
               <w:rPr>
-                <w:lang w:val="en-US"/>
-              </w:rPr>
-            </w:pPr>
+                <w:b/>
+                <w:bCs/>
+                <w:color w:val="FF0000"/>
+                <w:sz w:val="40"/>
+                <w:szCs w:val="40"/>
+                <w:lang w:val="en-US"/>
+              </w:rPr>
+            </w:pPr>
+            <w:r>
+              <w:rPr>
+                <w:rFonts w:hint="eastAsia"/>
+                <w:b/>
+                <w:bCs/>
+                <w:color w:val="FF0000"/>
+                <w:sz w:val="40"/>
+                <w:szCs w:val="40"/>
+                <w:lang w:val="en-US"/>
+              </w:rPr>
+              <w:t>TBD</w:t>
+            </w:r>
           </w:p>
           <w:p>
             <w:pPr>
@@ -7878,6 +8715,44 @@
               </w:rPr>
               <w:t>License applied to dataset:</w:t>
             </w:r>
+          </w:p>
+          <w:p>
+            <w:pPr>
+              <w:rPr>
+                <w:lang w:val="en-US"/>
+              </w:rPr>
+            </w:pPr>
+          </w:p>
+          <w:p>
+            <w:pPr>
+              <w:rPr>
+                <w:b/>
+                <w:bCs/>
+                <w:color w:val="FF0000"/>
+                <w:sz w:val="40"/>
+                <w:szCs w:val="40"/>
+                <w:lang w:val="en-US"/>
+              </w:rPr>
+            </w:pPr>
+            <w:r>
+              <w:rPr>
+                <w:rFonts w:hint="eastAsia"/>
+                <w:b/>
+                <w:bCs/>
+                <w:color w:val="FF0000"/>
+                <w:sz w:val="40"/>
+                <w:szCs w:val="40"/>
+                <w:lang w:val="en-US"/>
+              </w:rPr>
+              <w:t>TBD</w:t>
+            </w:r>
+          </w:p>
+          <w:p>
+            <w:pPr>
+              <w:rPr>
+                <w:lang w:val="en-US"/>
+              </w:rPr>
+            </w:pPr>
           </w:p>
         </w:tc>
         <w:tc>
@@ -8070,165 +8945,175 @@
               <w:rPr>
                 <w:lang w:val="en-US"/>
               </w:rPr>
-              <w:t xml:space="preserve">If there are restricted files and </w:t>
-            </w:r>
-            <w:r>
-              <w:rPr>
-                <w:lang w:val="en-US"/>
-              </w:rPr>
-              <w:lastRenderedPageBreak/>
-              <w:t>no Terms of Access, recommend including terms of access.</w:t>
-            </w:r>
-          </w:p>
-        </w:tc>
-        <w:tc>
-          <w:tcPr>
-            <w:tcW w:w="0" w:type="auto"/>
-            <w:tcBorders>
-              <w:top w:val="single" w:sz="8" w:space="0" w:color="000000"/>
-              <w:left w:val="single" w:sz="8" w:space="0" w:color="000000"/>
-              <w:bottom w:val="single" w:sz="8" w:space="0" w:color="000000"/>
-              <w:right w:val="single" w:sz="8" w:space="0" w:color="000000"/>
-            </w:tcBorders>
-            <w:tcMar>
-              <w:top w:w="100" w:type="dxa"/>
-              <w:left w:w="100" w:type="dxa"/>
-              <w:bottom w:w="100" w:type="dxa"/>
-              <w:right w:w="100" w:type="dxa"/>
-            </w:tcMar>
-            <w:hideMark/>
-          </w:tcPr>
-          <w:p>
-            <w:pPr>
-              <w:rPr>
-                <w:lang w:val="en-US"/>
-              </w:rPr>
-            </w:pPr>
-          </w:p>
-        </w:tc>
-        <w:tc>
-          <w:tcPr>
-            <w:tcW w:w="0" w:type="auto"/>
-            <w:tcBorders>
-              <w:top w:val="single" w:sz="8" w:space="0" w:color="000000"/>
-              <w:left w:val="single" w:sz="8" w:space="0" w:color="000000"/>
-              <w:bottom w:val="single" w:sz="8" w:space="0" w:color="000000"/>
-              <w:right w:val="single" w:sz="8" w:space="0" w:color="000000"/>
-            </w:tcBorders>
-            <w:tcMar>
-              <w:top w:w="100" w:type="dxa"/>
-              <w:left w:w="100" w:type="dxa"/>
-              <w:bottom w:w="100" w:type="dxa"/>
-              <w:right w:w="100" w:type="dxa"/>
-            </w:tcMar>
-            <w:hideMark/>
-          </w:tcPr>
-          <w:p>
-            <w:pPr>
-              <w:rPr>
-                <w:lang w:val="en-US"/>
-              </w:rPr>
-            </w:pPr>
-          </w:p>
-        </w:tc>
-        <w:tc>
-          <w:tcPr>
-            <w:tcW w:w="0" w:type="auto"/>
-            <w:tcBorders>
-              <w:top w:val="single" w:sz="8" w:space="0" w:color="000000"/>
-              <w:left w:val="single" w:sz="8" w:space="0" w:color="000000"/>
-              <w:bottom w:val="single" w:sz="8" w:space="0" w:color="000000"/>
-              <w:right w:val="single" w:sz="8" w:space="0" w:color="000000"/>
-            </w:tcBorders>
-            <w:tcMar>
-              <w:top w:w="100" w:type="dxa"/>
-              <w:left w:w="100" w:type="dxa"/>
-              <w:bottom w:w="100" w:type="dxa"/>
-              <w:right w:w="100" w:type="dxa"/>
-            </w:tcMar>
-            <w:hideMark/>
-          </w:tcPr>
-          <w:p>
-            <w:pPr>
-              <w:rPr>
-                <w:lang w:val="en-US"/>
-              </w:rPr>
-            </w:pPr>
-          </w:p>
-        </w:tc>
-        <w:tc>
-          <w:tcPr>
-            <w:tcW w:w="0" w:type="auto"/>
-            <w:tcBorders>
-              <w:top w:val="single" w:sz="8" w:space="0" w:color="000000"/>
-              <w:left w:val="single" w:sz="8" w:space="0" w:color="000000"/>
-              <w:bottom w:val="single" w:sz="8" w:space="0" w:color="000000"/>
-              <w:right w:val="single" w:sz="8" w:space="0" w:color="000000"/>
-            </w:tcBorders>
-            <w:tcMar>
-              <w:top w:w="100" w:type="dxa"/>
-              <w:left w:w="100" w:type="dxa"/>
-              <w:bottom w:w="100" w:type="dxa"/>
-              <w:right w:w="100" w:type="dxa"/>
-            </w:tcMar>
-            <w:hideMark/>
-          </w:tcPr>
-          <w:p>
-            <w:pPr>
-              <w:rPr>
-                <w:lang w:val="en-US"/>
-              </w:rPr>
-            </w:pPr>
-          </w:p>
-        </w:tc>
-        <w:tc>
-          <w:tcPr>
-            <w:tcW w:w="0" w:type="auto"/>
-            <w:tcBorders>
-              <w:top w:val="single" w:sz="8" w:space="0" w:color="000000"/>
-              <w:left w:val="single" w:sz="8" w:space="0" w:color="000000"/>
-              <w:bottom w:val="single" w:sz="8" w:space="0" w:color="000000"/>
-              <w:right w:val="single" w:sz="8" w:space="0" w:color="000000"/>
-            </w:tcBorders>
-            <w:tcMar>
-              <w:top w:w="100" w:type="dxa"/>
-              <w:left w:w="100" w:type="dxa"/>
-              <w:bottom w:w="100" w:type="dxa"/>
-              <w:right w:w="100" w:type="dxa"/>
-            </w:tcMar>
-            <w:hideMark/>
-          </w:tcPr>
-          <w:p>
-            <w:pPr>
-              <w:rPr>
-                <w:lang w:val="en-US"/>
-              </w:rPr>
-            </w:pPr>
-          </w:p>
-        </w:tc>
-        <w:tc>
-          <w:tcPr>
-            <w:tcW w:w="0" w:type="auto"/>
-            <w:tcBorders>
-              <w:top w:val="single" w:sz="8" w:space="0" w:color="000000"/>
-              <w:left w:val="single" w:sz="8" w:space="0" w:color="000000"/>
-              <w:bottom w:val="single" w:sz="8" w:space="0" w:color="000000"/>
-              <w:right w:val="single" w:sz="8" w:space="0" w:color="000000"/>
-            </w:tcBorders>
-            <w:tcMar>
-              <w:top w:w="100" w:type="dxa"/>
-              <w:left w:w="100" w:type="dxa"/>
-              <w:bottom w:w="100" w:type="dxa"/>
-              <w:right w:w="100" w:type="dxa"/>
-            </w:tcMar>
-            <w:hideMark/>
-          </w:tcPr>
-          <w:p>
-            <w:pPr>
-              <w:rPr>
-                <w:lang w:val="en-US"/>
-              </w:rPr>
-            </w:pPr>
+              <w:t>If there are restricted files and no Terms of Access, recommend including terms of access.</w:t>
+            </w:r>
+          </w:p>
+        </w:tc>
+        <w:tc>
+          <w:tcPr>
+            <w:tcW w:w="0" w:type="auto"/>
+            <w:tcBorders>
+              <w:top w:val="single" w:sz="8" w:space="0" w:color="000000"/>
+              <w:left w:val="single" w:sz="8" w:space="0" w:color="000000"/>
+              <w:bottom w:val="single" w:sz="8" w:space="0" w:color="000000"/>
+              <w:right w:val="single" w:sz="8" w:space="0" w:color="000000"/>
+            </w:tcBorders>
+            <w:tcMar>
+              <w:top w:w="100" w:type="dxa"/>
+              <w:left w:w="100" w:type="dxa"/>
+              <w:bottom w:w="100" w:type="dxa"/>
+              <w:right w:w="100" w:type="dxa"/>
+            </w:tcMar>
+            <w:hideMark/>
+          </w:tcPr>
+          <w:p>
+            <w:pPr>
+              <w:rPr>
+                <w:lang w:val="en-US"/>
+              </w:rPr>
+            </w:pPr>
+          </w:p>
+        </w:tc>
+        <w:tc>
+          <w:tcPr>
+            <w:tcW w:w="0" w:type="auto"/>
+            <w:tcBorders>
+              <w:top w:val="single" w:sz="8" w:space="0" w:color="000000"/>
+              <w:left w:val="single" w:sz="8" w:space="0" w:color="000000"/>
+              <w:bottom w:val="single" w:sz="8" w:space="0" w:color="000000"/>
+              <w:right w:val="single" w:sz="8" w:space="0" w:color="000000"/>
+            </w:tcBorders>
+            <w:tcMar>
+              <w:top w:w="100" w:type="dxa"/>
+              <w:left w:w="100" w:type="dxa"/>
+              <w:bottom w:w="100" w:type="dxa"/>
+              <w:right w:w="100" w:type="dxa"/>
+            </w:tcMar>
+            <w:hideMark/>
+          </w:tcPr>
+          <w:p>
+            <w:pPr>
+              <w:rPr>
+                <w:lang w:val="en-US"/>
+              </w:rPr>
+            </w:pPr>
+          </w:p>
+        </w:tc>
+        <w:tc>
+          <w:tcPr>
+            <w:tcW w:w="0" w:type="auto"/>
+            <w:tcBorders>
+              <w:top w:val="single" w:sz="8" w:space="0" w:color="000000"/>
+              <w:left w:val="single" w:sz="8" w:space="0" w:color="000000"/>
+              <w:bottom w:val="single" w:sz="8" w:space="0" w:color="000000"/>
+              <w:right w:val="single" w:sz="8" w:space="0" w:color="000000"/>
+            </w:tcBorders>
+            <w:tcMar>
+              <w:top w:w="100" w:type="dxa"/>
+              <w:left w:w="100" w:type="dxa"/>
+              <w:bottom w:w="100" w:type="dxa"/>
+              <w:right w:w="100" w:type="dxa"/>
+            </w:tcMar>
+            <w:hideMark/>
+          </w:tcPr>
+          <w:p>
+            <w:pPr>
+              <w:rPr>
+                <w:lang w:val="en-US"/>
+              </w:rPr>
+            </w:pPr>
+          </w:p>
+        </w:tc>
+        <w:tc>
+          <w:tcPr>
+            <w:tcW w:w="0" w:type="auto"/>
+            <w:tcBorders>
+              <w:top w:val="single" w:sz="8" w:space="0" w:color="000000"/>
+              <w:left w:val="single" w:sz="8" w:space="0" w:color="000000"/>
+              <w:bottom w:val="single" w:sz="8" w:space="0" w:color="000000"/>
+              <w:right w:val="single" w:sz="8" w:space="0" w:color="000000"/>
+            </w:tcBorders>
+            <w:tcMar>
+              <w:top w:w="100" w:type="dxa"/>
+              <w:left w:w="100" w:type="dxa"/>
+              <w:bottom w:w="100" w:type="dxa"/>
+              <w:right w:w="100" w:type="dxa"/>
+            </w:tcMar>
+            <w:hideMark/>
+          </w:tcPr>
+          <w:p>
+            <w:pPr>
+              <w:rPr>
+                <w:lang w:val="en-US"/>
+              </w:rPr>
+            </w:pPr>
+          </w:p>
+        </w:tc>
+        <w:tc>
+          <w:tcPr>
+            <w:tcW w:w="0" w:type="auto"/>
+            <w:tcBorders>
+              <w:top w:val="single" w:sz="8" w:space="0" w:color="000000"/>
+              <w:left w:val="single" w:sz="8" w:space="0" w:color="000000"/>
+              <w:bottom w:val="single" w:sz="8" w:space="0" w:color="000000"/>
+              <w:right w:val="single" w:sz="8" w:space="0" w:color="000000"/>
+            </w:tcBorders>
+            <w:tcMar>
+              <w:top w:w="100" w:type="dxa"/>
+              <w:left w:w="100" w:type="dxa"/>
+              <w:bottom w:w="100" w:type="dxa"/>
+              <w:right w:w="100" w:type="dxa"/>
+            </w:tcMar>
+            <w:hideMark/>
+          </w:tcPr>
+          <w:p>
+            <w:pPr>
+              <w:rPr>
+                <w:lang w:val="en-US"/>
+              </w:rPr>
+            </w:pPr>
+          </w:p>
+        </w:tc>
+        <w:tc>
+          <w:tcPr>
+            <w:tcW w:w="0" w:type="auto"/>
+            <w:tcBorders>
+              <w:top w:val="single" w:sz="8" w:space="0" w:color="000000"/>
+              <w:left w:val="single" w:sz="8" w:space="0" w:color="000000"/>
+              <w:bottom w:val="single" w:sz="8" w:space="0" w:color="000000"/>
+              <w:right w:val="single" w:sz="8" w:space="0" w:color="000000"/>
+            </w:tcBorders>
+            <w:tcMar>
+              <w:top w:w="100" w:type="dxa"/>
+              <w:left w:w="100" w:type="dxa"/>
+              <w:bottom w:w="100" w:type="dxa"/>
+              <w:right w:w="100" w:type="dxa"/>
+            </w:tcMar>
+            <w:hideMark/>
+          </w:tcPr>
+          <w:p>
+            <w:pPr>
+              <w:rPr>
+                <w:b/>
+                <w:bCs/>
+                <w:color w:val="FF0000"/>
+                <w:sz w:val="40"/>
+                <w:szCs w:val="40"/>
+                <w:lang w:val="en-US"/>
+              </w:rPr>
+            </w:pPr>
+            <w:r>
+              <w:rPr>
+                <w:rFonts w:hint="eastAsia"/>
+                <w:b/>
+                <w:bCs/>
+                <w:color w:val="FF0000"/>
+                <w:sz w:val="40"/>
+                <w:szCs w:val="40"/>
+                <w:lang w:val="en-US"/>
+              </w:rPr>
+              <w:t>TBD</w:t>
+            </w:r>
           </w:p>
         </w:tc>
         <w:tc>
@@ -11399,7 +12284,7 @@
   <w:style w:type="paragraph" w:default="1" w:styleId="Normal">
     <w:name w:val="Normal"/>
     <w:qFormat/>
-    <w:rsid w:val="00E0428E"/>
+    <w:rsid w:val="00D6654E"/>
     <w:rPr>
       <w:lang w:val="en-CA"/>
     </w:rPr>

</xml_diff>

<commit_message>
1. Added retrieval of parent dataverse name of the dataset
</commit_message>
<xml_diff>
--- a/res/template_new.docx
+++ b/res/template_new.docx
@@ -30,7 +30,14 @@
         <w:rPr>
           <w:rFonts w:hint="eastAsia"/>
         </w:rPr>
-        <w:t>Ticket number: {</w:t>
+        <w:t xml:space="preserve">Ticket number: </w:t>
+      </w:r>
+      <w:proofErr w:type="gramStart"/>
+      <w:r>
+        <w:rPr>
+          <w:rFonts w:hint="eastAsia"/>
+        </w:rPr>
+        <w:t>{</w:t>
       </w:r>
       <w:r>
         <w:rPr>
@@ -42,7 +49,21 @@
         <w:rPr>
           <w:rFonts w:hint="eastAsia"/>
         </w:rPr>
-        <w:t xml:space="preserve"> curator_info.ticket_n</w:t>
+        <w:t xml:space="preserve"> </w:t>
+      </w:r>
+      <w:proofErr w:type="spellStart"/>
+      <w:r>
+        <w:rPr>
+          <w:rFonts w:hint="eastAsia"/>
+        </w:rPr>
+        <w:t>curator</w:t>
+      </w:r>
+      <w:proofErr w:type="gramEnd"/>
+      <w:r>
+        <w:rPr>
+          <w:rFonts w:hint="eastAsia"/>
+        </w:rPr>
+        <w:t>_info.ticket_n</w:t>
       </w:r>
       <w:r>
         <w:rPr>
@@ -50,6 +71,7 @@
         </w:rPr>
         <w:t>umber</w:t>
       </w:r>
+      <w:proofErr w:type="spellEnd"/>
       <w:r>
         <w:rPr>
           <w:rFonts w:hint="eastAsia"/>
@@ -80,7 +102,35 @@
         <w:rPr>
           <w:rFonts w:hint="eastAsia"/>
         </w:rPr>
-        <w:t xml:space="preserve"> {{ curator_info.curator_name }}</w:t>
+        <w:t xml:space="preserve"> </w:t>
+      </w:r>
+      <w:proofErr w:type="gramStart"/>
+      <w:r>
+        <w:rPr>
+          <w:rFonts w:hint="eastAsia"/>
+        </w:rPr>
+        <w:t xml:space="preserve">{{ </w:t>
+      </w:r>
+      <w:proofErr w:type="spellStart"/>
+      <w:r>
+        <w:rPr>
+          <w:rFonts w:hint="eastAsia"/>
+        </w:rPr>
+        <w:t>curator</w:t>
+      </w:r>
+      <w:proofErr w:type="gramEnd"/>
+      <w:r>
+        <w:rPr>
+          <w:rFonts w:hint="eastAsia"/>
+        </w:rPr>
+        <w:t>_info.curator_name</w:t>
+      </w:r>
+      <w:proofErr w:type="spellEnd"/>
+      <w:r>
+        <w:rPr>
+          <w:rFonts w:hint="eastAsia"/>
+        </w:rPr>
+        <w:t xml:space="preserve"> }}</w:t>
       </w:r>
     </w:p>
     <w:p>
@@ -88,11 +138,33 @@
         <w:rPr>
           <w:rFonts w:hint="eastAsia"/>
         </w:rPr>
-        <w:t>Curator email: {{ curator_info.</w:t>
+        <w:t xml:space="preserve">Curator email: </w:t>
+      </w:r>
+      <w:proofErr w:type="gramStart"/>
+      <w:r>
+        <w:rPr>
+          <w:rFonts w:hint="eastAsia"/>
+        </w:rPr>
+        <w:t xml:space="preserve">{{ </w:t>
+      </w:r>
+      <w:proofErr w:type="spellStart"/>
+      <w:r>
+        <w:rPr>
+          <w:rFonts w:hint="eastAsia"/>
+        </w:rPr>
+        <w:t>curator</w:t>
+      </w:r>
+      <w:proofErr w:type="gramEnd"/>
+      <w:r>
+        <w:rPr>
+          <w:rFonts w:hint="eastAsia"/>
+        </w:rPr>
+        <w:t>_info.</w:t>
       </w:r>
       <w:r>
         <w:t>curator_email</w:t>
       </w:r>
+      <w:proofErr w:type="spellEnd"/>
       <w:r>
         <w:rPr>
           <w:rFonts w:hint="eastAsia"/>
@@ -107,21 +179,31 @@
         </w:rPr>
         <w:t xml:space="preserve">Dataset title: </w:t>
       </w:r>
+      <w:proofErr w:type="gramStart"/>
       <w:r>
         <w:rPr>
           <w:rFonts w:hint="eastAsia"/>
         </w:rPr>
         <w:t xml:space="preserve">{{ </w:t>
       </w:r>
+      <w:proofErr w:type="spellStart"/>
       <w:r>
         <w:rPr>
           <w:rFonts w:hint="eastAsia"/>
         </w:rPr>
-        <w:t>dataset.</w:t>
+        <w:t>dataset</w:t>
+      </w:r>
+      <w:proofErr w:type="gramEnd"/>
+      <w:r>
+        <w:rPr>
+          <w:rFonts w:hint="eastAsia"/>
+        </w:rPr>
+        <w:t>.</w:t>
       </w:r>
       <w:r>
         <w:t>DatasetTitle</w:t>
       </w:r>
+      <w:proofErr w:type="spellEnd"/>
       <w:r>
         <w:rPr>
           <w:rFonts w:hint="eastAsia"/>
@@ -155,7 +237,14 @@
         <w:rPr>
           <w:rFonts w:hint="eastAsia"/>
         </w:rPr>
-        <w:t>: {</w:t>
+        <w:t xml:space="preserve">: </w:t>
+      </w:r>
+      <w:proofErr w:type="gramStart"/>
+      <w:r>
+        <w:rPr>
+          <w:rFonts w:hint="eastAsia"/>
+        </w:rPr>
+        <w:t>{</w:t>
       </w:r>
       <w:r>
         <w:rPr>
@@ -169,15 +258,24 @@
         </w:rPr>
         <w:t xml:space="preserve"> </w:t>
       </w:r>
+      <w:proofErr w:type="spellStart"/>
       <w:r>
         <w:rPr>
           <w:rFonts w:hint="eastAsia"/>
         </w:rPr>
-        <w:t>dataset.</w:t>
+        <w:t>dataset</w:t>
+      </w:r>
+      <w:proofErr w:type="gramEnd"/>
+      <w:r>
+        <w:rPr>
+          <w:rFonts w:hint="eastAsia"/>
+        </w:rPr>
+        <w:t>.</w:t>
       </w:r>
       <w:r>
         <w:t>DatasetPersistentId</w:t>
       </w:r>
+      <w:proofErr w:type="spellEnd"/>
       <w:r>
         <w:rPr>
           <w:rFonts w:hint="eastAsia"/>
@@ -196,7 +294,21 @@
         <w:rPr>
           <w:rFonts w:hint="eastAsia"/>
         </w:rPr>
-        <w:t>Dataset ID (versioned): {{ dataset.ID  }}</w:t>
+        <w:t xml:space="preserve">Dataset ID (versioned): </w:t>
+      </w:r>
+      <w:proofErr w:type="gramStart"/>
+      <w:r>
+        <w:rPr>
+          <w:rFonts w:hint="eastAsia"/>
+        </w:rPr>
+        <w:t>{{ dataset.ID</w:t>
+      </w:r>
+      <w:proofErr w:type="gramEnd"/>
+      <w:r>
+        <w:rPr>
+          <w:rFonts w:hint="eastAsia"/>
+        </w:rPr>
+        <w:t xml:space="preserve">  }}</w:t>
       </w:r>
     </w:p>
     <w:p>
@@ -204,7 +316,14 @@
         <w:rPr>
           <w:rFonts w:hint="eastAsia"/>
         </w:rPr>
-        <w:t>Dataset access URL: {</w:t>
+        <w:t xml:space="preserve">Dataset access URL: </w:t>
+      </w:r>
+      <w:proofErr w:type="gramStart"/>
+      <w:r>
+        <w:rPr>
+          <w:rFonts w:hint="eastAsia"/>
+        </w:rPr>
+        <w:t>{</w:t>
       </w:r>
       <w:r>
         <w:rPr>
@@ -216,11 +335,26 @@
         <w:rPr>
           <w:rFonts w:hint="eastAsia"/>
         </w:rPr>
-        <w:t xml:space="preserve"> dataset.</w:t>
+        <w:t xml:space="preserve"> </w:t>
+      </w:r>
+      <w:proofErr w:type="spellStart"/>
+      <w:r>
+        <w:rPr>
+          <w:rFonts w:hint="eastAsia"/>
+        </w:rPr>
+        <w:t>dataset</w:t>
+      </w:r>
+      <w:proofErr w:type="gramEnd"/>
+      <w:r>
+        <w:rPr>
+          <w:rFonts w:hint="eastAsia"/>
+        </w:rPr>
+        <w:t>.</w:t>
       </w:r>
       <w:r>
         <w:t>DatasetURL</w:t>
       </w:r>
+      <w:proofErr w:type="spellEnd"/>
       <w:r>
         <w:rPr>
           <w:rFonts w:hint="eastAsia"/>
@@ -268,6 +402,7 @@
         </w:rPr>
         <w:t xml:space="preserve">date: </w:t>
       </w:r>
+      <w:proofErr w:type="gramStart"/>
       <w:r>
         <w:rPr>
           <w:rFonts w:hint="eastAsia"/>
@@ -292,6 +427,7 @@
         </w:rPr>
         <w:t>timestamp</w:t>
       </w:r>
+      <w:proofErr w:type="gramEnd"/>
       <w:r>
         <w:rPr>
           <w:rFonts w:hint="eastAsia"/>
@@ -303,6 +439,27 @@
           <w:rFonts w:hint="eastAsia"/>
         </w:rPr>
         <w:t>}</w:t>
+      </w:r>
+    </w:p>
+    <w:p>
+      <w:pPr>
+        <w:rPr>
+          <w:rFonts w:hint="eastAsia"/>
+        </w:rPr>
+      </w:pPr>
+      <w:r>
+        <w:rPr>
+          <w:rFonts w:hint="eastAsia"/>
+        </w:rPr>
+        <w:t xml:space="preserve">Log last updated date: </w:t>
+      </w:r>
+      <w:r>
+        <w:rPr>
+          <w:rFonts w:hint="eastAsia"/>
+          <w:color w:val="FF0000"/>
+          <w:highlight w:val="yellow"/>
+        </w:rPr>
+        <w:t>FILL IN THIS FIELD</w:t>
       </w:r>
     </w:p>
     <w:p/>
@@ -996,7 +1153,25 @@
                 <w:bCs/>
                 <w:lang w:val="en-US"/>
               </w:rPr>
-              <w:t>Has the depositor (or their research group) previously created or submitted to a dataverse?</w:t>
+              <w:t xml:space="preserve">Has the depositor (or their research group) previously created or submitted to a </w:t>
+            </w:r>
+            <w:proofErr w:type="spellStart"/>
+            <w:r>
+              <w:rPr>
+                <w:b/>
+                <w:bCs/>
+                <w:lang w:val="en-US"/>
+              </w:rPr>
+              <w:t>dataverse</w:t>
+            </w:r>
+            <w:proofErr w:type="spellEnd"/>
+            <w:r>
+              <w:rPr>
+                <w:b/>
+                <w:bCs/>
+                <w:lang w:val="en-US"/>
+              </w:rPr>
+              <w:t>?</w:t>
             </w:r>
           </w:p>
         </w:tc>
@@ -1058,26 +1233,55 @@
               <w:rPr>
                 <w:lang w:val="en-US"/>
               </w:rPr>
-              <w:t>{% if template_dict.</w:t>
+              <w:t xml:space="preserve">{% if </w:t>
+            </w:r>
+            <w:proofErr w:type="spellStart"/>
+            <w:r>
+              <w:rPr>
+                <w:lang w:val="en-US"/>
+              </w:rPr>
+              <w:t>template_</w:t>
+            </w:r>
+            <w:proofErr w:type="gramStart"/>
+            <w:r>
+              <w:rPr>
+                <w:lang w:val="en-US"/>
+              </w:rPr>
+              <w:t>dict.</w:t>
             </w:r>
             <w:r>
               <w:rPr>
                 <w:rFonts w:hint="eastAsia"/>
                 <w:lang w:val="en-US"/>
               </w:rPr>
-              <w:t>dv_record</w:t>
-            </w:r>
-            <w:r>
-              <w:rPr>
-                <w:lang w:val="en-US"/>
-              </w:rPr>
-              <w:t xml:space="preserve">.comments|length </w:t>
-            </w:r>
+              <w:t>dv</w:t>
+            </w:r>
+            <w:proofErr w:type="gramEnd"/>
             <w:r>
               <w:rPr>
                 <w:rFonts w:hint="eastAsia"/>
                 <w:lang w:val="en-US"/>
               </w:rPr>
+              <w:t>_record</w:t>
+            </w:r>
+            <w:r>
+              <w:rPr>
+                <w:lang w:val="en-US"/>
+              </w:rPr>
+              <w:t>.comments|length</w:t>
+            </w:r>
+            <w:proofErr w:type="spellEnd"/>
+            <w:r>
+              <w:rPr>
+                <w:lang w:val="en-US"/>
+              </w:rPr>
+              <w:t xml:space="preserve"> </w:t>
+            </w:r>
+            <w:r>
+              <w:rPr>
+                <w:rFonts w:hint="eastAsia"/>
+                <w:lang w:val="en-US"/>
+              </w:rPr>
               <w:t>&gt;</w:t>
             </w:r>
             <w:r>
@@ -1122,26 +1326,55 @@
               <w:rPr>
                 <w:lang w:val="en-US"/>
               </w:rPr>
-              <w:t>{% if template_dict.</w:t>
+              <w:t xml:space="preserve">{% if </w:t>
+            </w:r>
+            <w:proofErr w:type="spellStart"/>
+            <w:r>
+              <w:rPr>
+                <w:lang w:val="en-US"/>
+              </w:rPr>
+              <w:t>template_</w:t>
+            </w:r>
+            <w:proofErr w:type="gramStart"/>
+            <w:r>
+              <w:rPr>
+                <w:lang w:val="en-US"/>
+              </w:rPr>
+              <w:t>dict.</w:t>
             </w:r>
             <w:r>
               <w:rPr>
                 <w:rFonts w:hint="eastAsia"/>
                 <w:lang w:val="en-US"/>
               </w:rPr>
-              <w:t>dv_record</w:t>
-            </w:r>
-            <w:r>
-              <w:rPr>
-                <w:lang w:val="en-US"/>
-              </w:rPr>
-              <w:t xml:space="preserve">.comments|length </w:t>
-            </w:r>
+              <w:t>dv</w:t>
+            </w:r>
+            <w:proofErr w:type="gramEnd"/>
             <w:r>
               <w:rPr>
                 <w:rFonts w:hint="eastAsia"/>
                 <w:lang w:val="en-US"/>
               </w:rPr>
+              <w:t>_record</w:t>
+            </w:r>
+            <w:r>
+              <w:rPr>
+                <w:lang w:val="en-US"/>
+              </w:rPr>
+              <w:t>.comments|length</w:t>
+            </w:r>
+            <w:proofErr w:type="spellEnd"/>
+            <w:r>
+              <w:rPr>
+                <w:lang w:val="en-US"/>
+              </w:rPr>
+              <w:t xml:space="preserve"> </w:t>
+            </w:r>
+            <w:r>
+              <w:rPr>
+                <w:rFonts w:hint="eastAsia"/>
+                <w:lang w:val="en-US"/>
+              </w:rPr>
               <w:t>==</w:t>
             </w:r>
             <w:r>
@@ -1261,62 +1494,154 @@
               <w:rPr>
                 <w:lang w:val="en-US"/>
               </w:rPr>
-              <w:t>If relevant, list previously created dataverse:</w:t>
-            </w:r>
-          </w:p>
-          <w:p>
-            <w:r>
-              <w:t xml:space="preserve">{% for item in template_dict.dv_record.comments %} </w:t>
-            </w:r>
-          </w:p>
-          <w:p>
-            <w:pPr>
+              <w:t xml:space="preserve">If relevant, list previously created </w:t>
+            </w:r>
+            <w:proofErr w:type="spellStart"/>
+            <w:r>
+              <w:rPr>
+                <w:lang w:val="en-US"/>
+              </w:rPr>
+              <w:t>dataverse</w:t>
+            </w:r>
+            <w:proofErr w:type="spellEnd"/>
+            <w:r>
+              <w:rPr>
+                <w:lang w:val="en-US"/>
+              </w:rPr>
+              <w:t>:</w:t>
+            </w:r>
+          </w:p>
+          <w:p>
+            <w:r>
+              <w:t xml:space="preserve">{% for item in </w:t>
+            </w:r>
+            <w:proofErr w:type="spellStart"/>
+            <w:r>
+              <w:t>template_</w:t>
+            </w:r>
+            <w:proofErr w:type="gramStart"/>
+            <w:r>
+              <w:t>dict.dv</w:t>
+            </w:r>
+            <w:proofErr w:type="gramEnd"/>
+            <w:r>
+              <w:t>_record.comments</w:t>
+            </w:r>
+            <w:proofErr w:type="spellEnd"/>
+            <w:r>
+              <w:t xml:space="preserve"> %} </w:t>
+            </w:r>
+          </w:p>
+          <w:p>
+            <w:r>
+              <w:t xml:space="preserve">{% for author, </w:t>
+            </w:r>
+            <w:proofErr w:type="spellStart"/>
+            <w:r>
+              <w:t>dataverses</w:t>
+            </w:r>
+            <w:proofErr w:type="spellEnd"/>
+            <w:r>
+              <w:t xml:space="preserve"> in </w:t>
+            </w:r>
+            <w:proofErr w:type="spellStart"/>
+            <w:proofErr w:type="gramStart"/>
+            <w:r>
+              <w:t>item.items</w:t>
+            </w:r>
+            <w:proofErr w:type="spellEnd"/>
+            <w:proofErr w:type="gramEnd"/>
+            <w:r>
+              <w:t>() %} {{ author }}</w:t>
+            </w:r>
+            <w:r>
               <w:rPr>
                 <w:rFonts w:hint="eastAsia"/>
               </w:rPr>
-            </w:pPr>
-            <w:r>
-              <w:t>{% for author, dataverses in item.items() %} {{ author }}</w:t>
+              <w:t>:</w:t>
+            </w:r>
+          </w:p>
+          <w:p>
+            <w:r>
+              <w:t xml:space="preserve">{% for dataverse in </w:t>
+            </w:r>
+            <w:proofErr w:type="spellStart"/>
+            <w:r>
+              <w:t>dataverses</w:t>
+            </w:r>
+            <w:proofErr w:type="spellEnd"/>
+            <w:r>
+              <w:t xml:space="preserve"> %} </w:t>
+            </w:r>
+            <w:proofErr w:type="gramStart"/>
+            <w:r>
+              <w:t xml:space="preserve">{{ </w:t>
+            </w:r>
+            <w:proofErr w:type="spellStart"/>
+            <w:r>
+              <w:t>loop</w:t>
+            </w:r>
+            <w:proofErr w:type="gramEnd"/>
+            <w:r>
+              <w:t>.index</w:t>
+            </w:r>
+            <w:proofErr w:type="spellEnd"/>
+            <w:r>
+              <w:t xml:space="preserve"> }}.</w:t>
             </w:r>
             <w:r>
               <w:rPr>
                 <w:rFonts w:hint="eastAsia"/>
               </w:rPr>
-              <w:t>:</w:t>
-            </w:r>
-          </w:p>
-          <w:p>
-            <w:r>
-              <w:t xml:space="preserve">{% for dataverse in dataverses %} </w:t>
-            </w:r>
-            <w:r>
-              <w:t>{{ loop.index }}.</w:t>
-            </w:r>
-            <w:r>
-              <w:rPr>
-                <w:rFonts w:hint="eastAsia"/>
-              </w:rPr>
               <w:t xml:space="preserve"> </w:t>
             </w:r>
-            <w:r>
-              <w:t>{{ dataverse }}</w:t>
+            <w:proofErr w:type="gramStart"/>
+            <w:r>
+              <w:t>{{ dataverse</w:t>
+            </w:r>
+            <w:proofErr w:type="gramEnd"/>
+            <w:r>
+              <w:t xml:space="preserve"> }}</w:t>
             </w:r>
             <w:r>
               <w:br/>
             </w:r>
             <w:r>
-              <w:t xml:space="preserve">{% endfor %} </w:t>
-            </w:r>
-          </w:p>
-          <w:p>
-            <w:pPr>
-              <w:rPr>
-                <w:rFonts w:hint="eastAsia"/>
-                <w:lang w:val="en-US"/>
-              </w:rPr>
-            </w:pPr>
-            <w:r>
-              <w:t>{% endfor %} {% endfor %}</w:t>
+              <w:t xml:space="preserve">{% </w:t>
+            </w:r>
+            <w:proofErr w:type="spellStart"/>
+            <w:r>
+              <w:t>endfor</w:t>
+            </w:r>
+            <w:proofErr w:type="spellEnd"/>
+            <w:r>
+              <w:t xml:space="preserve"> %} </w:t>
+            </w:r>
+          </w:p>
+          <w:p>
+            <w:pPr>
+              <w:rPr>
+                <w:lang w:val="en-US"/>
+              </w:rPr>
+            </w:pPr>
+            <w:r>
+              <w:t xml:space="preserve">{% </w:t>
+            </w:r>
+            <w:proofErr w:type="spellStart"/>
+            <w:r>
+              <w:t>endfor</w:t>
+            </w:r>
+            <w:proofErr w:type="spellEnd"/>
+            <w:r>
+              <w:t xml:space="preserve"> %} {% </w:t>
+            </w:r>
+            <w:proofErr w:type="spellStart"/>
+            <w:r>
+              <w:t>endfor</w:t>
+            </w:r>
+            <w:proofErr w:type="spellEnd"/>
+            <w:r>
+              <w:t xml:space="preserve"> %}</w:t>
             </w:r>
           </w:p>
         </w:tc>
@@ -1507,7 +1832,21 @@
               <w:rPr>
                 <w:lang w:val="en-US"/>
               </w:rPr>
-              <w:t xml:space="preserve">If the dataset is deposited in a sub-dataverse collection, include the name of the </w:t>
+              <w:t>If the dataset is deposited in a sub-</w:t>
+            </w:r>
+            <w:proofErr w:type="spellStart"/>
+            <w:r>
+              <w:rPr>
+                <w:lang w:val="en-US"/>
+              </w:rPr>
+              <w:t>dataverse</w:t>
+            </w:r>
+            <w:proofErr w:type="spellEnd"/>
+            <w:r>
+              <w:rPr>
+                <w:lang w:val="en-US"/>
+              </w:rPr>
+              <w:t xml:space="preserve"> collection, include the name of the </w:t>
             </w:r>
             <w:r>
               <w:rPr>
@@ -1692,7 +2031,23 @@
                 <w:rFonts w:hint="eastAsia"/>
                 <w:lang w:val="en-US"/>
               </w:rPr>
-              <w:t xml:space="preserve">List the dataverse </w:t>
+              <w:t xml:space="preserve">List the </w:t>
+            </w:r>
+            <w:proofErr w:type="spellStart"/>
+            <w:r>
+              <w:rPr>
+                <w:rFonts w:hint="eastAsia"/>
+                <w:lang w:val="en-US"/>
+              </w:rPr>
+              <w:t>dataverse</w:t>
+            </w:r>
+            <w:proofErr w:type="spellEnd"/>
+            <w:r>
+              <w:rPr>
+                <w:rFonts w:hint="eastAsia"/>
+                <w:lang w:val="en-US"/>
+              </w:rPr>
+              <w:t xml:space="preserve"> </w:t>
             </w:r>
             <w:r>
               <w:rPr>
@@ -1711,27 +2066,46 @@
           <w:p>
             <w:pPr>
               <w:rPr>
-                <w:lang w:val="en-US"/>
-              </w:rPr>
-            </w:pPr>
-          </w:p>
-          <w:p>
-            <w:pPr>
-              <w:rPr>
-                <w:sz w:val="40"/>
-                <w:szCs w:val="40"/>
-                <w:lang w:val="en-US"/>
-              </w:rPr>
-            </w:pPr>
-            <w:r>
-              <w:rPr>
                 <w:rFonts w:hint="eastAsia"/>
-                <w:color w:val="FF0000"/>
-                <w:sz w:val="40"/>
-                <w:szCs w:val="40"/>
-                <w:lang w:val="en-US"/>
-              </w:rPr>
-              <w:t>TBD</w:t>
+                <w:lang w:val="en-US"/>
+              </w:rPr>
+            </w:pPr>
+            <w:proofErr w:type="gramStart"/>
+            <w:r>
+              <w:rPr>
+                <w:rFonts w:hint="eastAsia"/>
+                <w:lang w:val="en-US"/>
+              </w:rPr>
+              <w:t xml:space="preserve">{{ </w:t>
+            </w:r>
+            <w:proofErr w:type="spellStart"/>
+            <w:r>
+              <w:t>template</w:t>
+            </w:r>
+            <w:proofErr w:type="gramEnd"/>
+            <w:r>
+              <w:t>_dict</w:t>
+            </w:r>
+            <w:proofErr w:type="spellEnd"/>
+            <w:r>
+              <w:rPr>
+                <w:rFonts w:hint="eastAsia"/>
+              </w:rPr>
+              <w:t>.</w:t>
+            </w:r>
+            <w:r>
+              <w:t xml:space="preserve"> </w:t>
+            </w:r>
+            <w:proofErr w:type="spellStart"/>
+            <w:r>
+              <w:t>name_name_of_dataverse</w:t>
+            </w:r>
+            <w:proofErr w:type="spellEnd"/>
+            <w:r>
+              <w:rPr>
+                <w:rFonts w:hint="eastAsia"/>
+              </w:rPr>
+              <w:t xml:space="preserve"> }}</w:t>
             </w:r>
           </w:p>
         </w:tc>
@@ -1861,38 +2235,88 @@
                 <w:bCs/>
                 <w:lang w:val="en-US"/>
               </w:rPr>
-              <w:t>*If the dataset was deposited in a sub-dataverse collection, does it require its own dataverse?</w:t>
-            </w:r>
-          </w:p>
-        </w:tc>
-        <w:tc>
-          <w:tcPr>
-            <w:tcW w:w="0" w:type="auto"/>
-            <w:tcBorders>
-              <w:top w:val="single" w:sz="8" w:space="0" w:color="000000"/>
-              <w:left w:val="single" w:sz="8" w:space="0" w:color="000000"/>
-              <w:bottom w:val="single" w:sz="8" w:space="0" w:color="000000"/>
-              <w:right w:val="single" w:sz="8" w:space="0" w:color="000000"/>
-            </w:tcBorders>
-            <w:tcMar>
-              <w:top w:w="100" w:type="dxa"/>
-              <w:left w:w="100" w:type="dxa"/>
-              <w:bottom w:w="100" w:type="dxa"/>
-              <w:right w:w="100" w:type="dxa"/>
-            </w:tcMar>
-            <w:hideMark/>
-          </w:tcPr>
-          <w:p>
-            <w:pPr>
-              <w:rPr>
-                <w:lang w:val="en-US"/>
-              </w:rPr>
-            </w:pPr>
-            <w:r>
-              <w:rPr>
-                <w:lang w:val="en-US"/>
-              </w:rPr>
-              <w:t>If the depositor created a dataverse with one dataset:</w:t>
+              <w:t>*If the dataset was deposited in a sub-</w:t>
+            </w:r>
+            <w:proofErr w:type="spellStart"/>
+            <w:r>
+              <w:rPr>
+                <w:b/>
+                <w:bCs/>
+                <w:lang w:val="en-US"/>
+              </w:rPr>
+              <w:t>dataverse</w:t>
+            </w:r>
+            <w:proofErr w:type="spellEnd"/>
+            <w:r>
+              <w:rPr>
+                <w:b/>
+                <w:bCs/>
+                <w:lang w:val="en-US"/>
+              </w:rPr>
+              <w:t xml:space="preserve"> collection, does it require its own </w:t>
+            </w:r>
+            <w:proofErr w:type="spellStart"/>
+            <w:r>
+              <w:rPr>
+                <w:b/>
+                <w:bCs/>
+                <w:lang w:val="en-US"/>
+              </w:rPr>
+              <w:t>dataverse</w:t>
+            </w:r>
+            <w:proofErr w:type="spellEnd"/>
+            <w:r>
+              <w:rPr>
+                <w:b/>
+                <w:bCs/>
+                <w:lang w:val="en-US"/>
+              </w:rPr>
+              <w:t>?</w:t>
+            </w:r>
+          </w:p>
+        </w:tc>
+        <w:tc>
+          <w:tcPr>
+            <w:tcW w:w="0" w:type="auto"/>
+            <w:tcBorders>
+              <w:top w:val="single" w:sz="8" w:space="0" w:color="000000"/>
+              <w:left w:val="single" w:sz="8" w:space="0" w:color="000000"/>
+              <w:bottom w:val="single" w:sz="8" w:space="0" w:color="000000"/>
+              <w:right w:val="single" w:sz="8" w:space="0" w:color="000000"/>
+            </w:tcBorders>
+            <w:tcMar>
+              <w:top w:w="100" w:type="dxa"/>
+              <w:left w:w="100" w:type="dxa"/>
+              <w:bottom w:w="100" w:type="dxa"/>
+              <w:right w:w="100" w:type="dxa"/>
+            </w:tcMar>
+            <w:hideMark/>
+          </w:tcPr>
+          <w:p>
+            <w:pPr>
+              <w:rPr>
+                <w:lang w:val="en-US"/>
+              </w:rPr>
+            </w:pPr>
+            <w:r>
+              <w:rPr>
+                <w:lang w:val="en-US"/>
+              </w:rPr>
+              <w:t xml:space="preserve">If the depositor created a </w:t>
+            </w:r>
+            <w:proofErr w:type="spellStart"/>
+            <w:r>
+              <w:rPr>
+                <w:lang w:val="en-US"/>
+              </w:rPr>
+              <w:t>dataverse</w:t>
+            </w:r>
+            <w:proofErr w:type="spellEnd"/>
+            <w:r>
+              <w:rPr>
+                <w:lang w:val="en-US"/>
+              </w:rPr>
+              <w:t xml:space="preserve"> with one dataset:</w:t>
             </w:r>
           </w:p>
           <w:p>
@@ -1909,7 +2333,21 @@
               <w:rPr>
                 <w:lang w:val="en-US"/>
               </w:rPr>
-              <w:t>Is it the only dataset in the sub-dataverse collection?</w:t>
+              <w:t>Is it the only dataset in the sub-</w:t>
+            </w:r>
+            <w:proofErr w:type="spellStart"/>
+            <w:r>
+              <w:rPr>
+                <w:lang w:val="en-US"/>
+              </w:rPr>
+              <w:t>dataverse</w:t>
+            </w:r>
+            <w:proofErr w:type="spellEnd"/>
+            <w:r>
+              <w:rPr>
+                <w:lang w:val="en-US"/>
+              </w:rPr>
+              <w:t xml:space="preserve"> collection?</w:t>
             </w:r>
           </w:p>
           <w:p>
@@ -1926,7 +2364,21 @@
               <w:rPr>
                 <w:lang w:val="en-US"/>
               </w:rPr>
-              <w:t>Is there another sub-dataverse collection it should be in?</w:t>
+              <w:t>Is there another sub-</w:t>
+            </w:r>
+            <w:proofErr w:type="spellStart"/>
+            <w:r>
+              <w:rPr>
+                <w:lang w:val="en-US"/>
+              </w:rPr>
+              <w:t>dataverse</w:t>
+            </w:r>
+            <w:proofErr w:type="spellEnd"/>
+            <w:r>
+              <w:rPr>
+                <w:lang w:val="en-US"/>
+              </w:rPr>
+              <w:t xml:space="preserve"> collection it should be in?</w:t>
             </w:r>
           </w:p>
           <w:p>
@@ -1960,7 +2412,35 @@
               <w:rPr>
                 <w:lang w:val="en-US"/>
               </w:rPr>
-              <w:t>Confirm with the depositor that they actually require a dataverse (e.g., will there be future deposits?)</w:t>
+              <w:t xml:space="preserve">Confirm with the depositor that they </w:t>
+            </w:r>
+            <w:proofErr w:type="gramStart"/>
+            <w:r>
+              <w:rPr>
+                <w:lang w:val="en-US"/>
+              </w:rPr>
+              <w:t>actually require</w:t>
+            </w:r>
+            <w:proofErr w:type="gramEnd"/>
+            <w:r>
+              <w:rPr>
+                <w:lang w:val="en-US"/>
+              </w:rPr>
+              <w:t xml:space="preserve"> a </w:t>
+            </w:r>
+            <w:proofErr w:type="spellStart"/>
+            <w:r>
+              <w:rPr>
+                <w:lang w:val="en-US"/>
+              </w:rPr>
+              <w:t>dataverse</w:t>
+            </w:r>
+            <w:proofErr w:type="spellEnd"/>
+            <w:r>
+              <w:rPr>
+                <w:lang w:val="en-US"/>
+              </w:rPr>
+              <w:t xml:space="preserve"> (e.g., will there be future deposits?)</w:t>
             </w:r>
           </w:p>
         </w:tc>
@@ -2647,63 +3127,119 @@
               <w:rPr>
                 <w:lang w:val="en-US"/>
               </w:rPr>
-              <w:t>{% if template_dict.file_ext.comments|length == 0 %}X{% endif %}</w:t>
-            </w:r>
-          </w:p>
-        </w:tc>
-        <w:tc>
-          <w:tcPr>
-            <w:tcW w:w="0" w:type="auto"/>
-            <w:tcBorders>
-              <w:top w:val="single" w:sz="8" w:space="0" w:color="000000"/>
-              <w:left w:val="single" w:sz="8" w:space="0" w:color="000000"/>
-              <w:bottom w:val="single" w:sz="8" w:space="0" w:color="000000"/>
-              <w:right w:val="single" w:sz="8" w:space="0" w:color="000000"/>
-            </w:tcBorders>
-            <w:tcMar>
-              <w:top w:w="100" w:type="dxa"/>
-              <w:left w:w="100" w:type="dxa"/>
-              <w:bottom w:w="100" w:type="dxa"/>
-              <w:right w:w="100" w:type="dxa"/>
-            </w:tcMar>
-            <w:hideMark/>
-          </w:tcPr>
-          <w:p>
-            <w:pPr>
-              <w:rPr>
-                <w:lang w:val="en-US"/>
-              </w:rPr>
-            </w:pPr>
-          </w:p>
-        </w:tc>
-        <w:tc>
-          <w:tcPr>
-            <w:tcW w:w="0" w:type="auto"/>
-            <w:tcBorders>
-              <w:top w:val="single" w:sz="8" w:space="0" w:color="000000"/>
-              <w:left w:val="single" w:sz="8" w:space="0" w:color="000000"/>
-              <w:bottom w:val="single" w:sz="8" w:space="0" w:color="000000"/>
-              <w:right w:val="single" w:sz="8" w:space="0" w:color="000000"/>
-            </w:tcBorders>
-            <w:tcMar>
-              <w:top w:w="100" w:type="dxa"/>
-              <w:left w:w="100" w:type="dxa"/>
-              <w:bottom w:w="100" w:type="dxa"/>
-              <w:right w:w="100" w:type="dxa"/>
-            </w:tcMar>
-            <w:hideMark/>
-          </w:tcPr>
-          <w:p>
-            <w:pPr>
-              <w:rPr>
-                <w:lang w:val="en-US"/>
-              </w:rPr>
-            </w:pPr>
-            <w:r>
-              <w:rPr>
-                <w:lang w:val="en-US"/>
-              </w:rPr>
-              <w:t>{% if template_dict.file_ext.comments|length &gt; 0 %}X{% endif %}</w:t>
+              <w:t xml:space="preserve">{% if </w:t>
+            </w:r>
+            <w:proofErr w:type="spellStart"/>
+            <w:r>
+              <w:rPr>
+                <w:lang w:val="en-US"/>
+              </w:rPr>
+              <w:t>template_</w:t>
+            </w:r>
+            <w:proofErr w:type="gramStart"/>
+            <w:r>
+              <w:rPr>
+                <w:lang w:val="en-US"/>
+              </w:rPr>
+              <w:t>dict.file</w:t>
+            </w:r>
+            <w:proofErr w:type="gramEnd"/>
+            <w:r>
+              <w:rPr>
+                <w:lang w:val="en-US"/>
+              </w:rPr>
+              <w:t>_ext.comments|length</w:t>
+            </w:r>
+            <w:proofErr w:type="spellEnd"/>
+            <w:r>
+              <w:rPr>
+                <w:lang w:val="en-US"/>
+              </w:rPr>
+              <w:t xml:space="preserve"> == 0 %}X{% endif %}</w:t>
+            </w:r>
+          </w:p>
+        </w:tc>
+        <w:tc>
+          <w:tcPr>
+            <w:tcW w:w="0" w:type="auto"/>
+            <w:tcBorders>
+              <w:top w:val="single" w:sz="8" w:space="0" w:color="000000"/>
+              <w:left w:val="single" w:sz="8" w:space="0" w:color="000000"/>
+              <w:bottom w:val="single" w:sz="8" w:space="0" w:color="000000"/>
+              <w:right w:val="single" w:sz="8" w:space="0" w:color="000000"/>
+            </w:tcBorders>
+            <w:tcMar>
+              <w:top w:w="100" w:type="dxa"/>
+              <w:left w:w="100" w:type="dxa"/>
+              <w:bottom w:w="100" w:type="dxa"/>
+              <w:right w:w="100" w:type="dxa"/>
+            </w:tcMar>
+            <w:hideMark/>
+          </w:tcPr>
+          <w:p>
+            <w:pPr>
+              <w:rPr>
+                <w:lang w:val="en-US"/>
+              </w:rPr>
+            </w:pPr>
+          </w:p>
+        </w:tc>
+        <w:tc>
+          <w:tcPr>
+            <w:tcW w:w="0" w:type="auto"/>
+            <w:tcBorders>
+              <w:top w:val="single" w:sz="8" w:space="0" w:color="000000"/>
+              <w:left w:val="single" w:sz="8" w:space="0" w:color="000000"/>
+              <w:bottom w:val="single" w:sz="8" w:space="0" w:color="000000"/>
+              <w:right w:val="single" w:sz="8" w:space="0" w:color="000000"/>
+            </w:tcBorders>
+            <w:tcMar>
+              <w:top w:w="100" w:type="dxa"/>
+              <w:left w:w="100" w:type="dxa"/>
+              <w:bottom w:w="100" w:type="dxa"/>
+              <w:right w:w="100" w:type="dxa"/>
+            </w:tcMar>
+            <w:hideMark/>
+          </w:tcPr>
+          <w:p>
+            <w:pPr>
+              <w:rPr>
+                <w:lang w:val="en-US"/>
+              </w:rPr>
+            </w:pPr>
+            <w:r>
+              <w:rPr>
+                <w:lang w:val="en-US"/>
+              </w:rPr>
+              <w:t xml:space="preserve">{% if </w:t>
+            </w:r>
+            <w:proofErr w:type="spellStart"/>
+            <w:r>
+              <w:rPr>
+                <w:lang w:val="en-US"/>
+              </w:rPr>
+              <w:t>template_</w:t>
+            </w:r>
+            <w:proofErr w:type="gramStart"/>
+            <w:r>
+              <w:rPr>
+                <w:lang w:val="en-US"/>
+              </w:rPr>
+              <w:t>dict.file</w:t>
+            </w:r>
+            <w:proofErr w:type="gramEnd"/>
+            <w:r>
+              <w:rPr>
+                <w:lang w:val="en-US"/>
+              </w:rPr>
+              <w:t>_ext.comments|length</w:t>
+            </w:r>
+            <w:proofErr w:type="spellEnd"/>
+            <w:r>
+              <w:rPr>
+                <w:lang w:val="en-US"/>
+              </w:rPr>
+              <w:t xml:space="preserve"> &gt; 0 %}X{% endif %}</w:t>
             </w:r>
           </w:p>
         </w:tc>
@@ -2797,10 +3333,46 @@
               <w:rPr>
                 <w:lang w:val="en-US"/>
               </w:rPr>
-              <w:t>{% for item in template_dict.file_open.comments %}</w:t>
-            </w:r>
-            <w:r>
-              <w:t>{{ loop.index }}.</w:t>
+              <w:t xml:space="preserve">{% for item in </w:t>
+            </w:r>
+            <w:proofErr w:type="spellStart"/>
+            <w:r>
+              <w:rPr>
+                <w:lang w:val="en-US"/>
+              </w:rPr>
+              <w:t>template_</w:t>
+            </w:r>
+            <w:proofErr w:type="gramStart"/>
+            <w:r>
+              <w:rPr>
+                <w:lang w:val="en-US"/>
+              </w:rPr>
+              <w:t>dict.file</w:t>
+            </w:r>
+            <w:proofErr w:type="gramEnd"/>
+            <w:r>
+              <w:rPr>
+                <w:lang w:val="en-US"/>
+              </w:rPr>
+              <w:t>_open.comments</w:t>
+            </w:r>
+            <w:proofErr w:type="spellEnd"/>
+            <w:r>
+              <w:rPr>
+                <w:lang w:val="en-US"/>
+              </w:rPr>
+              <w:t xml:space="preserve"> %}</w:t>
+            </w:r>
+            <w:r>
+              <w:t xml:space="preserve">{{ </w:t>
+            </w:r>
+            <w:proofErr w:type="spellStart"/>
+            <w:r>
+              <w:t>loop.index</w:t>
+            </w:r>
+            <w:proofErr w:type="spellEnd"/>
+            <w:r>
+              <w:t xml:space="preserve"> }}.</w:t>
             </w:r>
             <w:r>
               <w:rPr>
@@ -2808,11 +3380,33 @@
               </w:rPr>
               <w:t xml:space="preserve"> </w:t>
             </w:r>
-            <w:r>
-              <w:rPr>
-                <w:lang w:val="en-US"/>
-              </w:rPr>
-              <w:t>{{ item.file_name }}</w:t>
+            <w:proofErr w:type="gramStart"/>
+            <w:r>
+              <w:rPr>
+                <w:lang w:val="en-US"/>
+              </w:rPr>
+              <w:t xml:space="preserve">{{ </w:t>
+            </w:r>
+            <w:proofErr w:type="spellStart"/>
+            <w:r>
+              <w:rPr>
+                <w:lang w:val="en-US"/>
+              </w:rPr>
+              <w:t>item</w:t>
+            </w:r>
+            <w:proofErr w:type="gramEnd"/>
+            <w:r>
+              <w:rPr>
+                <w:lang w:val="en-US"/>
+              </w:rPr>
+              <w:t>.file_name</w:t>
+            </w:r>
+            <w:proofErr w:type="spellEnd"/>
+            <w:r>
+              <w:rPr>
+                <w:lang w:val="en-US"/>
+              </w:rPr>
+              <w:t xml:space="preserve"> }}</w:t>
             </w:r>
             <w:r>
               <w:rPr>
@@ -2824,43 +3418,100 @@
               <w:rPr>
                 <w:lang w:val="en-US"/>
               </w:rPr>
-              <w:t>{% endfor %}</w:t>
-            </w:r>
-          </w:p>
-          <w:p>
-            <w:pPr>
-              <w:rPr>
-                <w:lang w:val="en-US"/>
-              </w:rPr>
-            </w:pPr>
-          </w:p>
-          <w:p>
-            <w:pPr>
-              <w:rPr>
-                <w:lang w:val="en-US"/>
-              </w:rPr>
-            </w:pPr>
-            <w:r>
-              <w:rPr>
-                <w:lang w:val="en-US"/>
-              </w:rPr>
-              <w:t>List all files that were not checked:</w:t>
-            </w:r>
-          </w:p>
-          <w:p>
-            <w:pPr>
-              <w:rPr>
-                <w:lang w:val="en-US"/>
-              </w:rPr>
-            </w:pPr>
-            <w:r>
-              <w:rPr>
-                <w:lang w:val="en-US"/>
-              </w:rPr>
-              <w:t>{% for item in template_dict.file_open.not_checked %}</w:t>
-            </w:r>
-            <w:r>
-              <w:t>{{ loop.index }}.</w:t>
+              <w:t xml:space="preserve">{% </w:t>
+            </w:r>
+            <w:proofErr w:type="spellStart"/>
+            <w:proofErr w:type="gramStart"/>
+            <w:r>
+              <w:rPr>
+                <w:lang w:val="en-US"/>
+              </w:rPr>
+              <w:t>endfor</w:t>
+            </w:r>
+            <w:proofErr w:type="spellEnd"/>
+            <w:r>
+              <w:rPr>
+                <w:lang w:val="en-US"/>
+              </w:rPr>
+              <w:t xml:space="preserve"> %}</w:t>
+            </w:r>
+            <w:proofErr w:type="gramEnd"/>
+          </w:p>
+          <w:p>
+            <w:pPr>
+              <w:rPr>
+                <w:lang w:val="en-US"/>
+              </w:rPr>
+            </w:pPr>
+          </w:p>
+          <w:p>
+            <w:pPr>
+              <w:rPr>
+                <w:lang w:val="en-US"/>
+              </w:rPr>
+            </w:pPr>
+            <w:proofErr w:type="gramStart"/>
+            <w:r>
+              <w:rPr>
+                <w:lang w:val="en-US"/>
+              </w:rPr>
+              <w:t>List</w:t>
+            </w:r>
+            <w:proofErr w:type="gramEnd"/>
+            <w:r>
+              <w:rPr>
+                <w:lang w:val="en-US"/>
+              </w:rPr>
+              <w:t xml:space="preserve"> all files that were not checked:</w:t>
+            </w:r>
+          </w:p>
+          <w:p>
+            <w:pPr>
+              <w:rPr>
+                <w:lang w:val="en-US"/>
+              </w:rPr>
+            </w:pPr>
+            <w:r>
+              <w:rPr>
+                <w:lang w:val="en-US"/>
+              </w:rPr>
+              <w:t xml:space="preserve">{% for item in </w:t>
+            </w:r>
+            <w:proofErr w:type="spellStart"/>
+            <w:r>
+              <w:rPr>
+                <w:lang w:val="en-US"/>
+              </w:rPr>
+              <w:t>template_dict.file_open.not_checked</w:t>
+            </w:r>
+            <w:proofErr w:type="spellEnd"/>
+            <w:r>
+              <w:rPr>
+                <w:lang w:val="en-US"/>
+              </w:rPr>
+              <w:t xml:space="preserve"> </w:t>
+            </w:r>
+            <w:proofErr w:type="gramStart"/>
+            <w:r>
+              <w:rPr>
+                <w:lang w:val="en-US"/>
+              </w:rPr>
+              <w:t>%}</w:t>
+            </w:r>
+            <w:r>
+              <w:t>{</w:t>
+            </w:r>
+            <w:proofErr w:type="gramEnd"/>
+            <w:r>
+              <w:t xml:space="preserve">{ </w:t>
+            </w:r>
+            <w:proofErr w:type="spellStart"/>
+            <w:r>
+              <w:t>loop.index</w:t>
+            </w:r>
+            <w:proofErr w:type="spellEnd"/>
+            <w:r>
+              <w:t xml:space="preserve"> }}.</w:t>
             </w:r>
             <w:r>
               <w:rPr>
@@ -2868,11 +3519,33 @@
               </w:rPr>
               <w:t xml:space="preserve"> </w:t>
             </w:r>
-            <w:r>
-              <w:rPr>
-                <w:lang w:val="en-US"/>
-              </w:rPr>
-              <w:t>{{ item.file_name }}</w:t>
+            <w:proofErr w:type="gramStart"/>
+            <w:r>
+              <w:rPr>
+                <w:lang w:val="en-US"/>
+              </w:rPr>
+              <w:t xml:space="preserve">{{ </w:t>
+            </w:r>
+            <w:proofErr w:type="spellStart"/>
+            <w:r>
+              <w:rPr>
+                <w:lang w:val="en-US"/>
+              </w:rPr>
+              <w:t>item</w:t>
+            </w:r>
+            <w:proofErr w:type="gramEnd"/>
+            <w:r>
+              <w:rPr>
+                <w:lang w:val="en-US"/>
+              </w:rPr>
+              <w:t>.file_name</w:t>
+            </w:r>
+            <w:proofErr w:type="spellEnd"/>
+            <w:r>
+              <w:rPr>
+                <w:lang w:val="en-US"/>
+              </w:rPr>
+              <w:t xml:space="preserve"> }}</w:t>
             </w:r>
             <w:r>
               <w:rPr>
@@ -2884,7 +3557,21 @@
               <w:rPr>
                 <w:lang w:val="en-US"/>
               </w:rPr>
-              <w:t>{% endfor %}</w:t>
+              <w:t xml:space="preserve">{% </w:t>
+            </w:r>
+            <w:proofErr w:type="spellStart"/>
+            <w:r>
+              <w:rPr>
+                <w:lang w:val="en-US"/>
+              </w:rPr>
+              <w:t>endfor</w:t>
+            </w:r>
+            <w:proofErr w:type="spellEnd"/>
+            <w:r>
+              <w:rPr>
+                <w:lang w:val="en-US"/>
+              </w:rPr>
+              <w:t xml:space="preserve"> %}</w:t>
             </w:r>
           </w:p>
         </w:tc>
@@ -3091,63 +3778,119 @@
               <w:rPr>
                 <w:lang w:val="en-US"/>
               </w:rPr>
-              <w:t>{% if template_dict.special_characters.comments|length == 0 %}X{% endif %}</w:t>
-            </w:r>
-          </w:p>
-        </w:tc>
-        <w:tc>
-          <w:tcPr>
-            <w:tcW w:w="0" w:type="auto"/>
-            <w:tcBorders>
-              <w:top w:val="single" w:sz="8" w:space="0" w:color="000000"/>
-              <w:left w:val="single" w:sz="8" w:space="0" w:color="000000"/>
-              <w:bottom w:val="single" w:sz="8" w:space="0" w:color="000000"/>
-              <w:right w:val="single" w:sz="8" w:space="0" w:color="000000"/>
-            </w:tcBorders>
-            <w:tcMar>
-              <w:top w:w="100" w:type="dxa"/>
-              <w:left w:w="100" w:type="dxa"/>
-              <w:bottom w:w="100" w:type="dxa"/>
-              <w:right w:w="100" w:type="dxa"/>
-            </w:tcMar>
-            <w:hideMark/>
-          </w:tcPr>
-          <w:p>
-            <w:pPr>
-              <w:rPr>
-                <w:lang w:val="en-US"/>
-              </w:rPr>
-            </w:pPr>
-          </w:p>
-        </w:tc>
-        <w:tc>
-          <w:tcPr>
-            <w:tcW w:w="0" w:type="auto"/>
-            <w:tcBorders>
-              <w:top w:val="single" w:sz="8" w:space="0" w:color="000000"/>
-              <w:left w:val="single" w:sz="8" w:space="0" w:color="000000"/>
-              <w:bottom w:val="single" w:sz="8" w:space="0" w:color="000000"/>
-              <w:right w:val="single" w:sz="8" w:space="0" w:color="000000"/>
-            </w:tcBorders>
-            <w:tcMar>
-              <w:top w:w="100" w:type="dxa"/>
-              <w:left w:w="100" w:type="dxa"/>
-              <w:bottom w:w="100" w:type="dxa"/>
-              <w:right w:w="100" w:type="dxa"/>
-            </w:tcMar>
-            <w:hideMark/>
-          </w:tcPr>
-          <w:p>
-            <w:pPr>
-              <w:rPr>
-                <w:lang w:val="en-US"/>
-              </w:rPr>
-            </w:pPr>
-            <w:r>
-              <w:rPr>
-                <w:lang w:val="en-US"/>
-              </w:rPr>
-              <w:t>{% if template_dict.special_characters.comments|length &gt; 0 %}X{% endif %}</w:t>
+              <w:t xml:space="preserve">{% if </w:t>
+            </w:r>
+            <w:proofErr w:type="spellStart"/>
+            <w:r>
+              <w:rPr>
+                <w:lang w:val="en-US"/>
+              </w:rPr>
+              <w:t>template_</w:t>
+            </w:r>
+            <w:proofErr w:type="gramStart"/>
+            <w:r>
+              <w:rPr>
+                <w:lang w:val="en-US"/>
+              </w:rPr>
+              <w:t>dict.special</w:t>
+            </w:r>
+            <w:proofErr w:type="gramEnd"/>
+            <w:r>
+              <w:rPr>
+                <w:lang w:val="en-US"/>
+              </w:rPr>
+              <w:t>_characters.comments|length</w:t>
+            </w:r>
+            <w:proofErr w:type="spellEnd"/>
+            <w:r>
+              <w:rPr>
+                <w:lang w:val="en-US"/>
+              </w:rPr>
+              <w:t xml:space="preserve"> == 0 %}X{% endif %}</w:t>
+            </w:r>
+          </w:p>
+        </w:tc>
+        <w:tc>
+          <w:tcPr>
+            <w:tcW w:w="0" w:type="auto"/>
+            <w:tcBorders>
+              <w:top w:val="single" w:sz="8" w:space="0" w:color="000000"/>
+              <w:left w:val="single" w:sz="8" w:space="0" w:color="000000"/>
+              <w:bottom w:val="single" w:sz="8" w:space="0" w:color="000000"/>
+              <w:right w:val="single" w:sz="8" w:space="0" w:color="000000"/>
+            </w:tcBorders>
+            <w:tcMar>
+              <w:top w:w="100" w:type="dxa"/>
+              <w:left w:w="100" w:type="dxa"/>
+              <w:bottom w:w="100" w:type="dxa"/>
+              <w:right w:w="100" w:type="dxa"/>
+            </w:tcMar>
+            <w:hideMark/>
+          </w:tcPr>
+          <w:p>
+            <w:pPr>
+              <w:rPr>
+                <w:lang w:val="en-US"/>
+              </w:rPr>
+            </w:pPr>
+          </w:p>
+        </w:tc>
+        <w:tc>
+          <w:tcPr>
+            <w:tcW w:w="0" w:type="auto"/>
+            <w:tcBorders>
+              <w:top w:val="single" w:sz="8" w:space="0" w:color="000000"/>
+              <w:left w:val="single" w:sz="8" w:space="0" w:color="000000"/>
+              <w:bottom w:val="single" w:sz="8" w:space="0" w:color="000000"/>
+              <w:right w:val="single" w:sz="8" w:space="0" w:color="000000"/>
+            </w:tcBorders>
+            <w:tcMar>
+              <w:top w:w="100" w:type="dxa"/>
+              <w:left w:w="100" w:type="dxa"/>
+              <w:bottom w:w="100" w:type="dxa"/>
+              <w:right w:w="100" w:type="dxa"/>
+            </w:tcMar>
+            <w:hideMark/>
+          </w:tcPr>
+          <w:p>
+            <w:pPr>
+              <w:rPr>
+                <w:lang w:val="en-US"/>
+              </w:rPr>
+            </w:pPr>
+            <w:r>
+              <w:rPr>
+                <w:lang w:val="en-US"/>
+              </w:rPr>
+              <w:t xml:space="preserve">{% if </w:t>
+            </w:r>
+            <w:proofErr w:type="spellStart"/>
+            <w:r>
+              <w:rPr>
+                <w:lang w:val="en-US"/>
+              </w:rPr>
+              <w:t>template_</w:t>
+            </w:r>
+            <w:proofErr w:type="gramStart"/>
+            <w:r>
+              <w:rPr>
+                <w:lang w:val="en-US"/>
+              </w:rPr>
+              <w:t>dict.special</w:t>
+            </w:r>
+            <w:proofErr w:type="gramEnd"/>
+            <w:r>
+              <w:rPr>
+                <w:lang w:val="en-US"/>
+              </w:rPr>
+              <w:t>_characters.comments|length</w:t>
+            </w:r>
+            <w:proofErr w:type="spellEnd"/>
+            <w:r>
+              <w:rPr>
+                <w:lang w:val="en-US"/>
+              </w:rPr>
+              <w:t xml:space="preserve"> &gt; 0 %}X{% endif %}</w:t>
             </w:r>
           </w:p>
         </w:tc>
@@ -3241,10 +3984,46 @@
               <w:rPr>
                 <w:lang w:val="en-US"/>
               </w:rPr>
-              <w:t>{% for item in template_dict.special_characters.comments %}</w:t>
-            </w:r>
-            <w:r>
-              <w:t>{{ loop.index }}.</w:t>
+              <w:t xml:space="preserve">{% for item in </w:t>
+            </w:r>
+            <w:proofErr w:type="spellStart"/>
+            <w:r>
+              <w:rPr>
+                <w:lang w:val="en-US"/>
+              </w:rPr>
+              <w:t>template_</w:t>
+            </w:r>
+            <w:proofErr w:type="gramStart"/>
+            <w:r>
+              <w:rPr>
+                <w:lang w:val="en-US"/>
+              </w:rPr>
+              <w:t>dict.special</w:t>
+            </w:r>
+            <w:proofErr w:type="gramEnd"/>
+            <w:r>
+              <w:rPr>
+                <w:lang w:val="en-US"/>
+              </w:rPr>
+              <w:t>_characters.comments</w:t>
+            </w:r>
+            <w:proofErr w:type="spellEnd"/>
+            <w:r>
+              <w:rPr>
+                <w:lang w:val="en-US"/>
+              </w:rPr>
+              <w:t xml:space="preserve"> %}</w:t>
+            </w:r>
+            <w:r>
+              <w:t xml:space="preserve">{{ </w:t>
+            </w:r>
+            <w:proofErr w:type="spellStart"/>
+            <w:r>
+              <w:t>loop.index</w:t>
+            </w:r>
+            <w:proofErr w:type="spellEnd"/>
+            <w:r>
+              <w:t xml:space="preserve"> }}.</w:t>
             </w:r>
             <w:r>
               <w:rPr>
@@ -3252,11 +4031,33 @@
               </w:rPr>
               <w:t xml:space="preserve"> </w:t>
             </w:r>
-            <w:r>
-              <w:rPr>
-                <w:lang w:val="en-US"/>
-              </w:rPr>
-              <w:t>{{ item.file_name }}</w:t>
+            <w:proofErr w:type="gramStart"/>
+            <w:r>
+              <w:rPr>
+                <w:lang w:val="en-US"/>
+              </w:rPr>
+              <w:t xml:space="preserve">{{ </w:t>
+            </w:r>
+            <w:proofErr w:type="spellStart"/>
+            <w:r>
+              <w:rPr>
+                <w:lang w:val="en-US"/>
+              </w:rPr>
+              <w:t>item</w:t>
+            </w:r>
+            <w:proofErr w:type="gramEnd"/>
+            <w:r>
+              <w:rPr>
+                <w:lang w:val="en-US"/>
+              </w:rPr>
+              <w:t>.file_name</w:t>
+            </w:r>
+            <w:proofErr w:type="spellEnd"/>
+            <w:r>
+              <w:rPr>
+                <w:lang w:val="en-US"/>
+              </w:rPr>
+              <w:t xml:space="preserve"> }}</w:t>
             </w:r>
             <w:r>
               <w:rPr>
@@ -3268,7 +4069,21 @@
               <w:rPr>
                 <w:lang w:val="en-US"/>
               </w:rPr>
-              <w:t>{% endfor %}</w:t>
+              <w:t xml:space="preserve">{% </w:t>
+            </w:r>
+            <w:proofErr w:type="spellStart"/>
+            <w:r>
+              <w:rPr>
+                <w:lang w:val="en-US"/>
+              </w:rPr>
+              <w:t>endfor</w:t>
+            </w:r>
+            <w:proofErr w:type="spellEnd"/>
+            <w:r>
+              <w:rPr>
+                <w:lang w:val="en-US"/>
+              </w:rPr>
+              <w:t xml:space="preserve"> %}</w:t>
             </w:r>
           </w:p>
         </w:tc>
@@ -3460,7 +4275,35 @@
               <w:rPr>
                 <w:lang w:val="en-US"/>
               </w:rPr>
-              <w:t xml:space="preserve">{% if template_dict.readme_file.comments|length </w:t>
+              <w:t xml:space="preserve">{% if </w:t>
+            </w:r>
+            <w:proofErr w:type="spellStart"/>
+            <w:r>
+              <w:rPr>
+                <w:lang w:val="en-US"/>
+              </w:rPr>
+              <w:t>template_</w:t>
+            </w:r>
+            <w:proofErr w:type="gramStart"/>
+            <w:r>
+              <w:rPr>
+                <w:lang w:val="en-US"/>
+              </w:rPr>
+              <w:t>dict.readme</w:t>
+            </w:r>
+            <w:proofErr w:type="gramEnd"/>
+            <w:r>
+              <w:rPr>
+                <w:lang w:val="en-US"/>
+              </w:rPr>
+              <w:t>_file.comments|length</w:t>
+            </w:r>
+            <w:proofErr w:type="spellEnd"/>
+            <w:r>
+              <w:rPr>
+                <w:lang w:val="en-US"/>
+              </w:rPr>
+              <w:t xml:space="preserve"> </w:t>
             </w:r>
             <w:r>
               <w:rPr>
@@ -3529,7 +4372,35 @@
               <w:rPr>
                 <w:lang w:val="en-US"/>
               </w:rPr>
-              <w:t>{% if template_dict.file_ext.comments|length &gt; 0 %}X{% endif %}</w:t>
+              <w:t xml:space="preserve">{% if </w:t>
+            </w:r>
+            <w:proofErr w:type="spellStart"/>
+            <w:r>
+              <w:rPr>
+                <w:lang w:val="en-US"/>
+              </w:rPr>
+              <w:t>template_</w:t>
+            </w:r>
+            <w:proofErr w:type="gramStart"/>
+            <w:r>
+              <w:rPr>
+                <w:lang w:val="en-US"/>
+              </w:rPr>
+              <w:t>dict.file</w:t>
+            </w:r>
+            <w:proofErr w:type="gramEnd"/>
+            <w:r>
+              <w:rPr>
+                <w:lang w:val="en-US"/>
+              </w:rPr>
+              <w:t>_ext.comments|length</w:t>
+            </w:r>
+            <w:proofErr w:type="spellEnd"/>
+            <w:r>
+              <w:rPr>
+                <w:lang w:val="en-US"/>
+              </w:rPr>
+              <w:t xml:space="preserve"> &gt; 0 %}X{% endif %}</w:t>
             </w:r>
           </w:p>
         </w:tc>
@@ -3623,10 +4494,46 @@
               <w:rPr>
                 <w:lang w:val="en-US"/>
               </w:rPr>
-              <w:t>{% for item in template_dict.file_ext.comments %}</w:t>
-            </w:r>
-            <w:r>
-              <w:t>{{ loop.index }}.</w:t>
+              <w:t xml:space="preserve">{% for item in </w:t>
+            </w:r>
+            <w:proofErr w:type="spellStart"/>
+            <w:r>
+              <w:rPr>
+                <w:lang w:val="en-US"/>
+              </w:rPr>
+              <w:t>template_</w:t>
+            </w:r>
+            <w:proofErr w:type="gramStart"/>
+            <w:r>
+              <w:rPr>
+                <w:lang w:val="en-US"/>
+              </w:rPr>
+              <w:t>dict.file</w:t>
+            </w:r>
+            <w:proofErr w:type="gramEnd"/>
+            <w:r>
+              <w:rPr>
+                <w:lang w:val="en-US"/>
+              </w:rPr>
+              <w:t>_ext.comments</w:t>
+            </w:r>
+            <w:proofErr w:type="spellEnd"/>
+            <w:r>
+              <w:rPr>
+                <w:lang w:val="en-US"/>
+              </w:rPr>
+              <w:t xml:space="preserve"> %}</w:t>
+            </w:r>
+            <w:r>
+              <w:t xml:space="preserve">{{ </w:t>
+            </w:r>
+            <w:proofErr w:type="spellStart"/>
+            <w:r>
+              <w:t>loop.index</w:t>
+            </w:r>
+            <w:proofErr w:type="spellEnd"/>
+            <w:r>
+              <w:t xml:space="preserve"> }}.</w:t>
             </w:r>
             <w:r>
               <w:rPr>
@@ -3634,11 +4541,33 @@
               </w:rPr>
               <w:t xml:space="preserve"> </w:t>
             </w:r>
-            <w:r>
-              <w:rPr>
-                <w:lang w:val="en-US"/>
-              </w:rPr>
-              <w:t>{{ item.file_name }}</w:t>
+            <w:proofErr w:type="gramStart"/>
+            <w:r>
+              <w:rPr>
+                <w:lang w:val="en-US"/>
+              </w:rPr>
+              <w:t xml:space="preserve">{{ </w:t>
+            </w:r>
+            <w:proofErr w:type="spellStart"/>
+            <w:r>
+              <w:rPr>
+                <w:lang w:val="en-US"/>
+              </w:rPr>
+              <w:t>item</w:t>
+            </w:r>
+            <w:proofErr w:type="gramEnd"/>
+            <w:r>
+              <w:rPr>
+                <w:lang w:val="en-US"/>
+              </w:rPr>
+              <w:t>.file_name</w:t>
+            </w:r>
+            <w:proofErr w:type="spellEnd"/>
+            <w:r>
+              <w:rPr>
+                <w:lang w:val="en-US"/>
+              </w:rPr>
+              <w:t xml:space="preserve"> }}</w:t>
             </w:r>
             <w:r>
               <w:rPr>
@@ -3650,7 +4579,21 @@
               <w:rPr>
                 <w:lang w:val="en-US"/>
               </w:rPr>
-              <w:t>{% endfor %}</w:t>
+              <w:t xml:space="preserve">{% </w:t>
+            </w:r>
+            <w:proofErr w:type="spellStart"/>
+            <w:r>
+              <w:rPr>
+                <w:lang w:val="en-US"/>
+              </w:rPr>
+              <w:t>endfor</w:t>
+            </w:r>
+            <w:proofErr w:type="spellEnd"/>
+            <w:r>
+              <w:rPr>
+                <w:lang w:val="en-US"/>
+              </w:rPr>
+              <w:t xml:space="preserve"> %}</w:t>
             </w:r>
           </w:p>
         </w:tc>
@@ -4907,38 +5850,94 @@
               <w:rPr>
                 <w:lang w:val="en-US"/>
               </w:rPr>
-              <w:t>{% if template_dict.readme_file.comments|length &gt; 0 %}X{% endif %}</w:t>
-            </w:r>
-          </w:p>
-        </w:tc>
-        <w:tc>
-          <w:tcPr>
-            <w:tcW w:w="0" w:type="auto"/>
-            <w:tcBorders>
-              <w:top w:val="single" w:sz="8" w:space="0" w:color="000000"/>
-              <w:left w:val="single" w:sz="8" w:space="0" w:color="000000"/>
-              <w:bottom w:val="single" w:sz="8" w:space="0" w:color="000000"/>
-              <w:right w:val="single" w:sz="8" w:space="0" w:color="000000"/>
-            </w:tcBorders>
-            <w:tcMar>
-              <w:top w:w="100" w:type="dxa"/>
-              <w:left w:w="100" w:type="dxa"/>
-              <w:bottom w:w="100" w:type="dxa"/>
-              <w:right w:w="100" w:type="dxa"/>
-            </w:tcMar>
-            <w:hideMark/>
-          </w:tcPr>
-          <w:p>
-            <w:pPr>
-              <w:rPr>
-                <w:lang w:val="en-US"/>
-              </w:rPr>
-            </w:pPr>
-            <w:r>
-              <w:rPr>
-                <w:lang w:val="en-US"/>
-              </w:rPr>
-              <w:t>{% if template_dict.readme_file.comments|length == 0 %}X{% endif %}</w:t>
+              <w:t xml:space="preserve">{% if </w:t>
+            </w:r>
+            <w:proofErr w:type="spellStart"/>
+            <w:r>
+              <w:rPr>
+                <w:lang w:val="en-US"/>
+              </w:rPr>
+              <w:t>template_</w:t>
+            </w:r>
+            <w:proofErr w:type="gramStart"/>
+            <w:r>
+              <w:rPr>
+                <w:lang w:val="en-US"/>
+              </w:rPr>
+              <w:t>dict.readme</w:t>
+            </w:r>
+            <w:proofErr w:type="gramEnd"/>
+            <w:r>
+              <w:rPr>
+                <w:lang w:val="en-US"/>
+              </w:rPr>
+              <w:t>_file.comments|length</w:t>
+            </w:r>
+            <w:proofErr w:type="spellEnd"/>
+            <w:r>
+              <w:rPr>
+                <w:lang w:val="en-US"/>
+              </w:rPr>
+              <w:t xml:space="preserve"> &gt; 0 %}X{% endif %}</w:t>
+            </w:r>
+          </w:p>
+        </w:tc>
+        <w:tc>
+          <w:tcPr>
+            <w:tcW w:w="0" w:type="auto"/>
+            <w:tcBorders>
+              <w:top w:val="single" w:sz="8" w:space="0" w:color="000000"/>
+              <w:left w:val="single" w:sz="8" w:space="0" w:color="000000"/>
+              <w:bottom w:val="single" w:sz="8" w:space="0" w:color="000000"/>
+              <w:right w:val="single" w:sz="8" w:space="0" w:color="000000"/>
+            </w:tcBorders>
+            <w:tcMar>
+              <w:top w:w="100" w:type="dxa"/>
+              <w:left w:w="100" w:type="dxa"/>
+              <w:bottom w:w="100" w:type="dxa"/>
+              <w:right w:w="100" w:type="dxa"/>
+            </w:tcMar>
+            <w:hideMark/>
+          </w:tcPr>
+          <w:p>
+            <w:pPr>
+              <w:rPr>
+                <w:lang w:val="en-US"/>
+              </w:rPr>
+            </w:pPr>
+            <w:r>
+              <w:rPr>
+                <w:lang w:val="en-US"/>
+              </w:rPr>
+              <w:t xml:space="preserve">{% if </w:t>
+            </w:r>
+            <w:proofErr w:type="spellStart"/>
+            <w:r>
+              <w:rPr>
+                <w:lang w:val="en-US"/>
+              </w:rPr>
+              <w:t>template_</w:t>
+            </w:r>
+            <w:proofErr w:type="gramStart"/>
+            <w:r>
+              <w:rPr>
+                <w:lang w:val="en-US"/>
+              </w:rPr>
+              <w:t>dict.readme</w:t>
+            </w:r>
+            <w:proofErr w:type="gramEnd"/>
+            <w:r>
+              <w:rPr>
+                <w:lang w:val="en-US"/>
+              </w:rPr>
+              <w:t>_file.comments|length</w:t>
+            </w:r>
+            <w:proofErr w:type="spellEnd"/>
+            <w:r>
+              <w:rPr>
+                <w:lang w:val="en-US"/>
+              </w:rPr>
+              <w:t xml:space="preserve"> == 0 %}X{% endif %}</w:t>
             </w:r>
           </w:p>
         </w:tc>
@@ -5057,10 +6056,46 @@
               <w:rPr>
                 <w:lang w:val="en-US"/>
               </w:rPr>
-              <w:t>{% for item in template_dict.readme_file.comments %}</w:t>
-            </w:r>
-            <w:r>
-              <w:t>{{ loop.index }}.</w:t>
+              <w:t xml:space="preserve">{% for item in </w:t>
+            </w:r>
+            <w:proofErr w:type="spellStart"/>
+            <w:r>
+              <w:rPr>
+                <w:lang w:val="en-US"/>
+              </w:rPr>
+              <w:t>template_</w:t>
+            </w:r>
+            <w:proofErr w:type="gramStart"/>
+            <w:r>
+              <w:rPr>
+                <w:lang w:val="en-US"/>
+              </w:rPr>
+              <w:t>dict.readme</w:t>
+            </w:r>
+            <w:proofErr w:type="gramEnd"/>
+            <w:r>
+              <w:rPr>
+                <w:lang w:val="en-US"/>
+              </w:rPr>
+              <w:t>_file.comments</w:t>
+            </w:r>
+            <w:proofErr w:type="spellEnd"/>
+            <w:r>
+              <w:rPr>
+                <w:lang w:val="en-US"/>
+              </w:rPr>
+              <w:t xml:space="preserve"> %}</w:t>
+            </w:r>
+            <w:r>
+              <w:t xml:space="preserve">{{ </w:t>
+            </w:r>
+            <w:proofErr w:type="spellStart"/>
+            <w:r>
+              <w:t>loop.index</w:t>
+            </w:r>
+            <w:proofErr w:type="spellEnd"/>
+            <w:r>
+              <w:t xml:space="preserve"> }}.</w:t>
             </w:r>
             <w:r>
               <w:rPr>
@@ -5068,11 +6103,33 @@
               </w:rPr>
               <w:t xml:space="preserve"> </w:t>
             </w:r>
-            <w:r>
-              <w:rPr>
-                <w:lang w:val="en-US"/>
-              </w:rPr>
-              <w:t>{{ item.file_name }}</w:t>
+            <w:proofErr w:type="gramStart"/>
+            <w:r>
+              <w:rPr>
+                <w:lang w:val="en-US"/>
+              </w:rPr>
+              <w:t xml:space="preserve">{{ </w:t>
+            </w:r>
+            <w:proofErr w:type="spellStart"/>
+            <w:r>
+              <w:rPr>
+                <w:lang w:val="en-US"/>
+              </w:rPr>
+              <w:t>item</w:t>
+            </w:r>
+            <w:proofErr w:type="gramEnd"/>
+            <w:r>
+              <w:rPr>
+                <w:lang w:val="en-US"/>
+              </w:rPr>
+              <w:t>.file_name</w:t>
+            </w:r>
+            <w:proofErr w:type="spellEnd"/>
+            <w:r>
+              <w:rPr>
+                <w:lang w:val="en-US"/>
+              </w:rPr>
+              <w:t xml:space="preserve"> }}</w:t>
             </w:r>
             <w:r>
               <w:rPr>
@@ -5084,7 +6141,21 @@
               <w:rPr>
                 <w:lang w:val="en-US"/>
               </w:rPr>
-              <w:t>{% endfor %}</w:t>
+              <w:t xml:space="preserve">{% </w:t>
+            </w:r>
+            <w:proofErr w:type="spellStart"/>
+            <w:r>
+              <w:rPr>
+                <w:lang w:val="en-US"/>
+              </w:rPr>
+              <w:t>endfor</w:t>
+            </w:r>
+            <w:proofErr w:type="spellEnd"/>
+            <w:r>
+              <w:rPr>
+                <w:lang w:val="en-US"/>
+              </w:rPr>
+              <w:t xml:space="preserve"> %}</w:t>
             </w:r>
           </w:p>
         </w:tc>
@@ -5883,10 +6954,46 @@
               <w:rPr>
                 <w:lang w:val="en-US"/>
               </w:rPr>
-              <w:t>{% for item in template_dict.typo.comments %}</w:t>
-            </w:r>
-            <w:r>
-              <w:t>{{ loop.index }}.</w:t>
+              <w:t xml:space="preserve">{% for item in </w:t>
+            </w:r>
+            <w:proofErr w:type="spellStart"/>
+            <w:r>
+              <w:rPr>
+                <w:lang w:val="en-US"/>
+              </w:rPr>
+              <w:t>template_</w:t>
+            </w:r>
+            <w:proofErr w:type="gramStart"/>
+            <w:r>
+              <w:rPr>
+                <w:lang w:val="en-US"/>
+              </w:rPr>
+              <w:t>dict.typo</w:t>
+            </w:r>
+            <w:proofErr w:type="gramEnd"/>
+            <w:r>
+              <w:rPr>
+                <w:lang w:val="en-US"/>
+              </w:rPr>
+              <w:t>.comments</w:t>
+            </w:r>
+            <w:proofErr w:type="spellEnd"/>
+            <w:r>
+              <w:rPr>
+                <w:lang w:val="en-US"/>
+              </w:rPr>
+              <w:t xml:space="preserve"> %}</w:t>
+            </w:r>
+            <w:r>
+              <w:t xml:space="preserve">{{ </w:t>
+            </w:r>
+            <w:proofErr w:type="spellStart"/>
+            <w:r>
+              <w:t>loop.index</w:t>
+            </w:r>
+            <w:proofErr w:type="spellEnd"/>
+            <w:r>
+              <w:t xml:space="preserve"> }}.</w:t>
             </w:r>
             <w:r>
               <w:rPr>
@@ -5894,11 +7001,19 @@
               </w:rPr>
               <w:t xml:space="preserve"> </w:t>
             </w:r>
-            <w:r>
-              <w:rPr>
-                <w:lang w:val="en-US"/>
-              </w:rPr>
-              <w:t>{{ item }}</w:t>
+            <w:proofErr w:type="gramStart"/>
+            <w:r>
+              <w:rPr>
+                <w:lang w:val="en-US"/>
+              </w:rPr>
+              <w:t>{{ item</w:t>
+            </w:r>
+            <w:proofErr w:type="gramEnd"/>
+            <w:r>
+              <w:rPr>
+                <w:lang w:val="en-US"/>
+              </w:rPr>
+              <w:t xml:space="preserve"> }}</w:t>
             </w:r>
             <w:r>
               <w:rPr>
@@ -5910,8 +7025,24 @@
               <w:rPr>
                 <w:lang w:val="en-US"/>
               </w:rPr>
-              <w:t>{% endfor %}</w:t>
-            </w:r>
+              <w:t xml:space="preserve">{% </w:t>
+            </w:r>
+            <w:proofErr w:type="spellStart"/>
+            <w:proofErr w:type="gramStart"/>
+            <w:r>
+              <w:rPr>
+                <w:lang w:val="en-US"/>
+              </w:rPr>
+              <w:t>endfor</w:t>
+            </w:r>
+            <w:proofErr w:type="spellEnd"/>
+            <w:r>
+              <w:rPr>
+                <w:lang w:val="en-US"/>
+              </w:rPr>
+              <w:t xml:space="preserve"> %}</w:t>
+            </w:r>
+            <w:proofErr w:type="gramEnd"/>
           </w:p>
           <w:p>
             <w:pPr>
@@ -8402,7 +9533,21 @@
               <w:rPr>
                 <w:lang w:val="en-US"/>
               </w:rPr>
-              <w:t>If there are restricted files and no Terms of Access, recommend including terms of access.</w:t>
+              <w:t xml:space="preserve">If there are restricted files and no Terms of Access, </w:t>
+            </w:r>
+            <w:proofErr w:type="gramStart"/>
+            <w:r>
+              <w:rPr>
+                <w:lang w:val="en-US"/>
+              </w:rPr>
+              <w:t>recommend</w:t>
+            </w:r>
+            <w:proofErr w:type="gramEnd"/>
+            <w:r>
+              <w:rPr>
+                <w:lang w:val="en-US"/>
+              </w:rPr>
+              <w:t xml:space="preserve"> including terms of access.</w:t>
             </w:r>
           </w:p>
         </w:tc>

</xml_diff>

<commit_message>
1. Updated the loop of items, to incorporate with the built-in numbered list feature in word. Except for ID 1.1, since it is a nested for loop.
</commit_message>
<xml_diff>
--- a/res/template_new.docx
+++ b/res/template_new.docx
@@ -30,14 +30,7 @@
         <w:rPr>
           <w:rFonts w:hint="eastAsia"/>
         </w:rPr>
-        <w:t xml:space="preserve">Ticket number: </w:t>
-      </w:r>
-      <w:proofErr w:type="gramStart"/>
-      <w:r>
-        <w:rPr>
-          <w:rFonts w:hint="eastAsia"/>
-        </w:rPr>
-        <w:t>{</w:t>
+        <w:t>Ticket number: {</w:t>
       </w:r>
       <w:r>
         <w:rPr>
@@ -56,14 +49,7 @@
         <w:rPr>
           <w:rFonts w:hint="eastAsia"/>
         </w:rPr>
-        <w:t>curator</w:t>
-      </w:r>
-      <w:proofErr w:type="gramEnd"/>
-      <w:r>
-        <w:rPr>
-          <w:rFonts w:hint="eastAsia"/>
-        </w:rPr>
-        <w:t>_info.ticket_n</w:t>
+        <w:t>curator_info.ticket_n</w:t>
       </w:r>
       <w:r>
         <w:rPr>
@@ -102,28 +88,14 @@
         <w:rPr>
           <w:rFonts w:hint="eastAsia"/>
         </w:rPr>
-        <w:t xml:space="preserve"> </w:t>
-      </w:r>
-      <w:proofErr w:type="gramStart"/>
-      <w:r>
-        <w:rPr>
-          <w:rFonts w:hint="eastAsia"/>
-        </w:rPr>
-        <w:t xml:space="preserve">{{ </w:t>
+        <w:t xml:space="preserve"> {{ </w:t>
       </w:r>
       <w:proofErr w:type="spellStart"/>
       <w:r>
         <w:rPr>
           <w:rFonts w:hint="eastAsia"/>
         </w:rPr>
-        <w:t>curator</w:t>
-      </w:r>
-      <w:proofErr w:type="gramEnd"/>
-      <w:r>
-        <w:rPr>
-          <w:rFonts w:hint="eastAsia"/>
-        </w:rPr>
-        <w:t>_info.curator_name</w:t>
+        <w:t>curator_info.curator_name</w:t>
       </w:r>
       <w:proofErr w:type="spellEnd"/>
       <w:r>
@@ -138,28 +110,14 @@
         <w:rPr>
           <w:rFonts w:hint="eastAsia"/>
         </w:rPr>
-        <w:t xml:space="preserve">Curator email: </w:t>
-      </w:r>
-      <w:proofErr w:type="gramStart"/>
-      <w:r>
-        <w:rPr>
-          <w:rFonts w:hint="eastAsia"/>
-        </w:rPr>
-        <w:t xml:space="preserve">{{ </w:t>
+        <w:t xml:space="preserve">Curator email: {{ </w:t>
       </w:r>
       <w:proofErr w:type="spellStart"/>
       <w:r>
         <w:rPr>
           <w:rFonts w:hint="eastAsia"/>
         </w:rPr>
-        <w:t>curator</w:t>
-      </w:r>
-      <w:proofErr w:type="gramEnd"/>
-      <w:r>
-        <w:rPr>
-          <w:rFonts w:hint="eastAsia"/>
-        </w:rPr>
-        <w:t>_info.</w:t>
+        <w:t>curator_info.</w:t>
       </w:r>
       <w:r>
         <w:t>curator_email</w:t>
@@ -179,7 +137,6 @@
         </w:rPr>
         <w:t xml:space="preserve">Dataset title: </w:t>
       </w:r>
-      <w:proofErr w:type="gramStart"/>
       <w:r>
         <w:rPr>
           <w:rFonts w:hint="eastAsia"/>
@@ -191,14 +148,7 @@
         <w:rPr>
           <w:rFonts w:hint="eastAsia"/>
         </w:rPr>
-        <w:t>dataset</w:t>
-      </w:r>
-      <w:proofErr w:type="gramEnd"/>
-      <w:r>
-        <w:rPr>
-          <w:rFonts w:hint="eastAsia"/>
-        </w:rPr>
-        <w:t>.</w:t>
+        <w:t>dataset.</w:t>
       </w:r>
       <w:r>
         <w:t>DatasetTitle</w:t>
@@ -237,14 +187,7 @@
         <w:rPr>
           <w:rFonts w:hint="eastAsia"/>
         </w:rPr>
-        <w:t xml:space="preserve">: </w:t>
-      </w:r>
-      <w:proofErr w:type="gramStart"/>
-      <w:r>
-        <w:rPr>
-          <w:rFonts w:hint="eastAsia"/>
-        </w:rPr>
-        <w:t>{</w:t>
+        <w:t>: {</w:t>
       </w:r>
       <w:r>
         <w:rPr>
@@ -263,14 +206,7 @@
         <w:rPr>
           <w:rFonts w:hint="eastAsia"/>
         </w:rPr>
-        <w:t>dataset</w:t>
-      </w:r>
-      <w:proofErr w:type="gramEnd"/>
-      <w:r>
-        <w:rPr>
-          <w:rFonts w:hint="eastAsia"/>
-        </w:rPr>
-        <w:t>.</w:t>
+        <w:t>dataset.</w:t>
       </w:r>
       <w:r>
         <w:t>DatasetPersistentId</w:t>
@@ -294,21 +230,7 @@
         <w:rPr>
           <w:rFonts w:hint="eastAsia"/>
         </w:rPr>
-        <w:t xml:space="preserve">Dataset ID (versioned): </w:t>
-      </w:r>
-      <w:proofErr w:type="gramStart"/>
-      <w:r>
-        <w:rPr>
-          <w:rFonts w:hint="eastAsia"/>
-        </w:rPr>
-        <w:t>{{ dataset.ID</w:t>
-      </w:r>
-      <w:proofErr w:type="gramEnd"/>
-      <w:r>
-        <w:rPr>
-          <w:rFonts w:hint="eastAsia"/>
-        </w:rPr>
-        <w:t xml:space="preserve">  }}</w:t>
+        <w:t>Dataset ID (versioned): {{ dataset.ID  }}</w:t>
       </w:r>
     </w:p>
     <w:p>
@@ -316,14 +238,7 @@
         <w:rPr>
           <w:rFonts w:hint="eastAsia"/>
         </w:rPr>
-        <w:t xml:space="preserve">Dataset access URL: </w:t>
-      </w:r>
-      <w:proofErr w:type="gramStart"/>
-      <w:r>
-        <w:rPr>
-          <w:rFonts w:hint="eastAsia"/>
-        </w:rPr>
-        <w:t>{</w:t>
+        <w:t>Dataset access URL: {</w:t>
       </w:r>
       <w:r>
         <w:rPr>
@@ -342,14 +257,7 @@
         <w:rPr>
           <w:rFonts w:hint="eastAsia"/>
         </w:rPr>
-        <w:t>dataset</w:t>
-      </w:r>
-      <w:proofErr w:type="gramEnd"/>
-      <w:r>
-        <w:rPr>
-          <w:rFonts w:hint="eastAsia"/>
-        </w:rPr>
-        <w:t>.</w:t>
+        <w:t>dataset.</w:t>
       </w:r>
       <w:r>
         <w:t>DatasetURL</w:t>
@@ -402,7 +310,6 @@
         </w:rPr>
         <w:t xml:space="preserve">date: </w:t>
       </w:r>
-      <w:proofErr w:type="gramStart"/>
       <w:r>
         <w:rPr>
           <w:rFonts w:hint="eastAsia"/>
@@ -427,7 +334,6 @@
         </w:rPr>
         <w:t>timestamp</w:t>
       </w:r>
-      <w:proofErr w:type="gramEnd"/>
       <w:r>
         <w:rPr>
           <w:rFonts w:hint="eastAsia"/>
@@ -1240,29 +1146,92 @@
               <w:rPr>
                 <w:lang w:val="en-US"/>
               </w:rPr>
-              <w:t>template_</w:t>
-            </w:r>
-            <w:proofErr w:type="gramStart"/>
-            <w:r>
-              <w:rPr>
-                <w:lang w:val="en-US"/>
-              </w:rPr>
-              <w:t>dict.</w:t>
+              <w:t>template_dict.</w:t>
             </w:r>
             <w:r>
               <w:rPr>
                 <w:rFonts w:hint="eastAsia"/>
                 <w:lang w:val="en-US"/>
               </w:rPr>
-              <w:t>dv</w:t>
-            </w:r>
-            <w:proofErr w:type="gramEnd"/>
+              <w:t>dv_record</w:t>
+            </w:r>
+            <w:r>
+              <w:rPr>
+                <w:lang w:val="en-US"/>
+              </w:rPr>
+              <w:t>.comments|length</w:t>
+            </w:r>
+            <w:proofErr w:type="spellEnd"/>
+            <w:r>
+              <w:rPr>
+                <w:lang w:val="en-US"/>
+              </w:rPr>
+              <w:t xml:space="preserve"> </w:t>
+            </w:r>
             <w:r>
               <w:rPr>
                 <w:rFonts w:hint="eastAsia"/>
                 <w:lang w:val="en-US"/>
               </w:rPr>
-              <w:t>_record</w:t>
+              <w:t>&gt;</w:t>
+            </w:r>
+            <w:r>
+              <w:rPr>
+                <w:lang w:val="en-US"/>
+              </w:rPr>
+              <w:t xml:space="preserve"> 0 %}X{% endif %}</w:t>
+            </w:r>
+          </w:p>
+          <w:p>
+            <w:pPr>
+              <w:rPr>
+                <w:lang w:val="en-US"/>
+              </w:rPr>
+            </w:pPr>
+          </w:p>
+        </w:tc>
+        <w:tc>
+          <w:tcPr>
+            <w:tcW w:w="0" w:type="auto"/>
+            <w:tcBorders>
+              <w:top w:val="single" w:sz="8" w:space="0" w:color="000000"/>
+              <w:left w:val="single" w:sz="8" w:space="0" w:color="000000"/>
+              <w:bottom w:val="single" w:sz="8" w:space="0" w:color="000000"/>
+              <w:right w:val="single" w:sz="8" w:space="0" w:color="000000"/>
+            </w:tcBorders>
+            <w:tcMar>
+              <w:top w:w="100" w:type="dxa"/>
+              <w:left w:w="100" w:type="dxa"/>
+              <w:bottom w:w="100" w:type="dxa"/>
+              <w:right w:w="100" w:type="dxa"/>
+            </w:tcMar>
+            <w:hideMark/>
+          </w:tcPr>
+          <w:p>
+            <w:pPr>
+              <w:rPr>
+                <w:lang w:val="en-US"/>
+              </w:rPr>
+            </w:pPr>
+            <w:r>
+              <w:rPr>
+                <w:lang w:val="en-US"/>
+              </w:rPr>
+              <w:t xml:space="preserve">{% if </w:t>
+            </w:r>
+            <w:proofErr w:type="spellStart"/>
+            <w:r>
+              <w:rPr>
+                <w:lang w:val="en-US"/>
+              </w:rPr>
+              <w:t>template_dict.</w:t>
+            </w:r>
+            <w:r>
+              <w:rPr>
+                <w:rFonts w:hint="eastAsia"/>
+                <w:lang w:val="en-US"/>
+              </w:rPr>
+              <w:t>dv_record</w:t>
             </w:r>
             <w:r>
               <w:rPr>
@@ -1282,7 +1251,7 @@
                 <w:rFonts w:hint="eastAsia"/>
                 <w:lang w:val="en-US"/>
               </w:rPr>
-              <w:t>&gt;</w:t>
+              <w:t>==</w:t>
             </w:r>
             <w:r>
               <w:rPr>
@@ -1322,308 +1291,195 @@
                 <w:lang w:val="en-US"/>
               </w:rPr>
             </w:pPr>
-            <w:r>
-              <w:rPr>
-                <w:lang w:val="en-US"/>
-              </w:rPr>
-              <w:t xml:space="preserve">{% if </w:t>
+          </w:p>
+        </w:tc>
+        <w:tc>
+          <w:tcPr>
+            <w:tcW w:w="0" w:type="auto"/>
+            <w:tcBorders>
+              <w:top w:val="single" w:sz="8" w:space="0" w:color="000000"/>
+              <w:left w:val="single" w:sz="8" w:space="0" w:color="000000"/>
+              <w:bottom w:val="single" w:sz="8" w:space="0" w:color="000000"/>
+              <w:right w:val="single" w:sz="8" w:space="0" w:color="000000"/>
+            </w:tcBorders>
+            <w:tcMar>
+              <w:top w:w="100" w:type="dxa"/>
+              <w:left w:w="100" w:type="dxa"/>
+              <w:bottom w:w="100" w:type="dxa"/>
+              <w:right w:w="100" w:type="dxa"/>
+            </w:tcMar>
+            <w:hideMark/>
+          </w:tcPr>
+          <w:p>
+            <w:pPr>
+              <w:rPr>
+                <w:lang w:val="en-US"/>
+              </w:rPr>
+            </w:pPr>
+          </w:p>
+        </w:tc>
+        <w:tc>
+          <w:tcPr>
+            <w:tcW w:w="0" w:type="auto"/>
+            <w:tcBorders>
+              <w:top w:val="single" w:sz="8" w:space="0" w:color="000000"/>
+              <w:left w:val="single" w:sz="8" w:space="0" w:color="000000"/>
+              <w:bottom w:val="single" w:sz="8" w:space="0" w:color="000000"/>
+              <w:right w:val="single" w:sz="8" w:space="0" w:color="000000"/>
+            </w:tcBorders>
+            <w:tcMar>
+              <w:top w:w="100" w:type="dxa"/>
+              <w:left w:w="100" w:type="dxa"/>
+              <w:bottom w:w="100" w:type="dxa"/>
+              <w:right w:w="100" w:type="dxa"/>
+            </w:tcMar>
+            <w:hideMark/>
+          </w:tcPr>
+          <w:p>
+            <w:pPr>
+              <w:rPr>
+                <w:lang w:val="en-US"/>
+              </w:rPr>
+            </w:pPr>
+          </w:p>
+        </w:tc>
+        <w:tc>
+          <w:tcPr>
+            <w:tcW w:w="0" w:type="auto"/>
+            <w:tcBorders>
+              <w:top w:val="single" w:sz="8" w:space="0" w:color="000000"/>
+              <w:left w:val="single" w:sz="8" w:space="0" w:color="000000"/>
+              <w:bottom w:val="single" w:sz="8" w:space="0" w:color="000000"/>
+              <w:right w:val="single" w:sz="8" w:space="0" w:color="000000"/>
+            </w:tcBorders>
+            <w:tcMar>
+              <w:top w:w="100" w:type="dxa"/>
+              <w:left w:w="100" w:type="dxa"/>
+              <w:bottom w:w="100" w:type="dxa"/>
+              <w:right w:w="100" w:type="dxa"/>
+            </w:tcMar>
+            <w:hideMark/>
+          </w:tcPr>
+          <w:p>
+            <w:pPr>
+              <w:rPr>
+                <w:lang w:val="en-US"/>
+              </w:rPr>
+            </w:pPr>
+            <w:r>
+              <w:rPr>
+                <w:lang w:val="en-US"/>
+              </w:rPr>
+              <w:t xml:space="preserve">If relevant, list previously created </w:t>
             </w:r>
             <w:proofErr w:type="spellStart"/>
             <w:r>
               <w:rPr>
                 <w:lang w:val="en-US"/>
               </w:rPr>
-              <w:t>template_</w:t>
-            </w:r>
-            <w:proofErr w:type="gramStart"/>
-            <w:r>
-              <w:rPr>
-                <w:lang w:val="en-US"/>
-              </w:rPr>
-              <w:t>dict.</w:t>
+              <w:t>dataverse</w:t>
+            </w:r>
+            <w:proofErr w:type="spellEnd"/>
+            <w:r>
+              <w:rPr>
+                <w:lang w:val="en-US"/>
+              </w:rPr>
+              <w:t>:</w:t>
+            </w:r>
+            <w:r>
+              <w:rPr>
+                <w:lang w:val="en-US"/>
+              </w:rPr>
+              <w:br/>
+            </w:r>
+            <w:r>
+              <w:t xml:space="preserve">{% for item in </w:t>
+            </w:r>
+            <w:proofErr w:type="spellStart"/>
+            <w:r>
+              <w:t>template_dict.dv_record.comments</w:t>
+            </w:r>
+            <w:proofErr w:type="spellEnd"/>
+            <w:r>
+              <w:t xml:space="preserve"> %} </w:t>
+            </w:r>
+          </w:p>
+          <w:p>
+            <w:r>
+              <w:t xml:space="preserve">{% for author, </w:t>
+            </w:r>
+            <w:proofErr w:type="spellStart"/>
+            <w:r>
+              <w:t>dataverses</w:t>
+            </w:r>
+            <w:proofErr w:type="spellEnd"/>
+            <w:r>
+              <w:t xml:space="preserve"> in </w:t>
+            </w:r>
+            <w:proofErr w:type="spellStart"/>
+            <w:r>
+              <w:t>item.items</w:t>
+            </w:r>
+            <w:proofErr w:type="spellEnd"/>
+            <w:r>
+              <w:t>() %} {{ author }}</w:t>
             </w:r>
             <w:r>
               <w:rPr>
                 <w:rFonts w:hint="eastAsia"/>
-                <w:lang w:val="en-US"/>
-              </w:rPr>
-              <w:t>dv</w:t>
-            </w:r>
-            <w:proofErr w:type="gramEnd"/>
+              </w:rPr>
+              <w:t>:</w:t>
+            </w:r>
+          </w:p>
+          <w:p>
+            <w:r>
+              <w:t xml:space="preserve">{% for dataverse in </w:t>
+            </w:r>
+            <w:proofErr w:type="spellStart"/>
+            <w:r>
+              <w:t>dataverses</w:t>
+            </w:r>
+            <w:proofErr w:type="spellEnd"/>
+            <w:r>
+              <w:t xml:space="preserve"> %} </w:t>
+            </w:r>
+            <w:r>
+              <w:t xml:space="preserve">{{ </w:t>
+            </w:r>
+            <w:proofErr w:type="spellStart"/>
+            <w:r>
+              <w:t>loop.index</w:t>
+            </w:r>
+            <w:proofErr w:type="spellEnd"/>
+            <w:r>
+              <w:t xml:space="preserve"> }}.</w:t>
+            </w:r>
             <w:r>
               <w:rPr>
                 <w:rFonts w:hint="eastAsia"/>
-                <w:lang w:val="en-US"/>
-              </w:rPr>
-              <w:t>_record</w:t>
-            </w:r>
-            <w:r>
-              <w:rPr>
-                <w:lang w:val="en-US"/>
-              </w:rPr>
-              <w:t>.comments|length</w:t>
+              </w:rPr>
+              <w:t xml:space="preserve"> </w:t>
+            </w:r>
+            <w:r>
+              <w:t>{{ dataverse }}</w:t>
+            </w:r>
+            <w:r>
+              <w:br/>
+            </w:r>
+            <w:r>
+              <w:t xml:space="preserve">{% </w:t>
+            </w:r>
+            <w:proofErr w:type="spellStart"/>
+            <w:r>
+              <w:t>endfor</w:t>
             </w:r>
             <w:proofErr w:type="spellEnd"/>
             <w:r>
-              <w:rPr>
-                <w:lang w:val="en-US"/>
-              </w:rPr>
-              <w:t xml:space="preserve"> </w:t>
-            </w:r>
-            <w:r>
-              <w:rPr>
-                <w:rFonts w:hint="eastAsia"/>
-                <w:lang w:val="en-US"/>
-              </w:rPr>
-              <w:t>==</w:t>
-            </w:r>
-            <w:r>
-              <w:rPr>
-                <w:lang w:val="en-US"/>
-              </w:rPr>
-              <w:t xml:space="preserve"> 0 %}X{% endif %}</w:t>
-            </w:r>
-          </w:p>
-          <w:p>
-            <w:pPr>
-              <w:rPr>
-                <w:lang w:val="en-US"/>
-              </w:rPr>
-            </w:pPr>
-          </w:p>
-        </w:tc>
-        <w:tc>
-          <w:tcPr>
-            <w:tcW w:w="0" w:type="auto"/>
-            <w:tcBorders>
-              <w:top w:val="single" w:sz="8" w:space="0" w:color="000000"/>
-              <w:left w:val="single" w:sz="8" w:space="0" w:color="000000"/>
-              <w:bottom w:val="single" w:sz="8" w:space="0" w:color="000000"/>
-              <w:right w:val="single" w:sz="8" w:space="0" w:color="000000"/>
-            </w:tcBorders>
-            <w:tcMar>
-              <w:top w:w="100" w:type="dxa"/>
-              <w:left w:w="100" w:type="dxa"/>
-              <w:bottom w:w="100" w:type="dxa"/>
-              <w:right w:w="100" w:type="dxa"/>
-            </w:tcMar>
-            <w:hideMark/>
-          </w:tcPr>
-          <w:p>
-            <w:pPr>
-              <w:rPr>
-                <w:lang w:val="en-US"/>
-              </w:rPr>
-            </w:pPr>
-          </w:p>
-        </w:tc>
-        <w:tc>
-          <w:tcPr>
-            <w:tcW w:w="0" w:type="auto"/>
-            <w:tcBorders>
-              <w:top w:val="single" w:sz="8" w:space="0" w:color="000000"/>
-              <w:left w:val="single" w:sz="8" w:space="0" w:color="000000"/>
-              <w:bottom w:val="single" w:sz="8" w:space="0" w:color="000000"/>
-              <w:right w:val="single" w:sz="8" w:space="0" w:color="000000"/>
-            </w:tcBorders>
-            <w:tcMar>
-              <w:top w:w="100" w:type="dxa"/>
-              <w:left w:w="100" w:type="dxa"/>
-              <w:bottom w:w="100" w:type="dxa"/>
-              <w:right w:w="100" w:type="dxa"/>
-            </w:tcMar>
-            <w:hideMark/>
-          </w:tcPr>
-          <w:p>
-            <w:pPr>
-              <w:rPr>
-                <w:lang w:val="en-US"/>
-              </w:rPr>
-            </w:pPr>
-          </w:p>
-        </w:tc>
-        <w:tc>
-          <w:tcPr>
-            <w:tcW w:w="0" w:type="auto"/>
-            <w:tcBorders>
-              <w:top w:val="single" w:sz="8" w:space="0" w:color="000000"/>
-              <w:left w:val="single" w:sz="8" w:space="0" w:color="000000"/>
-              <w:bottom w:val="single" w:sz="8" w:space="0" w:color="000000"/>
-              <w:right w:val="single" w:sz="8" w:space="0" w:color="000000"/>
-            </w:tcBorders>
-            <w:tcMar>
-              <w:top w:w="100" w:type="dxa"/>
-              <w:left w:w="100" w:type="dxa"/>
-              <w:bottom w:w="100" w:type="dxa"/>
-              <w:right w:w="100" w:type="dxa"/>
-            </w:tcMar>
-            <w:hideMark/>
-          </w:tcPr>
-          <w:p>
-            <w:pPr>
-              <w:rPr>
-                <w:lang w:val="en-US"/>
-              </w:rPr>
-            </w:pPr>
-          </w:p>
-        </w:tc>
-        <w:tc>
-          <w:tcPr>
-            <w:tcW w:w="0" w:type="auto"/>
-            <w:tcBorders>
-              <w:top w:val="single" w:sz="8" w:space="0" w:color="000000"/>
-              <w:left w:val="single" w:sz="8" w:space="0" w:color="000000"/>
-              <w:bottom w:val="single" w:sz="8" w:space="0" w:color="000000"/>
-              <w:right w:val="single" w:sz="8" w:space="0" w:color="000000"/>
-            </w:tcBorders>
-            <w:tcMar>
-              <w:top w:w="100" w:type="dxa"/>
-              <w:left w:w="100" w:type="dxa"/>
-              <w:bottom w:w="100" w:type="dxa"/>
-              <w:right w:w="100" w:type="dxa"/>
-            </w:tcMar>
-            <w:hideMark/>
-          </w:tcPr>
-          <w:p>
-            <w:pPr>
-              <w:rPr>
-                <w:lang w:val="en-US"/>
-              </w:rPr>
-            </w:pPr>
-            <w:r>
-              <w:rPr>
-                <w:lang w:val="en-US"/>
-              </w:rPr>
-              <w:t xml:space="preserve">If relevant, list previously created </w:t>
-            </w:r>
-            <w:proofErr w:type="spellStart"/>
-            <w:r>
-              <w:rPr>
-                <w:lang w:val="en-US"/>
-              </w:rPr>
-              <w:t>dataverse</w:t>
-            </w:r>
-            <w:proofErr w:type="spellEnd"/>
-            <w:r>
-              <w:rPr>
-                <w:lang w:val="en-US"/>
-              </w:rPr>
-              <w:t>:</w:t>
-            </w:r>
-          </w:p>
-          <w:p>
-            <w:r>
-              <w:t xml:space="preserve">{% for item in </w:t>
-            </w:r>
-            <w:proofErr w:type="spellStart"/>
-            <w:r>
-              <w:t>template_</w:t>
-            </w:r>
-            <w:proofErr w:type="gramStart"/>
-            <w:r>
-              <w:t>dict.dv</w:t>
-            </w:r>
-            <w:proofErr w:type="gramEnd"/>
-            <w:r>
-              <w:t>_record.comments</w:t>
-            </w:r>
-            <w:proofErr w:type="spellEnd"/>
-            <w:r>
               <w:t xml:space="preserve"> %} </w:t>
             </w:r>
-          </w:p>
-          <w:p>
-            <w:r>
-              <w:t xml:space="preserve">{% for author, </w:t>
-            </w:r>
-            <w:proofErr w:type="spellStart"/>
-            <w:r>
-              <w:t>dataverses</w:t>
-            </w:r>
-            <w:proofErr w:type="spellEnd"/>
-            <w:r>
-              <w:t xml:space="preserve"> in </w:t>
-            </w:r>
-            <w:proofErr w:type="spellStart"/>
-            <w:proofErr w:type="gramStart"/>
-            <w:r>
-              <w:t>item.items</w:t>
-            </w:r>
-            <w:proofErr w:type="spellEnd"/>
-            <w:proofErr w:type="gramEnd"/>
-            <w:r>
-              <w:t>() %} {{ author }}</w:t>
-            </w:r>
-            <w:r>
-              <w:rPr>
-                <w:rFonts w:hint="eastAsia"/>
-              </w:rPr>
-              <w:t>:</w:t>
-            </w:r>
-          </w:p>
-          <w:p>
-            <w:r>
-              <w:t xml:space="preserve">{% for dataverse in </w:t>
-            </w:r>
-            <w:proofErr w:type="spellStart"/>
-            <w:r>
-              <w:t>dataverses</w:t>
-            </w:r>
-            <w:proofErr w:type="spellEnd"/>
-            <w:r>
-              <w:t xml:space="preserve"> %} </w:t>
-            </w:r>
-            <w:proofErr w:type="gramStart"/>
-            <w:r>
-              <w:t xml:space="preserve">{{ </w:t>
-            </w:r>
-            <w:proofErr w:type="spellStart"/>
-            <w:r>
-              <w:t>loop</w:t>
-            </w:r>
-            <w:proofErr w:type="gramEnd"/>
-            <w:r>
-              <w:t>.index</w:t>
-            </w:r>
-            <w:proofErr w:type="spellEnd"/>
-            <w:r>
-              <w:t xml:space="preserve"> }}.</w:t>
-            </w:r>
-            <w:r>
-              <w:rPr>
-                <w:rFonts w:hint="eastAsia"/>
-              </w:rPr>
-              <w:t xml:space="preserve"> </w:t>
-            </w:r>
-            <w:proofErr w:type="gramStart"/>
-            <w:r>
-              <w:t>{{ dataverse</w:t>
-            </w:r>
-            <w:proofErr w:type="gramEnd"/>
-            <w:r>
-              <w:t xml:space="preserve"> }}</w:t>
-            </w:r>
             <w:r>
               <w:br/>
             </w:r>
-            <w:r>
-              <w:t xml:space="preserve">{% </w:t>
-            </w:r>
-            <w:proofErr w:type="spellStart"/>
-            <w:r>
-              <w:t>endfor</w:t>
-            </w:r>
-            <w:proofErr w:type="spellEnd"/>
-            <w:r>
-              <w:t xml:space="preserve"> %} </w:t>
-            </w:r>
-          </w:p>
-          <w:p>
-            <w:pPr>
-              <w:rPr>
-                <w:lang w:val="en-US"/>
-              </w:rPr>
-            </w:pPr>
             <w:r>
               <w:t xml:space="preserve">{% </w:t>
             </w:r>
@@ -2070,7 +1926,6 @@
                 <w:lang w:val="en-US"/>
               </w:rPr>
             </w:pPr>
-            <w:proofErr w:type="gramStart"/>
             <w:r>
               <w:rPr>
                 <w:rFonts w:hint="eastAsia"/>
@@ -2080,11 +1935,7 @@
             </w:r>
             <w:proofErr w:type="spellStart"/>
             <w:r>
-              <w:t>template</w:t>
-            </w:r>
-            <w:proofErr w:type="gramEnd"/>
-            <w:r>
-              <w:t>_dict</w:t>
+              <w:t>template_dict</w:t>
             </w:r>
             <w:proofErr w:type="spellEnd"/>
             <w:r>
@@ -2412,21 +2263,7 @@
               <w:rPr>
                 <w:lang w:val="en-US"/>
               </w:rPr>
-              <w:t xml:space="preserve">Confirm with the depositor that they </w:t>
-            </w:r>
-            <w:proofErr w:type="gramStart"/>
-            <w:r>
-              <w:rPr>
-                <w:lang w:val="en-US"/>
-              </w:rPr>
-              <w:t>actually require</w:t>
-            </w:r>
-            <w:proofErr w:type="gramEnd"/>
-            <w:r>
-              <w:rPr>
-                <w:lang w:val="en-US"/>
-              </w:rPr>
-              <w:t xml:space="preserve"> a </w:t>
+              <w:t xml:space="preserve">Confirm with the depositor that they actually require a </w:t>
             </w:r>
             <w:proofErr w:type="spellStart"/>
             <w:r>
@@ -3134,21 +2971,7 @@
               <w:rPr>
                 <w:lang w:val="en-US"/>
               </w:rPr>
-              <w:t>template_</w:t>
-            </w:r>
-            <w:proofErr w:type="gramStart"/>
-            <w:r>
-              <w:rPr>
-                <w:lang w:val="en-US"/>
-              </w:rPr>
-              <w:t>dict.file</w:t>
-            </w:r>
-            <w:proofErr w:type="gramEnd"/>
-            <w:r>
-              <w:rPr>
-                <w:lang w:val="en-US"/>
-              </w:rPr>
-              <w:t>_ext.comments|length</w:t>
+              <w:t>template_dict.file_ext.comments|length</w:t>
             </w:r>
             <w:proofErr w:type="spellEnd"/>
             <w:r>
@@ -3218,21 +3041,7 @@
               <w:rPr>
                 <w:lang w:val="en-US"/>
               </w:rPr>
-              <w:t>template_</w:t>
-            </w:r>
-            <w:proofErr w:type="gramStart"/>
-            <w:r>
-              <w:rPr>
-                <w:lang w:val="en-US"/>
-              </w:rPr>
-              <w:t>dict.file</w:t>
-            </w:r>
-            <w:proofErr w:type="gramEnd"/>
-            <w:r>
-              <w:rPr>
-                <w:lang w:val="en-US"/>
-              </w:rPr>
-              <w:t>_ext.comments|length</w:t>
+              <w:t>template_dict.file_ext.comments|length</w:t>
             </w:r>
             <w:proofErr w:type="spellEnd"/>
             <w:r>
@@ -3340,21 +3149,7 @@
               <w:rPr>
                 <w:lang w:val="en-US"/>
               </w:rPr>
-              <w:t>template_</w:t>
-            </w:r>
-            <w:proofErr w:type="gramStart"/>
-            <w:r>
-              <w:rPr>
-                <w:lang w:val="en-US"/>
-              </w:rPr>
-              <w:t>dict.file</w:t>
-            </w:r>
-            <w:proofErr w:type="gramEnd"/>
-            <w:r>
-              <w:rPr>
-                <w:lang w:val="en-US"/>
-              </w:rPr>
-              <w:t>_open.comments</w:t>
+              <w:t>template_dict.file_open.comments</w:t>
             </w:r>
             <w:proofErr w:type="spellEnd"/>
             <w:r>
@@ -3363,24 +3158,120 @@
               </w:rPr>
               <w:t xml:space="preserve"> %}</w:t>
             </w:r>
-            <w:r>
+          </w:p>
+          <w:p>
+            <w:pPr>
+              <w:pStyle w:val="ListParagraph"/>
+              <w:numPr>
+                <w:ilvl w:val="0"/>
+                <w:numId w:val="23"/>
+              </w:numPr>
+              <w:rPr>
+                <w:lang w:val="en-US"/>
+              </w:rPr>
+            </w:pPr>
+            <w:r>
+              <w:rPr>
+                <w:lang w:val="en-US"/>
+              </w:rPr>
               <w:t xml:space="preserve">{{ </w:t>
             </w:r>
             <w:proofErr w:type="spellStart"/>
             <w:r>
-              <w:t>loop.index</w:t>
+              <w:rPr>
+                <w:lang w:val="en-US"/>
+              </w:rPr>
+              <w:t>item.file_name</w:t>
             </w:r>
             <w:proofErr w:type="spellEnd"/>
             <w:r>
-              <w:t xml:space="preserve"> }}.</w:t>
-            </w:r>
-            <w:r>
+              <w:rPr>
+                <w:lang w:val="en-US"/>
+              </w:rPr>
+              <w:t xml:space="preserve"> }}</w:t>
+            </w:r>
+            <w:r>
+              <w:rPr>
+                <w:lang w:val="en-US"/>
+              </w:rPr>
+              <w:t xml:space="preserve">{% </w:t>
+            </w:r>
+            <w:proofErr w:type="spellStart"/>
+            <w:r>
+              <w:rPr>
+                <w:lang w:val="en-US"/>
+              </w:rPr>
+              <w:t>endfor</w:t>
+            </w:r>
+            <w:proofErr w:type="spellEnd"/>
+            <w:r>
+              <w:rPr>
+                <w:lang w:val="en-US"/>
+              </w:rPr>
+              <w:t xml:space="preserve"> %}</w:t>
+            </w:r>
+          </w:p>
+          <w:p>
+            <w:pPr>
+              <w:ind w:left="360"/>
               <w:rPr>
                 <w:rFonts w:hint="eastAsia"/>
-              </w:rPr>
-              <w:t xml:space="preserve"> </w:t>
-            </w:r>
-            <w:proofErr w:type="gramStart"/>
+                <w:lang w:val="en-US"/>
+              </w:rPr>
+            </w:pPr>
+          </w:p>
+          <w:p>
+            <w:pPr>
+              <w:rPr>
+                <w:lang w:val="en-US"/>
+              </w:rPr>
+            </w:pPr>
+            <w:r>
+              <w:rPr>
+                <w:lang w:val="en-US"/>
+              </w:rPr>
+              <w:t>List all files that were not checked:</w:t>
+            </w:r>
+          </w:p>
+          <w:p>
+            <w:pPr>
+              <w:rPr>
+                <w:lang w:val="en-US"/>
+              </w:rPr>
+            </w:pPr>
+            <w:r>
+              <w:rPr>
+                <w:lang w:val="en-US"/>
+              </w:rPr>
+              <w:t xml:space="preserve">{% for item in </w:t>
+            </w:r>
+            <w:proofErr w:type="spellStart"/>
+            <w:r>
+              <w:rPr>
+                <w:lang w:val="en-US"/>
+              </w:rPr>
+              <w:t>template_dict.file_open.not_checked</w:t>
+            </w:r>
+            <w:proofErr w:type="spellEnd"/>
+            <w:r>
+              <w:rPr>
+                <w:lang w:val="en-US"/>
+              </w:rPr>
+              <w:t xml:space="preserve"> %}</w:t>
+            </w:r>
+          </w:p>
+          <w:p>
+            <w:pPr>
+              <w:pStyle w:val="ListParagraph"/>
+              <w:numPr>
+                <w:ilvl w:val="0"/>
+                <w:numId w:val="24"/>
+              </w:numPr>
+              <w:rPr>
+                <w:rFonts w:hint="eastAsia"/>
+                <w:lang w:val="en-US"/>
+              </w:rPr>
+            </w:pPr>
             <w:r>
               <w:rPr>
                 <w:lang w:val="en-US"/>
@@ -3392,36 +3283,16 @@
               <w:rPr>
                 <w:lang w:val="en-US"/>
               </w:rPr>
-              <w:t>item</w:t>
-            </w:r>
-            <w:proofErr w:type="gramEnd"/>
-            <w:r>
-              <w:rPr>
-                <w:lang w:val="en-US"/>
-              </w:rPr>
-              <w:t>.file_name</w:t>
+              <w:t>item.file_name</w:t>
             </w:r>
             <w:proofErr w:type="spellEnd"/>
             <w:r>
               <w:rPr>
                 <w:lang w:val="en-US"/>
               </w:rPr>
-              <w:t xml:space="preserve"> }}</w:t>
-            </w:r>
-            <w:r>
-              <w:rPr>
-                <w:lang w:val="en-US"/>
-              </w:rPr>
-              <w:br/>
-            </w:r>
-            <w:r>
-              <w:rPr>
-                <w:lang w:val="en-US"/>
-              </w:rPr>
-              <w:t xml:space="preserve">{% </w:t>
+              <w:t xml:space="preserve"> }}{% </w:t>
             </w:r>
             <w:proofErr w:type="spellStart"/>
-            <w:proofErr w:type="gramStart"/>
             <w:r>
               <w:rPr>
                 <w:lang w:val="en-US"/>
@@ -3435,144 +3306,13 @@
               </w:rPr>
               <w:t xml:space="preserve"> %}</w:t>
             </w:r>
-            <w:proofErr w:type="gramEnd"/>
-          </w:p>
-          <w:p>
-            <w:pPr>
-              <w:rPr>
-                <w:lang w:val="en-US"/>
-              </w:rPr>
-            </w:pPr>
-          </w:p>
-          <w:p>
-            <w:pPr>
-              <w:rPr>
-                <w:lang w:val="en-US"/>
-              </w:rPr>
-            </w:pPr>
-            <w:proofErr w:type="gramStart"/>
-            <w:r>
-              <w:rPr>
-                <w:lang w:val="en-US"/>
-              </w:rPr>
-              <w:t>List</w:t>
-            </w:r>
-            <w:proofErr w:type="gramEnd"/>
-            <w:r>
-              <w:rPr>
-                <w:lang w:val="en-US"/>
-              </w:rPr>
-              <w:t xml:space="preserve"> all files that were not checked:</w:t>
-            </w:r>
-          </w:p>
-          <w:p>
-            <w:pPr>
-              <w:rPr>
-                <w:lang w:val="en-US"/>
-              </w:rPr>
-            </w:pPr>
-            <w:r>
-              <w:rPr>
-                <w:lang w:val="en-US"/>
-              </w:rPr>
-              <w:t xml:space="preserve">{% for item in </w:t>
-            </w:r>
-            <w:proofErr w:type="spellStart"/>
-            <w:r>
-              <w:rPr>
-                <w:lang w:val="en-US"/>
-              </w:rPr>
-              <w:t>template_dict.file_open.not_checked</w:t>
-            </w:r>
-            <w:proofErr w:type="spellEnd"/>
-            <w:r>
-              <w:rPr>
-                <w:lang w:val="en-US"/>
-              </w:rPr>
-              <w:t xml:space="preserve"> </w:t>
-            </w:r>
-            <w:proofErr w:type="gramStart"/>
-            <w:r>
-              <w:rPr>
-                <w:lang w:val="en-US"/>
-              </w:rPr>
-              <w:t>%}</w:t>
-            </w:r>
-            <w:r>
-              <w:t>{</w:t>
-            </w:r>
-            <w:proofErr w:type="gramEnd"/>
-            <w:r>
-              <w:t xml:space="preserve">{ </w:t>
-            </w:r>
-            <w:proofErr w:type="spellStart"/>
-            <w:r>
-              <w:t>loop.index</w:t>
-            </w:r>
-            <w:proofErr w:type="spellEnd"/>
-            <w:r>
-              <w:t xml:space="preserve"> }}.</w:t>
-            </w:r>
-            <w:r>
-              <w:rPr>
-                <w:rFonts w:hint="eastAsia"/>
-              </w:rPr>
-              <w:t xml:space="preserve"> </w:t>
-            </w:r>
-            <w:proofErr w:type="gramStart"/>
-            <w:r>
-              <w:rPr>
-                <w:lang w:val="en-US"/>
-              </w:rPr>
-              <w:t xml:space="preserve">{{ </w:t>
-            </w:r>
-            <w:proofErr w:type="spellStart"/>
-            <w:r>
-              <w:rPr>
-                <w:lang w:val="en-US"/>
-              </w:rPr>
-              <w:t>item</w:t>
-            </w:r>
-            <w:proofErr w:type="gramEnd"/>
-            <w:r>
-              <w:rPr>
-                <w:lang w:val="en-US"/>
-              </w:rPr>
-              <w:t>.file_name</w:t>
-            </w:r>
-            <w:proofErr w:type="spellEnd"/>
-            <w:r>
-              <w:rPr>
-                <w:lang w:val="en-US"/>
-              </w:rPr>
-              <w:t xml:space="preserve"> }}</w:t>
-            </w:r>
-            <w:r>
-              <w:rPr>
-                <w:lang w:val="en-US"/>
-              </w:rPr>
-              <w:br/>
-            </w:r>
-            <w:r>
-              <w:rPr>
-                <w:lang w:val="en-US"/>
-              </w:rPr>
-              <w:t xml:space="preserve">{% </w:t>
-            </w:r>
-            <w:proofErr w:type="spellStart"/>
-            <w:r>
-              <w:rPr>
-                <w:lang w:val="en-US"/>
-              </w:rPr>
-              <w:t>endfor</w:t>
-            </w:r>
-            <w:proofErr w:type="spellEnd"/>
-            <w:r>
-              <w:rPr>
-                <w:lang w:val="en-US"/>
-              </w:rPr>
-              <w:t xml:space="preserve"> %}</w:t>
-            </w:r>
+          </w:p>
+          <w:p>
+            <w:pPr>
+              <w:rPr>
+                <w:lang w:val="en-US"/>
+              </w:rPr>
+            </w:pPr>
           </w:p>
         </w:tc>
         <w:tc>
@@ -3785,21 +3525,7 @@
               <w:rPr>
                 <w:lang w:val="en-US"/>
               </w:rPr>
-              <w:t>template_</w:t>
-            </w:r>
-            <w:proofErr w:type="gramStart"/>
-            <w:r>
-              <w:rPr>
-                <w:lang w:val="en-US"/>
-              </w:rPr>
-              <w:t>dict.special</w:t>
-            </w:r>
-            <w:proofErr w:type="gramEnd"/>
-            <w:r>
-              <w:rPr>
-                <w:lang w:val="en-US"/>
-              </w:rPr>
-              <w:t>_characters.comments|length</w:t>
+              <w:t>template_dict.special_characters.comments|length</w:t>
             </w:r>
             <w:proofErr w:type="spellEnd"/>
             <w:r>
@@ -3869,21 +3595,7 @@
               <w:rPr>
                 <w:lang w:val="en-US"/>
               </w:rPr>
-              <w:t>template_</w:t>
-            </w:r>
-            <w:proofErr w:type="gramStart"/>
-            <w:r>
-              <w:rPr>
-                <w:lang w:val="en-US"/>
-              </w:rPr>
-              <w:t>dict.special</w:t>
-            </w:r>
-            <w:proofErr w:type="gramEnd"/>
-            <w:r>
-              <w:rPr>
-                <w:lang w:val="en-US"/>
-              </w:rPr>
-              <w:t>_characters.comments|length</w:t>
+              <w:t>template_dict.special_characters.comments|length</w:t>
             </w:r>
             <w:proofErr w:type="spellEnd"/>
             <w:r>
@@ -3964,6 +3676,7 @@
           <w:p>
             <w:pPr>
               <w:rPr>
+                <w:rFonts w:hint="eastAsia"/>
                 <w:lang w:val="en-US"/>
               </w:rPr>
             </w:pPr>
@@ -3991,21 +3704,7 @@
               <w:rPr>
                 <w:lang w:val="en-US"/>
               </w:rPr>
-              <w:t>template_</w:t>
-            </w:r>
-            <w:proofErr w:type="gramStart"/>
-            <w:r>
-              <w:rPr>
-                <w:lang w:val="en-US"/>
-              </w:rPr>
-              <w:t>dict.special</w:t>
-            </w:r>
-            <w:proofErr w:type="gramEnd"/>
-            <w:r>
-              <w:rPr>
-                <w:lang w:val="en-US"/>
-              </w:rPr>
-              <w:t>_characters.comments</w:t>
+              <w:t>template_dict.special_characters.comments</w:t>
             </w:r>
             <w:proofErr w:type="spellEnd"/>
             <w:r>
@@ -4014,62 +3713,37 @@
               </w:rPr>
               <w:t xml:space="preserve"> %}</w:t>
             </w:r>
-            <w:r>
+          </w:p>
+          <w:p>
+            <w:pPr>
+              <w:pStyle w:val="ListParagraph"/>
+              <w:numPr>
+                <w:ilvl w:val="0"/>
+                <w:numId w:val="25"/>
+              </w:numPr>
+              <w:rPr>
+                <w:lang w:val="en-US"/>
+              </w:rPr>
+            </w:pPr>
+            <w:r>
+              <w:rPr>
+                <w:lang w:val="en-US"/>
+              </w:rPr>
               <w:t xml:space="preserve">{{ </w:t>
             </w:r>
             <w:proofErr w:type="spellStart"/>
             <w:r>
-              <w:t>loop.index</w:t>
+              <w:rPr>
+                <w:lang w:val="en-US"/>
+              </w:rPr>
+              <w:t>item.file_name</w:t>
             </w:r>
             <w:proofErr w:type="spellEnd"/>
             <w:r>
-              <w:t xml:space="preserve"> }}.</w:t>
-            </w:r>
-            <w:r>
-              <w:rPr>
-                <w:rFonts w:hint="eastAsia"/>
-              </w:rPr>
-              <w:t xml:space="preserve"> </w:t>
-            </w:r>
-            <w:proofErr w:type="gramStart"/>
-            <w:r>
-              <w:rPr>
-                <w:lang w:val="en-US"/>
-              </w:rPr>
-              <w:t xml:space="preserve">{{ </w:t>
-            </w:r>
-            <w:proofErr w:type="spellStart"/>
-            <w:r>
-              <w:rPr>
-                <w:lang w:val="en-US"/>
-              </w:rPr>
-              <w:t>item</w:t>
-            </w:r>
-            <w:proofErr w:type="gramEnd"/>
-            <w:r>
-              <w:rPr>
-                <w:lang w:val="en-US"/>
-              </w:rPr>
-              <w:t>.file_name</w:t>
-            </w:r>
-            <w:proofErr w:type="spellEnd"/>
-            <w:r>
-              <w:rPr>
-                <w:lang w:val="en-US"/>
-              </w:rPr>
-              <w:t xml:space="preserve"> }}</w:t>
-            </w:r>
-            <w:r>
-              <w:rPr>
-                <w:lang w:val="en-US"/>
-              </w:rPr>
-              <w:br/>
-            </w:r>
-            <w:r>
-              <w:rPr>
-                <w:lang w:val="en-US"/>
-              </w:rPr>
-              <w:t xml:space="preserve">{% </w:t>
+              <w:rPr>
+                <w:lang w:val="en-US"/>
+              </w:rPr>
+              <w:t xml:space="preserve"> }}{% </w:t>
             </w:r>
             <w:proofErr w:type="spellStart"/>
             <w:r>
@@ -4282,21 +3956,7 @@
               <w:rPr>
                 <w:lang w:val="en-US"/>
               </w:rPr>
-              <w:t>template_</w:t>
-            </w:r>
-            <w:proofErr w:type="gramStart"/>
-            <w:r>
-              <w:rPr>
-                <w:lang w:val="en-US"/>
-              </w:rPr>
-              <w:t>dict.readme</w:t>
-            </w:r>
-            <w:proofErr w:type="gramEnd"/>
-            <w:r>
-              <w:rPr>
-                <w:lang w:val="en-US"/>
-              </w:rPr>
-              <w:t>_file.comments|length</w:t>
+              <w:t>template_dict.readme_file.comments|length</w:t>
             </w:r>
             <w:proofErr w:type="spellEnd"/>
             <w:r>
@@ -4379,21 +4039,7 @@
               <w:rPr>
                 <w:lang w:val="en-US"/>
               </w:rPr>
-              <w:t>template_</w:t>
-            </w:r>
-            <w:proofErr w:type="gramStart"/>
-            <w:r>
-              <w:rPr>
-                <w:lang w:val="en-US"/>
-              </w:rPr>
-              <w:t>dict.file</w:t>
-            </w:r>
-            <w:proofErr w:type="gramEnd"/>
-            <w:r>
-              <w:rPr>
-                <w:lang w:val="en-US"/>
-              </w:rPr>
-              <w:t>_ext.comments|length</w:t>
+              <w:t>template_dict.file_ext.comments|length</w:t>
             </w:r>
             <w:proofErr w:type="spellEnd"/>
             <w:r>
@@ -4501,21 +4147,7 @@
               <w:rPr>
                 <w:lang w:val="en-US"/>
               </w:rPr>
-              <w:t>template_</w:t>
-            </w:r>
-            <w:proofErr w:type="gramStart"/>
-            <w:r>
-              <w:rPr>
-                <w:lang w:val="en-US"/>
-              </w:rPr>
-              <w:t>dict.file</w:t>
-            </w:r>
-            <w:proofErr w:type="gramEnd"/>
-            <w:r>
-              <w:rPr>
-                <w:lang w:val="en-US"/>
-              </w:rPr>
-              <w:t>_ext.comments</w:t>
+              <w:t>template_dict.file_ext.comments</w:t>
             </w:r>
             <w:proofErr w:type="spellEnd"/>
             <w:r>
@@ -4524,62 +4156,37 @@
               </w:rPr>
               <w:t xml:space="preserve"> %}</w:t>
             </w:r>
-            <w:r>
+          </w:p>
+          <w:p>
+            <w:pPr>
+              <w:pStyle w:val="ListParagraph"/>
+              <w:numPr>
+                <w:ilvl w:val="0"/>
+                <w:numId w:val="26"/>
+              </w:numPr>
+              <w:rPr>
+                <w:lang w:val="en-US"/>
+              </w:rPr>
+            </w:pPr>
+            <w:r>
+              <w:rPr>
+                <w:lang w:val="en-US"/>
+              </w:rPr>
               <w:t xml:space="preserve">{{ </w:t>
             </w:r>
             <w:proofErr w:type="spellStart"/>
             <w:r>
-              <w:t>loop.index</w:t>
+              <w:rPr>
+                <w:lang w:val="en-US"/>
+              </w:rPr>
+              <w:t>item.file_name</w:t>
             </w:r>
             <w:proofErr w:type="spellEnd"/>
             <w:r>
-              <w:t xml:space="preserve"> }}.</w:t>
-            </w:r>
-            <w:r>
-              <w:rPr>
-                <w:rFonts w:hint="eastAsia"/>
-              </w:rPr>
-              <w:t xml:space="preserve"> </w:t>
-            </w:r>
-            <w:proofErr w:type="gramStart"/>
-            <w:r>
-              <w:rPr>
-                <w:lang w:val="en-US"/>
-              </w:rPr>
-              <w:t xml:space="preserve">{{ </w:t>
-            </w:r>
-            <w:proofErr w:type="spellStart"/>
-            <w:r>
-              <w:rPr>
-                <w:lang w:val="en-US"/>
-              </w:rPr>
-              <w:t>item</w:t>
-            </w:r>
-            <w:proofErr w:type="gramEnd"/>
-            <w:r>
-              <w:rPr>
-                <w:lang w:val="en-US"/>
-              </w:rPr>
-              <w:t>.file_name</w:t>
-            </w:r>
-            <w:proofErr w:type="spellEnd"/>
-            <w:r>
-              <w:rPr>
-                <w:lang w:val="en-US"/>
-              </w:rPr>
-              <w:t xml:space="preserve"> }}</w:t>
-            </w:r>
-            <w:r>
-              <w:rPr>
-                <w:lang w:val="en-US"/>
-              </w:rPr>
-              <w:br/>
-            </w:r>
-            <w:r>
-              <w:rPr>
-                <w:lang w:val="en-US"/>
-              </w:rPr>
-              <w:t xml:space="preserve">{% </w:t>
+              <w:rPr>
+                <w:lang w:val="en-US"/>
+              </w:rPr>
+              <w:t xml:space="preserve"> }}{% </w:t>
             </w:r>
             <w:proofErr w:type="spellStart"/>
             <w:r>
@@ -4723,37 +4330,47 @@
                 <w:bCs/>
                 <w:lang w:val="en-US"/>
               </w:rPr>
-              <w:t>Do all files appear on the common file format list?</w:t>
-            </w:r>
-          </w:p>
-        </w:tc>
-        <w:tc>
-          <w:tcPr>
-            <w:tcW w:w="0" w:type="auto"/>
-            <w:tcBorders>
-              <w:top w:val="single" w:sz="8" w:space="0" w:color="000000"/>
-              <w:left w:val="single" w:sz="8" w:space="0" w:color="000000"/>
-              <w:bottom w:val="single" w:sz="8" w:space="0" w:color="000000"/>
-              <w:right w:val="single" w:sz="8" w:space="0" w:color="000000"/>
-            </w:tcBorders>
-            <w:tcMar>
-              <w:top w:w="100" w:type="dxa"/>
-              <w:left w:w="100" w:type="dxa"/>
-              <w:bottom w:w="100" w:type="dxa"/>
-              <w:right w:w="100" w:type="dxa"/>
-            </w:tcMar>
-            <w:hideMark/>
-          </w:tcPr>
-          <w:p>
-            <w:pPr>
-              <w:rPr>
-                <w:lang w:val="en-US"/>
-              </w:rPr>
-            </w:pPr>
-            <w:r>
-              <w:rPr>
-                <w:lang w:val="en-US"/>
-              </w:rPr>
+              <w:t xml:space="preserve">Do all files appear on the common </w:t>
+            </w:r>
+            <w:r>
+              <w:rPr>
+                <w:b/>
+                <w:bCs/>
+                <w:lang w:val="en-US"/>
+              </w:rPr>
+              <w:lastRenderedPageBreak/>
+              <w:t>file format list?</w:t>
+            </w:r>
+          </w:p>
+        </w:tc>
+        <w:tc>
+          <w:tcPr>
+            <w:tcW w:w="0" w:type="auto"/>
+            <w:tcBorders>
+              <w:top w:val="single" w:sz="8" w:space="0" w:color="000000"/>
+              <w:left w:val="single" w:sz="8" w:space="0" w:color="000000"/>
+              <w:bottom w:val="single" w:sz="8" w:space="0" w:color="000000"/>
+              <w:right w:val="single" w:sz="8" w:space="0" w:color="000000"/>
+            </w:tcBorders>
+            <w:tcMar>
+              <w:top w:w="100" w:type="dxa"/>
+              <w:left w:w="100" w:type="dxa"/>
+              <w:bottom w:w="100" w:type="dxa"/>
+              <w:right w:w="100" w:type="dxa"/>
+            </w:tcMar>
+            <w:hideMark/>
+          </w:tcPr>
+          <w:p>
+            <w:pPr>
+              <w:rPr>
+                <w:lang w:val="en-US"/>
+              </w:rPr>
+            </w:pPr>
+            <w:r>
+              <w:rPr>
+                <w:lang w:val="en-US"/>
+              </w:rPr>
+              <w:lastRenderedPageBreak/>
               <w:t>Python scripted.</w:t>
             </w:r>
           </w:p>
@@ -5857,21 +5474,7 @@
               <w:rPr>
                 <w:lang w:val="en-US"/>
               </w:rPr>
-              <w:t>template_</w:t>
-            </w:r>
-            <w:proofErr w:type="gramStart"/>
-            <w:r>
-              <w:rPr>
-                <w:lang w:val="en-US"/>
-              </w:rPr>
-              <w:t>dict.readme</w:t>
-            </w:r>
-            <w:proofErr w:type="gramEnd"/>
-            <w:r>
-              <w:rPr>
-                <w:lang w:val="en-US"/>
-              </w:rPr>
-              <w:t>_file.comments|length</w:t>
+              <w:t>template_dict.readme_file.comments|length</w:t>
             </w:r>
             <w:proofErr w:type="spellEnd"/>
             <w:r>
@@ -5916,21 +5519,7 @@
               <w:rPr>
                 <w:lang w:val="en-US"/>
               </w:rPr>
-              <w:t>template_</w:t>
-            </w:r>
-            <w:proofErr w:type="gramStart"/>
-            <w:r>
-              <w:rPr>
-                <w:lang w:val="en-US"/>
-              </w:rPr>
-              <w:t>dict.readme</w:t>
-            </w:r>
-            <w:proofErr w:type="gramEnd"/>
-            <w:r>
-              <w:rPr>
-                <w:lang w:val="en-US"/>
-              </w:rPr>
-              <w:t>_file.comments|length</w:t>
+              <w:t>template_dict.readme_file.comments|length</w:t>
             </w:r>
             <w:proofErr w:type="spellEnd"/>
             <w:r>
@@ -6063,21 +5652,7 @@
               <w:rPr>
                 <w:lang w:val="en-US"/>
               </w:rPr>
-              <w:t>template_</w:t>
-            </w:r>
-            <w:proofErr w:type="gramStart"/>
-            <w:r>
-              <w:rPr>
-                <w:lang w:val="en-US"/>
-              </w:rPr>
-              <w:t>dict.readme</w:t>
-            </w:r>
-            <w:proofErr w:type="gramEnd"/>
-            <w:r>
-              <w:rPr>
-                <w:lang w:val="en-US"/>
-              </w:rPr>
-              <w:t>_file.comments</w:t>
+              <w:t>template_dict.readme_file.comments</w:t>
             </w:r>
             <w:proofErr w:type="spellEnd"/>
             <w:r>
@@ -6103,7 +5678,6 @@
               </w:rPr>
               <w:t xml:space="preserve"> </w:t>
             </w:r>
-            <w:proofErr w:type="gramStart"/>
             <w:r>
               <w:rPr>
                 <w:lang w:val="en-US"/>
@@ -6115,14 +5689,7 @@
               <w:rPr>
                 <w:lang w:val="en-US"/>
               </w:rPr>
-              <w:t>item</w:t>
-            </w:r>
-            <w:proofErr w:type="gramEnd"/>
-            <w:r>
-              <w:rPr>
-                <w:lang w:val="en-US"/>
-              </w:rPr>
-              <w:t>.file_name</w:t>
+              <w:t>item.file_name</w:t>
             </w:r>
             <w:proofErr w:type="spellEnd"/>
             <w:r>
@@ -6754,6 +6321,7 @@
               <w:rPr>
                 <w:lang w:val="en-US"/>
               </w:rPr>
+              <w:lastRenderedPageBreak/>
               <w:t>Description</w:t>
             </w:r>
           </w:p>
@@ -6945,11 +6513,6 @@
             </w:r>
           </w:p>
           <w:p>
-            <w:pPr>
-              <w:rPr>
-                <w:lang w:val="en-US"/>
-              </w:rPr>
-            </w:pPr>
             <w:r>
               <w:rPr>
                 <w:lang w:val="en-US"/>
@@ -6961,21 +6524,7 @@
               <w:rPr>
                 <w:lang w:val="en-US"/>
               </w:rPr>
-              <w:t>template_</w:t>
-            </w:r>
-            <w:proofErr w:type="gramStart"/>
-            <w:r>
-              <w:rPr>
-                <w:lang w:val="en-US"/>
-              </w:rPr>
-              <w:t>dict.typo</w:t>
-            </w:r>
-            <w:proofErr w:type="gramEnd"/>
-            <w:r>
-              <w:rPr>
-                <w:lang w:val="en-US"/>
-              </w:rPr>
-              <w:t>.comments</w:t>
+              <w:t>template_dict.typo.comments</w:t>
             </w:r>
             <w:proofErr w:type="spellEnd"/>
             <w:r>
@@ -6984,65 +6533,35 @@
               </w:rPr>
               <w:t xml:space="preserve"> %}</w:t>
             </w:r>
-            <w:r>
-              <w:t xml:space="preserve">{{ </w:t>
+          </w:p>
+          <w:p>
+            <w:pPr>
+              <w:pStyle w:val="ListParagraph"/>
+              <w:numPr>
+                <w:ilvl w:val="0"/>
+                <w:numId w:val="27"/>
+              </w:numPr>
+            </w:pPr>
+            <w:r>
+              <w:rPr>
+                <w:lang w:val="en-US"/>
+              </w:rPr>
+              <w:t xml:space="preserve">{{ item }}{% </w:t>
             </w:r>
             <w:proofErr w:type="spellStart"/>
             <w:r>
-              <w:t>loop.index</w:t>
+              <w:rPr>
+                <w:lang w:val="en-US"/>
+              </w:rPr>
+              <w:t>endfor</w:t>
             </w:r>
             <w:proofErr w:type="spellEnd"/>
             <w:r>
-              <w:t xml:space="preserve"> }}.</w:t>
-            </w:r>
-            <w:r>
-              <w:rPr>
-                <w:rFonts w:hint="eastAsia"/>
-              </w:rPr>
-              <w:t xml:space="preserve"> </w:t>
-            </w:r>
-            <w:proofErr w:type="gramStart"/>
-            <w:r>
-              <w:rPr>
-                <w:lang w:val="en-US"/>
-              </w:rPr>
-              <w:t>{{ item</w:t>
-            </w:r>
-            <w:proofErr w:type="gramEnd"/>
-            <w:r>
-              <w:rPr>
-                <w:lang w:val="en-US"/>
-              </w:rPr>
-              <w:t xml:space="preserve"> }}</w:t>
-            </w:r>
-            <w:r>
-              <w:rPr>
-                <w:lang w:val="en-US"/>
-              </w:rPr>
-              <w:br/>
-            </w:r>
-            <w:r>
-              <w:rPr>
-                <w:lang w:val="en-US"/>
-              </w:rPr>
-              <w:t xml:space="preserve">{% </w:t>
-            </w:r>
-            <w:proofErr w:type="spellStart"/>
-            <w:proofErr w:type="gramStart"/>
-            <w:r>
-              <w:rPr>
-                <w:lang w:val="en-US"/>
-              </w:rPr>
-              <w:t>endfor</w:t>
-            </w:r>
-            <w:proofErr w:type="spellEnd"/>
-            <w:r>
               <w:rPr>
                 <w:lang w:val="en-US"/>
               </w:rPr>
               <w:t xml:space="preserve"> %}</w:t>
             </w:r>
-            <w:proofErr w:type="gramEnd"/>
           </w:p>
           <w:p>
             <w:pPr>
@@ -7152,7 +6671,6 @@
                 <w:bCs/>
                 <w:lang w:val="en-US"/>
               </w:rPr>
-              <w:lastRenderedPageBreak/>
               <w:t>4.2</w:t>
             </w:r>
           </w:p>
@@ -8374,7 +7892,14 @@
               <w:rPr>
                 <w:lang w:val="en-US"/>
               </w:rPr>
-              <w:t>Review documentation and file names and see if there are any that should be opened and reviewed (e.g. if a file is named “participant survey”, etc.) </w:t>
+              <w:t xml:space="preserve">Review documentation and file names and see if there are any that should be opened and reviewed (e.g. if a file is named </w:t>
+            </w:r>
+            <w:r>
+              <w:rPr>
+                <w:lang w:val="en-US"/>
+              </w:rPr>
+              <w:lastRenderedPageBreak/>
+              <w:t>“participant survey”, etc.) </w:t>
             </w:r>
           </w:p>
           <w:p>
@@ -8391,7 +7916,6 @@
               <w:rPr>
                 <w:lang w:val="en-US"/>
               </w:rPr>
-              <w:lastRenderedPageBreak/>
               <w:t>Review description, notes, and terms of access metadata fields.</w:t>
             </w:r>
           </w:p>
@@ -9090,14 +8614,14 @@
               <w:rPr>
                 <w:lang w:val="en-US"/>
               </w:rPr>
-              <w:t>Check if the deposit includes restricted files (if yes, recomme</w:t>
+              <w:t xml:space="preserve">Check if the deposit includes restricted </w:t>
             </w:r>
             <w:r>
               <w:rPr>
                 <w:lang w:val="en-US"/>
               </w:rPr>
               <w:lastRenderedPageBreak/>
-              <w:t>nd they use custom terms)</w:t>
+              <w:t>files (if yes, recommend they use custom terms)</w:t>
             </w:r>
           </w:p>
         </w:tc>
@@ -9533,21 +9057,7 @@
               <w:rPr>
                 <w:lang w:val="en-US"/>
               </w:rPr>
-              <w:t xml:space="preserve">If there are restricted files and no Terms of Access, </w:t>
-            </w:r>
-            <w:proofErr w:type="gramStart"/>
-            <w:r>
-              <w:rPr>
-                <w:lang w:val="en-US"/>
-              </w:rPr>
-              <w:t>recommend</w:t>
-            </w:r>
-            <w:proofErr w:type="gramEnd"/>
-            <w:r>
-              <w:rPr>
-                <w:lang w:val="en-US"/>
-              </w:rPr>
-              <w:t xml:space="preserve"> including terms of access.</w:t>
+              <w:t>If there are restricted files and no Terms of Access, recommend including terms of access.</w:t>
             </w:r>
           </w:p>
         </w:tc>
@@ -9806,7 +9316,13 @@
         </w:tc>
       </w:tr>
     </w:tbl>
-    <w:p/>
+    <w:p>
+      <w:pPr>
+        <w:rPr>
+          <w:rFonts w:hint="eastAsia"/>
+        </w:rPr>
+      </w:pPr>
+    </w:p>
     <w:sectPr>
       <w:pgSz w:w="23811" w:h="16838" w:orient="landscape" w:code="8"/>
       <w:pgMar w:top="720" w:right="720" w:bottom="720" w:left="720" w:header="720" w:footer="720" w:gutter="0"/>
@@ -9969,9 +9485,98 @@
     </w:lvl>
   </w:abstractNum>
   <w:abstractNum w:abstractNumId="1" w15:restartNumberingAfterBreak="0">
+    <w:nsid w:val="077418B8"/>
+    <w:multiLevelType w:val="hybridMultilevel"/>
+    <w:tmpl w:val="36443B76"/>
+    <w:lvl w:ilvl="0" w:tplc="0409000F">
+      <w:start w:val="1"/>
+      <w:numFmt w:val="decimal"/>
+      <w:lvlText w:val="%1."/>
+      <w:lvlJc w:val="left"/>
+      <w:pPr>
+        <w:ind w:left="720" w:hanging="360"/>
+      </w:pPr>
+      <w:rPr>
+        <w:rFonts w:hint="default"/>
+      </w:rPr>
+    </w:lvl>
+    <w:lvl w:ilvl="1" w:tplc="04090019" w:tentative="1">
+      <w:start w:val="1"/>
+      <w:numFmt w:val="lowerLetter"/>
+      <w:lvlText w:val="%2."/>
+      <w:lvlJc w:val="left"/>
+      <w:pPr>
+        <w:ind w:left="1440" w:hanging="360"/>
+      </w:pPr>
+    </w:lvl>
+    <w:lvl w:ilvl="2" w:tplc="0409001B" w:tentative="1">
+      <w:start w:val="1"/>
+      <w:numFmt w:val="lowerRoman"/>
+      <w:lvlText w:val="%3."/>
+      <w:lvlJc w:val="right"/>
+      <w:pPr>
+        <w:ind w:left="2160" w:hanging="180"/>
+      </w:pPr>
+    </w:lvl>
+    <w:lvl w:ilvl="3" w:tplc="0409000F" w:tentative="1">
+      <w:start w:val="1"/>
+      <w:numFmt w:val="decimal"/>
+      <w:lvlText w:val="%4."/>
+      <w:lvlJc w:val="left"/>
+      <w:pPr>
+        <w:ind w:left="2880" w:hanging="360"/>
+      </w:pPr>
+    </w:lvl>
+    <w:lvl w:ilvl="4" w:tplc="04090019" w:tentative="1">
+      <w:start w:val="1"/>
+      <w:numFmt w:val="lowerLetter"/>
+      <w:lvlText w:val="%5."/>
+      <w:lvlJc w:val="left"/>
+      <w:pPr>
+        <w:ind w:left="3600" w:hanging="360"/>
+      </w:pPr>
+    </w:lvl>
+    <w:lvl w:ilvl="5" w:tplc="0409001B" w:tentative="1">
+      <w:start w:val="1"/>
+      <w:numFmt w:val="lowerRoman"/>
+      <w:lvlText w:val="%6."/>
+      <w:lvlJc w:val="right"/>
+      <w:pPr>
+        <w:ind w:left="4320" w:hanging="180"/>
+      </w:pPr>
+    </w:lvl>
+    <w:lvl w:ilvl="6" w:tplc="0409000F" w:tentative="1">
+      <w:start w:val="1"/>
+      <w:numFmt w:val="decimal"/>
+      <w:lvlText w:val="%7."/>
+      <w:lvlJc w:val="left"/>
+      <w:pPr>
+        <w:ind w:left="5040" w:hanging="360"/>
+      </w:pPr>
+    </w:lvl>
+    <w:lvl w:ilvl="7" w:tplc="04090019" w:tentative="1">
+      <w:start w:val="1"/>
+      <w:numFmt w:val="lowerLetter"/>
+      <w:lvlText w:val="%8."/>
+      <w:lvlJc w:val="left"/>
+      <w:pPr>
+        <w:ind w:left="5760" w:hanging="360"/>
+      </w:pPr>
+    </w:lvl>
+    <w:lvl w:ilvl="8" w:tplc="0409001B" w:tentative="1">
+      <w:start w:val="1"/>
+      <w:numFmt w:val="lowerRoman"/>
+      <w:lvlText w:val="%9."/>
+      <w:lvlJc w:val="right"/>
+      <w:pPr>
+        <w:ind w:left="6480" w:hanging="180"/>
+      </w:pPr>
+    </w:lvl>
+  </w:abstractNum>
+  <w:abstractNum w:abstractNumId="2" w15:restartNumberingAfterBreak="0">
     <w:nsid w:val="0C873FE0"/>
     <w:multiLevelType w:val="multilevel"/>
-    <w:tmpl w:val="6CB25C26"/>
+    <w:tmpl w:val="D7C8CDC0"/>
     <w:lvl w:ilvl="0">
       <w:start w:val="1"/>
       <w:numFmt w:val="bullet"/>
@@ -9988,6 +9593,552 @@
         <w:sz w:val="20"/>
       </w:rPr>
     </w:lvl>
+    <w:lvl w:ilvl="1">
+      <w:start w:val="1"/>
+      <w:numFmt w:val="decimal"/>
+      <w:lvlText w:val="%2."/>
+      <w:lvlJc w:val="left"/>
+      <w:pPr>
+        <w:ind w:left="1440" w:hanging="360"/>
+      </w:pPr>
+      <w:rPr>
+        <w:rFonts w:hint="default"/>
+      </w:rPr>
+    </w:lvl>
+    <w:lvl w:ilvl="2" w:tentative="1">
+      <w:start w:val="1"/>
+      <w:numFmt w:val="bullet"/>
+      <w:lvlText w:val=""/>
+      <w:lvlJc w:val="left"/>
+      <w:pPr>
+        <w:tabs>
+          <w:tab w:val="num" w:pos="2160"/>
+        </w:tabs>
+        <w:ind w:left="2160" w:hanging="360"/>
+      </w:pPr>
+      <w:rPr>
+        <w:rFonts w:ascii="Wingdings" w:hAnsi="Wingdings" w:hint="default"/>
+        <w:sz w:val="20"/>
+      </w:rPr>
+    </w:lvl>
+    <w:lvl w:ilvl="3" w:tentative="1">
+      <w:start w:val="1"/>
+      <w:numFmt w:val="bullet"/>
+      <w:lvlText w:val=""/>
+      <w:lvlJc w:val="left"/>
+      <w:pPr>
+        <w:tabs>
+          <w:tab w:val="num" w:pos="2880"/>
+        </w:tabs>
+        <w:ind w:left="2880" w:hanging="360"/>
+      </w:pPr>
+      <w:rPr>
+        <w:rFonts w:ascii="Wingdings" w:hAnsi="Wingdings" w:hint="default"/>
+        <w:sz w:val="20"/>
+      </w:rPr>
+    </w:lvl>
+    <w:lvl w:ilvl="4" w:tentative="1">
+      <w:start w:val="1"/>
+      <w:numFmt w:val="bullet"/>
+      <w:lvlText w:val=""/>
+      <w:lvlJc w:val="left"/>
+      <w:pPr>
+        <w:tabs>
+          <w:tab w:val="num" w:pos="3600"/>
+        </w:tabs>
+        <w:ind w:left="3600" w:hanging="360"/>
+      </w:pPr>
+      <w:rPr>
+        <w:rFonts w:ascii="Wingdings" w:hAnsi="Wingdings" w:hint="default"/>
+        <w:sz w:val="20"/>
+      </w:rPr>
+    </w:lvl>
+    <w:lvl w:ilvl="5" w:tentative="1">
+      <w:start w:val="1"/>
+      <w:numFmt w:val="bullet"/>
+      <w:lvlText w:val=""/>
+      <w:lvlJc w:val="left"/>
+      <w:pPr>
+        <w:tabs>
+          <w:tab w:val="num" w:pos="4320"/>
+        </w:tabs>
+        <w:ind w:left="4320" w:hanging="360"/>
+      </w:pPr>
+      <w:rPr>
+        <w:rFonts w:ascii="Wingdings" w:hAnsi="Wingdings" w:hint="default"/>
+        <w:sz w:val="20"/>
+      </w:rPr>
+    </w:lvl>
+    <w:lvl w:ilvl="6" w:tentative="1">
+      <w:start w:val="1"/>
+      <w:numFmt w:val="bullet"/>
+      <w:lvlText w:val=""/>
+      <w:lvlJc w:val="left"/>
+      <w:pPr>
+        <w:tabs>
+          <w:tab w:val="num" w:pos="5040"/>
+        </w:tabs>
+        <w:ind w:left="5040" w:hanging="360"/>
+      </w:pPr>
+      <w:rPr>
+        <w:rFonts w:ascii="Wingdings" w:hAnsi="Wingdings" w:hint="default"/>
+        <w:sz w:val="20"/>
+      </w:rPr>
+    </w:lvl>
+    <w:lvl w:ilvl="7" w:tentative="1">
+      <w:start w:val="1"/>
+      <w:numFmt w:val="bullet"/>
+      <w:lvlText w:val=""/>
+      <w:lvlJc w:val="left"/>
+      <w:pPr>
+        <w:tabs>
+          <w:tab w:val="num" w:pos="5760"/>
+        </w:tabs>
+        <w:ind w:left="5760" w:hanging="360"/>
+      </w:pPr>
+      <w:rPr>
+        <w:rFonts w:ascii="Wingdings" w:hAnsi="Wingdings" w:hint="default"/>
+        <w:sz w:val="20"/>
+      </w:rPr>
+    </w:lvl>
+    <w:lvl w:ilvl="8" w:tentative="1">
+      <w:start w:val="1"/>
+      <w:numFmt w:val="bullet"/>
+      <w:lvlText w:val=""/>
+      <w:lvlJc w:val="left"/>
+      <w:pPr>
+        <w:tabs>
+          <w:tab w:val="num" w:pos="6480"/>
+        </w:tabs>
+        <w:ind w:left="6480" w:hanging="360"/>
+      </w:pPr>
+      <w:rPr>
+        <w:rFonts w:ascii="Wingdings" w:hAnsi="Wingdings" w:hint="default"/>
+        <w:sz w:val="20"/>
+      </w:rPr>
+    </w:lvl>
+  </w:abstractNum>
+  <w:abstractNum w:abstractNumId="3" w15:restartNumberingAfterBreak="0">
+    <w:nsid w:val="0D0F3C3D"/>
+    <w:multiLevelType w:val="multilevel"/>
+    <w:tmpl w:val="3D820090"/>
+    <w:lvl w:ilvl="0">
+      <w:start w:val="1"/>
+      <w:numFmt w:val="decimal"/>
+      <w:lvlText w:val="%1."/>
+      <w:lvlJc w:val="left"/>
+      <w:pPr>
+        <w:tabs>
+          <w:tab w:val="num" w:pos="720"/>
+        </w:tabs>
+        <w:ind w:left="720" w:hanging="360"/>
+      </w:pPr>
+    </w:lvl>
+    <w:lvl w:ilvl="1" w:tentative="1">
+      <w:start w:val="1"/>
+      <w:numFmt w:val="decimal"/>
+      <w:lvlText w:val="%2."/>
+      <w:lvlJc w:val="left"/>
+      <w:pPr>
+        <w:tabs>
+          <w:tab w:val="num" w:pos="1440"/>
+        </w:tabs>
+        <w:ind w:left="1440" w:hanging="360"/>
+      </w:pPr>
+    </w:lvl>
+    <w:lvl w:ilvl="2" w:tentative="1">
+      <w:start w:val="1"/>
+      <w:numFmt w:val="decimal"/>
+      <w:lvlText w:val="%3."/>
+      <w:lvlJc w:val="left"/>
+      <w:pPr>
+        <w:tabs>
+          <w:tab w:val="num" w:pos="2160"/>
+        </w:tabs>
+        <w:ind w:left="2160" w:hanging="360"/>
+      </w:pPr>
+    </w:lvl>
+    <w:lvl w:ilvl="3" w:tentative="1">
+      <w:start w:val="1"/>
+      <w:numFmt w:val="decimal"/>
+      <w:lvlText w:val="%4."/>
+      <w:lvlJc w:val="left"/>
+      <w:pPr>
+        <w:tabs>
+          <w:tab w:val="num" w:pos="2880"/>
+        </w:tabs>
+        <w:ind w:left="2880" w:hanging="360"/>
+      </w:pPr>
+    </w:lvl>
+    <w:lvl w:ilvl="4" w:tentative="1">
+      <w:start w:val="1"/>
+      <w:numFmt w:val="decimal"/>
+      <w:lvlText w:val="%5."/>
+      <w:lvlJc w:val="left"/>
+      <w:pPr>
+        <w:tabs>
+          <w:tab w:val="num" w:pos="3600"/>
+        </w:tabs>
+        <w:ind w:left="3600" w:hanging="360"/>
+      </w:pPr>
+    </w:lvl>
+    <w:lvl w:ilvl="5" w:tentative="1">
+      <w:start w:val="1"/>
+      <w:numFmt w:val="decimal"/>
+      <w:lvlText w:val="%6."/>
+      <w:lvlJc w:val="left"/>
+      <w:pPr>
+        <w:tabs>
+          <w:tab w:val="num" w:pos="4320"/>
+        </w:tabs>
+        <w:ind w:left="4320" w:hanging="360"/>
+      </w:pPr>
+    </w:lvl>
+    <w:lvl w:ilvl="6" w:tentative="1">
+      <w:start w:val="1"/>
+      <w:numFmt w:val="decimal"/>
+      <w:lvlText w:val="%7."/>
+      <w:lvlJc w:val="left"/>
+      <w:pPr>
+        <w:tabs>
+          <w:tab w:val="num" w:pos="5040"/>
+        </w:tabs>
+        <w:ind w:left="5040" w:hanging="360"/>
+      </w:pPr>
+    </w:lvl>
+    <w:lvl w:ilvl="7" w:tentative="1">
+      <w:start w:val="1"/>
+      <w:numFmt w:val="decimal"/>
+      <w:lvlText w:val="%8."/>
+      <w:lvlJc w:val="left"/>
+      <w:pPr>
+        <w:tabs>
+          <w:tab w:val="num" w:pos="5760"/>
+        </w:tabs>
+        <w:ind w:left="5760" w:hanging="360"/>
+      </w:pPr>
+    </w:lvl>
+    <w:lvl w:ilvl="8" w:tentative="1">
+      <w:start w:val="1"/>
+      <w:numFmt w:val="decimal"/>
+      <w:lvlText w:val="%9."/>
+      <w:lvlJc w:val="left"/>
+      <w:pPr>
+        <w:tabs>
+          <w:tab w:val="num" w:pos="6480"/>
+        </w:tabs>
+        <w:ind w:left="6480" w:hanging="360"/>
+      </w:pPr>
+    </w:lvl>
+  </w:abstractNum>
+  <w:abstractNum w:abstractNumId="4" w15:restartNumberingAfterBreak="0">
+    <w:nsid w:val="0F0200C6"/>
+    <w:multiLevelType w:val="multilevel"/>
+    <w:tmpl w:val="B4EA1CA8"/>
+    <w:lvl w:ilvl="0">
+      <w:start w:val="1"/>
+      <w:numFmt w:val="decimal"/>
+      <w:lvlText w:val="%1."/>
+      <w:lvlJc w:val="left"/>
+      <w:pPr>
+        <w:tabs>
+          <w:tab w:val="num" w:pos="720"/>
+        </w:tabs>
+        <w:ind w:left="720" w:hanging="360"/>
+      </w:pPr>
+    </w:lvl>
+    <w:lvl w:ilvl="1" w:tentative="1">
+      <w:start w:val="1"/>
+      <w:numFmt w:val="decimal"/>
+      <w:lvlText w:val="%2."/>
+      <w:lvlJc w:val="left"/>
+      <w:pPr>
+        <w:tabs>
+          <w:tab w:val="num" w:pos="1440"/>
+        </w:tabs>
+        <w:ind w:left="1440" w:hanging="360"/>
+      </w:pPr>
+    </w:lvl>
+    <w:lvl w:ilvl="2" w:tentative="1">
+      <w:start w:val="1"/>
+      <w:numFmt w:val="decimal"/>
+      <w:lvlText w:val="%3."/>
+      <w:lvlJc w:val="left"/>
+      <w:pPr>
+        <w:tabs>
+          <w:tab w:val="num" w:pos="2160"/>
+        </w:tabs>
+        <w:ind w:left="2160" w:hanging="360"/>
+      </w:pPr>
+    </w:lvl>
+    <w:lvl w:ilvl="3" w:tentative="1">
+      <w:start w:val="1"/>
+      <w:numFmt w:val="decimal"/>
+      <w:lvlText w:val="%4."/>
+      <w:lvlJc w:val="left"/>
+      <w:pPr>
+        <w:tabs>
+          <w:tab w:val="num" w:pos="2880"/>
+        </w:tabs>
+        <w:ind w:left="2880" w:hanging="360"/>
+      </w:pPr>
+    </w:lvl>
+    <w:lvl w:ilvl="4" w:tentative="1">
+      <w:start w:val="1"/>
+      <w:numFmt w:val="decimal"/>
+      <w:lvlText w:val="%5."/>
+      <w:lvlJc w:val="left"/>
+      <w:pPr>
+        <w:tabs>
+          <w:tab w:val="num" w:pos="3600"/>
+        </w:tabs>
+        <w:ind w:left="3600" w:hanging="360"/>
+      </w:pPr>
+    </w:lvl>
+    <w:lvl w:ilvl="5" w:tentative="1">
+      <w:start w:val="1"/>
+      <w:numFmt w:val="decimal"/>
+      <w:lvlText w:val="%6."/>
+      <w:lvlJc w:val="left"/>
+      <w:pPr>
+        <w:tabs>
+          <w:tab w:val="num" w:pos="4320"/>
+        </w:tabs>
+        <w:ind w:left="4320" w:hanging="360"/>
+      </w:pPr>
+    </w:lvl>
+    <w:lvl w:ilvl="6" w:tentative="1">
+      <w:start w:val="1"/>
+      <w:numFmt w:val="decimal"/>
+      <w:lvlText w:val="%7."/>
+      <w:lvlJc w:val="left"/>
+      <w:pPr>
+        <w:tabs>
+          <w:tab w:val="num" w:pos="5040"/>
+        </w:tabs>
+        <w:ind w:left="5040" w:hanging="360"/>
+      </w:pPr>
+    </w:lvl>
+    <w:lvl w:ilvl="7" w:tentative="1">
+      <w:start w:val="1"/>
+      <w:numFmt w:val="decimal"/>
+      <w:lvlText w:val="%8."/>
+      <w:lvlJc w:val="left"/>
+      <w:pPr>
+        <w:tabs>
+          <w:tab w:val="num" w:pos="5760"/>
+        </w:tabs>
+        <w:ind w:left="5760" w:hanging="360"/>
+      </w:pPr>
+    </w:lvl>
+    <w:lvl w:ilvl="8" w:tentative="1">
+      <w:start w:val="1"/>
+      <w:numFmt w:val="decimal"/>
+      <w:lvlText w:val="%9."/>
+      <w:lvlJc w:val="left"/>
+      <w:pPr>
+        <w:tabs>
+          <w:tab w:val="num" w:pos="6480"/>
+        </w:tabs>
+        <w:ind w:left="6480" w:hanging="360"/>
+      </w:pPr>
+    </w:lvl>
+  </w:abstractNum>
+  <w:abstractNum w:abstractNumId="5" w15:restartNumberingAfterBreak="0">
+    <w:nsid w:val="10735190"/>
+    <w:multiLevelType w:val="hybridMultilevel"/>
+    <w:tmpl w:val="D42AF0FA"/>
+    <w:lvl w:ilvl="0" w:tplc="0409000F">
+      <w:start w:val="1"/>
+      <w:numFmt w:val="decimal"/>
+      <w:lvlText w:val="%1."/>
+      <w:lvlJc w:val="left"/>
+      <w:pPr>
+        <w:ind w:left="720" w:hanging="360"/>
+      </w:pPr>
+      <w:rPr>
+        <w:rFonts w:hint="default"/>
+      </w:rPr>
+    </w:lvl>
+    <w:lvl w:ilvl="1" w:tplc="04090019" w:tentative="1">
+      <w:start w:val="1"/>
+      <w:numFmt w:val="lowerLetter"/>
+      <w:lvlText w:val="%2."/>
+      <w:lvlJc w:val="left"/>
+      <w:pPr>
+        <w:ind w:left="1440" w:hanging="360"/>
+      </w:pPr>
+    </w:lvl>
+    <w:lvl w:ilvl="2" w:tplc="0409001B" w:tentative="1">
+      <w:start w:val="1"/>
+      <w:numFmt w:val="lowerRoman"/>
+      <w:lvlText w:val="%3."/>
+      <w:lvlJc w:val="right"/>
+      <w:pPr>
+        <w:ind w:left="2160" w:hanging="180"/>
+      </w:pPr>
+    </w:lvl>
+    <w:lvl w:ilvl="3" w:tplc="0409000F" w:tentative="1">
+      <w:start w:val="1"/>
+      <w:numFmt w:val="decimal"/>
+      <w:lvlText w:val="%4."/>
+      <w:lvlJc w:val="left"/>
+      <w:pPr>
+        <w:ind w:left="2880" w:hanging="360"/>
+      </w:pPr>
+    </w:lvl>
+    <w:lvl w:ilvl="4" w:tplc="04090019" w:tentative="1">
+      <w:start w:val="1"/>
+      <w:numFmt w:val="lowerLetter"/>
+      <w:lvlText w:val="%5."/>
+      <w:lvlJc w:val="left"/>
+      <w:pPr>
+        <w:ind w:left="3600" w:hanging="360"/>
+      </w:pPr>
+    </w:lvl>
+    <w:lvl w:ilvl="5" w:tplc="0409001B" w:tentative="1">
+      <w:start w:val="1"/>
+      <w:numFmt w:val="lowerRoman"/>
+      <w:lvlText w:val="%6."/>
+      <w:lvlJc w:val="right"/>
+      <w:pPr>
+        <w:ind w:left="4320" w:hanging="180"/>
+      </w:pPr>
+    </w:lvl>
+    <w:lvl w:ilvl="6" w:tplc="0409000F" w:tentative="1">
+      <w:start w:val="1"/>
+      <w:numFmt w:val="decimal"/>
+      <w:lvlText w:val="%7."/>
+      <w:lvlJc w:val="left"/>
+      <w:pPr>
+        <w:ind w:left="5040" w:hanging="360"/>
+      </w:pPr>
+    </w:lvl>
+    <w:lvl w:ilvl="7" w:tplc="04090019" w:tentative="1">
+      <w:start w:val="1"/>
+      <w:numFmt w:val="lowerLetter"/>
+      <w:lvlText w:val="%8."/>
+      <w:lvlJc w:val="left"/>
+      <w:pPr>
+        <w:ind w:left="5760" w:hanging="360"/>
+      </w:pPr>
+    </w:lvl>
+    <w:lvl w:ilvl="8" w:tplc="0409001B" w:tentative="1">
+      <w:start w:val="1"/>
+      <w:numFmt w:val="lowerRoman"/>
+      <w:lvlText w:val="%9."/>
+      <w:lvlJc w:val="right"/>
+      <w:pPr>
+        <w:ind w:left="6480" w:hanging="180"/>
+      </w:pPr>
+    </w:lvl>
+  </w:abstractNum>
+  <w:abstractNum w:abstractNumId="6" w15:restartNumberingAfterBreak="0">
+    <w:nsid w:val="10D74393"/>
+    <w:multiLevelType w:val="hybridMultilevel"/>
+    <w:tmpl w:val="646E37D8"/>
+    <w:lvl w:ilvl="0" w:tplc="0409000F">
+      <w:start w:val="1"/>
+      <w:numFmt w:val="decimal"/>
+      <w:lvlText w:val="%1."/>
+      <w:lvlJc w:val="left"/>
+      <w:pPr>
+        <w:ind w:left="720" w:hanging="360"/>
+      </w:pPr>
+    </w:lvl>
+    <w:lvl w:ilvl="1" w:tplc="04090019" w:tentative="1">
+      <w:start w:val="1"/>
+      <w:numFmt w:val="lowerLetter"/>
+      <w:lvlText w:val="%2."/>
+      <w:lvlJc w:val="left"/>
+      <w:pPr>
+        <w:ind w:left="1440" w:hanging="360"/>
+      </w:pPr>
+    </w:lvl>
+    <w:lvl w:ilvl="2" w:tplc="0409001B" w:tentative="1">
+      <w:start w:val="1"/>
+      <w:numFmt w:val="lowerRoman"/>
+      <w:lvlText w:val="%3."/>
+      <w:lvlJc w:val="right"/>
+      <w:pPr>
+        <w:ind w:left="2160" w:hanging="180"/>
+      </w:pPr>
+    </w:lvl>
+    <w:lvl w:ilvl="3" w:tplc="0409000F" w:tentative="1">
+      <w:start w:val="1"/>
+      <w:numFmt w:val="decimal"/>
+      <w:lvlText w:val="%4."/>
+      <w:lvlJc w:val="left"/>
+      <w:pPr>
+        <w:ind w:left="2880" w:hanging="360"/>
+      </w:pPr>
+    </w:lvl>
+    <w:lvl w:ilvl="4" w:tplc="04090019" w:tentative="1">
+      <w:start w:val="1"/>
+      <w:numFmt w:val="lowerLetter"/>
+      <w:lvlText w:val="%5."/>
+      <w:lvlJc w:val="left"/>
+      <w:pPr>
+        <w:ind w:left="3600" w:hanging="360"/>
+      </w:pPr>
+    </w:lvl>
+    <w:lvl w:ilvl="5" w:tplc="0409001B" w:tentative="1">
+      <w:start w:val="1"/>
+      <w:numFmt w:val="lowerRoman"/>
+      <w:lvlText w:val="%6."/>
+      <w:lvlJc w:val="right"/>
+      <w:pPr>
+        <w:ind w:left="4320" w:hanging="180"/>
+      </w:pPr>
+    </w:lvl>
+    <w:lvl w:ilvl="6" w:tplc="0409000F" w:tentative="1">
+      <w:start w:val="1"/>
+      <w:numFmt w:val="decimal"/>
+      <w:lvlText w:val="%7."/>
+      <w:lvlJc w:val="left"/>
+      <w:pPr>
+        <w:ind w:left="5040" w:hanging="360"/>
+      </w:pPr>
+    </w:lvl>
+    <w:lvl w:ilvl="7" w:tplc="04090019" w:tentative="1">
+      <w:start w:val="1"/>
+      <w:numFmt w:val="lowerLetter"/>
+      <w:lvlText w:val="%8."/>
+      <w:lvlJc w:val="left"/>
+      <w:pPr>
+        <w:ind w:left="5760" w:hanging="360"/>
+      </w:pPr>
+    </w:lvl>
+    <w:lvl w:ilvl="8" w:tplc="0409001B" w:tentative="1">
+      <w:start w:val="1"/>
+      <w:numFmt w:val="lowerRoman"/>
+      <w:lvlText w:val="%9."/>
+      <w:lvlJc w:val="right"/>
+      <w:pPr>
+        <w:ind w:left="6480" w:hanging="180"/>
+      </w:pPr>
+    </w:lvl>
+  </w:abstractNum>
+  <w:abstractNum w:abstractNumId="7" w15:restartNumberingAfterBreak="0">
+    <w:nsid w:val="11A52C9B"/>
+    <w:multiLevelType w:val="multilevel"/>
+    <w:tmpl w:val="D0944634"/>
+    <w:lvl w:ilvl="0">
+      <w:start w:val="1"/>
+      <w:numFmt w:val="bullet"/>
+      <w:lvlText w:val=""/>
+      <w:lvlJc w:val="left"/>
+      <w:pPr>
+        <w:tabs>
+          <w:tab w:val="num" w:pos="720"/>
+        </w:tabs>
+        <w:ind w:left="720" w:hanging="360"/>
+      </w:pPr>
+      <w:rPr>
+        <w:rFonts w:ascii="Symbol" w:hAnsi="Symbol" w:hint="default"/>
+        <w:sz w:val="20"/>
+      </w:rPr>
+    </w:lvl>
     <w:lvl w:ilvl="1" w:tentative="1">
       <w:start w:val="1"/>
       <w:numFmt w:val="bullet"/>
@@ -10117,10 +10268,10 @@
       </w:rPr>
     </w:lvl>
   </w:abstractNum>
-  <w:abstractNum w:abstractNumId="2" w15:restartNumberingAfterBreak="0">
-    <w:nsid w:val="0D0F3C3D"/>
+  <w:abstractNum w:abstractNumId="8" w15:restartNumberingAfterBreak="0">
+    <w:nsid w:val="178D3689"/>
     <w:multiLevelType w:val="multilevel"/>
-    <w:tmpl w:val="3D820090"/>
+    <w:tmpl w:val="C29A1B32"/>
     <w:lvl w:ilvl="0">
       <w:start w:val="1"/>
       <w:numFmt w:val="decimal"/>
@@ -10230,10 +10381,10 @@
       </w:pPr>
     </w:lvl>
   </w:abstractNum>
-  <w:abstractNum w:abstractNumId="3" w15:restartNumberingAfterBreak="0">
-    <w:nsid w:val="0F0200C6"/>
+  <w:abstractNum w:abstractNumId="9" w15:restartNumberingAfterBreak="0">
+    <w:nsid w:val="1A6C6797"/>
     <w:multiLevelType w:val="multilevel"/>
-    <w:tmpl w:val="B4EA1CA8"/>
+    <w:tmpl w:val="A964D450"/>
     <w:lvl w:ilvl="0">
       <w:start w:val="1"/>
       <w:numFmt w:val="decimal"/>
@@ -10343,10 +10494,10 @@
       </w:pPr>
     </w:lvl>
   </w:abstractNum>
-  <w:abstractNum w:abstractNumId="4" w15:restartNumberingAfterBreak="0">
-    <w:nsid w:val="11A52C9B"/>
+  <w:abstractNum w:abstractNumId="10" w15:restartNumberingAfterBreak="0">
+    <w:nsid w:val="1ACD68EC"/>
     <w:multiLevelType w:val="multilevel"/>
-    <w:tmpl w:val="D0944634"/>
+    <w:tmpl w:val="EAB6E042"/>
     <w:lvl w:ilvl="0">
       <w:start w:val="1"/>
       <w:numFmt w:val="bullet"/>
@@ -10492,236 +10643,99 @@
       </w:rPr>
     </w:lvl>
   </w:abstractNum>
-  <w:abstractNum w:abstractNumId="5" w15:restartNumberingAfterBreak="0">
-    <w:nsid w:val="178D3689"/>
+  <w:abstractNum w:abstractNumId="11" w15:restartNumberingAfterBreak="0">
+    <w:nsid w:val="24B73AAA"/>
+    <w:multiLevelType w:val="hybridMultilevel"/>
+    <w:tmpl w:val="4C4C890E"/>
+    <w:lvl w:ilvl="0" w:tplc="FFFFFFFF">
+      <w:start w:val="1"/>
+      <w:numFmt w:val="decimal"/>
+      <w:lvlText w:val="%1."/>
+      <w:lvlJc w:val="left"/>
+      <w:pPr>
+        <w:ind w:left="720" w:hanging="360"/>
+      </w:pPr>
+      <w:rPr>
+        <w:rFonts w:hint="default"/>
+      </w:rPr>
+    </w:lvl>
+    <w:lvl w:ilvl="1" w:tplc="FFFFFFFF" w:tentative="1">
+      <w:start w:val="1"/>
+      <w:numFmt w:val="lowerLetter"/>
+      <w:lvlText w:val="%2."/>
+      <w:lvlJc w:val="left"/>
+      <w:pPr>
+        <w:ind w:left="1440" w:hanging="360"/>
+      </w:pPr>
+    </w:lvl>
+    <w:lvl w:ilvl="2" w:tplc="FFFFFFFF" w:tentative="1">
+      <w:start w:val="1"/>
+      <w:numFmt w:val="lowerRoman"/>
+      <w:lvlText w:val="%3."/>
+      <w:lvlJc w:val="right"/>
+      <w:pPr>
+        <w:ind w:left="2160" w:hanging="180"/>
+      </w:pPr>
+    </w:lvl>
+    <w:lvl w:ilvl="3" w:tplc="FFFFFFFF" w:tentative="1">
+      <w:start w:val="1"/>
+      <w:numFmt w:val="decimal"/>
+      <w:lvlText w:val="%4."/>
+      <w:lvlJc w:val="left"/>
+      <w:pPr>
+        <w:ind w:left="2880" w:hanging="360"/>
+      </w:pPr>
+    </w:lvl>
+    <w:lvl w:ilvl="4" w:tplc="FFFFFFFF" w:tentative="1">
+      <w:start w:val="1"/>
+      <w:numFmt w:val="lowerLetter"/>
+      <w:lvlText w:val="%5."/>
+      <w:lvlJc w:val="left"/>
+      <w:pPr>
+        <w:ind w:left="3600" w:hanging="360"/>
+      </w:pPr>
+    </w:lvl>
+    <w:lvl w:ilvl="5" w:tplc="FFFFFFFF" w:tentative="1">
+      <w:start w:val="1"/>
+      <w:numFmt w:val="lowerRoman"/>
+      <w:lvlText w:val="%6."/>
+      <w:lvlJc w:val="right"/>
+      <w:pPr>
+        <w:ind w:left="4320" w:hanging="180"/>
+      </w:pPr>
+    </w:lvl>
+    <w:lvl w:ilvl="6" w:tplc="FFFFFFFF" w:tentative="1">
+      <w:start w:val="1"/>
+      <w:numFmt w:val="decimal"/>
+      <w:lvlText w:val="%7."/>
+      <w:lvlJc w:val="left"/>
+      <w:pPr>
+        <w:ind w:left="5040" w:hanging="360"/>
+      </w:pPr>
+    </w:lvl>
+    <w:lvl w:ilvl="7" w:tplc="FFFFFFFF" w:tentative="1">
+      <w:start w:val="1"/>
+      <w:numFmt w:val="lowerLetter"/>
+      <w:lvlText w:val="%8."/>
+      <w:lvlJc w:val="left"/>
+      <w:pPr>
+        <w:ind w:left="5760" w:hanging="360"/>
+      </w:pPr>
+    </w:lvl>
+    <w:lvl w:ilvl="8" w:tplc="FFFFFFFF" w:tentative="1">
+      <w:start w:val="1"/>
+      <w:numFmt w:val="lowerRoman"/>
+      <w:lvlText w:val="%9."/>
+      <w:lvlJc w:val="right"/>
+      <w:pPr>
+        <w:ind w:left="6480" w:hanging="180"/>
+      </w:pPr>
+    </w:lvl>
+  </w:abstractNum>
+  <w:abstractNum w:abstractNumId="12" w15:restartNumberingAfterBreak="0">
+    <w:nsid w:val="32790B27"/>
     <w:multiLevelType w:val="multilevel"/>
-    <w:tmpl w:val="C29A1B32"/>
-    <w:lvl w:ilvl="0">
-      <w:start w:val="1"/>
-      <w:numFmt w:val="decimal"/>
-      <w:lvlText w:val="%1."/>
-      <w:lvlJc w:val="left"/>
-      <w:pPr>
-        <w:tabs>
-          <w:tab w:val="num" w:pos="720"/>
-        </w:tabs>
-        <w:ind w:left="720" w:hanging="360"/>
-      </w:pPr>
-    </w:lvl>
-    <w:lvl w:ilvl="1" w:tentative="1">
-      <w:start w:val="1"/>
-      <w:numFmt w:val="decimal"/>
-      <w:lvlText w:val="%2."/>
-      <w:lvlJc w:val="left"/>
-      <w:pPr>
-        <w:tabs>
-          <w:tab w:val="num" w:pos="1440"/>
-        </w:tabs>
-        <w:ind w:left="1440" w:hanging="360"/>
-      </w:pPr>
-    </w:lvl>
-    <w:lvl w:ilvl="2" w:tentative="1">
-      <w:start w:val="1"/>
-      <w:numFmt w:val="decimal"/>
-      <w:lvlText w:val="%3."/>
-      <w:lvlJc w:val="left"/>
-      <w:pPr>
-        <w:tabs>
-          <w:tab w:val="num" w:pos="2160"/>
-        </w:tabs>
-        <w:ind w:left="2160" w:hanging="360"/>
-      </w:pPr>
-    </w:lvl>
-    <w:lvl w:ilvl="3" w:tentative="1">
-      <w:start w:val="1"/>
-      <w:numFmt w:val="decimal"/>
-      <w:lvlText w:val="%4."/>
-      <w:lvlJc w:val="left"/>
-      <w:pPr>
-        <w:tabs>
-          <w:tab w:val="num" w:pos="2880"/>
-        </w:tabs>
-        <w:ind w:left="2880" w:hanging="360"/>
-      </w:pPr>
-    </w:lvl>
-    <w:lvl w:ilvl="4" w:tentative="1">
-      <w:start w:val="1"/>
-      <w:numFmt w:val="decimal"/>
-      <w:lvlText w:val="%5."/>
-      <w:lvlJc w:val="left"/>
-      <w:pPr>
-        <w:tabs>
-          <w:tab w:val="num" w:pos="3600"/>
-        </w:tabs>
-        <w:ind w:left="3600" w:hanging="360"/>
-      </w:pPr>
-    </w:lvl>
-    <w:lvl w:ilvl="5" w:tentative="1">
-      <w:start w:val="1"/>
-      <w:numFmt w:val="decimal"/>
-      <w:lvlText w:val="%6."/>
-      <w:lvlJc w:val="left"/>
-      <w:pPr>
-        <w:tabs>
-          <w:tab w:val="num" w:pos="4320"/>
-        </w:tabs>
-        <w:ind w:left="4320" w:hanging="360"/>
-      </w:pPr>
-    </w:lvl>
-    <w:lvl w:ilvl="6" w:tentative="1">
-      <w:start w:val="1"/>
-      <w:numFmt w:val="decimal"/>
-      <w:lvlText w:val="%7."/>
-      <w:lvlJc w:val="left"/>
-      <w:pPr>
-        <w:tabs>
-          <w:tab w:val="num" w:pos="5040"/>
-        </w:tabs>
-        <w:ind w:left="5040" w:hanging="360"/>
-      </w:pPr>
-    </w:lvl>
-    <w:lvl w:ilvl="7" w:tentative="1">
-      <w:start w:val="1"/>
-      <w:numFmt w:val="decimal"/>
-      <w:lvlText w:val="%8."/>
-      <w:lvlJc w:val="left"/>
-      <w:pPr>
-        <w:tabs>
-          <w:tab w:val="num" w:pos="5760"/>
-        </w:tabs>
-        <w:ind w:left="5760" w:hanging="360"/>
-      </w:pPr>
-    </w:lvl>
-    <w:lvl w:ilvl="8" w:tentative="1">
-      <w:start w:val="1"/>
-      <w:numFmt w:val="decimal"/>
-      <w:lvlText w:val="%9."/>
-      <w:lvlJc w:val="left"/>
-      <w:pPr>
-        <w:tabs>
-          <w:tab w:val="num" w:pos="6480"/>
-        </w:tabs>
-        <w:ind w:left="6480" w:hanging="360"/>
-      </w:pPr>
-    </w:lvl>
-  </w:abstractNum>
-  <w:abstractNum w:abstractNumId="6" w15:restartNumberingAfterBreak="0">
-    <w:nsid w:val="1A6C6797"/>
-    <w:multiLevelType w:val="multilevel"/>
-    <w:tmpl w:val="A964D450"/>
-    <w:lvl w:ilvl="0">
-      <w:start w:val="1"/>
-      <w:numFmt w:val="decimal"/>
-      <w:lvlText w:val="%1."/>
-      <w:lvlJc w:val="left"/>
-      <w:pPr>
-        <w:tabs>
-          <w:tab w:val="num" w:pos="720"/>
-        </w:tabs>
-        <w:ind w:left="720" w:hanging="360"/>
-      </w:pPr>
-    </w:lvl>
-    <w:lvl w:ilvl="1" w:tentative="1">
-      <w:start w:val="1"/>
-      <w:numFmt w:val="decimal"/>
-      <w:lvlText w:val="%2."/>
-      <w:lvlJc w:val="left"/>
-      <w:pPr>
-        <w:tabs>
-          <w:tab w:val="num" w:pos="1440"/>
-        </w:tabs>
-        <w:ind w:left="1440" w:hanging="360"/>
-      </w:pPr>
-    </w:lvl>
-    <w:lvl w:ilvl="2" w:tentative="1">
-      <w:start w:val="1"/>
-      <w:numFmt w:val="decimal"/>
-      <w:lvlText w:val="%3."/>
-      <w:lvlJc w:val="left"/>
-      <w:pPr>
-        <w:tabs>
-          <w:tab w:val="num" w:pos="2160"/>
-        </w:tabs>
-        <w:ind w:left="2160" w:hanging="360"/>
-      </w:pPr>
-    </w:lvl>
-    <w:lvl w:ilvl="3" w:tentative="1">
-      <w:start w:val="1"/>
-      <w:numFmt w:val="decimal"/>
-      <w:lvlText w:val="%4."/>
-      <w:lvlJc w:val="left"/>
-      <w:pPr>
-        <w:tabs>
-          <w:tab w:val="num" w:pos="2880"/>
-        </w:tabs>
-        <w:ind w:left="2880" w:hanging="360"/>
-      </w:pPr>
-    </w:lvl>
-    <w:lvl w:ilvl="4" w:tentative="1">
-      <w:start w:val="1"/>
-      <w:numFmt w:val="decimal"/>
-      <w:lvlText w:val="%5."/>
-      <w:lvlJc w:val="left"/>
-      <w:pPr>
-        <w:tabs>
-          <w:tab w:val="num" w:pos="3600"/>
-        </w:tabs>
-        <w:ind w:left="3600" w:hanging="360"/>
-      </w:pPr>
-    </w:lvl>
-    <w:lvl w:ilvl="5" w:tentative="1">
-      <w:start w:val="1"/>
-      <w:numFmt w:val="decimal"/>
-      <w:lvlText w:val="%6."/>
-      <w:lvlJc w:val="left"/>
-      <w:pPr>
-        <w:tabs>
-          <w:tab w:val="num" w:pos="4320"/>
-        </w:tabs>
-        <w:ind w:left="4320" w:hanging="360"/>
-      </w:pPr>
-    </w:lvl>
-    <w:lvl w:ilvl="6" w:tentative="1">
-      <w:start w:val="1"/>
-      <w:numFmt w:val="decimal"/>
-      <w:lvlText w:val="%7."/>
-      <w:lvlJc w:val="left"/>
-      <w:pPr>
-        <w:tabs>
-          <w:tab w:val="num" w:pos="5040"/>
-        </w:tabs>
-        <w:ind w:left="5040" w:hanging="360"/>
-      </w:pPr>
-    </w:lvl>
-    <w:lvl w:ilvl="7" w:tentative="1">
-      <w:start w:val="1"/>
-      <w:numFmt w:val="decimal"/>
-      <w:lvlText w:val="%8."/>
-      <w:lvlJc w:val="left"/>
-      <w:pPr>
-        <w:tabs>
-          <w:tab w:val="num" w:pos="5760"/>
-        </w:tabs>
-        <w:ind w:left="5760" w:hanging="360"/>
-      </w:pPr>
-    </w:lvl>
-    <w:lvl w:ilvl="8" w:tentative="1">
-      <w:start w:val="1"/>
-      <w:numFmt w:val="decimal"/>
-      <w:lvlText w:val="%9."/>
-      <w:lvlJc w:val="left"/>
-      <w:pPr>
-        <w:tabs>
-          <w:tab w:val="num" w:pos="6480"/>
-        </w:tabs>
-        <w:ind w:left="6480" w:hanging="360"/>
-      </w:pPr>
-    </w:lvl>
-  </w:abstractNum>
-  <w:abstractNum w:abstractNumId="7" w15:restartNumberingAfterBreak="0">
-    <w:nsid w:val="1ACD68EC"/>
-    <w:multiLevelType w:val="multilevel"/>
-    <w:tmpl w:val="EAB6E042"/>
+    <w:tmpl w:val="237CAD18"/>
     <w:lvl w:ilvl="0">
       <w:start w:val="1"/>
       <w:numFmt w:val="bullet"/>
@@ -10867,10 +10881,236 @@
       </w:rPr>
     </w:lvl>
   </w:abstractNum>
-  <w:abstractNum w:abstractNumId="8" w15:restartNumberingAfterBreak="0">
-    <w:nsid w:val="32790B27"/>
+  <w:abstractNum w:abstractNumId="13" w15:restartNumberingAfterBreak="0">
+    <w:nsid w:val="371428FE"/>
     <w:multiLevelType w:val="multilevel"/>
-    <w:tmpl w:val="237CAD18"/>
+    <w:tmpl w:val="B83EAA3E"/>
+    <w:lvl w:ilvl="0">
+      <w:start w:val="1"/>
+      <w:numFmt w:val="decimal"/>
+      <w:lvlText w:val="%1."/>
+      <w:lvlJc w:val="left"/>
+      <w:pPr>
+        <w:tabs>
+          <w:tab w:val="num" w:pos="720"/>
+        </w:tabs>
+        <w:ind w:left="720" w:hanging="360"/>
+      </w:pPr>
+    </w:lvl>
+    <w:lvl w:ilvl="1" w:tentative="1">
+      <w:start w:val="1"/>
+      <w:numFmt w:val="decimal"/>
+      <w:lvlText w:val="%2."/>
+      <w:lvlJc w:val="left"/>
+      <w:pPr>
+        <w:tabs>
+          <w:tab w:val="num" w:pos="1440"/>
+        </w:tabs>
+        <w:ind w:left="1440" w:hanging="360"/>
+      </w:pPr>
+    </w:lvl>
+    <w:lvl w:ilvl="2" w:tentative="1">
+      <w:start w:val="1"/>
+      <w:numFmt w:val="decimal"/>
+      <w:lvlText w:val="%3."/>
+      <w:lvlJc w:val="left"/>
+      <w:pPr>
+        <w:tabs>
+          <w:tab w:val="num" w:pos="2160"/>
+        </w:tabs>
+        <w:ind w:left="2160" w:hanging="360"/>
+      </w:pPr>
+    </w:lvl>
+    <w:lvl w:ilvl="3" w:tentative="1">
+      <w:start w:val="1"/>
+      <w:numFmt w:val="decimal"/>
+      <w:lvlText w:val="%4."/>
+      <w:lvlJc w:val="left"/>
+      <w:pPr>
+        <w:tabs>
+          <w:tab w:val="num" w:pos="2880"/>
+        </w:tabs>
+        <w:ind w:left="2880" w:hanging="360"/>
+      </w:pPr>
+    </w:lvl>
+    <w:lvl w:ilvl="4" w:tentative="1">
+      <w:start w:val="1"/>
+      <w:numFmt w:val="decimal"/>
+      <w:lvlText w:val="%5."/>
+      <w:lvlJc w:val="left"/>
+      <w:pPr>
+        <w:tabs>
+          <w:tab w:val="num" w:pos="3600"/>
+        </w:tabs>
+        <w:ind w:left="3600" w:hanging="360"/>
+      </w:pPr>
+    </w:lvl>
+    <w:lvl w:ilvl="5" w:tentative="1">
+      <w:start w:val="1"/>
+      <w:numFmt w:val="decimal"/>
+      <w:lvlText w:val="%6."/>
+      <w:lvlJc w:val="left"/>
+      <w:pPr>
+        <w:tabs>
+          <w:tab w:val="num" w:pos="4320"/>
+        </w:tabs>
+        <w:ind w:left="4320" w:hanging="360"/>
+      </w:pPr>
+    </w:lvl>
+    <w:lvl w:ilvl="6" w:tentative="1">
+      <w:start w:val="1"/>
+      <w:numFmt w:val="decimal"/>
+      <w:lvlText w:val="%7."/>
+      <w:lvlJc w:val="left"/>
+      <w:pPr>
+        <w:tabs>
+          <w:tab w:val="num" w:pos="5040"/>
+        </w:tabs>
+        <w:ind w:left="5040" w:hanging="360"/>
+      </w:pPr>
+    </w:lvl>
+    <w:lvl w:ilvl="7" w:tentative="1">
+      <w:start w:val="1"/>
+      <w:numFmt w:val="decimal"/>
+      <w:lvlText w:val="%8."/>
+      <w:lvlJc w:val="left"/>
+      <w:pPr>
+        <w:tabs>
+          <w:tab w:val="num" w:pos="5760"/>
+        </w:tabs>
+        <w:ind w:left="5760" w:hanging="360"/>
+      </w:pPr>
+    </w:lvl>
+    <w:lvl w:ilvl="8" w:tentative="1">
+      <w:start w:val="1"/>
+      <w:numFmt w:val="decimal"/>
+      <w:lvlText w:val="%9."/>
+      <w:lvlJc w:val="left"/>
+      <w:pPr>
+        <w:tabs>
+          <w:tab w:val="num" w:pos="6480"/>
+        </w:tabs>
+        <w:ind w:left="6480" w:hanging="360"/>
+      </w:pPr>
+    </w:lvl>
+  </w:abstractNum>
+  <w:abstractNum w:abstractNumId="14" w15:restartNumberingAfterBreak="0">
+    <w:nsid w:val="3AF51956"/>
+    <w:multiLevelType w:val="multilevel"/>
+    <w:tmpl w:val="71B816E4"/>
+    <w:lvl w:ilvl="0">
+      <w:start w:val="1"/>
+      <w:numFmt w:val="decimal"/>
+      <w:lvlText w:val="%1."/>
+      <w:lvlJc w:val="left"/>
+      <w:pPr>
+        <w:tabs>
+          <w:tab w:val="num" w:pos="720"/>
+        </w:tabs>
+        <w:ind w:left="720" w:hanging="360"/>
+      </w:pPr>
+    </w:lvl>
+    <w:lvl w:ilvl="1" w:tentative="1">
+      <w:start w:val="1"/>
+      <w:numFmt w:val="decimal"/>
+      <w:lvlText w:val="%2."/>
+      <w:lvlJc w:val="left"/>
+      <w:pPr>
+        <w:tabs>
+          <w:tab w:val="num" w:pos="1440"/>
+        </w:tabs>
+        <w:ind w:left="1440" w:hanging="360"/>
+      </w:pPr>
+    </w:lvl>
+    <w:lvl w:ilvl="2" w:tentative="1">
+      <w:start w:val="1"/>
+      <w:numFmt w:val="decimal"/>
+      <w:lvlText w:val="%3."/>
+      <w:lvlJc w:val="left"/>
+      <w:pPr>
+        <w:tabs>
+          <w:tab w:val="num" w:pos="2160"/>
+        </w:tabs>
+        <w:ind w:left="2160" w:hanging="360"/>
+      </w:pPr>
+    </w:lvl>
+    <w:lvl w:ilvl="3" w:tentative="1">
+      <w:start w:val="1"/>
+      <w:numFmt w:val="decimal"/>
+      <w:lvlText w:val="%4."/>
+      <w:lvlJc w:val="left"/>
+      <w:pPr>
+        <w:tabs>
+          <w:tab w:val="num" w:pos="2880"/>
+        </w:tabs>
+        <w:ind w:left="2880" w:hanging="360"/>
+      </w:pPr>
+    </w:lvl>
+    <w:lvl w:ilvl="4" w:tentative="1">
+      <w:start w:val="1"/>
+      <w:numFmt w:val="decimal"/>
+      <w:lvlText w:val="%5."/>
+      <w:lvlJc w:val="left"/>
+      <w:pPr>
+        <w:tabs>
+          <w:tab w:val="num" w:pos="3600"/>
+        </w:tabs>
+        <w:ind w:left="3600" w:hanging="360"/>
+      </w:pPr>
+    </w:lvl>
+    <w:lvl w:ilvl="5" w:tentative="1">
+      <w:start w:val="1"/>
+      <w:numFmt w:val="decimal"/>
+      <w:lvlText w:val="%6."/>
+      <w:lvlJc w:val="left"/>
+      <w:pPr>
+        <w:tabs>
+          <w:tab w:val="num" w:pos="4320"/>
+        </w:tabs>
+        <w:ind w:left="4320" w:hanging="360"/>
+      </w:pPr>
+    </w:lvl>
+    <w:lvl w:ilvl="6" w:tentative="1">
+      <w:start w:val="1"/>
+      <w:numFmt w:val="decimal"/>
+      <w:lvlText w:val="%7."/>
+      <w:lvlJc w:val="left"/>
+      <w:pPr>
+        <w:tabs>
+          <w:tab w:val="num" w:pos="5040"/>
+        </w:tabs>
+        <w:ind w:left="5040" w:hanging="360"/>
+      </w:pPr>
+    </w:lvl>
+    <w:lvl w:ilvl="7" w:tentative="1">
+      <w:start w:val="1"/>
+      <w:numFmt w:val="decimal"/>
+      <w:lvlText w:val="%8."/>
+      <w:lvlJc w:val="left"/>
+      <w:pPr>
+        <w:tabs>
+          <w:tab w:val="num" w:pos="5760"/>
+        </w:tabs>
+        <w:ind w:left="5760" w:hanging="360"/>
+      </w:pPr>
+    </w:lvl>
+    <w:lvl w:ilvl="8" w:tentative="1">
+      <w:start w:val="1"/>
+      <w:numFmt w:val="decimal"/>
+      <w:lvlText w:val="%9."/>
+      <w:lvlJc w:val="left"/>
+      <w:pPr>
+        <w:tabs>
+          <w:tab w:val="num" w:pos="6480"/>
+        </w:tabs>
+        <w:ind w:left="6480" w:hanging="360"/>
+      </w:pPr>
+    </w:lvl>
+  </w:abstractNum>
+  <w:abstractNum w:abstractNumId="15" w15:restartNumberingAfterBreak="0">
+    <w:nsid w:val="4F996F26"/>
+    <w:multiLevelType w:val="multilevel"/>
+    <w:tmpl w:val="C00C3956"/>
     <w:lvl w:ilvl="0">
       <w:start w:val="1"/>
       <w:numFmt w:val="bullet"/>
@@ -11016,10 +11256,10 @@
       </w:rPr>
     </w:lvl>
   </w:abstractNum>
-  <w:abstractNum w:abstractNumId="9" w15:restartNumberingAfterBreak="0">
-    <w:nsid w:val="371428FE"/>
+  <w:abstractNum w:abstractNumId="16" w15:restartNumberingAfterBreak="0">
+    <w:nsid w:val="572A226F"/>
     <w:multiLevelType w:val="multilevel"/>
-    <w:tmpl w:val="B83EAA3E"/>
+    <w:tmpl w:val="81FC1D9E"/>
     <w:lvl w:ilvl="0">
       <w:start w:val="1"/>
       <w:numFmt w:val="decimal"/>
@@ -11129,10 +11369,10 @@
       </w:pPr>
     </w:lvl>
   </w:abstractNum>
-  <w:abstractNum w:abstractNumId="10" w15:restartNumberingAfterBreak="0">
-    <w:nsid w:val="3AF51956"/>
+  <w:abstractNum w:abstractNumId="17" w15:restartNumberingAfterBreak="0">
+    <w:nsid w:val="5BF5117B"/>
     <w:multiLevelType w:val="multilevel"/>
-    <w:tmpl w:val="71B816E4"/>
+    <w:tmpl w:val="8A1481F6"/>
     <w:lvl w:ilvl="0">
       <w:start w:val="1"/>
       <w:numFmt w:val="decimal"/>
@@ -11242,10 +11482,462 @@
       </w:pPr>
     </w:lvl>
   </w:abstractNum>
-  <w:abstractNum w:abstractNumId="11" w15:restartNumberingAfterBreak="0">
-    <w:nsid w:val="4F996F26"/>
+  <w:abstractNum w:abstractNumId="18" w15:restartNumberingAfterBreak="0">
+    <w:nsid w:val="5D3E6FA0"/>
     <w:multiLevelType w:val="multilevel"/>
-    <w:tmpl w:val="C00C3956"/>
+    <w:tmpl w:val="1DD496E8"/>
+    <w:lvl w:ilvl="0">
+      <w:start w:val="1"/>
+      <w:numFmt w:val="decimal"/>
+      <w:lvlText w:val="%1."/>
+      <w:lvlJc w:val="left"/>
+      <w:pPr>
+        <w:tabs>
+          <w:tab w:val="num" w:pos="720"/>
+        </w:tabs>
+        <w:ind w:left="720" w:hanging="360"/>
+      </w:pPr>
+    </w:lvl>
+    <w:lvl w:ilvl="1" w:tentative="1">
+      <w:start w:val="1"/>
+      <w:numFmt w:val="decimal"/>
+      <w:lvlText w:val="%2."/>
+      <w:lvlJc w:val="left"/>
+      <w:pPr>
+        <w:tabs>
+          <w:tab w:val="num" w:pos="1440"/>
+        </w:tabs>
+        <w:ind w:left="1440" w:hanging="360"/>
+      </w:pPr>
+    </w:lvl>
+    <w:lvl w:ilvl="2" w:tentative="1">
+      <w:start w:val="1"/>
+      <w:numFmt w:val="decimal"/>
+      <w:lvlText w:val="%3."/>
+      <w:lvlJc w:val="left"/>
+      <w:pPr>
+        <w:tabs>
+          <w:tab w:val="num" w:pos="2160"/>
+        </w:tabs>
+        <w:ind w:left="2160" w:hanging="360"/>
+      </w:pPr>
+    </w:lvl>
+    <w:lvl w:ilvl="3" w:tentative="1">
+      <w:start w:val="1"/>
+      <w:numFmt w:val="decimal"/>
+      <w:lvlText w:val="%4."/>
+      <w:lvlJc w:val="left"/>
+      <w:pPr>
+        <w:tabs>
+          <w:tab w:val="num" w:pos="2880"/>
+        </w:tabs>
+        <w:ind w:left="2880" w:hanging="360"/>
+      </w:pPr>
+    </w:lvl>
+    <w:lvl w:ilvl="4" w:tentative="1">
+      <w:start w:val="1"/>
+      <w:numFmt w:val="decimal"/>
+      <w:lvlText w:val="%5."/>
+      <w:lvlJc w:val="left"/>
+      <w:pPr>
+        <w:tabs>
+          <w:tab w:val="num" w:pos="3600"/>
+        </w:tabs>
+        <w:ind w:left="3600" w:hanging="360"/>
+      </w:pPr>
+    </w:lvl>
+    <w:lvl w:ilvl="5" w:tentative="1">
+      <w:start w:val="1"/>
+      <w:numFmt w:val="decimal"/>
+      <w:lvlText w:val="%6."/>
+      <w:lvlJc w:val="left"/>
+      <w:pPr>
+        <w:tabs>
+          <w:tab w:val="num" w:pos="4320"/>
+        </w:tabs>
+        <w:ind w:left="4320" w:hanging="360"/>
+      </w:pPr>
+    </w:lvl>
+    <w:lvl w:ilvl="6" w:tentative="1">
+      <w:start w:val="1"/>
+      <w:numFmt w:val="decimal"/>
+      <w:lvlText w:val="%7."/>
+      <w:lvlJc w:val="left"/>
+      <w:pPr>
+        <w:tabs>
+          <w:tab w:val="num" w:pos="5040"/>
+        </w:tabs>
+        <w:ind w:left="5040" w:hanging="360"/>
+      </w:pPr>
+    </w:lvl>
+    <w:lvl w:ilvl="7" w:tentative="1">
+      <w:start w:val="1"/>
+      <w:numFmt w:val="decimal"/>
+      <w:lvlText w:val="%8."/>
+      <w:lvlJc w:val="left"/>
+      <w:pPr>
+        <w:tabs>
+          <w:tab w:val="num" w:pos="5760"/>
+        </w:tabs>
+        <w:ind w:left="5760" w:hanging="360"/>
+      </w:pPr>
+    </w:lvl>
+    <w:lvl w:ilvl="8" w:tentative="1">
+      <w:start w:val="1"/>
+      <w:numFmt w:val="decimal"/>
+      <w:lvlText w:val="%9."/>
+      <w:lvlJc w:val="left"/>
+      <w:pPr>
+        <w:tabs>
+          <w:tab w:val="num" w:pos="6480"/>
+        </w:tabs>
+        <w:ind w:left="6480" w:hanging="360"/>
+      </w:pPr>
+    </w:lvl>
+  </w:abstractNum>
+  <w:abstractNum w:abstractNumId="19" w15:restartNumberingAfterBreak="0">
+    <w:nsid w:val="5F935511"/>
+    <w:multiLevelType w:val="multilevel"/>
+    <w:tmpl w:val="44AE5600"/>
+    <w:lvl w:ilvl="0">
+      <w:start w:val="1"/>
+      <w:numFmt w:val="decimal"/>
+      <w:lvlText w:val="%1."/>
+      <w:lvlJc w:val="left"/>
+      <w:pPr>
+        <w:tabs>
+          <w:tab w:val="num" w:pos="720"/>
+        </w:tabs>
+        <w:ind w:left="720" w:hanging="360"/>
+      </w:pPr>
+    </w:lvl>
+    <w:lvl w:ilvl="1" w:tentative="1">
+      <w:start w:val="1"/>
+      <w:numFmt w:val="decimal"/>
+      <w:lvlText w:val="%2."/>
+      <w:lvlJc w:val="left"/>
+      <w:pPr>
+        <w:tabs>
+          <w:tab w:val="num" w:pos="1440"/>
+        </w:tabs>
+        <w:ind w:left="1440" w:hanging="360"/>
+      </w:pPr>
+    </w:lvl>
+    <w:lvl w:ilvl="2" w:tentative="1">
+      <w:start w:val="1"/>
+      <w:numFmt w:val="decimal"/>
+      <w:lvlText w:val="%3."/>
+      <w:lvlJc w:val="left"/>
+      <w:pPr>
+        <w:tabs>
+          <w:tab w:val="num" w:pos="2160"/>
+        </w:tabs>
+        <w:ind w:left="2160" w:hanging="360"/>
+      </w:pPr>
+    </w:lvl>
+    <w:lvl w:ilvl="3" w:tentative="1">
+      <w:start w:val="1"/>
+      <w:numFmt w:val="decimal"/>
+      <w:lvlText w:val="%4."/>
+      <w:lvlJc w:val="left"/>
+      <w:pPr>
+        <w:tabs>
+          <w:tab w:val="num" w:pos="2880"/>
+        </w:tabs>
+        <w:ind w:left="2880" w:hanging="360"/>
+      </w:pPr>
+    </w:lvl>
+    <w:lvl w:ilvl="4" w:tentative="1">
+      <w:start w:val="1"/>
+      <w:numFmt w:val="decimal"/>
+      <w:lvlText w:val="%5."/>
+      <w:lvlJc w:val="left"/>
+      <w:pPr>
+        <w:tabs>
+          <w:tab w:val="num" w:pos="3600"/>
+        </w:tabs>
+        <w:ind w:left="3600" w:hanging="360"/>
+      </w:pPr>
+    </w:lvl>
+    <w:lvl w:ilvl="5" w:tentative="1">
+      <w:start w:val="1"/>
+      <w:numFmt w:val="decimal"/>
+      <w:lvlText w:val="%6."/>
+      <w:lvlJc w:val="left"/>
+      <w:pPr>
+        <w:tabs>
+          <w:tab w:val="num" w:pos="4320"/>
+        </w:tabs>
+        <w:ind w:left="4320" w:hanging="360"/>
+      </w:pPr>
+    </w:lvl>
+    <w:lvl w:ilvl="6" w:tentative="1">
+      <w:start w:val="1"/>
+      <w:numFmt w:val="decimal"/>
+      <w:lvlText w:val="%7."/>
+      <w:lvlJc w:val="left"/>
+      <w:pPr>
+        <w:tabs>
+          <w:tab w:val="num" w:pos="5040"/>
+        </w:tabs>
+        <w:ind w:left="5040" w:hanging="360"/>
+      </w:pPr>
+    </w:lvl>
+    <w:lvl w:ilvl="7" w:tentative="1">
+      <w:start w:val="1"/>
+      <w:numFmt w:val="decimal"/>
+      <w:lvlText w:val="%8."/>
+      <w:lvlJc w:val="left"/>
+      <w:pPr>
+        <w:tabs>
+          <w:tab w:val="num" w:pos="5760"/>
+        </w:tabs>
+        <w:ind w:left="5760" w:hanging="360"/>
+      </w:pPr>
+    </w:lvl>
+    <w:lvl w:ilvl="8" w:tentative="1">
+      <w:start w:val="1"/>
+      <w:numFmt w:val="decimal"/>
+      <w:lvlText w:val="%9."/>
+      <w:lvlJc w:val="left"/>
+      <w:pPr>
+        <w:tabs>
+          <w:tab w:val="num" w:pos="6480"/>
+        </w:tabs>
+        <w:ind w:left="6480" w:hanging="360"/>
+      </w:pPr>
+    </w:lvl>
+  </w:abstractNum>
+  <w:abstractNum w:abstractNumId="20" w15:restartNumberingAfterBreak="0">
+    <w:nsid w:val="62330FFA"/>
+    <w:multiLevelType w:val="multilevel"/>
+    <w:tmpl w:val="1354050A"/>
+    <w:lvl w:ilvl="0">
+      <w:start w:val="1"/>
+      <w:numFmt w:val="decimal"/>
+      <w:lvlText w:val="%1."/>
+      <w:lvlJc w:val="left"/>
+      <w:pPr>
+        <w:tabs>
+          <w:tab w:val="num" w:pos="720"/>
+        </w:tabs>
+        <w:ind w:left="720" w:hanging="360"/>
+      </w:pPr>
+    </w:lvl>
+    <w:lvl w:ilvl="1" w:tentative="1">
+      <w:start w:val="1"/>
+      <w:numFmt w:val="decimal"/>
+      <w:lvlText w:val="%2."/>
+      <w:lvlJc w:val="left"/>
+      <w:pPr>
+        <w:tabs>
+          <w:tab w:val="num" w:pos="1440"/>
+        </w:tabs>
+        <w:ind w:left="1440" w:hanging="360"/>
+      </w:pPr>
+    </w:lvl>
+    <w:lvl w:ilvl="2" w:tentative="1">
+      <w:start w:val="1"/>
+      <w:numFmt w:val="decimal"/>
+      <w:lvlText w:val="%3."/>
+      <w:lvlJc w:val="left"/>
+      <w:pPr>
+        <w:tabs>
+          <w:tab w:val="num" w:pos="2160"/>
+        </w:tabs>
+        <w:ind w:left="2160" w:hanging="360"/>
+      </w:pPr>
+    </w:lvl>
+    <w:lvl w:ilvl="3" w:tentative="1">
+      <w:start w:val="1"/>
+      <w:numFmt w:val="decimal"/>
+      <w:lvlText w:val="%4."/>
+      <w:lvlJc w:val="left"/>
+      <w:pPr>
+        <w:tabs>
+          <w:tab w:val="num" w:pos="2880"/>
+        </w:tabs>
+        <w:ind w:left="2880" w:hanging="360"/>
+      </w:pPr>
+    </w:lvl>
+    <w:lvl w:ilvl="4" w:tentative="1">
+      <w:start w:val="1"/>
+      <w:numFmt w:val="decimal"/>
+      <w:lvlText w:val="%5."/>
+      <w:lvlJc w:val="left"/>
+      <w:pPr>
+        <w:tabs>
+          <w:tab w:val="num" w:pos="3600"/>
+        </w:tabs>
+        <w:ind w:left="3600" w:hanging="360"/>
+      </w:pPr>
+    </w:lvl>
+    <w:lvl w:ilvl="5" w:tentative="1">
+      <w:start w:val="1"/>
+      <w:numFmt w:val="decimal"/>
+      <w:lvlText w:val="%6."/>
+      <w:lvlJc w:val="left"/>
+      <w:pPr>
+        <w:tabs>
+          <w:tab w:val="num" w:pos="4320"/>
+        </w:tabs>
+        <w:ind w:left="4320" w:hanging="360"/>
+      </w:pPr>
+    </w:lvl>
+    <w:lvl w:ilvl="6" w:tentative="1">
+      <w:start w:val="1"/>
+      <w:numFmt w:val="decimal"/>
+      <w:lvlText w:val="%7."/>
+      <w:lvlJc w:val="left"/>
+      <w:pPr>
+        <w:tabs>
+          <w:tab w:val="num" w:pos="5040"/>
+        </w:tabs>
+        <w:ind w:left="5040" w:hanging="360"/>
+      </w:pPr>
+    </w:lvl>
+    <w:lvl w:ilvl="7" w:tentative="1">
+      <w:start w:val="1"/>
+      <w:numFmt w:val="decimal"/>
+      <w:lvlText w:val="%8."/>
+      <w:lvlJc w:val="left"/>
+      <w:pPr>
+        <w:tabs>
+          <w:tab w:val="num" w:pos="5760"/>
+        </w:tabs>
+        <w:ind w:left="5760" w:hanging="360"/>
+      </w:pPr>
+    </w:lvl>
+    <w:lvl w:ilvl="8" w:tentative="1">
+      <w:start w:val="1"/>
+      <w:numFmt w:val="decimal"/>
+      <w:lvlText w:val="%9."/>
+      <w:lvlJc w:val="left"/>
+      <w:pPr>
+        <w:tabs>
+          <w:tab w:val="num" w:pos="6480"/>
+        </w:tabs>
+        <w:ind w:left="6480" w:hanging="360"/>
+      </w:pPr>
+    </w:lvl>
+  </w:abstractNum>
+  <w:abstractNum w:abstractNumId="21" w15:restartNumberingAfterBreak="0">
+    <w:nsid w:val="653571BB"/>
+    <w:multiLevelType w:val="multilevel"/>
+    <w:tmpl w:val="E0F0DCF4"/>
+    <w:lvl w:ilvl="0">
+      <w:start w:val="1"/>
+      <w:numFmt w:val="decimal"/>
+      <w:lvlText w:val="%1."/>
+      <w:lvlJc w:val="left"/>
+      <w:pPr>
+        <w:tabs>
+          <w:tab w:val="num" w:pos="720"/>
+        </w:tabs>
+        <w:ind w:left="720" w:hanging="360"/>
+      </w:pPr>
+    </w:lvl>
+    <w:lvl w:ilvl="1" w:tentative="1">
+      <w:start w:val="1"/>
+      <w:numFmt w:val="decimal"/>
+      <w:lvlText w:val="%2."/>
+      <w:lvlJc w:val="left"/>
+      <w:pPr>
+        <w:tabs>
+          <w:tab w:val="num" w:pos="1440"/>
+        </w:tabs>
+        <w:ind w:left="1440" w:hanging="360"/>
+      </w:pPr>
+    </w:lvl>
+    <w:lvl w:ilvl="2" w:tentative="1">
+      <w:start w:val="1"/>
+      <w:numFmt w:val="decimal"/>
+      <w:lvlText w:val="%3."/>
+      <w:lvlJc w:val="left"/>
+      <w:pPr>
+        <w:tabs>
+          <w:tab w:val="num" w:pos="2160"/>
+        </w:tabs>
+        <w:ind w:left="2160" w:hanging="360"/>
+      </w:pPr>
+    </w:lvl>
+    <w:lvl w:ilvl="3" w:tentative="1">
+      <w:start w:val="1"/>
+      <w:numFmt w:val="decimal"/>
+      <w:lvlText w:val="%4."/>
+      <w:lvlJc w:val="left"/>
+      <w:pPr>
+        <w:tabs>
+          <w:tab w:val="num" w:pos="2880"/>
+        </w:tabs>
+        <w:ind w:left="2880" w:hanging="360"/>
+      </w:pPr>
+    </w:lvl>
+    <w:lvl w:ilvl="4" w:tentative="1">
+      <w:start w:val="1"/>
+      <w:numFmt w:val="decimal"/>
+      <w:lvlText w:val="%5."/>
+      <w:lvlJc w:val="left"/>
+      <w:pPr>
+        <w:tabs>
+          <w:tab w:val="num" w:pos="3600"/>
+        </w:tabs>
+        <w:ind w:left="3600" w:hanging="360"/>
+      </w:pPr>
+    </w:lvl>
+    <w:lvl w:ilvl="5" w:tentative="1">
+      <w:start w:val="1"/>
+      <w:numFmt w:val="decimal"/>
+      <w:lvlText w:val="%6."/>
+      <w:lvlJc w:val="left"/>
+      <w:pPr>
+        <w:tabs>
+          <w:tab w:val="num" w:pos="4320"/>
+        </w:tabs>
+        <w:ind w:left="4320" w:hanging="360"/>
+      </w:pPr>
+    </w:lvl>
+    <w:lvl w:ilvl="6" w:tentative="1">
+      <w:start w:val="1"/>
+      <w:numFmt w:val="decimal"/>
+      <w:lvlText w:val="%7."/>
+      <w:lvlJc w:val="left"/>
+      <w:pPr>
+        <w:tabs>
+          <w:tab w:val="num" w:pos="5040"/>
+        </w:tabs>
+        <w:ind w:left="5040" w:hanging="360"/>
+      </w:pPr>
+    </w:lvl>
+    <w:lvl w:ilvl="7" w:tentative="1">
+      <w:start w:val="1"/>
+      <w:numFmt w:val="decimal"/>
+      <w:lvlText w:val="%8."/>
+      <w:lvlJc w:val="left"/>
+      <w:pPr>
+        <w:tabs>
+          <w:tab w:val="num" w:pos="5760"/>
+        </w:tabs>
+        <w:ind w:left="5760" w:hanging="360"/>
+      </w:pPr>
+    </w:lvl>
+    <w:lvl w:ilvl="8" w:tentative="1">
+      <w:start w:val="1"/>
+      <w:numFmt w:val="decimal"/>
+      <w:lvlText w:val="%9."/>
+      <w:lvlJc w:val="left"/>
+      <w:pPr>
+        <w:tabs>
+          <w:tab w:val="num" w:pos="6480"/>
+        </w:tabs>
+        <w:ind w:left="6480" w:hanging="360"/>
+      </w:pPr>
+    </w:lvl>
+  </w:abstractNum>
+  <w:abstractNum w:abstractNumId="22" w15:restartNumberingAfterBreak="0">
+    <w:nsid w:val="69731E7F"/>
+    <w:multiLevelType w:val="multilevel"/>
+    <w:tmpl w:val="4FEA352E"/>
     <w:lvl w:ilvl="0">
       <w:start w:val="1"/>
       <w:numFmt w:val="bullet"/>
@@ -11391,834 +12083,185 @@
       </w:rPr>
     </w:lvl>
   </w:abstractNum>
-  <w:abstractNum w:abstractNumId="12" w15:restartNumberingAfterBreak="0">
-    <w:nsid w:val="572A226F"/>
-    <w:multiLevelType w:val="multilevel"/>
-    <w:tmpl w:val="81FC1D9E"/>
-    <w:lvl w:ilvl="0">
+  <w:abstractNum w:abstractNumId="23" w15:restartNumberingAfterBreak="0">
+    <w:nsid w:val="6DE2596E"/>
+    <w:multiLevelType w:val="hybridMultilevel"/>
+    <w:tmpl w:val="4C4C890E"/>
+    <w:lvl w:ilvl="0" w:tplc="0409000F">
       <w:start w:val="1"/>
       <w:numFmt w:val="decimal"/>
       <w:lvlText w:val="%1."/>
       <w:lvlJc w:val="left"/>
       <w:pPr>
-        <w:tabs>
-          <w:tab w:val="num" w:pos="720"/>
-        </w:tabs>
         <w:ind w:left="720" w:hanging="360"/>
       </w:pPr>
-    </w:lvl>
-    <w:lvl w:ilvl="1" w:tentative="1">
-      <w:start w:val="1"/>
-      <w:numFmt w:val="decimal"/>
+      <w:rPr>
+        <w:rFonts w:hint="default"/>
+      </w:rPr>
+    </w:lvl>
+    <w:lvl w:ilvl="1" w:tplc="04090019" w:tentative="1">
+      <w:start w:val="1"/>
+      <w:numFmt w:val="lowerLetter"/>
       <w:lvlText w:val="%2."/>
       <w:lvlJc w:val="left"/>
       <w:pPr>
-        <w:tabs>
-          <w:tab w:val="num" w:pos="1440"/>
-        </w:tabs>
         <w:ind w:left="1440" w:hanging="360"/>
       </w:pPr>
     </w:lvl>
-    <w:lvl w:ilvl="2" w:tentative="1">
-      <w:start w:val="1"/>
-      <w:numFmt w:val="decimal"/>
+    <w:lvl w:ilvl="2" w:tplc="0409001B" w:tentative="1">
+      <w:start w:val="1"/>
+      <w:numFmt w:val="lowerRoman"/>
       <w:lvlText w:val="%3."/>
-      <w:lvlJc w:val="left"/>
-      <w:pPr>
-        <w:tabs>
-          <w:tab w:val="num" w:pos="2160"/>
-        </w:tabs>
-        <w:ind w:left="2160" w:hanging="360"/>
-      </w:pPr>
-    </w:lvl>
-    <w:lvl w:ilvl="3" w:tentative="1">
+      <w:lvlJc w:val="right"/>
+      <w:pPr>
+        <w:ind w:left="2160" w:hanging="180"/>
+      </w:pPr>
+    </w:lvl>
+    <w:lvl w:ilvl="3" w:tplc="0409000F" w:tentative="1">
       <w:start w:val="1"/>
       <w:numFmt w:val="decimal"/>
       <w:lvlText w:val="%4."/>
       <w:lvlJc w:val="left"/>
       <w:pPr>
-        <w:tabs>
-          <w:tab w:val="num" w:pos="2880"/>
-        </w:tabs>
         <w:ind w:left="2880" w:hanging="360"/>
       </w:pPr>
     </w:lvl>
-    <w:lvl w:ilvl="4" w:tentative="1">
-      <w:start w:val="1"/>
-      <w:numFmt w:val="decimal"/>
+    <w:lvl w:ilvl="4" w:tplc="04090019" w:tentative="1">
+      <w:start w:val="1"/>
+      <w:numFmt w:val="lowerLetter"/>
       <w:lvlText w:val="%5."/>
       <w:lvlJc w:val="left"/>
       <w:pPr>
-        <w:tabs>
-          <w:tab w:val="num" w:pos="3600"/>
-        </w:tabs>
         <w:ind w:left="3600" w:hanging="360"/>
       </w:pPr>
     </w:lvl>
-    <w:lvl w:ilvl="5" w:tentative="1">
-      <w:start w:val="1"/>
-      <w:numFmt w:val="decimal"/>
+    <w:lvl w:ilvl="5" w:tplc="0409001B" w:tentative="1">
+      <w:start w:val="1"/>
+      <w:numFmt w:val="lowerRoman"/>
       <w:lvlText w:val="%6."/>
-      <w:lvlJc w:val="left"/>
-      <w:pPr>
-        <w:tabs>
-          <w:tab w:val="num" w:pos="4320"/>
-        </w:tabs>
-        <w:ind w:left="4320" w:hanging="360"/>
-      </w:pPr>
-    </w:lvl>
-    <w:lvl w:ilvl="6" w:tentative="1">
+      <w:lvlJc w:val="right"/>
+      <w:pPr>
+        <w:ind w:left="4320" w:hanging="180"/>
+      </w:pPr>
+    </w:lvl>
+    <w:lvl w:ilvl="6" w:tplc="0409000F" w:tentative="1">
       <w:start w:val="1"/>
       <w:numFmt w:val="decimal"/>
       <w:lvlText w:val="%7."/>
       <w:lvlJc w:val="left"/>
       <w:pPr>
-        <w:tabs>
-          <w:tab w:val="num" w:pos="5040"/>
-        </w:tabs>
         <w:ind w:left="5040" w:hanging="360"/>
       </w:pPr>
     </w:lvl>
-    <w:lvl w:ilvl="7" w:tentative="1">
-      <w:start w:val="1"/>
-      <w:numFmt w:val="decimal"/>
+    <w:lvl w:ilvl="7" w:tplc="04090019" w:tentative="1">
+      <w:start w:val="1"/>
+      <w:numFmt w:val="lowerLetter"/>
       <w:lvlText w:val="%8."/>
       <w:lvlJc w:val="left"/>
       <w:pPr>
-        <w:tabs>
-          <w:tab w:val="num" w:pos="5760"/>
-        </w:tabs>
         <w:ind w:left="5760" w:hanging="360"/>
       </w:pPr>
     </w:lvl>
-    <w:lvl w:ilvl="8" w:tentative="1">
-      <w:start w:val="1"/>
-      <w:numFmt w:val="decimal"/>
+    <w:lvl w:ilvl="8" w:tplc="0409001B" w:tentative="1">
+      <w:start w:val="1"/>
+      <w:numFmt w:val="lowerRoman"/>
       <w:lvlText w:val="%9."/>
-      <w:lvlJc w:val="left"/>
-      <w:pPr>
-        <w:tabs>
-          <w:tab w:val="num" w:pos="6480"/>
-        </w:tabs>
-        <w:ind w:left="6480" w:hanging="360"/>
+      <w:lvlJc w:val="right"/>
+      <w:pPr>
+        <w:ind w:left="6480" w:hanging="180"/>
       </w:pPr>
     </w:lvl>
   </w:abstractNum>
-  <w:abstractNum w:abstractNumId="13" w15:restartNumberingAfterBreak="0">
-    <w:nsid w:val="5BF5117B"/>
-    <w:multiLevelType w:val="multilevel"/>
-    <w:tmpl w:val="8A1481F6"/>
-    <w:lvl w:ilvl="0">
+  <w:abstractNum w:abstractNumId="24" w15:restartNumberingAfterBreak="0">
+    <w:nsid w:val="75520C24"/>
+    <w:multiLevelType w:val="hybridMultilevel"/>
+    <w:tmpl w:val="FCCE1BF6"/>
+    <w:lvl w:ilvl="0" w:tplc="0409000F">
       <w:start w:val="1"/>
       <w:numFmt w:val="decimal"/>
       <w:lvlText w:val="%1."/>
       <w:lvlJc w:val="left"/>
       <w:pPr>
-        <w:tabs>
-          <w:tab w:val="num" w:pos="720"/>
-        </w:tabs>
         <w:ind w:left="720" w:hanging="360"/>
       </w:pPr>
-    </w:lvl>
-    <w:lvl w:ilvl="1" w:tentative="1">
-      <w:start w:val="1"/>
-      <w:numFmt w:val="decimal"/>
+      <w:rPr>
+        <w:rFonts w:hint="default"/>
+      </w:rPr>
+    </w:lvl>
+    <w:lvl w:ilvl="1" w:tplc="04090019" w:tentative="1">
+      <w:start w:val="1"/>
+      <w:numFmt w:val="lowerLetter"/>
       <w:lvlText w:val="%2."/>
       <w:lvlJc w:val="left"/>
       <w:pPr>
-        <w:tabs>
-          <w:tab w:val="num" w:pos="1440"/>
-        </w:tabs>
         <w:ind w:left="1440" w:hanging="360"/>
       </w:pPr>
     </w:lvl>
-    <w:lvl w:ilvl="2" w:tentative="1">
-      <w:start w:val="1"/>
-      <w:numFmt w:val="decimal"/>
+    <w:lvl w:ilvl="2" w:tplc="0409001B" w:tentative="1">
+      <w:start w:val="1"/>
+      <w:numFmt w:val="lowerRoman"/>
       <w:lvlText w:val="%3."/>
-      <w:lvlJc w:val="left"/>
-      <w:pPr>
-        <w:tabs>
-          <w:tab w:val="num" w:pos="2160"/>
-        </w:tabs>
-        <w:ind w:left="2160" w:hanging="360"/>
-      </w:pPr>
-    </w:lvl>
-    <w:lvl w:ilvl="3" w:tentative="1">
+      <w:lvlJc w:val="right"/>
+      <w:pPr>
+        <w:ind w:left="2160" w:hanging="180"/>
+      </w:pPr>
+    </w:lvl>
+    <w:lvl w:ilvl="3" w:tplc="0409000F" w:tentative="1">
       <w:start w:val="1"/>
       <w:numFmt w:val="decimal"/>
       <w:lvlText w:val="%4."/>
       <w:lvlJc w:val="left"/>
       <w:pPr>
-        <w:tabs>
-          <w:tab w:val="num" w:pos="2880"/>
-        </w:tabs>
         <w:ind w:left="2880" w:hanging="360"/>
       </w:pPr>
     </w:lvl>
-    <w:lvl w:ilvl="4" w:tentative="1">
-      <w:start w:val="1"/>
-      <w:numFmt w:val="decimal"/>
+    <w:lvl w:ilvl="4" w:tplc="04090019" w:tentative="1">
+      <w:start w:val="1"/>
+      <w:numFmt w:val="lowerLetter"/>
       <w:lvlText w:val="%5."/>
       <w:lvlJc w:val="left"/>
       <w:pPr>
-        <w:tabs>
-          <w:tab w:val="num" w:pos="3600"/>
-        </w:tabs>
         <w:ind w:left="3600" w:hanging="360"/>
       </w:pPr>
     </w:lvl>
-    <w:lvl w:ilvl="5" w:tentative="1">
-      <w:start w:val="1"/>
-      <w:numFmt w:val="decimal"/>
+    <w:lvl w:ilvl="5" w:tplc="0409001B" w:tentative="1">
+      <w:start w:val="1"/>
+      <w:numFmt w:val="lowerRoman"/>
       <w:lvlText w:val="%6."/>
-      <w:lvlJc w:val="left"/>
-      <w:pPr>
-        <w:tabs>
-          <w:tab w:val="num" w:pos="4320"/>
-        </w:tabs>
-        <w:ind w:left="4320" w:hanging="360"/>
-      </w:pPr>
-    </w:lvl>
-    <w:lvl w:ilvl="6" w:tentative="1">
+      <w:lvlJc w:val="right"/>
+      <w:pPr>
+        <w:ind w:left="4320" w:hanging="180"/>
+      </w:pPr>
+    </w:lvl>
+    <w:lvl w:ilvl="6" w:tplc="0409000F" w:tentative="1">
       <w:start w:val="1"/>
       <w:numFmt w:val="decimal"/>
       <w:lvlText w:val="%7."/>
       <w:lvlJc w:val="left"/>
       <w:pPr>
-        <w:tabs>
-          <w:tab w:val="num" w:pos="5040"/>
-        </w:tabs>
         <w:ind w:left="5040" w:hanging="360"/>
       </w:pPr>
     </w:lvl>
-    <w:lvl w:ilvl="7" w:tentative="1">
-      <w:start w:val="1"/>
-      <w:numFmt w:val="decimal"/>
+    <w:lvl w:ilvl="7" w:tplc="04090019" w:tentative="1">
+      <w:start w:val="1"/>
+      <w:numFmt w:val="lowerLetter"/>
       <w:lvlText w:val="%8."/>
       <w:lvlJc w:val="left"/>
       <w:pPr>
-        <w:tabs>
-          <w:tab w:val="num" w:pos="5760"/>
-        </w:tabs>
         <w:ind w:left="5760" w:hanging="360"/>
       </w:pPr>
     </w:lvl>
-    <w:lvl w:ilvl="8" w:tentative="1">
-      <w:start w:val="1"/>
-      <w:numFmt w:val="decimal"/>
+    <w:lvl w:ilvl="8" w:tplc="0409001B" w:tentative="1">
+      <w:start w:val="1"/>
+      <w:numFmt w:val="lowerRoman"/>
       <w:lvlText w:val="%9."/>
-      <w:lvlJc w:val="left"/>
-      <w:pPr>
-        <w:tabs>
-          <w:tab w:val="num" w:pos="6480"/>
-        </w:tabs>
-        <w:ind w:left="6480" w:hanging="360"/>
+      <w:lvlJc w:val="right"/>
+      <w:pPr>
+        <w:ind w:left="6480" w:hanging="180"/>
       </w:pPr>
     </w:lvl>
   </w:abstractNum>
-  <w:abstractNum w:abstractNumId="14" w15:restartNumberingAfterBreak="0">
-    <w:nsid w:val="5D3E6FA0"/>
-    <w:multiLevelType w:val="multilevel"/>
-    <w:tmpl w:val="1DD496E8"/>
-    <w:lvl w:ilvl="0">
-      <w:start w:val="1"/>
-      <w:numFmt w:val="decimal"/>
-      <w:lvlText w:val="%1."/>
-      <w:lvlJc w:val="left"/>
-      <w:pPr>
-        <w:tabs>
-          <w:tab w:val="num" w:pos="720"/>
-        </w:tabs>
-        <w:ind w:left="720" w:hanging="360"/>
-      </w:pPr>
-    </w:lvl>
-    <w:lvl w:ilvl="1" w:tentative="1">
-      <w:start w:val="1"/>
-      <w:numFmt w:val="decimal"/>
-      <w:lvlText w:val="%2."/>
-      <w:lvlJc w:val="left"/>
-      <w:pPr>
-        <w:tabs>
-          <w:tab w:val="num" w:pos="1440"/>
-        </w:tabs>
-        <w:ind w:left="1440" w:hanging="360"/>
-      </w:pPr>
-    </w:lvl>
-    <w:lvl w:ilvl="2" w:tentative="1">
-      <w:start w:val="1"/>
-      <w:numFmt w:val="decimal"/>
-      <w:lvlText w:val="%3."/>
-      <w:lvlJc w:val="left"/>
-      <w:pPr>
-        <w:tabs>
-          <w:tab w:val="num" w:pos="2160"/>
-        </w:tabs>
-        <w:ind w:left="2160" w:hanging="360"/>
-      </w:pPr>
-    </w:lvl>
-    <w:lvl w:ilvl="3" w:tentative="1">
-      <w:start w:val="1"/>
-      <w:numFmt w:val="decimal"/>
-      <w:lvlText w:val="%4."/>
-      <w:lvlJc w:val="left"/>
-      <w:pPr>
-        <w:tabs>
-          <w:tab w:val="num" w:pos="2880"/>
-        </w:tabs>
-        <w:ind w:left="2880" w:hanging="360"/>
-      </w:pPr>
-    </w:lvl>
-    <w:lvl w:ilvl="4" w:tentative="1">
-      <w:start w:val="1"/>
-      <w:numFmt w:val="decimal"/>
-      <w:lvlText w:val="%5."/>
-      <w:lvlJc w:val="left"/>
-      <w:pPr>
-        <w:tabs>
-          <w:tab w:val="num" w:pos="3600"/>
-        </w:tabs>
-        <w:ind w:left="3600" w:hanging="360"/>
-      </w:pPr>
-    </w:lvl>
-    <w:lvl w:ilvl="5" w:tentative="1">
-      <w:start w:val="1"/>
-      <w:numFmt w:val="decimal"/>
-      <w:lvlText w:val="%6."/>
-      <w:lvlJc w:val="left"/>
-      <w:pPr>
-        <w:tabs>
-          <w:tab w:val="num" w:pos="4320"/>
-        </w:tabs>
-        <w:ind w:left="4320" w:hanging="360"/>
-      </w:pPr>
-    </w:lvl>
-    <w:lvl w:ilvl="6" w:tentative="1">
-      <w:start w:val="1"/>
-      <w:numFmt w:val="decimal"/>
-      <w:lvlText w:val="%7."/>
-      <w:lvlJc w:val="left"/>
-      <w:pPr>
-        <w:tabs>
-          <w:tab w:val="num" w:pos="5040"/>
-        </w:tabs>
-        <w:ind w:left="5040" w:hanging="360"/>
-      </w:pPr>
-    </w:lvl>
-    <w:lvl w:ilvl="7" w:tentative="1">
-      <w:start w:val="1"/>
-      <w:numFmt w:val="decimal"/>
-      <w:lvlText w:val="%8."/>
-      <w:lvlJc w:val="left"/>
-      <w:pPr>
-        <w:tabs>
-          <w:tab w:val="num" w:pos="5760"/>
-        </w:tabs>
-        <w:ind w:left="5760" w:hanging="360"/>
-      </w:pPr>
-    </w:lvl>
-    <w:lvl w:ilvl="8" w:tentative="1">
-      <w:start w:val="1"/>
-      <w:numFmt w:val="decimal"/>
-      <w:lvlText w:val="%9."/>
-      <w:lvlJc w:val="left"/>
-      <w:pPr>
-        <w:tabs>
-          <w:tab w:val="num" w:pos="6480"/>
-        </w:tabs>
-        <w:ind w:left="6480" w:hanging="360"/>
-      </w:pPr>
-    </w:lvl>
-  </w:abstractNum>
-  <w:abstractNum w:abstractNumId="15" w15:restartNumberingAfterBreak="0">
-    <w:nsid w:val="5F935511"/>
-    <w:multiLevelType w:val="multilevel"/>
-    <w:tmpl w:val="44AE5600"/>
-    <w:lvl w:ilvl="0">
-      <w:start w:val="1"/>
-      <w:numFmt w:val="decimal"/>
-      <w:lvlText w:val="%1."/>
-      <w:lvlJc w:val="left"/>
-      <w:pPr>
-        <w:tabs>
-          <w:tab w:val="num" w:pos="720"/>
-        </w:tabs>
-        <w:ind w:left="720" w:hanging="360"/>
-      </w:pPr>
-    </w:lvl>
-    <w:lvl w:ilvl="1" w:tentative="1">
-      <w:start w:val="1"/>
-      <w:numFmt w:val="decimal"/>
-      <w:lvlText w:val="%2."/>
-      <w:lvlJc w:val="left"/>
-      <w:pPr>
-        <w:tabs>
-          <w:tab w:val="num" w:pos="1440"/>
-        </w:tabs>
-        <w:ind w:left="1440" w:hanging="360"/>
-      </w:pPr>
-    </w:lvl>
-    <w:lvl w:ilvl="2" w:tentative="1">
-      <w:start w:val="1"/>
-      <w:numFmt w:val="decimal"/>
-      <w:lvlText w:val="%3."/>
-      <w:lvlJc w:val="left"/>
-      <w:pPr>
-        <w:tabs>
-          <w:tab w:val="num" w:pos="2160"/>
-        </w:tabs>
-        <w:ind w:left="2160" w:hanging="360"/>
-      </w:pPr>
-    </w:lvl>
-    <w:lvl w:ilvl="3" w:tentative="1">
-      <w:start w:val="1"/>
-      <w:numFmt w:val="decimal"/>
-      <w:lvlText w:val="%4."/>
-      <w:lvlJc w:val="left"/>
-      <w:pPr>
-        <w:tabs>
-          <w:tab w:val="num" w:pos="2880"/>
-        </w:tabs>
-        <w:ind w:left="2880" w:hanging="360"/>
-      </w:pPr>
-    </w:lvl>
-    <w:lvl w:ilvl="4" w:tentative="1">
-      <w:start w:val="1"/>
-      <w:numFmt w:val="decimal"/>
-      <w:lvlText w:val="%5."/>
-      <w:lvlJc w:val="left"/>
-      <w:pPr>
-        <w:tabs>
-          <w:tab w:val="num" w:pos="3600"/>
-        </w:tabs>
-        <w:ind w:left="3600" w:hanging="360"/>
-      </w:pPr>
-    </w:lvl>
-    <w:lvl w:ilvl="5" w:tentative="1">
-      <w:start w:val="1"/>
-      <w:numFmt w:val="decimal"/>
-      <w:lvlText w:val="%6."/>
-      <w:lvlJc w:val="left"/>
-      <w:pPr>
-        <w:tabs>
-          <w:tab w:val="num" w:pos="4320"/>
-        </w:tabs>
-        <w:ind w:left="4320" w:hanging="360"/>
-      </w:pPr>
-    </w:lvl>
-    <w:lvl w:ilvl="6" w:tentative="1">
-      <w:start w:val="1"/>
-      <w:numFmt w:val="decimal"/>
-      <w:lvlText w:val="%7."/>
-      <w:lvlJc w:val="left"/>
-      <w:pPr>
-        <w:tabs>
-          <w:tab w:val="num" w:pos="5040"/>
-        </w:tabs>
-        <w:ind w:left="5040" w:hanging="360"/>
-      </w:pPr>
-    </w:lvl>
-    <w:lvl w:ilvl="7" w:tentative="1">
-      <w:start w:val="1"/>
-      <w:numFmt w:val="decimal"/>
-      <w:lvlText w:val="%8."/>
-      <w:lvlJc w:val="left"/>
-      <w:pPr>
-        <w:tabs>
-          <w:tab w:val="num" w:pos="5760"/>
-        </w:tabs>
-        <w:ind w:left="5760" w:hanging="360"/>
-      </w:pPr>
-    </w:lvl>
-    <w:lvl w:ilvl="8" w:tentative="1">
-      <w:start w:val="1"/>
-      <w:numFmt w:val="decimal"/>
-      <w:lvlText w:val="%9."/>
-      <w:lvlJc w:val="left"/>
-      <w:pPr>
-        <w:tabs>
-          <w:tab w:val="num" w:pos="6480"/>
-        </w:tabs>
-        <w:ind w:left="6480" w:hanging="360"/>
-      </w:pPr>
-    </w:lvl>
-  </w:abstractNum>
-  <w:abstractNum w:abstractNumId="16" w15:restartNumberingAfterBreak="0">
-    <w:nsid w:val="62330FFA"/>
-    <w:multiLevelType w:val="multilevel"/>
-    <w:tmpl w:val="1354050A"/>
-    <w:lvl w:ilvl="0">
-      <w:start w:val="1"/>
-      <w:numFmt w:val="decimal"/>
-      <w:lvlText w:val="%1."/>
-      <w:lvlJc w:val="left"/>
-      <w:pPr>
-        <w:tabs>
-          <w:tab w:val="num" w:pos="720"/>
-        </w:tabs>
-        <w:ind w:left="720" w:hanging="360"/>
-      </w:pPr>
-    </w:lvl>
-    <w:lvl w:ilvl="1" w:tentative="1">
-      <w:start w:val="1"/>
-      <w:numFmt w:val="decimal"/>
-      <w:lvlText w:val="%2."/>
-      <w:lvlJc w:val="left"/>
-      <w:pPr>
-        <w:tabs>
-          <w:tab w:val="num" w:pos="1440"/>
-        </w:tabs>
-        <w:ind w:left="1440" w:hanging="360"/>
-      </w:pPr>
-    </w:lvl>
-    <w:lvl w:ilvl="2" w:tentative="1">
-      <w:start w:val="1"/>
-      <w:numFmt w:val="decimal"/>
-      <w:lvlText w:val="%3."/>
-      <w:lvlJc w:val="left"/>
-      <w:pPr>
-        <w:tabs>
-          <w:tab w:val="num" w:pos="2160"/>
-        </w:tabs>
-        <w:ind w:left="2160" w:hanging="360"/>
-      </w:pPr>
-    </w:lvl>
-    <w:lvl w:ilvl="3" w:tentative="1">
-      <w:start w:val="1"/>
-      <w:numFmt w:val="decimal"/>
-      <w:lvlText w:val="%4."/>
-      <w:lvlJc w:val="left"/>
-      <w:pPr>
-        <w:tabs>
-          <w:tab w:val="num" w:pos="2880"/>
-        </w:tabs>
-        <w:ind w:left="2880" w:hanging="360"/>
-      </w:pPr>
-    </w:lvl>
-    <w:lvl w:ilvl="4" w:tentative="1">
-      <w:start w:val="1"/>
-      <w:numFmt w:val="decimal"/>
-      <w:lvlText w:val="%5."/>
-      <w:lvlJc w:val="left"/>
-      <w:pPr>
-        <w:tabs>
-          <w:tab w:val="num" w:pos="3600"/>
-        </w:tabs>
-        <w:ind w:left="3600" w:hanging="360"/>
-      </w:pPr>
-    </w:lvl>
-    <w:lvl w:ilvl="5" w:tentative="1">
-      <w:start w:val="1"/>
-      <w:numFmt w:val="decimal"/>
-      <w:lvlText w:val="%6."/>
-      <w:lvlJc w:val="left"/>
-      <w:pPr>
-        <w:tabs>
-          <w:tab w:val="num" w:pos="4320"/>
-        </w:tabs>
-        <w:ind w:left="4320" w:hanging="360"/>
-      </w:pPr>
-    </w:lvl>
-    <w:lvl w:ilvl="6" w:tentative="1">
-      <w:start w:val="1"/>
-      <w:numFmt w:val="decimal"/>
-      <w:lvlText w:val="%7."/>
-      <w:lvlJc w:val="left"/>
-      <w:pPr>
-        <w:tabs>
-          <w:tab w:val="num" w:pos="5040"/>
-        </w:tabs>
-        <w:ind w:left="5040" w:hanging="360"/>
-      </w:pPr>
-    </w:lvl>
-    <w:lvl w:ilvl="7" w:tentative="1">
-      <w:start w:val="1"/>
-      <w:numFmt w:val="decimal"/>
-      <w:lvlText w:val="%8."/>
-      <w:lvlJc w:val="left"/>
-      <w:pPr>
-        <w:tabs>
-          <w:tab w:val="num" w:pos="5760"/>
-        </w:tabs>
-        <w:ind w:left="5760" w:hanging="360"/>
-      </w:pPr>
-    </w:lvl>
-    <w:lvl w:ilvl="8" w:tentative="1">
-      <w:start w:val="1"/>
-      <w:numFmt w:val="decimal"/>
-      <w:lvlText w:val="%9."/>
-      <w:lvlJc w:val="left"/>
-      <w:pPr>
-        <w:tabs>
-          <w:tab w:val="num" w:pos="6480"/>
-        </w:tabs>
-        <w:ind w:left="6480" w:hanging="360"/>
-      </w:pPr>
-    </w:lvl>
-  </w:abstractNum>
-  <w:abstractNum w:abstractNumId="17" w15:restartNumberingAfterBreak="0">
-    <w:nsid w:val="653571BB"/>
-    <w:multiLevelType w:val="multilevel"/>
-    <w:tmpl w:val="E0F0DCF4"/>
-    <w:lvl w:ilvl="0">
-      <w:start w:val="1"/>
-      <w:numFmt w:val="decimal"/>
-      <w:lvlText w:val="%1."/>
-      <w:lvlJc w:val="left"/>
-      <w:pPr>
-        <w:tabs>
-          <w:tab w:val="num" w:pos="720"/>
-        </w:tabs>
-        <w:ind w:left="720" w:hanging="360"/>
-      </w:pPr>
-    </w:lvl>
-    <w:lvl w:ilvl="1" w:tentative="1">
-      <w:start w:val="1"/>
-      <w:numFmt w:val="decimal"/>
-      <w:lvlText w:val="%2."/>
-      <w:lvlJc w:val="left"/>
-      <w:pPr>
-        <w:tabs>
-          <w:tab w:val="num" w:pos="1440"/>
-        </w:tabs>
-        <w:ind w:left="1440" w:hanging="360"/>
-      </w:pPr>
-    </w:lvl>
-    <w:lvl w:ilvl="2" w:tentative="1">
-      <w:start w:val="1"/>
-      <w:numFmt w:val="decimal"/>
-      <w:lvlText w:val="%3."/>
-      <w:lvlJc w:val="left"/>
-      <w:pPr>
-        <w:tabs>
-          <w:tab w:val="num" w:pos="2160"/>
-        </w:tabs>
-        <w:ind w:left="2160" w:hanging="360"/>
-      </w:pPr>
-    </w:lvl>
-    <w:lvl w:ilvl="3" w:tentative="1">
-      <w:start w:val="1"/>
-      <w:numFmt w:val="decimal"/>
-      <w:lvlText w:val="%4."/>
-      <w:lvlJc w:val="left"/>
-      <w:pPr>
-        <w:tabs>
-          <w:tab w:val="num" w:pos="2880"/>
-        </w:tabs>
-        <w:ind w:left="2880" w:hanging="360"/>
-      </w:pPr>
-    </w:lvl>
-    <w:lvl w:ilvl="4" w:tentative="1">
-      <w:start w:val="1"/>
-      <w:numFmt w:val="decimal"/>
-      <w:lvlText w:val="%5."/>
-      <w:lvlJc w:val="left"/>
-      <w:pPr>
-        <w:tabs>
-          <w:tab w:val="num" w:pos="3600"/>
-        </w:tabs>
-        <w:ind w:left="3600" w:hanging="360"/>
-      </w:pPr>
-    </w:lvl>
-    <w:lvl w:ilvl="5" w:tentative="1">
-      <w:start w:val="1"/>
-      <w:numFmt w:val="decimal"/>
-      <w:lvlText w:val="%6."/>
-      <w:lvlJc w:val="left"/>
-      <w:pPr>
-        <w:tabs>
-          <w:tab w:val="num" w:pos="4320"/>
-        </w:tabs>
-        <w:ind w:left="4320" w:hanging="360"/>
-      </w:pPr>
-    </w:lvl>
-    <w:lvl w:ilvl="6" w:tentative="1">
-      <w:start w:val="1"/>
-      <w:numFmt w:val="decimal"/>
-      <w:lvlText w:val="%7."/>
-      <w:lvlJc w:val="left"/>
-      <w:pPr>
-        <w:tabs>
-          <w:tab w:val="num" w:pos="5040"/>
-        </w:tabs>
-        <w:ind w:left="5040" w:hanging="360"/>
-      </w:pPr>
-    </w:lvl>
-    <w:lvl w:ilvl="7" w:tentative="1">
-      <w:start w:val="1"/>
-      <w:numFmt w:val="decimal"/>
-      <w:lvlText w:val="%8."/>
-      <w:lvlJc w:val="left"/>
-      <w:pPr>
-        <w:tabs>
-          <w:tab w:val="num" w:pos="5760"/>
-        </w:tabs>
-        <w:ind w:left="5760" w:hanging="360"/>
-      </w:pPr>
-    </w:lvl>
-    <w:lvl w:ilvl="8" w:tentative="1">
-      <w:start w:val="1"/>
-      <w:numFmt w:val="decimal"/>
-      <w:lvlText w:val="%9."/>
-      <w:lvlJc w:val="left"/>
-      <w:pPr>
-        <w:tabs>
-          <w:tab w:val="num" w:pos="6480"/>
-        </w:tabs>
-        <w:ind w:left="6480" w:hanging="360"/>
-      </w:pPr>
-    </w:lvl>
-  </w:abstractNum>
-  <w:abstractNum w:abstractNumId="18" w15:restartNumberingAfterBreak="0">
-    <w:nsid w:val="69731E7F"/>
-    <w:multiLevelType w:val="multilevel"/>
-    <w:tmpl w:val="4FEA352E"/>
-    <w:lvl w:ilvl="0">
-      <w:start w:val="1"/>
-      <w:numFmt w:val="bullet"/>
-      <w:lvlText w:val=""/>
-      <w:lvlJc w:val="left"/>
-      <w:pPr>
-        <w:tabs>
-          <w:tab w:val="num" w:pos="720"/>
-        </w:tabs>
-        <w:ind w:left="720" w:hanging="360"/>
-      </w:pPr>
-      <w:rPr>
-        <w:rFonts w:ascii="Symbol" w:hAnsi="Symbol" w:hint="default"/>
-        <w:sz w:val="20"/>
-      </w:rPr>
-    </w:lvl>
-    <w:lvl w:ilvl="1" w:tentative="1">
-      <w:start w:val="1"/>
-      <w:numFmt w:val="bullet"/>
-      <w:lvlText w:val="o"/>
-      <w:lvlJc w:val="left"/>
-      <w:pPr>
-        <w:tabs>
-          <w:tab w:val="num" w:pos="1440"/>
-        </w:tabs>
-        <w:ind w:left="1440" w:hanging="360"/>
-      </w:pPr>
-      <w:rPr>
-        <w:rFonts w:ascii="Courier New" w:hAnsi="Courier New" w:hint="default"/>
-        <w:sz w:val="20"/>
-      </w:rPr>
-    </w:lvl>
-    <w:lvl w:ilvl="2" w:tentative="1">
-      <w:start w:val="1"/>
-      <w:numFmt w:val="bullet"/>
-      <w:lvlText w:val=""/>
-      <w:lvlJc w:val="left"/>
-      <w:pPr>
-        <w:tabs>
-          <w:tab w:val="num" w:pos="2160"/>
-        </w:tabs>
-        <w:ind w:left="2160" w:hanging="360"/>
-      </w:pPr>
-      <w:rPr>
-        <w:rFonts w:ascii="Wingdings" w:hAnsi="Wingdings" w:hint="default"/>
-        <w:sz w:val="20"/>
-      </w:rPr>
-    </w:lvl>
-    <w:lvl w:ilvl="3" w:tentative="1">
-      <w:start w:val="1"/>
-      <w:numFmt w:val="bullet"/>
-      <w:lvlText w:val=""/>
-      <w:lvlJc w:val="left"/>
-      <w:pPr>
-        <w:tabs>
-          <w:tab w:val="num" w:pos="2880"/>
-        </w:tabs>
-        <w:ind w:left="2880" w:hanging="360"/>
-      </w:pPr>
-      <w:rPr>
-        <w:rFonts w:ascii="Wingdings" w:hAnsi="Wingdings" w:hint="default"/>
-        <w:sz w:val="20"/>
-      </w:rPr>
-    </w:lvl>
-    <w:lvl w:ilvl="4" w:tentative="1">
-      <w:start w:val="1"/>
-      <w:numFmt w:val="bullet"/>
-      <w:lvlText w:val=""/>
-      <w:lvlJc w:val="left"/>
-      <w:pPr>
-        <w:tabs>
-          <w:tab w:val="num" w:pos="3600"/>
-        </w:tabs>
-        <w:ind w:left="3600" w:hanging="360"/>
-      </w:pPr>
-      <w:rPr>
-        <w:rFonts w:ascii="Wingdings" w:hAnsi="Wingdings" w:hint="default"/>
-        <w:sz w:val="20"/>
-      </w:rPr>
-    </w:lvl>
-    <w:lvl w:ilvl="5" w:tentative="1">
-      <w:start w:val="1"/>
-      <w:numFmt w:val="bullet"/>
-      <w:lvlText w:val=""/>
-      <w:lvlJc w:val="left"/>
-      <w:pPr>
-        <w:tabs>
-          <w:tab w:val="num" w:pos="4320"/>
-        </w:tabs>
-        <w:ind w:left="4320" w:hanging="360"/>
-      </w:pPr>
-      <w:rPr>
-        <w:rFonts w:ascii="Wingdings" w:hAnsi="Wingdings" w:hint="default"/>
-        <w:sz w:val="20"/>
-      </w:rPr>
-    </w:lvl>
-    <w:lvl w:ilvl="6" w:tentative="1">
-      <w:start w:val="1"/>
-      <w:numFmt w:val="bullet"/>
-      <w:lvlText w:val=""/>
-      <w:lvlJc w:val="left"/>
-      <w:pPr>
-        <w:tabs>
-          <w:tab w:val="num" w:pos="5040"/>
-        </w:tabs>
-        <w:ind w:left="5040" w:hanging="360"/>
-      </w:pPr>
-      <w:rPr>
-        <w:rFonts w:ascii="Wingdings" w:hAnsi="Wingdings" w:hint="default"/>
-        <w:sz w:val="20"/>
-      </w:rPr>
-    </w:lvl>
-    <w:lvl w:ilvl="7" w:tentative="1">
-      <w:start w:val="1"/>
-      <w:numFmt w:val="bullet"/>
-      <w:lvlText w:val=""/>
-      <w:lvlJc w:val="left"/>
-      <w:pPr>
-        <w:tabs>
-          <w:tab w:val="num" w:pos="5760"/>
-        </w:tabs>
-        <w:ind w:left="5760" w:hanging="360"/>
-      </w:pPr>
-      <w:rPr>
-        <w:rFonts w:ascii="Wingdings" w:hAnsi="Wingdings" w:hint="default"/>
-        <w:sz w:val="20"/>
-      </w:rPr>
-    </w:lvl>
-    <w:lvl w:ilvl="8" w:tentative="1">
-      <w:start w:val="1"/>
-      <w:numFmt w:val="bullet"/>
-      <w:lvlText w:val=""/>
-      <w:lvlJc w:val="left"/>
-      <w:pPr>
-        <w:tabs>
-          <w:tab w:val="num" w:pos="6480"/>
-        </w:tabs>
-        <w:ind w:left="6480" w:hanging="360"/>
-      </w:pPr>
-      <w:rPr>
-        <w:rFonts w:ascii="Wingdings" w:hAnsi="Wingdings" w:hint="default"/>
-        <w:sz w:val="20"/>
-      </w:rPr>
-    </w:lvl>
-  </w:abstractNum>
-  <w:abstractNum w:abstractNumId="19" w15:restartNumberingAfterBreak="0">
+  <w:abstractNum w:abstractNumId="25" w15:restartNumberingAfterBreak="0">
     <w:nsid w:val="76FC0259"/>
     <w:multiLevelType w:val="multilevel"/>
     <w:tmpl w:val="79680AA4"/>
@@ -12331,7 +12374,7 @@
       </w:pPr>
     </w:lvl>
   </w:abstractNum>
-  <w:abstractNum w:abstractNumId="20" w15:restartNumberingAfterBreak="0">
+  <w:abstractNum w:abstractNumId="26" w15:restartNumberingAfterBreak="0">
     <w:nsid w:val="77A70C23"/>
     <w:multiLevelType w:val="multilevel"/>
     <w:tmpl w:val="8E221C46"/>
@@ -12448,64 +12491,82 @@
     <w:abstractNumId w:val="0"/>
   </w:num>
   <w:num w:numId="2" w16cid:durableId="1361010676">
+    <w:abstractNumId w:val="7"/>
+  </w:num>
+  <w:num w:numId="3" w16cid:durableId="1561554637">
+    <w:abstractNumId w:val="16"/>
+  </w:num>
+  <w:num w:numId="4" w16cid:durableId="1987002333">
+    <w:abstractNumId w:val="26"/>
+  </w:num>
+  <w:num w:numId="5" w16cid:durableId="1029794338">
+    <w:abstractNumId w:val="13"/>
+  </w:num>
+  <w:num w:numId="6" w16cid:durableId="1650086756">
+    <w:abstractNumId w:val="18"/>
+  </w:num>
+  <w:num w:numId="7" w16cid:durableId="1476222975">
+    <w:abstractNumId w:val="25"/>
+  </w:num>
+  <w:num w:numId="8" w16cid:durableId="1533764241">
+    <w:abstractNumId w:val="2"/>
+  </w:num>
+  <w:num w:numId="9" w16cid:durableId="1439301835">
     <w:abstractNumId w:val="4"/>
   </w:num>
-  <w:num w:numId="3" w16cid:durableId="1561554637">
+  <w:num w:numId="10" w16cid:durableId="1801418588">
+    <w:abstractNumId w:val="3"/>
+  </w:num>
+  <w:num w:numId="11" w16cid:durableId="793057457">
+    <w:abstractNumId w:val="17"/>
+  </w:num>
+  <w:num w:numId="12" w16cid:durableId="2146773725">
+    <w:abstractNumId w:val="21"/>
+  </w:num>
+  <w:num w:numId="13" w16cid:durableId="1026561013">
+    <w:abstractNumId w:val="9"/>
+  </w:num>
+  <w:num w:numId="14" w16cid:durableId="1192110950">
+    <w:abstractNumId w:val="19"/>
+  </w:num>
+  <w:num w:numId="15" w16cid:durableId="1262841238">
+    <w:abstractNumId w:val="8"/>
+  </w:num>
+  <w:num w:numId="16" w16cid:durableId="155341019">
+    <w:abstractNumId w:val="15"/>
+  </w:num>
+  <w:num w:numId="17" w16cid:durableId="1040785662">
+    <w:abstractNumId w:val="14"/>
+  </w:num>
+  <w:num w:numId="18" w16cid:durableId="1409767320">
+    <w:abstractNumId w:val="22"/>
+  </w:num>
+  <w:num w:numId="19" w16cid:durableId="2045591211">
+    <w:abstractNumId w:val="10"/>
+  </w:num>
+  <w:num w:numId="20" w16cid:durableId="1764063768">
+    <w:abstractNumId w:val="20"/>
+  </w:num>
+  <w:num w:numId="21" w16cid:durableId="218832961">
     <w:abstractNumId w:val="12"/>
   </w:num>
-  <w:num w:numId="4" w16cid:durableId="1987002333">
-    <w:abstractNumId w:val="20"/>
+  <w:num w:numId="22" w16cid:durableId="2045669289">
+    <w:abstractNumId w:val="24"/>
   </w:num>
-  <w:num w:numId="5" w16cid:durableId="1029794338">
-    <w:abstractNumId w:val="9"/>
+  <w:num w:numId="23" w16cid:durableId="953443745">
+    <w:abstractNumId w:val="6"/>
   </w:num>
-  <w:num w:numId="6" w16cid:durableId="1650086756">
-    <w:abstractNumId w:val="14"/>
+  <w:num w:numId="24" w16cid:durableId="1489975285">
+    <w:abstractNumId w:val="5"/>
   </w:num>
-  <w:num w:numId="7" w16cid:durableId="1476222975">
-    <w:abstractNumId w:val="19"/>
-  </w:num>
-  <w:num w:numId="8" w16cid:durableId="1533764241">
+  <w:num w:numId="25" w16cid:durableId="2023780096">
     <w:abstractNumId w:val="1"/>
   </w:num>
-  <w:num w:numId="9" w16cid:durableId="1439301835">
-    <w:abstractNumId w:val="3"/>
+  <w:num w:numId="26" w16cid:durableId="1365129283">
+    <w:abstractNumId w:val="23"/>
   </w:num>
-  <w:num w:numId="10" w16cid:durableId="1801418588">
-    <w:abstractNumId w:val="2"/>
-  </w:num>
-  <w:num w:numId="11" w16cid:durableId="793057457">
-    <w:abstractNumId w:val="13"/>
-  </w:num>
-  <w:num w:numId="12" w16cid:durableId="2146773725">
-    <w:abstractNumId w:val="17"/>
-  </w:num>
-  <w:num w:numId="13" w16cid:durableId="1026561013">
-    <w:abstractNumId w:val="6"/>
-  </w:num>
-  <w:num w:numId="14" w16cid:durableId="1192110950">
-    <w:abstractNumId w:val="15"/>
-  </w:num>
-  <w:num w:numId="15" w16cid:durableId="1262841238">
-    <w:abstractNumId w:val="5"/>
-  </w:num>
-  <w:num w:numId="16" w16cid:durableId="155341019">
+  <w:num w:numId="27" w16cid:durableId="1202403600">
     <w:abstractNumId w:val="11"/>
-  </w:num>
-  <w:num w:numId="17" w16cid:durableId="1040785662">
-    <w:abstractNumId w:val="10"/>
-  </w:num>
-  <w:num w:numId="18" w16cid:durableId="1409767320">
-    <w:abstractNumId w:val="18"/>
-  </w:num>
-  <w:num w:numId="19" w16cid:durableId="2045591211">
-    <w:abstractNumId w:val="7"/>
-  </w:num>
-  <w:num w:numId="20" w16cid:durableId="1764063768">
-    <w:abstractNumId w:val="16"/>
-  </w:num>
-  <w:num w:numId="21" w16cid:durableId="218832961">
-    <w:abstractNumId w:val="8"/>
   </w:num>
 </w:numbering>
 </file>

</xml_diff>

<commit_message>
1. Moved ticket_number from config.yaml to prompt 2. Changed the template.docx 3. Refactored the log generation in main.py
</commit_message>
<xml_diff>
--- a/res/template_new.docx
+++ b/res/template_new.docx
@@ -30,7 +30,14 @@
         <w:rPr>
           <w:rFonts w:hint="eastAsia"/>
         </w:rPr>
-        <w:t>Ticket number: {</w:t>
+        <w:t xml:space="preserve">Ticket number: </w:t>
+      </w:r>
+      <w:proofErr w:type="gramStart"/>
+      <w:r>
+        <w:rPr>
+          <w:rFonts w:hint="eastAsia"/>
+        </w:rPr>
+        <w:t>{</w:t>
       </w:r>
       <w:r>
         <w:rPr>
@@ -46,16 +53,11 @@
       </w:r>
       <w:proofErr w:type="spellStart"/>
       <w:r>
-        <w:rPr>
-          <w:rFonts w:hint="eastAsia"/>
-        </w:rPr>
-        <w:t>curator_info.ticket_n</w:t>
+        <w:t>ticket</w:t>
       </w:r>
+      <w:proofErr w:type="gramEnd"/>
       <w:r>
-        <w:rPr>
-          <w:rFonts w:hint="eastAsia"/>
-        </w:rPr>
-        <w:t>umber</w:t>
+        <w:t>_number</w:t>
       </w:r>
       <w:proofErr w:type="spellEnd"/>
       <w:r>
@@ -88,14 +90,28 @@
         <w:rPr>
           <w:rFonts w:hint="eastAsia"/>
         </w:rPr>
-        <w:t xml:space="preserve"> {{ </w:t>
+        <w:t xml:space="preserve"> </w:t>
+      </w:r>
+      <w:proofErr w:type="gramStart"/>
+      <w:r>
+        <w:rPr>
+          <w:rFonts w:hint="eastAsia"/>
+        </w:rPr>
+        <w:t xml:space="preserve">{{ </w:t>
       </w:r>
       <w:proofErr w:type="spellStart"/>
       <w:r>
         <w:rPr>
           <w:rFonts w:hint="eastAsia"/>
         </w:rPr>
-        <w:t>curator_info.curator_name</w:t>
+        <w:t>curator</w:t>
+      </w:r>
+      <w:proofErr w:type="gramEnd"/>
+      <w:r>
+        <w:rPr>
+          <w:rFonts w:hint="eastAsia"/>
+        </w:rPr>
+        <w:t>_info.curator_name</w:t>
       </w:r>
       <w:proofErr w:type="spellEnd"/>
       <w:r>
@@ -110,14 +126,28 @@
         <w:rPr>
           <w:rFonts w:hint="eastAsia"/>
         </w:rPr>
-        <w:t xml:space="preserve">Curator email: {{ </w:t>
+        <w:t xml:space="preserve">Curator email: </w:t>
+      </w:r>
+      <w:proofErr w:type="gramStart"/>
+      <w:r>
+        <w:rPr>
+          <w:rFonts w:hint="eastAsia"/>
+        </w:rPr>
+        <w:t xml:space="preserve">{{ </w:t>
       </w:r>
       <w:proofErr w:type="spellStart"/>
       <w:r>
         <w:rPr>
           <w:rFonts w:hint="eastAsia"/>
         </w:rPr>
-        <w:t>curator_info.</w:t>
+        <w:t>curator</w:t>
+      </w:r>
+      <w:proofErr w:type="gramEnd"/>
+      <w:r>
+        <w:rPr>
+          <w:rFonts w:hint="eastAsia"/>
+        </w:rPr>
+        <w:t>_info.</w:t>
       </w:r>
       <w:r>
         <w:t>curator_email</w:t>
@@ -137,6 +167,7 @@
         </w:rPr>
         <w:t xml:space="preserve">Dataset title: </w:t>
       </w:r>
+      <w:proofErr w:type="gramStart"/>
       <w:r>
         <w:rPr>
           <w:rFonts w:hint="eastAsia"/>
@@ -148,7 +179,14 @@
         <w:rPr>
           <w:rFonts w:hint="eastAsia"/>
         </w:rPr>
-        <w:t>dataset.</w:t>
+        <w:t>dataset</w:t>
+      </w:r>
+      <w:proofErr w:type="gramEnd"/>
+      <w:r>
+        <w:rPr>
+          <w:rFonts w:hint="eastAsia"/>
+        </w:rPr>
+        <w:t>.</w:t>
       </w:r>
       <w:r>
         <w:t>DatasetTitle</w:t>
@@ -187,7 +225,14 @@
         <w:rPr>
           <w:rFonts w:hint="eastAsia"/>
         </w:rPr>
-        <w:t>: {</w:t>
+        <w:t xml:space="preserve">: </w:t>
+      </w:r>
+      <w:proofErr w:type="gramStart"/>
+      <w:r>
+        <w:rPr>
+          <w:rFonts w:hint="eastAsia"/>
+        </w:rPr>
+        <w:t>{</w:t>
       </w:r>
       <w:r>
         <w:rPr>
@@ -206,7 +251,14 @@
         <w:rPr>
           <w:rFonts w:hint="eastAsia"/>
         </w:rPr>
-        <w:t>dataset.</w:t>
+        <w:t>dataset</w:t>
+      </w:r>
+      <w:proofErr w:type="gramEnd"/>
+      <w:r>
+        <w:rPr>
+          <w:rFonts w:hint="eastAsia"/>
+        </w:rPr>
+        <w:t>.</w:t>
       </w:r>
       <w:r>
         <w:t>DatasetPersistentId</w:t>
@@ -230,7 +282,21 @@
         <w:rPr>
           <w:rFonts w:hint="eastAsia"/>
         </w:rPr>
-        <w:t>Dataset ID (versioned): {{ dataset.ID  }}</w:t>
+        <w:t xml:space="preserve">Dataset ID (versioned): </w:t>
+      </w:r>
+      <w:proofErr w:type="gramStart"/>
+      <w:r>
+        <w:rPr>
+          <w:rFonts w:hint="eastAsia"/>
+        </w:rPr>
+        <w:t>{{ dataset.ID</w:t>
+      </w:r>
+      <w:proofErr w:type="gramEnd"/>
+      <w:r>
+        <w:rPr>
+          <w:rFonts w:hint="eastAsia"/>
+        </w:rPr>
+        <w:t xml:space="preserve">  }}</w:t>
       </w:r>
     </w:p>
     <w:p>
@@ -238,7 +304,14 @@
         <w:rPr>
           <w:rFonts w:hint="eastAsia"/>
         </w:rPr>
-        <w:t>Dataset access URL: {</w:t>
+        <w:t xml:space="preserve">Dataset access URL: </w:t>
+      </w:r>
+      <w:proofErr w:type="gramStart"/>
+      <w:r>
+        <w:rPr>
+          <w:rFonts w:hint="eastAsia"/>
+        </w:rPr>
+        <w:t>{</w:t>
       </w:r>
       <w:r>
         <w:rPr>
@@ -257,7 +330,14 @@
         <w:rPr>
           <w:rFonts w:hint="eastAsia"/>
         </w:rPr>
-        <w:t>dataset.</w:t>
+        <w:t>dataset</w:t>
+      </w:r>
+      <w:proofErr w:type="gramEnd"/>
+      <w:r>
+        <w:rPr>
+          <w:rFonts w:hint="eastAsia"/>
+        </w:rPr>
+        <w:t>.</w:t>
       </w:r>
       <w:r>
         <w:t>DatasetURL</w:t>
@@ -310,6 +390,7 @@
         </w:rPr>
         <w:t xml:space="preserve">date: </w:t>
       </w:r>
+      <w:proofErr w:type="gramStart"/>
       <w:r>
         <w:rPr>
           <w:rFonts w:hint="eastAsia"/>
@@ -334,6 +415,7 @@
         </w:rPr>
         <w:t>timestamp</w:t>
       </w:r>
+      <w:proofErr w:type="gramEnd"/>
       <w:r>
         <w:rPr>
           <w:rFonts w:hint="eastAsia"/>
@@ -348,11 +430,6 @@
       </w:r>
     </w:p>
     <w:p>
-      <w:pPr>
-        <w:rPr>
-          <w:rFonts w:hint="eastAsia"/>
-        </w:rPr>
-      </w:pPr>
       <w:r>
         <w:rPr>
           <w:rFonts w:hint="eastAsia"/>
@@ -1397,71 +1474,99 @@
             </w:r>
             <w:proofErr w:type="spellStart"/>
             <w:r>
-              <w:t>template_dict.dv_record.comments</w:t>
+              <w:t>template_dict.dv_record.</w:t>
+            </w:r>
+            <w:proofErr w:type="gramStart"/>
+            <w:r>
+              <w:t>comments</w:t>
             </w:r>
             <w:proofErr w:type="spellEnd"/>
             <w:r>
+              <w:t xml:space="preserve"> %}</w:t>
+            </w:r>
+            <w:proofErr w:type="gramEnd"/>
+            <w:r>
+              <w:t xml:space="preserve"> </w:t>
+            </w:r>
+          </w:p>
+          <w:p>
+            <w:r>
+              <w:t xml:space="preserve">{% for author, </w:t>
+            </w:r>
+            <w:proofErr w:type="spellStart"/>
+            <w:r>
+              <w:t>dataverses</w:t>
+            </w:r>
+            <w:proofErr w:type="spellEnd"/>
+            <w:r>
+              <w:t xml:space="preserve"> in </w:t>
+            </w:r>
+            <w:proofErr w:type="spellStart"/>
+            <w:proofErr w:type="gramStart"/>
+            <w:r>
+              <w:t>item.items</w:t>
+            </w:r>
+            <w:proofErr w:type="spellEnd"/>
+            <w:proofErr w:type="gramEnd"/>
+            <w:r>
+              <w:t>() %} {{ author }}</w:t>
+            </w:r>
+            <w:r>
+              <w:rPr>
+                <w:rFonts w:hint="eastAsia"/>
+              </w:rPr>
+              <w:t>:</w:t>
+            </w:r>
+          </w:p>
+          <w:p>
+            <w:r>
+              <w:t xml:space="preserve">{% for </w:t>
+            </w:r>
+            <w:proofErr w:type="spellStart"/>
+            <w:r>
+              <w:t>dataverse</w:t>
+            </w:r>
+            <w:proofErr w:type="spellEnd"/>
+            <w:r>
+              <w:t xml:space="preserve"> in </w:t>
+            </w:r>
+            <w:proofErr w:type="spellStart"/>
+            <w:r>
+              <w:t>dataverses</w:t>
+            </w:r>
+            <w:proofErr w:type="spellEnd"/>
+            <w:r>
               <w:t xml:space="preserve"> %} </w:t>
             </w:r>
-          </w:p>
-          <w:p>
-            <w:r>
-              <w:t xml:space="preserve">{% for author, </w:t>
+            <w:proofErr w:type="gramStart"/>
+            <w:r>
+              <w:t xml:space="preserve">{{ </w:t>
             </w:r>
             <w:proofErr w:type="spellStart"/>
             <w:r>
-              <w:t>dataverses</w:t>
+              <w:t>loop</w:t>
+            </w:r>
+            <w:proofErr w:type="gramEnd"/>
+            <w:r>
+              <w:t>.index</w:t>
             </w:r>
             <w:proofErr w:type="spellEnd"/>
             <w:r>
-              <w:t xml:space="preserve"> in </w:t>
-            </w:r>
-            <w:proofErr w:type="spellStart"/>
-            <w:r>
-              <w:t>item.items</w:t>
-            </w:r>
-            <w:proofErr w:type="spellEnd"/>
-            <w:r>
-              <w:t>() %} {{ author }}</w:t>
+              <w:t xml:space="preserve"> }}.</w:t>
             </w:r>
             <w:r>
               <w:rPr>
                 <w:rFonts w:hint="eastAsia"/>
               </w:rPr>
-              <w:t>:</w:t>
-            </w:r>
-          </w:p>
-          <w:p>
-            <w:r>
-              <w:t xml:space="preserve">{% for dataverse in </w:t>
-            </w:r>
-            <w:proofErr w:type="spellStart"/>
-            <w:r>
-              <w:t>dataverses</w:t>
-            </w:r>
-            <w:proofErr w:type="spellEnd"/>
-            <w:r>
-              <w:t xml:space="preserve"> %} </w:t>
-            </w:r>
-            <w:r>
-              <w:t xml:space="preserve">{{ </w:t>
-            </w:r>
-            <w:proofErr w:type="spellStart"/>
-            <w:r>
-              <w:t>loop.index</w:t>
-            </w:r>
-            <w:proofErr w:type="spellEnd"/>
-            <w:r>
-              <w:t xml:space="preserve"> }}.</w:t>
-            </w:r>
-            <w:r>
-              <w:rPr>
-                <w:rFonts w:hint="eastAsia"/>
-              </w:rPr>
               <w:t xml:space="preserve"> </w:t>
             </w:r>
-            <w:r>
-              <w:t>{{ dataverse }}</w:t>
+            <w:proofErr w:type="gramStart"/>
+            <w:r>
+              <w:t>{{ dataverse</w:t>
+            </w:r>
+            <w:proofErr w:type="gramEnd"/>
+            <w:r>
+              <w:t xml:space="preserve"> }}</w:t>
             </w:r>
             <w:r>
               <w:br/>
@@ -1922,7 +2027,6 @@
           <w:p>
             <w:pPr>
               <w:rPr>
-                <w:rFonts w:hint="eastAsia"/>
                 <w:lang w:val="en-US"/>
               </w:rPr>
             </w:pPr>
@@ -2263,7 +2367,21 @@
               <w:rPr>
                 <w:lang w:val="en-US"/>
               </w:rPr>
-              <w:t xml:space="preserve">Confirm with the depositor that they actually require a </w:t>
+              <w:t xml:space="preserve">Confirm with the depositor that they </w:t>
+            </w:r>
+            <w:proofErr w:type="gramStart"/>
+            <w:r>
+              <w:rPr>
+                <w:lang w:val="en-US"/>
+              </w:rPr>
+              <w:t>actually require</w:t>
+            </w:r>
+            <w:proofErr w:type="gramEnd"/>
+            <w:r>
+              <w:rPr>
+                <w:lang w:val="en-US"/>
+              </w:rPr>
+              <w:t xml:space="preserve"> a </w:t>
             </w:r>
             <w:proofErr w:type="spellStart"/>
             <w:r>
@@ -3149,7 +3267,14 @@
               <w:rPr>
                 <w:lang w:val="en-US"/>
               </w:rPr>
-              <w:t>template_dict.file_open.comments</w:t>
+              <w:t>template_dict.file_open.</w:t>
+            </w:r>
+            <w:proofErr w:type="gramStart"/>
+            <w:r>
+              <w:rPr>
+                <w:lang w:val="en-US"/>
+              </w:rPr>
+              <w:t>comments</w:t>
             </w:r>
             <w:proofErr w:type="spellEnd"/>
             <w:r>
@@ -3158,6 +3283,7 @@
               </w:rPr>
               <w:t xml:space="preserve"> %}</w:t>
             </w:r>
+            <w:proofErr w:type="gramEnd"/>
           </w:p>
           <w:p>
             <w:pPr>
@@ -3181,7 +3307,14 @@
               <w:rPr>
                 <w:lang w:val="en-US"/>
               </w:rPr>
-              <w:t>item.file_name</w:t>
+              <w:t>item.file_</w:t>
+            </w:r>
+            <w:proofErr w:type="gramStart"/>
+            <w:r>
+              <w:rPr>
+                <w:lang w:val="en-US"/>
+              </w:rPr>
+              <w:t>name</w:t>
             </w:r>
             <w:proofErr w:type="spellEnd"/>
             <w:r>
@@ -3194,7 +3327,14 @@
               <w:rPr>
                 <w:lang w:val="en-US"/>
               </w:rPr>
-              <w:t xml:space="preserve">{% </w:t>
+              <w:t>{%</w:t>
+            </w:r>
+            <w:proofErr w:type="gramEnd"/>
+            <w:r>
+              <w:rPr>
+                <w:lang w:val="en-US"/>
+              </w:rPr>
+              <w:t xml:space="preserve"> </w:t>
             </w:r>
             <w:proofErr w:type="spellStart"/>
             <w:r>
@@ -3215,22 +3355,29 @@
             <w:pPr>
               <w:ind w:left="360"/>
               <w:rPr>
-                <w:rFonts w:hint="eastAsia"/>
-                <w:lang w:val="en-US"/>
-              </w:rPr>
-            </w:pPr>
-          </w:p>
-          <w:p>
-            <w:pPr>
-              <w:rPr>
-                <w:lang w:val="en-US"/>
-              </w:rPr>
-            </w:pPr>
-            <w:r>
-              <w:rPr>
-                <w:lang w:val="en-US"/>
-              </w:rPr>
-              <w:t>List all files that were not checked:</w:t>
+                <w:lang w:val="en-US"/>
+              </w:rPr>
+            </w:pPr>
+          </w:p>
+          <w:p>
+            <w:pPr>
+              <w:rPr>
+                <w:lang w:val="en-US"/>
+              </w:rPr>
+            </w:pPr>
+            <w:proofErr w:type="gramStart"/>
+            <w:r>
+              <w:rPr>
+                <w:lang w:val="en-US"/>
+              </w:rPr>
+              <w:t>List</w:t>
+            </w:r>
+            <w:proofErr w:type="gramEnd"/>
+            <w:r>
+              <w:rPr>
+                <w:lang w:val="en-US"/>
+              </w:rPr>
+              <w:t xml:space="preserve"> all files that were not checked:</w:t>
             </w:r>
           </w:p>
           <w:p>
@@ -3250,7 +3397,14 @@
               <w:rPr>
                 <w:lang w:val="en-US"/>
               </w:rPr>
-              <w:t>template_dict.file_open.not_checked</w:t>
+              <w:t>template_dict.file_open.not_</w:t>
+            </w:r>
+            <w:proofErr w:type="gramStart"/>
+            <w:r>
+              <w:rPr>
+                <w:lang w:val="en-US"/>
+              </w:rPr>
+              <w:t>checked</w:t>
             </w:r>
             <w:proofErr w:type="spellEnd"/>
             <w:r>
@@ -3259,6 +3413,7 @@
               </w:rPr>
               <w:t xml:space="preserve"> %}</w:t>
             </w:r>
+            <w:proofErr w:type="gramEnd"/>
           </w:p>
           <w:p>
             <w:pPr>
@@ -3268,7 +3423,6 @@
                 <w:numId w:val="24"/>
               </w:numPr>
               <w:rPr>
-                <w:rFonts w:hint="eastAsia"/>
                 <w:lang w:val="en-US"/>
               </w:rPr>
             </w:pPr>
@@ -3283,14 +3437,28 @@
               <w:rPr>
                 <w:lang w:val="en-US"/>
               </w:rPr>
-              <w:t>item.file_name</w:t>
+              <w:t>item.file_</w:t>
+            </w:r>
+            <w:proofErr w:type="gramStart"/>
+            <w:r>
+              <w:rPr>
+                <w:lang w:val="en-US"/>
+              </w:rPr>
+              <w:t>name</w:t>
             </w:r>
             <w:proofErr w:type="spellEnd"/>
             <w:r>
               <w:rPr>
                 <w:lang w:val="en-US"/>
               </w:rPr>
-              <w:t xml:space="preserve"> }}{% </w:t>
+              <w:t xml:space="preserve"> }}{%</w:t>
+            </w:r>
+            <w:proofErr w:type="gramEnd"/>
+            <w:r>
+              <w:rPr>
+                <w:lang w:val="en-US"/>
+              </w:rPr>
+              <w:t xml:space="preserve"> </w:t>
             </w:r>
             <w:proofErr w:type="spellStart"/>
             <w:r>
@@ -3676,7 +3844,6 @@
           <w:p>
             <w:pPr>
               <w:rPr>
-                <w:rFonts w:hint="eastAsia"/>
                 <w:lang w:val="en-US"/>
               </w:rPr>
             </w:pPr>
@@ -3704,7 +3871,14 @@
               <w:rPr>
                 <w:lang w:val="en-US"/>
               </w:rPr>
-              <w:t>template_dict.special_characters.comments</w:t>
+              <w:t>template_dict.special_characters.</w:t>
+            </w:r>
+            <w:proofErr w:type="gramStart"/>
+            <w:r>
+              <w:rPr>
+                <w:lang w:val="en-US"/>
+              </w:rPr>
+              <w:t>comments</w:t>
             </w:r>
             <w:proofErr w:type="spellEnd"/>
             <w:r>
@@ -3713,6 +3887,7 @@
               </w:rPr>
               <w:t xml:space="preserve"> %}</w:t>
             </w:r>
+            <w:proofErr w:type="gramEnd"/>
           </w:p>
           <w:p>
             <w:pPr>
@@ -3736,14 +3911,28 @@
               <w:rPr>
                 <w:lang w:val="en-US"/>
               </w:rPr>
-              <w:t>item.file_name</w:t>
+              <w:t>item.file_</w:t>
+            </w:r>
+            <w:proofErr w:type="gramStart"/>
+            <w:r>
+              <w:rPr>
+                <w:lang w:val="en-US"/>
+              </w:rPr>
+              <w:t>name</w:t>
             </w:r>
             <w:proofErr w:type="spellEnd"/>
             <w:r>
               <w:rPr>
                 <w:lang w:val="en-US"/>
               </w:rPr>
-              <w:t xml:space="preserve"> }}{% </w:t>
+              <w:t xml:space="preserve"> }}{%</w:t>
+            </w:r>
+            <w:proofErr w:type="gramEnd"/>
+            <w:r>
+              <w:rPr>
+                <w:lang w:val="en-US"/>
+              </w:rPr>
+              <w:t xml:space="preserve"> </w:t>
             </w:r>
             <w:proofErr w:type="spellStart"/>
             <w:r>
@@ -4147,7 +4336,14 @@
               <w:rPr>
                 <w:lang w:val="en-US"/>
               </w:rPr>
-              <w:t>template_dict.file_ext.comments</w:t>
+              <w:t>template_dict.file_ext.</w:t>
+            </w:r>
+            <w:proofErr w:type="gramStart"/>
+            <w:r>
+              <w:rPr>
+                <w:lang w:val="en-US"/>
+              </w:rPr>
+              <w:t>comments</w:t>
             </w:r>
             <w:proofErr w:type="spellEnd"/>
             <w:r>
@@ -4156,6 +4352,7 @@
               </w:rPr>
               <w:t xml:space="preserve"> %}</w:t>
             </w:r>
+            <w:proofErr w:type="gramEnd"/>
           </w:p>
           <w:p>
             <w:pPr>
@@ -4179,14 +4376,28 @@
               <w:rPr>
                 <w:lang w:val="en-US"/>
               </w:rPr>
-              <w:t>item.file_name</w:t>
+              <w:t>item.file_</w:t>
+            </w:r>
+            <w:proofErr w:type="gramStart"/>
+            <w:r>
+              <w:rPr>
+                <w:lang w:val="en-US"/>
+              </w:rPr>
+              <w:t>name</w:t>
             </w:r>
             <w:proofErr w:type="spellEnd"/>
             <w:r>
               <w:rPr>
                 <w:lang w:val="en-US"/>
               </w:rPr>
-              <w:t xml:space="preserve"> }}{% </w:t>
+              <w:t xml:space="preserve"> }}{%</w:t>
+            </w:r>
+            <w:proofErr w:type="gramEnd"/>
+            <w:r>
+              <w:rPr>
+                <w:lang w:val="en-US"/>
+              </w:rPr>
+              <w:t xml:space="preserve"> </w:t>
             </w:r>
             <w:proofErr w:type="spellStart"/>
             <w:r>
@@ -4664,7 +4875,6 @@
                 <w:bCs/>
                 <w:lang w:val="en-US"/>
               </w:rPr>
-              <w:lastRenderedPageBreak/>
               <w:t>2.5</w:t>
             </w:r>
           </w:p>
@@ -5652,7 +5862,14 @@
               <w:rPr>
                 <w:lang w:val="en-US"/>
               </w:rPr>
-              <w:t>template_dict.readme_file.comments</w:t>
+              <w:t>template_dict.readme_file.</w:t>
+            </w:r>
+            <w:proofErr w:type="gramStart"/>
+            <w:r>
+              <w:rPr>
+                <w:lang w:val="en-US"/>
+              </w:rPr>
+              <w:t>comments</w:t>
             </w:r>
             <w:proofErr w:type="spellEnd"/>
             <w:r>
@@ -5662,7 +5879,11 @@
               <w:t xml:space="preserve"> %}</w:t>
             </w:r>
             <w:r>
-              <w:t xml:space="preserve">{{ </w:t>
+              <w:t>{{</w:t>
+            </w:r>
+            <w:proofErr w:type="gramEnd"/>
+            <w:r>
+              <w:t xml:space="preserve"> </w:t>
             </w:r>
             <w:proofErr w:type="spellStart"/>
             <w:r>
@@ -6524,7 +6745,14 @@
               <w:rPr>
                 <w:lang w:val="en-US"/>
               </w:rPr>
-              <w:t>template_dict.typo.comments</w:t>
+              <w:t>template_dict.typo.</w:t>
+            </w:r>
+            <w:proofErr w:type="gramStart"/>
+            <w:r>
+              <w:rPr>
+                <w:lang w:val="en-US"/>
+              </w:rPr>
+              <w:t>comments</w:t>
             </w:r>
             <w:proofErr w:type="spellEnd"/>
             <w:r>
@@ -6533,6 +6761,7 @@
               </w:rPr>
               <w:t xml:space="preserve"> %}</w:t>
             </w:r>
+            <w:proofErr w:type="gramEnd"/>
           </w:p>
           <w:p>
             <w:pPr>
@@ -6542,11 +6771,19 @@
                 <w:numId w:val="27"/>
               </w:numPr>
             </w:pPr>
-            <w:r>
-              <w:rPr>
-                <w:lang w:val="en-US"/>
-              </w:rPr>
-              <w:t xml:space="preserve">{{ item }}{% </w:t>
+            <w:proofErr w:type="gramStart"/>
+            <w:r>
+              <w:rPr>
+                <w:lang w:val="en-US"/>
+              </w:rPr>
+              <w:t>{{ item }}{%</w:t>
+            </w:r>
+            <w:proofErr w:type="gramEnd"/>
+            <w:r>
+              <w:rPr>
+                <w:lang w:val="en-US"/>
+              </w:rPr>
+              <w:t xml:space="preserve"> </w:t>
             </w:r>
             <w:proofErr w:type="spellStart"/>
             <w:r>
@@ -9057,7 +9294,21 @@
               <w:rPr>
                 <w:lang w:val="en-US"/>
               </w:rPr>
-              <w:t>If there are restricted files and no Terms of Access, recommend including terms of access.</w:t>
+              <w:t xml:space="preserve">If there are restricted files and no Terms of Access, </w:t>
+            </w:r>
+            <w:proofErr w:type="gramStart"/>
+            <w:r>
+              <w:rPr>
+                <w:lang w:val="en-US"/>
+              </w:rPr>
+              <w:t>recommend</w:t>
+            </w:r>
+            <w:proofErr w:type="gramEnd"/>
+            <w:r>
+              <w:rPr>
+                <w:lang w:val="en-US"/>
+              </w:rPr>
+              <w:t xml:space="preserve"> including terms of access.</w:t>
             </w:r>
           </w:p>
         </w:tc>
@@ -9316,13 +9567,7 @@
         </w:tc>
       </w:tr>
     </w:tbl>
-    <w:p>
-      <w:pPr>
-        <w:rPr>
-          <w:rFonts w:hint="eastAsia"/>
-        </w:rPr>
-      </w:pPr>
-    </w:p>
+    <w:p/>
     <w:sectPr>
       <w:pgSz w:w="23811" w:h="16838" w:orient="landscape" w:code="8"/>
       <w:pgMar w:top="720" w:right="720" w:bottom="720" w:left="720" w:header="720" w:footer="720" w:gutter="0"/>

</xml_diff>

<commit_message>
1. Added generation of project_metadata 2. Added ending prompt
</commit_message>
<xml_diff>
--- a/res/template_new.docx
+++ b/res/template_new.docx
@@ -30,14 +30,7 @@
         <w:rPr>
           <w:rFonts w:hint="eastAsia"/>
         </w:rPr>
-        <w:t xml:space="preserve">Ticket number: </w:t>
-      </w:r>
-      <w:proofErr w:type="gramStart"/>
-      <w:r>
-        <w:rPr>
-          <w:rFonts w:hint="eastAsia"/>
-        </w:rPr>
-        <w:t>{</w:t>
+        <w:t>Ticket number: {</w:t>
       </w:r>
       <w:r>
         <w:rPr>
@@ -53,11 +46,16 @@
       </w:r>
       <w:proofErr w:type="spellStart"/>
       <w:r>
-        <w:t>ticket</w:t>
+        <w:t>project_info</w:t>
       </w:r>
-      <w:proofErr w:type="gramEnd"/>
       <w:r>
-        <w:t>_number</w:t>
+        <w:rPr>
+          <w:rFonts w:hint="eastAsia"/>
+        </w:rPr>
+        <w:t>.</w:t>
+      </w:r>
+      <w:r>
+        <w:t>ticket_number</w:t>
       </w:r>
       <w:proofErr w:type="spellEnd"/>
       <w:r>
@@ -90,28 +88,17 @@
         <w:rPr>
           <w:rFonts w:hint="eastAsia"/>
         </w:rPr>
-        <w:t xml:space="preserve"> </w:t>
+        <w:t xml:space="preserve"> {{ </w:t>
       </w:r>
-      <w:proofErr w:type="gramStart"/>
+      <w:proofErr w:type="spellStart"/>
+      <w:r>
+        <w:t>project_info</w:t>
+      </w:r>
       <w:r>
         <w:rPr>
           <w:rFonts w:hint="eastAsia"/>
         </w:rPr>
-        <w:t xml:space="preserve">{{ </w:t>
-      </w:r>
-      <w:proofErr w:type="spellStart"/>
-      <w:r>
-        <w:rPr>
-          <w:rFonts w:hint="eastAsia"/>
-        </w:rPr>
-        <w:t>curator</w:t>
-      </w:r>
-      <w:proofErr w:type="gramEnd"/>
-      <w:r>
-        <w:rPr>
-          <w:rFonts w:hint="eastAsia"/>
-        </w:rPr>
-        <w:t>_info.curator_name</w:t>
+        <w:t>.curator_name</w:t>
       </w:r>
       <w:proofErr w:type="spellEnd"/>
       <w:r>
@@ -126,28 +113,17 @@
         <w:rPr>
           <w:rFonts w:hint="eastAsia"/>
         </w:rPr>
-        <w:t xml:space="preserve">Curator email: </w:t>
+        <w:t xml:space="preserve">Curator email: {{ </w:t>
       </w:r>
-      <w:proofErr w:type="gramStart"/>
+      <w:proofErr w:type="spellStart"/>
+      <w:r>
+        <w:t>project_info</w:t>
+      </w:r>
       <w:r>
         <w:rPr>
           <w:rFonts w:hint="eastAsia"/>
         </w:rPr>
-        <w:t xml:space="preserve">{{ </w:t>
-      </w:r>
-      <w:proofErr w:type="spellStart"/>
-      <w:r>
-        <w:rPr>
-          <w:rFonts w:hint="eastAsia"/>
-        </w:rPr>
-        <w:t>curator</w:t>
-      </w:r>
-      <w:proofErr w:type="gramEnd"/>
-      <w:r>
-        <w:rPr>
-          <w:rFonts w:hint="eastAsia"/>
-        </w:rPr>
-        <w:t>_info.</w:t>
+        <w:t>.</w:t>
       </w:r>
       <w:r>
         <w:t>curator_email</w:t>
@@ -167,7 +143,6 @@
         </w:rPr>
         <w:t xml:space="preserve">Dataset title: </w:t>
       </w:r>
-      <w:proofErr w:type="gramStart"/>
       <w:r>
         <w:rPr>
           <w:rFonts w:hint="eastAsia"/>
@@ -179,14 +154,7 @@
         <w:rPr>
           <w:rFonts w:hint="eastAsia"/>
         </w:rPr>
-        <w:t>dataset</w:t>
-      </w:r>
-      <w:proofErr w:type="gramEnd"/>
-      <w:r>
-        <w:rPr>
-          <w:rFonts w:hint="eastAsia"/>
-        </w:rPr>
-        <w:t>.</w:t>
+        <w:t>dataset.</w:t>
       </w:r>
       <w:r>
         <w:t>DatasetTitle</w:t>
@@ -225,14 +193,7 @@
         <w:rPr>
           <w:rFonts w:hint="eastAsia"/>
         </w:rPr>
-        <w:t xml:space="preserve">: </w:t>
-      </w:r>
-      <w:proofErr w:type="gramStart"/>
-      <w:r>
-        <w:rPr>
-          <w:rFonts w:hint="eastAsia"/>
-        </w:rPr>
-        <w:t>{</w:t>
+        <w:t>: {</w:t>
       </w:r>
       <w:r>
         <w:rPr>
@@ -251,14 +212,7 @@
         <w:rPr>
           <w:rFonts w:hint="eastAsia"/>
         </w:rPr>
-        <w:t>dataset</w:t>
-      </w:r>
-      <w:proofErr w:type="gramEnd"/>
-      <w:r>
-        <w:rPr>
-          <w:rFonts w:hint="eastAsia"/>
-        </w:rPr>
-        <w:t>.</w:t>
+        <w:t>dataset.</w:t>
       </w:r>
       <w:r>
         <w:t>DatasetPersistentId</w:t>
@@ -282,21 +236,7 @@
         <w:rPr>
           <w:rFonts w:hint="eastAsia"/>
         </w:rPr>
-        <w:t xml:space="preserve">Dataset ID (versioned): </w:t>
-      </w:r>
-      <w:proofErr w:type="gramStart"/>
-      <w:r>
-        <w:rPr>
-          <w:rFonts w:hint="eastAsia"/>
-        </w:rPr>
-        <w:t>{{ dataset.ID</w:t>
-      </w:r>
-      <w:proofErr w:type="gramEnd"/>
-      <w:r>
-        <w:rPr>
-          <w:rFonts w:hint="eastAsia"/>
-        </w:rPr>
-        <w:t xml:space="preserve">  }}</w:t>
+        <w:t>Dataset ID (versioned): {{ dataset.ID  }}</w:t>
       </w:r>
     </w:p>
     <w:p>
@@ -304,14 +244,7 @@
         <w:rPr>
           <w:rFonts w:hint="eastAsia"/>
         </w:rPr>
-        <w:t xml:space="preserve">Dataset access URL: </w:t>
-      </w:r>
-      <w:proofErr w:type="gramStart"/>
-      <w:r>
-        <w:rPr>
-          <w:rFonts w:hint="eastAsia"/>
-        </w:rPr>
-        <w:t>{</w:t>
+        <w:t>Dataset access URL: {</w:t>
       </w:r>
       <w:r>
         <w:rPr>
@@ -330,14 +263,7 @@
         <w:rPr>
           <w:rFonts w:hint="eastAsia"/>
         </w:rPr>
-        <w:t>dataset</w:t>
-      </w:r>
-      <w:proofErr w:type="gramEnd"/>
-      <w:r>
-        <w:rPr>
-          <w:rFonts w:hint="eastAsia"/>
-        </w:rPr>
-        <w:t>.</w:t>
+        <w:t>dataset.</w:t>
       </w:r>
       <w:r>
         <w:t>DatasetURL</w:t>
@@ -390,7 +316,6 @@
         </w:rPr>
         <w:t xml:space="preserve">date: </w:t>
       </w:r>
-      <w:proofErr w:type="gramStart"/>
       <w:r>
         <w:rPr>
           <w:rFonts w:hint="eastAsia"/>
@@ -415,7 +340,6 @@
         </w:rPr>
         <w:t>timestamp</w:t>
       </w:r>
-      <w:proofErr w:type="gramEnd"/>
       <w:r>
         <w:rPr>
           <w:rFonts w:hint="eastAsia"/>
@@ -1474,99 +1398,79 @@
             </w:r>
             <w:proofErr w:type="spellStart"/>
             <w:r>
-              <w:t>template_dict.dv_record.</w:t>
-            </w:r>
-            <w:proofErr w:type="gramStart"/>
-            <w:r>
-              <w:t>comments</w:t>
+              <w:t>template_dict.dv_record.comments</w:t>
             </w:r>
             <w:proofErr w:type="spellEnd"/>
             <w:r>
-              <w:t xml:space="preserve"> %}</w:t>
-            </w:r>
-            <w:proofErr w:type="gramEnd"/>
-            <w:r>
+              <w:t xml:space="preserve"> %} </w:t>
+            </w:r>
+          </w:p>
+          <w:p>
+            <w:r>
+              <w:t xml:space="preserve">{% for author, </w:t>
+            </w:r>
+            <w:proofErr w:type="spellStart"/>
+            <w:r>
+              <w:t>dataverses</w:t>
+            </w:r>
+            <w:proofErr w:type="spellEnd"/>
+            <w:r>
+              <w:t xml:space="preserve"> in </w:t>
+            </w:r>
+            <w:proofErr w:type="spellStart"/>
+            <w:r>
+              <w:t>item.items</w:t>
+            </w:r>
+            <w:proofErr w:type="spellEnd"/>
+            <w:r>
+              <w:t>() %} {{ author }}</w:t>
+            </w:r>
+            <w:r>
+              <w:rPr>
+                <w:rFonts w:hint="eastAsia"/>
+              </w:rPr>
+              <w:t>:</w:t>
+            </w:r>
+          </w:p>
+          <w:p>
+            <w:r>
+              <w:t xml:space="preserve">{% for </w:t>
+            </w:r>
+            <w:proofErr w:type="spellStart"/>
+            <w:r>
+              <w:t>dataverse</w:t>
+            </w:r>
+            <w:proofErr w:type="spellEnd"/>
+            <w:r>
+              <w:t xml:space="preserve"> in </w:t>
+            </w:r>
+            <w:proofErr w:type="spellStart"/>
+            <w:r>
+              <w:t>dataverses</w:t>
+            </w:r>
+            <w:proofErr w:type="spellEnd"/>
+            <w:r>
+              <w:t xml:space="preserve"> %} </w:t>
+            </w:r>
+            <w:r>
+              <w:t xml:space="preserve">{{ </w:t>
+            </w:r>
+            <w:proofErr w:type="spellStart"/>
+            <w:r>
+              <w:t>loop.index</w:t>
+            </w:r>
+            <w:proofErr w:type="spellEnd"/>
+            <w:r>
+              <w:t xml:space="preserve"> }}.</w:t>
+            </w:r>
+            <w:r>
+              <w:rPr>
+                <w:rFonts w:hint="eastAsia"/>
+              </w:rPr>
               <w:t xml:space="preserve"> </w:t>
             </w:r>
-          </w:p>
-          <w:p>
-            <w:r>
-              <w:t xml:space="preserve">{% for author, </w:t>
-            </w:r>
-            <w:proofErr w:type="spellStart"/>
-            <w:r>
-              <w:t>dataverses</w:t>
-            </w:r>
-            <w:proofErr w:type="spellEnd"/>
-            <w:r>
-              <w:t xml:space="preserve"> in </w:t>
-            </w:r>
-            <w:proofErr w:type="spellStart"/>
-            <w:proofErr w:type="gramStart"/>
-            <w:r>
-              <w:t>item.items</w:t>
-            </w:r>
-            <w:proofErr w:type="spellEnd"/>
-            <w:proofErr w:type="gramEnd"/>
-            <w:r>
-              <w:t>() %} {{ author }}</w:t>
-            </w:r>
-            <w:r>
-              <w:rPr>
-                <w:rFonts w:hint="eastAsia"/>
-              </w:rPr>
-              <w:t>:</w:t>
-            </w:r>
-          </w:p>
-          <w:p>
-            <w:r>
-              <w:t xml:space="preserve">{% for </w:t>
-            </w:r>
-            <w:proofErr w:type="spellStart"/>
-            <w:r>
-              <w:t>dataverse</w:t>
-            </w:r>
-            <w:proofErr w:type="spellEnd"/>
-            <w:r>
-              <w:t xml:space="preserve"> in </w:t>
-            </w:r>
-            <w:proofErr w:type="spellStart"/>
-            <w:r>
-              <w:t>dataverses</w:t>
-            </w:r>
-            <w:proofErr w:type="spellEnd"/>
-            <w:r>
-              <w:t xml:space="preserve"> %} </w:t>
-            </w:r>
-            <w:proofErr w:type="gramStart"/>
-            <w:r>
-              <w:t xml:space="preserve">{{ </w:t>
-            </w:r>
-            <w:proofErr w:type="spellStart"/>
-            <w:r>
-              <w:t>loop</w:t>
-            </w:r>
-            <w:proofErr w:type="gramEnd"/>
-            <w:r>
-              <w:t>.index</w:t>
-            </w:r>
-            <w:proofErr w:type="spellEnd"/>
-            <w:r>
-              <w:t xml:space="preserve"> }}.</w:t>
-            </w:r>
-            <w:r>
-              <w:rPr>
-                <w:rFonts w:hint="eastAsia"/>
-              </w:rPr>
-              <w:t xml:space="preserve"> </w:t>
-            </w:r>
-            <w:proofErr w:type="gramStart"/>
-            <w:r>
-              <w:t>{{ dataverse</w:t>
-            </w:r>
-            <w:proofErr w:type="gramEnd"/>
-            <w:r>
-              <w:t xml:space="preserve"> }}</w:t>
+            <w:r>
+              <w:t>{{ dataverse }}</w:t>
             </w:r>
             <w:r>
               <w:br/>
@@ -2367,21 +2271,7 @@
               <w:rPr>
                 <w:lang w:val="en-US"/>
               </w:rPr>
-              <w:t xml:space="preserve">Confirm with the depositor that they </w:t>
-            </w:r>
-            <w:proofErr w:type="gramStart"/>
-            <w:r>
-              <w:rPr>
-                <w:lang w:val="en-US"/>
-              </w:rPr>
-              <w:t>actually require</w:t>
-            </w:r>
-            <w:proofErr w:type="gramEnd"/>
-            <w:r>
-              <w:rPr>
-                <w:lang w:val="en-US"/>
-              </w:rPr>
-              <w:t xml:space="preserve"> a </w:t>
+              <w:t xml:space="preserve">Confirm with the depositor that they actually require a </w:t>
             </w:r>
             <w:proofErr w:type="spellStart"/>
             <w:r>
@@ -3267,14 +3157,7 @@
               <w:rPr>
                 <w:lang w:val="en-US"/>
               </w:rPr>
-              <w:t>template_dict.file_open.</w:t>
-            </w:r>
-            <w:proofErr w:type="gramStart"/>
-            <w:r>
-              <w:rPr>
-                <w:lang w:val="en-US"/>
-              </w:rPr>
-              <w:t>comments</w:t>
+              <w:t>template_dict.file_open.comments</w:t>
             </w:r>
             <w:proofErr w:type="spellEnd"/>
             <w:r>
@@ -3283,7 +3166,6 @@
               </w:rPr>
               <w:t xml:space="preserve"> %}</w:t>
             </w:r>
-            <w:proofErr w:type="gramEnd"/>
           </w:p>
           <w:p>
             <w:pPr>
@@ -3307,14 +3189,7 @@
               <w:rPr>
                 <w:lang w:val="en-US"/>
               </w:rPr>
-              <w:t>item.file_</w:t>
-            </w:r>
-            <w:proofErr w:type="gramStart"/>
-            <w:r>
-              <w:rPr>
-                <w:lang w:val="en-US"/>
-              </w:rPr>
-              <w:t>name</w:t>
+              <w:t>item.file_name</w:t>
             </w:r>
             <w:proofErr w:type="spellEnd"/>
             <w:r>
@@ -3327,14 +3202,7 @@
               <w:rPr>
                 <w:lang w:val="en-US"/>
               </w:rPr>
-              <w:t>{%</w:t>
-            </w:r>
-            <w:proofErr w:type="gramEnd"/>
-            <w:r>
-              <w:rPr>
-                <w:lang w:val="en-US"/>
-              </w:rPr>
-              <w:t xml:space="preserve"> </w:t>
+              <w:t xml:space="preserve">{% </w:t>
             </w:r>
             <w:proofErr w:type="spellStart"/>
             <w:r>
@@ -3365,19 +3233,11 @@
                 <w:lang w:val="en-US"/>
               </w:rPr>
             </w:pPr>
-            <w:proofErr w:type="gramStart"/>
-            <w:r>
-              <w:rPr>
-                <w:lang w:val="en-US"/>
-              </w:rPr>
-              <w:t>List</w:t>
-            </w:r>
-            <w:proofErr w:type="gramEnd"/>
-            <w:r>
-              <w:rPr>
-                <w:lang w:val="en-US"/>
-              </w:rPr>
-              <w:t xml:space="preserve"> all files that were not checked:</w:t>
+            <w:r>
+              <w:rPr>
+                <w:lang w:val="en-US"/>
+              </w:rPr>
+              <w:t>List all files that were not checked:</w:t>
             </w:r>
           </w:p>
           <w:p>
@@ -3397,14 +3257,7 @@
               <w:rPr>
                 <w:lang w:val="en-US"/>
               </w:rPr>
-              <w:t>template_dict.file_open.not_</w:t>
-            </w:r>
-            <w:proofErr w:type="gramStart"/>
-            <w:r>
-              <w:rPr>
-                <w:lang w:val="en-US"/>
-              </w:rPr>
-              <w:t>checked</w:t>
+              <w:t>template_dict.file_open.not_checked</w:t>
             </w:r>
             <w:proofErr w:type="spellEnd"/>
             <w:r>
@@ -3413,7 +3266,6 @@
               </w:rPr>
               <w:t xml:space="preserve"> %}</w:t>
             </w:r>
-            <w:proofErr w:type="gramEnd"/>
           </w:p>
           <w:p>
             <w:pPr>
@@ -3437,28 +3289,14 @@
               <w:rPr>
                 <w:lang w:val="en-US"/>
               </w:rPr>
-              <w:t>item.file_</w:t>
-            </w:r>
-            <w:proofErr w:type="gramStart"/>
-            <w:r>
-              <w:rPr>
-                <w:lang w:val="en-US"/>
-              </w:rPr>
-              <w:t>name</w:t>
+              <w:t>item.file_name</w:t>
             </w:r>
             <w:proofErr w:type="spellEnd"/>
             <w:r>
               <w:rPr>
                 <w:lang w:val="en-US"/>
               </w:rPr>
-              <w:t xml:space="preserve"> }}{%</w:t>
-            </w:r>
-            <w:proofErr w:type="gramEnd"/>
-            <w:r>
-              <w:rPr>
-                <w:lang w:val="en-US"/>
-              </w:rPr>
-              <w:t xml:space="preserve"> </w:t>
+              <w:t xml:space="preserve"> }}{% </w:t>
             </w:r>
             <w:proofErr w:type="spellStart"/>
             <w:r>
@@ -3871,14 +3709,7 @@
               <w:rPr>
                 <w:lang w:val="en-US"/>
               </w:rPr>
-              <w:t>template_dict.special_characters.</w:t>
-            </w:r>
-            <w:proofErr w:type="gramStart"/>
-            <w:r>
-              <w:rPr>
-                <w:lang w:val="en-US"/>
-              </w:rPr>
-              <w:t>comments</w:t>
+              <w:t>template_dict.special_characters.comments</w:t>
             </w:r>
             <w:proofErr w:type="spellEnd"/>
             <w:r>
@@ -3887,7 +3718,6 @@
               </w:rPr>
               <w:t xml:space="preserve"> %}</w:t>
             </w:r>
-            <w:proofErr w:type="gramEnd"/>
           </w:p>
           <w:p>
             <w:pPr>
@@ -3911,28 +3741,14 @@
               <w:rPr>
                 <w:lang w:val="en-US"/>
               </w:rPr>
-              <w:t>item.file_</w:t>
-            </w:r>
-            <w:proofErr w:type="gramStart"/>
-            <w:r>
-              <w:rPr>
-                <w:lang w:val="en-US"/>
-              </w:rPr>
-              <w:t>name</w:t>
+              <w:t>item.file_name</w:t>
             </w:r>
             <w:proofErr w:type="spellEnd"/>
             <w:r>
               <w:rPr>
                 <w:lang w:val="en-US"/>
               </w:rPr>
-              <w:t xml:space="preserve"> }}{%</w:t>
-            </w:r>
-            <w:proofErr w:type="gramEnd"/>
-            <w:r>
-              <w:rPr>
-                <w:lang w:val="en-US"/>
-              </w:rPr>
-              <w:t xml:space="preserve"> </w:t>
+              <w:t xml:space="preserve"> }}{% </w:t>
             </w:r>
             <w:proofErr w:type="spellStart"/>
             <w:r>
@@ -4336,14 +4152,7 @@
               <w:rPr>
                 <w:lang w:val="en-US"/>
               </w:rPr>
-              <w:t>template_dict.file_ext.</w:t>
-            </w:r>
-            <w:proofErr w:type="gramStart"/>
-            <w:r>
-              <w:rPr>
-                <w:lang w:val="en-US"/>
-              </w:rPr>
-              <w:t>comments</w:t>
+              <w:t>template_dict.file_ext.comments</w:t>
             </w:r>
             <w:proofErr w:type="spellEnd"/>
             <w:r>
@@ -4352,7 +4161,6 @@
               </w:rPr>
               <w:t xml:space="preserve"> %}</w:t>
             </w:r>
-            <w:proofErr w:type="gramEnd"/>
           </w:p>
           <w:p>
             <w:pPr>
@@ -4376,28 +4184,14 @@
               <w:rPr>
                 <w:lang w:val="en-US"/>
               </w:rPr>
-              <w:t>item.file_</w:t>
-            </w:r>
-            <w:proofErr w:type="gramStart"/>
-            <w:r>
-              <w:rPr>
-                <w:lang w:val="en-US"/>
-              </w:rPr>
-              <w:t>name</w:t>
+              <w:t>item.file_name</w:t>
             </w:r>
             <w:proofErr w:type="spellEnd"/>
             <w:r>
               <w:rPr>
                 <w:lang w:val="en-US"/>
               </w:rPr>
-              <w:t xml:space="preserve"> }}{%</w:t>
-            </w:r>
-            <w:proofErr w:type="gramEnd"/>
-            <w:r>
-              <w:rPr>
-                <w:lang w:val="en-US"/>
-              </w:rPr>
-              <w:t xml:space="preserve"> </w:t>
+              <w:t xml:space="preserve"> }}{% </w:t>
             </w:r>
             <w:proofErr w:type="spellStart"/>
             <w:r>
@@ -5862,14 +5656,7 @@
               <w:rPr>
                 <w:lang w:val="en-US"/>
               </w:rPr>
-              <w:t>template_dict.readme_file.</w:t>
-            </w:r>
-            <w:proofErr w:type="gramStart"/>
-            <w:r>
-              <w:rPr>
-                <w:lang w:val="en-US"/>
-              </w:rPr>
-              <w:t>comments</w:t>
+              <w:t>template_dict.readme_file.comments</w:t>
             </w:r>
             <w:proofErr w:type="spellEnd"/>
             <w:r>
@@ -5879,11 +5666,7 @@
               <w:t xml:space="preserve"> %}</w:t>
             </w:r>
             <w:r>
-              <w:t>{{</w:t>
-            </w:r>
-            <w:proofErr w:type="gramEnd"/>
-            <w:r>
-              <w:t xml:space="preserve"> </w:t>
+              <w:t xml:space="preserve">{{ </w:t>
             </w:r>
             <w:proofErr w:type="spellStart"/>
             <w:r>
@@ -6745,14 +6528,7 @@
               <w:rPr>
                 <w:lang w:val="en-US"/>
               </w:rPr>
-              <w:t>template_dict.typo.</w:t>
-            </w:r>
-            <w:proofErr w:type="gramStart"/>
-            <w:r>
-              <w:rPr>
-                <w:lang w:val="en-US"/>
-              </w:rPr>
-              <w:t>comments</w:t>
+              <w:t>template_dict.typo.comments</w:t>
             </w:r>
             <w:proofErr w:type="spellEnd"/>
             <w:r>
@@ -6761,7 +6537,6 @@
               </w:rPr>
               <w:t xml:space="preserve"> %}</w:t>
             </w:r>
-            <w:proofErr w:type="gramEnd"/>
           </w:p>
           <w:p>
             <w:pPr>
@@ -6771,19 +6546,11 @@
                 <w:numId w:val="27"/>
               </w:numPr>
             </w:pPr>
-            <w:proofErr w:type="gramStart"/>
-            <w:r>
-              <w:rPr>
-                <w:lang w:val="en-US"/>
-              </w:rPr>
-              <w:t>{{ item }}{%</w:t>
-            </w:r>
-            <w:proofErr w:type="gramEnd"/>
-            <w:r>
-              <w:rPr>
-                <w:lang w:val="en-US"/>
-              </w:rPr>
-              <w:t xml:space="preserve"> </w:t>
+            <w:r>
+              <w:rPr>
+                <w:lang w:val="en-US"/>
+              </w:rPr>
+              <w:t xml:space="preserve">{{ item }}{% </w:t>
             </w:r>
             <w:proofErr w:type="spellStart"/>
             <w:r>
@@ -9294,21 +9061,7 @@
               <w:rPr>
                 <w:lang w:val="en-US"/>
               </w:rPr>
-              <w:t xml:space="preserve">If there are restricted files and no Terms of Access, </w:t>
-            </w:r>
-            <w:proofErr w:type="gramStart"/>
-            <w:r>
-              <w:rPr>
-                <w:lang w:val="en-US"/>
-              </w:rPr>
-              <w:t>recommend</w:t>
-            </w:r>
-            <w:proofErr w:type="gramEnd"/>
-            <w:r>
-              <w:rPr>
-                <w:lang w:val="en-US"/>
-              </w:rPr>
-              <w:t xml:space="preserve"> including terms of access.</w:t>
+              <w:t>If there are restricted files and no Terms of Access, recommend including terms of access.</w:t>
             </w:r>
           </w:p>
         </w:tc>

</xml_diff>

<commit_message>
1. Updated checking at least one author has author affiliation filled in (mid-4.3)
</commit_message>
<xml_diff>
--- a/res/template_new.docx
+++ b/res/template_new.docx
@@ -30,7 +30,14 @@
         <w:rPr>
           <w:rFonts w:hint="eastAsia"/>
         </w:rPr>
-        <w:t>Ticket number: {</w:t>
+        <w:t xml:space="preserve">Ticket number: </w:t>
+      </w:r>
+      <w:proofErr w:type="gramStart"/>
+      <w:r>
+        <w:rPr>
+          <w:rFonts w:hint="eastAsia"/>
+        </w:rPr>
+        <w:t>{</w:t>
       </w:r>
       <w:r>
         <w:rPr>
@@ -46,7 +53,11 @@
       </w:r>
       <w:proofErr w:type="spellStart"/>
       <w:r>
-        <w:t>project_info</w:t>
+        <w:t>project</w:t>
+      </w:r>
+      <w:proofErr w:type="gramEnd"/>
+      <w:r>
+        <w:t>_info</w:t>
       </w:r>
       <w:r>
         <w:rPr>
@@ -88,11 +99,22 @@
         <w:rPr>
           <w:rFonts w:hint="eastAsia"/>
         </w:rPr>
-        <w:t xml:space="preserve"> {{ </w:t>
+        <w:t xml:space="preserve"> </w:t>
+      </w:r>
+      <w:proofErr w:type="gramStart"/>
+      <w:r>
+        <w:rPr>
+          <w:rFonts w:hint="eastAsia"/>
+        </w:rPr>
+        <w:t xml:space="preserve">{{ </w:t>
       </w:r>
       <w:proofErr w:type="spellStart"/>
       <w:r>
-        <w:t>project_info</w:t>
+        <w:t>project</w:t>
+      </w:r>
+      <w:proofErr w:type="gramEnd"/>
+      <w:r>
+        <w:t>_info</w:t>
       </w:r>
       <w:r>
         <w:rPr>
@@ -113,11 +135,22 @@
         <w:rPr>
           <w:rFonts w:hint="eastAsia"/>
         </w:rPr>
-        <w:t xml:space="preserve">Curator email: {{ </w:t>
+        <w:t xml:space="preserve">Curator email: </w:t>
+      </w:r>
+      <w:proofErr w:type="gramStart"/>
+      <w:r>
+        <w:rPr>
+          <w:rFonts w:hint="eastAsia"/>
+        </w:rPr>
+        <w:t xml:space="preserve">{{ </w:t>
       </w:r>
       <w:proofErr w:type="spellStart"/>
       <w:r>
-        <w:t>project_info</w:t>
+        <w:t>project</w:t>
+      </w:r>
+      <w:proofErr w:type="gramEnd"/>
+      <w:r>
+        <w:t>_info</w:t>
       </w:r>
       <w:r>
         <w:rPr>
@@ -143,6 +176,7 @@
         </w:rPr>
         <w:t xml:space="preserve">Dataset title: </w:t>
       </w:r>
+      <w:proofErr w:type="gramStart"/>
       <w:r>
         <w:rPr>
           <w:rFonts w:hint="eastAsia"/>
@@ -154,7 +188,14 @@
         <w:rPr>
           <w:rFonts w:hint="eastAsia"/>
         </w:rPr>
-        <w:t>dataset.</w:t>
+        <w:t>dataset</w:t>
+      </w:r>
+      <w:proofErr w:type="gramEnd"/>
+      <w:r>
+        <w:rPr>
+          <w:rFonts w:hint="eastAsia"/>
+        </w:rPr>
+        <w:t>.</w:t>
       </w:r>
       <w:r>
         <w:t>DatasetTitle</w:t>
@@ -193,7 +234,14 @@
         <w:rPr>
           <w:rFonts w:hint="eastAsia"/>
         </w:rPr>
-        <w:t>: {</w:t>
+        <w:t xml:space="preserve">: </w:t>
+      </w:r>
+      <w:proofErr w:type="gramStart"/>
+      <w:r>
+        <w:rPr>
+          <w:rFonts w:hint="eastAsia"/>
+        </w:rPr>
+        <w:t>{</w:t>
       </w:r>
       <w:r>
         <w:rPr>
@@ -212,7 +260,14 @@
         <w:rPr>
           <w:rFonts w:hint="eastAsia"/>
         </w:rPr>
-        <w:t>dataset.</w:t>
+        <w:t>dataset</w:t>
+      </w:r>
+      <w:proofErr w:type="gramEnd"/>
+      <w:r>
+        <w:rPr>
+          <w:rFonts w:hint="eastAsia"/>
+        </w:rPr>
+        <w:t>.</w:t>
       </w:r>
       <w:r>
         <w:t>DatasetPersistentId</w:t>
@@ -236,7 +291,21 @@
         <w:rPr>
           <w:rFonts w:hint="eastAsia"/>
         </w:rPr>
-        <w:t>Dataset ID (versioned): {{ dataset.ID  }}</w:t>
+        <w:t xml:space="preserve">Dataset ID (versioned): </w:t>
+      </w:r>
+      <w:proofErr w:type="gramStart"/>
+      <w:r>
+        <w:rPr>
+          <w:rFonts w:hint="eastAsia"/>
+        </w:rPr>
+        <w:t>{{ dataset.ID</w:t>
+      </w:r>
+      <w:proofErr w:type="gramEnd"/>
+      <w:r>
+        <w:rPr>
+          <w:rFonts w:hint="eastAsia"/>
+        </w:rPr>
+        <w:t xml:space="preserve">  }}</w:t>
       </w:r>
     </w:p>
     <w:p>
@@ -244,7 +313,14 @@
         <w:rPr>
           <w:rFonts w:hint="eastAsia"/>
         </w:rPr>
-        <w:t>Dataset access URL: {</w:t>
+        <w:t xml:space="preserve">Dataset access URL: </w:t>
+      </w:r>
+      <w:proofErr w:type="gramStart"/>
+      <w:r>
+        <w:rPr>
+          <w:rFonts w:hint="eastAsia"/>
+        </w:rPr>
+        <w:t>{</w:t>
       </w:r>
       <w:r>
         <w:rPr>
@@ -263,7 +339,14 @@
         <w:rPr>
           <w:rFonts w:hint="eastAsia"/>
         </w:rPr>
-        <w:t>dataset.</w:t>
+        <w:t>dataset</w:t>
+      </w:r>
+      <w:proofErr w:type="gramEnd"/>
+      <w:r>
+        <w:rPr>
+          <w:rFonts w:hint="eastAsia"/>
+        </w:rPr>
+        <w:t>.</w:t>
       </w:r>
       <w:r>
         <w:t>DatasetURL</w:t>
@@ -316,6 +399,7 @@
         </w:rPr>
         <w:t xml:space="preserve">date: </w:t>
       </w:r>
+      <w:proofErr w:type="gramStart"/>
       <w:r>
         <w:rPr>
           <w:rFonts w:hint="eastAsia"/>
@@ -340,6 +424,7 @@
         </w:rPr>
         <w:t>timestamp</w:t>
       </w:r>
+      <w:proofErr w:type="gramEnd"/>
       <w:r>
         <w:rPr>
           <w:rFonts w:hint="eastAsia"/>
@@ -1398,79 +1483,99 @@
             </w:r>
             <w:proofErr w:type="spellStart"/>
             <w:r>
-              <w:t>template_dict.dv_record.comments</w:t>
+              <w:t>template_dict.dv_record.</w:t>
+            </w:r>
+            <w:proofErr w:type="gramStart"/>
+            <w:r>
+              <w:t>comments</w:t>
             </w:r>
             <w:proofErr w:type="spellEnd"/>
             <w:r>
+              <w:t xml:space="preserve"> %}</w:t>
+            </w:r>
+            <w:proofErr w:type="gramEnd"/>
+            <w:r>
+              <w:t xml:space="preserve"> </w:t>
+            </w:r>
+          </w:p>
+          <w:p>
+            <w:r>
+              <w:t xml:space="preserve">{% for author, </w:t>
+            </w:r>
+            <w:proofErr w:type="spellStart"/>
+            <w:r>
+              <w:t>dataverses</w:t>
+            </w:r>
+            <w:proofErr w:type="spellEnd"/>
+            <w:r>
+              <w:t xml:space="preserve"> in </w:t>
+            </w:r>
+            <w:proofErr w:type="spellStart"/>
+            <w:proofErr w:type="gramStart"/>
+            <w:r>
+              <w:t>item.items</w:t>
+            </w:r>
+            <w:proofErr w:type="spellEnd"/>
+            <w:proofErr w:type="gramEnd"/>
+            <w:r>
+              <w:t>() %} {{ author }}</w:t>
+            </w:r>
+            <w:r>
+              <w:rPr>
+                <w:rFonts w:hint="eastAsia"/>
+              </w:rPr>
+              <w:t>:</w:t>
+            </w:r>
+          </w:p>
+          <w:p>
+            <w:r>
+              <w:t xml:space="preserve">{% for </w:t>
+            </w:r>
+            <w:proofErr w:type="spellStart"/>
+            <w:r>
+              <w:t>dataverse</w:t>
+            </w:r>
+            <w:proofErr w:type="spellEnd"/>
+            <w:r>
+              <w:t xml:space="preserve"> in </w:t>
+            </w:r>
+            <w:proofErr w:type="spellStart"/>
+            <w:r>
+              <w:t>dataverses</w:t>
+            </w:r>
+            <w:proofErr w:type="spellEnd"/>
+            <w:r>
               <w:t xml:space="preserve"> %} </w:t>
             </w:r>
-          </w:p>
-          <w:p>
-            <w:r>
-              <w:t xml:space="preserve">{% for author, </w:t>
+            <w:proofErr w:type="gramStart"/>
+            <w:r>
+              <w:t xml:space="preserve">{{ </w:t>
             </w:r>
             <w:proofErr w:type="spellStart"/>
             <w:r>
-              <w:t>dataverses</w:t>
+              <w:t>loop</w:t>
+            </w:r>
+            <w:proofErr w:type="gramEnd"/>
+            <w:r>
+              <w:t>.index</w:t>
             </w:r>
             <w:proofErr w:type="spellEnd"/>
             <w:r>
-              <w:t xml:space="preserve"> in </w:t>
-            </w:r>
-            <w:proofErr w:type="spellStart"/>
-            <w:r>
-              <w:t>item.items</w:t>
-            </w:r>
-            <w:proofErr w:type="spellEnd"/>
-            <w:r>
-              <w:t>() %} {{ author }}</w:t>
+              <w:t xml:space="preserve"> }}.</w:t>
             </w:r>
             <w:r>
               <w:rPr>
                 <w:rFonts w:hint="eastAsia"/>
               </w:rPr>
-              <w:t>:</w:t>
-            </w:r>
-          </w:p>
-          <w:p>
-            <w:r>
-              <w:t xml:space="preserve">{% for </w:t>
-            </w:r>
-            <w:proofErr w:type="spellStart"/>
-            <w:r>
-              <w:t>dataverse</w:t>
-            </w:r>
-            <w:proofErr w:type="spellEnd"/>
-            <w:r>
-              <w:t xml:space="preserve"> in </w:t>
-            </w:r>
-            <w:proofErr w:type="spellStart"/>
-            <w:r>
-              <w:t>dataverses</w:t>
-            </w:r>
-            <w:proofErr w:type="spellEnd"/>
-            <w:r>
-              <w:t xml:space="preserve"> %} </w:t>
-            </w:r>
-            <w:r>
-              <w:t xml:space="preserve">{{ </w:t>
-            </w:r>
-            <w:proofErr w:type="spellStart"/>
-            <w:r>
-              <w:t>loop.index</w:t>
-            </w:r>
-            <w:proofErr w:type="spellEnd"/>
-            <w:r>
-              <w:t xml:space="preserve"> }}.</w:t>
-            </w:r>
-            <w:r>
-              <w:rPr>
-                <w:rFonts w:hint="eastAsia"/>
-              </w:rPr>
               <w:t xml:space="preserve"> </w:t>
             </w:r>
-            <w:r>
-              <w:t>{{ dataverse }}</w:t>
+            <w:proofErr w:type="gramStart"/>
+            <w:r>
+              <w:t>{{ dataverse</w:t>
+            </w:r>
+            <w:proofErr w:type="gramEnd"/>
+            <w:r>
+              <w:t xml:space="preserve"> }}</w:t>
             </w:r>
             <w:r>
               <w:br/>
@@ -1668,19 +1773,6 @@
                 <w:lang w:val="en-US"/>
               </w:rPr>
               <w:t>Python scripted.</w:t>
-            </w:r>
-          </w:p>
-          <w:p>
-            <w:pPr>
-              <w:rPr>
-                <w:lang w:val="en-US"/>
-              </w:rPr>
-            </w:pPr>
-            <w:r>
-              <w:rPr>
-                <w:lang w:val="en-US"/>
-              </w:rPr>
-              <w:br/>
             </w:r>
           </w:p>
           <w:p>
@@ -1711,79 +1803,220 @@
               <w:rPr>
                 <w:lang w:val="en-US"/>
               </w:rPr>
-              <w:t xml:space="preserve"> collection, include the name of the </w:t>
-            </w:r>
-            <w:r>
-              <w:rPr>
-                <w:lang w:val="en-US"/>
-              </w:rPr>
-              <w:lastRenderedPageBreak/>
-              <w:t>collection. </w:t>
-            </w:r>
-          </w:p>
-          <w:p>
-            <w:pPr>
-              <w:rPr>
-                <w:lang w:val="en-US"/>
-              </w:rPr>
-            </w:pPr>
-          </w:p>
-        </w:tc>
-        <w:tc>
-          <w:tcPr>
-            <w:tcW w:w="0" w:type="auto"/>
-            <w:tcBorders>
-              <w:top w:val="single" w:sz="8" w:space="0" w:color="000000"/>
-              <w:left w:val="single" w:sz="8" w:space="0" w:color="000000"/>
-              <w:bottom w:val="single" w:sz="8" w:space="0" w:color="000000"/>
-              <w:right w:val="single" w:sz="8" w:space="0" w:color="000000"/>
-            </w:tcBorders>
-            <w:tcMar>
-              <w:top w:w="100" w:type="dxa"/>
-              <w:left w:w="100" w:type="dxa"/>
-              <w:bottom w:w="100" w:type="dxa"/>
-              <w:right w:w="100" w:type="dxa"/>
-            </w:tcMar>
-            <w:hideMark/>
-          </w:tcPr>
-          <w:p>
-            <w:pPr>
-              <w:rPr>
-                <w:lang w:val="en-US"/>
-              </w:rPr>
-            </w:pPr>
-          </w:p>
-          <w:p>
-            <w:pPr>
-              <w:rPr>
-                <w:lang w:val="en-US"/>
-              </w:rPr>
-            </w:pPr>
-          </w:p>
-        </w:tc>
-        <w:tc>
-          <w:tcPr>
-            <w:tcW w:w="0" w:type="auto"/>
-            <w:tcBorders>
-              <w:top w:val="single" w:sz="8" w:space="0" w:color="000000"/>
-              <w:left w:val="single" w:sz="8" w:space="0" w:color="000000"/>
-              <w:bottom w:val="single" w:sz="8" w:space="0" w:color="000000"/>
-              <w:right w:val="single" w:sz="8" w:space="0" w:color="000000"/>
-            </w:tcBorders>
-            <w:tcMar>
-              <w:top w:w="100" w:type="dxa"/>
-              <w:left w:w="100" w:type="dxa"/>
-              <w:bottom w:w="100" w:type="dxa"/>
-              <w:right w:w="100" w:type="dxa"/>
-            </w:tcMar>
-            <w:hideMark/>
-          </w:tcPr>
-          <w:p>
-            <w:pPr>
-              <w:rPr>
-                <w:lang w:val="en-US"/>
-              </w:rPr>
-            </w:pPr>
+              <w:t xml:space="preserve"> collection, include the name of the collection. </w:t>
+            </w:r>
+          </w:p>
+          <w:p>
+            <w:pPr>
+              <w:rPr>
+                <w:lang w:val="en-US"/>
+              </w:rPr>
+            </w:pPr>
+          </w:p>
+        </w:tc>
+        <w:tc>
+          <w:tcPr>
+            <w:tcW w:w="0" w:type="auto"/>
+            <w:tcBorders>
+              <w:top w:val="single" w:sz="8" w:space="0" w:color="000000"/>
+              <w:left w:val="single" w:sz="8" w:space="0" w:color="000000"/>
+              <w:bottom w:val="single" w:sz="8" w:space="0" w:color="000000"/>
+              <w:right w:val="single" w:sz="8" w:space="0" w:color="000000"/>
+            </w:tcBorders>
+            <w:tcMar>
+              <w:top w:w="100" w:type="dxa"/>
+              <w:left w:w="100" w:type="dxa"/>
+              <w:bottom w:w="100" w:type="dxa"/>
+              <w:right w:w="100" w:type="dxa"/>
+            </w:tcMar>
+            <w:hideMark/>
+          </w:tcPr>
+          <w:p>
+            <w:r>
+              <w:rPr>
+                <w:lang w:val="en-US"/>
+              </w:rPr>
+              <w:t xml:space="preserve">{% if </w:t>
+            </w:r>
+            <w:proofErr w:type="spellStart"/>
+            <w:r>
+              <w:rPr>
+                <w:lang w:val="en-US"/>
+              </w:rPr>
+              <w:t>template_dict</w:t>
+            </w:r>
+            <w:proofErr w:type="spellEnd"/>
+            <w:r>
+              <w:rPr>
+                <w:lang w:val="en-US"/>
+              </w:rPr>
+              <w:t>.</w:t>
+            </w:r>
+            <w:r>
+              <w:rPr>
+                <w:rFonts w:ascii="Consolas" w:eastAsia="Times New Roman" w:hAnsi="Consolas" w:cs="Times New Roman"/>
+                <w:color w:val="9CDCFE"/>
+                <w:kern w:val="0"/>
+                <w:sz w:val="21"/>
+                <w:szCs w:val="21"/>
+                <w14:ligatures w14:val="none"/>
+              </w:rPr>
+              <w:t xml:space="preserve"> </w:t>
+            </w:r>
+            <w:proofErr w:type="spellStart"/>
+            <w:r>
+              <w:t>name_name_of_dataverse</w:t>
+            </w:r>
+            <w:proofErr w:type="spellEnd"/>
+            <w:r>
+              <w:rPr>
+                <w:lang w:val="en-US"/>
+              </w:rPr>
+              <w:t xml:space="preserve"> == </w:t>
+            </w:r>
+            <w:r>
+              <w:rPr>
+                <w:lang w:val="en-US"/>
+              </w:rPr>
+              <w:t>‘</w:t>
+            </w:r>
+            <w:r>
+              <w:rPr>
+                <w:lang w:val="en-US"/>
+              </w:rPr>
+              <w:t>University of Toronto Dataverse</w:t>
+            </w:r>
+            <w:proofErr w:type="gramStart"/>
+            <w:r>
+              <w:rPr>
+                <w:lang w:val="en-US"/>
+              </w:rPr>
+              <w:t>’</w:t>
+            </w:r>
+            <w:r>
+              <w:rPr>
+                <w:lang w:val="en-US"/>
+              </w:rPr>
+              <w:t xml:space="preserve"> %}</w:t>
+            </w:r>
+            <w:proofErr w:type="gramEnd"/>
+            <w:r>
+              <w:rPr>
+                <w:lang w:val="en-US"/>
+              </w:rPr>
+              <w:t>X{% endif %}</w:t>
+            </w:r>
+          </w:p>
+        </w:tc>
+        <w:tc>
+          <w:tcPr>
+            <w:tcW w:w="0" w:type="auto"/>
+            <w:tcBorders>
+              <w:top w:val="single" w:sz="8" w:space="0" w:color="000000"/>
+              <w:left w:val="single" w:sz="8" w:space="0" w:color="000000"/>
+              <w:bottom w:val="single" w:sz="8" w:space="0" w:color="000000"/>
+              <w:right w:val="single" w:sz="8" w:space="0" w:color="000000"/>
+            </w:tcBorders>
+            <w:tcMar>
+              <w:top w:w="100" w:type="dxa"/>
+              <w:left w:w="100" w:type="dxa"/>
+              <w:bottom w:w="100" w:type="dxa"/>
+              <w:right w:w="100" w:type="dxa"/>
+            </w:tcMar>
+            <w:hideMark/>
+          </w:tcPr>
+          <w:p>
+            <w:pPr>
+              <w:rPr>
+                <w:lang w:val="en-US"/>
+              </w:rPr>
+            </w:pPr>
+            <w:r>
+              <w:rPr>
+                <w:lang w:val="en-US"/>
+              </w:rPr>
+              <w:t xml:space="preserve">{% if </w:t>
+            </w:r>
+            <w:proofErr w:type="spellStart"/>
+            <w:r>
+              <w:rPr>
+                <w:lang w:val="en-US"/>
+              </w:rPr>
+              <w:t>template_dict</w:t>
+            </w:r>
+            <w:proofErr w:type="spellEnd"/>
+            <w:r>
+              <w:rPr>
+                <w:lang w:val="en-US"/>
+              </w:rPr>
+              <w:t>.</w:t>
+            </w:r>
+            <w:r>
+              <w:rPr>
+                <w:rFonts w:ascii="Consolas" w:eastAsia="Times New Roman" w:hAnsi="Consolas" w:cs="Times New Roman"/>
+                <w:color w:val="9CDCFE"/>
+                <w:kern w:val="0"/>
+                <w:sz w:val="21"/>
+                <w:szCs w:val="21"/>
+                <w14:ligatures w14:val="none"/>
+              </w:rPr>
+              <w:t xml:space="preserve"> </w:t>
+            </w:r>
+            <w:proofErr w:type="spellStart"/>
+            <w:r>
+              <w:t>name_name_of_dataverse</w:t>
+            </w:r>
+            <w:proofErr w:type="spellEnd"/>
+            <w:r>
+              <w:rPr>
+                <w:lang w:val="en-US"/>
+              </w:rPr>
+              <w:t xml:space="preserve"> </w:t>
+            </w:r>
+            <w:r>
+              <w:rPr>
+                <w:lang w:val="en-US"/>
+              </w:rPr>
+              <w:t>!</w:t>
+            </w:r>
+            <w:r>
+              <w:rPr>
+                <w:lang w:val="en-US"/>
+              </w:rPr>
+              <w:t xml:space="preserve">= </w:t>
+            </w:r>
+            <w:r>
+              <w:rPr>
+                <w:lang w:val="en-US"/>
+              </w:rPr>
+              <w:t>‘</w:t>
+            </w:r>
+            <w:r>
+              <w:rPr>
+                <w:lang w:val="en-US"/>
+              </w:rPr>
+              <w:t>University of Toronto Dataverse</w:t>
+            </w:r>
+            <w:proofErr w:type="gramStart"/>
+            <w:r>
+              <w:rPr>
+                <w:lang w:val="en-US"/>
+              </w:rPr>
+              <w:t>’</w:t>
+            </w:r>
+            <w:r>
+              <w:rPr>
+                <w:lang w:val="en-US"/>
+              </w:rPr>
+              <w:t xml:space="preserve"> %}</w:t>
+            </w:r>
+            <w:proofErr w:type="gramEnd"/>
+            <w:r>
+              <w:rPr>
+                <w:lang w:val="en-US"/>
+              </w:rPr>
+              <w:t>X{% endif %}</w:t>
+            </w:r>
           </w:p>
         </w:tc>
         <w:tc>
@@ -2061,6 +2294,7 @@
                 <w:bCs/>
                 <w:lang w:val="en-US"/>
               </w:rPr>
+              <w:lastRenderedPageBreak/>
               <w:t>1.3</w:t>
             </w:r>
           </w:p>
@@ -2271,7 +2505,21 @@
               <w:rPr>
                 <w:lang w:val="en-US"/>
               </w:rPr>
-              <w:t xml:space="preserve">Confirm with the depositor that they actually require a </w:t>
+              <w:t xml:space="preserve">Confirm with the depositor that they </w:t>
+            </w:r>
+            <w:proofErr w:type="gramStart"/>
+            <w:r>
+              <w:rPr>
+                <w:lang w:val="en-US"/>
+              </w:rPr>
+              <w:t>actually require</w:t>
+            </w:r>
+            <w:proofErr w:type="gramEnd"/>
+            <w:r>
+              <w:rPr>
+                <w:lang w:val="en-US"/>
+              </w:rPr>
+              <w:t xml:space="preserve"> a </w:t>
             </w:r>
             <w:proofErr w:type="spellStart"/>
             <w:r>
@@ -2533,7 +2781,6 @@
                 <w:bCs/>
                 <w:lang w:val="en-US"/>
               </w:rPr>
-              <w:lastRenderedPageBreak/>
               <w:t>2.0</w:t>
             </w:r>
           </w:p>
@@ -2877,6 +3124,7 @@
                 <w:bCs/>
                 <w:lang w:val="en-US"/>
               </w:rPr>
+              <w:lastRenderedPageBreak/>
               <w:t>2.1a</w:t>
             </w:r>
           </w:p>
@@ -3157,7 +3405,14 @@
               <w:rPr>
                 <w:lang w:val="en-US"/>
               </w:rPr>
-              <w:t>template_dict.file_open.comments</w:t>
+              <w:t>template_dict.file_open.</w:t>
+            </w:r>
+            <w:proofErr w:type="gramStart"/>
+            <w:r>
+              <w:rPr>
+                <w:lang w:val="en-US"/>
+              </w:rPr>
+              <w:t>comments</w:t>
             </w:r>
             <w:proofErr w:type="spellEnd"/>
             <w:r>
@@ -3166,6 +3421,7 @@
               </w:rPr>
               <w:t xml:space="preserve"> %}</w:t>
             </w:r>
+            <w:proofErr w:type="gramEnd"/>
           </w:p>
           <w:p>
             <w:pPr>
@@ -3189,7 +3445,14 @@
               <w:rPr>
                 <w:lang w:val="en-US"/>
               </w:rPr>
-              <w:t>item.file_name</w:t>
+              <w:t>item.file_</w:t>
+            </w:r>
+            <w:proofErr w:type="gramStart"/>
+            <w:r>
+              <w:rPr>
+                <w:lang w:val="en-US"/>
+              </w:rPr>
+              <w:t>name</w:t>
             </w:r>
             <w:proofErr w:type="spellEnd"/>
             <w:r>
@@ -3202,7 +3465,14 @@
               <w:rPr>
                 <w:lang w:val="en-US"/>
               </w:rPr>
-              <w:t xml:space="preserve">{% </w:t>
+              <w:t>{%</w:t>
+            </w:r>
+            <w:proofErr w:type="gramEnd"/>
+            <w:r>
+              <w:rPr>
+                <w:lang w:val="en-US"/>
+              </w:rPr>
+              <w:t xml:space="preserve"> </w:t>
             </w:r>
             <w:proofErr w:type="spellStart"/>
             <w:r>
@@ -3233,11 +3503,19 @@
                 <w:lang w:val="en-US"/>
               </w:rPr>
             </w:pPr>
-            <w:r>
-              <w:rPr>
-                <w:lang w:val="en-US"/>
-              </w:rPr>
-              <w:t>List all files that were not checked:</w:t>
+            <w:proofErr w:type="gramStart"/>
+            <w:r>
+              <w:rPr>
+                <w:lang w:val="en-US"/>
+              </w:rPr>
+              <w:t>List</w:t>
+            </w:r>
+            <w:proofErr w:type="gramEnd"/>
+            <w:r>
+              <w:rPr>
+                <w:lang w:val="en-US"/>
+              </w:rPr>
+              <w:t xml:space="preserve"> all files that were not checked:</w:t>
             </w:r>
           </w:p>
           <w:p>
@@ -3257,7 +3535,14 @@
               <w:rPr>
                 <w:lang w:val="en-US"/>
               </w:rPr>
-              <w:t>template_dict.file_open.not_checked</w:t>
+              <w:t>template_dict.file_open.not_</w:t>
+            </w:r>
+            <w:proofErr w:type="gramStart"/>
+            <w:r>
+              <w:rPr>
+                <w:lang w:val="en-US"/>
+              </w:rPr>
+              <w:t>checked</w:t>
             </w:r>
             <w:proofErr w:type="spellEnd"/>
             <w:r>
@@ -3266,6 +3551,7 @@
               </w:rPr>
               <w:t xml:space="preserve"> %}</w:t>
             </w:r>
+            <w:proofErr w:type="gramEnd"/>
           </w:p>
           <w:p>
             <w:pPr>
@@ -3289,14 +3575,28 @@
               <w:rPr>
                 <w:lang w:val="en-US"/>
               </w:rPr>
-              <w:t>item.file_name</w:t>
+              <w:t>item.file_</w:t>
+            </w:r>
+            <w:proofErr w:type="gramStart"/>
+            <w:r>
+              <w:rPr>
+                <w:lang w:val="en-US"/>
+              </w:rPr>
+              <w:t>name</w:t>
             </w:r>
             <w:proofErr w:type="spellEnd"/>
             <w:r>
               <w:rPr>
                 <w:lang w:val="en-US"/>
               </w:rPr>
-              <w:t xml:space="preserve"> }}{% </w:t>
+              <w:t xml:space="preserve"> }}{%</w:t>
+            </w:r>
+            <w:proofErr w:type="gramEnd"/>
+            <w:r>
+              <w:rPr>
+                <w:lang w:val="en-US"/>
+              </w:rPr>
+              <w:t xml:space="preserve"> </w:t>
             </w:r>
             <w:proofErr w:type="spellStart"/>
             <w:r>
@@ -3709,7 +4009,14 @@
               <w:rPr>
                 <w:lang w:val="en-US"/>
               </w:rPr>
-              <w:t>template_dict.special_characters.comments</w:t>
+              <w:t>template_dict.special_characters.</w:t>
+            </w:r>
+            <w:proofErr w:type="gramStart"/>
+            <w:r>
+              <w:rPr>
+                <w:lang w:val="en-US"/>
+              </w:rPr>
+              <w:t>comments</w:t>
             </w:r>
             <w:proofErr w:type="spellEnd"/>
             <w:r>
@@ -3718,6 +4025,7 @@
               </w:rPr>
               <w:t xml:space="preserve"> %}</w:t>
             </w:r>
+            <w:proofErr w:type="gramEnd"/>
           </w:p>
           <w:p>
             <w:pPr>
@@ -3741,14 +4049,28 @@
               <w:rPr>
                 <w:lang w:val="en-US"/>
               </w:rPr>
-              <w:t>item.file_name</w:t>
+              <w:t>item.file_</w:t>
+            </w:r>
+            <w:proofErr w:type="gramStart"/>
+            <w:r>
+              <w:rPr>
+                <w:lang w:val="en-US"/>
+              </w:rPr>
+              <w:t>name</w:t>
             </w:r>
             <w:proofErr w:type="spellEnd"/>
             <w:r>
               <w:rPr>
                 <w:lang w:val="en-US"/>
               </w:rPr>
-              <w:t xml:space="preserve"> }}{% </w:t>
+              <w:t xml:space="preserve"> }}{%</w:t>
+            </w:r>
+            <w:proofErr w:type="gramEnd"/>
+            <w:r>
+              <w:rPr>
+                <w:lang w:val="en-US"/>
+              </w:rPr>
+              <w:t xml:space="preserve"> </w:t>
             </w:r>
             <w:proofErr w:type="spellStart"/>
             <w:r>
@@ -4152,7 +4474,14 @@
               <w:rPr>
                 <w:lang w:val="en-US"/>
               </w:rPr>
-              <w:t>template_dict.file_ext.comments</w:t>
+              <w:t>template_dict.file_ext.</w:t>
+            </w:r>
+            <w:proofErr w:type="gramStart"/>
+            <w:r>
+              <w:rPr>
+                <w:lang w:val="en-US"/>
+              </w:rPr>
+              <w:t>comments</w:t>
             </w:r>
             <w:proofErr w:type="spellEnd"/>
             <w:r>
@@ -4161,6 +4490,7 @@
               </w:rPr>
               <w:t xml:space="preserve"> %}</w:t>
             </w:r>
+            <w:proofErr w:type="gramEnd"/>
           </w:p>
           <w:p>
             <w:pPr>
@@ -4184,14 +4514,28 @@
               <w:rPr>
                 <w:lang w:val="en-US"/>
               </w:rPr>
-              <w:t>item.file_name</w:t>
+              <w:t>item.file_</w:t>
+            </w:r>
+            <w:proofErr w:type="gramStart"/>
+            <w:r>
+              <w:rPr>
+                <w:lang w:val="en-US"/>
+              </w:rPr>
+              <w:t>name</w:t>
             </w:r>
             <w:proofErr w:type="spellEnd"/>
             <w:r>
               <w:rPr>
                 <w:lang w:val="en-US"/>
               </w:rPr>
-              <w:t xml:space="preserve"> }}{% </w:t>
+              <w:t xml:space="preserve"> }}{%</w:t>
+            </w:r>
+            <w:proofErr w:type="gramEnd"/>
+            <w:r>
+              <w:rPr>
+                <w:lang w:val="en-US"/>
+              </w:rPr>
+              <w:t xml:space="preserve"> </w:t>
             </w:r>
             <w:proofErr w:type="spellStart"/>
             <w:r>
@@ -4335,47 +4679,37 @@
                 <w:bCs/>
                 <w:lang w:val="en-US"/>
               </w:rPr>
-              <w:t xml:space="preserve">Do all files appear on the common </w:t>
-            </w:r>
-            <w:r>
-              <w:rPr>
-                <w:b/>
-                <w:bCs/>
-                <w:lang w:val="en-US"/>
-              </w:rPr>
-              <w:lastRenderedPageBreak/>
-              <w:t>file format list?</w:t>
-            </w:r>
-          </w:p>
-        </w:tc>
-        <w:tc>
-          <w:tcPr>
-            <w:tcW w:w="0" w:type="auto"/>
-            <w:tcBorders>
-              <w:top w:val="single" w:sz="8" w:space="0" w:color="000000"/>
-              <w:left w:val="single" w:sz="8" w:space="0" w:color="000000"/>
-              <w:bottom w:val="single" w:sz="8" w:space="0" w:color="000000"/>
-              <w:right w:val="single" w:sz="8" w:space="0" w:color="000000"/>
-            </w:tcBorders>
-            <w:tcMar>
-              <w:top w:w="100" w:type="dxa"/>
-              <w:left w:w="100" w:type="dxa"/>
-              <w:bottom w:w="100" w:type="dxa"/>
-              <w:right w:w="100" w:type="dxa"/>
-            </w:tcMar>
-            <w:hideMark/>
-          </w:tcPr>
-          <w:p>
-            <w:pPr>
-              <w:rPr>
-                <w:lang w:val="en-US"/>
-              </w:rPr>
-            </w:pPr>
-            <w:r>
-              <w:rPr>
-                <w:lang w:val="en-US"/>
-              </w:rPr>
-              <w:lastRenderedPageBreak/>
+              <w:t>Do all files appear on the common file format list?</w:t>
+            </w:r>
+          </w:p>
+        </w:tc>
+        <w:tc>
+          <w:tcPr>
+            <w:tcW w:w="0" w:type="auto"/>
+            <w:tcBorders>
+              <w:top w:val="single" w:sz="8" w:space="0" w:color="000000"/>
+              <w:left w:val="single" w:sz="8" w:space="0" w:color="000000"/>
+              <w:bottom w:val="single" w:sz="8" w:space="0" w:color="000000"/>
+              <w:right w:val="single" w:sz="8" w:space="0" w:color="000000"/>
+            </w:tcBorders>
+            <w:tcMar>
+              <w:top w:w="100" w:type="dxa"/>
+              <w:left w:w="100" w:type="dxa"/>
+              <w:bottom w:w="100" w:type="dxa"/>
+              <w:right w:w="100" w:type="dxa"/>
+            </w:tcMar>
+            <w:hideMark/>
+          </w:tcPr>
+          <w:p>
+            <w:pPr>
+              <w:rPr>
+                <w:lang w:val="en-US"/>
+              </w:rPr>
+            </w:pPr>
+            <w:r>
+              <w:rPr>
+                <w:lang w:val="en-US"/>
+              </w:rPr>
               <w:t>Python scripted.</w:t>
             </w:r>
           </w:p>
@@ -4669,6 +5003,7 @@
                 <w:bCs/>
                 <w:lang w:val="en-US"/>
               </w:rPr>
+              <w:lastRenderedPageBreak/>
               <w:t>2.5</w:t>
             </w:r>
           </w:p>
@@ -5656,7 +5991,14 @@
               <w:rPr>
                 <w:lang w:val="en-US"/>
               </w:rPr>
-              <w:t>template_dict.readme_file.comments</w:t>
+              <w:t>template_dict.readme_file.</w:t>
+            </w:r>
+            <w:proofErr w:type="gramStart"/>
+            <w:r>
+              <w:rPr>
+                <w:lang w:val="en-US"/>
+              </w:rPr>
+              <w:t>comments</w:t>
             </w:r>
             <w:proofErr w:type="spellEnd"/>
             <w:r>
@@ -5666,7 +6008,11 @@
               <w:t xml:space="preserve"> %}</w:t>
             </w:r>
             <w:r>
-              <w:t xml:space="preserve">{{ </w:t>
+              <w:t>{{</w:t>
+            </w:r>
+            <w:proofErr w:type="gramEnd"/>
+            <w:r>
+              <w:t xml:space="preserve"> </w:t>
             </w:r>
             <w:proofErr w:type="spellStart"/>
             <w:r>
@@ -6325,7 +6671,6 @@
               <w:rPr>
                 <w:lang w:val="en-US"/>
               </w:rPr>
-              <w:lastRenderedPageBreak/>
               <w:t>Description</w:t>
             </w:r>
           </w:p>
@@ -6528,7 +6873,14 @@
               <w:rPr>
                 <w:lang w:val="en-US"/>
               </w:rPr>
-              <w:t>template_dict.typo.comments</w:t>
+              <w:t>template_dict.typo.</w:t>
+            </w:r>
+            <w:proofErr w:type="gramStart"/>
+            <w:r>
+              <w:rPr>
+                <w:lang w:val="en-US"/>
+              </w:rPr>
+              <w:t>comments</w:t>
             </w:r>
             <w:proofErr w:type="spellEnd"/>
             <w:r>
@@ -6537,6 +6889,7 @@
               </w:rPr>
               <w:t xml:space="preserve"> %}</w:t>
             </w:r>
+            <w:proofErr w:type="gramEnd"/>
           </w:p>
           <w:p>
             <w:pPr>
@@ -6546,11 +6899,19 @@
                 <w:numId w:val="27"/>
               </w:numPr>
             </w:pPr>
-            <w:r>
-              <w:rPr>
-                <w:lang w:val="en-US"/>
-              </w:rPr>
-              <w:t xml:space="preserve">{{ item }}{% </w:t>
+            <w:proofErr w:type="gramStart"/>
+            <w:r>
+              <w:rPr>
+                <w:lang w:val="en-US"/>
+              </w:rPr>
+              <w:t>{{ item }}{%</w:t>
+            </w:r>
+            <w:proofErr w:type="gramEnd"/>
+            <w:r>
+              <w:rPr>
+                <w:lang w:val="en-US"/>
+              </w:rPr>
+              <w:t xml:space="preserve"> </w:t>
             </w:r>
             <w:proofErr w:type="spellStart"/>
             <w:r>
@@ -6675,6 +7036,7 @@
                 <w:bCs/>
                 <w:lang w:val="en-US"/>
               </w:rPr>
+              <w:lastRenderedPageBreak/>
               <w:t>4.2</w:t>
             </w:r>
           </w:p>
@@ -7180,6 +7542,1594 @@
             </w:tcMar>
             <w:hideMark/>
           </w:tcPr>
+          <w:p>
+            <w:r>
+              <w:t xml:space="preserve">{% if </w:t>
+            </w:r>
+            <w:r>
+              <w:t xml:space="preserve">not </w:t>
+            </w:r>
+            <w:proofErr w:type="spellStart"/>
+            <w:r>
+              <w:t>template_</w:t>
+            </w:r>
+            <w:proofErr w:type="gramStart"/>
+            <w:r>
+              <w:t>dict.none</w:t>
+            </w:r>
+            <w:proofErr w:type="gramEnd"/>
+            <w:r>
+              <w:t>_author_affiliation</w:t>
+            </w:r>
+            <w:proofErr w:type="spellEnd"/>
+            <w:r>
+              <w:t xml:space="preserve"> %}X{% endif %}</w:t>
+            </w:r>
+          </w:p>
+        </w:tc>
+        <w:tc>
+          <w:tcPr>
+            <w:tcW w:w="0" w:type="auto"/>
+            <w:tcBorders>
+              <w:top w:val="single" w:sz="8" w:space="0" w:color="000000"/>
+              <w:left w:val="single" w:sz="8" w:space="0" w:color="000000"/>
+              <w:bottom w:val="single" w:sz="8" w:space="0" w:color="000000"/>
+              <w:right w:val="single" w:sz="8" w:space="0" w:color="000000"/>
+            </w:tcBorders>
+            <w:tcMar>
+              <w:top w:w="100" w:type="dxa"/>
+              <w:left w:w="100" w:type="dxa"/>
+              <w:bottom w:w="100" w:type="dxa"/>
+              <w:right w:w="100" w:type="dxa"/>
+            </w:tcMar>
+            <w:hideMark/>
+          </w:tcPr>
+          <w:p>
+            <w:pPr>
+              <w:rPr>
+                <w:lang w:val="en-US"/>
+              </w:rPr>
+            </w:pPr>
+            <w:r>
+              <w:t>{% if</w:t>
+            </w:r>
+            <w:r>
+              <w:t xml:space="preserve"> </w:t>
+            </w:r>
+            <w:proofErr w:type="spellStart"/>
+            <w:r>
+              <w:t>template_</w:t>
+            </w:r>
+            <w:proofErr w:type="gramStart"/>
+            <w:r>
+              <w:t>dict.none</w:t>
+            </w:r>
+            <w:proofErr w:type="gramEnd"/>
+            <w:r>
+              <w:t>_author_affiliation</w:t>
+            </w:r>
+            <w:proofErr w:type="spellEnd"/>
+            <w:r>
+              <w:t xml:space="preserve"> %}X{% endif %}</w:t>
+            </w:r>
+          </w:p>
+        </w:tc>
+        <w:tc>
+          <w:tcPr>
+            <w:tcW w:w="0" w:type="auto"/>
+            <w:tcBorders>
+              <w:top w:val="single" w:sz="8" w:space="0" w:color="000000"/>
+              <w:left w:val="single" w:sz="8" w:space="0" w:color="000000"/>
+              <w:bottom w:val="single" w:sz="8" w:space="0" w:color="000000"/>
+              <w:right w:val="single" w:sz="8" w:space="0" w:color="000000"/>
+            </w:tcBorders>
+            <w:tcMar>
+              <w:top w:w="100" w:type="dxa"/>
+              <w:left w:w="100" w:type="dxa"/>
+              <w:bottom w:w="100" w:type="dxa"/>
+              <w:right w:w="100" w:type="dxa"/>
+            </w:tcMar>
+            <w:hideMark/>
+          </w:tcPr>
+          <w:p>
+            <w:pPr>
+              <w:rPr>
+                <w:lang w:val="en-US"/>
+              </w:rPr>
+            </w:pPr>
+          </w:p>
+        </w:tc>
+        <w:tc>
+          <w:tcPr>
+            <w:tcW w:w="0" w:type="auto"/>
+            <w:tcBorders>
+              <w:top w:val="single" w:sz="8" w:space="0" w:color="000000"/>
+              <w:left w:val="single" w:sz="8" w:space="0" w:color="000000"/>
+              <w:bottom w:val="single" w:sz="8" w:space="0" w:color="000000"/>
+              <w:right w:val="single" w:sz="8" w:space="0" w:color="000000"/>
+            </w:tcBorders>
+            <w:tcMar>
+              <w:top w:w="100" w:type="dxa"/>
+              <w:left w:w="100" w:type="dxa"/>
+              <w:bottom w:w="100" w:type="dxa"/>
+              <w:right w:w="100" w:type="dxa"/>
+            </w:tcMar>
+            <w:hideMark/>
+          </w:tcPr>
+          <w:p>
+            <w:pPr>
+              <w:rPr>
+                <w:lang w:val="en-US"/>
+              </w:rPr>
+            </w:pPr>
+          </w:p>
+        </w:tc>
+        <w:tc>
+          <w:tcPr>
+            <w:tcW w:w="0" w:type="auto"/>
+            <w:tcBorders>
+              <w:top w:val="single" w:sz="8" w:space="0" w:color="000000"/>
+              <w:left w:val="single" w:sz="8" w:space="0" w:color="000000"/>
+              <w:bottom w:val="single" w:sz="8" w:space="0" w:color="000000"/>
+              <w:right w:val="single" w:sz="8" w:space="0" w:color="000000"/>
+            </w:tcBorders>
+            <w:tcMar>
+              <w:top w:w="100" w:type="dxa"/>
+              <w:left w:w="100" w:type="dxa"/>
+              <w:bottom w:w="100" w:type="dxa"/>
+              <w:right w:w="100" w:type="dxa"/>
+            </w:tcMar>
+            <w:hideMark/>
+          </w:tcPr>
+          <w:p>
+            <w:pPr>
+              <w:rPr>
+                <w:lang w:val="en-US"/>
+              </w:rPr>
+            </w:pPr>
+          </w:p>
+        </w:tc>
+        <w:tc>
+          <w:tcPr>
+            <w:tcW w:w="0" w:type="auto"/>
+            <w:tcBorders>
+              <w:top w:val="single" w:sz="8" w:space="0" w:color="000000"/>
+              <w:left w:val="single" w:sz="8" w:space="0" w:color="000000"/>
+              <w:bottom w:val="single" w:sz="8" w:space="0" w:color="000000"/>
+              <w:right w:val="single" w:sz="8" w:space="0" w:color="000000"/>
+            </w:tcBorders>
+            <w:tcMar>
+              <w:top w:w="100" w:type="dxa"/>
+              <w:left w:w="100" w:type="dxa"/>
+              <w:bottom w:w="100" w:type="dxa"/>
+              <w:right w:w="100" w:type="dxa"/>
+            </w:tcMar>
+            <w:hideMark/>
+          </w:tcPr>
+          <w:p>
+            <w:pPr>
+              <w:rPr>
+                <w:b/>
+                <w:bCs/>
+                <w:color w:val="FF0000"/>
+                <w:sz w:val="40"/>
+                <w:szCs w:val="40"/>
+                <w:lang w:val="en-US"/>
+              </w:rPr>
+            </w:pPr>
+          </w:p>
+          <w:p>
+            <w:pPr>
+              <w:rPr>
+                <w:lang w:val="en-US"/>
+              </w:rPr>
+            </w:pPr>
+          </w:p>
+        </w:tc>
+        <w:tc>
+          <w:tcPr>
+            <w:tcW w:w="0" w:type="auto"/>
+            <w:tcBorders>
+              <w:top w:val="single" w:sz="8" w:space="0" w:color="000000"/>
+              <w:left w:val="single" w:sz="8" w:space="0" w:color="000000"/>
+              <w:bottom w:val="single" w:sz="8" w:space="0" w:color="000000"/>
+              <w:right w:val="single" w:sz="8" w:space="0" w:color="000000"/>
+            </w:tcBorders>
+            <w:tcMar>
+              <w:top w:w="100" w:type="dxa"/>
+              <w:left w:w="100" w:type="dxa"/>
+              <w:bottom w:w="100" w:type="dxa"/>
+              <w:right w:w="100" w:type="dxa"/>
+            </w:tcMar>
+            <w:hideMark/>
+          </w:tcPr>
+          <w:p>
+            <w:pPr>
+              <w:rPr>
+                <w:lang w:val="en-US"/>
+              </w:rPr>
+            </w:pPr>
+            <w:r>
+              <w:rPr>
+                <w:lang w:val="en-US"/>
+              </w:rPr>
+              <w:t>Require</w:t>
+            </w:r>
+          </w:p>
+        </w:tc>
+        <w:tc>
+          <w:tcPr>
+            <w:tcW w:w="0" w:type="auto"/>
+            <w:tcBorders>
+              <w:top w:val="single" w:sz="8" w:space="0" w:color="000000"/>
+              <w:left w:val="single" w:sz="8" w:space="0" w:color="000000"/>
+              <w:bottom w:val="single" w:sz="8" w:space="0" w:color="000000"/>
+              <w:right w:val="single" w:sz="8" w:space="0" w:color="000000"/>
+            </w:tcBorders>
+            <w:tcMar>
+              <w:top w:w="100" w:type="dxa"/>
+              <w:left w:w="100" w:type="dxa"/>
+              <w:bottom w:w="100" w:type="dxa"/>
+              <w:right w:w="100" w:type="dxa"/>
+            </w:tcMar>
+            <w:hideMark/>
+          </w:tcPr>
+          <w:p>
+            <w:pPr>
+              <w:rPr>
+                <w:lang w:val="en-US"/>
+              </w:rPr>
+            </w:pPr>
+            <w:r>
+              <w:rPr>
+                <w:lang w:val="en-US"/>
+              </w:rPr>
+              <w:t>Python scripted</w:t>
+            </w:r>
+          </w:p>
+        </w:tc>
+      </w:tr>
+      <w:tr>
+        <w:trPr>
+          <w:trHeight w:val="480"/>
+        </w:trPr>
+        <w:tc>
+          <w:tcPr>
+            <w:tcW w:w="0" w:type="auto"/>
+            <w:tcBorders>
+              <w:top w:val="single" w:sz="8" w:space="0" w:color="000000"/>
+              <w:left w:val="single" w:sz="8" w:space="0" w:color="000000"/>
+              <w:bottom w:val="single" w:sz="8" w:space="0" w:color="000000"/>
+              <w:right w:val="single" w:sz="8" w:space="0" w:color="000000"/>
+            </w:tcBorders>
+            <w:shd w:val="clear" w:color="auto" w:fill="D9EAD3"/>
+            <w:tcMar>
+              <w:top w:w="100" w:type="dxa"/>
+              <w:left w:w="100" w:type="dxa"/>
+              <w:bottom w:w="100" w:type="dxa"/>
+              <w:right w:w="100" w:type="dxa"/>
+            </w:tcMar>
+            <w:hideMark/>
+          </w:tcPr>
+          <w:p>
+            <w:pPr>
+              <w:rPr>
+                <w:lang w:val="en-US"/>
+              </w:rPr>
+            </w:pPr>
+            <w:r>
+              <w:rPr>
+                <w:b/>
+                <w:bCs/>
+                <w:lang w:val="en-US"/>
+              </w:rPr>
+              <w:t>5.0</w:t>
+            </w:r>
+          </w:p>
+        </w:tc>
+        <w:tc>
+          <w:tcPr>
+            <w:tcW w:w="0" w:type="auto"/>
+            <w:tcBorders>
+              <w:top w:val="single" w:sz="8" w:space="0" w:color="000000"/>
+              <w:left w:val="single" w:sz="8" w:space="0" w:color="000000"/>
+              <w:bottom w:val="single" w:sz="8" w:space="0" w:color="000000"/>
+              <w:right w:val="single" w:sz="8" w:space="0" w:color="000000"/>
+            </w:tcBorders>
+            <w:shd w:val="clear" w:color="auto" w:fill="D9EAD3"/>
+            <w:tcMar>
+              <w:top w:w="100" w:type="dxa"/>
+              <w:left w:w="100" w:type="dxa"/>
+              <w:bottom w:w="100" w:type="dxa"/>
+              <w:right w:w="100" w:type="dxa"/>
+            </w:tcMar>
+            <w:hideMark/>
+          </w:tcPr>
+          <w:p>
+            <w:pPr>
+              <w:rPr>
+                <w:lang w:val="en-US"/>
+              </w:rPr>
+            </w:pPr>
+            <w:r>
+              <w:rPr>
+                <w:b/>
+                <w:bCs/>
+                <w:lang w:val="en-US"/>
+              </w:rPr>
+              <w:t>Sensitive data and IP</w:t>
+            </w:r>
+          </w:p>
+        </w:tc>
+        <w:tc>
+          <w:tcPr>
+            <w:tcW w:w="0" w:type="auto"/>
+            <w:tcBorders>
+              <w:top w:val="single" w:sz="8" w:space="0" w:color="000000"/>
+              <w:left w:val="single" w:sz="8" w:space="0" w:color="000000"/>
+              <w:bottom w:val="single" w:sz="8" w:space="0" w:color="000000"/>
+              <w:right w:val="single" w:sz="8" w:space="0" w:color="000000"/>
+            </w:tcBorders>
+            <w:shd w:val="clear" w:color="auto" w:fill="D9EAD3"/>
+            <w:tcMar>
+              <w:top w:w="100" w:type="dxa"/>
+              <w:left w:w="100" w:type="dxa"/>
+              <w:bottom w:w="100" w:type="dxa"/>
+              <w:right w:w="100" w:type="dxa"/>
+            </w:tcMar>
+            <w:hideMark/>
+          </w:tcPr>
+          <w:p>
+            <w:pPr>
+              <w:rPr>
+                <w:lang w:val="en-US"/>
+              </w:rPr>
+            </w:pPr>
+          </w:p>
+        </w:tc>
+        <w:tc>
+          <w:tcPr>
+            <w:tcW w:w="0" w:type="auto"/>
+            <w:tcBorders>
+              <w:top w:val="single" w:sz="8" w:space="0" w:color="000000"/>
+              <w:left w:val="single" w:sz="8" w:space="0" w:color="000000"/>
+              <w:bottom w:val="single" w:sz="8" w:space="0" w:color="000000"/>
+              <w:right w:val="single" w:sz="8" w:space="0" w:color="000000"/>
+            </w:tcBorders>
+            <w:shd w:val="clear" w:color="auto" w:fill="D9EAD3"/>
+            <w:tcMar>
+              <w:top w:w="100" w:type="dxa"/>
+              <w:left w:w="100" w:type="dxa"/>
+              <w:bottom w:w="100" w:type="dxa"/>
+              <w:right w:w="100" w:type="dxa"/>
+            </w:tcMar>
+            <w:hideMark/>
+          </w:tcPr>
+          <w:p>
+            <w:pPr>
+              <w:rPr>
+                <w:lang w:val="en-US"/>
+              </w:rPr>
+            </w:pPr>
+            <w:r>
+              <w:rPr>
+                <w:b/>
+                <w:bCs/>
+                <w:lang w:val="en-US"/>
+              </w:rPr>
+              <w:t>Yes</w:t>
+            </w:r>
+          </w:p>
+        </w:tc>
+        <w:tc>
+          <w:tcPr>
+            <w:tcW w:w="0" w:type="auto"/>
+            <w:tcBorders>
+              <w:top w:val="single" w:sz="8" w:space="0" w:color="000000"/>
+              <w:left w:val="single" w:sz="8" w:space="0" w:color="000000"/>
+              <w:bottom w:val="single" w:sz="8" w:space="0" w:color="000000"/>
+              <w:right w:val="single" w:sz="8" w:space="0" w:color="000000"/>
+            </w:tcBorders>
+            <w:shd w:val="clear" w:color="auto" w:fill="D9EAD3"/>
+            <w:tcMar>
+              <w:top w:w="100" w:type="dxa"/>
+              <w:left w:w="100" w:type="dxa"/>
+              <w:bottom w:w="100" w:type="dxa"/>
+              <w:right w:w="100" w:type="dxa"/>
+            </w:tcMar>
+            <w:hideMark/>
+          </w:tcPr>
+          <w:p>
+            <w:pPr>
+              <w:rPr>
+                <w:lang w:val="en-US"/>
+              </w:rPr>
+            </w:pPr>
+            <w:r>
+              <w:rPr>
+                <w:b/>
+                <w:bCs/>
+                <w:lang w:val="en-US"/>
+              </w:rPr>
+              <w:t>No</w:t>
+            </w:r>
+          </w:p>
+        </w:tc>
+        <w:tc>
+          <w:tcPr>
+            <w:tcW w:w="0" w:type="auto"/>
+            <w:tcBorders>
+              <w:top w:val="single" w:sz="8" w:space="0" w:color="000000"/>
+              <w:left w:val="single" w:sz="8" w:space="0" w:color="000000"/>
+              <w:bottom w:val="single" w:sz="8" w:space="0" w:color="000000"/>
+              <w:right w:val="single" w:sz="8" w:space="0" w:color="000000"/>
+            </w:tcBorders>
+            <w:shd w:val="clear" w:color="auto" w:fill="D9EAD3"/>
+            <w:tcMar>
+              <w:top w:w="100" w:type="dxa"/>
+              <w:left w:w="100" w:type="dxa"/>
+              <w:bottom w:w="100" w:type="dxa"/>
+              <w:right w:w="100" w:type="dxa"/>
+            </w:tcMar>
+            <w:hideMark/>
+          </w:tcPr>
+          <w:p>
+            <w:pPr>
+              <w:rPr>
+                <w:lang w:val="en-US"/>
+              </w:rPr>
+            </w:pPr>
+            <w:r>
+              <w:rPr>
+                <w:b/>
+                <w:bCs/>
+                <w:lang w:val="en-US"/>
+              </w:rPr>
+              <w:t>SI</w:t>
+            </w:r>
+          </w:p>
+        </w:tc>
+        <w:tc>
+          <w:tcPr>
+            <w:tcW w:w="0" w:type="auto"/>
+            <w:tcBorders>
+              <w:top w:val="single" w:sz="8" w:space="0" w:color="000000"/>
+              <w:left w:val="single" w:sz="8" w:space="0" w:color="000000"/>
+              <w:bottom w:val="single" w:sz="8" w:space="0" w:color="000000"/>
+              <w:right w:val="single" w:sz="8" w:space="0" w:color="000000"/>
+            </w:tcBorders>
+            <w:shd w:val="clear" w:color="auto" w:fill="D9EAD3"/>
+            <w:tcMar>
+              <w:top w:w="100" w:type="dxa"/>
+              <w:left w:w="100" w:type="dxa"/>
+              <w:bottom w:w="100" w:type="dxa"/>
+              <w:right w:w="100" w:type="dxa"/>
+            </w:tcMar>
+            <w:hideMark/>
+          </w:tcPr>
+          <w:p>
+            <w:pPr>
+              <w:rPr>
+                <w:lang w:val="en-US"/>
+              </w:rPr>
+            </w:pPr>
+            <w:r>
+              <w:rPr>
+                <w:b/>
+                <w:bCs/>
+                <w:lang w:val="en-US"/>
+              </w:rPr>
+              <w:t>NS</w:t>
+            </w:r>
+          </w:p>
+        </w:tc>
+        <w:tc>
+          <w:tcPr>
+            <w:tcW w:w="0" w:type="auto"/>
+            <w:tcBorders>
+              <w:top w:val="single" w:sz="8" w:space="0" w:color="000000"/>
+              <w:left w:val="single" w:sz="8" w:space="0" w:color="000000"/>
+              <w:bottom w:val="single" w:sz="8" w:space="0" w:color="000000"/>
+              <w:right w:val="single" w:sz="8" w:space="0" w:color="000000"/>
+            </w:tcBorders>
+            <w:shd w:val="clear" w:color="auto" w:fill="D9EAD3"/>
+            <w:tcMar>
+              <w:top w:w="100" w:type="dxa"/>
+              <w:left w:w="100" w:type="dxa"/>
+              <w:bottom w:w="100" w:type="dxa"/>
+              <w:right w:w="100" w:type="dxa"/>
+            </w:tcMar>
+            <w:hideMark/>
+          </w:tcPr>
+          <w:p>
+            <w:pPr>
+              <w:rPr>
+                <w:lang w:val="en-US"/>
+              </w:rPr>
+            </w:pPr>
+            <w:r>
+              <w:rPr>
+                <w:b/>
+                <w:bCs/>
+                <w:lang w:val="en-US"/>
+              </w:rPr>
+              <w:t>NA</w:t>
+            </w:r>
+          </w:p>
+        </w:tc>
+        <w:tc>
+          <w:tcPr>
+            <w:tcW w:w="0" w:type="auto"/>
+            <w:tcBorders>
+              <w:top w:val="single" w:sz="8" w:space="0" w:color="000000"/>
+              <w:left w:val="single" w:sz="8" w:space="0" w:color="000000"/>
+              <w:bottom w:val="single" w:sz="8" w:space="0" w:color="000000"/>
+              <w:right w:val="single" w:sz="8" w:space="0" w:color="000000"/>
+            </w:tcBorders>
+            <w:shd w:val="clear" w:color="auto" w:fill="D9EAD3"/>
+            <w:tcMar>
+              <w:top w:w="100" w:type="dxa"/>
+              <w:left w:w="100" w:type="dxa"/>
+              <w:bottom w:w="100" w:type="dxa"/>
+              <w:right w:w="100" w:type="dxa"/>
+            </w:tcMar>
+            <w:hideMark/>
+          </w:tcPr>
+          <w:p>
+            <w:pPr>
+              <w:rPr>
+                <w:lang w:val="en-US"/>
+              </w:rPr>
+            </w:pPr>
+          </w:p>
+        </w:tc>
+        <w:tc>
+          <w:tcPr>
+            <w:tcW w:w="0" w:type="auto"/>
+            <w:tcBorders>
+              <w:top w:val="single" w:sz="8" w:space="0" w:color="000000"/>
+              <w:left w:val="single" w:sz="8" w:space="0" w:color="000000"/>
+              <w:bottom w:val="single" w:sz="8" w:space="0" w:color="000000"/>
+              <w:right w:val="single" w:sz="8" w:space="0" w:color="000000"/>
+            </w:tcBorders>
+            <w:shd w:val="clear" w:color="auto" w:fill="D9EAD3"/>
+            <w:tcMar>
+              <w:top w:w="100" w:type="dxa"/>
+              <w:left w:w="100" w:type="dxa"/>
+              <w:bottom w:w="100" w:type="dxa"/>
+              <w:right w:w="100" w:type="dxa"/>
+            </w:tcMar>
+            <w:hideMark/>
+          </w:tcPr>
+          <w:p>
+            <w:pPr>
+              <w:rPr>
+                <w:lang w:val="en-US"/>
+              </w:rPr>
+            </w:pPr>
+          </w:p>
+        </w:tc>
+        <w:tc>
+          <w:tcPr>
+            <w:tcW w:w="0" w:type="auto"/>
+            <w:tcBorders>
+              <w:top w:val="single" w:sz="8" w:space="0" w:color="000000"/>
+              <w:left w:val="single" w:sz="8" w:space="0" w:color="000000"/>
+              <w:bottom w:val="single" w:sz="8" w:space="0" w:color="000000"/>
+              <w:right w:val="single" w:sz="8" w:space="0" w:color="000000"/>
+            </w:tcBorders>
+            <w:shd w:val="clear" w:color="auto" w:fill="D9EAD3"/>
+            <w:tcMar>
+              <w:top w:w="100" w:type="dxa"/>
+              <w:left w:w="100" w:type="dxa"/>
+              <w:bottom w:w="100" w:type="dxa"/>
+              <w:right w:w="100" w:type="dxa"/>
+            </w:tcMar>
+            <w:hideMark/>
+          </w:tcPr>
+          <w:p>
+            <w:pPr>
+              <w:rPr>
+                <w:lang w:val="en-US"/>
+              </w:rPr>
+            </w:pPr>
+          </w:p>
+        </w:tc>
+      </w:tr>
+      <w:tr>
+        <w:trPr>
+          <w:trHeight w:val="480"/>
+        </w:trPr>
+        <w:tc>
+          <w:tcPr>
+            <w:tcW w:w="0" w:type="auto"/>
+            <w:tcBorders>
+              <w:top w:val="single" w:sz="8" w:space="0" w:color="000000"/>
+              <w:left w:val="single" w:sz="8" w:space="0" w:color="000000"/>
+              <w:bottom w:val="single" w:sz="8" w:space="0" w:color="000000"/>
+              <w:right w:val="single" w:sz="8" w:space="0" w:color="000000"/>
+            </w:tcBorders>
+            <w:tcMar>
+              <w:top w:w="100" w:type="dxa"/>
+              <w:left w:w="100" w:type="dxa"/>
+              <w:bottom w:w="100" w:type="dxa"/>
+              <w:right w:w="100" w:type="dxa"/>
+            </w:tcMar>
+            <w:hideMark/>
+          </w:tcPr>
+          <w:p>
+            <w:pPr>
+              <w:rPr>
+                <w:lang w:val="en-US"/>
+              </w:rPr>
+            </w:pPr>
+            <w:r>
+              <w:rPr>
+                <w:b/>
+                <w:bCs/>
+                <w:lang w:val="en-US"/>
+              </w:rPr>
+              <w:t>5.1</w:t>
+            </w:r>
+          </w:p>
+        </w:tc>
+        <w:tc>
+          <w:tcPr>
+            <w:tcW w:w="0" w:type="auto"/>
+            <w:tcBorders>
+              <w:top w:val="single" w:sz="8" w:space="0" w:color="000000"/>
+              <w:left w:val="single" w:sz="8" w:space="0" w:color="000000"/>
+              <w:bottom w:val="single" w:sz="8" w:space="0" w:color="000000"/>
+              <w:right w:val="single" w:sz="8" w:space="0" w:color="000000"/>
+            </w:tcBorders>
+            <w:tcMar>
+              <w:top w:w="100" w:type="dxa"/>
+              <w:left w:w="100" w:type="dxa"/>
+              <w:bottom w:w="100" w:type="dxa"/>
+              <w:right w:w="100" w:type="dxa"/>
+            </w:tcMar>
+            <w:hideMark/>
+          </w:tcPr>
+          <w:p>
+            <w:pPr>
+              <w:rPr>
+                <w:lang w:val="en-US"/>
+              </w:rPr>
+            </w:pPr>
+            <w:r>
+              <w:rPr>
+                <w:b/>
+                <w:bCs/>
+                <w:lang w:val="en-US"/>
+              </w:rPr>
+              <w:t>Is the dataset free of obvious sensitivity issues (e.g., direct identifiers)?</w:t>
+            </w:r>
+          </w:p>
+        </w:tc>
+        <w:tc>
+          <w:tcPr>
+            <w:tcW w:w="0" w:type="auto"/>
+            <w:tcBorders>
+              <w:top w:val="single" w:sz="8" w:space="0" w:color="000000"/>
+              <w:left w:val="single" w:sz="8" w:space="0" w:color="000000"/>
+              <w:bottom w:val="single" w:sz="8" w:space="0" w:color="000000"/>
+              <w:right w:val="single" w:sz="8" w:space="0" w:color="000000"/>
+            </w:tcBorders>
+            <w:tcMar>
+              <w:top w:w="100" w:type="dxa"/>
+              <w:left w:w="100" w:type="dxa"/>
+              <w:bottom w:w="100" w:type="dxa"/>
+              <w:right w:w="100" w:type="dxa"/>
+            </w:tcMar>
+            <w:hideMark/>
+          </w:tcPr>
+          <w:p>
+            <w:pPr>
+              <w:numPr>
+                <w:ilvl w:val="0"/>
+                <w:numId w:val="16"/>
+              </w:numPr>
+              <w:rPr>
+                <w:lang w:val="en-US"/>
+              </w:rPr>
+            </w:pPr>
+            <w:r>
+              <w:rPr>
+                <w:lang w:val="en-US"/>
+              </w:rPr>
+              <w:t>Review documentation and file names and see if there are any that should be opened and reviewed (e.g. if a file is named “participant survey”, etc.) </w:t>
+            </w:r>
+          </w:p>
+          <w:p>
+            <w:pPr>
+              <w:numPr>
+                <w:ilvl w:val="0"/>
+                <w:numId w:val="16"/>
+              </w:numPr>
+              <w:rPr>
+                <w:lang w:val="en-US"/>
+              </w:rPr>
+            </w:pPr>
+            <w:r>
+              <w:rPr>
+                <w:lang w:val="en-US"/>
+              </w:rPr>
+              <w:lastRenderedPageBreak/>
+              <w:t>Review description, notes, and terms of access metadata fields.</w:t>
+            </w:r>
+          </w:p>
+        </w:tc>
+        <w:tc>
+          <w:tcPr>
+            <w:tcW w:w="0" w:type="auto"/>
+            <w:tcBorders>
+              <w:top w:val="single" w:sz="8" w:space="0" w:color="000000"/>
+              <w:left w:val="single" w:sz="8" w:space="0" w:color="000000"/>
+              <w:bottom w:val="single" w:sz="8" w:space="0" w:color="000000"/>
+              <w:right w:val="single" w:sz="8" w:space="0" w:color="000000"/>
+            </w:tcBorders>
+            <w:tcMar>
+              <w:top w:w="100" w:type="dxa"/>
+              <w:left w:w="100" w:type="dxa"/>
+              <w:bottom w:w="100" w:type="dxa"/>
+              <w:right w:w="100" w:type="dxa"/>
+            </w:tcMar>
+            <w:hideMark/>
+          </w:tcPr>
+          <w:p>
+            <w:pPr>
+              <w:rPr>
+                <w:lang w:val="en-US"/>
+              </w:rPr>
+            </w:pPr>
+          </w:p>
+        </w:tc>
+        <w:tc>
+          <w:tcPr>
+            <w:tcW w:w="0" w:type="auto"/>
+            <w:tcBorders>
+              <w:top w:val="single" w:sz="8" w:space="0" w:color="000000"/>
+              <w:left w:val="single" w:sz="8" w:space="0" w:color="000000"/>
+              <w:bottom w:val="single" w:sz="8" w:space="0" w:color="000000"/>
+              <w:right w:val="single" w:sz="8" w:space="0" w:color="000000"/>
+            </w:tcBorders>
+            <w:tcMar>
+              <w:top w:w="100" w:type="dxa"/>
+              <w:left w:w="100" w:type="dxa"/>
+              <w:bottom w:w="100" w:type="dxa"/>
+              <w:right w:w="100" w:type="dxa"/>
+            </w:tcMar>
+            <w:hideMark/>
+          </w:tcPr>
+          <w:p>
+            <w:pPr>
+              <w:rPr>
+                <w:lang w:val="en-US"/>
+              </w:rPr>
+            </w:pPr>
+          </w:p>
+        </w:tc>
+        <w:tc>
+          <w:tcPr>
+            <w:tcW w:w="0" w:type="auto"/>
+            <w:tcBorders>
+              <w:top w:val="single" w:sz="8" w:space="0" w:color="000000"/>
+              <w:left w:val="single" w:sz="8" w:space="0" w:color="000000"/>
+              <w:bottom w:val="single" w:sz="8" w:space="0" w:color="000000"/>
+              <w:right w:val="single" w:sz="8" w:space="0" w:color="000000"/>
+            </w:tcBorders>
+            <w:tcMar>
+              <w:top w:w="100" w:type="dxa"/>
+              <w:left w:w="100" w:type="dxa"/>
+              <w:bottom w:w="100" w:type="dxa"/>
+              <w:right w:w="100" w:type="dxa"/>
+            </w:tcMar>
+            <w:hideMark/>
+          </w:tcPr>
+          <w:p>
+            <w:pPr>
+              <w:rPr>
+                <w:lang w:val="en-US"/>
+              </w:rPr>
+            </w:pPr>
+          </w:p>
+        </w:tc>
+        <w:tc>
+          <w:tcPr>
+            <w:tcW w:w="0" w:type="auto"/>
+            <w:tcBorders>
+              <w:top w:val="single" w:sz="8" w:space="0" w:color="000000"/>
+              <w:left w:val="single" w:sz="8" w:space="0" w:color="000000"/>
+              <w:bottom w:val="single" w:sz="8" w:space="0" w:color="000000"/>
+              <w:right w:val="single" w:sz="8" w:space="0" w:color="000000"/>
+            </w:tcBorders>
+            <w:tcMar>
+              <w:top w:w="100" w:type="dxa"/>
+              <w:left w:w="100" w:type="dxa"/>
+              <w:bottom w:w="100" w:type="dxa"/>
+              <w:right w:w="100" w:type="dxa"/>
+            </w:tcMar>
+            <w:hideMark/>
+          </w:tcPr>
+          <w:p>
+            <w:pPr>
+              <w:rPr>
+                <w:lang w:val="en-US"/>
+              </w:rPr>
+            </w:pPr>
+          </w:p>
+        </w:tc>
+        <w:tc>
+          <w:tcPr>
+            <w:tcW w:w="0" w:type="auto"/>
+            <w:tcBorders>
+              <w:top w:val="single" w:sz="8" w:space="0" w:color="000000"/>
+              <w:left w:val="single" w:sz="8" w:space="0" w:color="000000"/>
+              <w:bottom w:val="single" w:sz="8" w:space="0" w:color="000000"/>
+              <w:right w:val="single" w:sz="8" w:space="0" w:color="000000"/>
+            </w:tcBorders>
+            <w:tcMar>
+              <w:top w:w="100" w:type="dxa"/>
+              <w:left w:w="100" w:type="dxa"/>
+              <w:bottom w:w="100" w:type="dxa"/>
+              <w:right w:w="100" w:type="dxa"/>
+            </w:tcMar>
+            <w:hideMark/>
+          </w:tcPr>
+          <w:p>
+            <w:pPr>
+              <w:rPr>
+                <w:lang w:val="en-US"/>
+              </w:rPr>
+            </w:pPr>
+          </w:p>
+        </w:tc>
+        <w:tc>
+          <w:tcPr>
+            <w:tcW w:w="0" w:type="auto"/>
+            <w:tcBorders>
+              <w:top w:val="single" w:sz="8" w:space="0" w:color="000000"/>
+              <w:left w:val="single" w:sz="8" w:space="0" w:color="000000"/>
+              <w:bottom w:val="single" w:sz="8" w:space="0" w:color="000000"/>
+              <w:right w:val="single" w:sz="8" w:space="0" w:color="000000"/>
+            </w:tcBorders>
+            <w:tcMar>
+              <w:top w:w="100" w:type="dxa"/>
+              <w:left w:w="100" w:type="dxa"/>
+              <w:bottom w:w="100" w:type="dxa"/>
+              <w:right w:w="100" w:type="dxa"/>
+            </w:tcMar>
+            <w:hideMark/>
+          </w:tcPr>
+          <w:p>
+            <w:pPr>
+              <w:rPr>
+                <w:lang w:val="en-US"/>
+              </w:rPr>
+            </w:pPr>
+            <w:r>
+              <w:rPr>
+                <w:lang w:val="en-US"/>
+              </w:rPr>
+              <w:t>List fields/files below with the format ‘field/</w:t>
+            </w:r>
+            <w:r>
+              <w:rPr>
+                <w:i/>
+                <w:iCs/>
+                <w:lang w:val="en-US"/>
+              </w:rPr>
+              <w:t>file: issue and comments</w:t>
+            </w:r>
+            <w:r>
+              <w:rPr>
+                <w:lang w:val="en-US"/>
+              </w:rPr>
+              <w:t>’:</w:t>
+            </w:r>
+          </w:p>
+          <w:p>
+            <w:pPr>
+              <w:numPr>
+                <w:ilvl w:val="0"/>
+                <w:numId w:val="17"/>
+              </w:numPr>
+              <w:rPr>
+                <w:lang w:val="en-US"/>
+              </w:rPr>
+            </w:pPr>
+          </w:p>
+        </w:tc>
+        <w:tc>
+          <w:tcPr>
+            <w:tcW w:w="0" w:type="auto"/>
+            <w:tcBorders>
+              <w:top w:val="single" w:sz="8" w:space="0" w:color="000000"/>
+              <w:left w:val="single" w:sz="8" w:space="0" w:color="000000"/>
+              <w:bottom w:val="single" w:sz="8" w:space="0" w:color="000000"/>
+              <w:right w:val="single" w:sz="8" w:space="0" w:color="000000"/>
+            </w:tcBorders>
+            <w:tcMar>
+              <w:top w:w="100" w:type="dxa"/>
+              <w:left w:w="100" w:type="dxa"/>
+              <w:bottom w:w="100" w:type="dxa"/>
+              <w:right w:w="100" w:type="dxa"/>
+            </w:tcMar>
+            <w:hideMark/>
+          </w:tcPr>
+          <w:p>
+            <w:pPr>
+              <w:rPr>
+                <w:lang w:val="en-US"/>
+              </w:rPr>
+            </w:pPr>
+            <w:r>
+              <w:rPr>
+                <w:lang w:val="en-US"/>
+              </w:rPr>
+              <w:t>Require</w:t>
+            </w:r>
+          </w:p>
+        </w:tc>
+        <w:tc>
+          <w:tcPr>
+            <w:tcW w:w="0" w:type="auto"/>
+            <w:tcBorders>
+              <w:top w:val="single" w:sz="8" w:space="0" w:color="000000"/>
+              <w:left w:val="single" w:sz="8" w:space="0" w:color="000000"/>
+              <w:bottom w:val="single" w:sz="8" w:space="0" w:color="000000"/>
+              <w:right w:val="single" w:sz="8" w:space="0" w:color="000000"/>
+            </w:tcBorders>
+            <w:tcMar>
+              <w:top w:w="100" w:type="dxa"/>
+              <w:left w:w="100" w:type="dxa"/>
+              <w:bottom w:w="100" w:type="dxa"/>
+              <w:right w:w="100" w:type="dxa"/>
+            </w:tcMar>
+            <w:hideMark/>
+          </w:tcPr>
+          <w:p>
+            <w:pPr>
+              <w:rPr>
+                <w:lang w:val="en-US"/>
+              </w:rPr>
+            </w:pPr>
+          </w:p>
+        </w:tc>
+      </w:tr>
+      <w:tr>
+        <w:trPr>
+          <w:trHeight w:val="480"/>
+        </w:trPr>
+        <w:tc>
+          <w:tcPr>
+            <w:tcW w:w="0" w:type="auto"/>
+            <w:tcBorders>
+              <w:top w:val="single" w:sz="8" w:space="0" w:color="000000"/>
+              <w:left w:val="single" w:sz="8" w:space="0" w:color="000000"/>
+              <w:bottom w:val="single" w:sz="8" w:space="0" w:color="000000"/>
+              <w:right w:val="single" w:sz="8" w:space="0" w:color="000000"/>
+            </w:tcBorders>
+            <w:tcMar>
+              <w:top w:w="100" w:type="dxa"/>
+              <w:left w:w="100" w:type="dxa"/>
+              <w:bottom w:w="100" w:type="dxa"/>
+              <w:right w:w="100" w:type="dxa"/>
+            </w:tcMar>
+            <w:hideMark/>
+          </w:tcPr>
+          <w:p>
+            <w:pPr>
+              <w:rPr>
+                <w:lang w:val="en-US"/>
+              </w:rPr>
+            </w:pPr>
+            <w:r>
+              <w:rPr>
+                <w:b/>
+                <w:bCs/>
+                <w:lang w:val="en-US"/>
+              </w:rPr>
+              <w:t>5.2</w:t>
+            </w:r>
+          </w:p>
+        </w:tc>
+        <w:tc>
+          <w:tcPr>
+            <w:tcW w:w="0" w:type="auto"/>
+            <w:tcBorders>
+              <w:top w:val="single" w:sz="8" w:space="0" w:color="000000"/>
+              <w:left w:val="single" w:sz="8" w:space="0" w:color="000000"/>
+              <w:bottom w:val="single" w:sz="8" w:space="0" w:color="000000"/>
+              <w:right w:val="single" w:sz="8" w:space="0" w:color="000000"/>
+            </w:tcBorders>
+            <w:tcMar>
+              <w:top w:w="100" w:type="dxa"/>
+              <w:left w:w="100" w:type="dxa"/>
+              <w:bottom w:w="100" w:type="dxa"/>
+              <w:right w:w="100" w:type="dxa"/>
+            </w:tcMar>
+            <w:hideMark/>
+          </w:tcPr>
+          <w:p>
+            <w:pPr>
+              <w:rPr>
+                <w:lang w:val="en-US"/>
+              </w:rPr>
+            </w:pPr>
+            <w:r>
+              <w:rPr>
+                <w:b/>
+                <w:bCs/>
+                <w:lang w:val="en-US"/>
+              </w:rPr>
+              <w:t>*If something is flagged in the sensitive data review, does the depositor have REB approval to share the dataset?</w:t>
+            </w:r>
+          </w:p>
+        </w:tc>
+        <w:tc>
+          <w:tcPr>
+            <w:tcW w:w="0" w:type="auto"/>
+            <w:tcBorders>
+              <w:top w:val="single" w:sz="8" w:space="0" w:color="000000"/>
+              <w:left w:val="single" w:sz="8" w:space="0" w:color="000000"/>
+              <w:bottom w:val="single" w:sz="8" w:space="0" w:color="000000"/>
+              <w:right w:val="single" w:sz="8" w:space="0" w:color="000000"/>
+            </w:tcBorders>
+            <w:tcMar>
+              <w:top w:w="100" w:type="dxa"/>
+              <w:left w:w="100" w:type="dxa"/>
+              <w:bottom w:w="100" w:type="dxa"/>
+              <w:right w:w="100" w:type="dxa"/>
+            </w:tcMar>
+            <w:hideMark/>
+          </w:tcPr>
+          <w:p>
+            <w:pPr>
+              <w:numPr>
+                <w:ilvl w:val="0"/>
+                <w:numId w:val="18"/>
+              </w:numPr>
+              <w:rPr>
+                <w:lang w:val="en-US"/>
+              </w:rPr>
+            </w:pPr>
+            <w:r>
+              <w:rPr>
+                <w:lang w:val="en-US"/>
+              </w:rPr>
+              <w:t>If something is flagged in the sensitive data review (see question above), check the intake form to confirm information about their REB status.</w:t>
+            </w:r>
+          </w:p>
+        </w:tc>
+        <w:tc>
+          <w:tcPr>
+            <w:tcW w:w="0" w:type="auto"/>
+            <w:tcBorders>
+              <w:top w:val="single" w:sz="8" w:space="0" w:color="000000"/>
+              <w:left w:val="single" w:sz="8" w:space="0" w:color="000000"/>
+              <w:bottom w:val="single" w:sz="8" w:space="0" w:color="000000"/>
+              <w:right w:val="single" w:sz="8" w:space="0" w:color="000000"/>
+            </w:tcBorders>
+            <w:tcMar>
+              <w:top w:w="100" w:type="dxa"/>
+              <w:left w:w="100" w:type="dxa"/>
+              <w:bottom w:w="100" w:type="dxa"/>
+              <w:right w:w="100" w:type="dxa"/>
+            </w:tcMar>
+            <w:hideMark/>
+          </w:tcPr>
+          <w:p>
+            <w:pPr>
+              <w:rPr>
+                <w:lang w:val="en-US"/>
+              </w:rPr>
+            </w:pPr>
+          </w:p>
+        </w:tc>
+        <w:tc>
+          <w:tcPr>
+            <w:tcW w:w="0" w:type="auto"/>
+            <w:tcBorders>
+              <w:top w:val="single" w:sz="8" w:space="0" w:color="000000"/>
+              <w:left w:val="single" w:sz="8" w:space="0" w:color="000000"/>
+              <w:bottom w:val="single" w:sz="8" w:space="0" w:color="000000"/>
+              <w:right w:val="single" w:sz="8" w:space="0" w:color="000000"/>
+            </w:tcBorders>
+            <w:tcMar>
+              <w:top w:w="100" w:type="dxa"/>
+              <w:left w:w="100" w:type="dxa"/>
+              <w:bottom w:w="100" w:type="dxa"/>
+              <w:right w:w="100" w:type="dxa"/>
+            </w:tcMar>
+            <w:hideMark/>
+          </w:tcPr>
+          <w:p>
+            <w:pPr>
+              <w:rPr>
+                <w:lang w:val="en-US"/>
+              </w:rPr>
+            </w:pPr>
+          </w:p>
+        </w:tc>
+        <w:tc>
+          <w:tcPr>
+            <w:tcW w:w="0" w:type="auto"/>
+            <w:tcBorders>
+              <w:top w:val="single" w:sz="8" w:space="0" w:color="000000"/>
+              <w:left w:val="single" w:sz="8" w:space="0" w:color="000000"/>
+              <w:bottom w:val="single" w:sz="8" w:space="0" w:color="000000"/>
+              <w:right w:val="single" w:sz="8" w:space="0" w:color="000000"/>
+            </w:tcBorders>
+            <w:tcMar>
+              <w:top w:w="100" w:type="dxa"/>
+              <w:left w:w="100" w:type="dxa"/>
+              <w:bottom w:w="100" w:type="dxa"/>
+              <w:right w:w="100" w:type="dxa"/>
+            </w:tcMar>
+            <w:hideMark/>
+          </w:tcPr>
+          <w:p>
+            <w:pPr>
+              <w:rPr>
+                <w:lang w:val="en-US"/>
+              </w:rPr>
+            </w:pPr>
+          </w:p>
+        </w:tc>
+        <w:tc>
+          <w:tcPr>
+            <w:tcW w:w="0" w:type="auto"/>
+            <w:tcBorders>
+              <w:top w:val="single" w:sz="8" w:space="0" w:color="000000"/>
+              <w:left w:val="single" w:sz="8" w:space="0" w:color="000000"/>
+              <w:bottom w:val="single" w:sz="8" w:space="0" w:color="000000"/>
+              <w:right w:val="single" w:sz="8" w:space="0" w:color="000000"/>
+            </w:tcBorders>
+            <w:tcMar>
+              <w:top w:w="100" w:type="dxa"/>
+              <w:left w:w="100" w:type="dxa"/>
+              <w:bottom w:w="100" w:type="dxa"/>
+              <w:right w:w="100" w:type="dxa"/>
+            </w:tcMar>
+            <w:hideMark/>
+          </w:tcPr>
+          <w:p>
+            <w:pPr>
+              <w:rPr>
+                <w:lang w:val="en-US"/>
+              </w:rPr>
+            </w:pPr>
+          </w:p>
+        </w:tc>
+        <w:tc>
+          <w:tcPr>
+            <w:tcW w:w="0" w:type="auto"/>
+            <w:tcBorders>
+              <w:top w:val="single" w:sz="8" w:space="0" w:color="000000"/>
+              <w:left w:val="single" w:sz="8" w:space="0" w:color="000000"/>
+              <w:bottom w:val="single" w:sz="8" w:space="0" w:color="000000"/>
+              <w:right w:val="single" w:sz="8" w:space="0" w:color="000000"/>
+            </w:tcBorders>
+            <w:tcMar>
+              <w:top w:w="100" w:type="dxa"/>
+              <w:left w:w="100" w:type="dxa"/>
+              <w:bottom w:w="100" w:type="dxa"/>
+              <w:right w:w="100" w:type="dxa"/>
+            </w:tcMar>
+            <w:hideMark/>
+          </w:tcPr>
+          <w:p>
+            <w:pPr>
+              <w:rPr>
+                <w:lang w:val="en-US"/>
+              </w:rPr>
+            </w:pPr>
+          </w:p>
+        </w:tc>
+        <w:tc>
+          <w:tcPr>
+            <w:tcW w:w="0" w:type="auto"/>
+            <w:tcBorders>
+              <w:top w:val="single" w:sz="8" w:space="0" w:color="000000"/>
+              <w:left w:val="single" w:sz="8" w:space="0" w:color="000000"/>
+              <w:bottom w:val="single" w:sz="8" w:space="0" w:color="000000"/>
+              <w:right w:val="single" w:sz="8" w:space="0" w:color="000000"/>
+            </w:tcBorders>
+            <w:tcMar>
+              <w:top w:w="100" w:type="dxa"/>
+              <w:left w:w="100" w:type="dxa"/>
+              <w:bottom w:w="100" w:type="dxa"/>
+              <w:right w:w="100" w:type="dxa"/>
+            </w:tcMar>
+            <w:hideMark/>
+          </w:tcPr>
+          <w:p>
+            <w:pPr>
+              <w:rPr>
+                <w:lang w:val="en-US"/>
+              </w:rPr>
+            </w:pPr>
+          </w:p>
+        </w:tc>
+        <w:tc>
+          <w:tcPr>
+            <w:tcW w:w="0" w:type="auto"/>
+            <w:tcBorders>
+              <w:top w:val="single" w:sz="8" w:space="0" w:color="000000"/>
+              <w:left w:val="single" w:sz="8" w:space="0" w:color="000000"/>
+              <w:bottom w:val="single" w:sz="8" w:space="0" w:color="000000"/>
+              <w:right w:val="single" w:sz="8" w:space="0" w:color="000000"/>
+            </w:tcBorders>
+            <w:tcMar>
+              <w:top w:w="100" w:type="dxa"/>
+              <w:left w:w="100" w:type="dxa"/>
+              <w:bottom w:w="100" w:type="dxa"/>
+              <w:right w:w="100" w:type="dxa"/>
+            </w:tcMar>
+            <w:hideMark/>
+          </w:tcPr>
+          <w:p>
+            <w:pPr>
+              <w:rPr>
+                <w:lang w:val="en-US"/>
+              </w:rPr>
+            </w:pPr>
+            <w:r>
+              <w:rPr>
+                <w:lang w:val="en-US"/>
+              </w:rPr>
+              <w:t>Require</w:t>
+            </w:r>
+          </w:p>
+        </w:tc>
+        <w:tc>
+          <w:tcPr>
+            <w:tcW w:w="0" w:type="auto"/>
+            <w:tcBorders>
+              <w:top w:val="single" w:sz="8" w:space="0" w:color="000000"/>
+              <w:left w:val="single" w:sz="8" w:space="0" w:color="000000"/>
+              <w:bottom w:val="single" w:sz="8" w:space="0" w:color="000000"/>
+              <w:right w:val="single" w:sz="8" w:space="0" w:color="000000"/>
+            </w:tcBorders>
+            <w:tcMar>
+              <w:top w:w="100" w:type="dxa"/>
+              <w:left w:w="100" w:type="dxa"/>
+              <w:bottom w:w="100" w:type="dxa"/>
+              <w:right w:w="100" w:type="dxa"/>
+            </w:tcMar>
+            <w:hideMark/>
+          </w:tcPr>
+          <w:p>
+            <w:pPr>
+              <w:rPr>
+                <w:lang w:val="en-US"/>
+              </w:rPr>
+            </w:pPr>
+          </w:p>
+        </w:tc>
+      </w:tr>
+      <w:tr>
+        <w:trPr>
+          <w:trHeight w:val="480"/>
+        </w:trPr>
+        <w:tc>
+          <w:tcPr>
+            <w:tcW w:w="0" w:type="auto"/>
+            <w:tcBorders>
+              <w:top w:val="single" w:sz="8" w:space="0" w:color="000000"/>
+              <w:left w:val="single" w:sz="8" w:space="0" w:color="000000"/>
+              <w:bottom w:val="single" w:sz="8" w:space="0" w:color="000000"/>
+              <w:right w:val="single" w:sz="8" w:space="0" w:color="000000"/>
+            </w:tcBorders>
+            <w:tcMar>
+              <w:top w:w="100" w:type="dxa"/>
+              <w:left w:w="100" w:type="dxa"/>
+              <w:bottom w:w="100" w:type="dxa"/>
+              <w:right w:w="100" w:type="dxa"/>
+            </w:tcMar>
+            <w:hideMark/>
+          </w:tcPr>
+          <w:p>
+            <w:pPr>
+              <w:rPr>
+                <w:lang w:val="en-US"/>
+              </w:rPr>
+            </w:pPr>
+            <w:r>
+              <w:rPr>
+                <w:b/>
+                <w:bCs/>
+                <w:lang w:val="en-US"/>
+              </w:rPr>
+              <w:t>5.3</w:t>
+            </w:r>
+          </w:p>
+        </w:tc>
+        <w:tc>
+          <w:tcPr>
+            <w:tcW w:w="0" w:type="auto"/>
+            <w:tcBorders>
+              <w:top w:val="single" w:sz="8" w:space="0" w:color="000000"/>
+              <w:left w:val="single" w:sz="8" w:space="0" w:color="000000"/>
+              <w:bottom w:val="single" w:sz="8" w:space="0" w:color="000000"/>
+              <w:right w:val="single" w:sz="8" w:space="0" w:color="000000"/>
+            </w:tcBorders>
+            <w:tcMar>
+              <w:top w:w="100" w:type="dxa"/>
+              <w:left w:w="100" w:type="dxa"/>
+              <w:bottom w:w="100" w:type="dxa"/>
+              <w:right w:w="100" w:type="dxa"/>
+            </w:tcMar>
+            <w:hideMark/>
+          </w:tcPr>
+          <w:p>
+            <w:pPr>
+              <w:rPr>
+                <w:lang w:val="en-US"/>
+              </w:rPr>
+            </w:pPr>
+            <w:r>
+              <w:rPr>
+                <w:b/>
+                <w:bCs/>
+                <w:lang w:val="en-US"/>
+              </w:rPr>
+              <w:t>Has the depositor assigned an appropriate license to the dataset?</w:t>
+            </w:r>
+          </w:p>
+        </w:tc>
+        <w:tc>
+          <w:tcPr>
+            <w:tcW w:w="0" w:type="auto"/>
+            <w:tcBorders>
+              <w:top w:val="single" w:sz="8" w:space="0" w:color="000000"/>
+              <w:left w:val="single" w:sz="8" w:space="0" w:color="000000"/>
+              <w:bottom w:val="single" w:sz="8" w:space="0" w:color="000000"/>
+              <w:right w:val="single" w:sz="8" w:space="0" w:color="000000"/>
+            </w:tcBorders>
+            <w:tcMar>
+              <w:top w:w="100" w:type="dxa"/>
+              <w:left w:w="100" w:type="dxa"/>
+              <w:bottom w:w="100" w:type="dxa"/>
+              <w:right w:w="100" w:type="dxa"/>
+            </w:tcMar>
+            <w:hideMark/>
+          </w:tcPr>
+          <w:p>
+            <w:pPr>
+              <w:rPr>
+                <w:lang w:val="en-US"/>
+              </w:rPr>
+            </w:pPr>
+            <w:r>
+              <w:rPr>
+                <w:lang w:val="en-US"/>
+              </w:rPr>
+              <w:t>Python scripted.</w:t>
+            </w:r>
+          </w:p>
+          <w:p>
+            <w:pPr>
+              <w:rPr>
+                <w:lang w:val="en-US"/>
+              </w:rPr>
+            </w:pPr>
+            <w:r>
+              <w:rPr>
+                <w:lang w:val="en-US"/>
+              </w:rPr>
+              <w:br/>
+            </w:r>
+          </w:p>
+          <w:p>
+            <w:pPr>
+              <w:numPr>
+                <w:ilvl w:val="0"/>
+                <w:numId w:val="19"/>
+              </w:numPr>
+              <w:rPr>
+                <w:lang w:val="en-US"/>
+              </w:rPr>
+            </w:pPr>
+            <w:r>
+              <w:rPr>
+                <w:lang w:val="en-US"/>
+              </w:rPr>
+              <w:t>If the dataset uses CC0 - confirm this is what the depositor wants.</w:t>
+            </w:r>
+          </w:p>
+          <w:p>
+            <w:pPr>
+              <w:numPr>
+                <w:ilvl w:val="0"/>
+                <w:numId w:val="19"/>
+              </w:numPr>
+              <w:rPr>
+                <w:lang w:val="en-US"/>
+              </w:rPr>
+            </w:pPr>
+            <w:r>
+              <w:rPr>
+                <w:lang w:val="en-US"/>
+              </w:rPr>
+              <w:t>Check if the deposit includes restricted files (if yes, recomme</w:t>
+            </w:r>
+            <w:r>
+              <w:rPr>
+                <w:lang w:val="en-US"/>
+              </w:rPr>
+              <w:lastRenderedPageBreak/>
+              <w:t>nd they use custom terms)</w:t>
+            </w:r>
+          </w:p>
+        </w:tc>
+        <w:tc>
+          <w:tcPr>
+            <w:tcW w:w="0" w:type="auto"/>
+            <w:tcBorders>
+              <w:top w:val="single" w:sz="8" w:space="0" w:color="000000"/>
+              <w:left w:val="single" w:sz="8" w:space="0" w:color="000000"/>
+              <w:bottom w:val="single" w:sz="8" w:space="0" w:color="000000"/>
+              <w:right w:val="single" w:sz="8" w:space="0" w:color="000000"/>
+            </w:tcBorders>
+            <w:tcMar>
+              <w:top w:w="100" w:type="dxa"/>
+              <w:left w:w="100" w:type="dxa"/>
+              <w:bottom w:w="100" w:type="dxa"/>
+              <w:right w:w="100" w:type="dxa"/>
+            </w:tcMar>
+            <w:hideMark/>
+          </w:tcPr>
+          <w:p>
+            <w:pPr>
+              <w:rPr>
+                <w:lang w:val="en-US"/>
+              </w:rPr>
+            </w:pPr>
+          </w:p>
+        </w:tc>
+        <w:tc>
+          <w:tcPr>
+            <w:tcW w:w="0" w:type="auto"/>
+            <w:tcBorders>
+              <w:top w:val="single" w:sz="8" w:space="0" w:color="000000"/>
+              <w:left w:val="single" w:sz="8" w:space="0" w:color="000000"/>
+              <w:bottom w:val="single" w:sz="8" w:space="0" w:color="000000"/>
+              <w:right w:val="single" w:sz="8" w:space="0" w:color="000000"/>
+            </w:tcBorders>
+            <w:tcMar>
+              <w:top w:w="100" w:type="dxa"/>
+              <w:left w:w="100" w:type="dxa"/>
+              <w:bottom w:w="100" w:type="dxa"/>
+              <w:right w:w="100" w:type="dxa"/>
+            </w:tcMar>
+            <w:hideMark/>
+          </w:tcPr>
+          <w:p>
+            <w:pPr>
+              <w:rPr>
+                <w:lang w:val="en-US"/>
+              </w:rPr>
+            </w:pPr>
+          </w:p>
+        </w:tc>
+        <w:tc>
+          <w:tcPr>
+            <w:tcW w:w="0" w:type="auto"/>
+            <w:tcBorders>
+              <w:top w:val="single" w:sz="8" w:space="0" w:color="000000"/>
+              <w:left w:val="single" w:sz="8" w:space="0" w:color="000000"/>
+              <w:bottom w:val="single" w:sz="8" w:space="0" w:color="000000"/>
+              <w:right w:val="single" w:sz="8" w:space="0" w:color="000000"/>
+            </w:tcBorders>
+            <w:tcMar>
+              <w:top w:w="100" w:type="dxa"/>
+              <w:left w:w="100" w:type="dxa"/>
+              <w:bottom w:w="100" w:type="dxa"/>
+              <w:right w:w="100" w:type="dxa"/>
+            </w:tcMar>
+            <w:hideMark/>
+          </w:tcPr>
+          <w:p>
+            <w:pPr>
+              <w:rPr>
+                <w:lang w:val="en-US"/>
+              </w:rPr>
+            </w:pPr>
+          </w:p>
+        </w:tc>
+        <w:tc>
+          <w:tcPr>
+            <w:tcW w:w="0" w:type="auto"/>
+            <w:tcBorders>
+              <w:top w:val="single" w:sz="8" w:space="0" w:color="000000"/>
+              <w:left w:val="single" w:sz="8" w:space="0" w:color="000000"/>
+              <w:bottom w:val="single" w:sz="8" w:space="0" w:color="000000"/>
+              <w:right w:val="single" w:sz="8" w:space="0" w:color="000000"/>
+            </w:tcBorders>
+            <w:tcMar>
+              <w:top w:w="100" w:type="dxa"/>
+              <w:left w:w="100" w:type="dxa"/>
+              <w:bottom w:w="100" w:type="dxa"/>
+              <w:right w:w="100" w:type="dxa"/>
+            </w:tcMar>
+            <w:hideMark/>
+          </w:tcPr>
+          <w:p>
+            <w:pPr>
+              <w:rPr>
+                <w:lang w:val="en-US"/>
+              </w:rPr>
+            </w:pPr>
+          </w:p>
+        </w:tc>
+        <w:tc>
+          <w:tcPr>
+            <w:tcW w:w="0" w:type="auto"/>
+            <w:tcBorders>
+              <w:top w:val="single" w:sz="8" w:space="0" w:color="000000"/>
+              <w:left w:val="single" w:sz="8" w:space="0" w:color="000000"/>
+              <w:bottom w:val="single" w:sz="8" w:space="0" w:color="000000"/>
+              <w:right w:val="single" w:sz="8" w:space="0" w:color="000000"/>
+            </w:tcBorders>
+            <w:tcMar>
+              <w:top w:w="100" w:type="dxa"/>
+              <w:left w:w="100" w:type="dxa"/>
+              <w:bottom w:w="100" w:type="dxa"/>
+              <w:right w:w="100" w:type="dxa"/>
+            </w:tcMar>
+            <w:hideMark/>
+          </w:tcPr>
+          <w:p>
+            <w:pPr>
+              <w:rPr>
+                <w:lang w:val="en-US"/>
+              </w:rPr>
+            </w:pPr>
+          </w:p>
+        </w:tc>
+        <w:tc>
+          <w:tcPr>
+            <w:tcW w:w="0" w:type="auto"/>
+            <w:tcBorders>
+              <w:top w:val="single" w:sz="8" w:space="0" w:color="000000"/>
+              <w:left w:val="single" w:sz="8" w:space="0" w:color="000000"/>
+              <w:bottom w:val="single" w:sz="8" w:space="0" w:color="000000"/>
+              <w:right w:val="single" w:sz="8" w:space="0" w:color="000000"/>
+            </w:tcBorders>
+            <w:tcMar>
+              <w:top w:w="100" w:type="dxa"/>
+              <w:left w:w="100" w:type="dxa"/>
+              <w:bottom w:w="100" w:type="dxa"/>
+              <w:right w:w="100" w:type="dxa"/>
+            </w:tcMar>
+            <w:hideMark/>
+          </w:tcPr>
+          <w:p>
+            <w:pPr>
+              <w:rPr>
+                <w:lang w:val="en-US"/>
+              </w:rPr>
+            </w:pPr>
+            <w:r>
+              <w:rPr>
+                <w:lang w:val="en-US"/>
+              </w:rPr>
+              <w:t>List any restricted files in this dataset:</w:t>
+            </w:r>
+          </w:p>
+          <w:p>
+            <w:pPr>
+              <w:numPr>
+                <w:ilvl w:val="0"/>
+                <w:numId w:val="20"/>
+              </w:numPr>
+              <w:rPr>
+                <w:lang w:val="en-US"/>
+              </w:rPr>
+            </w:pPr>
+          </w:p>
           <w:p>
             <w:pPr>
               <w:rPr>
@@ -7210,25 +9160,20 @@
                 <w:lang w:val="en-US"/>
               </w:rPr>
             </w:pPr>
-          </w:p>
-        </w:tc>
-        <w:tc>
-          <w:tcPr>
-            <w:tcW w:w="0" w:type="auto"/>
-            <w:tcBorders>
-              <w:top w:val="single" w:sz="8" w:space="0" w:color="000000"/>
-              <w:left w:val="single" w:sz="8" w:space="0" w:color="000000"/>
-              <w:bottom w:val="single" w:sz="8" w:space="0" w:color="000000"/>
-              <w:right w:val="single" w:sz="8" w:space="0" w:color="000000"/>
-            </w:tcBorders>
-            <w:tcMar>
-              <w:top w:w="100" w:type="dxa"/>
-              <w:left w:w="100" w:type="dxa"/>
-              <w:bottom w:w="100" w:type="dxa"/>
-              <w:right w:w="100" w:type="dxa"/>
-            </w:tcMar>
-            <w:hideMark/>
-          </w:tcPr>
+            <w:r>
+              <w:rPr>
+                <w:lang w:val="en-US"/>
+              </w:rPr>
+              <w:t>License applied to dataset:</w:t>
+            </w:r>
+          </w:p>
+          <w:p>
+            <w:pPr>
+              <w:rPr>
+                <w:lang w:val="en-US"/>
+              </w:rPr>
+            </w:pPr>
+          </w:p>
           <w:p>
             <w:pPr>
               <w:rPr>
@@ -7284,130 +9229,6 @@
                 <w:lang w:val="en-US"/>
               </w:rPr>
             </w:pPr>
-          </w:p>
-        </w:tc>
-        <w:tc>
-          <w:tcPr>
-            <w:tcW w:w="0" w:type="auto"/>
-            <w:tcBorders>
-              <w:top w:val="single" w:sz="8" w:space="0" w:color="000000"/>
-              <w:left w:val="single" w:sz="8" w:space="0" w:color="000000"/>
-              <w:bottom w:val="single" w:sz="8" w:space="0" w:color="000000"/>
-              <w:right w:val="single" w:sz="8" w:space="0" w:color="000000"/>
-            </w:tcBorders>
-            <w:tcMar>
-              <w:top w:w="100" w:type="dxa"/>
-              <w:left w:w="100" w:type="dxa"/>
-              <w:bottom w:w="100" w:type="dxa"/>
-              <w:right w:w="100" w:type="dxa"/>
-            </w:tcMar>
-            <w:hideMark/>
-          </w:tcPr>
-          <w:p>
-            <w:pPr>
-              <w:rPr>
-                <w:lang w:val="en-US"/>
-              </w:rPr>
-            </w:pPr>
-          </w:p>
-        </w:tc>
-        <w:tc>
-          <w:tcPr>
-            <w:tcW w:w="0" w:type="auto"/>
-            <w:tcBorders>
-              <w:top w:val="single" w:sz="8" w:space="0" w:color="000000"/>
-              <w:left w:val="single" w:sz="8" w:space="0" w:color="000000"/>
-              <w:bottom w:val="single" w:sz="8" w:space="0" w:color="000000"/>
-              <w:right w:val="single" w:sz="8" w:space="0" w:color="000000"/>
-            </w:tcBorders>
-            <w:tcMar>
-              <w:top w:w="100" w:type="dxa"/>
-              <w:left w:w="100" w:type="dxa"/>
-              <w:bottom w:w="100" w:type="dxa"/>
-              <w:right w:w="100" w:type="dxa"/>
-            </w:tcMar>
-            <w:hideMark/>
-          </w:tcPr>
-          <w:p>
-            <w:pPr>
-              <w:rPr>
-                <w:lang w:val="en-US"/>
-              </w:rPr>
-            </w:pPr>
-          </w:p>
-        </w:tc>
-        <w:tc>
-          <w:tcPr>
-            <w:tcW w:w="0" w:type="auto"/>
-            <w:tcBorders>
-              <w:top w:val="single" w:sz="8" w:space="0" w:color="000000"/>
-              <w:left w:val="single" w:sz="8" w:space="0" w:color="000000"/>
-              <w:bottom w:val="single" w:sz="8" w:space="0" w:color="000000"/>
-              <w:right w:val="single" w:sz="8" w:space="0" w:color="000000"/>
-            </w:tcBorders>
-            <w:tcMar>
-              <w:top w:w="100" w:type="dxa"/>
-              <w:left w:w="100" w:type="dxa"/>
-              <w:bottom w:w="100" w:type="dxa"/>
-              <w:right w:w="100" w:type="dxa"/>
-            </w:tcMar>
-            <w:hideMark/>
-          </w:tcPr>
-          <w:p>
-            <w:pPr>
-              <w:rPr>
-                <w:b/>
-                <w:bCs/>
-                <w:color w:val="FF0000"/>
-                <w:sz w:val="40"/>
-                <w:szCs w:val="40"/>
-                <w:lang w:val="en-US"/>
-              </w:rPr>
-            </w:pPr>
-            <w:r>
-              <w:rPr>
-                <w:rFonts w:hint="eastAsia"/>
-                <w:b/>
-                <w:bCs/>
-                <w:color w:val="FF0000"/>
-                <w:sz w:val="40"/>
-                <w:szCs w:val="40"/>
-                <w:lang w:val="en-US"/>
-              </w:rPr>
-              <w:t>TBD</w:t>
-            </w:r>
-          </w:p>
-          <w:p>
-            <w:pPr>
-              <w:rPr>
-                <w:lang w:val="en-US"/>
-              </w:rPr>
-            </w:pPr>
-          </w:p>
-        </w:tc>
-        <w:tc>
-          <w:tcPr>
-            <w:tcW w:w="0" w:type="auto"/>
-            <w:tcBorders>
-              <w:top w:val="single" w:sz="8" w:space="0" w:color="000000"/>
-              <w:left w:val="single" w:sz="8" w:space="0" w:color="000000"/>
-              <w:bottom w:val="single" w:sz="8" w:space="0" w:color="000000"/>
-              <w:right w:val="single" w:sz="8" w:space="0" w:color="000000"/>
-            </w:tcBorders>
-            <w:tcMar>
-              <w:top w:w="100" w:type="dxa"/>
-              <w:left w:w="100" w:type="dxa"/>
-              <w:bottom w:w="100" w:type="dxa"/>
-              <w:right w:w="100" w:type="dxa"/>
-            </w:tcMar>
-            <w:hideMark/>
-          </w:tcPr>
-          <w:p>
-            <w:pPr>
-              <w:rPr>
-                <w:lang w:val="en-US"/>
-              </w:rPr>
-            </w:pPr>
             <w:r>
               <w:rPr>
                 <w:lang w:val="en-US"/>
@@ -7461,1492 +9282,6 @@
               <w:bottom w:val="single" w:sz="8" w:space="0" w:color="000000"/>
               <w:right w:val="single" w:sz="8" w:space="0" w:color="000000"/>
             </w:tcBorders>
-            <w:shd w:val="clear" w:color="auto" w:fill="D9EAD3"/>
-            <w:tcMar>
-              <w:top w:w="100" w:type="dxa"/>
-              <w:left w:w="100" w:type="dxa"/>
-              <w:bottom w:w="100" w:type="dxa"/>
-              <w:right w:w="100" w:type="dxa"/>
-            </w:tcMar>
-            <w:hideMark/>
-          </w:tcPr>
-          <w:p>
-            <w:pPr>
-              <w:rPr>
-                <w:lang w:val="en-US"/>
-              </w:rPr>
-            </w:pPr>
-            <w:r>
-              <w:rPr>
-                <w:b/>
-                <w:bCs/>
-                <w:lang w:val="en-US"/>
-              </w:rPr>
-              <w:t>5.0</w:t>
-            </w:r>
-          </w:p>
-        </w:tc>
-        <w:tc>
-          <w:tcPr>
-            <w:tcW w:w="0" w:type="auto"/>
-            <w:tcBorders>
-              <w:top w:val="single" w:sz="8" w:space="0" w:color="000000"/>
-              <w:left w:val="single" w:sz="8" w:space="0" w:color="000000"/>
-              <w:bottom w:val="single" w:sz="8" w:space="0" w:color="000000"/>
-              <w:right w:val="single" w:sz="8" w:space="0" w:color="000000"/>
-            </w:tcBorders>
-            <w:shd w:val="clear" w:color="auto" w:fill="D9EAD3"/>
-            <w:tcMar>
-              <w:top w:w="100" w:type="dxa"/>
-              <w:left w:w="100" w:type="dxa"/>
-              <w:bottom w:w="100" w:type="dxa"/>
-              <w:right w:w="100" w:type="dxa"/>
-            </w:tcMar>
-            <w:hideMark/>
-          </w:tcPr>
-          <w:p>
-            <w:pPr>
-              <w:rPr>
-                <w:lang w:val="en-US"/>
-              </w:rPr>
-            </w:pPr>
-            <w:r>
-              <w:rPr>
-                <w:b/>
-                <w:bCs/>
-                <w:lang w:val="en-US"/>
-              </w:rPr>
-              <w:t>Sensitive data and IP</w:t>
-            </w:r>
-          </w:p>
-        </w:tc>
-        <w:tc>
-          <w:tcPr>
-            <w:tcW w:w="0" w:type="auto"/>
-            <w:tcBorders>
-              <w:top w:val="single" w:sz="8" w:space="0" w:color="000000"/>
-              <w:left w:val="single" w:sz="8" w:space="0" w:color="000000"/>
-              <w:bottom w:val="single" w:sz="8" w:space="0" w:color="000000"/>
-              <w:right w:val="single" w:sz="8" w:space="0" w:color="000000"/>
-            </w:tcBorders>
-            <w:shd w:val="clear" w:color="auto" w:fill="D9EAD3"/>
-            <w:tcMar>
-              <w:top w:w="100" w:type="dxa"/>
-              <w:left w:w="100" w:type="dxa"/>
-              <w:bottom w:w="100" w:type="dxa"/>
-              <w:right w:w="100" w:type="dxa"/>
-            </w:tcMar>
-            <w:hideMark/>
-          </w:tcPr>
-          <w:p>
-            <w:pPr>
-              <w:rPr>
-                <w:lang w:val="en-US"/>
-              </w:rPr>
-            </w:pPr>
-          </w:p>
-        </w:tc>
-        <w:tc>
-          <w:tcPr>
-            <w:tcW w:w="0" w:type="auto"/>
-            <w:tcBorders>
-              <w:top w:val="single" w:sz="8" w:space="0" w:color="000000"/>
-              <w:left w:val="single" w:sz="8" w:space="0" w:color="000000"/>
-              <w:bottom w:val="single" w:sz="8" w:space="0" w:color="000000"/>
-              <w:right w:val="single" w:sz="8" w:space="0" w:color="000000"/>
-            </w:tcBorders>
-            <w:shd w:val="clear" w:color="auto" w:fill="D9EAD3"/>
-            <w:tcMar>
-              <w:top w:w="100" w:type="dxa"/>
-              <w:left w:w="100" w:type="dxa"/>
-              <w:bottom w:w="100" w:type="dxa"/>
-              <w:right w:w="100" w:type="dxa"/>
-            </w:tcMar>
-            <w:hideMark/>
-          </w:tcPr>
-          <w:p>
-            <w:pPr>
-              <w:rPr>
-                <w:lang w:val="en-US"/>
-              </w:rPr>
-            </w:pPr>
-            <w:r>
-              <w:rPr>
-                <w:b/>
-                <w:bCs/>
-                <w:lang w:val="en-US"/>
-              </w:rPr>
-              <w:t>Yes</w:t>
-            </w:r>
-          </w:p>
-        </w:tc>
-        <w:tc>
-          <w:tcPr>
-            <w:tcW w:w="0" w:type="auto"/>
-            <w:tcBorders>
-              <w:top w:val="single" w:sz="8" w:space="0" w:color="000000"/>
-              <w:left w:val="single" w:sz="8" w:space="0" w:color="000000"/>
-              <w:bottom w:val="single" w:sz="8" w:space="0" w:color="000000"/>
-              <w:right w:val="single" w:sz="8" w:space="0" w:color="000000"/>
-            </w:tcBorders>
-            <w:shd w:val="clear" w:color="auto" w:fill="D9EAD3"/>
-            <w:tcMar>
-              <w:top w:w="100" w:type="dxa"/>
-              <w:left w:w="100" w:type="dxa"/>
-              <w:bottom w:w="100" w:type="dxa"/>
-              <w:right w:w="100" w:type="dxa"/>
-            </w:tcMar>
-            <w:hideMark/>
-          </w:tcPr>
-          <w:p>
-            <w:pPr>
-              <w:rPr>
-                <w:lang w:val="en-US"/>
-              </w:rPr>
-            </w:pPr>
-            <w:r>
-              <w:rPr>
-                <w:b/>
-                <w:bCs/>
-                <w:lang w:val="en-US"/>
-              </w:rPr>
-              <w:t>No</w:t>
-            </w:r>
-          </w:p>
-        </w:tc>
-        <w:tc>
-          <w:tcPr>
-            <w:tcW w:w="0" w:type="auto"/>
-            <w:tcBorders>
-              <w:top w:val="single" w:sz="8" w:space="0" w:color="000000"/>
-              <w:left w:val="single" w:sz="8" w:space="0" w:color="000000"/>
-              <w:bottom w:val="single" w:sz="8" w:space="0" w:color="000000"/>
-              <w:right w:val="single" w:sz="8" w:space="0" w:color="000000"/>
-            </w:tcBorders>
-            <w:shd w:val="clear" w:color="auto" w:fill="D9EAD3"/>
-            <w:tcMar>
-              <w:top w:w="100" w:type="dxa"/>
-              <w:left w:w="100" w:type="dxa"/>
-              <w:bottom w:w="100" w:type="dxa"/>
-              <w:right w:w="100" w:type="dxa"/>
-            </w:tcMar>
-            <w:hideMark/>
-          </w:tcPr>
-          <w:p>
-            <w:pPr>
-              <w:rPr>
-                <w:lang w:val="en-US"/>
-              </w:rPr>
-            </w:pPr>
-            <w:r>
-              <w:rPr>
-                <w:b/>
-                <w:bCs/>
-                <w:lang w:val="en-US"/>
-              </w:rPr>
-              <w:t>SI</w:t>
-            </w:r>
-          </w:p>
-        </w:tc>
-        <w:tc>
-          <w:tcPr>
-            <w:tcW w:w="0" w:type="auto"/>
-            <w:tcBorders>
-              <w:top w:val="single" w:sz="8" w:space="0" w:color="000000"/>
-              <w:left w:val="single" w:sz="8" w:space="0" w:color="000000"/>
-              <w:bottom w:val="single" w:sz="8" w:space="0" w:color="000000"/>
-              <w:right w:val="single" w:sz="8" w:space="0" w:color="000000"/>
-            </w:tcBorders>
-            <w:shd w:val="clear" w:color="auto" w:fill="D9EAD3"/>
-            <w:tcMar>
-              <w:top w:w="100" w:type="dxa"/>
-              <w:left w:w="100" w:type="dxa"/>
-              <w:bottom w:w="100" w:type="dxa"/>
-              <w:right w:w="100" w:type="dxa"/>
-            </w:tcMar>
-            <w:hideMark/>
-          </w:tcPr>
-          <w:p>
-            <w:pPr>
-              <w:rPr>
-                <w:lang w:val="en-US"/>
-              </w:rPr>
-            </w:pPr>
-            <w:r>
-              <w:rPr>
-                <w:b/>
-                <w:bCs/>
-                <w:lang w:val="en-US"/>
-              </w:rPr>
-              <w:t>NS</w:t>
-            </w:r>
-          </w:p>
-        </w:tc>
-        <w:tc>
-          <w:tcPr>
-            <w:tcW w:w="0" w:type="auto"/>
-            <w:tcBorders>
-              <w:top w:val="single" w:sz="8" w:space="0" w:color="000000"/>
-              <w:left w:val="single" w:sz="8" w:space="0" w:color="000000"/>
-              <w:bottom w:val="single" w:sz="8" w:space="0" w:color="000000"/>
-              <w:right w:val="single" w:sz="8" w:space="0" w:color="000000"/>
-            </w:tcBorders>
-            <w:shd w:val="clear" w:color="auto" w:fill="D9EAD3"/>
-            <w:tcMar>
-              <w:top w:w="100" w:type="dxa"/>
-              <w:left w:w="100" w:type="dxa"/>
-              <w:bottom w:w="100" w:type="dxa"/>
-              <w:right w:w="100" w:type="dxa"/>
-            </w:tcMar>
-            <w:hideMark/>
-          </w:tcPr>
-          <w:p>
-            <w:pPr>
-              <w:rPr>
-                <w:lang w:val="en-US"/>
-              </w:rPr>
-            </w:pPr>
-            <w:r>
-              <w:rPr>
-                <w:b/>
-                <w:bCs/>
-                <w:lang w:val="en-US"/>
-              </w:rPr>
-              <w:t>NA</w:t>
-            </w:r>
-          </w:p>
-        </w:tc>
-        <w:tc>
-          <w:tcPr>
-            <w:tcW w:w="0" w:type="auto"/>
-            <w:tcBorders>
-              <w:top w:val="single" w:sz="8" w:space="0" w:color="000000"/>
-              <w:left w:val="single" w:sz="8" w:space="0" w:color="000000"/>
-              <w:bottom w:val="single" w:sz="8" w:space="0" w:color="000000"/>
-              <w:right w:val="single" w:sz="8" w:space="0" w:color="000000"/>
-            </w:tcBorders>
-            <w:shd w:val="clear" w:color="auto" w:fill="D9EAD3"/>
-            <w:tcMar>
-              <w:top w:w="100" w:type="dxa"/>
-              <w:left w:w="100" w:type="dxa"/>
-              <w:bottom w:w="100" w:type="dxa"/>
-              <w:right w:w="100" w:type="dxa"/>
-            </w:tcMar>
-            <w:hideMark/>
-          </w:tcPr>
-          <w:p>
-            <w:pPr>
-              <w:rPr>
-                <w:lang w:val="en-US"/>
-              </w:rPr>
-            </w:pPr>
-          </w:p>
-        </w:tc>
-        <w:tc>
-          <w:tcPr>
-            <w:tcW w:w="0" w:type="auto"/>
-            <w:tcBorders>
-              <w:top w:val="single" w:sz="8" w:space="0" w:color="000000"/>
-              <w:left w:val="single" w:sz="8" w:space="0" w:color="000000"/>
-              <w:bottom w:val="single" w:sz="8" w:space="0" w:color="000000"/>
-              <w:right w:val="single" w:sz="8" w:space="0" w:color="000000"/>
-            </w:tcBorders>
-            <w:shd w:val="clear" w:color="auto" w:fill="D9EAD3"/>
-            <w:tcMar>
-              <w:top w:w="100" w:type="dxa"/>
-              <w:left w:w="100" w:type="dxa"/>
-              <w:bottom w:w="100" w:type="dxa"/>
-              <w:right w:w="100" w:type="dxa"/>
-            </w:tcMar>
-            <w:hideMark/>
-          </w:tcPr>
-          <w:p>
-            <w:pPr>
-              <w:rPr>
-                <w:lang w:val="en-US"/>
-              </w:rPr>
-            </w:pPr>
-          </w:p>
-        </w:tc>
-        <w:tc>
-          <w:tcPr>
-            <w:tcW w:w="0" w:type="auto"/>
-            <w:tcBorders>
-              <w:top w:val="single" w:sz="8" w:space="0" w:color="000000"/>
-              <w:left w:val="single" w:sz="8" w:space="0" w:color="000000"/>
-              <w:bottom w:val="single" w:sz="8" w:space="0" w:color="000000"/>
-              <w:right w:val="single" w:sz="8" w:space="0" w:color="000000"/>
-            </w:tcBorders>
-            <w:shd w:val="clear" w:color="auto" w:fill="D9EAD3"/>
-            <w:tcMar>
-              <w:top w:w="100" w:type="dxa"/>
-              <w:left w:w="100" w:type="dxa"/>
-              <w:bottom w:w="100" w:type="dxa"/>
-              <w:right w:w="100" w:type="dxa"/>
-            </w:tcMar>
-            <w:hideMark/>
-          </w:tcPr>
-          <w:p>
-            <w:pPr>
-              <w:rPr>
-                <w:lang w:val="en-US"/>
-              </w:rPr>
-            </w:pPr>
-          </w:p>
-        </w:tc>
-      </w:tr>
-      <w:tr>
-        <w:trPr>
-          <w:trHeight w:val="480"/>
-        </w:trPr>
-        <w:tc>
-          <w:tcPr>
-            <w:tcW w:w="0" w:type="auto"/>
-            <w:tcBorders>
-              <w:top w:val="single" w:sz="8" w:space="0" w:color="000000"/>
-              <w:left w:val="single" w:sz="8" w:space="0" w:color="000000"/>
-              <w:bottom w:val="single" w:sz="8" w:space="0" w:color="000000"/>
-              <w:right w:val="single" w:sz="8" w:space="0" w:color="000000"/>
-            </w:tcBorders>
-            <w:tcMar>
-              <w:top w:w="100" w:type="dxa"/>
-              <w:left w:w="100" w:type="dxa"/>
-              <w:bottom w:w="100" w:type="dxa"/>
-              <w:right w:w="100" w:type="dxa"/>
-            </w:tcMar>
-            <w:hideMark/>
-          </w:tcPr>
-          <w:p>
-            <w:pPr>
-              <w:rPr>
-                <w:lang w:val="en-US"/>
-              </w:rPr>
-            </w:pPr>
-            <w:r>
-              <w:rPr>
-                <w:b/>
-                <w:bCs/>
-                <w:lang w:val="en-US"/>
-              </w:rPr>
-              <w:t>5.1</w:t>
-            </w:r>
-          </w:p>
-        </w:tc>
-        <w:tc>
-          <w:tcPr>
-            <w:tcW w:w="0" w:type="auto"/>
-            <w:tcBorders>
-              <w:top w:val="single" w:sz="8" w:space="0" w:color="000000"/>
-              <w:left w:val="single" w:sz="8" w:space="0" w:color="000000"/>
-              <w:bottom w:val="single" w:sz="8" w:space="0" w:color="000000"/>
-              <w:right w:val="single" w:sz="8" w:space="0" w:color="000000"/>
-            </w:tcBorders>
-            <w:tcMar>
-              <w:top w:w="100" w:type="dxa"/>
-              <w:left w:w="100" w:type="dxa"/>
-              <w:bottom w:w="100" w:type="dxa"/>
-              <w:right w:w="100" w:type="dxa"/>
-            </w:tcMar>
-            <w:hideMark/>
-          </w:tcPr>
-          <w:p>
-            <w:pPr>
-              <w:rPr>
-                <w:lang w:val="en-US"/>
-              </w:rPr>
-            </w:pPr>
-            <w:r>
-              <w:rPr>
-                <w:b/>
-                <w:bCs/>
-                <w:lang w:val="en-US"/>
-              </w:rPr>
-              <w:t>Is the dataset free of obvious sensitivity issues (e.g., direct identifiers)?</w:t>
-            </w:r>
-          </w:p>
-        </w:tc>
-        <w:tc>
-          <w:tcPr>
-            <w:tcW w:w="0" w:type="auto"/>
-            <w:tcBorders>
-              <w:top w:val="single" w:sz="8" w:space="0" w:color="000000"/>
-              <w:left w:val="single" w:sz="8" w:space="0" w:color="000000"/>
-              <w:bottom w:val="single" w:sz="8" w:space="0" w:color="000000"/>
-              <w:right w:val="single" w:sz="8" w:space="0" w:color="000000"/>
-            </w:tcBorders>
-            <w:tcMar>
-              <w:top w:w="100" w:type="dxa"/>
-              <w:left w:w="100" w:type="dxa"/>
-              <w:bottom w:w="100" w:type="dxa"/>
-              <w:right w:w="100" w:type="dxa"/>
-            </w:tcMar>
-            <w:hideMark/>
-          </w:tcPr>
-          <w:p>
-            <w:pPr>
-              <w:numPr>
-                <w:ilvl w:val="0"/>
-                <w:numId w:val="16"/>
-              </w:numPr>
-              <w:rPr>
-                <w:lang w:val="en-US"/>
-              </w:rPr>
-            </w:pPr>
-            <w:r>
-              <w:rPr>
-                <w:lang w:val="en-US"/>
-              </w:rPr>
-              <w:t xml:space="preserve">Review documentation and file names and see if there are any that should be opened and reviewed (e.g. if a file is named </w:t>
-            </w:r>
-            <w:r>
-              <w:rPr>
-                <w:lang w:val="en-US"/>
-              </w:rPr>
-              <w:lastRenderedPageBreak/>
-              <w:t>“participant survey”, etc.) </w:t>
-            </w:r>
-          </w:p>
-          <w:p>
-            <w:pPr>
-              <w:numPr>
-                <w:ilvl w:val="0"/>
-                <w:numId w:val="16"/>
-              </w:numPr>
-              <w:rPr>
-                <w:lang w:val="en-US"/>
-              </w:rPr>
-            </w:pPr>
-            <w:r>
-              <w:rPr>
-                <w:lang w:val="en-US"/>
-              </w:rPr>
-              <w:t>Review description, notes, and terms of access metadata fields.</w:t>
-            </w:r>
-          </w:p>
-        </w:tc>
-        <w:tc>
-          <w:tcPr>
-            <w:tcW w:w="0" w:type="auto"/>
-            <w:tcBorders>
-              <w:top w:val="single" w:sz="8" w:space="0" w:color="000000"/>
-              <w:left w:val="single" w:sz="8" w:space="0" w:color="000000"/>
-              <w:bottom w:val="single" w:sz="8" w:space="0" w:color="000000"/>
-              <w:right w:val="single" w:sz="8" w:space="0" w:color="000000"/>
-            </w:tcBorders>
-            <w:tcMar>
-              <w:top w:w="100" w:type="dxa"/>
-              <w:left w:w="100" w:type="dxa"/>
-              <w:bottom w:w="100" w:type="dxa"/>
-              <w:right w:w="100" w:type="dxa"/>
-            </w:tcMar>
-            <w:hideMark/>
-          </w:tcPr>
-          <w:p>
-            <w:pPr>
-              <w:rPr>
-                <w:lang w:val="en-US"/>
-              </w:rPr>
-            </w:pPr>
-          </w:p>
-        </w:tc>
-        <w:tc>
-          <w:tcPr>
-            <w:tcW w:w="0" w:type="auto"/>
-            <w:tcBorders>
-              <w:top w:val="single" w:sz="8" w:space="0" w:color="000000"/>
-              <w:left w:val="single" w:sz="8" w:space="0" w:color="000000"/>
-              <w:bottom w:val="single" w:sz="8" w:space="0" w:color="000000"/>
-              <w:right w:val="single" w:sz="8" w:space="0" w:color="000000"/>
-            </w:tcBorders>
-            <w:tcMar>
-              <w:top w:w="100" w:type="dxa"/>
-              <w:left w:w="100" w:type="dxa"/>
-              <w:bottom w:w="100" w:type="dxa"/>
-              <w:right w:w="100" w:type="dxa"/>
-            </w:tcMar>
-            <w:hideMark/>
-          </w:tcPr>
-          <w:p>
-            <w:pPr>
-              <w:rPr>
-                <w:lang w:val="en-US"/>
-              </w:rPr>
-            </w:pPr>
-          </w:p>
-        </w:tc>
-        <w:tc>
-          <w:tcPr>
-            <w:tcW w:w="0" w:type="auto"/>
-            <w:tcBorders>
-              <w:top w:val="single" w:sz="8" w:space="0" w:color="000000"/>
-              <w:left w:val="single" w:sz="8" w:space="0" w:color="000000"/>
-              <w:bottom w:val="single" w:sz="8" w:space="0" w:color="000000"/>
-              <w:right w:val="single" w:sz="8" w:space="0" w:color="000000"/>
-            </w:tcBorders>
-            <w:tcMar>
-              <w:top w:w="100" w:type="dxa"/>
-              <w:left w:w="100" w:type="dxa"/>
-              <w:bottom w:w="100" w:type="dxa"/>
-              <w:right w:w="100" w:type="dxa"/>
-            </w:tcMar>
-            <w:hideMark/>
-          </w:tcPr>
-          <w:p>
-            <w:pPr>
-              <w:rPr>
-                <w:lang w:val="en-US"/>
-              </w:rPr>
-            </w:pPr>
-          </w:p>
-        </w:tc>
-        <w:tc>
-          <w:tcPr>
-            <w:tcW w:w="0" w:type="auto"/>
-            <w:tcBorders>
-              <w:top w:val="single" w:sz="8" w:space="0" w:color="000000"/>
-              <w:left w:val="single" w:sz="8" w:space="0" w:color="000000"/>
-              <w:bottom w:val="single" w:sz="8" w:space="0" w:color="000000"/>
-              <w:right w:val="single" w:sz="8" w:space="0" w:color="000000"/>
-            </w:tcBorders>
-            <w:tcMar>
-              <w:top w:w="100" w:type="dxa"/>
-              <w:left w:w="100" w:type="dxa"/>
-              <w:bottom w:w="100" w:type="dxa"/>
-              <w:right w:w="100" w:type="dxa"/>
-            </w:tcMar>
-            <w:hideMark/>
-          </w:tcPr>
-          <w:p>
-            <w:pPr>
-              <w:rPr>
-                <w:lang w:val="en-US"/>
-              </w:rPr>
-            </w:pPr>
-          </w:p>
-        </w:tc>
-        <w:tc>
-          <w:tcPr>
-            <w:tcW w:w="0" w:type="auto"/>
-            <w:tcBorders>
-              <w:top w:val="single" w:sz="8" w:space="0" w:color="000000"/>
-              <w:left w:val="single" w:sz="8" w:space="0" w:color="000000"/>
-              <w:bottom w:val="single" w:sz="8" w:space="0" w:color="000000"/>
-              <w:right w:val="single" w:sz="8" w:space="0" w:color="000000"/>
-            </w:tcBorders>
-            <w:tcMar>
-              <w:top w:w="100" w:type="dxa"/>
-              <w:left w:w="100" w:type="dxa"/>
-              <w:bottom w:w="100" w:type="dxa"/>
-              <w:right w:w="100" w:type="dxa"/>
-            </w:tcMar>
-            <w:hideMark/>
-          </w:tcPr>
-          <w:p>
-            <w:pPr>
-              <w:rPr>
-                <w:lang w:val="en-US"/>
-              </w:rPr>
-            </w:pPr>
-          </w:p>
-        </w:tc>
-        <w:tc>
-          <w:tcPr>
-            <w:tcW w:w="0" w:type="auto"/>
-            <w:tcBorders>
-              <w:top w:val="single" w:sz="8" w:space="0" w:color="000000"/>
-              <w:left w:val="single" w:sz="8" w:space="0" w:color="000000"/>
-              <w:bottom w:val="single" w:sz="8" w:space="0" w:color="000000"/>
-              <w:right w:val="single" w:sz="8" w:space="0" w:color="000000"/>
-            </w:tcBorders>
-            <w:tcMar>
-              <w:top w:w="100" w:type="dxa"/>
-              <w:left w:w="100" w:type="dxa"/>
-              <w:bottom w:w="100" w:type="dxa"/>
-              <w:right w:w="100" w:type="dxa"/>
-            </w:tcMar>
-            <w:hideMark/>
-          </w:tcPr>
-          <w:p>
-            <w:pPr>
-              <w:rPr>
-                <w:lang w:val="en-US"/>
-              </w:rPr>
-            </w:pPr>
-            <w:r>
-              <w:rPr>
-                <w:lang w:val="en-US"/>
-              </w:rPr>
-              <w:t>List fields/files below with the format ‘field/</w:t>
-            </w:r>
-            <w:r>
-              <w:rPr>
-                <w:i/>
-                <w:iCs/>
-                <w:lang w:val="en-US"/>
-              </w:rPr>
-              <w:t>file: issue and comments</w:t>
-            </w:r>
-            <w:r>
-              <w:rPr>
-                <w:lang w:val="en-US"/>
-              </w:rPr>
-              <w:t>’:</w:t>
-            </w:r>
-          </w:p>
-          <w:p>
-            <w:pPr>
-              <w:numPr>
-                <w:ilvl w:val="0"/>
-                <w:numId w:val="17"/>
-              </w:numPr>
-              <w:rPr>
-                <w:lang w:val="en-US"/>
-              </w:rPr>
-            </w:pPr>
-          </w:p>
-        </w:tc>
-        <w:tc>
-          <w:tcPr>
-            <w:tcW w:w="0" w:type="auto"/>
-            <w:tcBorders>
-              <w:top w:val="single" w:sz="8" w:space="0" w:color="000000"/>
-              <w:left w:val="single" w:sz="8" w:space="0" w:color="000000"/>
-              <w:bottom w:val="single" w:sz="8" w:space="0" w:color="000000"/>
-              <w:right w:val="single" w:sz="8" w:space="0" w:color="000000"/>
-            </w:tcBorders>
-            <w:tcMar>
-              <w:top w:w="100" w:type="dxa"/>
-              <w:left w:w="100" w:type="dxa"/>
-              <w:bottom w:w="100" w:type="dxa"/>
-              <w:right w:w="100" w:type="dxa"/>
-            </w:tcMar>
-            <w:hideMark/>
-          </w:tcPr>
-          <w:p>
-            <w:pPr>
-              <w:rPr>
-                <w:lang w:val="en-US"/>
-              </w:rPr>
-            </w:pPr>
-            <w:r>
-              <w:rPr>
-                <w:lang w:val="en-US"/>
-              </w:rPr>
-              <w:t>Require</w:t>
-            </w:r>
-          </w:p>
-        </w:tc>
-        <w:tc>
-          <w:tcPr>
-            <w:tcW w:w="0" w:type="auto"/>
-            <w:tcBorders>
-              <w:top w:val="single" w:sz="8" w:space="0" w:color="000000"/>
-              <w:left w:val="single" w:sz="8" w:space="0" w:color="000000"/>
-              <w:bottom w:val="single" w:sz="8" w:space="0" w:color="000000"/>
-              <w:right w:val="single" w:sz="8" w:space="0" w:color="000000"/>
-            </w:tcBorders>
-            <w:tcMar>
-              <w:top w:w="100" w:type="dxa"/>
-              <w:left w:w="100" w:type="dxa"/>
-              <w:bottom w:w="100" w:type="dxa"/>
-              <w:right w:w="100" w:type="dxa"/>
-            </w:tcMar>
-            <w:hideMark/>
-          </w:tcPr>
-          <w:p>
-            <w:pPr>
-              <w:rPr>
-                <w:lang w:val="en-US"/>
-              </w:rPr>
-            </w:pPr>
-          </w:p>
-        </w:tc>
-      </w:tr>
-      <w:tr>
-        <w:trPr>
-          <w:trHeight w:val="480"/>
-        </w:trPr>
-        <w:tc>
-          <w:tcPr>
-            <w:tcW w:w="0" w:type="auto"/>
-            <w:tcBorders>
-              <w:top w:val="single" w:sz="8" w:space="0" w:color="000000"/>
-              <w:left w:val="single" w:sz="8" w:space="0" w:color="000000"/>
-              <w:bottom w:val="single" w:sz="8" w:space="0" w:color="000000"/>
-              <w:right w:val="single" w:sz="8" w:space="0" w:color="000000"/>
-            </w:tcBorders>
-            <w:tcMar>
-              <w:top w:w="100" w:type="dxa"/>
-              <w:left w:w="100" w:type="dxa"/>
-              <w:bottom w:w="100" w:type="dxa"/>
-              <w:right w:w="100" w:type="dxa"/>
-            </w:tcMar>
-            <w:hideMark/>
-          </w:tcPr>
-          <w:p>
-            <w:pPr>
-              <w:rPr>
-                <w:lang w:val="en-US"/>
-              </w:rPr>
-            </w:pPr>
-            <w:r>
-              <w:rPr>
-                <w:b/>
-                <w:bCs/>
-                <w:lang w:val="en-US"/>
-              </w:rPr>
-              <w:t>5.2</w:t>
-            </w:r>
-          </w:p>
-        </w:tc>
-        <w:tc>
-          <w:tcPr>
-            <w:tcW w:w="0" w:type="auto"/>
-            <w:tcBorders>
-              <w:top w:val="single" w:sz="8" w:space="0" w:color="000000"/>
-              <w:left w:val="single" w:sz="8" w:space="0" w:color="000000"/>
-              <w:bottom w:val="single" w:sz="8" w:space="0" w:color="000000"/>
-              <w:right w:val="single" w:sz="8" w:space="0" w:color="000000"/>
-            </w:tcBorders>
-            <w:tcMar>
-              <w:top w:w="100" w:type="dxa"/>
-              <w:left w:w="100" w:type="dxa"/>
-              <w:bottom w:w="100" w:type="dxa"/>
-              <w:right w:w="100" w:type="dxa"/>
-            </w:tcMar>
-            <w:hideMark/>
-          </w:tcPr>
-          <w:p>
-            <w:pPr>
-              <w:rPr>
-                <w:lang w:val="en-US"/>
-              </w:rPr>
-            </w:pPr>
-            <w:r>
-              <w:rPr>
-                <w:b/>
-                <w:bCs/>
-                <w:lang w:val="en-US"/>
-              </w:rPr>
-              <w:t>*If something is flagged in the sensitive data review, does the depositor have REB approval to share the dataset?</w:t>
-            </w:r>
-          </w:p>
-        </w:tc>
-        <w:tc>
-          <w:tcPr>
-            <w:tcW w:w="0" w:type="auto"/>
-            <w:tcBorders>
-              <w:top w:val="single" w:sz="8" w:space="0" w:color="000000"/>
-              <w:left w:val="single" w:sz="8" w:space="0" w:color="000000"/>
-              <w:bottom w:val="single" w:sz="8" w:space="0" w:color="000000"/>
-              <w:right w:val="single" w:sz="8" w:space="0" w:color="000000"/>
-            </w:tcBorders>
-            <w:tcMar>
-              <w:top w:w="100" w:type="dxa"/>
-              <w:left w:w="100" w:type="dxa"/>
-              <w:bottom w:w="100" w:type="dxa"/>
-              <w:right w:w="100" w:type="dxa"/>
-            </w:tcMar>
-            <w:hideMark/>
-          </w:tcPr>
-          <w:p>
-            <w:pPr>
-              <w:numPr>
-                <w:ilvl w:val="0"/>
-                <w:numId w:val="18"/>
-              </w:numPr>
-              <w:rPr>
-                <w:lang w:val="en-US"/>
-              </w:rPr>
-            </w:pPr>
-            <w:r>
-              <w:rPr>
-                <w:lang w:val="en-US"/>
-              </w:rPr>
-              <w:t>If something is flagged in the sensitive data review (see question above), check the intake form to confirm information about their REB status.</w:t>
-            </w:r>
-          </w:p>
-        </w:tc>
-        <w:tc>
-          <w:tcPr>
-            <w:tcW w:w="0" w:type="auto"/>
-            <w:tcBorders>
-              <w:top w:val="single" w:sz="8" w:space="0" w:color="000000"/>
-              <w:left w:val="single" w:sz="8" w:space="0" w:color="000000"/>
-              <w:bottom w:val="single" w:sz="8" w:space="0" w:color="000000"/>
-              <w:right w:val="single" w:sz="8" w:space="0" w:color="000000"/>
-            </w:tcBorders>
-            <w:tcMar>
-              <w:top w:w="100" w:type="dxa"/>
-              <w:left w:w="100" w:type="dxa"/>
-              <w:bottom w:w="100" w:type="dxa"/>
-              <w:right w:w="100" w:type="dxa"/>
-            </w:tcMar>
-            <w:hideMark/>
-          </w:tcPr>
-          <w:p>
-            <w:pPr>
-              <w:rPr>
-                <w:lang w:val="en-US"/>
-              </w:rPr>
-            </w:pPr>
-          </w:p>
-        </w:tc>
-        <w:tc>
-          <w:tcPr>
-            <w:tcW w:w="0" w:type="auto"/>
-            <w:tcBorders>
-              <w:top w:val="single" w:sz="8" w:space="0" w:color="000000"/>
-              <w:left w:val="single" w:sz="8" w:space="0" w:color="000000"/>
-              <w:bottom w:val="single" w:sz="8" w:space="0" w:color="000000"/>
-              <w:right w:val="single" w:sz="8" w:space="0" w:color="000000"/>
-            </w:tcBorders>
-            <w:tcMar>
-              <w:top w:w="100" w:type="dxa"/>
-              <w:left w:w="100" w:type="dxa"/>
-              <w:bottom w:w="100" w:type="dxa"/>
-              <w:right w:w="100" w:type="dxa"/>
-            </w:tcMar>
-            <w:hideMark/>
-          </w:tcPr>
-          <w:p>
-            <w:pPr>
-              <w:rPr>
-                <w:lang w:val="en-US"/>
-              </w:rPr>
-            </w:pPr>
-          </w:p>
-        </w:tc>
-        <w:tc>
-          <w:tcPr>
-            <w:tcW w:w="0" w:type="auto"/>
-            <w:tcBorders>
-              <w:top w:val="single" w:sz="8" w:space="0" w:color="000000"/>
-              <w:left w:val="single" w:sz="8" w:space="0" w:color="000000"/>
-              <w:bottom w:val="single" w:sz="8" w:space="0" w:color="000000"/>
-              <w:right w:val="single" w:sz="8" w:space="0" w:color="000000"/>
-            </w:tcBorders>
-            <w:tcMar>
-              <w:top w:w="100" w:type="dxa"/>
-              <w:left w:w="100" w:type="dxa"/>
-              <w:bottom w:w="100" w:type="dxa"/>
-              <w:right w:w="100" w:type="dxa"/>
-            </w:tcMar>
-            <w:hideMark/>
-          </w:tcPr>
-          <w:p>
-            <w:pPr>
-              <w:rPr>
-                <w:lang w:val="en-US"/>
-              </w:rPr>
-            </w:pPr>
-          </w:p>
-        </w:tc>
-        <w:tc>
-          <w:tcPr>
-            <w:tcW w:w="0" w:type="auto"/>
-            <w:tcBorders>
-              <w:top w:val="single" w:sz="8" w:space="0" w:color="000000"/>
-              <w:left w:val="single" w:sz="8" w:space="0" w:color="000000"/>
-              <w:bottom w:val="single" w:sz="8" w:space="0" w:color="000000"/>
-              <w:right w:val="single" w:sz="8" w:space="0" w:color="000000"/>
-            </w:tcBorders>
-            <w:tcMar>
-              <w:top w:w="100" w:type="dxa"/>
-              <w:left w:w="100" w:type="dxa"/>
-              <w:bottom w:w="100" w:type="dxa"/>
-              <w:right w:w="100" w:type="dxa"/>
-            </w:tcMar>
-            <w:hideMark/>
-          </w:tcPr>
-          <w:p>
-            <w:pPr>
-              <w:rPr>
-                <w:lang w:val="en-US"/>
-              </w:rPr>
-            </w:pPr>
-          </w:p>
-        </w:tc>
-        <w:tc>
-          <w:tcPr>
-            <w:tcW w:w="0" w:type="auto"/>
-            <w:tcBorders>
-              <w:top w:val="single" w:sz="8" w:space="0" w:color="000000"/>
-              <w:left w:val="single" w:sz="8" w:space="0" w:color="000000"/>
-              <w:bottom w:val="single" w:sz="8" w:space="0" w:color="000000"/>
-              <w:right w:val="single" w:sz="8" w:space="0" w:color="000000"/>
-            </w:tcBorders>
-            <w:tcMar>
-              <w:top w:w="100" w:type="dxa"/>
-              <w:left w:w="100" w:type="dxa"/>
-              <w:bottom w:w="100" w:type="dxa"/>
-              <w:right w:w="100" w:type="dxa"/>
-            </w:tcMar>
-            <w:hideMark/>
-          </w:tcPr>
-          <w:p>
-            <w:pPr>
-              <w:rPr>
-                <w:lang w:val="en-US"/>
-              </w:rPr>
-            </w:pPr>
-          </w:p>
-        </w:tc>
-        <w:tc>
-          <w:tcPr>
-            <w:tcW w:w="0" w:type="auto"/>
-            <w:tcBorders>
-              <w:top w:val="single" w:sz="8" w:space="0" w:color="000000"/>
-              <w:left w:val="single" w:sz="8" w:space="0" w:color="000000"/>
-              <w:bottom w:val="single" w:sz="8" w:space="0" w:color="000000"/>
-              <w:right w:val="single" w:sz="8" w:space="0" w:color="000000"/>
-            </w:tcBorders>
-            <w:tcMar>
-              <w:top w:w="100" w:type="dxa"/>
-              <w:left w:w="100" w:type="dxa"/>
-              <w:bottom w:w="100" w:type="dxa"/>
-              <w:right w:w="100" w:type="dxa"/>
-            </w:tcMar>
-            <w:hideMark/>
-          </w:tcPr>
-          <w:p>
-            <w:pPr>
-              <w:rPr>
-                <w:lang w:val="en-US"/>
-              </w:rPr>
-            </w:pPr>
-          </w:p>
-        </w:tc>
-        <w:tc>
-          <w:tcPr>
-            <w:tcW w:w="0" w:type="auto"/>
-            <w:tcBorders>
-              <w:top w:val="single" w:sz="8" w:space="0" w:color="000000"/>
-              <w:left w:val="single" w:sz="8" w:space="0" w:color="000000"/>
-              <w:bottom w:val="single" w:sz="8" w:space="0" w:color="000000"/>
-              <w:right w:val="single" w:sz="8" w:space="0" w:color="000000"/>
-            </w:tcBorders>
-            <w:tcMar>
-              <w:top w:w="100" w:type="dxa"/>
-              <w:left w:w="100" w:type="dxa"/>
-              <w:bottom w:w="100" w:type="dxa"/>
-              <w:right w:w="100" w:type="dxa"/>
-            </w:tcMar>
-            <w:hideMark/>
-          </w:tcPr>
-          <w:p>
-            <w:pPr>
-              <w:rPr>
-                <w:lang w:val="en-US"/>
-              </w:rPr>
-            </w:pPr>
-            <w:r>
-              <w:rPr>
-                <w:lang w:val="en-US"/>
-              </w:rPr>
-              <w:t>Require</w:t>
-            </w:r>
-          </w:p>
-        </w:tc>
-        <w:tc>
-          <w:tcPr>
-            <w:tcW w:w="0" w:type="auto"/>
-            <w:tcBorders>
-              <w:top w:val="single" w:sz="8" w:space="0" w:color="000000"/>
-              <w:left w:val="single" w:sz="8" w:space="0" w:color="000000"/>
-              <w:bottom w:val="single" w:sz="8" w:space="0" w:color="000000"/>
-              <w:right w:val="single" w:sz="8" w:space="0" w:color="000000"/>
-            </w:tcBorders>
-            <w:tcMar>
-              <w:top w:w="100" w:type="dxa"/>
-              <w:left w:w="100" w:type="dxa"/>
-              <w:bottom w:w="100" w:type="dxa"/>
-              <w:right w:w="100" w:type="dxa"/>
-            </w:tcMar>
-            <w:hideMark/>
-          </w:tcPr>
-          <w:p>
-            <w:pPr>
-              <w:rPr>
-                <w:lang w:val="en-US"/>
-              </w:rPr>
-            </w:pPr>
-          </w:p>
-        </w:tc>
-      </w:tr>
-      <w:tr>
-        <w:trPr>
-          <w:trHeight w:val="480"/>
-        </w:trPr>
-        <w:tc>
-          <w:tcPr>
-            <w:tcW w:w="0" w:type="auto"/>
-            <w:tcBorders>
-              <w:top w:val="single" w:sz="8" w:space="0" w:color="000000"/>
-              <w:left w:val="single" w:sz="8" w:space="0" w:color="000000"/>
-              <w:bottom w:val="single" w:sz="8" w:space="0" w:color="000000"/>
-              <w:right w:val="single" w:sz="8" w:space="0" w:color="000000"/>
-            </w:tcBorders>
-            <w:tcMar>
-              <w:top w:w="100" w:type="dxa"/>
-              <w:left w:w="100" w:type="dxa"/>
-              <w:bottom w:w="100" w:type="dxa"/>
-              <w:right w:w="100" w:type="dxa"/>
-            </w:tcMar>
-            <w:hideMark/>
-          </w:tcPr>
-          <w:p>
-            <w:pPr>
-              <w:rPr>
-                <w:lang w:val="en-US"/>
-              </w:rPr>
-            </w:pPr>
-            <w:r>
-              <w:rPr>
-                <w:b/>
-                <w:bCs/>
-                <w:lang w:val="en-US"/>
-              </w:rPr>
-              <w:t>5.3</w:t>
-            </w:r>
-          </w:p>
-        </w:tc>
-        <w:tc>
-          <w:tcPr>
-            <w:tcW w:w="0" w:type="auto"/>
-            <w:tcBorders>
-              <w:top w:val="single" w:sz="8" w:space="0" w:color="000000"/>
-              <w:left w:val="single" w:sz="8" w:space="0" w:color="000000"/>
-              <w:bottom w:val="single" w:sz="8" w:space="0" w:color="000000"/>
-              <w:right w:val="single" w:sz="8" w:space="0" w:color="000000"/>
-            </w:tcBorders>
-            <w:tcMar>
-              <w:top w:w="100" w:type="dxa"/>
-              <w:left w:w="100" w:type="dxa"/>
-              <w:bottom w:w="100" w:type="dxa"/>
-              <w:right w:w="100" w:type="dxa"/>
-            </w:tcMar>
-            <w:hideMark/>
-          </w:tcPr>
-          <w:p>
-            <w:pPr>
-              <w:rPr>
-                <w:lang w:val="en-US"/>
-              </w:rPr>
-            </w:pPr>
-            <w:r>
-              <w:rPr>
-                <w:b/>
-                <w:bCs/>
-                <w:lang w:val="en-US"/>
-              </w:rPr>
-              <w:t>Has the depositor assigned an appropriate license to the dataset?</w:t>
-            </w:r>
-          </w:p>
-        </w:tc>
-        <w:tc>
-          <w:tcPr>
-            <w:tcW w:w="0" w:type="auto"/>
-            <w:tcBorders>
-              <w:top w:val="single" w:sz="8" w:space="0" w:color="000000"/>
-              <w:left w:val="single" w:sz="8" w:space="0" w:color="000000"/>
-              <w:bottom w:val="single" w:sz="8" w:space="0" w:color="000000"/>
-              <w:right w:val="single" w:sz="8" w:space="0" w:color="000000"/>
-            </w:tcBorders>
-            <w:tcMar>
-              <w:top w:w="100" w:type="dxa"/>
-              <w:left w:w="100" w:type="dxa"/>
-              <w:bottom w:w="100" w:type="dxa"/>
-              <w:right w:w="100" w:type="dxa"/>
-            </w:tcMar>
-            <w:hideMark/>
-          </w:tcPr>
-          <w:p>
-            <w:pPr>
-              <w:rPr>
-                <w:lang w:val="en-US"/>
-              </w:rPr>
-            </w:pPr>
-            <w:r>
-              <w:rPr>
-                <w:lang w:val="en-US"/>
-              </w:rPr>
-              <w:t>Python scripted.</w:t>
-            </w:r>
-          </w:p>
-          <w:p>
-            <w:pPr>
-              <w:rPr>
-                <w:lang w:val="en-US"/>
-              </w:rPr>
-            </w:pPr>
-            <w:r>
-              <w:rPr>
-                <w:lang w:val="en-US"/>
-              </w:rPr>
-              <w:br/>
-            </w:r>
-          </w:p>
-          <w:p>
-            <w:pPr>
-              <w:numPr>
-                <w:ilvl w:val="0"/>
-                <w:numId w:val="19"/>
-              </w:numPr>
-              <w:rPr>
-                <w:lang w:val="en-US"/>
-              </w:rPr>
-            </w:pPr>
-            <w:r>
-              <w:rPr>
-                <w:lang w:val="en-US"/>
-              </w:rPr>
-              <w:t>If the dataset uses CC0 - confirm this is what the depositor wants.</w:t>
-            </w:r>
-          </w:p>
-          <w:p>
-            <w:pPr>
-              <w:numPr>
-                <w:ilvl w:val="0"/>
-                <w:numId w:val="19"/>
-              </w:numPr>
-              <w:rPr>
-                <w:lang w:val="en-US"/>
-              </w:rPr>
-            </w:pPr>
-            <w:r>
-              <w:rPr>
-                <w:lang w:val="en-US"/>
-              </w:rPr>
-              <w:t xml:space="preserve">Check if the deposit includes restricted </w:t>
-            </w:r>
-            <w:r>
-              <w:rPr>
-                <w:lang w:val="en-US"/>
-              </w:rPr>
-              <w:lastRenderedPageBreak/>
-              <w:t>files (if yes, recommend they use custom terms)</w:t>
-            </w:r>
-          </w:p>
-        </w:tc>
-        <w:tc>
-          <w:tcPr>
-            <w:tcW w:w="0" w:type="auto"/>
-            <w:tcBorders>
-              <w:top w:val="single" w:sz="8" w:space="0" w:color="000000"/>
-              <w:left w:val="single" w:sz="8" w:space="0" w:color="000000"/>
-              <w:bottom w:val="single" w:sz="8" w:space="0" w:color="000000"/>
-              <w:right w:val="single" w:sz="8" w:space="0" w:color="000000"/>
-            </w:tcBorders>
-            <w:tcMar>
-              <w:top w:w="100" w:type="dxa"/>
-              <w:left w:w="100" w:type="dxa"/>
-              <w:bottom w:w="100" w:type="dxa"/>
-              <w:right w:w="100" w:type="dxa"/>
-            </w:tcMar>
-            <w:hideMark/>
-          </w:tcPr>
-          <w:p>
-            <w:pPr>
-              <w:rPr>
-                <w:lang w:val="en-US"/>
-              </w:rPr>
-            </w:pPr>
-          </w:p>
-        </w:tc>
-        <w:tc>
-          <w:tcPr>
-            <w:tcW w:w="0" w:type="auto"/>
-            <w:tcBorders>
-              <w:top w:val="single" w:sz="8" w:space="0" w:color="000000"/>
-              <w:left w:val="single" w:sz="8" w:space="0" w:color="000000"/>
-              <w:bottom w:val="single" w:sz="8" w:space="0" w:color="000000"/>
-              <w:right w:val="single" w:sz="8" w:space="0" w:color="000000"/>
-            </w:tcBorders>
-            <w:tcMar>
-              <w:top w:w="100" w:type="dxa"/>
-              <w:left w:w="100" w:type="dxa"/>
-              <w:bottom w:w="100" w:type="dxa"/>
-              <w:right w:w="100" w:type="dxa"/>
-            </w:tcMar>
-            <w:hideMark/>
-          </w:tcPr>
-          <w:p>
-            <w:pPr>
-              <w:rPr>
-                <w:lang w:val="en-US"/>
-              </w:rPr>
-            </w:pPr>
-          </w:p>
-        </w:tc>
-        <w:tc>
-          <w:tcPr>
-            <w:tcW w:w="0" w:type="auto"/>
-            <w:tcBorders>
-              <w:top w:val="single" w:sz="8" w:space="0" w:color="000000"/>
-              <w:left w:val="single" w:sz="8" w:space="0" w:color="000000"/>
-              <w:bottom w:val="single" w:sz="8" w:space="0" w:color="000000"/>
-              <w:right w:val="single" w:sz="8" w:space="0" w:color="000000"/>
-            </w:tcBorders>
-            <w:tcMar>
-              <w:top w:w="100" w:type="dxa"/>
-              <w:left w:w="100" w:type="dxa"/>
-              <w:bottom w:w="100" w:type="dxa"/>
-              <w:right w:w="100" w:type="dxa"/>
-            </w:tcMar>
-            <w:hideMark/>
-          </w:tcPr>
-          <w:p>
-            <w:pPr>
-              <w:rPr>
-                <w:lang w:val="en-US"/>
-              </w:rPr>
-            </w:pPr>
-          </w:p>
-        </w:tc>
-        <w:tc>
-          <w:tcPr>
-            <w:tcW w:w="0" w:type="auto"/>
-            <w:tcBorders>
-              <w:top w:val="single" w:sz="8" w:space="0" w:color="000000"/>
-              <w:left w:val="single" w:sz="8" w:space="0" w:color="000000"/>
-              <w:bottom w:val="single" w:sz="8" w:space="0" w:color="000000"/>
-              <w:right w:val="single" w:sz="8" w:space="0" w:color="000000"/>
-            </w:tcBorders>
-            <w:tcMar>
-              <w:top w:w="100" w:type="dxa"/>
-              <w:left w:w="100" w:type="dxa"/>
-              <w:bottom w:w="100" w:type="dxa"/>
-              <w:right w:w="100" w:type="dxa"/>
-            </w:tcMar>
-            <w:hideMark/>
-          </w:tcPr>
-          <w:p>
-            <w:pPr>
-              <w:rPr>
-                <w:lang w:val="en-US"/>
-              </w:rPr>
-            </w:pPr>
-          </w:p>
-        </w:tc>
-        <w:tc>
-          <w:tcPr>
-            <w:tcW w:w="0" w:type="auto"/>
-            <w:tcBorders>
-              <w:top w:val="single" w:sz="8" w:space="0" w:color="000000"/>
-              <w:left w:val="single" w:sz="8" w:space="0" w:color="000000"/>
-              <w:bottom w:val="single" w:sz="8" w:space="0" w:color="000000"/>
-              <w:right w:val="single" w:sz="8" w:space="0" w:color="000000"/>
-            </w:tcBorders>
-            <w:tcMar>
-              <w:top w:w="100" w:type="dxa"/>
-              <w:left w:w="100" w:type="dxa"/>
-              <w:bottom w:w="100" w:type="dxa"/>
-              <w:right w:w="100" w:type="dxa"/>
-            </w:tcMar>
-            <w:hideMark/>
-          </w:tcPr>
-          <w:p>
-            <w:pPr>
-              <w:rPr>
-                <w:lang w:val="en-US"/>
-              </w:rPr>
-            </w:pPr>
-          </w:p>
-        </w:tc>
-        <w:tc>
-          <w:tcPr>
-            <w:tcW w:w="0" w:type="auto"/>
-            <w:tcBorders>
-              <w:top w:val="single" w:sz="8" w:space="0" w:color="000000"/>
-              <w:left w:val="single" w:sz="8" w:space="0" w:color="000000"/>
-              <w:bottom w:val="single" w:sz="8" w:space="0" w:color="000000"/>
-              <w:right w:val="single" w:sz="8" w:space="0" w:color="000000"/>
-            </w:tcBorders>
-            <w:tcMar>
-              <w:top w:w="100" w:type="dxa"/>
-              <w:left w:w="100" w:type="dxa"/>
-              <w:bottom w:w="100" w:type="dxa"/>
-              <w:right w:w="100" w:type="dxa"/>
-            </w:tcMar>
-            <w:hideMark/>
-          </w:tcPr>
-          <w:p>
-            <w:pPr>
-              <w:rPr>
-                <w:lang w:val="en-US"/>
-              </w:rPr>
-            </w:pPr>
-            <w:r>
-              <w:rPr>
-                <w:lang w:val="en-US"/>
-              </w:rPr>
-              <w:t>List any restricted files in this dataset:</w:t>
-            </w:r>
-          </w:p>
-          <w:p>
-            <w:pPr>
-              <w:numPr>
-                <w:ilvl w:val="0"/>
-                <w:numId w:val="20"/>
-              </w:numPr>
-              <w:rPr>
-                <w:lang w:val="en-US"/>
-              </w:rPr>
-            </w:pPr>
-          </w:p>
-          <w:p>
-            <w:pPr>
-              <w:rPr>
-                <w:b/>
-                <w:bCs/>
-                <w:color w:val="FF0000"/>
-                <w:sz w:val="40"/>
-                <w:szCs w:val="40"/>
-                <w:lang w:val="en-US"/>
-              </w:rPr>
-            </w:pPr>
-            <w:r>
-              <w:rPr>
-                <w:rFonts w:hint="eastAsia"/>
-                <w:b/>
-                <w:bCs/>
-                <w:color w:val="FF0000"/>
-                <w:sz w:val="40"/>
-                <w:szCs w:val="40"/>
-                <w:lang w:val="en-US"/>
-              </w:rPr>
-              <w:t>TBD</w:t>
-            </w:r>
-          </w:p>
-          <w:p>
-            <w:pPr>
-              <w:rPr>
-                <w:lang w:val="en-US"/>
-              </w:rPr>
-            </w:pPr>
-            <w:r>
-              <w:rPr>
-                <w:lang w:val="en-US"/>
-              </w:rPr>
-              <w:t>License applied to dataset:</w:t>
-            </w:r>
-          </w:p>
-          <w:p>
-            <w:pPr>
-              <w:rPr>
-                <w:lang w:val="en-US"/>
-              </w:rPr>
-            </w:pPr>
-          </w:p>
-          <w:p>
-            <w:pPr>
-              <w:rPr>
-                <w:b/>
-                <w:bCs/>
-                <w:color w:val="FF0000"/>
-                <w:sz w:val="40"/>
-                <w:szCs w:val="40"/>
-                <w:lang w:val="en-US"/>
-              </w:rPr>
-            </w:pPr>
-            <w:r>
-              <w:rPr>
-                <w:rFonts w:hint="eastAsia"/>
-                <w:b/>
-                <w:bCs/>
-                <w:color w:val="FF0000"/>
-                <w:sz w:val="40"/>
-                <w:szCs w:val="40"/>
-                <w:lang w:val="en-US"/>
-              </w:rPr>
-              <w:t>TBD</w:t>
-            </w:r>
-          </w:p>
-          <w:p>
-            <w:pPr>
-              <w:rPr>
-                <w:lang w:val="en-US"/>
-              </w:rPr>
-            </w:pPr>
-          </w:p>
-        </w:tc>
-        <w:tc>
-          <w:tcPr>
-            <w:tcW w:w="0" w:type="auto"/>
-            <w:tcBorders>
-              <w:top w:val="single" w:sz="8" w:space="0" w:color="000000"/>
-              <w:left w:val="single" w:sz="8" w:space="0" w:color="000000"/>
-              <w:bottom w:val="single" w:sz="8" w:space="0" w:color="000000"/>
-              <w:right w:val="single" w:sz="8" w:space="0" w:color="000000"/>
-            </w:tcBorders>
-            <w:tcMar>
-              <w:top w:w="100" w:type="dxa"/>
-              <w:left w:w="100" w:type="dxa"/>
-              <w:bottom w:w="100" w:type="dxa"/>
-              <w:right w:w="100" w:type="dxa"/>
-            </w:tcMar>
-            <w:hideMark/>
-          </w:tcPr>
-          <w:p>
-            <w:pPr>
-              <w:rPr>
-                <w:lang w:val="en-US"/>
-              </w:rPr>
-            </w:pPr>
-            <w:r>
-              <w:rPr>
-                <w:lang w:val="en-US"/>
-              </w:rPr>
-              <w:t>Require</w:t>
-            </w:r>
-          </w:p>
-        </w:tc>
-        <w:tc>
-          <w:tcPr>
-            <w:tcW w:w="0" w:type="auto"/>
-            <w:tcBorders>
-              <w:top w:val="single" w:sz="8" w:space="0" w:color="000000"/>
-              <w:left w:val="single" w:sz="8" w:space="0" w:color="000000"/>
-              <w:bottom w:val="single" w:sz="8" w:space="0" w:color="000000"/>
-              <w:right w:val="single" w:sz="8" w:space="0" w:color="000000"/>
-            </w:tcBorders>
-            <w:tcMar>
-              <w:top w:w="100" w:type="dxa"/>
-              <w:left w:w="100" w:type="dxa"/>
-              <w:bottom w:w="100" w:type="dxa"/>
-              <w:right w:w="100" w:type="dxa"/>
-            </w:tcMar>
-            <w:hideMark/>
-          </w:tcPr>
-          <w:p>
-            <w:pPr>
-              <w:rPr>
-                <w:lang w:val="en-US"/>
-              </w:rPr>
-            </w:pPr>
-            <w:r>
-              <w:rPr>
-                <w:lang w:val="en-US"/>
-              </w:rPr>
-              <w:t>Python scripted</w:t>
-            </w:r>
-          </w:p>
-        </w:tc>
-      </w:tr>
-      <w:tr>
-        <w:trPr>
-          <w:trHeight w:val="480"/>
-        </w:trPr>
-        <w:tc>
-          <w:tcPr>
-            <w:tcW w:w="0" w:type="auto"/>
-            <w:tcBorders>
-              <w:top w:val="single" w:sz="8" w:space="0" w:color="000000"/>
-              <w:left w:val="single" w:sz="8" w:space="0" w:color="000000"/>
-              <w:bottom w:val="single" w:sz="8" w:space="0" w:color="000000"/>
-              <w:right w:val="single" w:sz="8" w:space="0" w:color="000000"/>
-            </w:tcBorders>
             <w:tcMar>
               <w:top w:w="100" w:type="dxa"/>
               <w:left w:w="100" w:type="dxa"/>
@@ -9061,7 +9396,21 @@
               <w:rPr>
                 <w:lang w:val="en-US"/>
               </w:rPr>
-              <w:t>If there are restricted files and no Terms of Access, recommend including terms of access.</w:t>
+              <w:t xml:space="preserve">If there are restricted files and no Terms of Access, </w:t>
+            </w:r>
+            <w:proofErr w:type="gramStart"/>
+            <w:r>
+              <w:rPr>
+                <w:lang w:val="en-US"/>
+              </w:rPr>
+              <w:t>recommend</w:t>
+            </w:r>
+            <w:proofErr w:type="gramEnd"/>
+            <w:r>
+              <w:rPr>
+                <w:lang w:val="en-US"/>
+              </w:rPr>
+              <w:t xml:space="preserve"> including terms of access.</w:t>
             </w:r>
           </w:p>
         </w:tc>

</xml_diff>

<commit_message>
1. Deleted unnecessary fields in template.json 2. Updated template_new.docx for formatting
</commit_message>
<xml_diff>
--- a/res/template_new.docx
+++ b/res/template_new.docx
@@ -7106,19 +7106,6 @@
           </w:p>
           <w:p>
             <w:pPr>
-              <w:rPr>
-                <w:lang w:val="en-US"/>
-              </w:rPr>
-            </w:pPr>
-            <w:r>
-              <w:rPr>
-                <w:lang w:val="en-US"/>
-              </w:rPr>
-              <w:br/>
-            </w:r>
-          </w:p>
-          <w:p>
-            <w:pPr>
               <w:numPr>
                 <w:ilvl w:val="0"/>
                 <w:numId w:val="14"/>
@@ -8254,8 +8241,14 @@
               <w:rPr>
                 <w:lang w:val="en-US"/>
               </w:rPr>
+              <w:t xml:space="preserve">Review description, notes, and terms </w:t>
+            </w:r>
+            <w:r>
+              <w:rPr>
+                <w:lang w:val="en-US"/>
+              </w:rPr>
               <w:lastRenderedPageBreak/>
-              <w:t>Review description, notes, and terms of access metadata fields.</w:t>
+              <w:t>of access metadata fields.</w:t>
             </w:r>
           </w:p>
         </w:tc>
@@ -8911,19 +8904,6 @@
           </w:p>
           <w:p>
             <w:pPr>
-              <w:rPr>
-                <w:lang w:val="en-US"/>
-              </w:rPr>
-            </w:pPr>
-            <w:r>
-              <w:rPr>
-                <w:lang w:val="en-US"/>
-              </w:rPr>
-              <w:br/>
-            </w:r>
-          </w:p>
-          <w:p>
-            <w:pPr>
               <w:numPr>
                 <w:ilvl w:val="0"/>
                 <w:numId w:val="19"/>
@@ -8953,14 +8933,7 @@
               <w:rPr>
                 <w:lang w:val="en-US"/>
               </w:rPr>
-              <w:t>Check if the deposit includes restricted files (if yes, recomme</w:t>
-            </w:r>
-            <w:r>
-              <w:rPr>
-                <w:lang w:val="en-US"/>
-              </w:rPr>
-              <w:lastRenderedPageBreak/>
-              <w:t>nd they use custom terms)</w:t>
+              <w:t>Check if the deposit includes restricted files (if yes, recommend they use custom terms)</w:t>
             </w:r>
           </w:p>
         </w:tc>
@@ -9302,6 +9275,7 @@
                 <w:bCs/>
                 <w:lang w:val="en-US"/>
               </w:rPr>
+              <w:lastRenderedPageBreak/>
               <w:t>5.4a</w:t>
             </w:r>
           </w:p>
@@ -9375,12 +9349,6 @@
                 <w:lang w:val="en-US"/>
               </w:rPr>
             </w:pPr>
-            <w:r>
-              <w:rPr>
-                <w:lang w:val="en-US"/>
-              </w:rPr>
-              <w:br/>
-            </w:r>
           </w:p>
           <w:p>
             <w:pPr>

</xml_diff>

<commit_message>
1. Added support for catching restricted files. 2. Fixed formatting of res/template_new.docx
</commit_message>
<xml_diff>
--- a/res/template_new.docx
+++ b/res/template_new.docx
@@ -30,14 +30,7 @@
         <w:rPr>
           <w:rFonts w:hint="eastAsia"/>
         </w:rPr>
-        <w:t xml:space="preserve">Ticket number: </w:t>
-      </w:r>
-      <w:proofErr w:type="gramStart"/>
-      <w:r>
-        <w:rPr>
-          <w:rFonts w:hint="eastAsia"/>
-        </w:rPr>
-        <w:t>{</w:t>
+        <w:t>Ticket number: {</w:t>
       </w:r>
       <w:r>
         <w:rPr>
@@ -51,13 +44,8 @@
         </w:rPr>
         <w:t xml:space="preserve"> </w:t>
       </w:r>
-      <w:proofErr w:type="spellStart"/>
       <w:r>
-        <w:t>project</w:t>
-      </w:r>
-      <w:proofErr w:type="gramEnd"/>
-      <w:r>
-        <w:t>_info</w:t>
+        <w:t>project_info</w:t>
       </w:r>
       <w:r>
         <w:rPr>
@@ -68,7 +56,6 @@
       <w:r>
         <w:t>ticket_number</w:t>
       </w:r>
-      <w:proofErr w:type="spellEnd"/>
       <w:r>
         <w:rPr>
           <w:rFonts w:hint="eastAsia"/>
@@ -99,35 +86,16 @@
         <w:rPr>
           <w:rFonts w:hint="eastAsia"/>
         </w:rPr>
-        <w:t xml:space="preserve"> </w:t>
+        <w:t xml:space="preserve"> {{ </w:t>
       </w:r>
-      <w:proofErr w:type="gramStart"/>
       <w:r>
-        <w:rPr>
-          <w:rFonts w:hint="eastAsia"/>
-        </w:rPr>
-        <w:t xml:space="preserve">{{ </w:t>
-      </w:r>
-      <w:proofErr w:type="spellStart"/>
-      <w:r>
-        <w:t>project</w:t>
-      </w:r>
-      <w:proofErr w:type="gramEnd"/>
-      <w:r>
-        <w:t>_info</w:t>
+        <w:t>project_info</w:t>
       </w:r>
       <w:r>
         <w:rPr>
           <w:rFonts w:hint="eastAsia"/>
         </w:rPr>
-        <w:t>.curator_name</w:t>
-      </w:r>
-      <w:proofErr w:type="spellEnd"/>
-      <w:r>
-        <w:rPr>
-          <w:rFonts w:hint="eastAsia"/>
-        </w:rPr>
-        <w:t xml:space="preserve"> }}</w:t>
+        <w:t>.curator_name }}</w:t>
       </w:r>
     </w:p>
     <w:p>
@@ -135,22 +103,10 @@
         <w:rPr>
           <w:rFonts w:hint="eastAsia"/>
         </w:rPr>
-        <w:t xml:space="preserve">Curator email: </w:t>
+        <w:t xml:space="preserve">Curator email: {{ </w:t>
       </w:r>
-      <w:proofErr w:type="gramStart"/>
       <w:r>
-        <w:rPr>
-          <w:rFonts w:hint="eastAsia"/>
-        </w:rPr>
-        <w:t xml:space="preserve">{{ </w:t>
-      </w:r>
-      <w:proofErr w:type="spellStart"/>
-      <w:r>
-        <w:t>project</w:t>
-      </w:r>
-      <w:proofErr w:type="gramEnd"/>
-      <w:r>
-        <w:t>_info</w:t>
+        <w:t>project_info</w:t>
       </w:r>
       <w:r>
         <w:rPr>
@@ -161,7 +117,6 @@
       <w:r>
         <w:t>curator_email</w:t>
       </w:r>
-      <w:proofErr w:type="spellEnd"/>
       <w:r>
         <w:rPr>
           <w:rFonts w:hint="eastAsia"/>
@@ -176,31 +131,21 @@
         </w:rPr>
         <w:t xml:space="preserve">Dataset title: </w:t>
       </w:r>
-      <w:proofErr w:type="gramStart"/>
       <w:r>
         <w:rPr>
           <w:rFonts w:hint="eastAsia"/>
         </w:rPr>
         <w:t xml:space="preserve">{{ </w:t>
       </w:r>
-      <w:proofErr w:type="spellStart"/>
       <w:r>
         <w:rPr>
           <w:rFonts w:hint="eastAsia"/>
         </w:rPr>
-        <w:t>dataset</w:t>
-      </w:r>
-      <w:proofErr w:type="gramEnd"/>
-      <w:r>
-        <w:rPr>
-          <w:rFonts w:hint="eastAsia"/>
-        </w:rPr>
-        <w:t>.</w:t>
+        <w:t>dataset.</w:t>
       </w:r>
       <w:r>
         <w:t>DatasetTitle</w:t>
       </w:r>
-      <w:proofErr w:type="spellEnd"/>
       <w:r>
         <w:rPr>
           <w:rFonts w:hint="eastAsia"/>
@@ -234,14 +179,7 @@
         <w:rPr>
           <w:rFonts w:hint="eastAsia"/>
         </w:rPr>
-        <w:t xml:space="preserve">: </w:t>
-      </w:r>
-      <w:proofErr w:type="gramStart"/>
-      <w:r>
-        <w:rPr>
-          <w:rFonts w:hint="eastAsia"/>
-        </w:rPr>
-        <w:t>{</w:t>
+        <w:t>: {</w:t>
       </w:r>
       <w:r>
         <w:rPr>
@@ -255,24 +193,15 @@
         </w:rPr>
         <w:t xml:space="preserve"> </w:t>
       </w:r>
-      <w:proofErr w:type="spellStart"/>
       <w:r>
         <w:rPr>
           <w:rFonts w:hint="eastAsia"/>
         </w:rPr>
-        <w:t>dataset</w:t>
-      </w:r>
-      <w:proofErr w:type="gramEnd"/>
-      <w:r>
-        <w:rPr>
-          <w:rFonts w:hint="eastAsia"/>
-        </w:rPr>
-        <w:t>.</w:t>
+        <w:t>dataset.</w:t>
       </w:r>
       <w:r>
         <w:t>DatasetPersistentId</w:t>
       </w:r>
-      <w:proofErr w:type="spellEnd"/>
       <w:r>
         <w:rPr>
           <w:rFonts w:hint="eastAsia"/>
@@ -291,21 +220,7 @@
         <w:rPr>
           <w:rFonts w:hint="eastAsia"/>
         </w:rPr>
-        <w:t xml:space="preserve">Dataset ID (versioned): </w:t>
-      </w:r>
-      <w:proofErr w:type="gramStart"/>
-      <w:r>
-        <w:rPr>
-          <w:rFonts w:hint="eastAsia"/>
-        </w:rPr>
-        <w:t>{{ dataset.ID</w:t>
-      </w:r>
-      <w:proofErr w:type="gramEnd"/>
-      <w:r>
-        <w:rPr>
-          <w:rFonts w:hint="eastAsia"/>
-        </w:rPr>
-        <w:t xml:space="preserve">  }}</w:t>
+        <w:t>Dataset ID (versioned): {{ dataset.ID  }}</w:t>
       </w:r>
     </w:p>
     <w:p>
@@ -313,14 +228,7 @@
         <w:rPr>
           <w:rFonts w:hint="eastAsia"/>
         </w:rPr>
-        <w:t xml:space="preserve">Dataset access URL: </w:t>
-      </w:r>
-      <w:proofErr w:type="gramStart"/>
-      <w:r>
-        <w:rPr>
-          <w:rFonts w:hint="eastAsia"/>
-        </w:rPr>
-        <w:t>{</w:t>
+        <w:t>Dataset access URL: {</w:t>
       </w:r>
       <w:r>
         <w:rPr>
@@ -332,26 +240,11 @@
         <w:rPr>
           <w:rFonts w:hint="eastAsia"/>
         </w:rPr>
-        <w:t xml:space="preserve"> </w:t>
-      </w:r>
-      <w:proofErr w:type="spellStart"/>
-      <w:r>
-        <w:rPr>
-          <w:rFonts w:hint="eastAsia"/>
-        </w:rPr>
-        <w:t>dataset</w:t>
-      </w:r>
-      <w:proofErr w:type="gramEnd"/>
-      <w:r>
-        <w:rPr>
-          <w:rFonts w:hint="eastAsia"/>
-        </w:rPr>
-        <w:t>.</w:t>
+        <w:t xml:space="preserve"> dataset.</w:t>
       </w:r>
       <w:r>
         <w:t>DatasetURL</w:t>
       </w:r>
-      <w:proofErr w:type="spellEnd"/>
       <w:r>
         <w:rPr>
           <w:rFonts w:hint="eastAsia"/>
@@ -399,7 +292,6 @@
         </w:rPr>
         <w:t xml:space="preserve">date: </w:t>
       </w:r>
-      <w:proofErr w:type="gramStart"/>
       <w:r>
         <w:rPr>
           <w:rFonts w:hint="eastAsia"/>
@@ -424,7 +316,6 @@
         </w:rPr>
         <w:t>timestamp</w:t>
       </w:r>
-      <w:proofErr w:type="gramEnd"/>
       <w:r>
         <w:rPr>
           <w:rFonts w:hint="eastAsia"/>
@@ -1145,25 +1036,7 @@
                 <w:bCs/>
                 <w:lang w:val="en-US"/>
               </w:rPr>
-              <w:t xml:space="preserve">Has the depositor (or their research group) previously created or submitted to a </w:t>
-            </w:r>
-            <w:proofErr w:type="spellStart"/>
-            <w:r>
-              <w:rPr>
-                <w:b/>
-                <w:bCs/>
-                <w:lang w:val="en-US"/>
-              </w:rPr>
-              <w:t>dataverse</w:t>
-            </w:r>
-            <w:proofErr w:type="spellEnd"/>
-            <w:r>
-              <w:rPr>
-                <w:b/>
-                <w:bCs/>
-                <w:lang w:val="en-US"/>
-              </w:rPr>
-              <w:t>?</w:t>
+              <w:t>Has the depositor (or their research group) previously created or submitted to a dataverse?</w:t>
             </w:r>
           </w:p>
         </w:tc>
@@ -1225,14 +1098,7 @@
               <w:rPr>
                 <w:lang w:val="en-US"/>
               </w:rPr>
-              <w:t xml:space="preserve">{% if </w:t>
-            </w:r>
-            <w:proofErr w:type="spellStart"/>
-            <w:r>
-              <w:rPr>
-                <w:lang w:val="en-US"/>
-              </w:rPr>
-              <w:t>template_dict.</w:t>
+              <w:t>{% if template_dict.</w:t>
             </w:r>
             <w:r>
               <w:rPr>
@@ -1245,373 +1111,246 @@
               <w:rPr>
                 <w:lang w:val="en-US"/>
               </w:rPr>
-              <w:t>.comments|length</w:t>
-            </w:r>
-            <w:proofErr w:type="spellEnd"/>
-            <w:r>
-              <w:rPr>
-                <w:lang w:val="en-US"/>
+              <w:t xml:space="preserve">.comments|length </w:t>
+            </w:r>
+            <w:r>
+              <w:rPr>
+                <w:rFonts w:hint="eastAsia"/>
+                <w:lang w:val="en-US"/>
+              </w:rPr>
+              <w:t>&gt;</w:t>
+            </w:r>
+            <w:r>
+              <w:rPr>
+                <w:lang w:val="en-US"/>
+              </w:rPr>
+              <w:t xml:space="preserve"> 0 %}X{% endif %}</w:t>
+            </w:r>
+          </w:p>
+          <w:p>
+            <w:pPr>
+              <w:rPr>
+                <w:lang w:val="en-US"/>
+              </w:rPr>
+            </w:pPr>
+          </w:p>
+        </w:tc>
+        <w:tc>
+          <w:tcPr>
+            <w:tcW w:w="0" w:type="auto"/>
+            <w:tcBorders>
+              <w:top w:val="single" w:sz="8" w:space="0" w:color="000000"/>
+              <w:left w:val="single" w:sz="8" w:space="0" w:color="000000"/>
+              <w:bottom w:val="single" w:sz="8" w:space="0" w:color="000000"/>
+              <w:right w:val="single" w:sz="8" w:space="0" w:color="000000"/>
+            </w:tcBorders>
+            <w:tcMar>
+              <w:top w:w="100" w:type="dxa"/>
+              <w:left w:w="100" w:type="dxa"/>
+              <w:bottom w:w="100" w:type="dxa"/>
+              <w:right w:w="100" w:type="dxa"/>
+            </w:tcMar>
+            <w:hideMark/>
+          </w:tcPr>
+          <w:p>
+            <w:pPr>
+              <w:rPr>
+                <w:lang w:val="en-US"/>
+              </w:rPr>
+            </w:pPr>
+            <w:r>
+              <w:rPr>
+                <w:lang w:val="en-US"/>
+              </w:rPr>
+              <w:t>{% if template_dict.</w:t>
+            </w:r>
+            <w:r>
+              <w:rPr>
+                <w:rFonts w:hint="eastAsia"/>
+                <w:lang w:val="en-US"/>
+              </w:rPr>
+              <w:t>dv_record</w:t>
+            </w:r>
+            <w:r>
+              <w:rPr>
+                <w:lang w:val="en-US"/>
+              </w:rPr>
+              <w:t xml:space="preserve">.comments|length </w:t>
+            </w:r>
+            <w:r>
+              <w:rPr>
+                <w:rFonts w:hint="eastAsia"/>
+                <w:lang w:val="en-US"/>
+              </w:rPr>
+              <w:t>==</w:t>
+            </w:r>
+            <w:r>
+              <w:rPr>
+                <w:lang w:val="en-US"/>
+              </w:rPr>
+              <w:t xml:space="preserve"> 0 %}X{% endif %}</w:t>
+            </w:r>
+          </w:p>
+          <w:p>
+            <w:pPr>
+              <w:rPr>
+                <w:lang w:val="en-US"/>
+              </w:rPr>
+            </w:pPr>
+          </w:p>
+        </w:tc>
+        <w:tc>
+          <w:tcPr>
+            <w:tcW w:w="0" w:type="auto"/>
+            <w:tcBorders>
+              <w:top w:val="single" w:sz="8" w:space="0" w:color="000000"/>
+              <w:left w:val="single" w:sz="8" w:space="0" w:color="000000"/>
+              <w:bottom w:val="single" w:sz="8" w:space="0" w:color="000000"/>
+              <w:right w:val="single" w:sz="8" w:space="0" w:color="000000"/>
+            </w:tcBorders>
+            <w:tcMar>
+              <w:top w:w="100" w:type="dxa"/>
+              <w:left w:w="100" w:type="dxa"/>
+              <w:bottom w:w="100" w:type="dxa"/>
+              <w:right w:w="100" w:type="dxa"/>
+            </w:tcMar>
+            <w:hideMark/>
+          </w:tcPr>
+          <w:p>
+            <w:pPr>
+              <w:rPr>
+                <w:lang w:val="en-US"/>
+              </w:rPr>
+            </w:pPr>
+          </w:p>
+        </w:tc>
+        <w:tc>
+          <w:tcPr>
+            <w:tcW w:w="0" w:type="auto"/>
+            <w:tcBorders>
+              <w:top w:val="single" w:sz="8" w:space="0" w:color="000000"/>
+              <w:left w:val="single" w:sz="8" w:space="0" w:color="000000"/>
+              <w:bottom w:val="single" w:sz="8" w:space="0" w:color="000000"/>
+              <w:right w:val="single" w:sz="8" w:space="0" w:color="000000"/>
+            </w:tcBorders>
+            <w:tcMar>
+              <w:top w:w="100" w:type="dxa"/>
+              <w:left w:w="100" w:type="dxa"/>
+              <w:bottom w:w="100" w:type="dxa"/>
+              <w:right w:w="100" w:type="dxa"/>
+            </w:tcMar>
+            <w:hideMark/>
+          </w:tcPr>
+          <w:p>
+            <w:pPr>
+              <w:rPr>
+                <w:lang w:val="en-US"/>
+              </w:rPr>
+            </w:pPr>
+          </w:p>
+        </w:tc>
+        <w:tc>
+          <w:tcPr>
+            <w:tcW w:w="0" w:type="auto"/>
+            <w:tcBorders>
+              <w:top w:val="single" w:sz="8" w:space="0" w:color="000000"/>
+              <w:left w:val="single" w:sz="8" w:space="0" w:color="000000"/>
+              <w:bottom w:val="single" w:sz="8" w:space="0" w:color="000000"/>
+              <w:right w:val="single" w:sz="8" w:space="0" w:color="000000"/>
+            </w:tcBorders>
+            <w:tcMar>
+              <w:top w:w="100" w:type="dxa"/>
+              <w:left w:w="100" w:type="dxa"/>
+              <w:bottom w:w="100" w:type="dxa"/>
+              <w:right w:w="100" w:type="dxa"/>
+            </w:tcMar>
+            <w:hideMark/>
+          </w:tcPr>
+          <w:p>
+            <w:pPr>
+              <w:rPr>
+                <w:lang w:val="en-US"/>
+              </w:rPr>
+            </w:pPr>
+          </w:p>
+        </w:tc>
+        <w:tc>
+          <w:tcPr>
+            <w:tcW w:w="0" w:type="auto"/>
+            <w:tcBorders>
+              <w:top w:val="single" w:sz="8" w:space="0" w:color="000000"/>
+              <w:left w:val="single" w:sz="8" w:space="0" w:color="000000"/>
+              <w:bottom w:val="single" w:sz="8" w:space="0" w:color="000000"/>
+              <w:right w:val="single" w:sz="8" w:space="0" w:color="000000"/>
+            </w:tcBorders>
+            <w:tcMar>
+              <w:top w:w="100" w:type="dxa"/>
+              <w:left w:w="100" w:type="dxa"/>
+              <w:bottom w:w="100" w:type="dxa"/>
+              <w:right w:w="100" w:type="dxa"/>
+            </w:tcMar>
+            <w:hideMark/>
+          </w:tcPr>
+          <w:p>
+            <w:pPr>
+              <w:rPr>
+                <w:lang w:val="en-US"/>
+              </w:rPr>
+            </w:pPr>
+            <w:r>
+              <w:rPr>
+                <w:lang w:val="en-US"/>
+              </w:rPr>
+              <w:t>If relevant, list previously created dataverse:</w:t>
+            </w:r>
+            <w:r>
+              <w:rPr>
+                <w:lang w:val="en-US"/>
+              </w:rPr>
+              <w:br/>
+            </w:r>
+            <w:r>
+              <w:t xml:space="preserve">{% for item in template_dict.dv_record.comments %} </w:t>
+            </w:r>
+          </w:p>
+          <w:p>
+            <w:r>
+              <w:t>{% for author, dataverses in item.items() %} {{ author }}</w:t>
+            </w:r>
+            <w:r>
+              <w:rPr>
+                <w:rFonts w:hint="eastAsia"/>
+              </w:rPr>
+              <w:t>:</w:t>
+            </w:r>
+          </w:p>
+          <w:p>
+            <w:r>
+              <w:t xml:space="preserve">{% for dataverse in dataverses %} </w:t>
+            </w:r>
+            <w:r>
+              <w:t>{{ loop.index }}.</w:t>
+            </w:r>
+            <w:r>
+              <w:rPr>
+                <w:rFonts w:hint="eastAsia"/>
               </w:rPr>
               <w:t xml:space="preserve"> </w:t>
             </w:r>
             <w:r>
-              <w:rPr>
-                <w:rFonts w:hint="eastAsia"/>
-                <w:lang w:val="en-US"/>
-              </w:rPr>
-              <w:t>&gt;</w:t>
-            </w:r>
-            <w:r>
-              <w:rPr>
-                <w:lang w:val="en-US"/>
-              </w:rPr>
-              <w:t xml:space="preserve"> 0 %}X{% endif %}</w:t>
-            </w:r>
-          </w:p>
-          <w:p>
-            <w:pPr>
-              <w:rPr>
-                <w:lang w:val="en-US"/>
-              </w:rPr>
-            </w:pPr>
-          </w:p>
-        </w:tc>
-        <w:tc>
-          <w:tcPr>
-            <w:tcW w:w="0" w:type="auto"/>
-            <w:tcBorders>
-              <w:top w:val="single" w:sz="8" w:space="0" w:color="000000"/>
-              <w:left w:val="single" w:sz="8" w:space="0" w:color="000000"/>
-              <w:bottom w:val="single" w:sz="8" w:space="0" w:color="000000"/>
-              <w:right w:val="single" w:sz="8" w:space="0" w:color="000000"/>
-            </w:tcBorders>
-            <w:tcMar>
-              <w:top w:w="100" w:type="dxa"/>
-              <w:left w:w="100" w:type="dxa"/>
-              <w:bottom w:w="100" w:type="dxa"/>
-              <w:right w:w="100" w:type="dxa"/>
-            </w:tcMar>
-            <w:hideMark/>
-          </w:tcPr>
-          <w:p>
-            <w:pPr>
-              <w:rPr>
-                <w:lang w:val="en-US"/>
-              </w:rPr>
-            </w:pPr>
-            <w:r>
-              <w:rPr>
-                <w:lang w:val="en-US"/>
-              </w:rPr>
-              <w:t xml:space="preserve">{% if </w:t>
-            </w:r>
-            <w:proofErr w:type="spellStart"/>
-            <w:r>
-              <w:rPr>
-                <w:lang w:val="en-US"/>
-              </w:rPr>
-              <w:t>template_dict.</w:t>
-            </w:r>
-            <w:r>
-              <w:rPr>
-                <w:rFonts w:hint="eastAsia"/>
-                <w:lang w:val="en-US"/>
-              </w:rPr>
-              <w:t>dv_record</w:t>
-            </w:r>
-            <w:r>
-              <w:rPr>
-                <w:lang w:val="en-US"/>
-              </w:rPr>
-              <w:t>.comments|length</w:t>
-            </w:r>
-            <w:proofErr w:type="spellEnd"/>
-            <w:r>
-              <w:rPr>
-                <w:lang w:val="en-US"/>
-              </w:rPr>
-              <w:t xml:space="preserve"> </w:t>
-            </w:r>
-            <w:r>
-              <w:rPr>
-                <w:rFonts w:hint="eastAsia"/>
-                <w:lang w:val="en-US"/>
-              </w:rPr>
-              <w:t>==</w:t>
-            </w:r>
-            <w:r>
-              <w:rPr>
-                <w:lang w:val="en-US"/>
-              </w:rPr>
-              <w:t xml:space="preserve"> 0 %}X{% endif %}</w:t>
-            </w:r>
-          </w:p>
-          <w:p>
-            <w:pPr>
-              <w:rPr>
-                <w:lang w:val="en-US"/>
-              </w:rPr>
-            </w:pPr>
-          </w:p>
-        </w:tc>
-        <w:tc>
-          <w:tcPr>
-            <w:tcW w:w="0" w:type="auto"/>
-            <w:tcBorders>
-              <w:top w:val="single" w:sz="8" w:space="0" w:color="000000"/>
-              <w:left w:val="single" w:sz="8" w:space="0" w:color="000000"/>
-              <w:bottom w:val="single" w:sz="8" w:space="0" w:color="000000"/>
-              <w:right w:val="single" w:sz="8" w:space="0" w:color="000000"/>
-            </w:tcBorders>
-            <w:tcMar>
-              <w:top w:w="100" w:type="dxa"/>
-              <w:left w:w="100" w:type="dxa"/>
-              <w:bottom w:w="100" w:type="dxa"/>
-              <w:right w:w="100" w:type="dxa"/>
-            </w:tcMar>
-            <w:hideMark/>
-          </w:tcPr>
-          <w:p>
-            <w:pPr>
-              <w:rPr>
-                <w:lang w:val="en-US"/>
-              </w:rPr>
-            </w:pPr>
-          </w:p>
-        </w:tc>
-        <w:tc>
-          <w:tcPr>
-            <w:tcW w:w="0" w:type="auto"/>
-            <w:tcBorders>
-              <w:top w:val="single" w:sz="8" w:space="0" w:color="000000"/>
-              <w:left w:val="single" w:sz="8" w:space="0" w:color="000000"/>
-              <w:bottom w:val="single" w:sz="8" w:space="0" w:color="000000"/>
-              <w:right w:val="single" w:sz="8" w:space="0" w:color="000000"/>
-            </w:tcBorders>
-            <w:tcMar>
-              <w:top w:w="100" w:type="dxa"/>
-              <w:left w:w="100" w:type="dxa"/>
-              <w:bottom w:w="100" w:type="dxa"/>
-              <w:right w:w="100" w:type="dxa"/>
-            </w:tcMar>
-            <w:hideMark/>
-          </w:tcPr>
-          <w:p>
-            <w:pPr>
-              <w:rPr>
-                <w:lang w:val="en-US"/>
-              </w:rPr>
-            </w:pPr>
-          </w:p>
-        </w:tc>
-        <w:tc>
-          <w:tcPr>
-            <w:tcW w:w="0" w:type="auto"/>
-            <w:tcBorders>
-              <w:top w:val="single" w:sz="8" w:space="0" w:color="000000"/>
-              <w:left w:val="single" w:sz="8" w:space="0" w:color="000000"/>
-              <w:bottom w:val="single" w:sz="8" w:space="0" w:color="000000"/>
-              <w:right w:val="single" w:sz="8" w:space="0" w:color="000000"/>
-            </w:tcBorders>
-            <w:tcMar>
-              <w:top w:w="100" w:type="dxa"/>
-              <w:left w:w="100" w:type="dxa"/>
-              <w:bottom w:w="100" w:type="dxa"/>
-              <w:right w:w="100" w:type="dxa"/>
-            </w:tcMar>
-            <w:hideMark/>
-          </w:tcPr>
-          <w:p>
-            <w:pPr>
-              <w:rPr>
-                <w:lang w:val="en-US"/>
-              </w:rPr>
-            </w:pPr>
-          </w:p>
-        </w:tc>
-        <w:tc>
-          <w:tcPr>
-            <w:tcW w:w="0" w:type="auto"/>
-            <w:tcBorders>
-              <w:top w:val="single" w:sz="8" w:space="0" w:color="000000"/>
-              <w:left w:val="single" w:sz="8" w:space="0" w:color="000000"/>
-              <w:bottom w:val="single" w:sz="8" w:space="0" w:color="000000"/>
-              <w:right w:val="single" w:sz="8" w:space="0" w:color="000000"/>
-            </w:tcBorders>
-            <w:tcMar>
-              <w:top w:w="100" w:type="dxa"/>
-              <w:left w:w="100" w:type="dxa"/>
-              <w:bottom w:w="100" w:type="dxa"/>
-              <w:right w:w="100" w:type="dxa"/>
-            </w:tcMar>
-            <w:hideMark/>
-          </w:tcPr>
-          <w:p>
-            <w:pPr>
-              <w:rPr>
-                <w:lang w:val="en-US"/>
-              </w:rPr>
-            </w:pPr>
-            <w:r>
-              <w:rPr>
-                <w:lang w:val="en-US"/>
-              </w:rPr>
-              <w:t xml:space="preserve">If relevant, list previously created </w:t>
-            </w:r>
-            <w:proofErr w:type="spellStart"/>
-            <w:r>
-              <w:rPr>
-                <w:lang w:val="en-US"/>
-              </w:rPr>
-              <w:t>dataverse</w:t>
-            </w:r>
-            <w:proofErr w:type="spellEnd"/>
-            <w:r>
-              <w:rPr>
-                <w:lang w:val="en-US"/>
-              </w:rPr>
-              <w:t>:</w:t>
-            </w:r>
-            <w:r>
-              <w:rPr>
-                <w:lang w:val="en-US"/>
-              </w:rPr>
+              <w:t>{{ dataverse }}</w:t>
+            </w:r>
+            <w:r>
               <w:br/>
             </w:r>
             <w:r>
-              <w:t xml:space="preserve">{% for item in </w:t>
-            </w:r>
-            <w:proofErr w:type="spellStart"/>
-            <w:r>
-              <w:t>template_dict.dv_record.</w:t>
-            </w:r>
-            <w:proofErr w:type="gramStart"/>
-            <w:r>
-              <w:t>comments</w:t>
-            </w:r>
-            <w:proofErr w:type="spellEnd"/>
-            <w:r>
-              <w:t xml:space="preserve"> %}</w:t>
-            </w:r>
-            <w:proofErr w:type="gramEnd"/>
-            <w:r>
-              <w:t xml:space="preserve"> </w:t>
-            </w:r>
-          </w:p>
-          <w:p>
-            <w:r>
-              <w:t xml:space="preserve">{% for author, </w:t>
-            </w:r>
-            <w:proofErr w:type="spellStart"/>
-            <w:r>
-              <w:t>dataverses</w:t>
-            </w:r>
-            <w:proofErr w:type="spellEnd"/>
-            <w:r>
-              <w:t xml:space="preserve"> in </w:t>
-            </w:r>
-            <w:proofErr w:type="spellStart"/>
-            <w:proofErr w:type="gramStart"/>
-            <w:r>
-              <w:t>item.items</w:t>
-            </w:r>
-            <w:proofErr w:type="spellEnd"/>
-            <w:proofErr w:type="gramEnd"/>
-            <w:r>
-              <w:t>() %} {{ author }}</w:t>
-            </w:r>
-            <w:r>
-              <w:rPr>
-                <w:rFonts w:hint="eastAsia"/>
-              </w:rPr>
-              <w:t>:</w:t>
-            </w:r>
-          </w:p>
-          <w:p>
-            <w:r>
-              <w:t xml:space="preserve">{% for </w:t>
-            </w:r>
-            <w:proofErr w:type="spellStart"/>
-            <w:r>
-              <w:t>dataverse</w:t>
-            </w:r>
-            <w:proofErr w:type="spellEnd"/>
-            <w:r>
-              <w:t xml:space="preserve"> in </w:t>
-            </w:r>
-            <w:proofErr w:type="spellStart"/>
-            <w:r>
-              <w:t>dataverses</w:t>
-            </w:r>
-            <w:proofErr w:type="spellEnd"/>
-            <w:r>
-              <w:t xml:space="preserve"> %} </w:t>
-            </w:r>
-            <w:proofErr w:type="gramStart"/>
-            <w:r>
-              <w:t xml:space="preserve">{{ </w:t>
-            </w:r>
-            <w:proofErr w:type="spellStart"/>
-            <w:r>
-              <w:t>loop</w:t>
-            </w:r>
-            <w:proofErr w:type="gramEnd"/>
-            <w:r>
-              <w:t>.index</w:t>
-            </w:r>
-            <w:proofErr w:type="spellEnd"/>
-            <w:r>
-              <w:t xml:space="preserve"> }}.</w:t>
-            </w:r>
-            <w:r>
-              <w:rPr>
-                <w:rFonts w:hint="eastAsia"/>
-              </w:rPr>
-              <w:t xml:space="preserve"> </w:t>
-            </w:r>
-            <w:proofErr w:type="gramStart"/>
-            <w:r>
-              <w:t>{{ dataverse</w:t>
-            </w:r>
-            <w:proofErr w:type="gramEnd"/>
-            <w:r>
-              <w:t xml:space="preserve"> }}</w:t>
+              <w:t xml:space="preserve">{% endfor %} </w:t>
             </w:r>
             <w:r>
               <w:br/>
             </w:r>
             <w:r>
-              <w:t xml:space="preserve">{% </w:t>
-            </w:r>
-            <w:proofErr w:type="spellStart"/>
-            <w:r>
-              <w:t>endfor</w:t>
-            </w:r>
-            <w:proofErr w:type="spellEnd"/>
-            <w:r>
-              <w:t xml:space="preserve"> %} </w:t>
-            </w:r>
-            <w:r>
-              <w:br/>
-            </w:r>
-            <w:r>
-              <w:t xml:space="preserve">{% </w:t>
-            </w:r>
-            <w:proofErr w:type="spellStart"/>
-            <w:r>
-              <w:t>endfor</w:t>
-            </w:r>
-            <w:proofErr w:type="spellEnd"/>
-            <w:r>
-              <w:t xml:space="preserve"> %} {% </w:t>
-            </w:r>
-            <w:proofErr w:type="spellStart"/>
-            <w:r>
-              <w:t>endfor</w:t>
-            </w:r>
-            <w:proofErr w:type="spellEnd"/>
-            <w:r>
-              <w:t xml:space="preserve"> %}</w:t>
+              <w:t>{% endfor %} {% endfor %}</w:t>
             </w:r>
           </w:p>
         </w:tc>
@@ -1789,68 +1528,40 @@
               <w:rPr>
                 <w:lang w:val="en-US"/>
               </w:rPr>
-              <w:t>If the dataset is deposited in a sub-</w:t>
-            </w:r>
-            <w:proofErr w:type="spellStart"/>
-            <w:r>
-              <w:rPr>
-                <w:lang w:val="en-US"/>
-              </w:rPr>
-              <w:t>dataverse</w:t>
-            </w:r>
-            <w:proofErr w:type="spellEnd"/>
-            <w:r>
-              <w:rPr>
-                <w:lang w:val="en-US"/>
-              </w:rPr>
-              <w:t xml:space="preserve"> collection, include the name of the collection. </w:t>
-            </w:r>
-          </w:p>
-          <w:p>
-            <w:pPr>
-              <w:rPr>
-                <w:lang w:val="en-US"/>
-              </w:rPr>
-            </w:pPr>
-          </w:p>
-        </w:tc>
-        <w:tc>
-          <w:tcPr>
-            <w:tcW w:w="0" w:type="auto"/>
-            <w:tcBorders>
-              <w:top w:val="single" w:sz="8" w:space="0" w:color="000000"/>
-              <w:left w:val="single" w:sz="8" w:space="0" w:color="000000"/>
-              <w:bottom w:val="single" w:sz="8" w:space="0" w:color="000000"/>
-              <w:right w:val="single" w:sz="8" w:space="0" w:color="000000"/>
-            </w:tcBorders>
-            <w:tcMar>
-              <w:top w:w="100" w:type="dxa"/>
-              <w:left w:w="100" w:type="dxa"/>
-              <w:bottom w:w="100" w:type="dxa"/>
-              <w:right w:w="100" w:type="dxa"/>
-            </w:tcMar>
-            <w:hideMark/>
-          </w:tcPr>
-          <w:p>
-            <w:r>
-              <w:rPr>
-                <w:lang w:val="en-US"/>
-              </w:rPr>
-              <w:t xml:space="preserve">{% if </w:t>
-            </w:r>
-            <w:proofErr w:type="spellStart"/>
-            <w:r>
-              <w:rPr>
-                <w:lang w:val="en-US"/>
-              </w:rPr>
-              <w:t>template_dict</w:t>
-            </w:r>
-            <w:proofErr w:type="spellEnd"/>
-            <w:r>
-              <w:rPr>
-                <w:lang w:val="en-US"/>
-              </w:rPr>
-              <w:t>.</w:t>
+              <w:t>If the dataset is deposited in a sub-dataverse collection, include the name of the collection. </w:t>
+            </w:r>
+          </w:p>
+          <w:p>
+            <w:pPr>
+              <w:rPr>
+                <w:lang w:val="en-US"/>
+              </w:rPr>
+            </w:pPr>
+          </w:p>
+        </w:tc>
+        <w:tc>
+          <w:tcPr>
+            <w:tcW w:w="0" w:type="auto"/>
+            <w:tcBorders>
+              <w:top w:val="single" w:sz="8" w:space="0" w:color="000000"/>
+              <w:left w:val="single" w:sz="8" w:space="0" w:color="000000"/>
+              <w:bottom w:val="single" w:sz="8" w:space="0" w:color="000000"/>
+              <w:right w:val="single" w:sz="8" w:space="0" w:color="000000"/>
+            </w:tcBorders>
+            <w:tcMar>
+              <w:top w:w="100" w:type="dxa"/>
+              <w:left w:w="100" w:type="dxa"/>
+              <w:bottom w:w="100" w:type="dxa"/>
+              <w:right w:w="100" w:type="dxa"/>
+            </w:tcMar>
+            <w:hideMark/>
+          </w:tcPr>
+          <w:p>
+            <w:r>
+              <w:rPr>
+                <w:lang w:val="en-US"/>
+              </w:rPr>
+              <w:t>{% if template_dict.</w:t>
             </w:r>
             <w:r>
               <w:rPr>
@@ -1863,11 +1574,9 @@
               </w:rPr>
               <w:t xml:space="preserve"> </w:t>
             </w:r>
-            <w:proofErr w:type="spellStart"/>
             <w:r>
               <w:t>name_name_of_dataverse</w:t>
             </w:r>
-            <w:proofErr w:type="spellEnd"/>
             <w:r>
               <w:rPr>
                 <w:lang w:val="en-US"/>
@@ -1886,7 +1595,6 @@
               </w:rPr>
               <w:t>University of Toronto Dataverse</w:t>
             </w:r>
-            <w:proofErr w:type="gramStart"/>
             <w:r>
               <w:rPr>
                 <w:lang w:val="en-US"/>
@@ -1897,59 +1605,38 @@
               <w:rPr>
                 <w:lang w:val="en-US"/>
               </w:rPr>
-              <w:t xml:space="preserve"> %}</w:t>
-            </w:r>
-            <w:proofErr w:type="gramEnd"/>
-            <w:r>
-              <w:rPr>
-                <w:lang w:val="en-US"/>
-              </w:rPr>
-              <w:t>X{% endif %}</w:t>
-            </w:r>
-          </w:p>
-        </w:tc>
-        <w:tc>
-          <w:tcPr>
-            <w:tcW w:w="0" w:type="auto"/>
-            <w:tcBorders>
-              <w:top w:val="single" w:sz="8" w:space="0" w:color="000000"/>
-              <w:left w:val="single" w:sz="8" w:space="0" w:color="000000"/>
-              <w:bottom w:val="single" w:sz="8" w:space="0" w:color="000000"/>
-              <w:right w:val="single" w:sz="8" w:space="0" w:color="000000"/>
-            </w:tcBorders>
-            <w:tcMar>
-              <w:top w:w="100" w:type="dxa"/>
-              <w:left w:w="100" w:type="dxa"/>
-              <w:bottom w:w="100" w:type="dxa"/>
-              <w:right w:w="100" w:type="dxa"/>
-            </w:tcMar>
-            <w:hideMark/>
-          </w:tcPr>
-          <w:p>
-            <w:pPr>
-              <w:rPr>
-                <w:lang w:val="en-US"/>
-              </w:rPr>
-            </w:pPr>
-            <w:r>
-              <w:rPr>
-                <w:lang w:val="en-US"/>
-              </w:rPr>
-              <w:t xml:space="preserve">{% if </w:t>
-            </w:r>
-            <w:proofErr w:type="spellStart"/>
-            <w:r>
-              <w:rPr>
-                <w:lang w:val="en-US"/>
-              </w:rPr>
-              <w:t>template_dict</w:t>
-            </w:r>
-            <w:proofErr w:type="spellEnd"/>
-            <w:r>
-              <w:rPr>
-                <w:lang w:val="en-US"/>
-              </w:rPr>
-              <w:t>.</w:t>
+              <w:t xml:space="preserve"> %}X{% endif %}</w:t>
+            </w:r>
+          </w:p>
+        </w:tc>
+        <w:tc>
+          <w:tcPr>
+            <w:tcW w:w="0" w:type="auto"/>
+            <w:tcBorders>
+              <w:top w:val="single" w:sz="8" w:space="0" w:color="000000"/>
+              <w:left w:val="single" w:sz="8" w:space="0" w:color="000000"/>
+              <w:bottom w:val="single" w:sz="8" w:space="0" w:color="000000"/>
+              <w:right w:val="single" w:sz="8" w:space="0" w:color="000000"/>
+            </w:tcBorders>
+            <w:tcMar>
+              <w:top w:w="100" w:type="dxa"/>
+              <w:left w:w="100" w:type="dxa"/>
+              <w:bottom w:w="100" w:type="dxa"/>
+              <w:right w:w="100" w:type="dxa"/>
+            </w:tcMar>
+            <w:hideMark/>
+          </w:tcPr>
+          <w:p>
+            <w:pPr>
+              <w:rPr>
+                <w:lang w:val="en-US"/>
+              </w:rPr>
+            </w:pPr>
+            <w:r>
+              <w:rPr>
+                <w:lang w:val="en-US"/>
+              </w:rPr>
+              <w:t>{% if template_dict.</w:t>
             </w:r>
             <w:r>
               <w:rPr>
@@ -1962,11 +1649,9 @@
               </w:rPr>
               <w:t xml:space="preserve"> </w:t>
             </w:r>
-            <w:proofErr w:type="spellStart"/>
             <w:r>
               <w:t>name_name_of_dataverse</w:t>
             </w:r>
-            <w:proofErr w:type="spellEnd"/>
             <w:r>
               <w:rPr>
                 <w:lang w:val="en-US"/>
@@ -1997,7 +1682,6 @@
               </w:rPr>
               <w:t>University of Toronto Dataverse</w:t>
             </w:r>
-            <w:proofErr w:type="gramStart"/>
             <w:r>
               <w:rPr>
                 <w:lang w:val="en-US"/>
@@ -2008,14 +1692,7 @@
               <w:rPr>
                 <w:lang w:val="en-US"/>
               </w:rPr>
-              <w:t xml:space="preserve"> %}</w:t>
-            </w:r>
-            <w:proofErr w:type="gramEnd"/>
-            <w:r>
-              <w:rPr>
-                <w:lang w:val="en-US"/>
-              </w:rPr>
-              <w:t>X{% endif %}</w:t>
+              <w:t xml:space="preserve"> %}X{% endif %}</w:t>
             </w:r>
           </w:p>
         </w:tc>
@@ -2129,70 +1806,46 @@
                 <w:rFonts w:hint="eastAsia"/>
                 <w:lang w:val="en-US"/>
               </w:rPr>
-              <w:t xml:space="preserve">List the </w:t>
-            </w:r>
-            <w:proofErr w:type="spellStart"/>
+              <w:t xml:space="preserve">List the dataverse </w:t>
+            </w:r>
+            <w:r>
+              <w:rPr>
+                <w:lang w:val="en-US"/>
+              </w:rPr>
+              <w:t>collection</w:t>
+            </w:r>
             <w:r>
               <w:rPr>
                 <w:rFonts w:hint="eastAsia"/>
                 <w:lang w:val="en-US"/>
               </w:rPr>
-              <w:t>dataverse</w:t>
-            </w:r>
-            <w:proofErr w:type="spellEnd"/>
+              <w:t xml:space="preserve"> name:</w:t>
+            </w:r>
+            <w:r>
+              <w:rPr>
+                <w:lang w:val="en-US"/>
+              </w:rPr>
+              <w:br/>
+            </w:r>
             <w:r>
               <w:rPr>
                 <w:rFonts w:hint="eastAsia"/>
                 <w:lang w:val="en-US"/>
               </w:rPr>
-              <w:t xml:space="preserve"> </w:t>
-            </w:r>
-            <w:r>
-              <w:rPr>
-                <w:lang w:val="en-US"/>
-              </w:rPr>
-              <w:t>collection</w:t>
+              <w:t xml:space="preserve">{{ </w:t>
+            </w:r>
+            <w:r>
+              <w:t>template_dict</w:t>
             </w:r>
             <w:r>
               <w:rPr>
                 <w:rFonts w:hint="eastAsia"/>
-                <w:lang w:val="en-US"/>
-              </w:rPr>
-              <w:t xml:space="preserve"> name:</w:t>
-            </w:r>
-          </w:p>
-          <w:p>
-            <w:pPr>
-              <w:rPr>
-                <w:lang w:val="en-US"/>
-              </w:rPr>
-            </w:pPr>
-            <w:r>
-              <w:rPr>
-                <w:rFonts w:hint="eastAsia"/>
-                <w:lang w:val="en-US"/>
-              </w:rPr>
-              <w:t xml:space="preserve">{{ </w:t>
-            </w:r>
-            <w:proofErr w:type="spellStart"/>
-            <w:r>
-              <w:t>template_dict</w:t>
-            </w:r>
-            <w:proofErr w:type="spellEnd"/>
-            <w:r>
-              <w:rPr>
-                <w:rFonts w:hint="eastAsia"/>
               </w:rPr>
               <w:t>.</w:t>
             </w:r>
             <w:r>
-              <w:t xml:space="preserve"> </w:t>
-            </w:r>
-            <w:proofErr w:type="spellStart"/>
-            <w:r>
-              <w:t>name_name_of_dataverse</w:t>
-            </w:r>
-            <w:proofErr w:type="spellEnd"/>
+              <w:t xml:space="preserve"> name_name_of_dataverse</w:t>
+            </w:r>
             <w:r>
               <w:rPr>
                 <w:rFonts w:hint="eastAsia"/>
@@ -2328,88 +1981,38 @@
                 <w:bCs/>
                 <w:lang w:val="en-US"/>
               </w:rPr>
-              <w:t>*If the dataset was deposited in a sub-</w:t>
-            </w:r>
-            <w:proofErr w:type="spellStart"/>
-            <w:r>
-              <w:rPr>
-                <w:b/>
-                <w:bCs/>
-                <w:lang w:val="en-US"/>
-              </w:rPr>
-              <w:t>dataverse</w:t>
-            </w:r>
-            <w:proofErr w:type="spellEnd"/>
-            <w:r>
-              <w:rPr>
-                <w:b/>
-                <w:bCs/>
-                <w:lang w:val="en-US"/>
-              </w:rPr>
-              <w:t xml:space="preserve"> collection, does it require its own </w:t>
-            </w:r>
-            <w:proofErr w:type="spellStart"/>
-            <w:r>
-              <w:rPr>
-                <w:b/>
-                <w:bCs/>
-                <w:lang w:val="en-US"/>
-              </w:rPr>
-              <w:t>dataverse</w:t>
-            </w:r>
-            <w:proofErr w:type="spellEnd"/>
-            <w:r>
-              <w:rPr>
-                <w:b/>
-                <w:bCs/>
-                <w:lang w:val="en-US"/>
-              </w:rPr>
-              <w:t>?</w:t>
-            </w:r>
-          </w:p>
-        </w:tc>
-        <w:tc>
-          <w:tcPr>
-            <w:tcW w:w="0" w:type="auto"/>
-            <w:tcBorders>
-              <w:top w:val="single" w:sz="8" w:space="0" w:color="000000"/>
-              <w:left w:val="single" w:sz="8" w:space="0" w:color="000000"/>
-              <w:bottom w:val="single" w:sz="8" w:space="0" w:color="000000"/>
-              <w:right w:val="single" w:sz="8" w:space="0" w:color="000000"/>
-            </w:tcBorders>
-            <w:tcMar>
-              <w:top w:w="100" w:type="dxa"/>
-              <w:left w:w="100" w:type="dxa"/>
-              <w:bottom w:w="100" w:type="dxa"/>
-              <w:right w:w="100" w:type="dxa"/>
-            </w:tcMar>
-            <w:hideMark/>
-          </w:tcPr>
-          <w:p>
-            <w:pPr>
-              <w:rPr>
-                <w:lang w:val="en-US"/>
-              </w:rPr>
-            </w:pPr>
-            <w:r>
-              <w:rPr>
-                <w:lang w:val="en-US"/>
-              </w:rPr>
-              <w:t xml:space="preserve">If the depositor created a </w:t>
-            </w:r>
-            <w:proofErr w:type="spellStart"/>
-            <w:r>
-              <w:rPr>
-                <w:lang w:val="en-US"/>
-              </w:rPr>
-              <w:t>dataverse</w:t>
-            </w:r>
-            <w:proofErr w:type="spellEnd"/>
-            <w:r>
-              <w:rPr>
-                <w:lang w:val="en-US"/>
-              </w:rPr>
-              <w:t xml:space="preserve"> with one dataset:</w:t>
+              <w:t>*If the dataset was deposited in a sub-dataverse collection, does it require its own dataverse?</w:t>
+            </w:r>
+          </w:p>
+        </w:tc>
+        <w:tc>
+          <w:tcPr>
+            <w:tcW w:w="0" w:type="auto"/>
+            <w:tcBorders>
+              <w:top w:val="single" w:sz="8" w:space="0" w:color="000000"/>
+              <w:left w:val="single" w:sz="8" w:space="0" w:color="000000"/>
+              <w:bottom w:val="single" w:sz="8" w:space="0" w:color="000000"/>
+              <w:right w:val="single" w:sz="8" w:space="0" w:color="000000"/>
+            </w:tcBorders>
+            <w:tcMar>
+              <w:top w:w="100" w:type="dxa"/>
+              <w:left w:w="100" w:type="dxa"/>
+              <w:bottom w:w="100" w:type="dxa"/>
+              <w:right w:w="100" w:type="dxa"/>
+            </w:tcMar>
+            <w:hideMark/>
+          </w:tcPr>
+          <w:p>
+            <w:pPr>
+              <w:rPr>
+                <w:lang w:val="en-US"/>
+              </w:rPr>
+            </w:pPr>
+            <w:r>
+              <w:rPr>
+                <w:lang w:val="en-US"/>
+              </w:rPr>
+              <w:t>If the depositor created a dataverse with one dataset:</w:t>
             </w:r>
           </w:p>
           <w:p>
@@ -2426,21 +2029,7 @@
               <w:rPr>
                 <w:lang w:val="en-US"/>
               </w:rPr>
-              <w:t>Is it the only dataset in the sub-</w:t>
-            </w:r>
-            <w:proofErr w:type="spellStart"/>
-            <w:r>
-              <w:rPr>
-                <w:lang w:val="en-US"/>
-              </w:rPr>
-              <w:t>dataverse</w:t>
-            </w:r>
-            <w:proofErr w:type="spellEnd"/>
-            <w:r>
-              <w:rPr>
-                <w:lang w:val="en-US"/>
-              </w:rPr>
-              <w:t xml:space="preserve"> collection?</w:t>
+              <w:t>Is it the only dataset in the sub-dataverse collection?</w:t>
             </w:r>
           </w:p>
           <w:p>
@@ -2457,21 +2046,7 @@
               <w:rPr>
                 <w:lang w:val="en-US"/>
               </w:rPr>
-              <w:t>Is there another sub-</w:t>
-            </w:r>
-            <w:proofErr w:type="spellStart"/>
-            <w:r>
-              <w:rPr>
-                <w:lang w:val="en-US"/>
-              </w:rPr>
-              <w:t>dataverse</w:t>
-            </w:r>
-            <w:proofErr w:type="spellEnd"/>
-            <w:r>
-              <w:rPr>
-                <w:lang w:val="en-US"/>
-              </w:rPr>
-              <w:t xml:space="preserve"> collection it should be in?</w:t>
+              <w:t>Is there another sub-dataverse collection it should be in?</w:t>
             </w:r>
           </w:p>
           <w:p>
@@ -2505,35 +2080,7 @@
               <w:rPr>
                 <w:lang w:val="en-US"/>
               </w:rPr>
-              <w:t xml:space="preserve">Confirm with the depositor that they </w:t>
-            </w:r>
-            <w:proofErr w:type="gramStart"/>
-            <w:r>
-              <w:rPr>
-                <w:lang w:val="en-US"/>
-              </w:rPr>
-              <w:t>actually require</w:t>
-            </w:r>
-            <w:proofErr w:type="gramEnd"/>
-            <w:r>
-              <w:rPr>
-                <w:lang w:val="en-US"/>
-              </w:rPr>
-              <w:t xml:space="preserve"> a </w:t>
-            </w:r>
-            <w:proofErr w:type="spellStart"/>
-            <w:r>
-              <w:rPr>
-                <w:lang w:val="en-US"/>
-              </w:rPr>
-              <w:t>dataverse</w:t>
-            </w:r>
-            <w:proofErr w:type="spellEnd"/>
-            <w:r>
-              <w:rPr>
-                <w:lang w:val="en-US"/>
-              </w:rPr>
-              <w:t xml:space="preserve"> (e.g., will there be future deposits?)</w:t>
+              <w:t>Confirm with the depositor that they actually require a dataverse (e.g., will there be future deposits?)</w:t>
             </w:r>
           </w:p>
         </w:tc>
@@ -3220,91 +2767,63 @@
               <w:rPr>
                 <w:lang w:val="en-US"/>
               </w:rPr>
-              <w:t xml:space="preserve">{% if </w:t>
-            </w:r>
-            <w:proofErr w:type="spellStart"/>
-            <w:r>
-              <w:rPr>
-                <w:lang w:val="en-US"/>
-              </w:rPr>
-              <w:t>template_dict.file_ext.comments|length</w:t>
-            </w:r>
-            <w:proofErr w:type="spellEnd"/>
-            <w:r>
-              <w:rPr>
-                <w:lang w:val="en-US"/>
-              </w:rPr>
-              <w:t xml:space="preserve"> == 0 %}X{% endif %}</w:t>
-            </w:r>
-          </w:p>
-        </w:tc>
-        <w:tc>
-          <w:tcPr>
-            <w:tcW w:w="0" w:type="auto"/>
-            <w:tcBorders>
-              <w:top w:val="single" w:sz="8" w:space="0" w:color="000000"/>
-              <w:left w:val="single" w:sz="8" w:space="0" w:color="000000"/>
-              <w:bottom w:val="single" w:sz="8" w:space="0" w:color="000000"/>
-              <w:right w:val="single" w:sz="8" w:space="0" w:color="000000"/>
-            </w:tcBorders>
-            <w:tcMar>
-              <w:top w:w="100" w:type="dxa"/>
-              <w:left w:w="100" w:type="dxa"/>
-              <w:bottom w:w="100" w:type="dxa"/>
-              <w:right w:w="100" w:type="dxa"/>
-            </w:tcMar>
-            <w:hideMark/>
-          </w:tcPr>
-          <w:p>
-            <w:pPr>
-              <w:rPr>
-                <w:lang w:val="en-US"/>
-              </w:rPr>
-            </w:pPr>
-          </w:p>
-        </w:tc>
-        <w:tc>
-          <w:tcPr>
-            <w:tcW w:w="0" w:type="auto"/>
-            <w:tcBorders>
-              <w:top w:val="single" w:sz="8" w:space="0" w:color="000000"/>
-              <w:left w:val="single" w:sz="8" w:space="0" w:color="000000"/>
-              <w:bottom w:val="single" w:sz="8" w:space="0" w:color="000000"/>
-              <w:right w:val="single" w:sz="8" w:space="0" w:color="000000"/>
-            </w:tcBorders>
-            <w:tcMar>
-              <w:top w:w="100" w:type="dxa"/>
-              <w:left w:w="100" w:type="dxa"/>
-              <w:bottom w:w="100" w:type="dxa"/>
-              <w:right w:w="100" w:type="dxa"/>
-            </w:tcMar>
-            <w:hideMark/>
-          </w:tcPr>
-          <w:p>
-            <w:pPr>
-              <w:rPr>
-                <w:lang w:val="en-US"/>
-              </w:rPr>
-            </w:pPr>
-            <w:r>
-              <w:rPr>
-                <w:lang w:val="en-US"/>
-              </w:rPr>
-              <w:t xml:space="preserve">{% if </w:t>
-            </w:r>
-            <w:proofErr w:type="spellStart"/>
-            <w:r>
-              <w:rPr>
-                <w:lang w:val="en-US"/>
-              </w:rPr>
-              <w:t>template_dict.file_ext.comments|length</w:t>
-            </w:r>
-            <w:proofErr w:type="spellEnd"/>
-            <w:r>
-              <w:rPr>
-                <w:lang w:val="en-US"/>
-              </w:rPr>
-              <w:t xml:space="preserve"> &gt; 0 %}X{% endif %}</w:t>
+              <w:t>{% if template_dict.file_ext.comments|length == 0 %}X{% endif %}</w:t>
+            </w:r>
+          </w:p>
+        </w:tc>
+        <w:tc>
+          <w:tcPr>
+            <w:tcW w:w="0" w:type="auto"/>
+            <w:tcBorders>
+              <w:top w:val="single" w:sz="8" w:space="0" w:color="000000"/>
+              <w:left w:val="single" w:sz="8" w:space="0" w:color="000000"/>
+              <w:bottom w:val="single" w:sz="8" w:space="0" w:color="000000"/>
+              <w:right w:val="single" w:sz="8" w:space="0" w:color="000000"/>
+            </w:tcBorders>
+            <w:tcMar>
+              <w:top w:w="100" w:type="dxa"/>
+              <w:left w:w="100" w:type="dxa"/>
+              <w:bottom w:w="100" w:type="dxa"/>
+              <w:right w:w="100" w:type="dxa"/>
+            </w:tcMar>
+            <w:hideMark/>
+          </w:tcPr>
+          <w:p>
+            <w:pPr>
+              <w:rPr>
+                <w:lang w:val="en-US"/>
+              </w:rPr>
+            </w:pPr>
+          </w:p>
+        </w:tc>
+        <w:tc>
+          <w:tcPr>
+            <w:tcW w:w="0" w:type="auto"/>
+            <w:tcBorders>
+              <w:top w:val="single" w:sz="8" w:space="0" w:color="000000"/>
+              <w:left w:val="single" w:sz="8" w:space="0" w:color="000000"/>
+              <w:bottom w:val="single" w:sz="8" w:space="0" w:color="000000"/>
+              <w:right w:val="single" w:sz="8" w:space="0" w:color="000000"/>
+            </w:tcBorders>
+            <w:tcMar>
+              <w:top w:w="100" w:type="dxa"/>
+              <w:left w:w="100" w:type="dxa"/>
+              <w:bottom w:w="100" w:type="dxa"/>
+              <w:right w:w="100" w:type="dxa"/>
+            </w:tcMar>
+            <w:hideMark/>
+          </w:tcPr>
+          <w:p>
+            <w:pPr>
+              <w:rPr>
+                <w:lang w:val="en-US"/>
+              </w:rPr>
+            </w:pPr>
+            <w:r>
+              <w:rPr>
+                <w:lang w:val="en-US"/>
+              </w:rPr>
+              <w:t>{% if template_dict.file_ext.comments|length &gt; 0 %}X{% endif %}</w:t>
             </w:r>
           </w:p>
         </w:tc>
@@ -3387,41 +2906,18 @@
               </w:rPr>
               <w:t>List all files that did not open correctly:</w:t>
             </w:r>
-          </w:p>
-          <w:p>
-            <w:pPr>
-              <w:rPr>
-                <w:lang w:val="en-US"/>
-              </w:rPr>
-            </w:pPr>
-            <w:r>
-              <w:rPr>
-                <w:lang w:val="en-US"/>
-              </w:rPr>
-              <w:t xml:space="preserve">{% for item in </w:t>
-            </w:r>
-            <w:proofErr w:type="spellStart"/>
-            <w:r>
-              <w:rPr>
-                <w:lang w:val="en-US"/>
-              </w:rPr>
-              <w:t>template_dict.file_open.</w:t>
-            </w:r>
-            <w:proofErr w:type="gramStart"/>
-            <w:r>
-              <w:rPr>
-                <w:lang w:val="en-US"/>
-              </w:rPr>
-              <w:t>comments</w:t>
-            </w:r>
-            <w:proofErr w:type="spellEnd"/>
-            <w:r>
-              <w:rPr>
-                <w:lang w:val="en-US"/>
-              </w:rPr>
-              <w:t xml:space="preserve"> %}</w:t>
-            </w:r>
-            <w:proofErr w:type="gramEnd"/>
+            <w:r>
+              <w:rPr>
+                <w:lang w:val="en-US"/>
+              </w:rPr>
+              <w:br/>
+            </w:r>
+            <w:r>
+              <w:rPr>
+                <w:lang w:val="en-US"/>
+              </w:rPr>
+              <w:t>{% for item in template_dict.file_open.comments %}</w:t>
+            </w:r>
           </w:p>
           <w:p>
             <w:pPr>
@@ -3438,55 +2934,13 @@
               <w:rPr>
                 <w:lang w:val="en-US"/>
               </w:rPr>
-              <w:t xml:space="preserve">{{ </w:t>
-            </w:r>
-            <w:proofErr w:type="spellStart"/>
-            <w:r>
-              <w:rPr>
-                <w:lang w:val="en-US"/>
-              </w:rPr>
-              <w:t>item.file_</w:t>
-            </w:r>
-            <w:proofErr w:type="gramStart"/>
-            <w:r>
-              <w:rPr>
-                <w:lang w:val="en-US"/>
-              </w:rPr>
-              <w:t>name</w:t>
-            </w:r>
-            <w:proofErr w:type="spellEnd"/>
-            <w:r>
-              <w:rPr>
-                <w:lang w:val="en-US"/>
-              </w:rPr>
-              <w:t xml:space="preserve"> }}</w:t>
-            </w:r>
-            <w:r>
-              <w:rPr>
-                <w:lang w:val="en-US"/>
-              </w:rPr>
-              <w:t>{%</w:t>
-            </w:r>
-            <w:proofErr w:type="gramEnd"/>
-            <w:r>
-              <w:rPr>
-                <w:lang w:val="en-US"/>
-              </w:rPr>
-              <w:t xml:space="preserve"> </w:t>
-            </w:r>
-            <w:proofErr w:type="spellStart"/>
-            <w:r>
-              <w:rPr>
-                <w:lang w:val="en-US"/>
-              </w:rPr>
-              <w:t>endfor</w:t>
-            </w:r>
-            <w:proofErr w:type="spellEnd"/>
-            <w:r>
-              <w:rPr>
-                <w:lang w:val="en-US"/>
-              </w:rPr>
-              <w:t xml:space="preserve"> %}</w:t>
+              <w:t>{{ item.file_name }}</w:t>
+            </w:r>
+            <w:r>
+              <w:rPr>
+                <w:lang w:val="en-US"/>
+              </w:rPr>
+              <w:t>{% endfor %}</w:t>
             </w:r>
           </w:p>
           <w:p>
@@ -3503,55 +2957,24 @@
                 <w:lang w:val="en-US"/>
               </w:rPr>
             </w:pPr>
-            <w:proofErr w:type="gramStart"/>
-            <w:r>
-              <w:rPr>
-                <w:lang w:val="en-US"/>
-              </w:rPr>
-              <w:t>List</w:t>
-            </w:r>
-            <w:proofErr w:type="gramEnd"/>
-            <w:r>
-              <w:rPr>
-                <w:lang w:val="en-US"/>
-              </w:rPr>
-              <w:t xml:space="preserve"> all files that were not checked:</w:t>
-            </w:r>
-          </w:p>
-          <w:p>
-            <w:pPr>
-              <w:rPr>
-                <w:lang w:val="en-US"/>
-              </w:rPr>
-            </w:pPr>
-            <w:r>
-              <w:rPr>
-                <w:lang w:val="en-US"/>
-              </w:rPr>
-              <w:t xml:space="preserve">{% for item in </w:t>
-            </w:r>
-            <w:proofErr w:type="spellStart"/>
-            <w:r>
-              <w:rPr>
-                <w:lang w:val="en-US"/>
-              </w:rPr>
-              <w:t>template_dict.file_open.not_</w:t>
-            </w:r>
-            <w:proofErr w:type="gramStart"/>
-            <w:r>
-              <w:rPr>
-                <w:lang w:val="en-US"/>
-              </w:rPr>
-              <w:t>checked</w:t>
-            </w:r>
-            <w:proofErr w:type="spellEnd"/>
-            <w:r>
-              <w:rPr>
-                <w:lang w:val="en-US"/>
-              </w:rPr>
-              <w:t xml:space="preserve"> %}</w:t>
-            </w:r>
-            <w:proofErr w:type="gramEnd"/>
+            <w:r>
+              <w:rPr>
+                <w:lang w:val="en-US"/>
+              </w:rPr>
+              <w:t>List all files that were not checked:</w:t>
+            </w:r>
+            <w:r>
+              <w:rPr>
+                <w:lang w:val="en-US"/>
+              </w:rPr>
+              <w:br/>
+            </w:r>
+            <w:r>
+              <w:rPr>
+                <w:lang w:val="en-US"/>
+              </w:rPr>
+              <w:t>{% for item in template_dict.file_open.not_checked %}</w:t>
+            </w:r>
           </w:p>
           <w:p>
             <w:pPr>
@@ -3568,49 +2991,7 @@
               <w:rPr>
                 <w:lang w:val="en-US"/>
               </w:rPr>
-              <w:t xml:space="preserve">{{ </w:t>
-            </w:r>
-            <w:proofErr w:type="spellStart"/>
-            <w:r>
-              <w:rPr>
-                <w:lang w:val="en-US"/>
-              </w:rPr>
-              <w:t>item.file_</w:t>
-            </w:r>
-            <w:proofErr w:type="gramStart"/>
-            <w:r>
-              <w:rPr>
-                <w:lang w:val="en-US"/>
-              </w:rPr>
-              <w:t>name</w:t>
-            </w:r>
-            <w:proofErr w:type="spellEnd"/>
-            <w:r>
-              <w:rPr>
-                <w:lang w:val="en-US"/>
-              </w:rPr>
-              <w:t xml:space="preserve"> }}{%</w:t>
-            </w:r>
-            <w:proofErr w:type="gramEnd"/>
-            <w:r>
-              <w:rPr>
-                <w:lang w:val="en-US"/>
-              </w:rPr>
-              <w:t xml:space="preserve"> </w:t>
-            </w:r>
-            <w:proofErr w:type="spellStart"/>
-            <w:r>
-              <w:rPr>
-                <w:lang w:val="en-US"/>
-              </w:rPr>
-              <w:t>endfor</w:t>
-            </w:r>
-            <w:proofErr w:type="spellEnd"/>
-            <w:r>
-              <w:rPr>
-                <w:lang w:val="en-US"/>
-              </w:rPr>
-              <w:t xml:space="preserve"> %}</w:t>
+              <w:t>{{ item.file_name }}{% endfor %}</w:t>
             </w:r>
           </w:p>
           <w:p>
@@ -3824,91 +3205,63 @@
               <w:rPr>
                 <w:lang w:val="en-US"/>
               </w:rPr>
-              <w:t xml:space="preserve">{% if </w:t>
-            </w:r>
-            <w:proofErr w:type="spellStart"/>
-            <w:r>
-              <w:rPr>
-                <w:lang w:val="en-US"/>
-              </w:rPr>
-              <w:t>template_dict.special_characters.comments|length</w:t>
-            </w:r>
-            <w:proofErr w:type="spellEnd"/>
-            <w:r>
-              <w:rPr>
-                <w:lang w:val="en-US"/>
-              </w:rPr>
-              <w:t xml:space="preserve"> == 0 %}X{% endif %}</w:t>
-            </w:r>
-          </w:p>
-        </w:tc>
-        <w:tc>
-          <w:tcPr>
-            <w:tcW w:w="0" w:type="auto"/>
-            <w:tcBorders>
-              <w:top w:val="single" w:sz="8" w:space="0" w:color="000000"/>
-              <w:left w:val="single" w:sz="8" w:space="0" w:color="000000"/>
-              <w:bottom w:val="single" w:sz="8" w:space="0" w:color="000000"/>
-              <w:right w:val="single" w:sz="8" w:space="0" w:color="000000"/>
-            </w:tcBorders>
-            <w:tcMar>
-              <w:top w:w="100" w:type="dxa"/>
-              <w:left w:w="100" w:type="dxa"/>
-              <w:bottom w:w="100" w:type="dxa"/>
-              <w:right w:w="100" w:type="dxa"/>
-            </w:tcMar>
-            <w:hideMark/>
-          </w:tcPr>
-          <w:p>
-            <w:pPr>
-              <w:rPr>
-                <w:lang w:val="en-US"/>
-              </w:rPr>
-            </w:pPr>
-          </w:p>
-        </w:tc>
-        <w:tc>
-          <w:tcPr>
-            <w:tcW w:w="0" w:type="auto"/>
-            <w:tcBorders>
-              <w:top w:val="single" w:sz="8" w:space="0" w:color="000000"/>
-              <w:left w:val="single" w:sz="8" w:space="0" w:color="000000"/>
-              <w:bottom w:val="single" w:sz="8" w:space="0" w:color="000000"/>
-              <w:right w:val="single" w:sz="8" w:space="0" w:color="000000"/>
-            </w:tcBorders>
-            <w:tcMar>
-              <w:top w:w="100" w:type="dxa"/>
-              <w:left w:w="100" w:type="dxa"/>
-              <w:bottom w:w="100" w:type="dxa"/>
-              <w:right w:w="100" w:type="dxa"/>
-            </w:tcMar>
-            <w:hideMark/>
-          </w:tcPr>
-          <w:p>
-            <w:pPr>
-              <w:rPr>
-                <w:lang w:val="en-US"/>
-              </w:rPr>
-            </w:pPr>
-            <w:r>
-              <w:rPr>
-                <w:lang w:val="en-US"/>
-              </w:rPr>
-              <w:t xml:space="preserve">{% if </w:t>
-            </w:r>
-            <w:proofErr w:type="spellStart"/>
-            <w:r>
-              <w:rPr>
-                <w:lang w:val="en-US"/>
-              </w:rPr>
-              <w:t>template_dict.special_characters.comments|length</w:t>
-            </w:r>
-            <w:proofErr w:type="spellEnd"/>
-            <w:r>
-              <w:rPr>
-                <w:lang w:val="en-US"/>
-              </w:rPr>
-              <w:t xml:space="preserve"> &gt; 0 %}X{% endif %}</w:t>
+              <w:t>{% if template_dict.special_characters.comments|length == 0 %}X{% endif %}</w:t>
+            </w:r>
+          </w:p>
+        </w:tc>
+        <w:tc>
+          <w:tcPr>
+            <w:tcW w:w="0" w:type="auto"/>
+            <w:tcBorders>
+              <w:top w:val="single" w:sz="8" w:space="0" w:color="000000"/>
+              <w:left w:val="single" w:sz="8" w:space="0" w:color="000000"/>
+              <w:bottom w:val="single" w:sz="8" w:space="0" w:color="000000"/>
+              <w:right w:val="single" w:sz="8" w:space="0" w:color="000000"/>
+            </w:tcBorders>
+            <w:tcMar>
+              <w:top w:w="100" w:type="dxa"/>
+              <w:left w:w="100" w:type="dxa"/>
+              <w:bottom w:w="100" w:type="dxa"/>
+              <w:right w:w="100" w:type="dxa"/>
+            </w:tcMar>
+            <w:hideMark/>
+          </w:tcPr>
+          <w:p>
+            <w:pPr>
+              <w:rPr>
+                <w:lang w:val="en-US"/>
+              </w:rPr>
+            </w:pPr>
+          </w:p>
+        </w:tc>
+        <w:tc>
+          <w:tcPr>
+            <w:tcW w:w="0" w:type="auto"/>
+            <w:tcBorders>
+              <w:top w:val="single" w:sz="8" w:space="0" w:color="000000"/>
+              <w:left w:val="single" w:sz="8" w:space="0" w:color="000000"/>
+              <w:bottom w:val="single" w:sz="8" w:space="0" w:color="000000"/>
+              <w:right w:val="single" w:sz="8" w:space="0" w:color="000000"/>
+            </w:tcBorders>
+            <w:tcMar>
+              <w:top w:w="100" w:type="dxa"/>
+              <w:left w:w="100" w:type="dxa"/>
+              <w:bottom w:w="100" w:type="dxa"/>
+              <w:right w:w="100" w:type="dxa"/>
+            </w:tcMar>
+            <w:hideMark/>
+          </w:tcPr>
+          <w:p>
+            <w:pPr>
+              <w:rPr>
+                <w:lang w:val="en-US"/>
+              </w:rPr>
+            </w:pPr>
+            <w:r>
+              <w:rPr>
+                <w:lang w:val="en-US"/>
+              </w:rPr>
+              <w:t>{% if template_dict.special_characters.comments|length &gt; 0 %}X{% endif %}</w:t>
             </w:r>
           </w:p>
         </w:tc>
@@ -3991,41 +3344,18 @@
               </w:rPr>
               <w:t>List all files that contain special characters:</w:t>
             </w:r>
-          </w:p>
-          <w:p>
-            <w:pPr>
-              <w:rPr>
-                <w:lang w:val="en-US"/>
-              </w:rPr>
-            </w:pPr>
-            <w:r>
-              <w:rPr>
-                <w:lang w:val="en-US"/>
-              </w:rPr>
-              <w:t xml:space="preserve">{% for item in </w:t>
-            </w:r>
-            <w:proofErr w:type="spellStart"/>
-            <w:r>
-              <w:rPr>
-                <w:lang w:val="en-US"/>
-              </w:rPr>
-              <w:t>template_dict.special_characters.</w:t>
-            </w:r>
-            <w:proofErr w:type="gramStart"/>
-            <w:r>
-              <w:rPr>
-                <w:lang w:val="en-US"/>
-              </w:rPr>
-              <w:t>comments</w:t>
-            </w:r>
-            <w:proofErr w:type="spellEnd"/>
-            <w:r>
-              <w:rPr>
-                <w:lang w:val="en-US"/>
-              </w:rPr>
-              <w:t xml:space="preserve"> %}</w:t>
-            </w:r>
-            <w:proofErr w:type="gramEnd"/>
+            <w:r>
+              <w:rPr>
+                <w:lang w:val="en-US"/>
+              </w:rPr>
+              <w:br/>
+            </w:r>
+            <w:r>
+              <w:rPr>
+                <w:lang w:val="en-US"/>
+              </w:rPr>
+              <w:t>{% for item in template_dict.special_characters.comments %}</w:t>
+            </w:r>
           </w:p>
           <w:p>
             <w:pPr>
@@ -4042,49 +3372,7 @@
               <w:rPr>
                 <w:lang w:val="en-US"/>
               </w:rPr>
-              <w:t xml:space="preserve">{{ </w:t>
-            </w:r>
-            <w:proofErr w:type="spellStart"/>
-            <w:r>
-              <w:rPr>
-                <w:lang w:val="en-US"/>
-              </w:rPr>
-              <w:t>item.file_</w:t>
-            </w:r>
-            <w:proofErr w:type="gramStart"/>
-            <w:r>
-              <w:rPr>
-                <w:lang w:val="en-US"/>
-              </w:rPr>
-              <w:t>name</w:t>
-            </w:r>
-            <w:proofErr w:type="spellEnd"/>
-            <w:r>
-              <w:rPr>
-                <w:lang w:val="en-US"/>
-              </w:rPr>
-              <w:t xml:space="preserve"> }}{%</w:t>
-            </w:r>
-            <w:proofErr w:type="gramEnd"/>
-            <w:r>
-              <w:rPr>
-                <w:lang w:val="en-US"/>
-              </w:rPr>
-              <w:t xml:space="preserve"> </w:t>
-            </w:r>
-            <w:proofErr w:type="spellStart"/>
-            <w:r>
-              <w:rPr>
-                <w:lang w:val="en-US"/>
-              </w:rPr>
-              <w:t>endfor</w:t>
-            </w:r>
-            <w:proofErr w:type="spellEnd"/>
-            <w:r>
-              <w:rPr>
-                <w:lang w:val="en-US"/>
-              </w:rPr>
-              <w:t xml:space="preserve"> %}</w:t>
+              <w:t>{{ item.file_name }}{% endfor %}</w:t>
             </w:r>
           </w:p>
         </w:tc>
@@ -4276,21 +3564,7 @@
               <w:rPr>
                 <w:lang w:val="en-US"/>
               </w:rPr>
-              <w:t xml:space="preserve">{% if </w:t>
-            </w:r>
-            <w:proofErr w:type="spellStart"/>
-            <w:r>
-              <w:rPr>
-                <w:lang w:val="en-US"/>
-              </w:rPr>
-              <w:t>template_dict.readme_file.comments|length</w:t>
-            </w:r>
-            <w:proofErr w:type="spellEnd"/>
-            <w:r>
-              <w:rPr>
-                <w:lang w:val="en-US"/>
-              </w:rPr>
-              <w:t xml:space="preserve"> </w:t>
+              <w:t xml:space="preserve">{% if template_dict.readme_file.comments|length </w:t>
             </w:r>
             <w:r>
               <w:rPr>
@@ -4359,21 +3633,7 @@
               <w:rPr>
                 <w:lang w:val="en-US"/>
               </w:rPr>
-              <w:t xml:space="preserve">{% if </w:t>
-            </w:r>
-            <w:proofErr w:type="spellStart"/>
-            <w:r>
-              <w:rPr>
-                <w:lang w:val="en-US"/>
-              </w:rPr>
-              <w:t>template_dict.file_ext.comments|length</w:t>
-            </w:r>
-            <w:proofErr w:type="spellEnd"/>
-            <w:r>
-              <w:rPr>
-                <w:lang w:val="en-US"/>
-              </w:rPr>
-              <w:t xml:space="preserve"> &gt; 0 %}X{% endif %}</w:t>
+              <w:t>{% if template_dict.file_ext.comments|length &gt; 0 %}X{% endif %}</w:t>
             </w:r>
           </w:p>
         </w:tc>
@@ -4456,41 +3716,18 @@
               </w:rPr>
               <w:t>List all files that do not contain file extensions:</w:t>
             </w:r>
-          </w:p>
-          <w:p>
-            <w:pPr>
-              <w:rPr>
-                <w:lang w:val="en-US"/>
-              </w:rPr>
-            </w:pPr>
-            <w:r>
-              <w:rPr>
-                <w:lang w:val="en-US"/>
-              </w:rPr>
-              <w:t xml:space="preserve">{% for item in </w:t>
-            </w:r>
-            <w:proofErr w:type="spellStart"/>
-            <w:r>
-              <w:rPr>
-                <w:lang w:val="en-US"/>
-              </w:rPr>
-              <w:t>template_dict.file_ext.</w:t>
-            </w:r>
-            <w:proofErr w:type="gramStart"/>
-            <w:r>
-              <w:rPr>
-                <w:lang w:val="en-US"/>
-              </w:rPr>
-              <w:t>comments</w:t>
-            </w:r>
-            <w:proofErr w:type="spellEnd"/>
-            <w:r>
-              <w:rPr>
-                <w:lang w:val="en-US"/>
-              </w:rPr>
-              <w:t xml:space="preserve"> %}</w:t>
-            </w:r>
-            <w:proofErr w:type="gramEnd"/>
+            <w:r>
+              <w:rPr>
+                <w:lang w:val="en-US"/>
+              </w:rPr>
+              <w:br/>
+            </w:r>
+            <w:r>
+              <w:rPr>
+                <w:lang w:val="en-US"/>
+              </w:rPr>
+              <w:t>{% for item in template_dict.file_ext.comments %}</w:t>
+            </w:r>
           </w:p>
           <w:p>
             <w:pPr>
@@ -4507,49 +3744,7 @@
               <w:rPr>
                 <w:lang w:val="en-US"/>
               </w:rPr>
-              <w:t xml:space="preserve">{{ </w:t>
-            </w:r>
-            <w:proofErr w:type="spellStart"/>
-            <w:r>
-              <w:rPr>
-                <w:lang w:val="en-US"/>
-              </w:rPr>
-              <w:t>item.file_</w:t>
-            </w:r>
-            <w:proofErr w:type="gramStart"/>
-            <w:r>
-              <w:rPr>
-                <w:lang w:val="en-US"/>
-              </w:rPr>
-              <w:t>name</w:t>
-            </w:r>
-            <w:proofErr w:type="spellEnd"/>
-            <w:r>
-              <w:rPr>
-                <w:lang w:val="en-US"/>
-              </w:rPr>
-              <w:t xml:space="preserve"> }}{%</w:t>
-            </w:r>
-            <w:proofErr w:type="gramEnd"/>
-            <w:r>
-              <w:rPr>
-                <w:lang w:val="en-US"/>
-              </w:rPr>
-              <w:t xml:space="preserve"> </w:t>
-            </w:r>
-            <w:proofErr w:type="spellStart"/>
-            <w:r>
-              <w:rPr>
-                <w:lang w:val="en-US"/>
-              </w:rPr>
-              <w:t>endfor</w:t>
-            </w:r>
-            <w:proofErr w:type="spellEnd"/>
-            <w:r>
-              <w:rPr>
-                <w:lang w:val="en-US"/>
-              </w:rPr>
-              <w:t xml:space="preserve"> %}</w:t>
+              <w:t>{{ item.file_name }}{% endfor %}</w:t>
             </w:r>
           </w:p>
         </w:tc>
@@ -5003,7 +4198,6 @@
                 <w:bCs/>
                 <w:lang w:val="en-US"/>
               </w:rPr>
-              <w:lastRenderedPageBreak/>
               <w:t>2.5</w:t>
             </w:r>
           </w:p>
@@ -5037,7 +4231,16 @@
                 <w:bCs/>
                 <w:lang w:val="en-US"/>
               </w:rPr>
-              <w:t>*If some files do not appear on the common file format list, is there information or documentation about how to open the files(s)?</w:t>
+              <w:t xml:space="preserve">*If some files do not appear on </w:t>
+            </w:r>
+            <w:r>
+              <w:rPr>
+                <w:b/>
+                <w:bCs/>
+                <w:lang w:val="en-US"/>
+              </w:rPr>
+              <w:lastRenderedPageBreak/>
+              <w:t>the common file format list, is there information or documentation about how to open the files(s)?</w:t>
             </w:r>
           </w:p>
         </w:tc>
@@ -5072,7 +4275,15 @@
               <w:rPr>
                 <w:lang w:val="en-US"/>
               </w:rPr>
-              <w:t>Review documentation files (e.g., README, other relevant files based on name) to determine if there is information about uncommon file types. </w:t>
+              <w:lastRenderedPageBreak/>
+              <w:t xml:space="preserve">Review documentation files </w:t>
+            </w:r>
+            <w:r>
+              <w:rPr>
+                <w:lang w:val="en-US"/>
+              </w:rPr>
+              <w:lastRenderedPageBreak/>
+              <w:t>(e.g., README, other relevant files based on name) to determine if there is information about uncommon file types. </w:t>
             </w:r>
           </w:p>
         </w:tc>
@@ -5301,6 +4512,7 @@
               <w:rPr>
                 <w:lang w:val="en-US"/>
               </w:rPr>
+              <w:lastRenderedPageBreak/>
               <w:t>Recommend</w:t>
             </w:r>
           </w:p>
@@ -5806,66 +5018,38 @@
               <w:rPr>
                 <w:lang w:val="en-US"/>
               </w:rPr>
-              <w:t xml:space="preserve">{% if </w:t>
-            </w:r>
-            <w:proofErr w:type="spellStart"/>
-            <w:r>
-              <w:rPr>
-                <w:lang w:val="en-US"/>
-              </w:rPr>
-              <w:t>template_dict.readme_file.comments|length</w:t>
-            </w:r>
-            <w:proofErr w:type="spellEnd"/>
-            <w:r>
-              <w:rPr>
-                <w:lang w:val="en-US"/>
-              </w:rPr>
-              <w:t xml:space="preserve"> &gt; 0 %}X{% endif %}</w:t>
-            </w:r>
-          </w:p>
-        </w:tc>
-        <w:tc>
-          <w:tcPr>
-            <w:tcW w:w="0" w:type="auto"/>
-            <w:tcBorders>
-              <w:top w:val="single" w:sz="8" w:space="0" w:color="000000"/>
-              <w:left w:val="single" w:sz="8" w:space="0" w:color="000000"/>
-              <w:bottom w:val="single" w:sz="8" w:space="0" w:color="000000"/>
-              <w:right w:val="single" w:sz="8" w:space="0" w:color="000000"/>
-            </w:tcBorders>
-            <w:tcMar>
-              <w:top w:w="100" w:type="dxa"/>
-              <w:left w:w="100" w:type="dxa"/>
-              <w:bottom w:w="100" w:type="dxa"/>
-              <w:right w:w="100" w:type="dxa"/>
-            </w:tcMar>
-            <w:hideMark/>
-          </w:tcPr>
-          <w:p>
-            <w:pPr>
-              <w:rPr>
-                <w:lang w:val="en-US"/>
-              </w:rPr>
-            </w:pPr>
-            <w:r>
-              <w:rPr>
-                <w:lang w:val="en-US"/>
-              </w:rPr>
-              <w:t xml:space="preserve">{% if </w:t>
-            </w:r>
-            <w:proofErr w:type="spellStart"/>
-            <w:r>
-              <w:rPr>
-                <w:lang w:val="en-US"/>
-              </w:rPr>
-              <w:t>template_dict.readme_file.comments|length</w:t>
-            </w:r>
-            <w:proofErr w:type="spellEnd"/>
-            <w:r>
-              <w:rPr>
-                <w:lang w:val="en-US"/>
-              </w:rPr>
-              <w:t xml:space="preserve"> == 0 %}X{% endif %}</w:t>
+              <w:t>{% if template_dict.readme_file.comments|length &gt; 0 %}X{% endif %}</w:t>
+            </w:r>
+          </w:p>
+        </w:tc>
+        <w:tc>
+          <w:tcPr>
+            <w:tcW w:w="0" w:type="auto"/>
+            <w:tcBorders>
+              <w:top w:val="single" w:sz="8" w:space="0" w:color="000000"/>
+              <w:left w:val="single" w:sz="8" w:space="0" w:color="000000"/>
+              <w:bottom w:val="single" w:sz="8" w:space="0" w:color="000000"/>
+              <w:right w:val="single" w:sz="8" w:space="0" w:color="000000"/>
+            </w:tcBorders>
+            <w:tcMar>
+              <w:top w:w="100" w:type="dxa"/>
+              <w:left w:w="100" w:type="dxa"/>
+              <w:bottom w:w="100" w:type="dxa"/>
+              <w:right w:w="100" w:type="dxa"/>
+            </w:tcMar>
+            <w:hideMark/>
+          </w:tcPr>
+          <w:p>
+            <w:pPr>
+              <w:rPr>
+                <w:lang w:val="en-US"/>
+              </w:rPr>
+            </w:pPr>
+            <w:r>
+              <w:rPr>
+                <w:lang w:val="en-US"/>
+              </w:rPr>
+              <w:t>{% if template_dict.readme_file.comments|length == 0 %}X{% endif %}</w:t>
             </w:r>
           </w:p>
         </w:tc>
@@ -5973,80 +5157,32 @@
               </w:rPr>
               <w:t>List the README file below:</w:t>
             </w:r>
-          </w:p>
-          <w:p>
-            <w:pPr>
-              <w:rPr>
-                <w:lang w:val="en-US"/>
-              </w:rPr>
-            </w:pPr>
-            <w:r>
-              <w:rPr>
-                <w:lang w:val="en-US"/>
-              </w:rPr>
-              <w:t xml:space="preserve">{% for item in </w:t>
-            </w:r>
-            <w:proofErr w:type="spellStart"/>
-            <w:r>
-              <w:rPr>
-                <w:lang w:val="en-US"/>
-              </w:rPr>
-              <w:t>template_dict.readme_file.</w:t>
-            </w:r>
-            <w:proofErr w:type="gramStart"/>
-            <w:r>
-              <w:rPr>
-                <w:lang w:val="en-US"/>
-              </w:rPr>
-              <w:t>comments</w:t>
-            </w:r>
-            <w:proofErr w:type="spellEnd"/>
-            <w:r>
-              <w:rPr>
-                <w:lang w:val="en-US"/>
-              </w:rPr>
-              <w:t xml:space="preserve"> %}</w:t>
-            </w:r>
-            <w:r>
-              <w:t>{{</w:t>
-            </w:r>
-            <w:proofErr w:type="gramEnd"/>
-            <w:r>
+            <w:r>
+              <w:rPr>
+                <w:lang w:val="en-US"/>
+              </w:rPr>
+              <w:br/>
+            </w:r>
+            <w:r>
+              <w:rPr>
+                <w:lang w:val="en-US"/>
+              </w:rPr>
+              <w:t>{% for item in template_dict.readme_file.comments %}</w:t>
+            </w:r>
+            <w:r>
+              <w:t>{{ loop.index }}.</w:t>
+            </w:r>
+            <w:r>
+              <w:rPr>
+                <w:rFonts w:hint="eastAsia"/>
+              </w:rPr>
               <w:t xml:space="preserve"> </w:t>
             </w:r>
-            <w:proofErr w:type="spellStart"/>
-            <w:r>
-              <w:t>loop.index</w:t>
-            </w:r>
-            <w:proofErr w:type="spellEnd"/>
-            <w:r>
-              <w:t xml:space="preserve"> }}.</w:t>
-            </w:r>
-            <w:r>
-              <w:rPr>
-                <w:rFonts w:hint="eastAsia"/>
-              </w:rPr>
-              <w:t xml:space="preserve"> </w:t>
-            </w:r>
-            <w:r>
-              <w:rPr>
-                <w:lang w:val="en-US"/>
-              </w:rPr>
-              <w:t xml:space="preserve">{{ </w:t>
-            </w:r>
-            <w:proofErr w:type="spellStart"/>
-            <w:r>
-              <w:rPr>
-                <w:lang w:val="en-US"/>
-              </w:rPr>
-              <w:t>item.file_name</w:t>
-            </w:r>
-            <w:proofErr w:type="spellEnd"/>
-            <w:r>
-              <w:rPr>
-                <w:lang w:val="en-US"/>
-              </w:rPr>
-              <w:t xml:space="preserve"> }}</w:t>
+            <w:r>
+              <w:rPr>
+                <w:lang w:val="en-US"/>
+              </w:rPr>
+              <w:t>{{ item.file_name }}</w:t>
             </w:r>
             <w:r>
               <w:rPr>
@@ -6058,21 +5194,7 @@
               <w:rPr>
                 <w:lang w:val="en-US"/>
               </w:rPr>
-              <w:t xml:space="preserve">{% </w:t>
-            </w:r>
-            <w:proofErr w:type="spellStart"/>
-            <w:r>
-              <w:rPr>
-                <w:lang w:val="en-US"/>
-              </w:rPr>
-              <w:t>endfor</w:t>
-            </w:r>
-            <w:proofErr w:type="spellEnd"/>
-            <w:r>
-              <w:rPr>
-                <w:lang w:val="en-US"/>
-              </w:rPr>
-              <w:t xml:space="preserve"> %}</w:t>
+              <w:t>{% endfor %}</w:t>
             </w:r>
           </w:p>
         </w:tc>
@@ -6860,36 +5982,18 @@
               </w:rPr>
               <w:t>’:</w:t>
             </w:r>
-          </w:p>
-          <w:p>
-            <w:r>
-              <w:rPr>
-                <w:lang w:val="en-US"/>
-              </w:rPr>
-              <w:t xml:space="preserve">{% for item in </w:t>
-            </w:r>
-            <w:proofErr w:type="spellStart"/>
-            <w:r>
-              <w:rPr>
-                <w:lang w:val="en-US"/>
-              </w:rPr>
-              <w:t>template_dict.typo.</w:t>
-            </w:r>
-            <w:proofErr w:type="gramStart"/>
-            <w:r>
-              <w:rPr>
-                <w:lang w:val="en-US"/>
-              </w:rPr>
-              <w:t>comments</w:t>
-            </w:r>
-            <w:proofErr w:type="spellEnd"/>
-            <w:r>
-              <w:rPr>
-                <w:lang w:val="en-US"/>
-              </w:rPr>
-              <w:t xml:space="preserve"> %}</w:t>
-            </w:r>
-            <w:proofErr w:type="gramEnd"/>
+            <w:r>
+              <w:rPr>
+                <w:lang w:val="en-US"/>
+              </w:rPr>
+              <w:br/>
+            </w:r>
+            <w:r>
+              <w:rPr>
+                <w:lang w:val="en-US"/>
+              </w:rPr>
+              <w:t>{% for item in template_dict.typo.comments %}</w:t>
+            </w:r>
           </w:p>
           <w:p>
             <w:pPr>
@@ -6899,33 +6003,11 @@
                 <w:numId w:val="27"/>
               </w:numPr>
             </w:pPr>
-            <w:proofErr w:type="gramStart"/>
-            <w:r>
-              <w:rPr>
-                <w:lang w:val="en-US"/>
-              </w:rPr>
-              <w:t>{{ item }}{%</w:t>
-            </w:r>
-            <w:proofErr w:type="gramEnd"/>
-            <w:r>
-              <w:rPr>
-                <w:lang w:val="en-US"/>
-              </w:rPr>
-              <w:t xml:space="preserve"> </w:t>
-            </w:r>
-            <w:proofErr w:type="spellStart"/>
-            <w:r>
-              <w:rPr>
-                <w:lang w:val="en-US"/>
-              </w:rPr>
-              <w:t>endfor</w:t>
-            </w:r>
-            <w:proofErr w:type="spellEnd"/>
-            <w:r>
-              <w:rPr>
-                <w:lang w:val="en-US"/>
-              </w:rPr>
-              <w:t xml:space="preserve"> %}</w:t>
+            <w:r>
+              <w:rPr>
+                <w:lang w:val="en-US"/>
+              </w:rPr>
+              <w:t>{{ item }}{% endfor %}</w:t>
             </w:r>
           </w:p>
           <w:p>
@@ -7036,7 +6118,6 @@
                 <w:bCs/>
                 <w:lang w:val="en-US"/>
               </w:rPr>
-              <w:lastRenderedPageBreak/>
               <w:t>4.2</w:t>
             </w:r>
           </w:p>
@@ -7070,38 +6151,55 @@
                 <w:bCs/>
                 <w:lang w:val="en-US"/>
               </w:rPr>
-              <w:t>Do the metadata fields contain a valid entry?</w:t>
-            </w:r>
-          </w:p>
-        </w:tc>
-        <w:tc>
-          <w:tcPr>
-            <w:tcW w:w="0" w:type="auto"/>
-            <w:tcBorders>
-              <w:top w:val="single" w:sz="8" w:space="0" w:color="000000"/>
-              <w:left w:val="single" w:sz="8" w:space="0" w:color="000000"/>
-              <w:bottom w:val="single" w:sz="8" w:space="0" w:color="000000"/>
-              <w:right w:val="single" w:sz="8" w:space="0" w:color="000000"/>
-            </w:tcBorders>
-            <w:tcMar>
-              <w:top w:w="100" w:type="dxa"/>
-              <w:left w:w="100" w:type="dxa"/>
-              <w:bottom w:w="100" w:type="dxa"/>
-              <w:right w:w="100" w:type="dxa"/>
-            </w:tcMar>
-            <w:hideMark/>
-          </w:tcPr>
-          <w:p>
-            <w:pPr>
-              <w:rPr>
-                <w:lang w:val="en-US"/>
-              </w:rPr>
-            </w:pPr>
-            <w:r>
-              <w:rPr>
-                <w:lang w:val="en-US"/>
-              </w:rPr>
-              <w:t>Review the following fields to ensure there is a valid entry and flag any issues:</w:t>
+              <w:t xml:space="preserve">Do the metadata fields </w:t>
+            </w:r>
+            <w:r>
+              <w:rPr>
+                <w:b/>
+                <w:bCs/>
+                <w:lang w:val="en-US"/>
+              </w:rPr>
+              <w:lastRenderedPageBreak/>
+              <w:t>contain a valid entry?</w:t>
+            </w:r>
+          </w:p>
+        </w:tc>
+        <w:tc>
+          <w:tcPr>
+            <w:tcW w:w="0" w:type="auto"/>
+            <w:tcBorders>
+              <w:top w:val="single" w:sz="8" w:space="0" w:color="000000"/>
+              <w:left w:val="single" w:sz="8" w:space="0" w:color="000000"/>
+              <w:bottom w:val="single" w:sz="8" w:space="0" w:color="000000"/>
+              <w:right w:val="single" w:sz="8" w:space="0" w:color="000000"/>
+            </w:tcBorders>
+            <w:tcMar>
+              <w:top w:w="100" w:type="dxa"/>
+              <w:left w:w="100" w:type="dxa"/>
+              <w:bottom w:w="100" w:type="dxa"/>
+              <w:right w:w="100" w:type="dxa"/>
+            </w:tcMar>
+            <w:hideMark/>
+          </w:tcPr>
+          <w:p>
+            <w:pPr>
+              <w:rPr>
+                <w:lang w:val="en-US"/>
+              </w:rPr>
+            </w:pPr>
+            <w:r>
+              <w:rPr>
+                <w:lang w:val="en-US"/>
+              </w:rPr>
+              <w:lastRenderedPageBreak/>
+              <w:t xml:space="preserve">Review the following fields to ensure there is a </w:t>
+            </w:r>
+            <w:r>
+              <w:rPr>
+                <w:lang w:val="en-US"/>
+              </w:rPr>
+              <w:lastRenderedPageBreak/>
+              <w:t>valid entry and flag any issues:</w:t>
             </w:r>
           </w:p>
           <w:p>
@@ -7381,6 +6479,7 @@
               <w:rPr>
                 <w:lang w:val="en-US"/>
               </w:rPr>
+              <w:lastRenderedPageBreak/>
               <w:t>Require</w:t>
             </w:r>
           </w:p>
@@ -7536,21 +6635,8 @@
             <w:r>
               <w:t xml:space="preserve">not </w:t>
             </w:r>
-            <w:proofErr w:type="spellStart"/>
-            <w:r>
-              <w:t>template_</w:t>
-            </w:r>
-            <w:proofErr w:type="gramStart"/>
-            <w:r>
-              <w:t>dict.none</w:t>
-            </w:r>
-            <w:proofErr w:type="gramEnd"/>
-            <w:r>
-              <w:t>_author_affiliation</w:t>
-            </w:r>
-            <w:proofErr w:type="spellEnd"/>
-            <w:r>
-              <w:t xml:space="preserve"> %}X{% endif %}</w:t>
+            <w:r>
+              <w:t>template_dict.none_author_affiliation %}X{% endif %}</w:t>
             </w:r>
           </w:p>
         </w:tc>
@@ -7583,21 +6669,8 @@
             <w:r>
               <w:t xml:space="preserve"> </w:t>
             </w:r>
-            <w:proofErr w:type="spellStart"/>
-            <w:r>
-              <w:t>template_</w:t>
-            </w:r>
-            <w:proofErr w:type="gramStart"/>
-            <w:r>
-              <w:t>dict.none</w:t>
-            </w:r>
-            <w:proofErr w:type="gramEnd"/>
-            <w:r>
-              <w:t>_author_affiliation</w:t>
-            </w:r>
-            <w:proofErr w:type="spellEnd"/>
-            <w:r>
-              <w:t xml:space="preserve"> %}X{% endif %}</w:t>
+            <w:r>
+              <w:t>template_dict.none_author_affiliation %}X{% endif %}</w:t>
             </w:r>
           </w:p>
         </w:tc>
@@ -8241,14 +7314,14 @@
               <w:rPr>
                 <w:lang w:val="en-US"/>
               </w:rPr>
-              <w:t xml:space="preserve">Review description, notes, and terms </w:t>
+              <w:t xml:space="preserve">Review description, notes, and terms of access </w:t>
             </w:r>
             <w:r>
               <w:rPr>
                 <w:lang w:val="en-US"/>
               </w:rPr>
               <w:lastRenderedPageBreak/>
-              <w:t>of access metadata fields.</w:t>
+              <w:t>metadata fields.</w:t>
             </w:r>
           </w:p>
         </w:tc>
@@ -9091,13 +8164,95 @@
               </w:rPr>
               <w:t>List any restricted files in this dataset:</w:t>
             </w:r>
-          </w:p>
-          <w:p>
-            <w:pPr>
+            <w:r>
+              <w:rPr>
+                <w:lang w:val="en-US"/>
+              </w:rPr>
+              <w:br/>
+            </w:r>
+            <w:r>
+              <w:rPr>
+                <w:lang w:val="en-US"/>
+              </w:rPr>
+              <w:t>{% for item in template_dict.</w:t>
+            </w:r>
+            <w:r>
+              <w:rPr>
+                <w:rFonts w:ascii="Consolas" w:eastAsia="Times New Roman" w:hAnsi="Consolas" w:cs="Times New Roman"/>
+                <w:color w:val="9CDCFE"/>
+                <w:kern w:val="0"/>
+                <w:sz w:val="21"/>
+                <w:szCs w:val="21"/>
+                <w14:ligatures w14:val="none"/>
+              </w:rPr>
+              <w:t xml:space="preserve"> </w:t>
+            </w:r>
+            <w:r>
+              <w:t>restricted_files</w:t>
+            </w:r>
+            <w:r>
+              <w:rPr>
+                <w:lang w:val="en-US"/>
+              </w:rPr>
+              <w:t>.comments %}</w:t>
+            </w:r>
+          </w:p>
+          <w:p>
+            <w:pPr>
+              <w:pStyle w:val="ListParagraph"/>
               <w:numPr>
                 <w:ilvl w:val="0"/>
-                <w:numId w:val="20"/>
+                <w:numId w:val="28"/>
               </w:numPr>
+            </w:pPr>
+            <w:r>
+              <w:rPr>
+                <w:lang w:val="en-US"/>
+              </w:rPr>
+              <w:t xml:space="preserve">{{ </w:t>
+            </w:r>
+            <w:r>
+              <w:rPr>
+                <w:rFonts w:hint="eastAsia"/>
+                <w:lang w:val="en-US"/>
+              </w:rPr>
+              <w:t>item.</w:t>
+            </w:r>
+            <w:r>
+              <w:rPr>
+                <w:lang w:val="en-US"/>
+              </w:rPr>
+              <w:t>file_name</w:t>
+            </w:r>
+            <w:r>
+              <w:rPr>
+                <w:lang w:val="en-US"/>
+              </w:rPr>
+              <w:t xml:space="preserve"> }}{% endfor %}</w:t>
+            </w:r>
+          </w:p>
+          <w:p>
+            <w:pPr>
+              <w:rPr>
+                <w:lang w:val="en-US"/>
+              </w:rPr>
+            </w:pPr>
+          </w:p>
+          <w:p>
+            <w:pPr>
+              <w:rPr>
+                <w:lang w:val="en-US"/>
+              </w:rPr>
+            </w:pPr>
+            <w:r>
+              <w:rPr>
+                <w:lang w:val="en-US"/>
+              </w:rPr>
+              <w:t>License applied to dataset:</w:t>
+            </w:r>
+          </w:p>
+          <w:p>
+            <w:pPr>
               <w:rPr>
                 <w:lang w:val="en-US"/>
               </w:rPr>
@@ -9133,28 +8288,226 @@
                 <w:lang w:val="en-US"/>
               </w:rPr>
             </w:pPr>
-            <w:r>
-              <w:rPr>
-                <w:lang w:val="en-US"/>
-              </w:rPr>
-              <w:t>License applied to dataset:</w:t>
-            </w:r>
-          </w:p>
-          <w:p>
-            <w:pPr>
-              <w:rPr>
-                <w:lang w:val="en-US"/>
-              </w:rPr>
-            </w:pPr>
-          </w:p>
-          <w:p>
-            <w:pPr>
+          </w:p>
+        </w:tc>
+        <w:tc>
+          <w:tcPr>
+            <w:tcW w:w="0" w:type="auto"/>
+            <w:tcBorders>
+              <w:top w:val="single" w:sz="8" w:space="0" w:color="000000"/>
+              <w:left w:val="single" w:sz="8" w:space="0" w:color="000000"/>
+              <w:bottom w:val="single" w:sz="8" w:space="0" w:color="000000"/>
+              <w:right w:val="single" w:sz="8" w:space="0" w:color="000000"/>
+            </w:tcBorders>
+            <w:tcMar>
+              <w:top w:w="100" w:type="dxa"/>
+              <w:left w:w="100" w:type="dxa"/>
+              <w:bottom w:w="100" w:type="dxa"/>
+              <w:right w:w="100" w:type="dxa"/>
+            </w:tcMar>
+            <w:hideMark/>
+          </w:tcPr>
+          <w:p>
+            <w:pPr>
+              <w:rPr>
+                <w:lang w:val="en-US"/>
+              </w:rPr>
+            </w:pPr>
+            <w:r>
+              <w:rPr>
+                <w:lang w:val="en-US"/>
+              </w:rPr>
+              <w:t>Require</w:t>
+            </w:r>
+          </w:p>
+        </w:tc>
+        <w:tc>
+          <w:tcPr>
+            <w:tcW w:w="0" w:type="auto"/>
+            <w:tcBorders>
+              <w:top w:val="single" w:sz="8" w:space="0" w:color="000000"/>
+              <w:left w:val="single" w:sz="8" w:space="0" w:color="000000"/>
+              <w:bottom w:val="single" w:sz="8" w:space="0" w:color="000000"/>
+              <w:right w:val="single" w:sz="8" w:space="0" w:color="000000"/>
+            </w:tcBorders>
+            <w:tcMar>
+              <w:top w:w="100" w:type="dxa"/>
+              <w:left w:w="100" w:type="dxa"/>
+              <w:bottom w:w="100" w:type="dxa"/>
+              <w:right w:w="100" w:type="dxa"/>
+            </w:tcMar>
+            <w:hideMark/>
+          </w:tcPr>
+          <w:p>
+            <w:pPr>
+              <w:rPr>
+                <w:lang w:val="en-US"/>
+              </w:rPr>
+            </w:pPr>
+            <w:r>
+              <w:rPr>
+                <w:lang w:val="en-US"/>
+              </w:rPr>
+              <w:t>Python scripted</w:t>
+            </w:r>
+          </w:p>
+        </w:tc>
+      </w:tr>
+      <w:tr>
+        <w:trPr>
+          <w:trHeight w:val="480"/>
+        </w:trPr>
+        <w:tc>
+          <w:tcPr>
+            <w:tcW w:w="0" w:type="auto"/>
+            <w:tcBorders>
+              <w:top w:val="single" w:sz="8" w:space="0" w:color="000000"/>
+              <w:left w:val="single" w:sz="8" w:space="0" w:color="000000"/>
+              <w:bottom w:val="single" w:sz="8" w:space="0" w:color="000000"/>
+              <w:right w:val="single" w:sz="8" w:space="0" w:color="000000"/>
+            </w:tcBorders>
+            <w:tcMar>
+              <w:top w:w="100" w:type="dxa"/>
+              <w:left w:w="100" w:type="dxa"/>
+              <w:bottom w:w="100" w:type="dxa"/>
+              <w:right w:w="100" w:type="dxa"/>
+            </w:tcMar>
+            <w:hideMark/>
+          </w:tcPr>
+          <w:p>
+            <w:pPr>
+              <w:rPr>
+                <w:lang w:val="en-US"/>
+              </w:rPr>
+            </w:pPr>
+            <w:r>
               <w:rPr>
                 <w:b/>
                 <w:bCs/>
-                <w:color w:val="FF0000"/>
-                <w:sz w:val="40"/>
-                <w:szCs w:val="40"/>
+                <w:lang w:val="en-US"/>
+              </w:rPr>
+              <w:t>5.4a</w:t>
+            </w:r>
+          </w:p>
+        </w:tc>
+        <w:tc>
+          <w:tcPr>
+            <w:tcW w:w="0" w:type="auto"/>
+            <w:tcBorders>
+              <w:top w:val="single" w:sz="8" w:space="0" w:color="000000"/>
+              <w:left w:val="single" w:sz="8" w:space="0" w:color="000000"/>
+              <w:bottom w:val="single" w:sz="8" w:space="0" w:color="000000"/>
+              <w:right w:val="single" w:sz="8" w:space="0" w:color="000000"/>
+            </w:tcBorders>
+            <w:tcMar>
+              <w:top w:w="100" w:type="dxa"/>
+              <w:left w:w="100" w:type="dxa"/>
+              <w:bottom w:w="100" w:type="dxa"/>
+              <w:right w:w="100" w:type="dxa"/>
+            </w:tcMar>
+            <w:hideMark/>
+          </w:tcPr>
+          <w:p>
+            <w:pPr>
+              <w:rPr>
+                <w:lang w:val="en-US"/>
+              </w:rPr>
+            </w:pPr>
+            <w:r>
+              <w:rPr>
+                <w:b/>
+                <w:bCs/>
+                <w:lang w:val="en-US"/>
+              </w:rPr>
+              <w:t xml:space="preserve">*If there are restricted </w:t>
+            </w:r>
+            <w:r>
+              <w:rPr>
+                <w:b/>
+                <w:bCs/>
+                <w:lang w:val="en-US"/>
+              </w:rPr>
+              <w:lastRenderedPageBreak/>
+              <w:t>files in the dataset, is the Terms of Access field complete?</w:t>
+            </w:r>
+          </w:p>
+        </w:tc>
+        <w:tc>
+          <w:tcPr>
+            <w:tcW w:w="0" w:type="auto"/>
+            <w:tcBorders>
+              <w:top w:val="single" w:sz="8" w:space="0" w:color="000000"/>
+              <w:left w:val="single" w:sz="8" w:space="0" w:color="000000"/>
+              <w:bottom w:val="single" w:sz="8" w:space="0" w:color="000000"/>
+              <w:right w:val="single" w:sz="8" w:space="0" w:color="000000"/>
+            </w:tcBorders>
+            <w:tcMar>
+              <w:top w:w="100" w:type="dxa"/>
+              <w:left w:w="100" w:type="dxa"/>
+              <w:bottom w:w="100" w:type="dxa"/>
+              <w:right w:w="100" w:type="dxa"/>
+            </w:tcMar>
+            <w:hideMark/>
+          </w:tcPr>
+          <w:p>
+            <w:pPr>
+              <w:rPr>
+                <w:lang w:val="en-US"/>
+              </w:rPr>
+            </w:pPr>
+            <w:r>
+              <w:rPr>
+                <w:lang w:val="en-US"/>
+              </w:rPr>
+              <w:lastRenderedPageBreak/>
+              <w:t>Python scripted.</w:t>
+            </w:r>
+          </w:p>
+          <w:p>
+            <w:pPr>
+              <w:rPr>
+                <w:lang w:val="en-US"/>
+              </w:rPr>
+            </w:pPr>
+          </w:p>
+          <w:p>
+            <w:pPr>
+              <w:numPr>
+                <w:ilvl w:val="0"/>
+                <w:numId w:val="21"/>
+              </w:numPr>
+              <w:rPr>
+                <w:lang w:val="en-US"/>
+              </w:rPr>
+            </w:pPr>
+            <w:r>
+              <w:rPr>
+                <w:lang w:val="en-US"/>
+              </w:rPr>
+              <w:t>If there are restricted files and no Terms of Access, recommend including terms of access.</w:t>
+            </w:r>
+          </w:p>
+        </w:tc>
+        <w:tc>
+          <w:tcPr>
+            <w:tcW w:w="0" w:type="auto"/>
+            <w:tcBorders>
+              <w:top w:val="single" w:sz="8" w:space="0" w:color="000000"/>
+              <w:left w:val="single" w:sz="8" w:space="0" w:color="000000"/>
+              <w:bottom w:val="single" w:sz="8" w:space="0" w:color="000000"/>
+              <w:right w:val="single" w:sz="8" w:space="0" w:color="000000"/>
+            </w:tcBorders>
+            <w:tcMar>
+              <w:top w:w="100" w:type="dxa"/>
+              <w:left w:w="100" w:type="dxa"/>
+              <w:bottom w:w="100" w:type="dxa"/>
+              <w:right w:w="100" w:type="dxa"/>
+            </w:tcMar>
+            <w:hideMark/>
+          </w:tcPr>
+          <w:p>
+            <w:pPr>
+              <w:rPr>
                 <w:lang w:val="en-US"/>
               </w:rPr>
             </w:pPr>
@@ -9168,218 +8521,34 @@
                 <w:szCs w:val="40"/>
                 <w:lang w:val="en-US"/>
               </w:rPr>
+              <w:lastRenderedPageBreak/>
               <w:t>TBD</w:t>
             </w:r>
           </w:p>
-          <w:p>
-            <w:pPr>
-              <w:rPr>
-                <w:lang w:val="en-US"/>
-              </w:rPr>
-            </w:pPr>
-          </w:p>
-        </w:tc>
-        <w:tc>
-          <w:tcPr>
-            <w:tcW w:w="0" w:type="auto"/>
-            <w:tcBorders>
-              <w:top w:val="single" w:sz="8" w:space="0" w:color="000000"/>
-              <w:left w:val="single" w:sz="8" w:space="0" w:color="000000"/>
-              <w:bottom w:val="single" w:sz="8" w:space="0" w:color="000000"/>
-              <w:right w:val="single" w:sz="8" w:space="0" w:color="000000"/>
-            </w:tcBorders>
-            <w:tcMar>
-              <w:top w:w="100" w:type="dxa"/>
-              <w:left w:w="100" w:type="dxa"/>
-              <w:bottom w:w="100" w:type="dxa"/>
-              <w:right w:w="100" w:type="dxa"/>
-            </w:tcMar>
-            <w:hideMark/>
-          </w:tcPr>
-          <w:p>
-            <w:pPr>
-              <w:rPr>
-                <w:lang w:val="en-US"/>
-              </w:rPr>
-            </w:pPr>
-            <w:r>
-              <w:rPr>
-                <w:lang w:val="en-US"/>
-              </w:rPr>
-              <w:t>Require</w:t>
-            </w:r>
-          </w:p>
-        </w:tc>
-        <w:tc>
-          <w:tcPr>
-            <w:tcW w:w="0" w:type="auto"/>
-            <w:tcBorders>
-              <w:top w:val="single" w:sz="8" w:space="0" w:color="000000"/>
-              <w:left w:val="single" w:sz="8" w:space="0" w:color="000000"/>
-              <w:bottom w:val="single" w:sz="8" w:space="0" w:color="000000"/>
-              <w:right w:val="single" w:sz="8" w:space="0" w:color="000000"/>
-            </w:tcBorders>
-            <w:tcMar>
-              <w:top w:w="100" w:type="dxa"/>
-              <w:left w:w="100" w:type="dxa"/>
-              <w:bottom w:w="100" w:type="dxa"/>
-              <w:right w:w="100" w:type="dxa"/>
-            </w:tcMar>
-            <w:hideMark/>
-          </w:tcPr>
-          <w:p>
-            <w:pPr>
-              <w:rPr>
-                <w:lang w:val="en-US"/>
-              </w:rPr>
-            </w:pPr>
-            <w:r>
-              <w:rPr>
-                <w:lang w:val="en-US"/>
-              </w:rPr>
-              <w:t>Python scripted</w:t>
-            </w:r>
-          </w:p>
-        </w:tc>
-      </w:tr>
-      <w:tr>
-        <w:trPr>
-          <w:trHeight w:val="480"/>
-        </w:trPr>
-        <w:tc>
-          <w:tcPr>
-            <w:tcW w:w="0" w:type="auto"/>
-            <w:tcBorders>
-              <w:top w:val="single" w:sz="8" w:space="0" w:color="000000"/>
-              <w:left w:val="single" w:sz="8" w:space="0" w:color="000000"/>
-              <w:bottom w:val="single" w:sz="8" w:space="0" w:color="000000"/>
-              <w:right w:val="single" w:sz="8" w:space="0" w:color="000000"/>
-            </w:tcBorders>
-            <w:tcMar>
-              <w:top w:w="100" w:type="dxa"/>
-              <w:left w:w="100" w:type="dxa"/>
-              <w:bottom w:w="100" w:type="dxa"/>
-              <w:right w:w="100" w:type="dxa"/>
-            </w:tcMar>
-            <w:hideMark/>
-          </w:tcPr>
-          <w:p>
-            <w:pPr>
-              <w:rPr>
-                <w:lang w:val="en-US"/>
-              </w:rPr>
-            </w:pPr>
-            <w:r>
-              <w:rPr>
-                <w:b/>
-                <w:bCs/>
-                <w:lang w:val="en-US"/>
-              </w:rPr>
-              <w:lastRenderedPageBreak/>
-              <w:t>5.4a</w:t>
-            </w:r>
-          </w:p>
-        </w:tc>
-        <w:tc>
-          <w:tcPr>
-            <w:tcW w:w="0" w:type="auto"/>
-            <w:tcBorders>
-              <w:top w:val="single" w:sz="8" w:space="0" w:color="000000"/>
-              <w:left w:val="single" w:sz="8" w:space="0" w:color="000000"/>
-              <w:bottom w:val="single" w:sz="8" w:space="0" w:color="000000"/>
-              <w:right w:val="single" w:sz="8" w:space="0" w:color="000000"/>
-            </w:tcBorders>
-            <w:tcMar>
-              <w:top w:w="100" w:type="dxa"/>
-              <w:left w:w="100" w:type="dxa"/>
-              <w:bottom w:w="100" w:type="dxa"/>
-              <w:right w:w="100" w:type="dxa"/>
-            </w:tcMar>
-            <w:hideMark/>
-          </w:tcPr>
-          <w:p>
-            <w:pPr>
-              <w:rPr>
-                <w:lang w:val="en-US"/>
-              </w:rPr>
-            </w:pPr>
-            <w:r>
-              <w:rPr>
-                <w:b/>
-                <w:bCs/>
-                <w:lang w:val="en-US"/>
-              </w:rPr>
-              <w:t>*If there are restricted files in the dataset, is the Terms of Access field complete?</w:t>
-            </w:r>
-          </w:p>
-        </w:tc>
-        <w:tc>
-          <w:tcPr>
-            <w:tcW w:w="0" w:type="auto"/>
-            <w:tcBorders>
-              <w:top w:val="single" w:sz="8" w:space="0" w:color="000000"/>
-              <w:left w:val="single" w:sz="8" w:space="0" w:color="000000"/>
-              <w:bottom w:val="single" w:sz="8" w:space="0" w:color="000000"/>
-              <w:right w:val="single" w:sz="8" w:space="0" w:color="000000"/>
-            </w:tcBorders>
-            <w:tcMar>
-              <w:top w:w="100" w:type="dxa"/>
-              <w:left w:w="100" w:type="dxa"/>
-              <w:bottom w:w="100" w:type="dxa"/>
-              <w:right w:w="100" w:type="dxa"/>
-            </w:tcMar>
-            <w:hideMark/>
-          </w:tcPr>
-          <w:p>
-            <w:pPr>
-              <w:rPr>
-                <w:lang w:val="en-US"/>
-              </w:rPr>
-            </w:pPr>
-            <w:r>
-              <w:rPr>
-                <w:lang w:val="en-US"/>
-              </w:rPr>
-              <w:t>Python scripted.</w:t>
-            </w:r>
-          </w:p>
-          <w:p>
-            <w:pPr>
-              <w:rPr>
-                <w:lang w:val="en-US"/>
-              </w:rPr>
-            </w:pPr>
-          </w:p>
-          <w:p>
-            <w:pPr>
-              <w:numPr>
-                <w:ilvl w:val="0"/>
-                <w:numId w:val="21"/>
-              </w:numPr>
-              <w:rPr>
-                <w:lang w:val="en-US"/>
-              </w:rPr>
-            </w:pPr>
-            <w:r>
-              <w:rPr>
-                <w:lang w:val="en-US"/>
-              </w:rPr>
-              <w:t xml:space="preserve">If there are restricted files and no Terms of Access, </w:t>
-            </w:r>
-            <w:proofErr w:type="gramStart"/>
-            <w:r>
-              <w:rPr>
-                <w:lang w:val="en-US"/>
-              </w:rPr>
-              <w:t>recommend</w:t>
-            </w:r>
-            <w:proofErr w:type="gramEnd"/>
-            <w:r>
-              <w:rPr>
-                <w:lang w:val="en-US"/>
-              </w:rPr>
-              <w:t xml:space="preserve"> including terms of access.</w:t>
-            </w:r>
+        </w:tc>
+        <w:tc>
+          <w:tcPr>
+            <w:tcW w:w="0" w:type="auto"/>
+            <w:tcBorders>
+              <w:top w:val="single" w:sz="8" w:space="0" w:color="000000"/>
+              <w:left w:val="single" w:sz="8" w:space="0" w:color="000000"/>
+              <w:bottom w:val="single" w:sz="8" w:space="0" w:color="000000"/>
+              <w:right w:val="single" w:sz="8" w:space="0" w:color="000000"/>
+            </w:tcBorders>
+            <w:tcMar>
+              <w:top w:w="100" w:type="dxa"/>
+              <w:left w:w="100" w:type="dxa"/>
+              <w:bottom w:w="100" w:type="dxa"/>
+              <w:right w:w="100" w:type="dxa"/>
+            </w:tcMar>
+            <w:hideMark/>
+          </w:tcPr>
+          <w:p>
+            <w:pPr>
+              <w:rPr>
+                <w:lang w:val="en-US"/>
+              </w:rPr>
+            </w:pPr>
           </w:p>
         </w:tc>
         <w:tc>
@@ -9467,6 +8636,36 @@
                 <w:lang w:val="en-US"/>
               </w:rPr>
             </w:pPr>
+          </w:p>
+        </w:tc>
+        <w:tc>
+          <w:tcPr>
+            <w:tcW w:w="0" w:type="auto"/>
+            <w:tcBorders>
+              <w:top w:val="single" w:sz="8" w:space="0" w:color="000000"/>
+              <w:left w:val="single" w:sz="8" w:space="0" w:color="000000"/>
+              <w:bottom w:val="single" w:sz="8" w:space="0" w:color="000000"/>
+              <w:right w:val="single" w:sz="8" w:space="0" w:color="000000"/>
+            </w:tcBorders>
+            <w:tcMar>
+              <w:top w:w="100" w:type="dxa"/>
+              <w:left w:w="100" w:type="dxa"/>
+              <w:bottom w:w="100" w:type="dxa"/>
+              <w:right w:w="100" w:type="dxa"/>
+            </w:tcMar>
+            <w:hideMark/>
+          </w:tcPr>
+          <w:p>
+            <w:pPr>
+              <w:rPr>
+                <w:b/>
+                <w:bCs/>
+                <w:color w:val="FF0000"/>
+                <w:sz w:val="40"/>
+                <w:szCs w:val="40"/>
+                <w:lang w:val="en-US"/>
+              </w:rPr>
+            </w:pPr>
             <w:r>
               <w:rPr>
                 <w:rFonts w:hint="eastAsia"/>
@@ -9504,98 +8703,6 @@
                 <w:lang w:val="en-US"/>
               </w:rPr>
             </w:pPr>
-          </w:p>
-        </w:tc>
-        <w:tc>
-          <w:tcPr>
-            <w:tcW w:w="0" w:type="auto"/>
-            <w:tcBorders>
-              <w:top w:val="single" w:sz="8" w:space="0" w:color="000000"/>
-              <w:left w:val="single" w:sz="8" w:space="0" w:color="000000"/>
-              <w:bottom w:val="single" w:sz="8" w:space="0" w:color="000000"/>
-              <w:right w:val="single" w:sz="8" w:space="0" w:color="000000"/>
-            </w:tcBorders>
-            <w:tcMar>
-              <w:top w:w="100" w:type="dxa"/>
-              <w:left w:w="100" w:type="dxa"/>
-              <w:bottom w:w="100" w:type="dxa"/>
-              <w:right w:w="100" w:type="dxa"/>
-            </w:tcMar>
-            <w:hideMark/>
-          </w:tcPr>
-          <w:p>
-            <w:pPr>
-              <w:rPr>
-                <w:lang w:val="en-US"/>
-              </w:rPr>
-            </w:pPr>
-          </w:p>
-        </w:tc>
-        <w:tc>
-          <w:tcPr>
-            <w:tcW w:w="0" w:type="auto"/>
-            <w:tcBorders>
-              <w:top w:val="single" w:sz="8" w:space="0" w:color="000000"/>
-              <w:left w:val="single" w:sz="8" w:space="0" w:color="000000"/>
-              <w:bottom w:val="single" w:sz="8" w:space="0" w:color="000000"/>
-              <w:right w:val="single" w:sz="8" w:space="0" w:color="000000"/>
-            </w:tcBorders>
-            <w:tcMar>
-              <w:top w:w="100" w:type="dxa"/>
-              <w:left w:w="100" w:type="dxa"/>
-              <w:bottom w:w="100" w:type="dxa"/>
-              <w:right w:w="100" w:type="dxa"/>
-            </w:tcMar>
-            <w:hideMark/>
-          </w:tcPr>
-          <w:p>
-            <w:pPr>
-              <w:rPr>
-                <w:b/>
-                <w:bCs/>
-                <w:color w:val="FF0000"/>
-                <w:sz w:val="40"/>
-                <w:szCs w:val="40"/>
-                <w:lang w:val="en-US"/>
-              </w:rPr>
-            </w:pPr>
-            <w:r>
-              <w:rPr>
-                <w:rFonts w:hint="eastAsia"/>
-                <w:b/>
-                <w:bCs/>
-                <w:color w:val="FF0000"/>
-                <w:sz w:val="40"/>
-                <w:szCs w:val="40"/>
-                <w:lang w:val="en-US"/>
-              </w:rPr>
-              <w:t>TBD</w:t>
-            </w:r>
-          </w:p>
-        </w:tc>
-        <w:tc>
-          <w:tcPr>
-            <w:tcW w:w="0" w:type="auto"/>
-            <w:tcBorders>
-              <w:top w:val="single" w:sz="8" w:space="0" w:color="000000"/>
-              <w:left w:val="single" w:sz="8" w:space="0" w:color="000000"/>
-              <w:bottom w:val="single" w:sz="8" w:space="0" w:color="000000"/>
-              <w:right w:val="single" w:sz="8" w:space="0" w:color="000000"/>
-            </w:tcBorders>
-            <w:tcMar>
-              <w:top w:w="100" w:type="dxa"/>
-              <w:left w:w="100" w:type="dxa"/>
-              <w:bottom w:w="100" w:type="dxa"/>
-              <w:right w:w="100" w:type="dxa"/>
-            </w:tcMar>
-            <w:hideMark/>
-          </w:tcPr>
-          <w:p>
-            <w:pPr>
-              <w:rPr>
-                <w:lang w:val="en-US"/>
-              </w:rPr>
-            </w:pPr>
             <w:r>
               <w:rPr>
                 <w:lang w:val="en-US"/>
@@ -9631,7 +8738,14 @@
               <w:rPr>
                 <w:lang w:val="en-US"/>
               </w:rPr>
-              <w:t>Python scripted</w:t>
+              <w:t xml:space="preserve">Python </w:t>
+            </w:r>
+            <w:r>
+              <w:rPr>
+                <w:lang w:val="en-US"/>
+              </w:rPr>
+              <w:lastRenderedPageBreak/>
+              <w:t>scripted</w:t>
             </w:r>
           </w:p>
         </w:tc>
@@ -11572,6 +10686,95 @@
     </w:lvl>
   </w:abstractNum>
   <w:abstractNum w:abstractNumId="16" w15:restartNumberingAfterBreak="0">
+    <w:nsid w:val="561074E4"/>
+    <w:multiLevelType w:val="hybridMultilevel"/>
+    <w:tmpl w:val="4C4C890E"/>
+    <w:lvl w:ilvl="0" w:tplc="FFFFFFFF">
+      <w:start w:val="1"/>
+      <w:numFmt w:val="decimal"/>
+      <w:lvlText w:val="%1."/>
+      <w:lvlJc w:val="left"/>
+      <w:pPr>
+        <w:ind w:left="720" w:hanging="360"/>
+      </w:pPr>
+      <w:rPr>
+        <w:rFonts w:hint="default"/>
+      </w:rPr>
+    </w:lvl>
+    <w:lvl w:ilvl="1" w:tplc="FFFFFFFF" w:tentative="1">
+      <w:start w:val="1"/>
+      <w:numFmt w:val="lowerLetter"/>
+      <w:lvlText w:val="%2."/>
+      <w:lvlJc w:val="left"/>
+      <w:pPr>
+        <w:ind w:left="1440" w:hanging="360"/>
+      </w:pPr>
+    </w:lvl>
+    <w:lvl w:ilvl="2" w:tplc="FFFFFFFF" w:tentative="1">
+      <w:start w:val="1"/>
+      <w:numFmt w:val="lowerRoman"/>
+      <w:lvlText w:val="%3."/>
+      <w:lvlJc w:val="right"/>
+      <w:pPr>
+        <w:ind w:left="2160" w:hanging="180"/>
+      </w:pPr>
+    </w:lvl>
+    <w:lvl w:ilvl="3" w:tplc="FFFFFFFF" w:tentative="1">
+      <w:start w:val="1"/>
+      <w:numFmt w:val="decimal"/>
+      <w:lvlText w:val="%4."/>
+      <w:lvlJc w:val="left"/>
+      <w:pPr>
+        <w:ind w:left="2880" w:hanging="360"/>
+      </w:pPr>
+    </w:lvl>
+    <w:lvl w:ilvl="4" w:tplc="FFFFFFFF" w:tentative="1">
+      <w:start w:val="1"/>
+      <w:numFmt w:val="lowerLetter"/>
+      <w:lvlText w:val="%5."/>
+      <w:lvlJc w:val="left"/>
+      <w:pPr>
+        <w:ind w:left="3600" w:hanging="360"/>
+      </w:pPr>
+    </w:lvl>
+    <w:lvl w:ilvl="5" w:tplc="FFFFFFFF" w:tentative="1">
+      <w:start w:val="1"/>
+      <w:numFmt w:val="lowerRoman"/>
+      <w:lvlText w:val="%6."/>
+      <w:lvlJc w:val="right"/>
+      <w:pPr>
+        <w:ind w:left="4320" w:hanging="180"/>
+      </w:pPr>
+    </w:lvl>
+    <w:lvl w:ilvl="6" w:tplc="FFFFFFFF" w:tentative="1">
+      <w:start w:val="1"/>
+      <w:numFmt w:val="decimal"/>
+      <w:lvlText w:val="%7."/>
+      <w:lvlJc w:val="left"/>
+      <w:pPr>
+        <w:ind w:left="5040" w:hanging="360"/>
+      </w:pPr>
+    </w:lvl>
+    <w:lvl w:ilvl="7" w:tplc="FFFFFFFF" w:tentative="1">
+      <w:start w:val="1"/>
+      <w:numFmt w:val="lowerLetter"/>
+      <w:lvlText w:val="%8."/>
+      <w:lvlJc w:val="left"/>
+      <w:pPr>
+        <w:ind w:left="5760" w:hanging="360"/>
+      </w:pPr>
+    </w:lvl>
+    <w:lvl w:ilvl="8" w:tplc="FFFFFFFF" w:tentative="1">
+      <w:start w:val="1"/>
+      <w:numFmt w:val="lowerRoman"/>
+      <w:lvlText w:val="%9."/>
+      <w:lvlJc w:val="right"/>
+      <w:pPr>
+        <w:ind w:left="6480" w:hanging="180"/>
+      </w:pPr>
+    </w:lvl>
+  </w:abstractNum>
+  <w:abstractNum w:abstractNumId="17" w15:restartNumberingAfterBreak="0">
     <w:nsid w:val="572A226F"/>
     <w:multiLevelType w:val="multilevel"/>
     <w:tmpl w:val="81FC1D9E"/>
@@ -11684,7 +10887,7 @@
       </w:pPr>
     </w:lvl>
   </w:abstractNum>
-  <w:abstractNum w:abstractNumId="17" w15:restartNumberingAfterBreak="0">
+  <w:abstractNum w:abstractNumId="18" w15:restartNumberingAfterBreak="0">
     <w:nsid w:val="5BF5117B"/>
     <w:multiLevelType w:val="multilevel"/>
     <w:tmpl w:val="8A1481F6"/>
@@ -11797,7 +11000,7 @@
       </w:pPr>
     </w:lvl>
   </w:abstractNum>
-  <w:abstractNum w:abstractNumId="18" w15:restartNumberingAfterBreak="0">
+  <w:abstractNum w:abstractNumId="19" w15:restartNumberingAfterBreak="0">
     <w:nsid w:val="5D3E6FA0"/>
     <w:multiLevelType w:val="multilevel"/>
     <w:tmpl w:val="1DD496E8"/>
@@ -11910,7 +11113,7 @@
       </w:pPr>
     </w:lvl>
   </w:abstractNum>
-  <w:abstractNum w:abstractNumId="19" w15:restartNumberingAfterBreak="0">
+  <w:abstractNum w:abstractNumId="20" w15:restartNumberingAfterBreak="0">
     <w:nsid w:val="5F935511"/>
     <w:multiLevelType w:val="multilevel"/>
     <w:tmpl w:val="44AE5600"/>
@@ -12023,7 +11226,7 @@
       </w:pPr>
     </w:lvl>
   </w:abstractNum>
-  <w:abstractNum w:abstractNumId="20" w15:restartNumberingAfterBreak="0">
+  <w:abstractNum w:abstractNumId="21" w15:restartNumberingAfterBreak="0">
     <w:nsid w:val="62330FFA"/>
     <w:multiLevelType w:val="multilevel"/>
     <w:tmpl w:val="1354050A"/>
@@ -12136,7 +11339,7 @@
       </w:pPr>
     </w:lvl>
   </w:abstractNum>
-  <w:abstractNum w:abstractNumId="21" w15:restartNumberingAfterBreak="0">
+  <w:abstractNum w:abstractNumId="22" w15:restartNumberingAfterBreak="0">
     <w:nsid w:val="653571BB"/>
     <w:multiLevelType w:val="multilevel"/>
     <w:tmpl w:val="E0F0DCF4"/>
@@ -12249,7 +11452,7 @@
       </w:pPr>
     </w:lvl>
   </w:abstractNum>
-  <w:abstractNum w:abstractNumId="22" w15:restartNumberingAfterBreak="0">
+  <w:abstractNum w:abstractNumId="23" w15:restartNumberingAfterBreak="0">
     <w:nsid w:val="69731E7F"/>
     <w:multiLevelType w:val="multilevel"/>
     <w:tmpl w:val="4FEA352E"/>
@@ -12398,7 +11601,7 @@
       </w:rPr>
     </w:lvl>
   </w:abstractNum>
-  <w:abstractNum w:abstractNumId="23" w15:restartNumberingAfterBreak="0">
+  <w:abstractNum w:abstractNumId="24" w15:restartNumberingAfterBreak="0">
     <w:nsid w:val="6DE2596E"/>
     <w:multiLevelType w:val="hybridMultilevel"/>
     <w:tmpl w:val="4C4C890E"/>
@@ -12487,7 +11690,7 @@
       </w:pPr>
     </w:lvl>
   </w:abstractNum>
-  <w:abstractNum w:abstractNumId="24" w15:restartNumberingAfterBreak="0">
+  <w:abstractNum w:abstractNumId="25" w15:restartNumberingAfterBreak="0">
     <w:nsid w:val="75520C24"/>
     <w:multiLevelType w:val="hybridMultilevel"/>
     <w:tmpl w:val="FCCE1BF6"/>
@@ -12576,7 +11779,7 @@
       </w:pPr>
     </w:lvl>
   </w:abstractNum>
-  <w:abstractNum w:abstractNumId="25" w15:restartNumberingAfterBreak="0">
+  <w:abstractNum w:abstractNumId="26" w15:restartNumberingAfterBreak="0">
     <w:nsid w:val="76FC0259"/>
     <w:multiLevelType w:val="multilevel"/>
     <w:tmpl w:val="79680AA4"/>
@@ -12689,7 +11892,7 @@
       </w:pPr>
     </w:lvl>
   </w:abstractNum>
-  <w:abstractNum w:abstractNumId="26" w15:restartNumberingAfterBreak="0">
+  <w:abstractNum w:abstractNumId="27" w15:restartNumberingAfterBreak="0">
     <w:nsid w:val="77A70C23"/>
     <w:multiLevelType w:val="multilevel"/>
     <w:tmpl w:val="8E221C46"/>
@@ -12809,19 +12012,19 @@
     <w:abstractNumId w:val="7"/>
   </w:num>
   <w:num w:numId="3" w16cid:durableId="1561554637">
-    <w:abstractNumId w:val="16"/>
+    <w:abstractNumId w:val="17"/>
   </w:num>
   <w:num w:numId="4" w16cid:durableId="1987002333">
-    <w:abstractNumId w:val="26"/>
+    <w:abstractNumId w:val="27"/>
   </w:num>
   <w:num w:numId="5" w16cid:durableId="1029794338">
     <w:abstractNumId w:val="13"/>
   </w:num>
   <w:num w:numId="6" w16cid:durableId="1650086756">
-    <w:abstractNumId w:val="18"/>
+    <w:abstractNumId w:val="19"/>
   </w:num>
   <w:num w:numId="7" w16cid:durableId="1476222975">
-    <w:abstractNumId w:val="25"/>
+    <w:abstractNumId w:val="26"/>
   </w:num>
   <w:num w:numId="8" w16cid:durableId="1533764241">
     <w:abstractNumId w:val="2"/>
@@ -12833,16 +12036,16 @@
     <w:abstractNumId w:val="3"/>
   </w:num>
   <w:num w:numId="11" w16cid:durableId="793057457">
-    <w:abstractNumId w:val="17"/>
+    <w:abstractNumId w:val="18"/>
   </w:num>
   <w:num w:numId="12" w16cid:durableId="2146773725">
-    <w:abstractNumId w:val="21"/>
+    <w:abstractNumId w:val="22"/>
   </w:num>
   <w:num w:numId="13" w16cid:durableId="1026561013">
     <w:abstractNumId w:val="9"/>
   </w:num>
   <w:num w:numId="14" w16cid:durableId="1192110950">
-    <w:abstractNumId w:val="19"/>
+    <w:abstractNumId w:val="20"/>
   </w:num>
   <w:num w:numId="15" w16cid:durableId="1262841238">
     <w:abstractNumId w:val="8"/>
@@ -12854,19 +12057,19 @@
     <w:abstractNumId w:val="14"/>
   </w:num>
   <w:num w:numId="18" w16cid:durableId="1409767320">
-    <w:abstractNumId w:val="22"/>
+    <w:abstractNumId w:val="23"/>
   </w:num>
   <w:num w:numId="19" w16cid:durableId="2045591211">
     <w:abstractNumId w:val="10"/>
   </w:num>
   <w:num w:numId="20" w16cid:durableId="1764063768">
-    <w:abstractNumId w:val="20"/>
+    <w:abstractNumId w:val="21"/>
   </w:num>
   <w:num w:numId="21" w16cid:durableId="218832961">
     <w:abstractNumId w:val="12"/>
   </w:num>
   <w:num w:numId="22" w16cid:durableId="2045669289">
-    <w:abstractNumId w:val="24"/>
+    <w:abstractNumId w:val="25"/>
   </w:num>
   <w:num w:numId="23" w16cid:durableId="953443745">
     <w:abstractNumId w:val="6"/>
@@ -12878,10 +12081,13 @@
     <w:abstractNumId w:val="1"/>
   </w:num>
   <w:num w:numId="26" w16cid:durableId="1365129283">
-    <w:abstractNumId w:val="23"/>
+    <w:abstractNumId w:val="24"/>
   </w:num>
   <w:num w:numId="27" w16cid:durableId="1202403600">
     <w:abstractNumId w:val="11"/>
+  </w:num>
+  <w:num w:numId="28" w16cid:durableId="282420373">
+    <w:abstractNumId w:val="16"/>
   </w:num>
 </w:numbering>
 </file>
@@ -13286,7 +12492,7 @@
   <w:style w:type="paragraph" w:default="1" w:styleId="Normal">
     <w:name w:val="Normal"/>
     <w:qFormat/>
-    <w:rsid w:val="00AD6F1A"/>
+    <w:rsid w:val="001C5BBA"/>
     <w:rPr>
       <w:lang w:val="en-CA"/>
     </w:rPr>

</xml_diff>

<commit_message>
1. Added support for getting Terms of Use, License and Terms of Access
</commit_message>
<xml_diff>
--- a/res/template_new.docx
+++ b/res/template_new.docx
@@ -44,6 +44,7 @@
         </w:rPr>
         <w:t xml:space="preserve"> </w:t>
       </w:r>
+      <w:proofErr w:type="spellStart"/>
       <w:r>
         <w:t>project_info</w:t>
       </w:r>
@@ -56,6 +57,7 @@
       <w:r>
         <w:t>ticket_number</w:t>
       </w:r>
+      <w:proofErr w:type="spellEnd"/>
       <w:r>
         <w:rPr>
           <w:rFonts w:hint="eastAsia"/>
@@ -88,6 +90,7 @@
         </w:rPr>
         <w:t xml:space="preserve"> {{ </w:t>
       </w:r>
+      <w:proofErr w:type="spellStart"/>
       <w:r>
         <w:t>project_info</w:t>
       </w:r>
@@ -95,7 +98,14 @@
         <w:rPr>
           <w:rFonts w:hint="eastAsia"/>
         </w:rPr>
-        <w:t>.curator_name }}</w:t>
+        <w:t>.curator_name</w:t>
+      </w:r>
+      <w:proofErr w:type="spellEnd"/>
+      <w:r>
+        <w:rPr>
+          <w:rFonts w:hint="eastAsia"/>
+        </w:rPr>
+        <w:t xml:space="preserve"> }}</w:t>
       </w:r>
     </w:p>
     <w:p>
@@ -105,6 +115,7 @@
         </w:rPr>
         <w:t xml:space="preserve">Curator email: {{ </w:t>
       </w:r>
+      <w:proofErr w:type="spellStart"/>
       <w:r>
         <w:t>project_info</w:t>
       </w:r>
@@ -117,6 +128,7 @@
       <w:r>
         <w:t>curator_email</w:t>
       </w:r>
+      <w:proofErr w:type="spellEnd"/>
       <w:r>
         <w:rPr>
           <w:rFonts w:hint="eastAsia"/>
@@ -137,6 +149,7 @@
         </w:rPr>
         <w:t xml:space="preserve">{{ </w:t>
       </w:r>
+      <w:proofErr w:type="spellStart"/>
       <w:r>
         <w:rPr>
           <w:rFonts w:hint="eastAsia"/>
@@ -146,6 +159,7 @@
       <w:r>
         <w:t>DatasetTitle</w:t>
       </w:r>
+      <w:proofErr w:type="spellEnd"/>
       <w:r>
         <w:rPr>
           <w:rFonts w:hint="eastAsia"/>
@@ -193,6 +207,7 @@
         </w:rPr>
         <w:t xml:space="preserve"> </w:t>
       </w:r>
+      <w:proofErr w:type="spellStart"/>
       <w:r>
         <w:rPr>
           <w:rFonts w:hint="eastAsia"/>
@@ -202,6 +217,7 @@
       <w:r>
         <w:t>DatasetPersistentId</w:t>
       </w:r>
+      <w:proofErr w:type="spellEnd"/>
       <w:r>
         <w:rPr>
           <w:rFonts w:hint="eastAsia"/>
@@ -240,11 +256,19 @@
         <w:rPr>
           <w:rFonts w:hint="eastAsia"/>
         </w:rPr>
-        <w:t xml:space="preserve"> dataset.</w:t>
+        <w:t xml:space="preserve"> </w:t>
+      </w:r>
+      <w:proofErr w:type="spellStart"/>
+      <w:r>
+        <w:rPr>
+          <w:rFonts w:hint="eastAsia"/>
+        </w:rPr>
+        <w:t>dataset.</w:t>
       </w:r>
       <w:r>
         <w:t>DatasetURL</w:t>
       </w:r>
+      <w:proofErr w:type="spellEnd"/>
       <w:r>
         <w:rPr>
           <w:rFonts w:hint="eastAsia"/>
@@ -358,17 +382,17 @@
         <w:tblLook w:val="04A0" w:firstRow="1" w:lastRow="0" w:firstColumn="1" w:lastColumn="0" w:noHBand="0" w:noVBand="1"/>
       </w:tblPr>
       <w:tblGrid>
-        <w:gridCol w:w="540"/>
-        <w:gridCol w:w="1455"/>
-        <w:gridCol w:w="1948"/>
-        <w:gridCol w:w="4147"/>
-        <w:gridCol w:w="3599"/>
-        <w:gridCol w:w="4147"/>
-        <w:gridCol w:w="433"/>
-        <w:gridCol w:w="437"/>
-        <w:gridCol w:w="3622"/>
-        <w:gridCol w:w="1180"/>
-        <w:gridCol w:w="843"/>
+        <w:gridCol w:w="522"/>
+        <w:gridCol w:w="1389"/>
+        <w:gridCol w:w="1856"/>
+        <w:gridCol w:w="3939"/>
+        <w:gridCol w:w="3420"/>
+        <w:gridCol w:w="3939"/>
+        <w:gridCol w:w="421"/>
+        <w:gridCol w:w="425"/>
+        <w:gridCol w:w="4501"/>
+        <w:gridCol w:w="1129"/>
+        <w:gridCol w:w="810"/>
       </w:tblGrid>
       <w:tr>
         <w:trPr>
@@ -1036,7 +1060,25 @@
                 <w:bCs/>
                 <w:lang w:val="en-US"/>
               </w:rPr>
-              <w:t>Has the depositor (or their research group) previously created or submitted to a dataverse?</w:t>
+              <w:t xml:space="preserve">Has the depositor (or their research group) previously created or submitted to a </w:t>
+            </w:r>
+            <w:proofErr w:type="spellStart"/>
+            <w:r>
+              <w:rPr>
+                <w:b/>
+                <w:bCs/>
+                <w:lang w:val="en-US"/>
+              </w:rPr>
+              <w:t>dataverse</w:t>
+            </w:r>
+            <w:proofErr w:type="spellEnd"/>
+            <w:r>
+              <w:rPr>
+                <w:b/>
+                <w:bCs/>
+                <w:lang w:val="en-US"/>
+              </w:rPr>
+              <w:t>?</w:t>
             </w:r>
           </w:p>
         </w:tc>
@@ -1098,7 +1140,14 @@
               <w:rPr>
                 <w:lang w:val="en-US"/>
               </w:rPr>
-              <w:t>{% if template_dict.</w:t>
+              <w:t xml:space="preserve">{% if </w:t>
+            </w:r>
+            <w:proofErr w:type="spellStart"/>
+            <w:r>
+              <w:rPr>
+                <w:lang w:val="en-US"/>
+              </w:rPr>
+              <w:t>template_dict.</w:t>
             </w:r>
             <w:r>
               <w:rPr>
@@ -1111,7 +1160,14 @@
               <w:rPr>
                 <w:lang w:val="en-US"/>
               </w:rPr>
-              <w:t xml:space="preserve">.comments|length </w:t>
+              <w:t>.comments|length</w:t>
+            </w:r>
+            <w:proofErr w:type="spellEnd"/>
+            <w:r>
+              <w:rPr>
+                <w:lang w:val="en-US"/>
+              </w:rPr>
+              <w:t xml:space="preserve"> </w:t>
             </w:r>
             <w:r>
               <w:rPr>
@@ -1162,7 +1218,14 @@
               <w:rPr>
                 <w:lang w:val="en-US"/>
               </w:rPr>
-              <w:t>{% if template_dict.</w:t>
+              <w:t xml:space="preserve">{% if </w:t>
+            </w:r>
+            <w:proofErr w:type="spellStart"/>
+            <w:r>
+              <w:rPr>
+                <w:lang w:val="en-US"/>
+              </w:rPr>
+              <w:t>template_dict.</w:t>
             </w:r>
             <w:r>
               <w:rPr>
@@ -1175,7 +1238,14 @@
               <w:rPr>
                 <w:lang w:val="en-US"/>
               </w:rPr>
-              <w:t xml:space="preserve">.comments|length </w:t>
+              <w:t>.comments|length</w:t>
+            </w:r>
+            <w:proofErr w:type="spellEnd"/>
+            <w:r>
+              <w:rPr>
+                <w:lang w:val="en-US"/>
+              </w:rPr>
+              <w:t xml:space="preserve"> </w:t>
             </w:r>
             <w:r>
               <w:rPr>
@@ -1301,7 +1371,21 @@
               <w:rPr>
                 <w:lang w:val="en-US"/>
               </w:rPr>
-              <w:t>If relevant, list previously created dataverse:</w:t>
+              <w:t xml:space="preserve">If relevant, list previously created </w:t>
+            </w:r>
+            <w:proofErr w:type="spellStart"/>
+            <w:r>
+              <w:rPr>
+                <w:lang w:val="en-US"/>
+              </w:rPr>
+              <w:t>dataverse</w:t>
+            </w:r>
+            <w:proofErr w:type="spellEnd"/>
+            <w:r>
+              <w:rPr>
+                <w:lang w:val="en-US"/>
+              </w:rPr>
+              <w:t>:</w:t>
             </w:r>
             <w:r>
               <w:rPr>
@@ -1310,12 +1394,36 @@
               <w:br/>
             </w:r>
             <w:r>
-              <w:t xml:space="preserve">{% for item in template_dict.dv_record.comments %} </w:t>
-            </w:r>
-          </w:p>
-          <w:p>
-            <w:r>
-              <w:t>{% for author, dataverses in item.items() %} {{ author }}</w:t>
+              <w:t xml:space="preserve">{% for item in </w:t>
+            </w:r>
+            <w:proofErr w:type="spellStart"/>
+            <w:r>
+              <w:t>template_dict.dv_record.comments</w:t>
+            </w:r>
+            <w:proofErr w:type="spellEnd"/>
+            <w:r>
+              <w:t xml:space="preserve"> %} </w:t>
+            </w:r>
+          </w:p>
+          <w:p>
+            <w:r>
+              <w:t xml:space="preserve">{% for author, </w:t>
+            </w:r>
+            <w:proofErr w:type="spellStart"/>
+            <w:r>
+              <w:t>dataverses</w:t>
+            </w:r>
+            <w:proofErr w:type="spellEnd"/>
+            <w:r>
+              <w:t xml:space="preserve"> in </w:t>
+            </w:r>
+            <w:proofErr w:type="spellStart"/>
+            <w:r>
+              <w:t>item.items</w:t>
+            </w:r>
+            <w:proofErr w:type="spellEnd"/>
+            <w:r>
+              <w:t>() %} {{ author }}</w:t>
             </w:r>
             <w:r>
               <w:rPr>
@@ -1326,10 +1434,34 @@
           </w:p>
           <w:p>
             <w:r>
-              <w:t xml:space="preserve">{% for dataverse in dataverses %} </w:t>
-            </w:r>
-            <w:r>
-              <w:t>{{ loop.index }}.</w:t>
+              <w:t xml:space="preserve">{% for </w:t>
+            </w:r>
+            <w:proofErr w:type="spellStart"/>
+            <w:r>
+              <w:t>dataverse</w:t>
+            </w:r>
+            <w:proofErr w:type="spellEnd"/>
+            <w:r>
+              <w:t xml:space="preserve"> in </w:t>
+            </w:r>
+            <w:proofErr w:type="spellStart"/>
+            <w:r>
+              <w:t>dataverses</w:t>
+            </w:r>
+            <w:proofErr w:type="spellEnd"/>
+            <w:r>
+              <w:t xml:space="preserve"> %} </w:t>
+            </w:r>
+            <w:r>
+              <w:t xml:space="preserve">{{ </w:t>
+            </w:r>
+            <w:proofErr w:type="spellStart"/>
+            <w:r>
+              <w:t>loop.index</w:t>
+            </w:r>
+            <w:proofErr w:type="spellEnd"/>
+            <w:r>
+              <w:t xml:space="preserve"> }}.</w:t>
             </w:r>
             <w:r>
               <w:rPr>
@@ -1344,13 +1476,37 @@
               <w:br/>
             </w:r>
             <w:r>
-              <w:t xml:space="preserve">{% endfor %} </w:t>
+              <w:t xml:space="preserve">{% </w:t>
+            </w:r>
+            <w:proofErr w:type="spellStart"/>
+            <w:r>
+              <w:t>endfor</w:t>
+            </w:r>
+            <w:proofErr w:type="spellEnd"/>
+            <w:r>
+              <w:t xml:space="preserve"> %} </w:t>
             </w:r>
             <w:r>
               <w:br/>
             </w:r>
             <w:r>
-              <w:t>{% endfor %} {% endfor %}</w:t>
+              <w:t xml:space="preserve">{% </w:t>
+            </w:r>
+            <w:proofErr w:type="spellStart"/>
+            <w:r>
+              <w:t>endfor</w:t>
+            </w:r>
+            <w:proofErr w:type="spellEnd"/>
+            <w:r>
+              <w:t xml:space="preserve"> %} {% </w:t>
+            </w:r>
+            <w:proofErr w:type="spellStart"/>
+            <w:r>
+              <w:t>endfor</w:t>
+            </w:r>
+            <w:proofErr w:type="spellEnd"/>
+            <w:r>
+              <w:t xml:space="preserve"> %}</w:t>
             </w:r>
           </w:p>
         </w:tc>
@@ -1528,40 +1684,68 @@
               <w:rPr>
                 <w:lang w:val="en-US"/>
               </w:rPr>
-              <w:t>If the dataset is deposited in a sub-dataverse collection, include the name of the collection. </w:t>
-            </w:r>
-          </w:p>
-          <w:p>
-            <w:pPr>
-              <w:rPr>
-                <w:lang w:val="en-US"/>
-              </w:rPr>
-            </w:pPr>
-          </w:p>
-        </w:tc>
-        <w:tc>
-          <w:tcPr>
-            <w:tcW w:w="0" w:type="auto"/>
-            <w:tcBorders>
-              <w:top w:val="single" w:sz="8" w:space="0" w:color="000000"/>
-              <w:left w:val="single" w:sz="8" w:space="0" w:color="000000"/>
-              <w:bottom w:val="single" w:sz="8" w:space="0" w:color="000000"/>
-              <w:right w:val="single" w:sz="8" w:space="0" w:color="000000"/>
-            </w:tcBorders>
-            <w:tcMar>
-              <w:top w:w="100" w:type="dxa"/>
-              <w:left w:w="100" w:type="dxa"/>
-              <w:bottom w:w="100" w:type="dxa"/>
-              <w:right w:w="100" w:type="dxa"/>
-            </w:tcMar>
-            <w:hideMark/>
-          </w:tcPr>
-          <w:p>
-            <w:r>
-              <w:rPr>
-                <w:lang w:val="en-US"/>
-              </w:rPr>
-              <w:t>{% if template_dict.</w:t>
+              <w:t>If the dataset is deposited in a sub-</w:t>
+            </w:r>
+            <w:proofErr w:type="spellStart"/>
+            <w:r>
+              <w:rPr>
+                <w:lang w:val="en-US"/>
+              </w:rPr>
+              <w:t>dataverse</w:t>
+            </w:r>
+            <w:proofErr w:type="spellEnd"/>
+            <w:r>
+              <w:rPr>
+                <w:lang w:val="en-US"/>
+              </w:rPr>
+              <w:t xml:space="preserve"> collection, include the name of the collection. </w:t>
+            </w:r>
+          </w:p>
+          <w:p>
+            <w:pPr>
+              <w:rPr>
+                <w:lang w:val="en-US"/>
+              </w:rPr>
+            </w:pPr>
+          </w:p>
+        </w:tc>
+        <w:tc>
+          <w:tcPr>
+            <w:tcW w:w="0" w:type="auto"/>
+            <w:tcBorders>
+              <w:top w:val="single" w:sz="8" w:space="0" w:color="000000"/>
+              <w:left w:val="single" w:sz="8" w:space="0" w:color="000000"/>
+              <w:bottom w:val="single" w:sz="8" w:space="0" w:color="000000"/>
+              <w:right w:val="single" w:sz="8" w:space="0" w:color="000000"/>
+            </w:tcBorders>
+            <w:tcMar>
+              <w:top w:w="100" w:type="dxa"/>
+              <w:left w:w="100" w:type="dxa"/>
+              <w:bottom w:w="100" w:type="dxa"/>
+              <w:right w:w="100" w:type="dxa"/>
+            </w:tcMar>
+            <w:hideMark/>
+          </w:tcPr>
+          <w:p>
+            <w:r>
+              <w:rPr>
+                <w:lang w:val="en-US"/>
+              </w:rPr>
+              <w:t xml:space="preserve">{% if </w:t>
+            </w:r>
+            <w:proofErr w:type="spellStart"/>
+            <w:r>
+              <w:rPr>
+                <w:lang w:val="en-US"/>
+              </w:rPr>
+              <w:t>template_dict</w:t>
+            </w:r>
+            <w:proofErr w:type="spellEnd"/>
+            <w:r>
+              <w:rPr>
+                <w:lang w:val="en-US"/>
+              </w:rPr>
+              <w:t>.</w:t>
             </w:r>
             <w:r>
               <w:rPr>
@@ -1574,9 +1758,11 @@
               </w:rPr>
               <w:t xml:space="preserve"> </w:t>
             </w:r>
+            <w:proofErr w:type="spellStart"/>
             <w:r>
               <w:t>name_name_of_dataverse</w:t>
             </w:r>
+            <w:proofErr w:type="spellEnd"/>
             <w:r>
               <w:rPr>
                 <w:lang w:val="en-US"/>
@@ -1636,7 +1822,21 @@
               <w:rPr>
                 <w:lang w:val="en-US"/>
               </w:rPr>
-              <w:t>{% if template_dict.</w:t>
+              <w:t xml:space="preserve">{% if </w:t>
+            </w:r>
+            <w:proofErr w:type="spellStart"/>
+            <w:r>
+              <w:rPr>
+                <w:lang w:val="en-US"/>
+              </w:rPr>
+              <w:t>template_dict</w:t>
+            </w:r>
+            <w:proofErr w:type="spellEnd"/>
+            <w:r>
+              <w:rPr>
+                <w:lang w:val="en-US"/>
+              </w:rPr>
+              <w:t>.</w:t>
             </w:r>
             <w:r>
               <w:rPr>
@@ -1649,9 +1849,11 @@
               </w:rPr>
               <w:t xml:space="preserve"> </w:t>
             </w:r>
+            <w:proofErr w:type="spellStart"/>
             <w:r>
               <w:t>name_name_of_dataverse</w:t>
             </w:r>
+            <w:proofErr w:type="spellEnd"/>
             <w:r>
               <w:rPr>
                 <w:lang w:val="en-US"/>
@@ -1806,7 +2008,23 @@
                 <w:rFonts w:hint="eastAsia"/>
                 <w:lang w:val="en-US"/>
               </w:rPr>
-              <w:t xml:space="preserve">List the dataverse </w:t>
+              <w:t xml:space="preserve">List the </w:t>
+            </w:r>
+            <w:proofErr w:type="spellStart"/>
+            <w:r>
+              <w:rPr>
+                <w:rFonts w:hint="eastAsia"/>
+                <w:lang w:val="en-US"/>
+              </w:rPr>
+              <w:t>dataverse</w:t>
+            </w:r>
+            <w:proofErr w:type="spellEnd"/>
+            <w:r>
+              <w:rPr>
+                <w:rFonts w:hint="eastAsia"/>
+                <w:lang w:val="en-US"/>
+              </w:rPr>
+              <w:t xml:space="preserve"> </w:t>
             </w:r>
             <w:r>
               <w:rPr>
@@ -1834,9 +2052,11 @@
               </w:rPr>
               <w:t xml:space="preserve">{{ </w:t>
             </w:r>
+            <w:proofErr w:type="spellStart"/>
             <w:r>
               <w:t>template_dict</w:t>
             </w:r>
+            <w:proofErr w:type="spellEnd"/>
             <w:r>
               <w:rPr>
                 <w:rFonts w:hint="eastAsia"/>
@@ -1844,8 +2064,13 @@
               <w:t>.</w:t>
             </w:r>
             <w:r>
-              <w:t xml:space="preserve"> name_name_of_dataverse</w:t>
-            </w:r>
+              <w:t xml:space="preserve"> </w:t>
+            </w:r>
+            <w:proofErr w:type="spellStart"/>
+            <w:r>
+              <w:t>name_name_of_dataverse</w:t>
+            </w:r>
+            <w:proofErr w:type="spellEnd"/>
             <w:r>
               <w:rPr>
                 <w:rFonts w:hint="eastAsia"/>
@@ -1981,38 +2206,88 @@
                 <w:bCs/>
                 <w:lang w:val="en-US"/>
               </w:rPr>
-              <w:t>*If the dataset was deposited in a sub-dataverse collection, does it require its own dataverse?</w:t>
-            </w:r>
-          </w:p>
-        </w:tc>
-        <w:tc>
-          <w:tcPr>
-            <w:tcW w:w="0" w:type="auto"/>
-            <w:tcBorders>
-              <w:top w:val="single" w:sz="8" w:space="0" w:color="000000"/>
-              <w:left w:val="single" w:sz="8" w:space="0" w:color="000000"/>
-              <w:bottom w:val="single" w:sz="8" w:space="0" w:color="000000"/>
-              <w:right w:val="single" w:sz="8" w:space="0" w:color="000000"/>
-            </w:tcBorders>
-            <w:tcMar>
-              <w:top w:w="100" w:type="dxa"/>
-              <w:left w:w="100" w:type="dxa"/>
-              <w:bottom w:w="100" w:type="dxa"/>
-              <w:right w:w="100" w:type="dxa"/>
-            </w:tcMar>
-            <w:hideMark/>
-          </w:tcPr>
-          <w:p>
-            <w:pPr>
-              <w:rPr>
-                <w:lang w:val="en-US"/>
-              </w:rPr>
-            </w:pPr>
-            <w:r>
-              <w:rPr>
-                <w:lang w:val="en-US"/>
-              </w:rPr>
-              <w:t>If the depositor created a dataverse with one dataset:</w:t>
+              <w:t>*If the dataset was deposited in a sub-</w:t>
+            </w:r>
+            <w:proofErr w:type="spellStart"/>
+            <w:r>
+              <w:rPr>
+                <w:b/>
+                <w:bCs/>
+                <w:lang w:val="en-US"/>
+              </w:rPr>
+              <w:t>dataverse</w:t>
+            </w:r>
+            <w:proofErr w:type="spellEnd"/>
+            <w:r>
+              <w:rPr>
+                <w:b/>
+                <w:bCs/>
+                <w:lang w:val="en-US"/>
+              </w:rPr>
+              <w:t xml:space="preserve"> collection, does it require its own </w:t>
+            </w:r>
+            <w:proofErr w:type="spellStart"/>
+            <w:r>
+              <w:rPr>
+                <w:b/>
+                <w:bCs/>
+                <w:lang w:val="en-US"/>
+              </w:rPr>
+              <w:t>dataverse</w:t>
+            </w:r>
+            <w:proofErr w:type="spellEnd"/>
+            <w:r>
+              <w:rPr>
+                <w:b/>
+                <w:bCs/>
+                <w:lang w:val="en-US"/>
+              </w:rPr>
+              <w:t>?</w:t>
+            </w:r>
+          </w:p>
+        </w:tc>
+        <w:tc>
+          <w:tcPr>
+            <w:tcW w:w="0" w:type="auto"/>
+            <w:tcBorders>
+              <w:top w:val="single" w:sz="8" w:space="0" w:color="000000"/>
+              <w:left w:val="single" w:sz="8" w:space="0" w:color="000000"/>
+              <w:bottom w:val="single" w:sz="8" w:space="0" w:color="000000"/>
+              <w:right w:val="single" w:sz="8" w:space="0" w:color="000000"/>
+            </w:tcBorders>
+            <w:tcMar>
+              <w:top w:w="100" w:type="dxa"/>
+              <w:left w:w="100" w:type="dxa"/>
+              <w:bottom w:w="100" w:type="dxa"/>
+              <w:right w:w="100" w:type="dxa"/>
+            </w:tcMar>
+            <w:hideMark/>
+          </w:tcPr>
+          <w:p>
+            <w:pPr>
+              <w:rPr>
+                <w:lang w:val="en-US"/>
+              </w:rPr>
+            </w:pPr>
+            <w:r>
+              <w:rPr>
+                <w:lang w:val="en-US"/>
+              </w:rPr>
+              <w:t xml:space="preserve">If the depositor created a </w:t>
+            </w:r>
+            <w:proofErr w:type="spellStart"/>
+            <w:r>
+              <w:rPr>
+                <w:lang w:val="en-US"/>
+              </w:rPr>
+              <w:t>dataverse</w:t>
+            </w:r>
+            <w:proofErr w:type="spellEnd"/>
+            <w:r>
+              <w:rPr>
+                <w:lang w:val="en-US"/>
+              </w:rPr>
+              <w:t xml:space="preserve"> with one dataset:</w:t>
             </w:r>
           </w:p>
           <w:p>
@@ -2029,7 +2304,21 @@
               <w:rPr>
                 <w:lang w:val="en-US"/>
               </w:rPr>
-              <w:t>Is it the only dataset in the sub-dataverse collection?</w:t>
+              <w:t>Is it the only dataset in the sub-</w:t>
+            </w:r>
+            <w:proofErr w:type="spellStart"/>
+            <w:r>
+              <w:rPr>
+                <w:lang w:val="en-US"/>
+              </w:rPr>
+              <w:t>dataverse</w:t>
+            </w:r>
+            <w:proofErr w:type="spellEnd"/>
+            <w:r>
+              <w:rPr>
+                <w:lang w:val="en-US"/>
+              </w:rPr>
+              <w:t xml:space="preserve"> collection?</w:t>
             </w:r>
           </w:p>
           <w:p>
@@ -2046,7 +2335,21 @@
               <w:rPr>
                 <w:lang w:val="en-US"/>
               </w:rPr>
-              <w:t>Is there another sub-dataverse collection it should be in?</w:t>
+              <w:t>Is there another sub-</w:t>
+            </w:r>
+            <w:proofErr w:type="spellStart"/>
+            <w:r>
+              <w:rPr>
+                <w:lang w:val="en-US"/>
+              </w:rPr>
+              <w:t>dataverse</w:t>
+            </w:r>
+            <w:proofErr w:type="spellEnd"/>
+            <w:r>
+              <w:rPr>
+                <w:lang w:val="en-US"/>
+              </w:rPr>
+              <w:t xml:space="preserve"> collection it should be in?</w:t>
             </w:r>
           </w:p>
           <w:p>
@@ -2080,7 +2383,21 @@
               <w:rPr>
                 <w:lang w:val="en-US"/>
               </w:rPr>
-              <w:t>Confirm with the depositor that they actually require a dataverse (e.g., will there be future deposits?)</w:t>
+              <w:t xml:space="preserve">Confirm with the depositor that they actually require a </w:t>
+            </w:r>
+            <w:proofErr w:type="spellStart"/>
+            <w:r>
+              <w:rPr>
+                <w:lang w:val="en-US"/>
+              </w:rPr>
+              <w:t>dataverse</w:t>
+            </w:r>
+            <w:proofErr w:type="spellEnd"/>
+            <w:r>
+              <w:rPr>
+                <w:lang w:val="en-US"/>
+              </w:rPr>
+              <w:t xml:space="preserve"> (e.g., will there be future deposits?)</w:t>
             </w:r>
           </w:p>
         </w:tc>
@@ -2328,6 +2645,7 @@
                 <w:bCs/>
                 <w:lang w:val="en-US"/>
               </w:rPr>
+              <w:lastRenderedPageBreak/>
               <w:t>2.0</w:t>
             </w:r>
           </w:p>
@@ -2671,7 +2989,6 @@
                 <w:bCs/>
                 <w:lang w:val="en-US"/>
               </w:rPr>
-              <w:lastRenderedPageBreak/>
               <w:t>2.1a</w:t>
             </w:r>
           </w:p>
@@ -2767,63 +3084,91 @@
               <w:rPr>
                 <w:lang w:val="en-US"/>
               </w:rPr>
-              <w:t>{% if template_dict.file_ext.comments|length == 0 %}X{% endif %}</w:t>
-            </w:r>
-          </w:p>
-        </w:tc>
-        <w:tc>
-          <w:tcPr>
-            <w:tcW w:w="0" w:type="auto"/>
-            <w:tcBorders>
-              <w:top w:val="single" w:sz="8" w:space="0" w:color="000000"/>
-              <w:left w:val="single" w:sz="8" w:space="0" w:color="000000"/>
-              <w:bottom w:val="single" w:sz="8" w:space="0" w:color="000000"/>
-              <w:right w:val="single" w:sz="8" w:space="0" w:color="000000"/>
-            </w:tcBorders>
-            <w:tcMar>
-              <w:top w:w="100" w:type="dxa"/>
-              <w:left w:w="100" w:type="dxa"/>
-              <w:bottom w:w="100" w:type="dxa"/>
-              <w:right w:w="100" w:type="dxa"/>
-            </w:tcMar>
-            <w:hideMark/>
-          </w:tcPr>
-          <w:p>
-            <w:pPr>
-              <w:rPr>
-                <w:lang w:val="en-US"/>
-              </w:rPr>
-            </w:pPr>
-          </w:p>
-        </w:tc>
-        <w:tc>
-          <w:tcPr>
-            <w:tcW w:w="0" w:type="auto"/>
-            <w:tcBorders>
-              <w:top w:val="single" w:sz="8" w:space="0" w:color="000000"/>
-              <w:left w:val="single" w:sz="8" w:space="0" w:color="000000"/>
-              <w:bottom w:val="single" w:sz="8" w:space="0" w:color="000000"/>
-              <w:right w:val="single" w:sz="8" w:space="0" w:color="000000"/>
-            </w:tcBorders>
-            <w:tcMar>
-              <w:top w:w="100" w:type="dxa"/>
-              <w:left w:w="100" w:type="dxa"/>
-              <w:bottom w:w="100" w:type="dxa"/>
-              <w:right w:w="100" w:type="dxa"/>
-            </w:tcMar>
-            <w:hideMark/>
-          </w:tcPr>
-          <w:p>
-            <w:pPr>
-              <w:rPr>
-                <w:lang w:val="en-US"/>
-              </w:rPr>
-            </w:pPr>
-            <w:r>
-              <w:rPr>
-                <w:lang w:val="en-US"/>
-              </w:rPr>
-              <w:t>{% if template_dict.file_ext.comments|length &gt; 0 %}X{% endif %}</w:t>
+              <w:t xml:space="preserve">{% if </w:t>
+            </w:r>
+            <w:proofErr w:type="spellStart"/>
+            <w:r>
+              <w:rPr>
+                <w:lang w:val="en-US"/>
+              </w:rPr>
+              <w:t>template_dict.file_ext.comments|length</w:t>
+            </w:r>
+            <w:proofErr w:type="spellEnd"/>
+            <w:r>
+              <w:rPr>
+                <w:lang w:val="en-US"/>
+              </w:rPr>
+              <w:t xml:space="preserve"> == 0 %}X{% endif %}</w:t>
+            </w:r>
+          </w:p>
+        </w:tc>
+        <w:tc>
+          <w:tcPr>
+            <w:tcW w:w="0" w:type="auto"/>
+            <w:tcBorders>
+              <w:top w:val="single" w:sz="8" w:space="0" w:color="000000"/>
+              <w:left w:val="single" w:sz="8" w:space="0" w:color="000000"/>
+              <w:bottom w:val="single" w:sz="8" w:space="0" w:color="000000"/>
+              <w:right w:val="single" w:sz="8" w:space="0" w:color="000000"/>
+            </w:tcBorders>
+            <w:tcMar>
+              <w:top w:w="100" w:type="dxa"/>
+              <w:left w:w="100" w:type="dxa"/>
+              <w:bottom w:w="100" w:type="dxa"/>
+              <w:right w:w="100" w:type="dxa"/>
+            </w:tcMar>
+            <w:hideMark/>
+          </w:tcPr>
+          <w:p>
+            <w:pPr>
+              <w:rPr>
+                <w:lang w:val="en-US"/>
+              </w:rPr>
+            </w:pPr>
+          </w:p>
+        </w:tc>
+        <w:tc>
+          <w:tcPr>
+            <w:tcW w:w="0" w:type="auto"/>
+            <w:tcBorders>
+              <w:top w:val="single" w:sz="8" w:space="0" w:color="000000"/>
+              <w:left w:val="single" w:sz="8" w:space="0" w:color="000000"/>
+              <w:bottom w:val="single" w:sz="8" w:space="0" w:color="000000"/>
+              <w:right w:val="single" w:sz="8" w:space="0" w:color="000000"/>
+            </w:tcBorders>
+            <w:tcMar>
+              <w:top w:w="100" w:type="dxa"/>
+              <w:left w:w="100" w:type="dxa"/>
+              <w:bottom w:w="100" w:type="dxa"/>
+              <w:right w:w="100" w:type="dxa"/>
+            </w:tcMar>
+            <w:hideMark/>
+          </w:tcPr>
+          <w:p>
+            <w:pPr>
+              <w:rPr>
+                <w:lang w:val="en-US"/>
+              </w:rPr>
+            </w:pPr>
+            <w:r>
+              <w:rPr>
+                <w:lang w:val="en-US"/>
+              </w:rPr>
+              <w:t xml:space="preserve">{% if </w:t>
+            </w:r>
+            <w:proofErr w:type="spellStart"/>
+            <w:r>
+              <w:rPr>
+                <w:lang w:val="en-US"/>
+              </w:rPr>
+              <w:t>template_dict.file_ext.comments|length</w:t>
+            </w:r>
+            <w:proofErr w:type="spellEnd"/>
+            <w:r>
+              <w:rPr>
+                <w:lang w:val="en-US"/>
+              </w:rPr>
+              <w:t xml:space="preserve"> &gt; 0 %}X{% endif %}</w:t>
             </w:r>
           </w:p>
         </w:tc>
@@ -2916,7 +3261,21 @@
               <w:rPr>
                 <w:lang w:val="en-US"/>
               </w:rPr>
-              <w:t>{% for item in template_dict.file_open.comments %}</w:t>
+              <w:t xml:space="preserve">{% for item in </w:t>
+            </w:r>
+            <w:proofErr w:type="spellStart"/>
+            <w:r>
+              <w:rPr>
+                <w:lang w:val="en-US"/>
+              </w:rPr>
+              <w:t>template_dict.file_open.comments</w:t>
+            </w:r>
+            <w:proofErr w:type="spellEnd"/>
+            <w:r>
+              <w:rPr>
+                <w:lang w:val="en-US"/>
+              </w:rPr>
+              <w:t xml:space="preserve"> %}</w:t>
             </w:r>
           </w:p>
           <w:p>
@@ -2934,13 +3293,41 @@
               <w:rPr>
                 <w:lang w:val="en-US"/>
               </w:rPr>
-              <w:t>{{ item.file_name }}</w:t>
-            </w:r>
-            <w:r>
-              <w:rPr>
-                <w:lang w:val="en-US"/>
-              </w:rPr>
-              <w:t>{% endfor %}</w:t>
+              <w:t xml:space="preserve">{{ </w:t>
+            </w:r>
+            <w:proofErr w:type="spellStart"/>
+            <w:r>
+              <w:rPr>
+                <w:lang w:val="en-US"/>
+              </w:rPr>
+              <w:t>item.file_name</w:t>
+            </w:r>
+            <w:proofErr w:type="spellEnd"/>
+            <w:r>
+              <w:rPr>
+                <w:lang w:val="en-US"/>
+              </w:rPr>
+              <w:t xml:space="preserve"> }}</w:t>
+            </w:r>
+            <w:r>
+              <w:rPr>
+                <w:lang w:val="en-US"/>
+              </w:rPr>
+              <w:t xml:space="preserve">{% </w:t>
+            </w:r>
+            <w:proofErr w:type="spellStart"/>
+            <w:r>
+              <w:rPr>
+                <w:lang w:val="en-US"/>
+              </w:rPr>
+              <w:t>endfor</w:t>
+            </w:r>
+            <w:proofErr w:type="spellEnd"/>
+            <w:r>
+              <w:rPr>
+                <w:lang w:val="en-US"/>
+              </w:rPr>
+              <w:t xml:space="preserve"> %}</w:t>
             </w:r>
           </w:p>
           <w:p>
@@ -2973,7 +3360,21 @@
               <w:rPr>
                 <w:lang w:val="en-US"/>
               </w:rPr>
-              <w:t>{% for item in template_dict.file_open.not_checked %}</w:t>
+              <w:t xml:space="preserve">{% for item in </w:t>
+            </w:r>
+            <w:proofErr w:type="spellStart"/>
+            <w:r>
+              <w:rPr>
+                <w:lang w:val="en-US"/>
+              </w:rPr>
+              <w:t>template_dict.file_open.not_checked</w:t>
+            </w:r>
+            <w:proofErr w:type="spellEnd"/>
+            <w:r>
+              <w:rPr>
+                <w:lang w:val="en-US"/>
+              </w:rPr>
+              <w:t xml:space="preserve"> %}</w:t>
             </w:r>
           </w:p>
           <w:p>
@@ -2991,7 +3392,35 @@
               <w:rPr>
                 <w:lang w:val="en-US"/>
               </w:rPr>
-              <w:t>{{ item.file_name }}{% endfor %}</w:t>
+              <w:t xml:space="preserve">{{ </w:t>
+            </w:r>
+            <w:proofErr w:type="spellStart"/>
+            <w:r>
+              <w:rPr>
+                <w:lang w:val="en-US"/>
+              </w:rPr>
+              <w:t>item.file_name</w:t>
+            </w:r>
+            <w:proofErr w:type="spellEnd"/>
+            <w:r>
+              <w:rPr>
+                <w:lang w:val="en-US"/>
+              </w:rPr>
+              <w:t xml:space="preserve"> }}{% </w:t>
+            </w:r>
+            <w:proofErr w:type="spellStart"/>
+            <w:r>
+              <w:rPr>
+                <w:lang w:val="en-US"/>
+              </w:rPr>
+              <w:t>endfor</w:t>
+            </w:r>
+            <w:proofErr w:type="spellEnd"/>
+            <w:r>
+              <w:rPr>
+                <w:lang w:val="en-US"/>
+              </w:rPr>
+              <w:t xml:space="preserve"> %}</w:t>
             </w:r>
           </w:p>
           <w:p>
@@ -3205,63 +3634,91 @@
               <w:rPr>
                 <w:lang w:val="en-US"/>
               </w:rPr>
-              <w:t>{% if template_dict.special_characters.comments|length == 0 %}X{% endif %}</w:t>
-            </w:r>
-          </w:p>
-        </w:tc>
-        <w:tc>
-          <w:tcPr>
-            <w:tcW w:w="0" w:type="auto"/>
-            <w:tcBorders>
-              <w:top w:val="single" w:sz="8" w:space="0" w:color="000000"/>
-              <w:left w:val="single" w:sz="8" w:space="0" w:color="000000"/>
-              <w:bottom w:val="single" w:sz="8" w:space="0" w:color="000000"/>
-              <w:right w:val="single" w:sz="8" w:space="0" w:color="000000"/>
-            </w:tcBorders>
-            <w:tcMar>
-              <w:top w:w="100" w:type="dxa"/>
-              <w:left w:w="100" w:type="dxa"/>
-              <w:bottom w:w="100" w:type="dxa"/>
-              <w:right w:w="100" w:type="dxa"/>
-            </w:tcMar>
-            <w:hideMark/>
-          </w:tcPr>
-          <w:p>
-            <w:pPr>
-              <w:rPr>
-                <w:lang w:val="en-US"/>
-              </w:rPr>
-            </w:pPr>
-          </w:p>
-        </w:tc>
-        <w:tc>
-          <w:tcPr>
-            <w:tcW w:w="0" w:type="auto"/>
-            <w:tcBorders>
-              <w:top w:val="single" w:sz="8" w:space="0" w:color="000000"/>
-              <w:left w:val="single" w:sz="8" w:space="0" w:color="000000"/>
-              <w:bottom w:val="single" w:sz="8" w:space="0" w:color="000000"/>
-              <w:right w:val="single" w:sz="8" w:space="0" w:color="000000"/>
-            </w:tcBorders>
-            <w:tcMar>
-              <w:top w:w="100" w:type="dxa"/>
-              <w:left w:w="100" w:type="dxa"/>
-              <w:bottom w:w="100" w:type="dxa"/>
-              <w:right w:w="100" w:type="dxa"/>
-            </w:tcMar>
-            <w:hideMark/>
-          </w:tcPr>
-          <w:p>
-            <w:pPr>
-              <w:rPr>
-                <w:lang w:val="en-US"/>
-              </w:rPr>
-            </w:pPr>
-            <w:r>
-              <w:rPr>
-                <w:lang w:val="en-US"/>
-              </w:rPr>
-              <w:t>{% if template_dict.special_characters.comments|length &gt; 0 %}X{% endif %}</w:t>
+              <w:t xml:space="preserve">{% if </w:t>
+            </w:r>
+            <w:proofErr w:type="spellStart"/>
+            <w:r>
+              <w:rPr>
+                <w:lang w:val="en-US"/>
+              </w:rPr>
+              <w:t>template_dict.special_characters.comments|length</w:t>
+            </w:r>
+            <w:proofErr w:type="spellEnd"/>
+            <w:r>
+              <w:rPr>
+                <w:lang w:val="en-US"/>
+              </w:rPr>
+              <w:t xml:space="preserve"> == 0 %}X{% endif %}</w:t>
+            </w:r>
+          </w:p>
+        </w:tc>
+        <w:tc>
+          <w:tcPr>
+            <w:tcW w:w="0" w:type="auto"/>
+            <w:tcBorders>
+              <w:top w:val="single" w:sz="8" w:space="0" w:color="000000"/>
+              <w:left w:val="single" w:sz="8" w:space="0" w:color="000000"/>
+              <w:bottom w:val="single" w:sz="8" w:space="0" w:color="000000"/>
+              <w:right w:val="single" w:sz="8" w:space="0" w:color="000000"/>
+            </w:tcBorders>
+            <w:tcMar>
+              <w:top w:w="100" w:type="dxa"/>
+              <w:left w:w="100" w:type="dxa"/>
+              <w:bottom w:w="100" w:type="dxa"/>
+              <w:right w:w="100" w:type="dxa"/>
+            </w:tcMar>
+            <w:hideMark/>
+          </w:tcPr>
+          <w:p>
+            <w:pPr>
+              <w:rPr>
+                <w:lang w:val="en-US"/>
+              </w:rPr>
+            </w:pPr>
+          </w:p>
+        </w:tc>
+        <w:tc>
+          <w:tcPr>
+            <w:tcW w:w="0" w:type="auto"/>
+            <w:tcBorders>
+              <w:top w:val="single" w:sz="8" w:space="0" w:color="000000"/>
+              <w:left w:val="single" w:sz="8" w:space="0" w:color="000000"/>
+              <w:bottom w:val="single" w:sz="8" w:space="0" w:color="000000"/>
+              <w:right w:val="single" w:sz="8" w:space="0" w:color="000000"/>
+            </w:tcBorders>
+            <w:tcMar>
+              <w:top w:w="100" w:type="dxa"/>
+              <w:left w:w="100" w:type="dxa"/>
+              <w:bottom w:w="100" w:type="dxa"/>
+              <w:right w:w="100" w:type="dxa"/>
+            </w:tcMar>
+            <w:hideMark/>
+          </w:tcPr>
+          <w:p>
+            <w:pPr>
+              <w:rPr>
+                <w:lang w:val="en-US"/>
+              </w:rPr>
+            </w:pPr>
+            <w:r>
+              <w:rPr>
+                <w:lang w:val="en-US"/>
+              </w:rPr>
+              <w:t xml:space="preserve">{% if </w:t>
+            </w:r>
+            <w:proofErr w:type="spellStart"/>
+            <w:r>
+              <w:rPr>
+                <w:lang w:val="en-US"/>
+              </w:rPr>
+              <w:t>template_dict.special_characters.comments|length</w:t>
+            </w:r>
+            <w:proofErr w:type="spellEnd"/>
+            <w:r>
+              <w:rPr>
+                <w:lang w:val="en-US"/>
+              </w:rPr>
+              <w:t xml:space="preserve"> &gt; 0 %}X{% endif %}</w:t>
             </w:r>
           </w:p>
         </w:tc>
@@ -3354,7 +3811,21 @@
               <w:rPr>
                 <w:lang w:val="en-US"/>
               </w:rPr>
-              <w:t>{% for item in template_dict.special_characters.comments %}</w:t>
+              <w:t xml:space="preserve">{% for item in </w:t>
+            </w:r>
+            <w:proofErr w:type="spellStart"/>
+            <w:r>
+              <w:rPr>
+                <w:lang w:val="en-US"/>
+              </w:rPr>
+              <w:t>template_dict.special_characters.comments</w:t>
+            </w:r>
+            <w:proofErr w:type="spellEnd"/>
+            <w:r>
+              <w:rPr>
+                <w:lang w:val="en-US"/>
+              </w:rPr>
+              <w:t xml:space="preserve"> %}</w:t>
             </w:r>
           </w:p>
           <w:p>
@@ -3372,7 +3843,35 @@
               <w:rPr>
                 <w:lang w:val="en-US"/>
               </w:rPr>
-              <w:t>{{ item.file_name }}{% endfor %}</w:t>
+              <w:t xml:space="preserve">{{ </w:t>
+            </w:r>
+            <w:proofErr w:type="spellStart"/>
+            <w:r>
+              <w:rPr>
+                <w:lang w:val="en-US"/>
+              </w:rPr>
+              <w:t>item.file_name</w:t>
+            </w:r>
+            <w:proofErr w:type="spellEnd"/>
+            <w:r>
+              <w:rPr>
+                <w:lang w:val="en-US"/>
+              </w:rPr>
+              <w:t xml:space="preserve"> }}{% </w:t>
+            </w:r>
+            <w:proofErr w:type="spellStart"/>
+            <w:r>
+              <w:rPr>
+                <w:lang w:val="en-US"/>
+              </w:rPr>
+              <w:t>endfor</w:t>
+            </w:r>
+            <w:proofErr w:type="spellEnd"/>
+            <w:r>
+              <w:rPr>
+                <w:lang w:val="en-US"/>
+              </w:rPr>
+              <w:t xml:space="preserve"> %}</w:t>
             </w:r>
           </w:p>
         </w:tc>
@@ -3564,7 +4063,21 @@
               <w:rPr>
                 <w:lang w:val="en-US"/>
               </w:rPr>
-              <w:t xml:space="preserve">{% if template_dict.readme_file.comments|length </w:t>
+              <w:t xml:space="preserve">{% if </w:t>
+            </w:r>
+            <w:proofErr w:type="spellStart"/>
+            <w:r>
+              <w:rPr>
+                <w:lang w:val="en-US"/>
+              </w:rPr>
+              <w:t>template_dict.readme_file.comments|length</w:t>
+            </w:r>
+            <w:proofErr w:type="spellEnd"/>
+            <w:r>
+              <w:rPr>
+                <w:lang w:val="en-US"/>
+              </w:rPr>
+              <w:t xml:space="preserve"> </w:t>
             </w:r>
             <w:r>
               <w:rPr>
@@ -3633,7 +4146,21 @@
               <w:rPr>
                 <w:lang w:val="en-US"/>
               </w:rPr>
-              <w:t>{% if template_dict.file_ext.comments|length &gt; 0 %}X{% endif %}</w:t>
+              <w:t xml:space="preserve">{% if </w:t>
+            </w:r>
+            <w:proofErr w:type="spellStart"/>
+            <w:r>
+              <w:rPr>
+                <w:lang w:val="en-US"/>
+              </w:rPr>
+              <w:t>template_dict.file_ext.comments|length</w:t>
+            </w:r>
+            <w:proofErr w:type="spellEnd"/>
+            <w:r>
+              <w:rPr>
+                <w:lang w:val="en-US"/>
+              </w:rPr>
+              <w:t xml:space="preserve"> &gt; 0 %}X{% endif %}</w:t>
             </w:r>
           </w:p>
         </w:tc>
@@ -3726,7 +4253,21 @@
               <w:rPr>
                 <w:lang w:val="en-US"/>
               </w:rPr>
-              <w:t>{% for item in template_dict.file_ext.comments %}</w:t>
+              <w:t xml:space="preserve">{% for item in </w:t>
+            </w:r>
+            <w:proofErr w:type="spellStart"/>
+            <w:r>
+              <w:rPr>
+                <w:lang w:val="en-US"/>
+              </w:rPr>
+              <w:t>template_dict.file_ext.comments</w:t>
+            </w:r>
+            <w:proofErr w:type="spellEnd"/>
+            <w:r>
+              <w:rPr>
+                <w:lang w:val="en-US"/>
+              </w:rPr>
+              <w:t xml:space="preserve"> %}</w:t>
             </w:r>
           </w:p>
           <w:p>
@@ -3744,7 +4285,35 @@
               <w:rPr>
                 <w:lang w:val="en-US"/>
               </w:rPr>
-              <w:t>{{ item.file_name }}{% endfor %}</w:t>
+              <w:t xml:space="preserve">{{ </w:t>
+            </w:r>
+            <w:proofErr w:type="spellStart"/>
+            <w:r>
+              <w:rPr>
+                <w:lang w:val="en-US"/>
+              </w:rPr>
+              <w:t>item.file_name</w:t>
+            </w:r>
+            <w:proofErr w:type="spellEnd"/>
+            <w:r>
+              <w:rPr>
+                <w:lang w:val="en-US"/>
+              </w:rPr>
+              <w:t xml:space="preserve"> }}{% </w:t>
+            </w:r>
+            <w:proofErr w:type="spellStart"/>
+            <w:r>
+              <w:rPr>
+                <w:lang w:val="en-US"/>
+              </w:rPr>
+              <w:t>endfor</w:t>
+            </w:r>
+            <w:proofErr w:type="spellEnd"/>
+            <w:r>
+              <w:rPr>
+                <w:lang w:val="en-US"/>
+              </w:rPr>
+              <w:t xml:space="preserve"> %}</w:t>
             </w:r>
           </w:p>
         </w:tc>
@@ -4231,7 +4800,7 @@
                 <w:bCs/>
                 <w:lang w:val="en-US"/>
               </w:rPr>
-              <w:t xml:space="preserve">*If some files do not appear on </w:t>
+              <w:t xml:space="preserve">*If some files do not appear on the common file format list, is there </w:t>
             </w:r>
             <w:r>
               <w:rPr>
@@ -4240,7 +4809,7 @@
                 <w:lang w:val="en-US"/>
               </w:rPr>
               <w:lastRenderedPageBreak/>
-              <w:t>the common file format list, is there information or documentation about how to open the files(s)?</w:t>
+              <w:t>information or documentation about how to open the files(s)?</w:t>
             </w:r>
           </w:p>
         </w:tc>
@@ -4276,14 +4845,14 @@
                 <w:lang w:val="en-US"/>
               </w:rPr>
               <w:lastRenderedPageBreak/>
-              <w:t xml:space="preserve">Review documentation files </w:t>
+              <w:t xml:space="preserve">Review documentation files (e.g., README, other relevant </w:t>
             </w:r>
             <w:r>
               <w:rPr>
                 <w:lang w:val="en-US"/>
               </w:rPr>
               <w:lastRenderedPageBreak/>
-              <w:t>(e.g., README, other relevant files based on name) to determine if there is information about uncommon file types. </w:t>
+              <w:t>files based on name) to determine if there is information about uncommon file types. </w:t>
             </w:r>
           </w:p>
         </w:tc>
@@ -4470,6 +5039,7 @@
               <w:rPr>
                 <w:lang w:val="en-US"/>
               </w:rPr>
+              <w:lastRenderedPageBreak/>
               <w:t>List the uncommon file format that does not have a documentation file:</w:t>
             </w:r>
           </w:p>
@@ -5018,38 +5588,66 @@
               <w:rPr>
                 <w:lang w:val="en-US"/>
               </w:rPr>
-              <w:t>{% if template_dict.readme_file.comments|length &gt; 0 %}X{% endif %}</w:t>
-            </w:r>
-          </w:p>
-        </w:tc>
-        <w:tc>
-          <w:tcPr>
-            <w:tcW w:w="0" w:type="auto"/>
-            <w:tcBorders>
-              <w:top w:val="single" w:sz="8" w:space="0" w:color="000000"/>
-              <w:left w:val="single" w:sz="8" w:space="0" w:color="000000"/>
-              <w:bottom w:val="single" w:sz="8" w:space="0" w:color="000000"/>
-              <w:right w:val="single" w:sz="8" w:space="0" w:color="000000"/>
-            </w:tcBorders>
-            <w:tcMar>
-              <w:top w:w="100" w:type="dxa"/>
-              <w:left w:w="100" w:type="dxa"/>
-              <w:bottom w:w="100" w:type="dxa"/>
-              <w:right w:w="100" w:type="dxa"/>
-            </w:tcMar>
-            <w:hideMark/>
-          </w:tcPr>
-          <w:p>
-            <w:pPr>
-              <w:rPr>
-                <w:lang w:val="en-US"/>
-              </w:rPr>
-            </w:pPr>
-            <w:r>
-              <w:rPr>
-                <w:lang w:val="en-US"/>
-              </w:rPr>
-              <w:t>{% if template_dict.readme_file.comments|length == 0 %}X{% endif %}</w:t>
+              <w:t xml:space="preserve">{% if </w:t>
+            </w:r>
+            <w:proofErr w:type="spellStart"/>
+            <w:r>
+              <w:rPr>
+                <w:lang w:val="en-US"/>
+              </w:rPr>
+              <w:t>template_dict.readme_file.comments|length</w:t>
+            </w:r>
+            <w:proofErr w:type="spellEnd"/>
+            <w:r>
+              <w:rPr>
+                <w:lang w:val="en-US"/>
+              </w:rPr>
+              <w:t xml:space="preserve"> &gt; 0 %}X{% endif %}</w:t>
+            </w:r>
+          </w:p>
+        </w:tc>
+        <w:tc>
+          <w:tcPr>
+            <w:tcW w:w="0" w:type="auto"/>
+            <w:tcBorders>
+              <w:top w:val="single" w:sz="8" w:space="0" w:color="000000"/>
+              <w:left w:val="single" w:sz="8" w:space="0" w:color="000000"/>
+              <w:bottom w:val="single" w:sz="8" w:space="0" w:color="000000"/>
+              <w:right w:val="single" w:sz="8" w:space="0" w:color="000000"/>
+            </w:tcBorders>
+            <w:tcMar>
+              <w:top w:w="100" w:type="dxa"/>
+              <w:left w:w="100" w:type="dxa"/>
+              <w:bottom w:w="100" w:type="dxa"/>
+              <w:right w:w="100" w:type="dxa"/>
+            </w:tcMar>
+            <w:hideMark/>
+          </w:tcPr>
+          <w:p>
+            <w:pPr>
+              <w:rPr>
+                <w:lang w:val="en-US"/>
+              </w:rPr>
+            </w:pPr>
+            <w:r>
+              <w:rPr>
+                <w:lang w:val="en-US"/>
+              </w:rPr>
+              <w:t xml:space="preserve">{% if </w:t>
+            </w:r>
+            <w:proofErr w:type="spellStart"/>
+            <w:r>
+              <w:rPr>
+                <w:lang w:val="en-US"/>
+              </w:rPr>
+              <w:t>template_dict.readme_file.comments|length</w:t>
+            </w:r>
+            <w:proofErr w:type="spellEnd"/>
+            <w:r>
+              <w:rPr>
+                <w:lang w:val="en-US"/>
+              </w:rPr>
+              <w:t xml:space="preserve"> == 0 %}X{% endif %}</w:t>
             </w:r>
           </w:p>
         </w:tc>
@@ -5167,10 +5765,32 @@
               <w:rPr>
                 <w:lang w:val="en-US"/>
               </w:rPr>
-              <w:t>{% for item in template_dict.readme_file.comments %}</w:t>
-            </w:r>
-            <w:r>
-              <w:t>{{ loop.index }}.</w:t>
+              <w:t xml:space="preserve">{% for item in </w:t>
+            </w:r>
+            <w:proofErr w:type="spellStart"/>
+            <w:r>
+              <w:rPr>
+                <w:lang w:val="en-US"/>
+              </w:rPr>
+              <w:t>template_dict.readme_file.comments</w:t>
+            </w:r>
+            <w:proofErr w:type="spellEnd"/>
+            <w:r>
+              <w:rPr>
+                <w:lang w:val="en-US"/>
+              </w:rPr>
+              <w:t xml:space="preserve"> %}</w:t>
+            </w:r>
+            <w:r>
+              <w:t xml:space="preserve">{{ </w:t>
+            </w:r>
+            <w:proofErr w:type="spellStart"/>
+            <w:r>
+              <w:t>loop.index</w:t>
+            </w:r>
+            <w:proofErr w:type="spellEnd"/>
+            <w:r>
+              <w:t xml:space="preserve"> }}.</w:t>
             </w:r>
             <w:r>
               <w:rPr>
@@ -5182,7 +5802,21 @@
               <w:rPr>
                 <w:lang w:val="en-US"/>
               </w:rPr>
-              <w:t>{{ item.file_name }}</w:t>
+              <w:t xml:space="preserve">{{ </w:t>
+            </w:r>
+            <w:proofErr w:type="spellStart"/>
+            <w:r>
+              <w:rPr>
+                <w:lang w:val="en-US"/>
+              </w:rPr>
+              <w:t>item.file_name</w:t>
+            </w:r>
+            <w:proofErr w:type="spellEnd"/>
+            <w:r>
+              <w:rPr>
+                <w:lang w:val="en-US"/>
+              </w:rPr>
+              <w:t xml:space="preserve"> }}</w:t>
             </w:r>
             <w:r>
               <w:rPr>
@@ -5194,7 +5828,21 @@
               <w:rPr>
                 <w:lang w:val="en-US"/>
               </w:rPr>
-              <w:t>{% endfor %}</w:t>
+              <w:t xml:space="preserve">{% </w:t>
+            </w:r>
+            <w:proofErr w:type="spellStart"/>
+            <w:r>
+              <w:rPr>
+                <w:lang w:val="en-US"/>
+              </w:rPr>
+              <w:t>endfor</w:t>
+            </w:r>
+            <w:proofErr w:type="spellEnd"/>
+            <w:r>
+              <w:rPr>
+                <w:lang w:val="en-US"/>
+              </w:rPr>
+              <w:t xml:space="preserve"> %}</w:t>
             </w:r>
           </w:p>
         </w:tc>
@@ -5992,7 +6640,21 @@
               <w:rPr>
                 <w:lang w:val="en-US"/>
               </w:rPr>
-              <w:t>{% for item in template_dict.typo.comments %}</w:t>
+              <w:t xml:space="preserve">{% for item in </w:t>
+            </w:r>
+            <w:proofErr w:type="spellStart"/>
+            <w:r>
+              <w:rPr>
+                <w:lang w:val="en-US"/>
+              </w:rPr>
+              <w:t>template_dict.typo.comments</w:t>
+            </w:r>
+            <w:proofErr w:type="spellEnd"/>
+            <w:r>
+              <w:rPr>
+                <w:lang w:val="en-US"/>
+              </w:rPr>
+              <w:t xml:space="preserve"> %}</w:t>
             </w:r>
           </w:p>
           <w:p>
@@ -6007,7 +6669,21 @@
               <w:rPr>
                 <w:lang w:val="en-US"/>
               </w:rPr>
-              <w:t>{{ item }}{% endfor %}</w:t>
+              <w:t xml:space="preserve">{{ item }}{% </w:t>
+            </w:r>
+            <w:proofErr w:type="spellStart"/>
+            <w:r>
+              <w:rPr>
+                <w:lang w:val="en-US"/>
+              </w:rPr>
+              <w:t>endfor</w:t>
+            </w:r>
+            <w:proofErr w:type="spellEnd"/>
+            <w:r>
+              <w:rPr>
+                <w:lang w:val="en-US"/>
+              </w:rPr>
+              <w:t xml:space="preserve"> %}</w:t>
             </w:r>
           </w:p>
           <w:p>
@@ -6151,55 +6827,38 @@
                 <w:bCs/>
                 <w:lang w:val="en-US"/>
               </w:rPr>
-              <w:t xml:space="preserve">Do the metadata fields </w:t>
-            </w:r>
-            <w:r>
-              <w:rPr>
-                <w:b/>
-                <w:bCs/>
-                <w:lang w:val="en-US"/>
-              </w:rPr>
-              <w:lastRenderedPageBreak/>
-              <w:t>contain a valid entry?</w:t>
-            </w:r>
-          </w:p>
-        </w:tc>
-        <w:tc>
-          <w:tcPr>
-            <w:tcW w:w="0" w:type="auto"/>
-            <w:tcBorders>
-              <w:top w:val="single" w:sz="8" w:space="0" w:color="000000"/>
-              <w:left w:val="single" w:sz="8" w:space="0" w:color="000000"/>
-              <w:bottom w:val="single" w:sz="8" w:space="0" w:color="000000"/>
-              <w:right w:val="single" w:sz="8" w:space="0" w:color="000000"/>
-            </w:tcBorders>
-            <w:tcMar>
-              <w:top w:w="100" w:type="dxa"/>
-              <w:left w:w="100" w:type="dxa"/>
-              <w:bottom w:w="100" w:type="dxa"/>
-              <w:right w:w="100" w:type="dxa"/>
-            </w:tcMar>
-            <w:hideMark/>
-          </w:tcPr>
-          <w:p>
-            <w:pPr>
-              <w:rPr>
-                <w:lang w:val="en-US"/>
-              </w:rPr>
-            </w:pPr>
-            <w:r>
-              <w:rPr>
-                <w:lang w:val="en-US"/>
-              </w:rPr>
-              <w:lastRenderedPageBreak/>
-              <w:t xml:space="preserve">Review the following fields to ensure there is a </w:t>
-            </w:r>
-            <w:r>
-              <w:rPr>
-                <w:lang w:val="en-US"/>
-              </w:rPr>
-              <w:lastRenderedPageBreak/>
-              <w:t>valid entry and flag any issues:</w:t>
+              <w:t>Do the metadata fields contain a valid entry?</w:t>
+            </w:r>
+          </w:p>
+        </w:tc>
+        <w:tc>
+          <w:tcPr>
+            <w:tcW w:w="0" w:type="auto"/>
+            <w:tcBorders>
+              <w:top w:val="single" w:sz="8" w:space="0" w:color="000000"/>
+              <w:left w:val="single" w:sz="8" w:space="0" w:color="000000"/>
+              <w:bottom w:val="single" w:sz="8" w:space="0" w:color="000000"/>
+              <w:right w:val="single" w:sz="8" w:space="0" w:color="000000"/>
+            </w:tcBorders>
+            <w:tcMar>
+              <w:top w:w="100" w:type="dxa"/>
+              <w:left w:w="100" w:type="dxa"/>
+              <w:bottom w:w="100" w:type="dxa"/>
+              <w:right w:w="100" w:type="dxa"/>
+            </w:tcMar>
+            <w:hideMark/>
+          </w:tcPr>
+          <w:p>
+            <w:pPr>
+              <w:rPr>
+                <w:lang w:val="en-US"/>
+              </w:rPr>
+            </w:pPr>
+            <w:r>
+              <w:rPr>
+                <w:lang w:val="en-US"/>
+              </w:rPr>
+              <w:t>Review the following fields to ensure there is a valid entry and flag any issues:</w:t>
             </w:r>
           </w:p>
           <w:p>
@@ -6216,6 +6875,7 @@
               <w:rPr>
                 <w:lang w:val="en-US"/>
               </w:rPr>
+              <w:lastRenderedPageBreak/>
               <w:t>Title</w:t>
             </w:r>
           </w:p>
@@ -6479,7 +7139,6 @@
               <w:rPr>
                 <w:lang w:val="en-US"/>
               </w:rPr>
-              <w:lastRenderedPageBreak/>
               <w:t>Require</w:t>
             </w:r>
           </w:p>
@@ -6635,8 +7294,13 @@
             <w:r>
               <w:t xml:space="preserve">not </w:t>
             </w:r>
-            <w:r>
-              <w:t>template_dict.none_author_affiliation %}X{% endif %}</w:t>
+            <w:proofErr w:type="spellStart"/>
+            <w:r>
+              <w:t>template_dict.none_author_affiliation</w:t>
+            </w:r>
+            <w:proofErr w:type="spellEnd"/>
+            <w:r>
+              <w:t xml:space="preserve"> %}X{% endif %}</w:t>
             </w:r>
           </w:p>
         </w:tc>
@@ -6669,8 +7333,13 @@
             <w:r>
               <w:t xml:space="preserve"> </w:t>
             </w:r>
-            <w:r>
-              <w:t>template_dict.none_author_affiliation %}X{% endif %}</w:t>
+            <w:proofErr w:type="spellStart"/>
+            <w:r>
+              <w:t>template_dict.none_author_affiliation</w:t>
+            </w:r>
+            <w:proofErr w:type="spellEnd"/>
+            <w:r>
+              <w:t xml:space="preserve"> %}X{% endif %}</w:t>
             </w:r>
           </w:p>
         </w:tc>
@@ -8174,7 +8843,21 @@
               <w:rPr>
                 <w:lang w:val="en-US"/>
               </w:rPr>
-              <w:t>{% for item in template_dict.</w:t>
+              <w:t xml:space="preserve">{% for item in </w:t>
+            </w:r>
+            <w:proofErr w:type="spellStart"/>
+            <w:r>
+              <w:rPr>
+                <w:lang w:val="en-US"/>
+              </w:rPr>
+              <w:t>template_dict</w:t>
+            </w:r>
+            <w:proofErr w:type="spellEnd"/>
+            <w:r>
+              <w:rPr>
+                <w:lang w:val="en-US"/>
+              </w:rPr>
+              <w:t>.</w:t>
             </w:r>
             <w:r>
               <w:rPr>
@@ -8187,9 +8870,11 @@
               </w:rPr>
               <w:t xml:space="preserve"> </w:t>
             </w:r>
+            <w:proofErr w:type="spellStart"/>
             <w:r>
               <w:t>restricted_files</w:t>
             </w:r>
+            <w:proofErr w:type="spellEnd"/>
             <w:r>
               <w:rPr>
                 <w:lang w:val="en-US"/>
@@ -8211,6 +8896,7 @@
               </w:rPr>
               <w:t xml:space="preserve">{{ </w:t>
             </w:r>
+            <w:proofErr w:type="spellStart"/>
             <w:r>
               <w:rPr>
                 <w:rFonts w:hint="eastAsia"/>
@@ -8224,26 +8910,37 @@
               </w:rPr>
               <w:t>file_name</w:t>
             </w:r>
-            <w:r>
-              <w:rPr>
-                <w:lang w:val="en-US"/>
-              </w:rPr>
-              <w:t xml:space="preserve"> }}{% endfor %}</w:t>
-            </w:r>
-          </w:p>
-          <w:p>
-            <w:pPr>
-              <w:rPr>
-                <w:lang w:val="en-US"/>
-              </w:rPr>
-            </w:pPr>
-          </w:p>
-          <w:p>
-            <w:pPr>
-              <w:rPr>
-                <w:lang w:val="en-US"/>
-              </w:rPr>
-            </w:pPr>
+            <w:proofErr w:type="spellEnd"/>
+            <w:r>
+              <w:rPr>
+                <w:lang w:val="en-US"/>
+              </w:rPr>
+              <w:t xml:space="preserve"> }}{% </w:t>
+            </w:r>
+            <w:proofErr w:type="spellStart"/>
+            <w:r>
+              <w:rPr>
+                <w:lang w:val="en-US"/>
+              </w:rPr>
+              <w:t>endfor</w:t>
+            </w:r>
+            <w:proofErr w:type="spellEnd"/>
+            <w:r>
+              <w:rPr>
+                <w:lang w:val="en-US"/>
+              </w:rPr>
+              <w:t xml:space="preserve"> %}</w:t>
+            </w:r>
+          </w:p>
+          <w:p>
+            <w:pPr>
+              <w:rPr>
+                <w:lang w:val="en-US"/>
+              </w:rPr>
+            </w:pPr>
+            <w:r>
+              <w:br/>
+            </w:r>
             <w:r>
               <w:rPr>
                 <w:lang w:val="en-US"/>
@@ -8253,19 +8950,403 @@
           </w:p>
           <w:p>
             <w:pPr>
-              <w:rPr>
-                <w:lang w:val="en-US"/>
-              </w:rPr>
-            </w:pPr>
-          </w:p>
-          <w:p>
-            <w:pPr>
+              <w:pStyle w:val="ListParagraph"/>
+              <w:numPr>
+                <w:ilvl w:val="0"/>
+                <w:numId w:val="29"/>
+              </w:numPr>
+              <w:rPr>
+                <w:lang w:val="en-US"/>
+              </w:rPr>
+            </w:pPr>
+            <w:r>
+              <w:t xml:space="preserve">{% if </w:t>
+            </w:r>
+            <w:proofErr w:type="spellStart"/>
+            <w:r>
+              <w:t>template_dict.terms_license.licenseName</w:t>
+            </w:r>
+            <w:proofErr w:type="spellEnd"/>
+            <w:r>
+              <w:t xml:space="preserve"> is not none %}{{ </w:t>
+            </w:r>
+            <w:proofErr w:type="spellStart"/>
+            <w:r>
+              <w:t>template_dict.terms_license.licenseName</w:t>
+            </w:r>
+            <w:proofErr w:type="spellEnd"/>
+            <w:r>
+              <w:t xml:space="preserve"> }}{% else %}_(NONE)_{% endif %}</w:t>
+            </w:r>
+          </w:p>
+          <w:p>
+            <w:pPr>
+              <w:rPr>
+                <w:lang w:val="en-US"/>
+              </w:rPr>
+            </w:pPr>
+            <w:r>
+              <w:br/>
+            </w:r>
+            <w:r>
+              <w:rPr>
+                <w:rFonts w:hint="eastAsia"/>
+                <w:lang w:val="en-US"/>
+              </w:rPr>
+              <w:t>Terms of Use applied to dataset:</w:t>
+            </w:r>
+          </w:p>
+          <w:tbl>
+            <w:tblPr>
+              <w:tblStyle w:val="TableGrid"/>
+              <w:tblW w:w="0" w:type="auto"/>
+              <w:tblLook w:val="04A0" w:firstRow="1" w:lastRow="0" w:firstColumn="1" w:lastColumn="0" w:noHBand="0" w:noVBand="1"/>
+            </w:tblPr>
+            <w:tblGrid>
+              <w:gridCol w:w="4291"/>
+            </w:tblGrid>
+            <w:tr>
+              <w:tc>
+                <w:tcPr>
+                  <w:tcW w:w="4291" w:type="dxa"/>
+                </w:tcPr>
+                <w:p>
+                  <w:pPr>
+                    <w:rPr>
+                      <w:lang w:val="en-US"/>
+                    </w:rPr>
+                  </w:pPr>
+                  <w:r>
+                    <w:t xml:space="preserve">{% if </w:t>
+                  </w:r>
+                  <w:proofErr w:type="spellStart"/>
+                  <w:r>
+                    <w:t>template_dict.terms_license.</w:t>
+                  </w:r>
+                  <w:r>
+                    <w:t>termsOfUse</w:t>
+                  </w:r>
+                  <w:proofErr w:type="spellEnd"/>
+                  <w:r>
+                    <w:t xml:space="preserve"> is not none %}{{ </w:t>
+                  </w:r>
+                  <w:proofErr w:type="spellStart"/>
+                  <w:r>
+                    <w:t>template_dict.terms_license.</w:t>
+                  </w:r>
+                  <w:r>
+                    <w:t>termsOfUse</w:t>
+                  </w:r>
+                  <w:proofErr w:type="spellEnd"/>
+                  <w:r>
+                    <w:t xml:space="preserve"> }}{% else %}_(NONE)_{% endif %}</w:t>
+                  </w:r>
+                </w:p>
+              </w:tc>
+            </w:tr>
+          </w:tbl>
+          <w:p>
+            <w:pPr>
+              <w:rPr>
+                <w:lang w:val="en-US"/>
+              </w:rPr>
+            </w:pPr>
+          </w:p>
+          <w:p>
+            <w:pPr>
+              <w:rPr>
+                <w:lang w:val="en-US"/>
+              </w:rPr>
+            </w:pPr>
+            <w:r>
+              <w:rPr>
+                <w:rFonts w:hint="eastAsia"/>
+                <w:lang w:val="en-US"/>
+              </w:rPr>
+              <w:t xml:space="preserve">Terms of </w:t>
+            </w:r>
+            <w:r>
+              <w:rPr>
+                <w:rFonts w:hint="eastAsia"/>
+                <w:lang w:val="en-US"/>
+              </w:rPr>
+              <w:t xml:space="preserve">Access </w:t>
+            </w:r>
+            <w:r>
+              <w:rPr>
+                <w:rFonts w:hint="eastAsia"/>
+                <w:lang w:val="en-US"/>
+              </w:rPr>
+              <w:t>applied to dataset:</w:t>
+            </w:r>
+          </w:p>
+          <w:tbl>
+            <w:tblPr>
+              <w:tblStyle w:val="TableGrid"/>
+              <w:tblW w:w="0" w:type="auto"/>
+              <w:tblLook w:val="04A0" w:firstRow="1" w:lastRow="0" w:firstColumn="1" w:lastColumn="0" w:noHBand="0" w:noVBand="1"/>
+            </w:tblPr>
+            <w:tblGrid>
+              <w:gridCol w:w="4291"/>
+            </w:tblGrid>
+            <w:tr>
+              <w:tc>
+                <w:tcPr>
+                  <w:tcW w:w="4368" w:type="dxa"/>
+                </w:tcPr>
+                <w:p>
+                  <w:pPr>
+                    <w:rPr>
+                      <w:lang w:val="en-US"/>
+                    </w:rPr>
+                  </w:pPr>
+                  <w:r>
+                    <w:lastRenderedPageBreak/>
+                    <w:t xml:space="preserve">{% if </w:t>
+                  </w:r>
+                  <w:proofErr w:type="spellStart"/>
+                  <w:r>
+                    <w:t>template_dict.terms_license.</w:t>
+                  </w:r>
+                  <w:r>
+                    <w:t>termsOfAccess</w:t>
+                  </w:r>
+                  <w:proofErr w:type="spellEnd"/>
+                  <w:r>
+                    <w:t xml:space="preserve"> is not none %}{{ </w:t>
+                  </w:r>
+                  <w:proofErr w:type="spellStart"/>
+                  <w:r>
+                    <w:t>template_dict.terms_license.</w:t>
+                  </w:r>
+                  <w:r>
+                    <w:t>termsOfAccess</w:t>
+                  </w:r>
+                  <w:proofErr w:type="spellEnd"/>
+                  <w:r>
+                    <w:t xml:space="preserve"> }}{% else %}_(NONE)_{% endif %}</w:t>
+                  </w:r>
+                </w:p>
+              </w:tc>
+            </w:tr>
+          </w:tbl>
+          <w:p>
+            <w:pPr>
+              <w:rPr>
+                <w:lang w:val="en-US"/>
+              </w:rPr>
+            </w:pPr>
+          </w:p>
+        </w:tc>
+        <w:tc>
+          <w:tcPr>
+            <w:tcW w:w="0" w:type="auto"/>
+            <w:tcBorders>
+              <w:top w:val="single" w:sz="8" w:space="0" w:color="000000"/>
+              <w:left w:val="single" w:sz="8" w:space="0" w:color="000000"/>
+              <w:bottom w:val="single" w:sz="8" w:space="0" w:color="000000"/>
+              <w:right w:val="single" w:sz="8" w:space="0" w:color="000000"/>
+            </w:tcBorders>
+            <w:tcMar>
+              <w:top w:w="100" w:type="dxa"/>
+              <w:left w:w="100" w:type="dxa"/>
+              <w:bottom w:w="100" w:type="dxa"/>
+              <w:right w:w="100" w:type="dxa"/>
+            </w:tcMar>
+            <w:hideMark/>
+          </w:tcPr>
+          <w:p>
+            <w:pPr>
+              <w:rPr>
+                <w:lang w:val="en-US"/>
+              </w:rPr>
+            </w:pPr>
+            <w:r>
+              <w:rPr>
+                <w:lang w:val="en-US"/>
+              </w:rPr>
+              <w:lastRenderedPageBreak/>
+              <w:t>Require</w:t>
+            </w:r>
+          </w:p>
+        </w:tc>
+        <w:tc>
+          <w:tcPr>
+            <w:tcW w:w="0" w:type="auto"/>
+            <w:tcBorders>
+              <w:top w:val="single" w:sz="8" w:space="0" w:color="000000"/>
+              <w:left w:val="single" w:sz="8" w:space="0" w:color="000000"/>
+              <w:bottom w:val="single" w:sz="8" w:space="0" w:color="000000"/>
+              <w:right w:val="single" w:sz="8" w:space="0" w:color="000000"/>
+            </w:tcBorders>
+            <w:tcMar>
+              <w:top w:w="100" w:type="dxa"/>
+              <w:left w:w="100" w:type="dxa"/>
+              <w:bottom w:w="100" w:type="dxa"/>
+              <w:right w:w="100" w:type="dxa"/>
+            </w:tcMar>
+            <w:hideMark/>
+          </w:tcPr>
+          <w:p>
+            <w:pPr>
+              <w:rPr>
+                <w:lang w:val="en-US"/>
+              </w:rPr>
+            </w:pPr>
+            <w:r>
+              <w:rPr>
+                <w:lang w:val="en-US"/>
+              </w:rPr>
+              <w:t>Python scripted</w:t>
+            </w:r>
+          </w:p>
+        </w:tc>
+      </w:tr>
+      <w:tr>
+        <w:trPr>
+          <w:trHeight w:val="480"/>
+        </w:trPr>
+        <w:tc>
+          <w:tcPr>
+            <w:tcW w:w="0" w:type="auto"/>
+            <w:tcBorders>
+              <w:top w:val="single" w:sz="8" w:space="0" w:color="000000"/>
+              <w:left w:val="single" w:sz="8" w:space="0" w:color="000000"/>
+              <w:bottom w:val="single" w:sz="8" w:space="0" w:color="000000"/>
+              <w:right w:val="single" w:sz="8" w:space="0" w:color="000000"/>
+            </w:tcBorders>
+            <w:tcMar>
+              <w:top w:w="100" w:type="dxa"/>
+              <w:left w:w="100" w:type="dxa"/>
+              <w:bottom w:w="100" w:type="dxa"/>
+              <w:right w:w="100" w:type="dxa"/>
+            </w:tcMar>
+            <w:hideMark/>
+          </w:tcPr>
+          <w:p>
+            <w:pPr>
+              <w:rPr>
+                <w:lang w:val="en-US"/>
+              </w:rPr>
+            </w:pPr>
+            <w:r>
               <w:rPr>
                 <w:b/>
                 <w:bCs/>
-                <w:color w:val="FF0000"/>
-                <w:sz w:val="40"/>
-                <w:szCs w:val="40"/>
+                <w:lang w:val="en-US"/>
+              </w:rPr>
+              <w:t>5.4a</w:t>
+            </w:r>
+          </w:p>
+        </w:tc>
+        <w:tc>
+          <w:tcPr>
+            <w:tcW w:w="0" w:type="auto"/>
+            <w:tcBorders>
+              <w:top w:val="single" w:sz="8" w:space="0" w:color="000000"/>
+              <w:left w:val="single" w:sz="8" w:space="0" w:color="000000"/>
+              <w:bottom w:val="single" w:sz="8" w:space="0" w:color="000000"/>
+              <w:right w:val="single" w:sz="8" w:space="0" w:color="000000"/>
+            </w:tcBorders>
+            <w:tcMar>
+              <w:top w:w="100" w:type="dxa"/>
+              <w:left w:w="100" w:type="dxa"/>
+              <w:bottom w:w="100" w:type="dxa"/>
+              <w:right w:w="100" w:type="dxa"/>
+            </w:tcMar>
+            <w:hideMark/>
+          </w:tcPr>
+          <w:p>
+            <w:pPr>
+              <w:rPr>
+                <w:lang w:val="en-US"/>
+              </w:rPr>
+            </w:pPr>
+            <w:r>
+              <w:rPr>
+                <w:b/>
+                <w:bCs/>
+                <w:lang w:val="en-US"/>
+              </w:rPr>
+              <w:t>*If there are restricted files in the dataset, is the Terms of Access field complete?</w:t>
+            </w:r>
+          </w:p>
+        </w:tc>
+        <w:tc>
+          <w:tcPr>
+            <w:tcW w:w="0" w:type="auto"/>
+            <w:tcBorders>
+              <w:top w:val="single" w:sz="8" w:space="0" w:color="000000"/>
+              <w:left w:val="single" w:sz="8" w:space="0" w:color="000000"/>
+              <w:bottom w:val="single" w:sz="8" w:space="0" w:color="000000"/>
+              <w:right w:val="single" w:sz="8" w:space="0" w:color="000000"/>
+            </w:tcBorders>
+            <w:tcMar>
+              <w:top w:w="100" w:type="dxa"/>
+              <w:left w:w="100" w:type="dxa"/>
+              <w:bottom w:w="100" w:type="dxa"/>
+              <w:right w:w="100" w:type="dxa"/>
+            </w:tcMar>
+            <w:hideMark/>
+          </w:tcPr>
+          <w:p>
+            <w:pPr>
+              <w:rPr>
+                <w:lang w:val="en-US"/>
+              </w:rPr>
+            </w:pPr>
+            <w:r>
+              <w:rPr>
+                <w:lang w:val="en-US"/>
+              </w:rPr>
+              <w:t>Python scripted.</w:t>
+            </w:r>
+          </w:p>
+          <w:p>
+            <w:pPr>
+              <w:rPr>
+                <w:lang w:val="en-US"/>
+              </w:rPr>
+            </w:pPr>
+          </w:p>
+          <w:p>
+            <w:pPr>
+              <w:numPr>
+                <w:ilvl w:val="0"/>
+                <w:numId w:val="21"/>
+              </w:numPr>
+              <w:rPr>
+                <w:lang w:val="en-US"/>
+              </w:rPr>
+            </w:pPr>
+            <w:r>
+              <w:rPr>
+                <w:lang w:val="en-US"/>
+              </w:rPr>
+              <w:t>If there are restricted files and no Terms of Access, recommend including terms of access.</w:t>
+            </w:r>
+          </w:p>
+        </w:tc>
+        <w:tc>
+          <w:tcPr>
+            <w:tcW w:w="0" w:type="auto"/>
+            <w:tcBorders>
+              <w:top w:val="single" w:sz="8" w:space="0" w:color="000000"/>
+              <w:left w:val="single" w:sz="8" w:space="0" w:color="000000"/>
+              <w:bottom w:val="single" w:sz="8" w:space="0" w:color="000000"/>
+              <w:right w:val="single" w:sz="8" w:space="0" w:color="000000"/>
+            </w:tcBorders>
+            <w:tcMar>
+              <w:top w:w="100" w:type="dxa"/>
+              <w:left w:w="100" w:type="dxa"/>
+              <w:bottom w:w="100" w:type="dxa"/>
+              <w:right w:w="100" w:type="dxa"/>
+            </w:tcMar>
+            <w:hideMark/>
+          </w:tcPr>
+          <w:p>
+            <w:pPr>
+              <w:rPr>
                 <w:lang w:val="en-US"/>
               </w:rPr>
             </w:pPr>
@@ -8282,210 +9363,30 @@
               <w:t>TBD</w:t>
             </w:r>
           </w:p>
-          <w:p>
-            <w:pPr>
-              <w:rPr>
-                <w:lang w:val="en-US"/>
-              </w:rPr>
-            </w:pPr>
-          </w:p>
-        </w:tc>
-        <w:tc>
-          <w:tcPr>
-            <w:tcW w:w="0" w:type="auto"/>
-            <w:tcBorders>
-              <w:top w:val="single" w:sz="8" w:space="0" w:color="000000"/>
-              <w:left w:val="single" w:sz="8" w:space="0" w:color="000000"/>
-              <w:bottom w:val="single" w:sz="8" w:space="0" w:color="000000"/>
-              <w:right w:val="single" w:sz="8" w:space="0" w:color="000000"/>
-            </w:tcBorders>
-            <w:tcMar>
-              <w:top w:w="100" w:type="dxa"/>
-              <w:left w:w="100" w:type="dxa"/>
-              <w:bottom w:w="100" w:type="dxa"/>
-              <w:right w:w="100" w:type="dxa"/>
-            </w:tcMar>
-            <w:hideMark/>
-          </w:tcPr>
-          <w:p>
-            <w:pPr>
-              <w:rPr>
-                <w:lang w:val="en-US"/>
-              </w:rPr>
-            </w:pPr>
-            <w:r>
-              <w:rPr>
-                <w:lang w:val="en-US"/>
-              </w:rPr>
-              <w:t>Require</w:t>
-            </w:r>
-          </w:p>
-        </w:tc>
-        <w:tc>
-          <w:tcPr>
-            <w:tcW w:w="0" w:type="auto"/>
-            <w:tcBorders>
-              <w:top w:val="single" w:sz="8" w:space="0" w:color="000000"/>
-              <w:left w:val="single" w:sz="8" w:space="0" w:color="000000"/>
-              <w:bottom w:val="single" w:sz="8" w:space="0" w:color="000000"/>
-              <w:right w:val="single" w:sz="8" w:space="0" w:color="000000"/>
-            </w:tcBorders>
-            <w:tcMar>
-              <w:top w:w="100" w:type="dxa"/>
-              <w:left w:w="100" w:type="dxa"/>
-              <w:bottom w:w="100" w:type="dxa"/>
-              <w:right w:w="100" w:type="dxa"/>
-            </w:tcMar>
-            <w:hideMark/>
-          </w:tcPr>
-          <w:p>
-            <w:pPr>
-              <w:rPr>
-                <w:lang w:val="en-US"/>
-              </w:rPr>
-            </w:pPr>
-            <w:r>
-              <w:rPr>
-                <w:lang w:val="en-US"/>
-              </w:rPr>
-              <w:t>Python scripted</w:t>
-            </w:r>
-          </w:p>
-        </w:tc>
-      </w:tr>
-      <w:tr>
-        <w:trPr>
-          <w:trHeight w:val="480"/>
-        </w:trPr>
-        <w:tc>
-          <w:tcPr>
-            <w:tcW w:w="0" w:type="auto"/>
-            <w:tcBorders>
-              <w:top w:val="single" w:sz="8" w:space="0" w:color="000000"/>
-              <w:left w:val="single" w:sz="8" w:space="0" w:color="000000"/>
-              <w:bottom w:val="single" w:sz="8" w:space="0" w:color="000000"/>
-              <w:right w:val="single" w:sz="8" w:space="0" w:color="000000"/>
-            </w:tcBorders>
-            <w:tcMar>
-              <w:top w:w="100" w:type="dxa"/>
-              <w:left w:w="100" w:type="dxa"/>
-              <w:bottom w:w="100" w:type="dxa"/>
-              <w:right w:w="100" w:type="dxa"/>
-            </w:tcMar>
-            <w:hideMark/>
-          </w:tcPr>
-          <w:p>
-            <w:pPr>
-              <w:rPr>
-                <w:lang w:val="en-US"/>
-              </w:rPr>
-            </w:pPr>
-            <w:r>
-              <w:rPr>
-                <w:b/>
-                <w:bCs/>
-                <w:lang w:val="en-US"/>
-              </w:rPr>
-              <w:t>5.4a</w:t>
-            </w:r>
-          </w:p>
-        </w:tc>
-        <w:tc>
-          <w:tcPr>
-            <w:tcW w:w="0" w:type="auto"/>
-            <w:tcBorders>
-              <w:top w:val="single" w:sz="8" w:space="0" w:color="000000"/>
-              <w:left w:val="single" w:sz="8" w:space="0" w:color="000000"/>
-              <w:bottom w:val="single" w:sz="8" w:space="0" w:color="000000"/>
-              <w:right w:val="single" w:sz="8" w:space="0" w:color="000000"/>
-            </w:tcBorders>
-            <w:tcMar>
-              <w:top w:w="100" w:type="dxa"/>
-              <w:left w:w="100" w:type="dxa"/>
-              <w:bottom w:w="100" w:type="dxa"/>
-              <w:right w:w="100" w:type="dxa"/>
-            </w:tcMar>
-            <w:hideMark/>
-          </w:tcPr>
-          <w:p>
-            <w:pPr>
-              <w:rPr>
-                <w:lang w:val="en-US"/>
-              </w:rPr>
-            </w:pPr>
-            <w:r>
-              <w:rPr>
-                <w:b/>
-                <w:bCs/>
-                <w:lang w:val="en-US"/>
-              </w:rPr>
-              <w:t xml:space="preserve">*If there are restricted </w:t>
-            </w:r>
-            <w:r>
-              <w:rPr>
-                <w:b/>
-                <w:bCs/>
-                <w:lang w:val="en-US"/>
-              </w:rPr>
-              <w:lastRenderedPageBreak/>
-              <w:t>files in the dataset, is the Terms of Access field complete?</w:t>
-            </w:r>
-          </w:p>
-        </w:tc>
-        <w:tc>
-          <w:tcPr>
-            <w:tcW w:w="0" w:type="auto"/>
-            <w:tcBorders>
-              <w:top w:val="single" w:sz="8" w:space="0" w:color="000000"/>
-              <w:left w:val="single" w:sz="8" w:space="0" w:color="000000"/>
-              <w:bottom w:val="single" w:sz="8" w:space="0" w:color="000000"/>
-              <w:right w:val="single" w:sz="8" w:space="0" w:color="000000"/>
-            </w:tcBorders>
-            <w:tcMar>
-              <w:top w:w="100" w:type="dxa"/>
-              <w:left w:w="100" w:type="dxa"/>
-              <w:bottom w:w="100" w:type="dxa"/>
-              <w:right w:w="100" w:type="dxa"/>
-            </w:tcMar>
-            <w:hideMark/>
-          </w:tcPr>
-          <w:p>
-            <w:pPr>
-              <w:rPr>
-                <w:lang w:val="en-US"/>
-              </w:rPr>
-            </w:pPr>
-            <w:r>
-              <w:rPr>
-                <w:lang w:val="en-US"/>
-              </w:rPr>
-              <w:lastRenderedPageBreak/>
-              <w:t>Python scripted.</w:t>
-            </w:r>
-          </w:p>
-          <w:p>
-            <w:pPr>
-              <w:rPr>
-                <w:lang w:val="en-US"/>
-              </w:rPr>
-            </w:pPr>
-          </w:p>
-          <w:p>
-            <w:pPr>
-              <w:numPr>
-                <w:ilvl w:val="0"/>
-                <w:numId w:val="21"/>
-              </w:numPr>
-              <w:rPr>
-                <w:lang w:val="en-US"/>
-              </w:rPr>
-            </w:pPr>
-            <w:r>
-              <w:rPr>
-                <w:lang w:val="en-US"/>
-              </w:rPr>
-              <w:t>If there are restricted files and no Terms of Access, recommend including terms of access.</w:t>
-            </w:r>
+        </w:tc>
+        <w:tc>
+          <w:tcPr>
+            <w:tcW w:w="0" w:type="auto"/>
+            <w:tcBorders>
+              <w:top w:val="single" w:sz="8" w:space="0" w:color="000000"/>
+              <w:left w:val="single" w:sz="8" w:space="0" w:color="000000"/>
+              <w:bottom w:val="single" w:sz="8" w:space="0" w:color="000000"/>
+              <w:right w:val="single" w:sz="8" w:space="0" w:color="000000"/>
+            </w:tcBorders>
+            <w:tcMar>
+              <w:top w:w="100" w:type="dxa"/>
+              <w:left w:w="100" w:type="dxa"/>
+              <w:bottom w:w="100" w:type="dxa"/>
+              <w:right w:w="100" w:type="dxa"/>
+            </w:tcMar>
+            <w:hideMark/>
+          </w:tcPr>
+          <w:p>
+            <w:pPr>
+              <w:rPr>
+                <w:lang w:val="en-US"/>
+              </w:rPr>
+            </w:pPr>
           </w:p>
         </w:tc>
         <w:tc>
@@ -8521,7 +9422,6 @@
                 <w:szCs w:val="40"/>
                 <w:lang w:val="en-US"/>
               </w:rPr>
-              <w:lastRenderedPageBreak/>
               <w:t>TBD</w:t>
             </w:r>
           </w:p>
@@ -8571,6 +9471,36 @@
           <w:p>
             <w:pPr>
               <w:rPr>
+                <w:lang w:val="en-US"/>
+              </w:rPr>
+            </w:pPr>
+          </w:p>
+        </w:tc>
+        <w:tc>
+          <w:tcPr>
+            <w:tcW w:w="0" w:type="auto"/>
+            <w:tcBorders>
+              <w:top w:val="single" w:sz="8" w:space="0" w:color="000000"/>
+              <w:left w:val="single" w:sz="8" w:space="0" w:color="000000"/>
+              <w:bottom w:val="single" w:sz="8" w:space="0" w:color="000000"/>
+              <w:right w:val="single" w:sz="8" w:space="0" w:color="000000"/>
+            </w:tcBorders>
+            <w:tcMar>
+              <w:top w:w="100" w:type="dxa"/>
+              <w:left w:w="100" w:type="dxa"/>
+              <w:bottom w:w="100" w:type="dxa"/>
+              <w:right w:w="100" w:type="dxa"/>
+            </w:tcMar>
+            <w:hideMark/>
+          </w:tcPr>
+          <w:p>
+            <w:pPr>
+              <w:rPr>
+                <w:b/>
+                <w:bCs/>
+                <w:color w:val="FF0000"/>
+                <w:sz w:val="40"/>
+                <w:szCs w:val="40"/>
                 <w:lang w:val="en-US"/>
               </w:rPr>
             </w:pPr>
@@ -8611,98 +9541,6 @@
                 <w:lang w:val="en-US"/>
               </w:rPr>
             </w:pPr>
-          </w:p>
-        </w:tc>
-        <w:tc>
-          <w:tcPr>
-            <w:tcW w:w="0" w:type="auto"/>
-            <w:tcBorders>
-              <w:top w:val="single" w:sz="8" w:space="0" w:color="000000"/>
-              <w:left w:val="single" w:sz="8" w:space="0" w:color="000000"/>
-              <w:bottom w:val="single" w:sz="8" w:space="0" w:color="000000"/>
-              <w:right w:val="single" w:sz="8" w:space="0" w:color="000000"/>
-            </w:tcBorders>
-            <w:tcMar>
-              <w:top w:w="100" w:type="dxa"/>
-              <w:left w:w="100" w:type="dxa"/>
-              <w:bottom w:w="100" w:type="dxa"/>
-              <w:right w:w="100" w:type="dxa"/>
-            </w:tcMar>
-            <w:hideMark/>
-          </w:tcPr>
-          <w:p>
-            <w:pPr>
-              <w:rPr>
-                <w:lang w:val="en-US"/>
-              </w:rPr>
-            </w:pPr>
-          </w:p>
-        </w:tc>
-        <w:tc>
-          <w:tcPr>
-            <w:tcW w:w="0" w:type="auto"/>
-            <w:tcBorders>
-              <w:top w:val="single" w:sz="8" w:space="0" w:color="000000"/>
-              <w:left w:val="single" w:sz="8" w:space="0" w:color="000000"/>
-              <w:bottom w:val="single" w:sz="8" w:space="0" w:color="000000"/>
-              <w:right w:val="single" w:sz="8" w:space="0" w:color="000000"/>
-            </w:tcBorders>
-            <w:tcMar>
-              <w:top w:w="100" w:type="dxa"/>
-              <w:left w:w="100" w:type="dxa"/>
-              <w:bottom w:w="100" w:type="dxa"/>
-              <w:right w:w="100" w:type="dxa"/>
-            </w:tcMar>
-            <w:hideMark/>
-          </w:tcPr>
-          <w:p>
-            <w:pPr>
-              <w:rPr>
-                <w:b/>
-                <w:bCs/>
-                <w:color w:val="FF0000"/>
-                <w:sz w:val="40"/>
-                <w:szCs w:val="40"/>
-                <w:lang w:val="en-US"/>
-              </w:rPr>
-            </w:pPr>
-            <w:r>
-              <w:rPr>
-                <w:rFonts w:hint="eastAsia"/>
-                <w:b/>
-                <w:bCs/>
-                <w:color w:val="FF0000"/>
-                <w:sz w:val="40"/>
-                <w:szCs w:val="40"/>
-                <w:lang w:val="en-US"/>
-              </w:rPr>
-              <w:t>TBD</w:t>
-            </w:r>
-          </w:p>
-        </w:tc>
-        <w:tc>
-          <w:tcPr>
-            <w:tcW w:w="0" w:type="auto"/>
-            <w:tcBorders>
-              <w:top w:val="single" w:sz="8" w:space="0" w:color="000000"/>
-              <w:left w:val="single" w:sz="8" w:space="0" w:color="000000"/>
-              <w:bottom w:val="single" w:sz="8" w:space="0" w:color="000000"/>
-              <w:right w:val="single" w:sz="8" w:space="0" w:color="000000"/>
-            </w:tcBorders>
-            <w:tcMar>
-              <w:top w:w="100" w:type="dxa"/>
-              <w:left w:w="100" w:type="dxa"/>
-              <w:bottom w:w="100" w:type="dxa"/>
-              <w:right w:w="100" w:type="dxa"/>
-            </w:tcMar>
-            <w:hideMark/>
-          </w:tcPr>
-          <w:p>
-            <w:pPr>
-              <w:rPr>
-                <w:lang w:val="en-US"/>
-              </w:rPr>
-            </w:pPr>
             <w:r>
               <w:rPr>
                 <w:lang w:val="en-US"/>
@@ -8738,14 +9576,7 @@
               <w:rPr>
                 <w:lang w:val="en-US"/>
               </w:rPr>
-              <w:t xml:space="preserve">Python </w:t>
-            </w:r>
-            <w:r>
-              <w:rPr>
-                <w:lang w:val="en-US"/>
-              </w:rPr>
-              <w:lastRenderedPageBreak/>
-              <w:t>scripted</w:t>
+              <w:t>Python scripted</w:t>
             </w:r>
           </w:p>
         </w:tc>
@@ -10537,6 +11368,119 @@
     </w:lvl>
   </w:abstractNum>
   <w:abstractNum w:abstractNumId="15" w15:restartNumberingAfterBreak="0">
+    <w:nsid w:val="472F23DD"/>
+    <w:multiLevelType w:val="hybridMultilevel"/>
+    <w:tmpl w:val="82846050"/>
+    <w:lvl w:ilvl="0" w:tplc="10090001">
+      <w:start w:val="1"/>
+      <w:numFmt w:val="bullet"/>
+      <w:lvlText w:val=""/>
+      <w:lvlJc w:val="left"/>
+      <w:pPr>
+        <w:ind w:left="720" w:hanging="360"/>
+      </w:pPr>
+      <w:rPr>
+        <w:rFonts w:ascii="Symbol" w:hAnsi="Symbol" w:hint="default"/>
+      </w:rPr>
+    </w:lvl>
+    <w:lvl w:ilvl="1" w:tplc="10090003" w:tentative="1">
+      <w:start w:val="1"/>
+      <w:numFmt w:val="bullet"/>
+      <w:lvlText w:val="o"/>
+      <w:lvlJc w:val="left"/>
+      <w:pPr>
+        <w:ind w:left="1440" w:hanging="360"/>
+      </w:pPr>
+      <w:rPr>
+        <w:rFonts w:ascii="Courier New" w:hAnsi="Courier New" w:cs="Courier New" w:hint="default"/>
+      </w:rPr>
+    </w:lvl>
+    <w:lvl w:ilvl="2" w:tplc="10090005" w:tentative="1">
+      <w:start w:val="1"/>
+      <w:numFmt w:val="bullet"/>
+      <w:lvlText w:val=""/>
+      <w:lvlJc w:val="left"/>
+      <w:pPr>
+        <w:ind w:left="2160" w:hanging="360"/>
+      </w:pPr>
+      <w:rPr>
+        <w:rFonts w:ascii="Wingdings" w:hAnsi="Wingdings" w:hint="default"/>
+      </w:rPr>
+    </w:lvl>
+    <w:lvl w:ilvl="3" w:tplc="10090001" w:tentative="1">
+      <w:start w:val="1"/>
+      <w:numFmt w:val="bullet"/>
+      <w:lvlText w:val=""/>
+      <w:lvlJc w:val="left"/>
+      <w:pPr>
+        <w:ind w:left="2880" w:hanging="360"/>
+      </w:pPr>
+      <w:rPr>
+        <w:rFonts w:ascii="Symbol" w:hAnsi="Symbol" w:hint="default"/>
+      </w:rPr>
+    </w:lvl>
+    <w:lvl w:ilvl="4" w:tplc="10090003" w:tentative="1">
+      <w:start w:val="1"/>
+      <w:numFmt w:val="bullet"/>
+      <w:lvlText w:val="o"/>
+      <w:lvlJc w:val="left"/>
+      <w:pPr>
+        <w:ind w:left="3600" w:hanging="360"/>
+      </w:pPr>
+      <w:rPr>
+        <w:rFonts w:ascii="Courier New" w:hAnsi="Courier New" w:cs="Courier New" w:hint="default"/>
+      </w:rPr>
+    </w:lvl>
+    <w:lvl w:ilvl="5" w:tplc="10090005" w:tentative="1">
+      <w:start w:val="1"/>
+      <w:numFmt w:val="bullet"/>
+      <w:lvlText w:val=""/>
+      <w:lvlJc w:val="left"/>
+      <w:pPr>
+        <w:ind w:left="4320" w:hanging="360"/>
+      </w:pPr>
+      <w:rPr>
+        <w:rFonts w:ascii="Wingdings" w:hAnsi="Wingdings" w:hint="default"/>
+      </w:rPr>
+    </w:lvl>
+    <w:lvl w:ilvl="6" w:tplc="10090001" w:tentative="1">
+      <w:start w:val="1"/>
+      <w:numFmt w:val="bullet"/>
+      <w:lvlText w:val=""/>
+      <w:lvlJc w:val="left"/>
+      <w:pPr>
+        <w:ind w:left="5040" w:hanging="360"/>
+      </w:pPr>
+      <w:rPr>
+        <w:rFonts w:ascii="Symbol" w:hAnsi="Symbol" w:hint="default"/>
+      </w:rPr>
+    </w:lvl>
+    <w:lvl w:ilvl="7" w:tplc="10090003" w:tentative="1">
+      <w:start w:val="1"/>
+      <w:numFmt w:val="bullet"/>
+      <w:lvlText w:val="o"/>
+      <w:lvlJc w:val="left"/>
+      <w:pPr>
+        <w:ind w:left="5760" w:hanging="360"/>
+      </w:pPr>
+      <w:rPr>
+        <w:rFonts w:ascii="Courier New" w:hAnsi="Courier New" w:cs="Courier New" w:hint="default"/>
+      </w:rPr>
+    </w:lvl>
+    <w:lvl w:ilvl="8" w:tplc="10090005" w:tentative="1">
+      <w:start w:val="1"/>
+      <w:numFmt w:val="bullet"/>
+      <w:lvlText w:val=""/>
+      <w:lvlJc w:val="left"/>
+      <w:pPr>
+        <w:ind w:left="6480" w:hanging="360"/>
+      </w:pPr>
+      <w:rPr>
+        <w:rFonts w:ascii="Wingdings" w:hAnsi="Wingdings" w:hint="default"/>
+      </w:rPr>
+    </w:lvl>
+  </w:abstractNum>
+  <w:abstractNum w:abstractNumId="16" w15:restartNumberingAfterBreak="0">
     <w:nsid w:val="4F996F26"/>
     <w:multiLevelType w:val="multilevel"/>
     <w:tmpl w:val="C00C3956"/>
@@ -10685,7 +11629,7 @@
       </w:rPr>
     </w:lvl>
   </w:abstractNum>
-  <w:abstractNum w:abstractNumId="16" w15:restartNumberingAfterBreak="0">
+  <w:abstractNum w:abstractNumId="17" w15:restartNumberingAfterBreak="0">
     <w:nsid w:val="561074E4"/>
     <w:multiLevelType w:val="hybridMultilevel"/>
     <w:tmpl w:val="4C4C890E"/>
@@ -10774,7 +11718,7 @@
       </w:pPr>
     </w:lvl>
   </w:abstractNum>
-  <w:abstractNum w:abstractNumId="17" w15:restartNumberingAfterBreak="0">
+  <w:abstractNum w:abstractNumId="18" w15:restartNumberingAfterBreak="0">
     <w:nsid w:val="572A226F"/>
     <w:multiLevelType w:val="multilevel"/>
     <w:tmpl w:val="81FC1D9E"/>
@@ -10887,7 +11831,7 @@
       </w:pPr>
     </w:lvl>
   </w:abstractNum>
-  <w:abstractNum w:abstractNumId="18" w15:restartNumberingAfterBreak="0">
+  <w:abstractNum w:abstractNumId="19" w15:restartNumberingAfterBreak="0">
     <w:nsid w:val="5BF5117B"/>
     <w:multiLevelType w:val="multilevel"/>
     <w:tmpl w:val="8A1481F6"/>
@@ -11000,7 +11944,7 @@
       </w:pPr>
     </w:lvl>
   </w:abstractNum>
-  <w:abstractNum w:abstractNumId="19" w15:restartNumberingAfterBreak="0">
+  <w:abstractNum w:abstractNumId="20" w15:restartNumberingAfterBreak="0">
     <w:nsid w:val="5D3E6FA0"/>
     <w:multiLevelType w:val="multilevel"/>
     <w:tmpl w:val="1DD496E8"/>
@@ -11113,7 +12057,7 @@
       </w:pPr>
     </w:lvl>
   </w:abstractNum>
-  <w:abstractNum w:abstractNumId="20" w15:restartNumberingAfterBreak="0">
+  <w:abstractNum w:abstractNumId="21" w15:restartNumberingAfterBreak="0">
     <w:nsid w:val="5F935511"/>
     <w:multiLevelType w:val="multilevel"/>
     <w:tmpl w:val="44AE5600"/>
@@ -11226,7 +12170,7 @@
       </w:pPr>
     </w:lvl>
   </w:abstractNum>
-  <w:abstractNum w:abstractNumId="21" w15:restartNumberingAfterBreak="0">
+  <w:abstractNum w:abstractNumId="22" w15:restartNumberingAfterBreak="0">
     <w:nsid w:val="62330FFA"/>
     <w:multiLevelType w:val="multilevel"/>
     <w:tmpl w:val="1354050A"/>
@@ -11339,7 +12283,7 @@
       </w:pPr>
     </w:lvl>
   </w:abstractNum>
-  <w:abstractNum w:abstractNumId="22" w15:restartNumberingAfterBreak="0">
+  <w:abstractNum w:abstractNumId="23" w15:restartNumberingAfterBreak="0">
     <w:nsid w:val="653571BB"/>
     <w:multiLevelType w:val="multilevel"/>
     <w:tmpl w:val="E0F0DCF4"/>
@@ -11452,7 +12396,7 @@
       </w:pPr>
     </w:lvl>
   </w:abstractNum>
-  <w:abstractNum w:abstractNumId="23" w15:restartNumberingAfterBreak="0">
+  <w:abstractNum w:abstractNumId="24" w15:restartNumberingAfterBreak="0">
     <w:nsid w:val="69731E7F"/>
     <w:multiLevelType w:val="multilevel"/>
     <w:tmpl w:val="4FEA352E"/>
@@ -11601,7 +12545,7 @@
       </w:rPr>
     </w:lvl>
   </w:abstractNum>
-  <w:abstractNum w:abstractNumId="24" w15:restartNumberingAfterBreak="0">
+  <w:abstractNum w:abstractNumId="25" w15:restartNumberingAfterBreak="0">
     <w:nsid w:val="6DE2596E"/>
     <w:multiLevelType w:val="hybridMultilevel"/>
     <w:tmpl w:val="4C4C890E"/>
@@ -11690,7 +12634,7 @@
       </w:pPr>
     </w:lvl>
   </w:abstractNum>
-  <w:abstractNum w:abstractNumId="25" w15:restartNumberingAfterBreak="0">
+  <w:abstractNum w:abstractNumId="26" w15:restartNumberingAfterBreak="0">
     <w:nsid w:val="75520C24"/>
     <w:multiLevelType w:val="hybridMultilevel"/>
     <w:tmpl w:val="FCCE1BF6"/>
@@ -11779,7 +12723,7 @@
       </w:pPr>
     </w:lvl>
   </w:abstractNum>
-  <w:abstractNum w:abstractNumId="26" w15:restartNumberingAfterBreak="0">
+  <w:abstractNum w:abstractNumId="27" w15:restartNumberingAfterBreak="0">
     <w:nsid w:val="76FC0259"/>
     <w:multiLevelType w:val="multilevel"/>
     <w:tmpl w:val="79680AA4"/>
@@ -11892,7 +12836,7 @@
       </w:pPr>
     </w:lvl>
   </w:abstractNum>
-  <w:abstractNum w:abstractNumId="27" w15:restartNumberingAfterBreak="0">
+  <w:abstractNum w:abstractNumId="28" w15:restartNumberingAfterBreak="0">
     <w:nsid w:val="77A70C23"/>
     <w:multiLevelType w:val="multilevel"/>
     <w:tmpl w:val="8E221C46"/>
@@ -12012,19 +12956,19 @@
     <w:abstractNumId w:val="7"/>
   </w:num>
   <w:num w:numId="3" w16cid:durableId="1561554637">
-    <w:abstractNumId w:val="17"/>
+    <w:abstractNumId w:val="18"/>
   </w:num>
   <w:num w:numId="4" w16cid:durableId="1987002333">
-    <w:abstractNumId w:val="27"/>
+    <w:abstractNumId w:val="28"/>
   </w:num>
   <w:num w:numId="5" w16cid:durableId="1029794338">
     <w:abstractNumId w:val="13"/>
   </w:num>
   <w:num w:numId="6" w16cid:durableId="1650086756">
-    <w:abstractNumId w:val="19"/>
+    <w:abstractNumId w:val="20"/>
   </w:num>
   <w:num w:numId="7" w16cid:durableId="1476222975">
-    <w:abstractNumId w:val="26"/>
+    <w:abstractNumId w:val="27"/>
   </w:num>
   <w:num w:numId="8" w16cid:durableId="1533764241">
     <w:abstractNumId w:val="2"/>
@@ -12036,40 +12980,40 @@
     <w:abstractNumId w:val="3"/>
   </w:num>
   <w:num w:numId="11" w16cid:durableId="793057457">
-    <w:abstractNumId w:val="18"/>
+    <w:abstractNumId w:val="19"/>
   </w:num>
   <w:num w:numId="12" w16cid:durableId="2146773725">
-    <w:abstractNumId w:val="22"/>
+    <w:abstractNumId w:val="23"/>
   </w:num>
   <w:num w:numId="13" w16cid:durableId="1026561013">
     <w:abstractNumId w:val="9"/>
   </w:num>
   <w:num w:numId="14" w16cid:durableId="1192110950">
-    <w:abstractNumId w:val="20"/>
+    <w:abstractNumId w:val="21"/>
   </w:num>
   <w:num w:numId="15" w16cid:durableId="1262841238">
     <w:abstractNumId w:val="8"/>
   </w:num>
   <w:num w:numId="16" w16cid:durableId="155341019">
-    <w:abstractNumId w:val="15"/>
+    <w:abstractNumId w:val="16"/>
   </w:num>
   <w:num w:numId="17" w16cid:durableId="1040785662">
     <w:abstractNumId w:val="14"/>
   </w:num>
   <w:num w:numId="18" w16cid:durableId="1409767320">
-    <w:abstractNumId w:val="23"/>
+    <w:abstractNumId w:val="24"/>
   </w:num>
   <w:num w:numId="19" w16cid:durableId="2045591211">
     <w:abstractNumId w:val="10"/>
   </w:num>
   <w:num w:numId="20" w16cid:durableId="1764063768">
-    <w:abstractNumId w:val="21"/>
+    <w:abstractNumId w:val="22"/>
   </w:num>
   <w:num w:numId="21" w16cid:durableId="218832961">
     <w:abstractNumId w:val="12"/>
   </w:num>
   <w:num w:numId="22" w16cid:durableId="2045669289">
-    <w:abstractNumId w:val="25"/>
+    <w:abstractNumId w:val="26"/>
   </w:num>
   <w:num w:numId="23" w16cid:durableId="953443745">
     <w:abstractNumId w:val="6"/>
@@ -12081,13 +13025,16 @@
     <w:abstractNumId w:val="1"/>
   </w:num>
   <w:num w:numId="26" w16cid:durableId="1365129283">
-    <w:abstractNumId w:val="24"/>
+    <w:abstractNumId w:val="25"/>
   </w:num>
   <w:num w:numId="27" w16cid:durableId="1202403600">
     <w:abstractNumId w:val="11"/>
   </w:num>
   <w:num w:numId="28" w16cid:durableId="282420373">
-    <w:abstractNumId w:val="16"/>
+    <w:abstractNumId w:val="17"/>
+  </w:num>
+  <w:num w:numId="29" w16cid:durableId="101195959">
+    <w:abstractNumId w:val="15"/>
   </w:num>
 </w:numbering>
 </file>
@@ -12492,7 +13439,7 @@
   <w:style w:type="paragraph" w:default="1" w:styleId="Normal">
     <w:name w:val="Normal"/>
     <w:qFormat/>
-    <w:rsid w:val="001C5BBA"/>
+    <w:rsid w:val="008953D9"/>
     <w:rPr>
       <w:lang w:val="en-CA"/>
     </w:rPr>
@@ -13025,6 +13972,25 @@
       <w:spacing w:val="5"/>
     </w:rPr>
   </w:style>
+  <w:style w:type="table" w:styleId="TableGrid">
+    <w:name w:val="Table Grid"/>
+    <w:basedOn w:val="TableNormal"/>
+    <w:uiPriority w:val="39"/>
+    <w:rsid w:val="009C523A"/>
+    <w:pPr>
+      <w:spacing w:after="0" w:line="240" w:lineRule="auto"/>
+    </w:pPr>
+    <w:tblPr>
+      <w:tblBorders>
+        <w:top w:val="single" w:sz="4" w:space="0" w:color="auto"/>
+        <w:left w:val="single" w:sz="4" w:space="0" w:color="auto"/>
+        <w:bottom w:val="single" w:sz="4" w:space="0" w:color="auto"/>
+        <w:right w:val="single" w:sz="4" w:space="0" w:color="auto"/>
+        <w:insideH w:val="single" w:sz="4" w:space="0" w:color="auto"/>
+        <w:insideV w:val="single" w:sz="4" w:space="0" w:color="auto"/>
+      </w:tblBorders>
+    </w:tblPr>
+  </w:style>
 </w:styles>
 </file>
 

</xml_diff>

<commit_message>
Added support for checking restricted files and terms of access (5.4a)
</commit_message>
<xml_diff>
--- a/res/template_new.docx
+++ b/res/template_new.docx
@@ -382,17 +382,17 @@
         <w:tblLook w:val="04A0" w:firstRow="1" w:lastRow="0" w:firstColumn="1" w:lastColumn="0" w:noHBand="0" w:noVBand="1"/>
       </w:tblPr>
       <w:tblGrid>
-        <w:gridCol w:w="522"/>
-        <w:gridCol w:w="1389"/>
-        <w:gridCol w:w="1856"/>
-        <w:gridCol w:w="3939"/>
-        <w:gridCol w:w="3420"/>
-        <w:gridCol w:w="3939"/>
-        <w:gridCol w:w="421"/>
-        <w:gridCol w:w="425"/>
-        <w:gridCol w:w="4501"/>
-        <w:gridCol w:w="1129"/>
-        <w:gridCol w:w="810"/>
+        <w:gridCol w:w="489"/>
+        <w:gridCol w:w="1272"/>
+        <w:gridCol w:w="1694"/>
+        <w:gridCol w:w="3573"/>
+        <w:gridCol w:w="3104"/>
+        <w:gridCol w:w="3573"/>
+        <w:gridCol w:w="400"/>
+        <w:gridCol w:w="2357"/>
+        <w:gridCol w:w="4101"/>
+        <w:gridCol w:w="1038"/>
+        <w:gridCol w:w="750"/>
       </w:tblGrid>
       <w:tr>
         <w:trPr>
@@ -1698,39 +1698,47 @@
               <w:rPr>
                 <w:lang w:val="en-US"/>
               </w:rPr>
-              <w:t xml:space="preserve"> collection, include the name of the collection. </w:t>
-            </w:r>
-          </w:p>
-          <w:p>
-            <w:pPr>
-              <w:rPr>
-                <w:lang w:val="en-US"/>
-              </w:rPr>
-            </w:pPr>
-          </w:p>
-        </w:tc>
-        <w:tc>
-          <w:tcPr>
-            <w:tcW w:w="0" w:type="auto"/>
-            <w:tcBorders>
-              <w:top w:val="single" w:sz="8" w:space="0" w:color="000000"/>
-              <w:left w:val="single" w:sz="8" w:space="0" w:color="000000"/>
-              <w:bottom w:val="single" w:sz="8" w:space="0" w:color="000000"/>
-              <w:right w:val="single" w:sz="8" w:space="0" w:color="000000"/>
-            </w:tcBorders>
-            <w:tcMar>
-              <w:top w:w="100" w:type="dxa"/>
-              <w:left w:w="100" w:type="dxa"/>
-              <w:bottom w:w="100" w:type="dxa"/>
-              <w:right w:w="100" w:type="dxa"/>
-            </w:tcMar>
-            <w:hideMark/>
-          </w:tcPr>
-          <w:p>
-            <w:r>
-              <w:rPr>
-                <w:lang w:val="en-US"/>
-              </w:rPr>
+              <w:t xml:space="preserve"> collection, include </w:t>
+            </w:r>
+            <w:r>
+              <w:rPr>
+                <w:lang w:val="en-US"/>
+              </w:rPr>
+              <w:lastRenderedPageBreak/>
+              <w:t>the name of the collection. </w:t>
+            </w:r>
+          </w:p>
+          <w:p>
+            <w:pPr>
+              <w:rPr>
+                <w:lang w:val="en-US"/>
+              </w:rPr>
+            </w:pPr>
+          </w:p>
+        </w:tc>
+        <w:tc>
+          <w:tcPr>
+            <w:tcW w:w="0" w:type="auto"/>
+            <w:tcBorders>
+              <w:top w:val="single" w:sz="8" w:space="0" w:color="000000"/>
+              <w:left w:val="single" w:sz="8" w:space="0" w:color="000000"/>
+              <w:bottom w:val="single" w:sz="8" w:space="0" w:color="000000"/>
+              <w:right w:val="single" w:sz="8" w:space="0" w:color="000000"/>
+            </w:tcBorders>
+            <w:tcMar>
+              <w:top w:w="100" w:type="dxa"/>
+              <w:left w:w="100" w:type="dxa"/>
+              <w:bottom w:w="100" w:type="dxa"/>
+              <w:right w:w="100" w:type="dxa"/>
+            </w:tcMar>
+            <w:hideMark/>
+          </w:tcPr>
+          <w:p>
+            <w:r>
+              <w:rPr>
+                <w:lang w:val="en-US"/>
+              </w:rPr>
+              <w:lastRenderedPageBreak/>
               <w:t xml:space="preserve">{% if </w:t>
             </w:r>
             <w:proofErr w:type="spellStart"/>
@@ -2172,7 +2180,6 @@
                 <w:bCs/>
                 <w:lang w:val="en-US"/>
               </w:rPr>
-              <w:lastRenderedPageBreak/>
               <w:t>1.3</w:t>
             </w:r>
           </w:p>
@@ -2383,7 +2390,14 @@
               <w:rPr>
                 <w:lang w:val="en-US"/>
               </w:rPr>
-              <w:t xml:space="preserve">Confirm with the depositor that they actually require a </w:t>
+              <w:t>Confirm with the deposit</w:t>
+            </w:r>
+            <w:r>
+              <w:rPr>
+                <w:lang w:val="en-US"/>
+              </w:rPr>
+              <w:lastRenderedPageBreak/>
+              <w:t xml:space="preserve">or that they actually require a </w:t>
             </w:r>
             <w:proofErr w:type="spellStart"/>
             <w:r>
@@ -2645,7 +2659,6 @@
                 <w:bCs/>
                 <w:lang w:val="en-US"/>
               </w:rPr>
-              <w:lastRenderedPageBreak/>
               <w:t>2.0</w:t>
             </w:r>
           </w:p>
@@ -3968,6 +3981,7 @@
                 <w:bCs/>
                 <w:lang w:val="en-US"/>
               </w:rPr>
+              <w:lastRenderedPageBreak/>
               <w:t>2.3</w:t>
             </w:r>
           </w:p>
@@ -4800,16 +4814,7 @@
                 <w:bCs/>
                 <w:lang w:val="en-US"/>
               </w:rPr>
-              <w:t xml:space="preserve">*If some files do not appear on the common file format list, is there </w:t>
-            </w:r>
-            <w:r>
-              <w:rPr>
-                <w:b/>
-                <w:bCs/>
-                <w:lang w:val="en-US"/>
-              </w:rPr>
-              <w:lastRenderedPageBreak/>
-              <w:t>information or documentation about how to open the files(s)?</w:t>
+              <w:t>*If some files do not appear on the common file format list, is there information or documentation about how to open the files(s)?</w:t>
             </w:r>
           </w:p>
         </w:tc>
@@ -4844,15 +4849,7 @@
               <w:rPr>
                 <w:lang w:val="en-US"/>
               </w:rPr>
-              <w:lastRenderedPageBreak/>
-              <w:t xml:space="preserve">Review documentation files (e.g., README, other relevant </w:t>
-            </w:r>
-            <w:r>
-              <w:rPr>
-                <w:lang w:val="en-US"/>
-              </w:rPr>
-              <w:lastRenderedPageBreak/>
-              <w:t>files based on name) to determine if there is information about uncommon file types. </w:t>
+              <w:t>Review documentation files (e.g., README, other relevant files based on name) to determine if there is information about uncommon file types. </w:t>
             </w:r>
           </w:p>
         </w:tc>
@@ -5039,7 +5036,6 @@
               <w:rPr>
                 <w:lang w:val="en-US"/>
               </w:rPr>
-              <w:lastRenderedPageBreak/>
               <w:t>List the uncommon file format that does not have a documentation file:</w:t>
             </w:r>
           </w:p>
@@ -5082,7 +5078,6 @@
               <w:rPr>
                 <w:lang w:val="en-US"/>
               </w:rPr>
-              <w:lastRenderedPageBreak/>
               <w:t>Recommend</w:t>
             </w:r>
           </w:p>
@@ -5943,6 +5938,7 @@
                 <w:bCs/>
                 <w:lang w:val="en-US"/>
               </w:rPr>
+              <w:lastRenderedPageBreak/>
               <w:t>4.0</w:t>
             </w:r>
           </w:p>
@@ -6875,7 +6871,6 @@
               <w:rPr>
                 <w:lang w:val="en-US"/>
               </w:rPr>
-              <w:lastRenderedPageBreak/>
               <w:t>Title</w:t>
             </w:r>
           </w:p>
@@ -7552,6 +7547,7 @@
                 <w:bCs/>
                 <w:lang w:val="en-US"/>
               </w:rPr>
+              <w:lastRenderedPageBreak/>
               <w:t>5.0</w:t>
             </w:r>
           </w:p>
@@ -7983,14 +7979,7 @@
               <w:rPr>
                 <w:lang w:val="en-US"/>
               </w:rPr>
-              <w:t xml:space="preserve">Review description, notes, and terms of access </w:t>
-            </w:r>
-            <w:r>
-              <w:rPr>
-                <w:lang w:val="en-US"/>
-              </w:rPr>
-              <w:lastRenderedPageBreak/>
-              <w:t>metadata fields.</w:t>
+              <w:t>Review description, notes, and terms of access metadata fields.</w:t>
             </w:r>
           </w:p>
         </w:tc>
@@ -8298,7 +8287,16 @@
                 <w:bCs/>
                 <w:lang w:val="en-US"/>
               </w:rPr>
-              <w:t>*If something is flagged in the sensitive data review, does the depositor have REB approval to share the dataset?</w:t>
+              <w:t xml:space="preserve">*If something is flagged in the sensitive data review, does the </w:t>
+            </w:r>
+            <w:r>
+              <w:rPr>
+                <w:b/>
+                <w:bCs/>
+                <w:lang w:val="en-US"/>
+              </w:rPr>
+              <w:lastRenderedPageBreak/>
+              <w:t>depositor have REB approval to share the dataset?</w:t>
             </w:r>
           </w:p>
         </w:tc>
@@ -8333,7 +8331,15 @@
               <w:rPr>
                 <w:lang w:val="en-US"/>
               </w:rPr>
-              <w:t>If something is flagged in the sensitive data review (see question above), check the intake form to confirm information about their REB status.</w:t>
+              <w:lastRenderedPageBreak/>
+              <w:t xml:space="preserve">If something is flagged in the sensitive data review </w:t>
+            </w:r>
+            <w:r>
+              <w:rPr>
+                <w:lang w:val="en-US"/>
+              </w:rPr>
+              <w:lastRenderedPageBreak/>
+              <w:t>(see question above), check the intake form to confirm information about their REB status.</w:t>
             </w:r>
           </w:p>
         </w:tc>
@@ -8822,130 +8828,42 @@
             <w:hideMark/>
           </w:tcPr>
           <w:p>
-            <w:pPr>
-              <w:rPr>
-                <w:lang w:val="en-US"/>
-              </w:rPr>
-            </w:pPr>
-            <w:r>
-              <w:rPr>
-                <w:lang w:val="en-US"/>
-              </w:rPr>
+            <w:r>
               <w:t>List any restricted files in this dataset:</w:t>
             </w:r>
             <w:r>
-              <w:rPr>
-                <w:lang w:val="en-US"/>
-              </w:rPr>
               <w:br/>
             </w:r>
             <w:r>
-              <w:rPr>
-                <w:lang w:val="en-US"/>
-              </w:rPr>
-              <w:t xml:space="preserve">{% for item in </w:t>
+              <w:t xml:space="preserve">{% if </w:t>
             </w:r>
             <w:proofErr w:type="spellStart"/>
             <w:r>
-              <w:rPr>
-                <w:lang w:val="en-US"/>
-              </w:rPr>
-              <w:t>template_dict</w:t>
+              <w:t>template_dict.restricted_files.comment</w:t>
+            </w:r>
+            <w:r>
+              <w:rPr>
+                <w:rFonts w:hint="eastAsia"/>
+              </w:rPr>
+              <w:t>s</w:t>
+            </w:r>
+            <w:r>
+              <w:t>|length</w:t>
             </w:r>
             <w:proofErr w:type="spellEnd"/>
             <w:r>
-              <w:rPr>
-                <w:lang w:val="en-US"/>
-              </w:rPr>
-              <w:t>.</w:t>
-            </w:r>
-            <w:r>
-              <w:rPr>
-                <w:rFonts w:ascii="Consolas" w:eastAsia="Times New Roman" w:hAnsi="Consolas" w:cs="Times New Roman"/>
-                <w:color w:val="9CDCFE"/>
-                <w:kern w:val="0"/>
-                <w:sz w:val="21"/>
-                <w:szCs w:val="21"/>
-                <w14:ligatures w14:val="none"/>
-              </w:rPr>
-              <w:t xml:space="preserve"> </w:t>
+              <w:t xml:space="preserve"> &gt; 0</w:t>
+            </w:r>
+            <w:r>
+              <w:t xml:space="preserve"> %} {% for item in </w:t>
             </w:r>
             <w:proofErr w:type="spellStart"/>
             <w:r>
-              <w:t>restricted_files</w:t>
+              <w:t>template_dict.restricted_files.comments</w:t>
             </w:r>
             <w:proofErr w:type="spellEnd"/>
             <w:r>
-              <w:rPr>
-                <w:lang w:val="en-US"/>
-              </w:rPr>
-              <w:t>.comments %}</w:t>
-            </w:r>
-          </w:p>
-          <w:p>
-            <w:pPr>
-              <w:pStyle w:val="ListParagraph"/>
-              <w:numPr>
-                <w:ilvl w:val="0"/>
-                <w:numId w:val="28"/>
-              </w:numPr>
-            </w:pPr>
-            <w:r>
-              <w:rPr>
-                <w:lang w:val="en-US"/>
-              </w:rPr>
-              <w:t xml:space="preserve">{{ </w:t>
-            </w:r>
-            <w:proofErr w:type="spellStart"/>
-            <w:r>
-              <w:rPr>
-                <w:rFonts w:hint="eastAsia"/>
-                <w:lang w:val="en-US"/>
-              </w:rPr>
-              <w:t>item.</w:t>
-            </w:r>
-            <w:r>
-              <w:rPr>
-                <w:lang w:val="en-US"/>
-              </w:rPr>
-              <w:t>file_name</w:t>
-            </w:r>
-            <w:proofErr w:type="spellEnd"/>
-            <w:r>
-              <w:rPr>
-                <w:lang w:val="en-US"/>
-              </w:rPr>
-              <w:t xml:space="preserve"> }}{% </w:t>
-            </w:r>
-            <w:proofErr w:type="spellStart"/>
-            <w:r>
-              <w:rPr>
-                <w:lang w:val="en-US"/>
-              </w:rPr>
-              <w:t>endfor</w:t>
-            </w:r>
-            <w:proofErr w:type="spellEnd"/>
-            <w:r>
-              <w:rPr>
-                <w:lang w:val="en-US"/>
-              </w:rPr>
-              <w:t xml:space="preserve"> %}</w:t>
-            </w:r>
-          </w:p>
-          <w:p>
-            <w:pPr>
-              <w:rPr>
-                <w:lang w:val="en-US"/>
-              </w:rPr>
-            </w:pPr>
-            <w:r>
-              <w:br/>
-            </w:r>
-            <w:r>
-              <w:rPr>
-                <w:lang w:val="en-US"/>
-              </w:rPr>
-              <w:t>License applied to dataset:</w:t>
+              <w:t xml:space="preserve"> %} </w:t>
             </w:r>
           </w:p>
           <w:p>
@@ -8955,6 +8873,52 @@
                 <w:ilvl w:val="0"/>
                 <w:numId w:val="29"/>
               </w:numPr>
+            </w:pPr>
+            <w:r>
+              <w:t xml:space="preserve">{{ </w:t>
+            </w:r>
+            <w:proofErr w:type="spellStart"/>
+            <w:r>
+              <w:t>item.file_name</w:t>
+            </w:r>
+            <w:proofErr w:type="spellEnd"/>
+            <w:r>
+              <w:t xml:space="preserve"> }} {% </w:t>
+            </w:r>
+            <w:proofErr w:type="spellStart"/>
+            <w:r>
+              <w:t>endfor</w:t>
+            </w:r>
+            <w:proofErr w:type="spellEnd"/>
+            <w:r>
+              <w:t xml:space="preserve"> %}</w:t>
+            </w:r>
+          </w:p>
+          <w:p>
+            <w:r>
+              <w:t>{% else %}(NONE){% endif %}</w:t>
+            </w:r>
+          </w:p>
+          <w:p>
+            <w:pPr>
+              <w:rPr>
+                <w:lang w:val="en-US"/>
+              </w:rPr>
+            </w:pPr>
+            <w:r>
+              <w:rPr>
+                <w:lang w:val="en-US"/>
+              </w:rPr>
+              <w:t>License applied to dataset:</w:t>
+            </w:r>
+          </w:p>
+          <w:p>
+            <w:pPr>
+              <w:pStyle w:val="ListParagraph"/>
+              <w:numPr>
+                <w:ilvl w:val="0"/>
+                <w:numId w:val="30"/>
+              </w:numPr>
               <w:rPr>
                 <w:lang w:val="en-US"/>
               </w:rPr>
@@ -8976,7 +8940,7 @@
             </w:r>
             <w:proofErr w:type="spellEnd"/>
             <w:r>
-              <w:t xml:space="preserve"> }}{% else %}_(NONE)_{% endif %}</w:t>
+              <w:t xml:space="preserve"> }}{% else %}(NONE){% endif %}</w:t>
             </w:r>
           </w:p>
           <w:p>
@@ -9003,7 +8967,7 @@
               <w:tblLook w:val="04A0" w:firstRow="1" w:lastRow="0" w:firstColumn="1" w:lastColumn="0" w:noHBand="0" w:noVBand="1"/>
             </w:tblPr>
             <w:tblGrid>
-              <w:gridCol w:w="4291"/>
+              <w:gridCol w:w="3891"/>
             </w:tblGrid>
             <w:tr>
               <w:tc>
@@ -9039,7 +9003,7 @@
                   </w:r>
                   <w:proofErr w:type="spellEnd"/>
                   <w:r>
-                    <w:t xml:space="preserve"> }}{% else %}_(NONE)_{% endif %}</w:t>
+                    <w:t xml:space="preserve"> }}{% else %}(NONE){% endif %}</w:t>
                   </w:r>
                 </w:p>
               </w:tc>
@@ -9052,32 +9016,639 @@
               </w:rPr>
             </w:pPr>
           </w:p>
-          <w:p>
-            <w:pPr>
-              <w:rPr>
-                <w:lang w:val="en-US"/>
-              </w:rPr>
-            </w:pPr>
-            <w:r>
+        </w:tc>
+        <w:tc>
+          <w:tcPr>
+            <w:tcW w:w="0" w:type="auto"/>
+            <w:tcBorders>
+              <w:top w:val="single" w:sz="8" w:space="0" w:color="000000"/>
+              <w:left w:val="single" w:sz="8" w:space="0" w:color="000000"/>
+              <w:bottom w:val="single" w:sz="8" w:space="0" w:color="000000"/>
+              <w:right w:val="single" w:sz="8" w:space="0" w:color="000000"/>
+            </w:tcBorders>
+            <w:tcMar>
+              <w:top w:w="100" w:type="dxa"/>
+              <w:left w:w="100" w:type="dxa"/>
+              <w:bottom w:w="100" w:type="dxa"/>
+              <w:right w:w="100" w:type="dxa"/>
+            </w:tcMar>
+            <w:hideMark/>
+          </w:tcPr>
+          <w:p>
+            <w:pPr>
+              <w:rPr>
+                <w:lang w:val="en-US"/>
+              </w:rPr>
+            </w:pPr>
+            <w:r>
+              <w:rPr>
+                <w:lang w:val="en-US"/>
+              </w:rPr>
+              <w:t>Require</w:t>
+            </w:r>
+          </w:p>
+        </w:tc>
+        <w:tc>
+          <w:tcPr>
+            <w:tcW w:w="0" w:type="auto"/>
+            <w:tcBorders>
+              <w:top w:val="single" w:sz="8" w:space="0" w:color="000000"/>
+              <w:left w:val="single" w:sz="8" w:space="0" w:color="000000"/>
+              <w:bottom w:val="single" w:sz="8" w:space="0" w:color="000000"/>
+              <w:right w:val="single" w:sz="8" w:space="0" w:color="000000"/>
+            </w:tcBorders>
+            <w:tcMar>
+              <w:top w:w="100" w:type="dxa"/>
+              <w:left w:w="100" w:type="dxa"/>
+              <w:bottom w:w="100" w:type="dxa"/>
+              <w:right w:w="100" w:type="dxa"/>
+            </w:tcMar>
+            <w:hideMark/>
+          </w:tcPr>
+          <w:p>
+            <w:pPr>
+              <w:rPr>
+                <w:lang w:val="en-US"/>
+              </w:rPr>
+            </w:pPr>
+            <w:r>
+              <w:rPr>
+                <w:lang w:val="en-US"/>
+              </w:rPr>
+              <w:t>Python scripted</w:t>
+            </w:r>
+          </w:p>
+        </w:tc>
+      </w:tr>
+      <w:tr>
+        <w:trPr>
+          <w:trHeight w:val="480"/>
+        </w:trPr>
+        <w:tc>
+          <w:tcPr>
+            <w:tcW w:w="0" w:type="auto"/>
+            <w:tcBorders>
+              <w:top w:val="single" w:sz="8" w:space="0" w:color="000000"/>
+              <w:left w:val="single" w:sz="8" w:space="0" w:color="000000"/>
+              <w:bottom w:val="single" w:sz="8" w:space="0" w:color="000000"/>
+              <w:right w:val="single" w:sz="8" w:space="0" w:color="000000"/>
+            </w:tcBorders>
+            <w:tcMar>
+              <w:top w:w="100" w:type="dxa"/>
+              <w:left w:w="100" w:type="dxa"/>
+              <w:bottom w:w="100" w:type="dxa"/>
+              <w:right w:w="100" w:type="dxa"/>
+            </w:tcMar>
+            <w:hideMark/>
+          </w:tcPr>
+          <w:p>
+            <w:pPr>
+              <w:rPr>
+                <w:lang w:val="en-US"/>
+              </w:rPr>
+            </w:pPr>
+            <w:r>
+              <w:rPr>
+                <w:b/>
+                <w:bCs/>
+                <w:lang w:val="en-US"/>
+              </w:rPr>
+              <w:lastRenderedPageBreak/>
+              <w:t>5.4a</w:t>
+            </w:r>
+          </w:p>
+        </w:tc>
+        <w:tc>
+          <w:tcPr>
+            <w:tcW w:w="0" w:type="auto"/>
+            <w:tcBorders>
+              <w:top w:val="single" w:sz="8" w:space="0" w:color="000000"/>
+              <w:left w:val="single" w:sz="8" w:space="0" w:color="000000"/>
+              <w:bottom w:val="single" w:sz="8" w:space="0" w:color="000000"/>
+              <w:right w:val="single" w:sz="8" w:space="0" w:color="000000"/>
+            </w:tcBorders>
+            <w:tcMar>
+              <w:top w:w="100" w:type="dxa"/>
+              <w:left w:w="100" w:type="dxa"/>
+              <w:bottom w:w="100" w:type="dxa"/>
+              <w:right w:w="100" w:type="dxa"/>
+            </w:tcMar>
+            <w:hideMark/>
+          </w:tcPr>
+          <w:p>
+            <w:pPr>
+              <w:rPr>
+                <w:lang w:val="en-US"/>
+              </w:rPr>
+            </w:pPr>
+            <w:r>
+              <w:rPr>
+                <w:b/>
+                <w:bCs/>
+                <w:lang w:val="en-US"/>
+              </w:rPr>
+              <w:t>*If there are restricted files in the dataset, is the Terms of Access field complete?</w:t>
+            </w:r>
+          </w:p>
+        </w:tc>
+        <w:tc>
+          <w:tcPr>
+            <w:tcW w:w="0" w:type="auto"/>
+            <w:tcBorders>
+              <w:top w:val="single" w:sz="8" w:space="0" w:color="000000"/>
+              <w:left w:val="single" w:sz="8" w:space="0" w:color="000000"/>
+              <w:bottom w:val="single" w:sz="8" w:space="0" w:color="000000"/>
+              <w:right w:val="single" w:sz="8" w:space="0" w:color="000000"/>
+            </w:tcBorders>
+            <w:tcMar>
+              <w:top w:w="100" w:type="dxa"/>
+              <w:left w:w="100" w:type="dxa"/>
+              <w:bottom w:w="100" w:type="dxa"/>
+              <w:right w:w="100" w:type="dxa"/>
+            </w:tcMar>
+            <w:hideMark/>
+          </w:tcPr>
+          <w:p>
+            <w:pPr>
+              <w:rPr>
+                <w:lang w:val="en-US"/>
+              </w:rPr>
+            </w:pPr>
+            <w:r>
+              <w:rPr>
+                <w:lang w:val="en-US"/>
+              </w:rPr>
+              <w:t>Python scripted.</w:t>
+            </w:r>
+          </w:p>
+          <w:p>
+            <w:pPr>
+              <w:numPr>
+                <w:ilvl w:val="0"/>
+                <w:numId w:val="21"/>
+              </w:numPr>
+              <w:rPr>
+                <w:lang w:val="en-US"/>
+              </w:rPr>
+            </w:pPr>
+            <w:r>
+              <w:rPr>
+                <w:lang w:val="en-US"/>
+              </w:rPr>
+              <w:t>If there are restricted files and no Terms of Access, recommend including terms of access.</w:t>
+            </w:r>
+          </w:p>
+        </w:tc>
+        <w:tc>
+          <w:tcPr>
+            <w:tcW w:w="0" w:type="auto"/>
+            <w:tcBorders>
+              <w:top w:val="single" w:sz="8" w:space="0" w:color="000000"/>
+              <w:left w:val="single" w:sz="8" w:space="0" w:color="000000"/>
+              <w:bottom w:val="single" w:sz="8" w:space="0" w:color="000000"/>
+              <w:right w:val="single" w:sz="8" w:space="0" w:color="000000"/>
+            </w:tcBorders>
+            <w:tcMar>
+              <w:top w:w="100" w:type="dxa"/>
+              <w:left w:w="100" w:type="dxa"/>
+              <w:bottom w:w="100" w:type="dxa"/>
+              <w:right w:w="100" w:type="dxa"/>
+            </w:tcMar>
+            <w:hideMark/>
+          </w:tcPr>
+          <w:p>
+            <w:pPr>
               <w:rPr>
                 <w:rFonts w:hint="eastAsia"/>
                 <w:lang w:val="en-US"/>
               </w:rPr>
-              <w:t xml:space="preserve">Terms of </w:t>
-            </w:r>
+            </w:pPr>
             <w:r>
               <w:rPr>
                 <w:rFonts w:hint="eastAsia"/>
                 <w:lang w:val="en-US"/>
               </w:rPr>
-              <w:t xml:space="preserve">Access </w:t>
+              <w:t xml:space="preserve">{% if </w:t>
+            </w:r>
+            <w:proofErr w:type="spellStart"/>
+            <w:r>
+              <w:rPr>
+                <w:lang w:val="en-US"/>
+              </w:rPr>
+              <w:t>template_dict</w:t>
+            </w:r>
+            <w:proofErr w:type="spellEnd"/>
+            <w:r>
+              <w:rPr>
+                <w:lang w:val="en-US"/>
+              </w:rPr>
+              <w:t>.</w:t>
+            </w:r>
+            <w:r>
+              <w:rPr>
+                <w:rFonts w:ascii="Consolas" w:eastAsia="Times New Roman" w:hAnsi="Consolas" w:cs="Times New Roman"/>
+                <w:color w:val="9CDCFE"/>
+                <w:kern w:val="0"/>
+                <w:sz w:val="21"/>
+                <w:szCs w:val="21"/>
+                <w14:ligatures w14:val="none"/>
+              </w:rPr>
+              <w:t xml:space="preserve"> </w:t>
+            </w:r>
+            <w:proofErr w:type="spellStart"/>
+            <w:r>
+              <w:t>restricted_files</w:t>
+            </w:r>
+            <w:proofErr w:type="spellEnd"/>
+            <w:r>
+              <w:rPr>
+                <w:lang w:val="en-US"/>
+              </w:rPr>
+              <w:t>.</w:t>
+            </w:r>
+            <w:proofErr w:type="spellStart"/>
+            <w:r>
+              <w:rPr>
+                <w:lang w:val="en-US"/>
+              </w:rPr>
+              <w:t>comments</w:t>
             </w:r>
             <w:r>
               <w:rPr>
                 <w:rFonts w:hint="eastAsia"/>
                 <w:lang w:val="en-US"/>
               </w:rPr>
-              <w:t>applied to dataset:</w:t>
+              <w:t>|length</w:t>
+            </w:r>
+            <w:proofErr w:type="spellEnd"/>
+            <w:r>
+              <w:rPr>
+                <w:rFonts w:hint="eastAsia"/>
+                <w:lang w:val="en-US"/>
+              </w:rPr>
+              <w:t xml:space="preserve"> </w:t>
+            </w:r>
+            <w:r>
+              <w:rPr>
+                <w:rFonts w:hint="eastAsia"/>
+                <w:lang w:val="en-US"/>
+              </w:rPr>
+              <w:t>&gt;</w:t>
+            </w:r>
+            <w:r>
+              <w:rPr>
+                <w:lang w:val="en-US"/>
+              </w:rPr>
+              <w:t xml:space="preserve"> 0 </w:t>
+            </w:r>
+            <w:r>
+              <w:rPr>
+                <w:rFonts w:hint="eastAsia"/>
+                <w:lang w:val="en-US"/>
+              </w:rPr>
+              <w:t xml:space="preserve">and </w:t>
+            </w:r>
+            <w:proofErr w:type="spellStart"/>
+            <w:r>
+              <w:t>template_dict.terms_license.</w:t>
+            </w:r>
+            <w:r>
+              <w:t>termsOfAccess</w:t>
+            </w:r>
+            <w:proofErr w:type="spellEnd"/>
+            <w:r>
+              <w:t xml:space="preserve"> is not none</w:t>
+            </w:r>
+            <w:r>
+              <w:rPr>
+                <w:lang w:val="en-US"/>
+              </w:rPr>
+              <w:t xml:space="preserve"> %}</w:t>
+            </w:r>
+            <w:r>
+              <w:t>X{% endif %}</w:t>
+            </w:r>
+          </w:p>
+        </w:tc>
+        <w:tc>
+          <w:tcPr>
+            <w:tcW w:w="0" w:type="auto"/>
+            <w:tcBorders>
+              <w:top w:val="single" w:sz="8" w:space="0" w:color="000000"/>
+              <w:left w:val="single" w:sz="8" w:space="0" w:color="000000"/>
+              <w:bottom w:val="single" w:sz="8" w:space="0" w:color="000000"/>
+              <w:right w:val="single" w:sz="8" w:space="0" w:color="000000"/>
+            </w:tcBorders>
+            <w:tcMar>
+              <w:top w:w="100" w:type="dxa"/>
+              <w:left w:w="100" w:type="dxa"/>
+              <w:bottom w:w="100" w:type="dxa"/>
+              <w:right w:w="100" w:type="dxa"/>
+            </w:tcMar>
+            <w:hideMark/>
+          </w:tcPr>
+          <w:p>
+            <w:pPr>
+              <w:rPr>
+                <w:lang w:val="en-US"/>
+              </w:rPr>
+            </w:pPr>
+            <w:r>
+              <w:rPr>
+                <w:rFonts w:hint="eastAsia"/>
+                <w:lang w:val="en-US"/>
+              </w:rPr>
+              <w:t xml:space="preserve">{% if </w:t>
+            </w:r>
+            <w:proofErr w:type="spellStart"/>
+            <w:r>
+              <w:rPr>
+                <w:lang w:val="en-US"/>
+              </w:rPr>
+              <w:t>template_dict</w:t>
+            </w:r>
+            <w:proofErr w:type="spellEnd"/>
+            <w:r>
+              <w:rPr>
+                <w:lang w:val="en-US"/>
+              </w:rPr>
+              <w:t>.</w:t>
+            </w:r>
+            <w:r>
+              <w:rPr>
+                <w:rFonts w:ascii="Consolas" w:eastAsia="Times New Roman" w:hAnsi="Consolas" w:cs="Times New Roman"/>
+                <w:color w:val="9CDCFE"/>
+                <w:kern w:val="0"/>
+                <w:sz w:val="21"/>
+                <w:szCs w:val="21"/>
+                <w14:ligatures w14:val="none"/>
+              </w:rPr>
+              <w:t xml:space="preserve"> </w:t>
+            </w:r>
+            <w:proofErr w:type="spellStart"/>
+            <w:r>
+              <w:t>restricted_files</w:t>
+            </w:r>
+            <w:proofErr w:type="spellEnd"/>
+            <w:r>
+              <w:rPr>
+                <w:lang w:val="en-US"/>
+              </w:rPr>
+              <w:t>.</w:t>
+            </w:r>
+            <w:proofErr w:type="spellStart"/>
+            <w:r>
+              <w:rPr>
+                <w:lang w:val="en-US"/>
+              </w:rPr>
+              <w:t>comments</w:t>
+            </w:r>
+            <w:r>
+              <w:rPr>
+                <w:rFonts w:hint="eastAsia"/>
+                <w:lang w:val="en-US"/>
+              </w:rPr>
+              <w:t>|length</w:t>
+            </w:r>
+            <w:proofErr w:type="spellEnd"/>
+            <w:r>
+              <w:rPr>
+                <w:rFonts w:hint="eastAsia"/>
+                <w:lang w:val="en-US"/>
+              </w:rPr>
+              <w:t xml:space="preserve"> &gt;</w:t>
+            </w:r>
+            <w:r>
+              <w:rPr>
+                <w:lang w:val="en-US"/>
+              </w:rPr>
+              <w:t xml:space="preserve"> 0 </w:t>
+            </w:r>
+            <w:r>
+              <w:rPr>
+                <w:rFonts w:hint="eastAsia"/>
+                <w:lang w:val="en-US"/>
+              </w:rPr>
+              <w:t xml:space="preserve">and </w:t>
+            </w:r>
+            <w:proofErr w:type="spellStart"/>
+            <w:r>
+              <w:t>template_dict.terms_license.</w:t>
+            </w:r>
+            <w:r>
+              <w:t>termsOfAccess</w:t>
+            </w:r>
+            <w:proofErr w:type="spellEnd"/>
+            <w:r>
+              <w:t xml:space="preserve"> is none</w:t>
+            </w:r>
+            <w:r>
+              <w:rPr>
+                <w:lang w:val="en-US"/>
+              </w:rPr>
+              <w:t xml:space="preserve"> %}</w:t>
+            </w:r>
+            <w:r>
+              <w:t>X{% endif %}</w:t>
+            </w:r>
+          </w:p>
+        </w:tc>
+        <w:tc>
+          <w:tcPr>
+            <w:tcW w:w="0" w:type="auto"/>
+            <w:tcBorders>
+              <w:top w:val="single" w:sz="8" w:space="0" w:color="000000"/>
+              <w:left w:val="single" w:sz="8" w:space="0" w:color="000000"/>
+              <w:bottom w:val="single" w:sz="8" w:space="0" w:color="000000"/>
+              <w:right w:val="single" w:sz="8" w:space="0" w:color="000000"/>
+            </w:tcBorders>
+            <w:tcMar>
+              <w:top w:w="100" w:type="dxa"/>
+              <w:left w:w="100" w:type="dxa"/>
+              <w:bottom w:w="100" w:type="dxa"/>
+              <w:right w:w="100" w:type="dxa"/>
+            </w:tcMar>
+            <w:hideMark/>
+          </w:tcPr>
+          <w:p>
+            <w:pPr>
+              <w:rPr>
+                <w:lang w:val="en-US"/>
+              </w:rPr>
+            </w:pPr>
+          </w:p>
+        </w:tc>
+        <w:tc>
+          <w:tcPr>
+            <w:tcW w:w="0" w:type="auto"/>
+            <w:tcBorders>
+              <w:top w:val="single" w:sz="8" w:space="0" w:color="000000"/>
+              <w:left w:val="single" w:sz="8" w:space="0" w:color="000000"/>
+              <w:bottom w:val="single" w:sz="8" w:space="0" w:color="000000"/>
+              <w:right w:val="single" w:sz="8" w:space="0" w:color="000000"/>
+            </w:tcBorders>
+            <w:tcMar>
+              <w:top w:w="100" w:type="dxa"/>
+              <w:left w:w="100" w:type="dxa"/>
+              <w:bottom w:w="100" w:type="dxa"/>
+              <w:right w:w="100" w:type="dxa"/>
+            </w:tcMar>
+            <w:hideMark/>
+          </w:tcPr>
+          <w:p>
+            <w:pPr>
+              <w:rPr>
+                <w:lang w:val="en-US"/>
+              </w:rPr>
+            </w:pPr>
+          </w:p>
+        </w:tc>
+        <w:tc>
+          <w:tcPr>
+            <w:tcW w:w="0" w:type="auto"/>
+            <w:tcBorders>
+              <w:top w:val="single" w:sz="8" w:space="0" w:color="000000"/>
+              <w:left w:val="single" w:sz="8" w:space="0" w:color="000000"/>
+              <w:bottom w:val="single" w:sz="8" w:space="0" w:color="000000"/>
+              <w:right w:val="single" w:sz="8" w:space="0" w:color="000000"/>
+            </w:tcBorders>
+            <w:tcMar>
+              <w:top w:w="100" w:type="dxa"/>
+              <w:left w:w="100" w:type="dxa"/>
+              <w:bottom w:w="100" w:type="dxa"/>
+              <w:right w:w="100" w:type="dxa"/>
+            </w:tcMar>
+            <w:hideMark/>
+          </w:tcPr>
+          <w:p>
+            <w:pPr>
+              <w:rPr>
+                <w:rFonts w:hint="eastAsia"/>
+                <w:lang w:val="en-US"/>
+              </w:rPr>
+            </w:pPr>
+            <w:r>
+              <w:rPr>
+                <w:rFonts w:hint="eastAsia"/>
+                <w:lang w:val="en-US"/>
+              </w:rPr>
+              <w:t xml:space="preserve">{% if </w:t>
+            </w:r>
+            <w:proofErr w:type="spellStart"/>
+            <w:r>
+              <w:rPr>
+                <w:lang w:val="en-US"/>
+              </w:rPr>
+              <w:t>template_dict</w:t>
+            </w:r>
+            <w:proofErr w:type="spellEnd"/>
+            <w:r>
+              <w:rPr>
+                <w:lang w:val="en-US"/>
+              </w:rPr>
+              <w:t>.</w:t>
+            </w:r>
+            <w:r>
+              <w:rPr>
+                <w:rFonts w:ascii="Consolas" w:eastAsia="Times New Roman" w:hAnsi="Consolas" w:cs="Times New Roman"/>
+                <w:color w:val="9CDCFE"/>
+                <w:kern w:val="0"/>
+                <w:sz w:val="21"/>
+                <w:szCs w:val="21"/>
+                <w14:ligatures w14:val="none"/>
+              </w:rPr>
+              <w:t xml:space="preserve"> </w:t>
+            </w:r>
+            <w:proofErr w:type="spellStart"/>
+            <w:r>
+              <w:t>restricted_files</w:t>
+            </w:r>
+            <w:proofErr w:type="spellEnd"/>
+            <w:r>
+              <w:rPr>
+                <w:lang w:val="en-US"/>
+              </w:rPr>
+              <w:t>.</w:t>
+            </w:r>
+            <w:proofErr w:type="spellStart"/>
+            <w:r>
+              <w:rPr>
+                <w:lang w:val="en-US"/>
+              </w:rPr>
+              <w:t>comments</w:t>
+            </w:r>
+            <w:r>
+              <w:rPr>
+                <w:rFonts w:hint="eastAsia"/>
+                <w:lang w:val="en-US"/>
+              </w:rPr>
+              <w:t>|length</w:t>
+            </w:r>
+            <w:proofErr w:type="spellEnd"/>
+            <w:r>
+              <w:rPr>
+                <w:rFonts w:hint="eastAsia"/>
+                <w:lang w:val="en-US"/>
+              </w:rPr>
+              <w:t xml:space="preserve"> </w:t>
+            </w:r>
+            <w:r>
+              <w:rPr>
+                <w:rFonts w:hint="eastAsia"/>
+                <w:lang w:val="en-US"/>
+              </w:rPr>
+              <w:t>==</w:t>
+            </w:r>
+            <w:r>
+              <w:rPr>
+                <w:lang w:val="en-US"/>
+              </w:rPr>
+              <w:t xml:space="preserve"> 0</w:t>
+            </w:r>
+            <w:r>
+              <w:rPr>
+                <w:rFonts w:hint="eastAsia"/>
+                <w:lang w:val="en-US"/>
+              </w:rPr>
+              <w:t xml:space="preserve"> %}X</w:t>
+            </w:r>
+            <w:r>
+              <w:rPr>
+                <w:lang w:val="en-US"/>
+              </w:rPr>
+              <w:t>{% endif %}</w:t>
+            </w:r>
+          </w:p>
+        </w:tc>
+        <w:tc>
+          <w:tcPr>
+            <w:tcW w:w="0" w:type="auto"/>
+            <w:tcBorders>
+              <w:top w:val="single" w:sz="8" w:space="0" w:color="000000"/>
+              <w:left w:val="single" w:sz="8" w:space="0" w:color="000000"/>
+              <w:bottom w:val="single" w:sz="8" w:space="0" w:color="000000"/>
+              <w:right w:val="single" w:sz="8" w:space="0" w:color="000000"/>
+            </w:tcBorders>
+            <w:tcMar>
+              <w:top w:w="100" w:type="dxa"/>
+              <w:left w:w="100" w:type="dxa"/>
+              <w:bottom w:w="100" w:type="dxa"/>
+              <w:right w:w="100" w:type="dxa"/>
+            </w:tcMar>
+            <w:hideMark/>
+          </w:tcPr>
+          <w:p>
+            <w:pPr>
+              <w:rPr>
+                <w:lang w:val="en-US"/>
+              </w:rPr>
+            </w:pPr>
+            <w:r>
+              <w:rPr>
+                <w:rFonts w:hint="eastAsia"/>
+                <w:lang w:val="en-US"/>
+              </w:rPr>
+              <w:t>Terms of Access applied to dataset:</w:t>
             </w:r>
           </w:p>
           <w:tbl>
@@ -9087,7 +9658,7 @@
               <w:tblLook w:val="04A0" w:firstRow="1" w:lastRow="0" w:firstColumn="1" w:lastColumn="0" w:noHBand="0" w:noVBand="1"/>
             </w:tblPr>
             <w:tblGrid>
-              <w:gridCol w:w="4291"/>
+              <w:gridCol w:w="3891"/>
             </w:tblGrid>
             <w:tr>
               <w:tc>
@@ -9101,7 +9672,6 @@
                     </w:rPr>
                   </w:pPr>
                   <w:r>
-                    <w:lastRenderedPageBreak/>
                     <w:t xml:space="preserve">{% if </w:t>
                   </w:r>
                   <w:proofErr w:type="spellStart"/>
@@ -9124,7 +9694,7 @@
                   </w:r>
                   <w:proofErr w:type="spellEnd"/>
                   <w:r>
-                    <w:t xml:space="preserve"> }}{% else %}_(NONE)_{% endif %}</w:t>
+                    <w:t xml:space="preserve"> }}{% else %}(NONE){% endif %}</w:t>
                   </w:r>
                 </w:p>
               </w:tc>
@@ -9133,389 +9703,13 @@
           <w:p>
             <w:pPr>
               <w:rPr>
-                <w:lang w:val="en-US"/>
-              </w:rPr>
-            </w:pPr>
-          </w:p>
-        </w:tc>
-        <w:tc>
-          <w:tcPr>
-            <w:tcW w:w="0" w:type="auto"/>
-            <w:tcBorders>
-              <w:top w:val="single" w:sz="8" w:space="0" w:color="000000"/>
-              <w:left w:val="single" w:sz="8" w:space="0" w:color="000000"/>
-              <w:bottom w:val="single" w:sz="8" w:space="0" w:color="000000"/>
-              <w:right w:val="single" w:sz="8" w:space="0" w:color="000000"/>
-            </w:tcBorders>
-            <w:tcMar>
-              <w:top w:w="100" w:type="dxa"/>
-              <w:left w:w="100" w:type="dxa"/>
-              <w:bottom w:w="100" w:type="dxa"/>
-              <w:right w:w="100" w:type="dxa"/>
-            </w:tcMar>
-            <w:hideMark/>
-          </w:tcPr>
-          <w:p>
-            <w:pPr>
-              <w:rPr>
-                <w:lang w:val="en-US"/>
-              </w:rPr>
-            </w:pPr>
-            <w:r>
-              <w:rPr>
-                <w:lang w:val="en-US"/>
-              </w:rPr>
-              <w:lastRenderedPageBreak/>
-              <w:t>Require</w:t>
-            </w:r>
-          </w:p>
-        </w:tc>
-        <w:tc>
-          <w:tcPr>
-            <w:tcW w:w="0" w:type="auto"/>
-            <w:tcBorders>
-              <w:top w:val="single" w:sz="8" w:space="0" w:color="000000"/>
-              <w:left w:val="single" w:sz="8" w:space="0" w:color="000000"/>
-              <w:bottom w:val="single" w:sz="8" w:space="0" w:color="000000"/>
-              <w:right w:val="single" w:sz="8" w:space="0" w:color="000000"/>
-            </w:tcBorders>
-            <w:tcMar>
-              <w:top w:w="100" w:type="dxa"/>
-              <w:left w:w="100" w:type="dxa"/>
-              <w:bottom w:w="100" w:type="dxa"/>
-              <w:right w:w="100" w:type="dxa"/>
-            </w:tcMar>
-            <w:hideMark/>
-          </w:tcPr>
-          <w:p>
-            <w:pPr>
-              <w:rPr>
-                <w:lang w:val="en-US"/>
-              </w:rPr>
-            </w:pPr>
-            <w:r>
-              <w:rPr>
-                <w:lang w:val="en-US"/>
-              </w:rPr>
-              <w:t>Python scripted</w:t>
-            </w:r>
-          </w:p>
-        </w:tc>
-      </w:tr>
-      <w:tr>
-        <w:trPr>
-          <w:trHeight w:val="480"/>
-        </w:trPr>
-        <w:tc>
-          <w:tcPr>
-            <w:tcW w:w="0" w:type="auto"/>
-            <w:tcBorders>
-              <w:top w:val="single" w:sz="8" w:space="0" w:color="000000"/>
-              <w:left w:val="single" w:sz="8" w:space="0" w:color="000000"/>
-              <w:bottom w:val="single" w:sz="8" w:space="0" w:color="000000"/>
-              <w:right w:val="single" w:sz="8" w:space="0" w:color="000000"/>
-            </w:tcBorders>
-            <w:tcMar>
-              <w:top w:w="100" w:type="dxa"/>
-              <w:left w:w="100" w:type="dxa"/>
-              <w:bottom w:w="100" w:type="dxa"/>
-              <w:right w:w="100" w:type="dxa"/>
-            </w:tcMar>
-            <w:hideMark/>
-          </w:tcPr>
-          <w:p>
-            <w:pPr>
-              <w:rPr>
-                <w:lang w:val="en-US"/>
-              </w:rPr>
-            </w:pPr>
-            <w:r>
-              <w:rPr>
-                <w:b/>
-                <w:bCs/>
-                <w:lang w:val="en-US"/>
-              </w:rPr>
-              <w:t>5.4a</w:t>
-            </w:r>
-          </w:p>
-        </w:tc>
-        <w:tc>
-          <w:tcPr>
-            <w:tcW w:w="0" w:type="auto"/>
-            <w:tcBorders>
-              <w:top w:val="single" w:sz="8" w:space="0" w:color="000000"/>
-              <w:left w:val="single" w:sz="8" w:space="0" w:color="000000"/>
-              <w:bottom w:val="single" w:sz="8" w:space="0" w:color="000000"/>
-              <w:right w:val="single" w:sz="8" w:space="0" w:color="000000"/>
-            </w:tcBorders>
-            <w:tcMar>
-              <w:top w:w="100" w:type="dxa"/>
-              <w:left w:w="100" w:type="dxa"/>
-              <w:bottom w:w="100" w:type="dxa"/>
-              <w:right w:w="100" w:type="dxa"/>
-            </w:tcMar>
-            <w:hideMark/>
-          </w:tcPr>
-          <w:p>
-            <w:pPr>
-              <w:rPr>
-                <w:lang w:val="en-US"/>
-              </w:rPr>
-            </w:pPr>
-            <w:r>
-              <w:rPr>
-                <w:b/>
-                <w:bCs/>
-                <w:lang w:val="en-US"/>
-              </w:rPr>
-              <w:t>*If there are restricted files in the dataset, is the Terms of Access field complete?</w:t>
-            </w:r>
-          </w:p>
-        </w:tc>
-        <w:tc>
-          <w:tcPr>
-            <w:tcW w:w="0" w:type="auto"/>
-            <w:tcBorders>
-              <w:top w:val="single" w:sz="8" w:space="0" w:color="000000"/>
-              <w:left w:val="single" w:sz="8" w:space="0" w:color="000000"/>
-              <w:bottom w:val="single" w:sz="8" w:space="0" w:color="000000"/>
-              <w:right w:val="single" w:sz="8" w:space="0" w:color="000000"/>
-            </w:tcBorders>
-            <w:tcMar>
-              <w:top w:w="100" w:type="dxa"/>
-              <w:left w:w="100" w:type="dxa"/>
-              <w:bottom w:w="100" w:type="dxa"/>
-              <w:right w:w="100" w:type="dxa"/>
-            </w:tcMar>
-            <w:hideMark/>
-          </w:tcPr>
-          <w:p>
-            <w:pPr>
-              <w:rPr>
-                <w:lang w:val="en-US"/>
-              </w:rPr>
-            </w:pPr>
-            <w:r>
-              <w:rPr>
-                <w:lang w:val="en-US"/>
-              </w:rPr>
-              <w:t>Python scripted.</w:t>
-            </w:r>
-          </w:p>
-          <w:p>
-            <w:pPr>
-              <w:rPr>
-                <w:lang w:val="en-US"/>
-              </w:rPr>
-            </w:pPr>
-          </w:p>
-          <w:p>
-            <w:pPr>
-              <w:numPr>
-                <w:ilvl w:val="0"/>
-                <w:numId w:val="21"/>
-              </w:numPr>
-              <w:rPr>
-                <w:lang w:val="en-US"/>
-              </w:rPr>
-            </w:pPr>
-            <w:r>
-              <w:rPr>
-                <w:lang w:val="en-US"/>
-              </w:rPr>
-              <w:t>If there are restricted files and no Terms of Access, recommend including terms of access.</w:t>
-            </w:r>
-          </w:p>
-        </w:tc>
-        <w:tc>
-          <w:tcPr>
-            <w:tcW w:w="0" w:type="auto"/>
-            <w:tcBorders>
-              <w:top w:val="single" w:sz="8" w:space="0" w:color="000000"/>
-              <w:left w:val="single" w:sz="8" w:space="0" w:color="000000"/>
-              <w:bottom w:val="single" w:sz="8" w:space="0" w:color="000000"/>
-              <w:right w:val="single" w:sz="8" w:space="0" w:color="000000"/>
-            </w:tcBorders>
-            <w:tcMar>
-              <w:top w:w="100" w:type="dxa"/>
-              <w:left w:w="100" w:type="dxa"/>
-              <w:bottom w:w="100" w:type="dxa"/>
-              <w:right w:w="100" w:type="dxa"/>
-            </w:tcMar>
-            <w:hideMark/>
-          </w:tcPr>
-          <w:p>
-            <w:pPr>
-              <w:rPr>
-                <w:lang w:val="en-US"/>
-              </w:rPr>
-            </w:pPr>
-            <w:r>
-              <w:rPr>
-                <w:rFonts w:hint="eastAsia"/>
                 <w:b/>
                 <w:bCs/>
                 <w:color w:val="FF0000"/>
                 <w:sz w:val="40"/>
                 <w:szCs w:val="40"/>
-                <w:lang w:val="en-US"/>
-              </w:rPr>
-              <w:t>TBD</w:t>
-            </w:r>
-          </w:p>
-        </w:tc>
-        <w:tc>
-          <w:tcPr>
-            <w:tcW w:w="0" w:type="auto"/>
-            <w:tcBorders>
-              <w:top w:val="single" w:sz="8" w:space="0" w:color="000000"/>
-              <w:left w:val="single" w:sz="8" w:space="0" w:color="000000"/>
-              <w:bottom w:val="single" w:sz="8" w:space="0" w:color="000000"/>
-              <w:right w:val="single" w:sz="8" w:space="0" w:color="000000"/>
-            </w:tcBorders>
-            <w:tcMar>
-              <w:top w:w="100" w:type="dxa"/>
-              <w:left w:w="100" w:type="dxa"/>
-              <w:bottom w:w="100" w:type="dxa"/>
-              <w:right w:w="100" w:type="dxa"/>
-            </w:tcMar>
-            <w:hideMark/>
-          </w:tcPr>
-          <w:p>
-            <w:pPr>
-              <w:rPr>
-                <w:lang w:val="en-US"/>
-              </w:rPr>
-            </w:pPr>
-          </w:p>
-        </w:tc>
-        <w:tc>
-          <w:tcPr>
-            <w:tcW w:w="0" w:type="auto"/>
-            <w:tcBorders>
-              <w:top w:val="single" w:sz="8" w:space="0" w:color="000000"/>
-              <w:left w:val="single" w:sz="8" w:space="0" w:color="000000"/>
-              <w:bottom w:val="single" w:sz="8" w:space="0" w:color="000000"/>
-              <w:right w:val="single" w:sz="8" w:space="0" w:color="000000"/>
-            </w:tcBorders>
-            <w:tcMar>
-              <w:top w:w="100" w:type="dxa"/>
-              <w:left w:w="100" w:type="dxa"/>
-              <w:bottom w:w="100" w:type="dxa"/>
-              <w:right w:w="100" w:type="dxa"/>
-            </w:tcMar>
-            <w:hideMark/>
-          </w:tcPr>
-          <w:p>
-            <w:pPr>
-              <w:rPr>
-                <w:lang w:val="en-US"/>
-              </w:rPr>
-            </w:pPr>
-            <w:r>
-              <w:rPr>
-                <w:rFonts w:hint="eastAsia"/>
-                <w:b/>
-                <w:bCs/>
-                <w:color w:val="FF0000"/>
-                <w:sz w:val="40"/>
-                <w:szCs w:val="40"/>
-                <w:lang w:val="en-US"/>
-              </w:rPr>
-              <w:t>TBD</w:t>
-            </w:r>
-          </w:p>
-        </w:tc>
-        <w:tc>
-          <w:tcPr>
-            <w:tcW w:w="0" w:type="auto"/>
-            <w:tcBorders>
-              <w:top w:val="single" w:sz="8" w:space="0" w:color="000000"/>
-              <w:left w:val="single" w:sz="8" w:space="0" w:color="000000"/>
-              <w:bottom w:val="single" w:sz="8" w:space="0" w:color="000000"/>
-              <w:right w:val="single" w:sz="8" w:space="0" w:color="000000"/>
-            </w:tcBorders>
-            <w:tcMar>
-              <w:top w:w="100" w:type="dxa"/>
-              <w:left w:w="100" w:type="dxa"/>
-              <w:bottom w:w="100" w:type="dxa"/>
-              <w:right w:w="100" w:type="dxa"/>
-            </w:tcMar>
-            <w:hideMark/>
-          </w:tcPr>
-          <w:p>
-            <w:pPr>
-              <w:rPr>
-                <w:lang w:val="en-US"/>
-              </w:rPr>
-            </w:pPr>
-          </w:p>
-        </w:tc>
-        <w:tc>
-          <w:tcPr>
-            <w:tcW w:w="0" w:type="auto"/>
-            <w:tcBorders>
-              <w:top w:val="single" w:sz="8" w:space="0" w:color="000000"/>
-              <w:left w:val="single" w:sz="8" w:space="0" w:color="000000"/>
-              <w:bottom w:val="single" w:sz="8" w:space="0" w:color="000000"/>
-              <w:right w:val="single" w:sz="8" w:space="0" w:color="000000"/>
-            </w:tcBorders>
-            <w:tcMar>
-              <w:top w:w="100" w:type="dxa"/>
-              <w:left w:w="100" w:type="dxa"/>
-              <w:bottom w:w="100" w:type="dxa"/>
-              <w:right w:w="100" w:type="dxa"/>
-            </w:tcMar>
-            <w:hideMark/>
-          </w:tcPr>
-          <w:p>
-            <w:pPr>
-              <w:rPr>
-                <w:lang w:val="en-US"/>
-              </w:rPr>
-            </w:pPr>
-          </w:p>
-        </w:tc>
-        <w:tc>
-          <w:tcPr>
-            <w:tcW w:w="0" w:type="auto"/>
-            <w:tcBorders>
-              <w:top w:val="single" w:sz="8" w:space="0" w:color="000000"/>
-              <w:left w:val="single" w:sz="8" w:space="0" w:color="000000"/>
-              <w:bottom w:val="single" w:sz="8" w:space="0" w:color="000000"/>
-              <w:right w:val="single" w:sz="8" w:space="0" w:color="000000"/>
-            </w:tcBorders>
-            <w:tcMar>
-              <w:top w:w="100" w:type="dxa"/>
-              <w:left w:w="100" w:type="dxa"/>
-              <w:bottom w:w="100" w:type="dxa"/>
-              <w:right w:w="100" w:type="dxa"/>
-            </w:tcMar>
-            <w:hideMark/>
-          </w:tcPr>
-          <w:p>
-            <w:pPr>
-              <w:rPr>
-                <w:b/>
-                <w:bCs/>
-                <w:color w:val="FF0000"/>
-                <w:sz w:val="40"/>
-                <w:szCs w:val="40"/>
-                <w:lang w:val="en-US"/>
-              </w:rPr>
-            </w:pPr>
-            <w:r>
-              <w:rPr>
-                <w:rFonts w:hint="eastAsia"/>
-                <w:b/>
-                <w:bCs/>
-                <w:color w:val="FF0000"/>
-                <w:sz w:val="40"/>
-                <w:szCs w:val="40"/>
-                <w:lang w:val="en-US"/>
-              </w:rPr>
-              <w:t>TBD</w:t>
-            </w:r>
+              </w:rPr>
+            </w:pPr>
           </w:p>
         </w:tc>
         <w:tc>
@@ -11370,117 +11564,230 @@
   <w:abstractNum w:abstractNumId="15" w15:restartNumberingAfterBreak="0">
     <w:nsid w:val="472F23DD"/>
     <w:multiLevelType w:val="hybridMultilevel"/>
-    <w:tmpl w:val="82846050"/>
-    <w:lvl w:ilvl="0" w:tplc="10090001">
+    <w:tmpl w:val="03DEC164"/>
+    <w:lvl w:ilvl="0" w:tplc="1009000F">
+      <w:start w:val="1"/>
+      <w:numFmt w:val="decimal"/>
+      <w:lvlText w:val="%1."/>
+      <w:lvlJc w:val="left"/>
+      <w:pPr>
+        <w:ind w:left="720" w:hanging="360"/>
+      </w:pPr>
+      <w:rPr>
+        <w:rFonts w:hint="default"/>
+      </w:rPr>
+    </w:lvl>
+    <w:lvl w:ilvl="1" w:tplc="10090003" w:tentative="1">
+      <w:start w:val="1"/>
+      <w:numFmt w:val="bullet"/>
+      <w:lvlText w:val="o"/>
+      <w:lvlJc w:val="left"/>
+      <w:pPr>
+        <w:ind w:left="1440" w:hanging="360"/>
+      </w:pPr>
+      <w:rPr>
+        <w:rFonts w:ascii="Courier New" w:hAnsi="Courier New" w:cs="Courier New" w:hint="default"/>
+      </w:rPr>
+    </w:lvl>
+    <w:lvl w:ilvl="2" w:tplc="10090005" w:tentative="1">
+      <w:start w:val="1"/>
+      <w:numFmt w:val="bullet"/>
+      <w:lvlText w:val=""/>
+      <w:lvlJc w:val="left"/>
+      <w:pPr>
+        <w:ind w:left="2160" w:hanging="360"/>
+      </w:pPr>
+      <w:rPr>
+        <w:rFonts w:ascii="Wingdings" w:hAnsi="Wingdings" w:hint="default"/>
+      </w:rPr>
+    </w:lvl>
+    <w:lvl w:ilvl="3" w:tplc="10090001" w:tentative="1">
       <w:start w:val="1"/>
       <w:numFmt w:val="bullet"/>
       <w:lvlText w:val=""/>
       <w:lvlJc w:val="left"/>
       <w:pPr>
-        <w:ind w:left="720" w:hanging="360"/>
+        <w:ind w:left="2880" w:hanging="360"/>
       </w:pPr>
       <w:rPr>
         <w:rFonts w:ascii="Symbol" w:hAnsi="Symbol" w:hint="default"/>
       </w:rPr>
     </w:lvl>
-    <w:lvl w:ilvl="1" w:tplc="10090003" w:tentative="1">
+    <w:lvl w:ilvl="4" w:tplc="10090003" w:tentative="1">
       <w:start w:val="1"/>
       <w:numFmt w:val="bullet"/>
       <w:lvlText w:val="o"/>
       <w:lvlJc w:val="left"/>
       <w:pPr>
-        <w:ind w:left="1440" w:hanging="360"/>
+        <w:ind w:left="3600" w:hanging="360"/>
       </w:pPr>
       <w:rPr>
         <w:rFonts w:ascii="Courier New" w:hAnsi="Courier New" w:cs="Courier New" w:hint="default"/>
       </w:rPr>
     </w:lvl>
-    <w:lvl w:ilvl="2" w:tplc="10090005" w:tentative="1">
+    <w:lvl w:ilvl="5" w:tplc="10090005" w:tentative="1">
       <w:start w:val="1"/>
       <w:numFmt w:val="bullet"/>
       <w:lvlText w:val=""/>
       <w:lvlJc w:val="left"/>
       <w:pPr>
-        <w:ind w:left="2160" w:hanging="360"/>
+        <w:ind w:left="4320" w:hanging="360"/>
       </w:pPr>
       <w:rPr>
         <w:rFonts w:ascii="Wingdings" w:hAnsi="Wingdings" w:hint="default"/>
       </w:rPr>
     </w:lvl>
-    <w:lvl w:ilvl="3" w:tplc="10090001" w:tentative="1">
+    <w:lvl w:ilvl="6" w:tplc="10090001" w:tentative="1">
       <w:start w:val="1"/>
       <w:numFmt w:val="bullet"/>
       <w:lvlText w:val=""/>
       <w:lvlJc w:val="left"/>
       <w:pPr>
-        <w:ind w:left="2880" w:hanging="360"/>
+        <w:ind w:left="5040" w:hanging="360"/>
       </w:pPr>
       <w:rPr>
         <w:rFonts w:ascii="Symbol" w:hAnsi="Symbol" w:hint="default"/>
       </w:rPr>
     </w:lvl>
-    <w:lvl w:ilvl="4" w:tplc="10090003" w:tentative="1">
+    <w:lvl w:ilvl="7" w:tplc="10090003" w:tentative="1">
       <w:start w:val="1"/>
       <w:numFmt w:val="bullet"/>
       <w:lvlText w:val="o"/>
       <w:lvlJc w:val="left"/>
       <w:pPr>
-        <w:ind w:left="3600" w:hanging="360"/>
+        <w:ind w:left="5760" w:hanging="360"/>
       </w:pPr>
       <w:rPr>
         <w:rFonts w:ascii="Courier New" w:hAnsi="Courier New" w:cs="Courier New" w:hint="default"/>
       </w:rPr>
     </w:lvl>
-    <w:lvl w:ilvl="5" w:tplc="10090005" w:tentative="1">
+    <w:lvl w:ilvl="8" w:tplc="10090005" w:tentative="1">
       <w:start w:val="1"/>
       <w:numFmt w:val="bullet"/>
       <w:lvlText w:val=""/>
       <w:lvlJc w:val="left"/>
       <w:pPr>
-        <w:ind w:left="4320" w:hanging="360"/>
+        <w:ind w:left="6480" w:hanging="360"/>
       </w:pPr>
       <w:rPr>
         <w:rFonts w:ascii="Wingdings" w:hAnsi="Wingdings" w:hint="default"/>
       </w:rPr>
     </w:lvl>
-    <w:lvl w:ilvl="6" w:tplc="10090001" w:tentative="1">
+  </w:abstractNum>
+  <w:abstractNum w:abstractNumId="16" w15:restartNumberingAfterBreak="0">
+    <w:nsid w:val="48F76F1E"/>
+    <w:multiLevelType w:val="hybridMultilevel"/>
+    <w:tmpl w:val="03DEC164"/>
+    <w:lvl w:ilvl="0" w:tplc="FFFFFFFF">
+      <w:start w:val="1"/>
+      <w:numFmt w:val="decimal"/>
+      <w:lvlText w:val="%1."/>
+      <w:lvlJc w:val="left"/>
+      <w:pPr>
+        <w:ind w:left="720" w:hanging="360"/>
+      </w:pPr>
+      <w:rPr>
+        <w:rFonts w:hint="default"/>
+      </w:rPr>
+    </w:lvl>
+    <w:lvl w:ilvl="1" w:tplc="FFFFFFFF" w:tentative="1">
+      <w:start w:val="1"/>
+      <w:numFmt w:val="bullet"/>
+      <w:lvlText w:val="o"/>
+      <w:lvlJc w:val="left"/>
+      <w:pPr>
+        <w:ind w:left="1440" w:hanging="360"/>
+      </w:pPr>
+      <w:rPr>
+        <w:rFonts w:ascii="Courier New" w:hAnsi="Courier New" w:cs="Courier New" w:hint="default"/>
+      </w:rPr>
+    </w:lvl>
+    <w:lvl w:ilvl="2" w:tplc="FFFFFFFF" w:tentative="1">
+      <w:start w:val="1"/>
+      <w:numFmt w:val="bullet"/>
+      <w:lvlText w:val=""/>
+      <w:lvlJc w:val="left"/>
+      <w:pPr>
+        <w:ind w:left="2160" w:hanging="360"/>
+      </w:pPr>
+      <w:rPr>
+        <w:rFonts w:ascii="Wingdings" w:hAnsi="Wingdings" w:hint="default"/>
+      </w:rPr>
+    </w:lvl>
+    <w:lvl w:ilvl="3" w:tplc="FFFFFFFF" w:tentative="1">
       <w:start w:val="1"/>
       <w:numFmt w:val="bullet"/>
       <w:lvlText w:val=""/>
       <w:lvlJc w:val="left"/>
       <w:pPr>
-        <w:ind w:left="5040" w:hanging="360"/>
+        <w:ind w:left="2880" w:hanging="360"/>
       </w:pPr>
       <w:rPr>
         <w:rFonts w:ascii="Symbol" w:hAnsi="Symbol" w:hint="default"/>
       </w:rPr>
     </w:lvl>
-    <w:lvl w:ilvl="7" w:tplc="10090003" w:tentative="1">
+    <w:lvl w:ilvl="4" w:tplc="FFFFFFFF" w:tentative="1">
       <w:start w:val="1"/>
       <w:numFmt w:val="bullet"/>
       <w:lvlText w:val="o"/>
       <w:lvlJc w:val="left"/>
       <w:pPr>
-        <w:ind w:left="5760" w:hanging="360"/>
+        <w:ind w:left="3600" w:hanging="360"/>
       </w:pPr>
       <w:rPr>
         <w:rFonts w:ascii="Courier New" w:hAnsi="Courier New" w:cs="Courier New" w:hint="default"/>
       </w:rPr>
     </w:lvl>
-    <w:lvl w:ilvl="8" w:tplc="10090005" w:tentative="1">
+    <w:lvl w:ilvl="5" w:tplc="FFFFFFFF" w:tentative="1">
       <w:start w:val="1"/>
       <w:numFmt w:val="bullet"/>
       <w:lvlText w:val=""/>
       <w:lvlJc w:val="left"/>
       <w:pPr>
-        <w:ind w:left="6480" w:hanging="360"/>
+        <w:ind w:left="4320" w:hanging="360"/>
       </w:pPr>
       <w:rPr>
         <w:rFonts w:ascii="Wingdings" w:hAnsi="Wingdings" w:hint="default"/>
       </w:rPr>
     </w:lvl>
+    <w:lvl w:ilvl="6" w:tplc="FFFFFFFF" w:tentative="1">
+      <w:start w:val="1"/>
+      <w:numFmt w:val="bullet"/>
+      <w:lvlText w:val=""/>
+      <w:lvlJc w:val="left"/>
+      <w:pPr>
+        <w:ind w:left="5040" w:hanging="360"/>
+      </w:pPr>
+      <w:rPr>
+        <w:rFonts w:ascii="Symbol" w:hAnsi="Symbol" w:hint="default"/>
+      </w:rPr>
+    </w:lvl>
+    <w:lvl w:ilvl="7" w:tplc="FFFFFFFF" w:tentative="1">
+      <w:start w:val="1"/>
+      <w:numFmt w:val="bullet"/>
+      <w:lvlText w:val="o"/>
+      <w:lvlJc w:val="left"/>
+      <w:pPr>
+        <w:ind w:left="5760" w:hanging="360"/>
+      </w:pPr>
+      <w:rPr>
+        <w:rFonts w:ascii="Courier New" w:hAnsi="Courier New" w:cs="Courier New" w:hint="default"/>
+      </w:rPr>
+    </w:lvl>
+    <w:lvl w:ilvl="8" w:tplc="FFFFFFFF" w:tentative="1">
+      <w:start w:val="1"/>
+      <w:numFmt w:val="bullet"/>
+      <w:lvlText w:val=""/>
+      <w:lvlJc w:val="left"/>
+      <w:pPr>
+        <w:ind w:left="6480" w:hanging="360"/>
+      </w:pPr>
+      <w:rPr>
+        <w:rFonts w:ascii="Wingdings" w:hAnsi="Wingdings" w:hint="default"/>
+      </w:rPr>
+    </w:lvl>
   </w:abstractNum>
-  <w:abstractNum w:abstractNumId="16" w15:restartNumberingAfterBreak="0">
+  <w:abstractNum w:abstractNumId="17" w15:restartNumberingAfterBreak="0">
     <w:nsid w:val="4F996F26"/>
     <w:multiLevelType w:val="multilevel"/>
     <w:tmpl w:val="C00C3956"/>
@@ -11629,7 +11936,7 @@
       </w:rPr>
     </w:lvl>
   </w:abstractNum>
-  <w:abstractNum w:abstractNumId="17" w15:restartNumberingAfterBreak="0">
+  <w:abstractNum w:abstractNumId="18" w15:restartNumberingAfterBreak="0">
     <w:nsid w:val="561074E4"/>
     <w:multiLevelType w:val="hybridMultilevel"/>
     <w:tmpl w:val="4C4C890E"/>
@@ -11718,7 +12025,7 @@
       </w:pPr>
     </w:lvl>
   </w:abstractNum>
-  <w:abstractNum w:abstractNumId="18" w15:restartNumberingAfterBreak="0">
+  <w:abstractNum w:abstractNumId="19" w15:restartNumberingAfterBreak="0">
     <w:nsid w:val="572A226F"/>
     <w:multiLevelType w:val="multilevel"/>
     <w:tmpl w:val="81FC1D9E"/>
@@ -11831,7 +12138,7 @@
       </w:pPr>
     </w:lvl>
   </w:abstractNum>
-  <w:abstractNum w:abstractNumId="19" w15:restartNumberingAfterBreak="0">
+  <w:abstractNum w:abstractNumId="20" w15:restartNumberingAfterBreak="0">
     <w:nsid w:val="5BF5117B"/>
     <w:multiLevelType w:val="multilevel"/>
     <w:tmpl w:val="8A1481F6"/>
@@ -11944,7 +12251,7 @@
       </w:pPr>
     </w:lvl>
   </w:abstractNum>
-  <w:abstractNum w:abstractNumId="20" w15:restartNumberingAfterBreak="0">
+  <w:abstractNum w:abstractNumId="21" w15:restartNumberingAfterBreak="0">
     <w:nsid w:val="5D3E6FA0"/>
     <w:multiLevelType w:val="multilevel"/>
     <w:tmpl w:val="1DD496E8"/>
@@ -12057,7 +12364,7 @@
       </w:pPr>
     </w:lvl>
   </w:abstractNum>
-  <w:abstractNum w:abstractNumId="21" w15:restartNumberingAfterBreak="0">
+  <w:abstractNum w:abstractNumId="22" w15:restartNumberingAfterBreak="0">
     <w:nsid w:val="5F935511"/>
     <w:multiLevelType w:val="multilevel"/>
     <w:tmpl w:val="44AE5600"/>
@@ -12170,7 +12477,7 @@
       </w:pPr>
     </w:lvl>
   </w:abstractNum>
-  <w:abstractNum w:abstractNumId="22" w15:restartNumberingAfterBreak="0">
+  <w:abstractNum w:abstractNumId="23" w15:restartNumberingAfterBreak="0">
     <w:nsid w:val="62330FFA"/>
     <w:multiLevelType w:val="multilevel"/>
     <w:tmpl w:val="1354050A"/>
@@ -12283,7 +12590,7 @@
       </w:pPr>
     </w:lvl>
   </w:abstractNum>
-  <w:abstractNum w:abstractNumId="23" w15:restartNumberingAfterBreak="0">
+  <w:abstractNum w:abstractNumId="24" w15:restartNumberingAfterBreak="0">
     <w:nsid w:val="653571BB"/>
     <w:multiLevelType w:val="multilevel"/>
     <w:tmpl w:val="E0F0DCF4"/>
@@ -12396,7 +12703,7 @@
       </w:pPr>
     </w:lvl>
   </w:abstractNum>
-  <w:abstractNum w:abstractNumId="24" w15:restartNumberingAfterBreak="0">
+  <w:abstractNum w:abstractNumId="25" w15:restartNumberingAfterBreak="0">
     <w:nsid w:val="69731E7F"/>
     <w:multiLevelType w:val="multilevel"/>
     <w:tmpl w:val="4FEA352E"/>
@@ -12545,7 +12852,7 @@
       </w:rPr>
     </w:lvl>
   </w:abstractNum>
-  <w:abstractNum w:abstractNumId="25" w15:restartNumberingAfterBreak="0">
+  <w:abstractNum w:abstractNumId="26" w15:restartNumberingAfterBreak="0">
     <w:nsid w:val="6DE2596E"/>
     <w:multiLevelType w:val="hybridMultilevel"/>
     <w:tmpl w:val="4C4C890E"/>
@@ -12634,7 +12941,7 @@
       </w:pPr>
     </w:lvl>
   </w:abstractNum>
-  <w:abstractNum w:abstractNumId="26" w15:restartNumberingAfterBreak="0">
+  <w:abstractNum w:abstractNumId="27" w15:restartNumberingAfterBreak="0">
     <w:nsid w:val="75520C24"/>
     <w:multiLevelType w:val="hybridMultilevel"/>
     <w:tmpl w:val="FCCE1BF6"/>
@@ -12723,7 +13030,7 @@
       </w:pPr>
     </w:lvl>
   </w:abstractNum>
-  <w:abstractNum w:abstractNumId="27" w15:restartNumberingAfterBreak="0">
+  <w:abstractNum w:abstractNumId="28" w15:restartNumberingAfterBreak="0">
     <w:nsid w:val="76FC0259"/>
     <w:multiLevelType w:val="multilevel"/>
     <w:tmpl w:val="79680AA4"/>
@@ -12836,7 +13143,7 @@
       </w:pPr>
     </w:lvl>
   </w:abstractNum>
-  <w:abstractNum w:abstractNumId="28" w15:restartNumberingAfterBreak="0">
+  <w:abstractNum w:abstractNumId="29" w15:restartNumberingAfterBreak="0">
     <w:nsid w:val="77A70C23"/>
     <w:multiLevelType w:val="multilevel"/>
     <w:tmpl w:val="8E221C46"/>
@@ -12956,19 +13263,19 @@
     <w:abstractNumId w:val="7"/>
   </w:num>
   <w:num w:numId="3" w16cid:durableId="1561554637">
-    <w:abstractNumId w:val="18"/>
+    <w:abstractNumId w:val="19"/>
   </w:num>
   <w:num w:numId="4" w16cid:durableId="1987002333">
-    <w:abstractNumId w:val="28"/>
+    <w:abstractNumId w:val="29"/>
   </w:num>
   <w:num w:numId="5" w16cid:durableId="1029794338">
     <w:abstractNumId w:val="13"/>
   </w:num>
   <w:num w:numId="6" w16cid:durableId="1650086756">
-    <w:abstractNumId w:val="20"/>
+    <w:abstractNumId w:val="21"/>
   </w:num>
   <w:num w:numId="7" w16cid:durableId="1476222975">
-    <w:abstractNumId w:val="27"/>
+    <w:abstractNumId w:val="28"/>
   </w:num>
   <w:num w:numId="8" w16cid:durableId="1533764241">
     <w:abstractNumId w:val="2"/>
@@ -12980,40 +13287,40 @@
     <w:abstractNumId w:val="3"/>
   </w:num>
   <w:num w:numId="11" w16cid:durableId="793057457">
-    <w:abstractNumId w:val="19"/>
+    <w:abstractNumId w:val="20"/>
   </w:num>
   <w:num w:numId="12" w16cid:durableId="2146773725">
-    <w:abstractNumId w:val="23"/>
+    <w:abstractNumId w:val="24"/>
   </w:num>
   <w:num w:numId="13" w16cid:durableId="1026561013">
     <w:abstractNumId w:val="9"/>
   </w:num>
   <w:num w:numId="14" w16cid:durableId="1192110950">
-    <w:abstractNumId w:val="21"/>
+    <w:abstractNumId w:val="22"/>
   </w:num>
   <w:num w:numId="15" w16cid:durableId="1262841238">
     <w:abstractNumId w:val="8"/>
   </w:num>
   <w:num w:numId="16" w16cid:durableId="155341019">
-    <w:abstractNumId w:val="16"/>
+    <w:abstractNumId w:val="17"/>
   </w:num>
   <w:num w:numId="17" w16cid:durableId="1040785662">
     <w:abstractNumId w:val="14"/>
   </w:num>
   <w:num w:numId="18" w16cid:durableId="1409767320">
-    <w:abstractNumId w:val="24"/>
+    <w:abstractNumId w:val="25"/>
   </w:num>
   <w:num w:numId="19" w16cid:durableId="2045591211">
     <w:abstractNumId w:val="10"/>
   </w:num>
   <w:num w:numId="20" w16cid:durableId="1764063768">
-    <w:abstractNumId w:val="22"/>
+    <w:abstractNumId w:val="23"/>
   </w:num>
   <w:num w:numId="21" w16cid:durableId="218832961">
     <w:abstractNumId w:val="12"/>
   </w:num>
   <w:num w:numId="22" w16cid:durableId="2045669289">
-    <w:abstractNumId w:val="26"/>
+    <w:abstractNumId w:val="27"/>
   </w:num>
   <w:num w:numId="23" w16cid:durableId="953443745">
     <w:abstractNumId w:val="6"/>
@@ -13025,16 +13332,19 @@
     <w:abstractNumId w:val="1"/>
   </w:num>
   <w:num w:numId="26" w16cid:durableId="1365129283">
-    <w:abstractNumId w:val="25"/>
+    <w:abstractNumId w:val="26"/>
   </w:num>
   <w:num w:numId="27" w16cid:durableId="1202403600">
     <w:abstractNumId w:val="11"/>
   </w:num>
   <w:num w:numId="28" w16cid:durableId="282420373">
-    <w:abstractNumId w:val="17"/>
+    <w:abstractNumId w:val="18"/>
   </w:num>
   <w:num w:numId="29" w16cid:durableId="101195959">
     <w:abstractNumId w:val="15"/>
+  </w:num>
+  <w:num w:numId="30" w16cid:durableId="395199757">
+    <w:abstractNumId w:val="16"/>
   </w:num>
 </w:numbering>
 </file>

</xml_diff>

<commit_message>
1. Added support for item 2.4 in medium checklist, for checking against a common_file_formats_list.
</commit_message>
<xml_diff>
--- a/res/template_new.docx
+++ b/res/template_new.docx
@@ -44,7 +44,6 @@
         </w:rPr>
         <w:t xml:space="preserve"> </w:t>
       </w:r>
-      <w:proofErr w:type="spellStart"/>
       <w:r>
         <w:t>project_info</w:t>
       </w:r>
@@ -57,7 +56,6 @@
       <w:r>
         <w:t>ticket_number</w:t>
       </w:r>
-      <w:proofErr w:type="spellEnd"/>
       <w:r>
         <w:rPr>
           <w:rFonts w:hint="eastAsia"/>
@@ -90,7 +88,6 @@
         </w:rPr>
         <w:t xml:space="preserve"> {{ </w:t>
       </w:r>
-      <w:proofErr w:type="spellStart"/>
       <w:r>
         <w:t>project_info</w:t>
       </w:r>
@@ -98,14 +95,7 @@
         <w:rPr>
           <w:rFonts w:hint="eastAsia"/>
         </w:rPr>
-        <w:t>.curator_name</w:t>
-      </w:r>
-      <w:proofErr w:type="spellEnd"/>
-      <w:r>
-        <w:rPr>
-          <w:rFonts w:hint="eastAsia"/>
-        </w:rPr>
-        <w:t xml:space="preserve"> }}</w:t>
+        <w:t>.curator_name }}</w:t>
       </w:r>
     </w:p>
     <w:p>
@@ -115,7 +105,6 @@
         </w:rPr>
         <w:t xml:space="preserve">Curator email: {{ </w:t>
       </w:r>
-      <w:proofErr w:type="spellStart"/>
       <w:r>
         <w:t>project_info</w:t>
       </w:r>
@@ -128,7 +117,6 @@
       <w:r>
         <w:t>curator_email</w:t>
       </w:r>
-      <w:proofErr w:type="spellEnd"/>
       <w:r>
         <w:rPr>
           <w:rFonts w:hint="eastAsia"/>
@@ -149,7 +137,6 @@
         </w:rPr>
         <w:t xml:space="preserve">{{ </w:t>
       </w:r>
-      <w:proofErr w:type="spellStart"/>
       <w:r>
         <w:rPr>
           <w:rFonts w:hint="eastAsia"/>
@@ -159,7 +146,6 @@
       <w:r>
         <w:t>DatasetTitle</w:t>
       </w:r>
-      <w:proofErr w:type="spellEnd"/>
       <w:r>
         <w:rPr>
           <w:rFonts w:hint="eastAsia"/>
@@ -207,7 +193,6 @@
         </w:rPr>
         <w:t xml:space="preserve"> </w:t>
       </w:r>
-      <w:proofErr w:type="spellStart"/>
       <w:r>
         <w:rPr>
           <w:rFonts w:hint="eastAsia"/>
@@ -217,7 +202,6 @@
       <w:r>
         <w:t>DatasetPersistentId</w:t>
       </w:r>
-      <w:proofErr w:type="spellEnd"/>
       <w:r>
         <w:rPr>
           <w:rFonts w:hint="eastAsia"/>
@@ -256,19 +240,11 @@
         <w:rPr>
           <w:rFonts w:hint="eastAsia"/>
         </w:rPr>
-        <w:t xml:space="preserve"> </w:t>
-      </w:r>
-      <w:proofErr w:type="spellStart"/>
-      <w:r>
-        <w:rPr>
-          <w:rFonts w:hint="eastAsia"/>
-        </w:rPr>
-        <w:t>dataset.</w:t>
+        <w:t xml:space="preserve"> dataset.</w:t>
       </w:r>
       <w:r>
         <w:t>DatasetURL</w:t>
       </w:r>
-      <w:proofErr w:type="spellEnd"/>
       <w:r>
         <w:rPr>
           <w:rFonts w:hint="eastAsia"/>
@@ -1060,25 +1036,7 @@
                 <w:bCs/>
                 <w:lang w:val="en-US"/>
               </w:rPr>
-              <w:t xml:space="preserve">Has the depositor (or their research group) previously created or submitted to a </w:t>
-            </w:r>
-            <w:proofErr w:type="spellStart"/>
-            <w:r>
-              <w:rPr>
-                <w:b/>
-                <w:bCs/>
-                <w:lang w:val="en-US"/>
-              </w:rPr>
-              <w:t>dataverse</w:t>
-            </w:r>
-            <w:proofErr w:type="spellEnd"/>
-            <w:r>
-              <w:rPr>
-                <w:b/>
-                <w:bCs/>
-                <w:lang w:val="en-US"/>
-              </w:rPr>
-              <w:t>?</w:t>
+              <w:t>Has the depositor (or their research group) previously created or submitted to a dataverse?</w:t>
             </w:r>
           </w:p>
         </w:tc>
@@ -1140,14 +1098,7 @@
               <w:rPr>
                 <w:lang w:val="en-US"/>
               </w:rPr>
-              <w:t xml:space="preserve">{% if </w:t>
-            </w:r>
-            <w:proofErr w:type="spellStart"/>
-            <w:r>
-              <w:rPr>
-                <w:lang w:val="en-US"/>
-              </w:rPr>
-              <w:t>template_dict.</w:t>
+              <w:t>{% if template_dict.</w:t>
             </w:r>
             <w:r>
               <w:rPr>
@@ -1160,353 +1111,246 @@
               <w:rPr>
                 <w:lang w:val="en-US"/>
               </w:rPr>
-              <w:t>.comments|length</w:t>
-            </w:r>
-            <w:proofErr w:type="spellEnd"/>
-            <w:r>
-              <w:rPr>
-                <w:lang w:val="en-US"/>
+              <w:t xml:space="preserve">.comments|length </w:t>
+            </w:r>
+            <w:r>
+              <w:rPr>
+                <w:rFonts w:hint="eastAsia"/>
+                <w:lang w:val="en-US"/>
+              </w:rPr>
+              <w:t>&gt;</w:t>
+            </w:r>
+            <w:r>
+              <w:rPr>
+                <w:lang w:val="en-US"/>
+              </w:rPr>
+              <w:t xml:space="preserve"> 0 %}X{% endif %}</w:t>
+            </w:r>
+          </w:p>
+          <w:p>
+            <w:pPr>
+              <w:rPr>
+                <w:lang w:val="en-US"/>
+              </w:rPr>
+            </w:pPr>
+          </w:p>
+        </w:tc>
+        <w:tc>
+          <w:tcPr>
+            <w:tcW w:w="0" w:type="auto"/>
+            <w:tcBorders>
+              <w:top w:val="single" w:sz="8" w:space="0" w:color="000000"/>
+              <w:left w:val="single" w:sz="8" w:space="0" w:color="000000"/>
+              <w:bottom w:val="single" w:sz="8" w:space="0" w:color="000000"/>
+              <w:right w:val="single" w:sz="8" w:space="0" w:color="000000"/>
+            </w:tcBorders>
+            <w:tcMar>
+              <w:top w:w="100" w:type="dxa"/>
+              <w:left w:w="100" w:type="dxa"/>
+              <w:bottom w:w="100" w:type="dxa"/>
+              <w:right w:w="100" w:type="dxa"/>
+            </w:tcMar>
+            <w:hideMark/>
+          </w:tcPr>
+          <w:p>
+            <w:pPr>
+              <w:rPr>
+                <w:lang w:val="en-US"/>
+              </w:rPr>
+            </w:pPr>
+            <w:r>
+              <w:rPr>
+                <w:lang w:val="en-US"/>
+              </w:rPr>
+              <w:t>{% if template_dict.</w:t>
+            </w:r>
+            <w:r>
+              <w:rPr>
+                <w:rFonts w:hint="eastAsia"/>
+                <w:lang w:val="en-US"/>
+              </w:rPr>
+              <w:t>dv_record</w:t>
+            </w:r>
+            <w:r>
+              <w:rPr>
+                <w:lang w:val="en-US"/>
+              </w:rPr>
+              <w:t xml:space="preserve">.comments|length </w:t>
+            </w:r>
+            <w:r>
+              <w:rPr>
+                <w:rFonts w:hint="eastAsia"/>
+                <w:lang w:val="en-US"/>
+              </w:rPr>
+              <w:t>==</w:t>
+            </w:r>
+            <w:r>
+              <w:rPr>
+                <w:lang w:val="en-US"/>
+              </w:rPr>
+              <w:t xml:space="preserve"> 0 %}X{% endif %}</w:t>
+            </w:r>
+          </w:p>
+          <w:p>
+            <w:pPr>
+              <w:rPr>
+                <w:lang w:val="en-US"/>
+              </w:rPr>
+            </w:pPr>
+          </w:p>
+        </w:tc>
+        <w:tc>
+          <w:tcPr>
+            <w:tcW w:w="0" w:type="auto"/>
+            <w:tcBorders>
+              <w:top w:val="single" w:sz="8" w:space="0" w:color="000000"/>
+              <w:left w:val="single" w:sz="8" w:space="0" w:color="000000"/>
+              <w:bottom w:val="single" w:sz="8" w:space="0" w:color="000000"/>
+              <w:right w:val="single" w:sz="8" w:space="0" w:color="000000"/>
+            </w:tcBorders>
+            <w:tcMar>
+              <w:top w:w="100" w:type="dxa"/>
+              <w:left w:w="100" w:type="dxa"/>
+              <w:bottom w:w="100" w:type="dxa"/>
+              <w:right w:w="100" w:type="dxa"/>
+            </w:tcMar>
+            <w:hideMark/>
+          </w:tcPr>
+          <w:p>
+            <w:pPr>
+              <w:rPr>
+                <w:lang w:val="en-US"/>
+              </w:rPr>
+            </w:pPr>
+          </w:p>
+        </w:tc>
+        <w:tc>
+          <w:tcPr>
+            <w:tcW w:w="0" w:type="auto"/>
+            <w:tcBorders>
+              <w:top w:val="single" w:sz="8" w:space="0" w:color="000000"/>
+              <w:left w:val="single" w:sz="8" w:space="0" w:color="000000"/>
+              <w:bottom w:val="single" w:sz="8" w:space="0" w:color="000000"/>
+              <w:right w:val="single" w:sz="8" w:space="0" w:color="000000"/>
+            </w:tcBorders>
+            <w:tcMar>
+              <w:top w:w="100" w:type="dxa"/>
+              <w:left w:w="100" w:type="dxa"/>
+              <w:bottom w:w="100" w:type="dxa"/>
+              <w:right w:w="100" w:type="dxa"/>
+            </w:tcMar>
+            <w:hideMark/>
+          </w:tcPr>
+          <w:p>
+            <w:pPr>
+              <w:rPr>
+                <w:lang w:val="en-US"/>
+              </w:rPr>
+            </w:pPr>
+          </w:p>
+        </w:tc>
+        <w:tc>
+          <w:tcPr>
+            <w:tcW w:w="0" w:type="auto"/>
+            <w:tcBorders>
+              <w:top w:val="single" w:sz="8" w:space="0" w:color="000000"/>
+              <w:left w:val="single" w:sz="8" w:space="0" w:color="000000"/>
+              <w:bottom w:val="single" w:sz="8" w:space="0" w:color="000000"/>
+              <w:right w:val="single" w:sz="8" w:space="0" w:color="000000"/>
+            </w:tcBorders>
+            <w:tcMar>
+              <w:top w:w="100" w:type="dxa"/>
+              <w:left w:w="100" w:type="dxa"/>
+              <w:bottom w:w="100" w:type="dxa"/>
+              <w:right w:w="100" w:type="dxa"/>
+            </w:tcMar>
+            <w:hideMark/>
+          </w:tcPr>
+          <w:p>
+            <w:pPr>
+              <w:rPr>
+                <w:lang w:val="en-US"/>
+              </w:rPr>
+            </w:pPr>
+          </w:p>
+        </w:tc>
+        <w:tc>
+          <w:tcPr>
+            <w:tcW w:w="0" w:type="auto"/>
+            <w:tcBorders>
+              <w:top w:val="single" w:sz="8" w:space="0" w:color="000000"/>
+              <w:left w:val="single" w:sz="8" w:space="0" w:color="000000"/>
+              <w:bottom w:val="single" w:sz="8" w:space="0" w:color="000000"/>
+              <w:right w:val="single" w:sz="8" w:space="0" w:color="000000"/>
+            </w:tcBorders>
+            <w:tcMar>
+              <w:top w:w="100" w:type="dxa"/>
+              <w:left w:w="100" w:type="dxa"/>
+              <w:bottom w:w="100" w:type="dxa"/>
+              <w:right w:w="100" w:type="dxa"/>
+            </w:tcMar>
+            <w:hideMark/>
+          </w:tcPr>
+          <w:p>
+            <w:pPr>
+              <w:rPr>
+                <w:lang w:val="en-US"/>
+              </w:rPr>
+            </w:pPr>
+            <w:r>
+              <w:rPr>
+                <w:lang w:val="en-US"/>
+              </w:rPr>
+              <w:t>If relevant, list previously created dataverse:</w:t>
+            </w:r>
+            <w:r>
+              <w:rPr>
+                <w:lang w:val="en-US"/>
+              </w:rPr>
+              <w:br/>
+            </w:r>
+            <w:r>
+              <w:t xml:space="preserve">{% for item in template_dict.dv_record.comments %} </w:t>
+            </w:r>
+          </w:p>
+          <w:p>
+            <w:r>
+              <w:t>{% for author, dataverses in item.items() %} {{ author }}</w:t>
+            </w:r>
+            <w:r>
+              <w:rPr>
+                <w:rFonts w:hint="eastAsia"/>
+              </w:rPr>
+              <w:t>:</w:t>
+            </w:r>
+          </w:p>
+          <w:p>
+            <w:r>
+              <w:t xml:space="preserve">{% for dataverse in dataverses %} </w:t>
+            </w:r>
+            <w:r>
+              <w:t>{{ loop.index }}.</w:t>
+            </w:r>
+            <w:r>
+              <w:rPr>
+                <w:rFonts w:hint="eastAsia"/>
               </w:rPr>
               <w:t xml:space="preserve"> </w:t>
             </w:r>
             <w:r>
-              <w:rPr>
-                <w:rFonts w:hint="eastAsia"/>
-                <w:lang w:val="en-US"/>
-              </w:rPr>
-              <w:t>&gt;</w:t>
-            </w:r>
-            <w:r>
-              <w:rPr>
-                <w:lang w:val="en-US"/>
-              </w:rPr>
-              <w:t xml:space="preserve"> 0 %}X{% endif %}</w:t>
-            </w:r>
-          </w:p>
-          <w:p>
-            <w:pPr>
-              <w:rPr>
-                <w:lang w:val="en-US"/>
-              </w:rPr>
-            </w:pPr>
-          </w:p>
-        </w:tc>
-        <w:tc>
-          <w:tcPr>
-            <w:tcW w:w="0" w:type="auto"/>
-            <w:tcBorders>
-              <w:top w:val="single" w:sz="8" w:space="0" w:color="000000"/>
-              <w:left w:val="single" w:sz="8" w:space="0" w:color="000000"/>
-              <w:bottom w:val="single" w:sz="8" w:space="0" w:color="000000"/>
-              <w:right w:val="single" w:sz="8" w:space="0" w:color="000000"/>
-            </w:tcBorders>
-            <w:tcMar>
-              <w:top w:w="100" w:type="dxa"/>
-              <w:left w:w="100" w:type="dxa"/>
-              <w:bottom w:w="100" w:type="dxa"/>
-              <w:right w:w="100" w:type="dxa"/>
-            </w:tcMar>
-            <w:hideMark/>
-          </w:tcPr>
-          <w:p>
-            <w:pPr>
-              <w:rPr>
-                <w:lang w:val="en-US"/>
-              </w:rPr>
-            </w:pPr>
-            <w:r>
-              <w:rPr>
-                <w:lang w:val="en-US"/>
-              </w:rPr>
-              <w:t xml:space="preserve">{% if </w:t>
-            </w:r>
-            <w:proofErr w:type="spellStart"/>
-            <w:r>
-              <w:rPr>
-                <w:lang w:val="en-US"/>
-              </w:rPr>
-              <w:t>template_dict.</w:t>
-            </w:r>
-            <w:r>
-              <w:rPr>
-                <w:rFonts w:hint="eastAsia"/>
-                <w:lang w:val="en-US"/>
-              </w:rPr>
-              <w:t>dv_record</w:t>
-            </w:r>
-            <w:r>
-              <w:rPr>
-                <w:lang w:val="en-US"/>
-              </w:rPr>
-              <w:t>.comments|length</w:t>
-            </w:r>
-            <w:proofErr w:type="spellEnd"/>
-            <w:r>
-              <w:rPr>
-                <w:lang w:val="en-US"/>
-              </w:rPr>
-              <w:t xml:space="preserve"> </w:t>
-            </w:r>
-            <w:r>
-              <w:rPr>
-                <w:rFonts w:hint="eastAsia"/>
-                <w:lang w:val="en-US"/>
-              </w:rPr>
-              <w:t>==</w:t>
-            </w:r>
-            <w:r>
-              <w:rPr>
-                <w:lang w:val="en-US"/>
-              </w:rPr>
-              <w:t xml:space="preserve"> 0 %}X{% endif %}</w:t>
-            </w:r>
-          </w:p>
-          <w:p>
-            <w:pPr>
-              <w:rPr>
-                <w:lang w:val="en-US"/>
-              </w:rPr>
-            </w:pPr>
-          </w:p>
-        </w:tc>
-        <w:tc>
-          <w:tcPr>
-            <w:tcW w:w="0" w:type="auto"/>
-            <w:tcBorders>
-              <w:top w:val="single" w:sz="8" w:space="0" w:color="000000"/>
-              <w:left w:val="single" w:sz="8" w:space="0" w:color="000000"/>
-              <w:bottom w:val="single" w:sz="8" w:space="0" w:color="000000"/>
-              <w:right w:val="single" w:sz="8" w:space="0" w:color="000000"/>
-            </w:tcBorders>
-            <w:tcMar>
-              <w:top w:w="100" w:type="dxa"/>
-              <w:left w:w="100" w:type="dxa"/>
-              <w:bottom w:w="100" w:type="dxa"/>
-              <w:right w:w="100" w:type="dxa"/>
-            </w:tcMar>
-            <w:hideMark/>
-          </w:tcPr>
-          <w:p>
-            <w:pPr>
-              <w:rPr>
-                <w:lang w:val="en-US"/>
-              </w:rPr>
-            </w:pPr>
-          </w:p>
-        </w:tc>
-        <w:tc>
-          <w:tcPr>
-            <w:tcW w:w="0" w:type="auto"/>
-            <w:tcBorders>
-              <w:top w:val="single" w:sz="8" w:space="0" w:color="000000"/>
-              <w:left w:val="single" w:sz="8" w:space="0" w:color="000000"/>
-              <w:bottom w:val="single" w:sz="8" w:space="0" w:color="000000"/>
-              <w:right w:val="single" w:sz="8" w:space="0" w:color="000000"/>
-            </w:tcBorders>
-            <w:tcMar>
-              <w:top w:w="100" w:type="dxa"/>
-              <w:left w:w="100" w:type="dxa"/>
-              <w:bottom w:w="100" w:type="dxa"/>
-              <w:right w:w="100" w:type="dxa"/>
-            </w:tcMar>
-            <w:hideMark/>
-          </w:tcPr>
-          <w:p>
-            <w:pPr>
-              <w:rPr>
-                <w:lang w:val="en-US"/>
-              </w:rPr>
-            </w:pPr>
-          </w:p>
-        </w:tc>
-        <w:tc>
-          <w:tcPr>
-            <w:tcW w:w="0" w:type="auto"/>
-            <w:tcBorders>
-              <w:top w:val="single" w:sz="8" w:space="0" w:color="000000"/>
-              <w:left w:val="single" w:sz="8" w:space="0" w:color="000000"/>
-              <w:bottom w:val="single" w:sz="8" w:space="0" w:color="000000"/>
-              <w:right w:val="single" w:sz="8" w:space="0" w:color="000000"/>
-            </w:tcBorders>
-            <w:tcMar>
-              <w:top w:w="100" w:type="dxa"/>
-              <w:left w:w="100" w:type="dxa"/>
-              <w:bottom w:w="100" w:type="dxa"/>
-              <w:right w:w="100" w:type="dxa"/>
-            </w:tcMar>
-            <w:hideMark/>
-          </w:tcPr>
-          <w:p>
-            <w:pPr>
-              <w:rPr>
-                <w:lang w:val="en-US"/>
-              </w:rPr>
-            </w:pPr>
-          </w:p>
-        </w:tc>
-        <w:tc>
-          <w:tcPr>
-            <w:tcW w:w="0" w:type="auto"/>
-            <w:tcBorders>
-              <w:top w:val="single" w:sz="8" w:space="0" w:color="000000"/>
-              <w:left w:val="single" w:sz="8" w:space="0" w:color="000000"/>
-              <w:bottom w:val="single" w:sz="8" w:space="0" w:color="000000"/>
-              <w:right w:val="single" w:sz="8" w:space="0" w:color="000000"/>
-            </w:tcBorders>
-            <w:tcMar>
-              <w:top w:w="100" w:type="dxa"/>
-              <w:left w:w="100" w:type="dxa"/>
-              <w:bottom w:w="100" w:type="dxa"/>
-              <w:right w:w="100" w:type="dxa"/>
-            </w:tcMar>
-            <w:hideMark/>
-          </w:tcPr>
-          <w:p>
-            <w:pPr>
-              <w:rPr>
-                <w:lang w:val="en-US"/>
-              </w:rPr>
-            </w:pPr>
-            <w:r>
-              <w:rPr>
-                <w:lang w:val="en-US"/>
-              </w:rPr>
-              <w:t xml:space="preserve">If relevant, list previously created </w:t>
-            </w:r>
-            <w:proofErr w:type="spellStart"/>
-            <w:r>
-              <w:rPr>
-                <w:lang w:val="en-US"/>
-              </w:rPr>
-              <w:t>dataverse</w:t>
-            </w:r>
-            <w:proofErr w:type="spellEnd"/>
-            <w:r>
-              <w:rPr>
-                <w:lang w:val="en-US"/>
-              </w:rPr>
-              <w:t>:</w:t>
-            </w:r>
-            <w:r>
-              <w:rPr>
-                <w:lang w:val="en-US"/>
-              </w:rPr>
+              <w:t>{{ dataverse }}</w:t>
+            </w:r>
+            <w:r>
               <w:br/>
             </w:r>
             <w:r>
-              <w:t xml:space="preserve">{% for item in </w:t>
-            </w:r>
-            <w:proofErr w:type="spellStart"/>
-            <w:r>
-              <w:t>template_dict.dv_record.comments</w:t>
-            </w:r>
-            <w:proofErr w:type="spellEnd"/>
-            <w:r>
-              <w:t xml:space="preserve"> %} </w:t>
-            </w:r>
-          </w:p>
-          <w:p>
-            <w:r>
-              <w:t xml:space="preserve">{% for author, </w:t>
-            </w:r>
-            <w:proofErr w:type="spellStart"/>
-            <w:r>
-              <w:t>dataverses</w:t>
-            </w:r>
-            <w:proofErr w:type="spellEnd"/>
-            <w:r>
-              <w:t xml:space="preserve"> in </w:t>
-            </w:r>
-            <w:proofErr w:type="spellStart"/>
-            <w:r>
-              <w:t>item.items</w:t>
-            </w:r>
-            <w:proofErr w:type="spellEnd"/>
-            <w:r>
-              <w:t>() %} {{ author }}</w:t>
-            </w:r>
-            <w:r>
-              <w:rPr>
-                <w:rFonts w:hint="eastAsia"/>
-              </w:rPr>
-              <w:t>:</w:t>
-            </w:r>
-          </w:p>
-          <w:p>
-            <w:r>
-              <w:t xml:space="preserve">{% for </w:t>
-            </w:r>
-            <w:proofErr w:type="spellStart"/>
-            <w:r>
-              <w:t>dataverse</w:t>
-            </w:r>
-            <w:proofErr w:type="spellEnd"/>
-            <w:r>
-              <w:t xml:space="preserve"> in </w:t>
-            </w:r>
-            <w:proofErr w:type="spellStart"/>
-            <w:r>
-              <w:t>dataverses</w:t>
-            </w:r>
-            <w:proofErr w:type="spellEnd"/>
-            <w:r>
-              <w:t xml:space="preserve"> %} </w:t>
-            </w:r>
-            <w:r>
-              <w:t xml:space="preserve">{{ </w:t>
-            </w:r>
-            <w:proofErr w:type="spellStart"/>
-            <w:r>
-              <w:t>loop.index</w:t>
-            </w:r>
-            <w:proofErr w:type="spellEnd"/>
-            <w:r>
-              <w:t xml:space="preserve"> }}.</w:t>
-            </w:r>
-            <w:r>
-              <w:rPr>
-                <w:rFonts w:hint="eastAsia"/>
-              </w:rPr>
-              <w:t xml:space="preserve"> </w:t>
-            </w:r>
-            <w:r>
-              <w:t>{{ dataverse }}</w:t>
+              <w:t xml:space="preserve">{% endfor %} </w:t>
             </w:r>
             <w:r>
               <w:br/>
             </w:r>
             <w:r>
-              <w:t xml:space="preserve">{% </w:t>
-            </w:r>
-            <w:proofErr w:type="spellStart"/>
-            <w:r>
-              <w:t>endfor</w:t>
-            </w:r>
-            <w:proofErr w:type="spellEnd"/>
-            <w:r>
-              <w:t xml:space="preserve"> %} </w:t>
-            </w:r>
-            <w:r>
-              <w:br/>
-            </w:r>
-            <w:r>
-              <w:t xml:space="preserve">{% </w:t>
-            </w:r>
-            <w:proofErr w:type="spellStart"/>
-            <w:r>
-              <w:t>endfor</w:t>
-            </w:r>
-            <w:proofErr w:type="spellEnd"/>
-            <w:r>
-              <w:t xml:space="preserve"> %} {% </w:t>
-            </w:r>
-            <w:proofErr w:type="spellStart"/>
-            <w:r>
-              <w:t>endfor</w:t>
-            </w:r>
-            <w:proofErr w:type="spellEnd"/>
-            <w:r>
-              <w:t xml:space="preserve"> %}</w:t>
+              <w:t>{% endfor %} {% endfor %}</w:t>
             </w:r>
           </w:p>
         </w:tc>
@@ -1684,21 +1528,7 @@
               <w:rPr>
                 <w:lang w:val="en-US"/>
               </w:rPr>
-              <w:t>If the dataset is deposited in a sub-</w:t>
-            </w:r>
-            <w:proofErr w:type="spellStart"/>
-            <w:r>
-              <w:rPr>
-                <w:lang w:val="en-US"/>
-              </w:rPr>
-              <w:t>dataverse</w:t>
-            </w:r>
-            <w:proofErr w:type="spellEnd"/>
-            <w:r>
-              <w:rPr>
-                <w:lang w:val="en-US"/>
-              </w:rPr>
-              <w:t xml:space="preserve"> collection, include </w:t>
+              <w:t xml:space="preserve">If the dataset is deposited in a sub-dataverse collection, include </w:t>
             </w:r>
             <w:r>
               <w:rPr>
@@ -1739,21 +1569,7 @@
                 <w:lang w:val="en-US"/>
               </w:rPr>
               <w:lastRenderedPageBreak/>
-              <w:t xml:space="preserve">{% if </w:t>
-            </w:r>
-            <w:proofErr w:type="spellStart"/>
-            <w:r>
-              <w:rPr>
-                <w:lang w:val="en-US"/>
-              </w:rPr>
-              <w:t>template_dict</w:t>
-            </w:r>
-            <w:proofErr w:type="spellEnd"/>
-            <w:r>
-              <w:rPr>
-                <w:lang w:val="en-US"/>
-              </w:rPr>
-              <w:t>.</w:t>
+              <w:t>{% if template_dict.</w:t>
             </w:r>
             <w:r>
               <w:rPr>
@@ -1766,11 +1582,9 @@
               </w:rPr>
               <w:t xml:space="preserve"> </w:t>
             </w:r>
-            <w:proofErr w:type="spellStart"/>
             <w:r>
               <w:t>name_name_of_dataverse</w:t>
             </w:r>
-            <w:proofErr w:type="spellEnd"/>
             <w:r>
               <w:rPr>
                 <w:lang w:val="en-US"/>
@@ -1830,21 +1644,7 @@
               <w:rPr>
                 <w:lang w:val="en-US"/>
               </w:rPr>
-              <w:t xml:space="preserve">{% if </w:t>
-            </w:r>
-            <w:proofErr w:type="spellStart"/>
-            <w:r>
-              <w:rPr>
-                <w:lang w:val="en-US"/>
-              </w:rPr>
-              <w:t>template_dict</w:t>
-            </w:r>
-            <w:proofErr w:type="spellEnd"/>
-            <w:r>
-              <w:rPr>
-                <w:lang w:val="en-US"/>
-              </w:rPr>
-              <w:t>.</w:t>
+              <w:t>{% if template_dict.</w:t>
             </w:r>
             <w:r>
               <w:rPr>
@@ -1857,11 +1657,9 @@
               </w:rPr>
               <w:t xml:space="preserve"> </w:t>
             </w:r>
-            <w:proofErr w:type="spellStart"/>
             <w:r>
               <w:t>name_name_of_dataverse</w:t>
             </w:r>
-            <w:proofErr w:type="spellEnd"/>
             <w:r>
               <w:rPr>
                 <w:lang w:val="en-US"/>
@@ -2016,69 +1814,46 @@
                 <w:rFonts w:hint="eastAsia"/>
                 <w:lang w:val="en-US"/>
               </w:rPr>
-              <w:t xml:space="preserve">List the </w:t>
-            </w:r>
-            <w:proofErr w:type="spellStart"/>
+              <w:t xml:space="preserve">List the dataverse </w:t>
+            </w:r>
+            <w:r>
+              <w:rPr>
+                <w:lang w:val="en-US"/>
+              </w:rPr>
+              <w:t>collection</w:t>
+            </w:r>
             <w:r>
               <w:rPr>
                 <w:rFonts w:hint="eastAsia"/>
                 <w:lang w:val="en-US"/>
               </w:rPr>
-              <w:t>dataverse</w:t>
-            </w:r>
-            <w:proofErr w:type="spellEnd"/>
+              <w:t xml:space="preserve"> name:</w:t>
+            </w:r>
+            <w:r>
+              <w:rPr>
+                <w:lang w:val="en-US"/>
+              </w:rPr>
+              <w:br/>
+            </w:r>
             <w:r>
               <w:rPr>
                 <w:rFonts w:hint="eastAsia"/>
                 <w:lang w:val="en-US"/>
               </w:rPr>
-              <w:t xml:space="preserve"> </w:t>
-            </w:r>
-            <w:r>
-              <w:rPr>
-                <w:lang w:val="en-US"/>
-              </w:rPr>
-              <w:t>collection</w:t>
+              <w:t xml:space="preserve">{{ </w:t>
+            </w:r>
+            <w:r>
+              <w:t>template_dict</w:t>
             </w:r>
             <w:r>
               <w:rPr>
                 <w:rFonts w:hint="eastAsia"/>
-                <w:lang w:val="en-US"/>
-              </w:rPr>
-              <w:t xml:space="preserve"> name:</w:t>
-            </w:r>
-            <w:r>
-              <w:rPr>
-                <w:lang w:val="en-US"/>
-              </w:rPr>
-              <w:br/>
-            </w:r>
-            <w:r>
-              <w:rPr>
-                <w:rFonts w:hint="eastAsia"/>
-                <w:lang w:val="en-US"/>
-              </w:rPr>
-              <w:t xml:space="preserve">{{ </w:t>
-            </w:r>
-            <w:proofErr w:type="spellStart"/>
-            <w:r>
-              <w:t>template_dict</w:t>
-            </w:r>
-            <w:proofErr w:type="spellEnd"/>
-            <w:r>
-              <w:rPr>
-                <w:rFonts w:hint="eastAsia"/>
               </w:rPr>
               <w:t>.</w:t>
             </w:r>
             <w:r>
-              <w:t xml:space="preserve"> </w:t>
-            </w:r>
-            <w:proofErr w:type="spellStart"/>
-            <w:r>
-              <w:t>name_name_of_dataverse</w:t>
-            </w:r>
-            <w:proofErr w:type="spellEnd"/>
+              <w:t xml:space="preserve"> name_name_of_dataverse</w:t>
+            </w:r>
             <w:r>
               <w:rPr>
                 <w:rFonts w:hint="eastAsia"/>
@@ -2213,88 +1988,38 @@
                 <w:bCs/>
                 <w:lang w:val="en-US"/>
               </w:rPr>
-              <w:t>*If the dataset was deposited in a sub-</w:t>
-            </w:r>
-            <w:proofErr w:type="spellStart"/>
-            <w:r>
-              <w:rPr>
-                <w:b/>
-                <w:bCs/>
-                <w:lang w:val="en-US"/>
-              </w:rPr>
-              <w:t>dataverse</w:t>
-            </w:r>
-            <w:proofErr w:type="spellEnd"/>
-            <w:r>
-              <w:rPr>
-                <w:b/>
-                <w:bCs/>
-                <w:lang w:val="en-US"/>
-              </w:rPr>
-              <w:t xml:space="preserve"> collection, does it require its own </w:t>
-            </w:r>
-            <w:proofErr w:type="spellStart"/>
-            <w:r>
-              <w:rPr>
-                <w:b/>
-                <w:bCs/>
-                <w:lang w:val="en-US"/>
-              </w:rPr>
-              <w:t>dataverse</w:t>
-            </w:r>
-            <w:proofErr w:type="spellEnd"/>
-            <w:r>
-              <w:rPr>
-                <w:b/>
-                <w:bCs/>
-                <w:lang w:val="en-US"/>
-              </w:rPr>
-              <w:t>?</w:t>
-            </w:r>
-          </w:p>
-        </w:tc>
-        <w:tc>
-          <w:tcPr>
-            <w:tcW w:w="0" w:type="auto"/>
-            <w:tcBorders>
-              <w:top w:val="single" w:sz="8" w:space="0" w:color="000000"/>
-              <w:left w:val="single" w:sz="8" w:space="0" w:color="000000"/>
-              <w:bottom w:val="single" w:sz="8" w:space="0" w:color="000000"/>
-              <w:right w:val="single" w:sz="8" w:space="0" w:color="000000"/>
-            </w:tcBorders>
-            <w:tcMar>
-              <w:top w:w="100" w:type="dxa"/>
-              <w:left w:w="100" w:type="dxa"/>
-              <w:bottom w:w="100" w:type="dxa"/>
-              <w:right w:w="100" w:type="dxa"/>
-            </w:tcMar>
-            <w:hideMark/>
-          </w:tcPr>
-          <w:p>
-            <w:pPr>
-              <w:rPr>
-                <w:lang w:val="en-US"/>
-              </w:rPr>
-            </w:pPr>
-            <w:r>
-              <w:rPr>
-                <w:lang w:val="en-US"/>
-              </w:rPr>
-              <w:t xml:space="preserve">If the depositor created a </w:t>
-            </w:r>
-            <w:proofErr w:type="spellStart"/>
-            <w:r>
-              <w:rPr>
-                <w:lang w:val="en-US"/>
-              </w:rPr>
-              <w:t>dataverse</w:t>
-            </w:r>
-            <w:proofErr w:type="spellEnd"/>
-            <w:r>
-              <w:rPr>
-                <w:lang w:val="en-US"/>
-              </w:rPr>
-              <w:t xml:space="preserve"> with one dataset:</w:t>
+              <w:t>*If the dataset was deposited in a sub-dataverse collection, does it require its own dataverse?</w:t>
+            </w:r>
+          </w:p>
+        </w:tc>
+        <w:tc>
+          <w:tcPr>
+            <w:tcW w:w="0" w:type="auto"/>
+            <w:tcBorders>
+              <w:top w:val="single" w:sz="8" w:space="0" w:color="000000"/>
+              <w:left w:val="single" w:sz="8" w:space="0" w:color="000000"/>
+              <w:bottom w:val="single" w:sz="8" w:space="0" w:color="000000"/>
+              <w:right w:val="single" w:sz="8" w:space="0" w:color="000000"/>
+            </w:tcBorders>
+            <w:tcMar>
+              <w:top w:w="100" w:type="dxa"/>
+              <w:left w:w="100" w:type="dxa"/>
+              <w:bottom w:w="100" w:type="dxa"/>
+              <w:right w:w="100" w:type="dxa"/>
+            </w:tcMar>
+            <w:hideMark/>
+          </w:tcPr>
+          <w:p>
+            <w:pPr>
+              <w:rPr>
+                <w:lang w:val="en-US"/>
+              </w:rPr>
+            </w:pPr>
+            <w:r>
+              <w:rPr>
+                <w:lang w:val="en-US"/>
+              </w:rPr>
+              <w:t>If the depositor created a dataverse with one dataset:</w:t>
             </w:r>
           </w:p>
           <w:p>
@@ -2311,21 +2036,7 @@
               <w:rPr>
                 <w:lang w:val="en-US"/>
               </w:rPr>
-              <w:t>Is it the only dataset in the sub-</w:t>
-            </w:r>
-            <w:proofErr w:type="spellStart"/>
-            <w:r>
-              <w:rPr>
-                <w:lang w:val="en-US"/>
-              </w:rPr>
-              <w:t>dataverse</w:t>
-            </w:r>
-            <w:proofErr w:type="spellEnd"/>
-            <w:r>
-              <w:rPr>
-                <w:lang w:val="en-US"/>
-              </w:rPr>
-              <w:t xml:space="preserve"> collection?</w:t>
+              <w:t>Is it the only dataset in the sub-dataverse collection?</w:t>
             </w:r>
           </w:p>
           <w:p>
@@ -2342,21 +2053,7 @@
               <w:rPr>
                 <w:lang w:val="en-US"/>
               </w:rPr>
-              <w:t>Is there another sub-</w:t>
-            </w:r>
-            <w:proofErr w:type="spellStart"/>
-            <w:r>
-              <w:rPr>
-                <w:lang w:val="en-US"/>
-              </w:rPr>
-              <w:t>dataverse</w:t>
-            </w:r>
-            <w:proofErr w:type="spellEnd"/>
-            <w:r>
-              <w:rPr>
-                <w:lang w:val="en-US"/>
-              </w:rPr>
-              <w:t xml:space="preserve"> collection it should be in?</w:t>
+              <w:t>Is there another sub-dataverse collection it should be in?</w:t>
             </w:r>
           </w:p>
           <w:p>
@@ -2397,21 +2094,7 @@
                 <w:lang w:val="en-US"/>
               </w:rPr>
               <w:lastRenderedPageBreak/>
-              <w:t xml:space="preserve">or that they actually require a </w:t>
-            </w:r>
-            <w:proofErr w:type="spellStart"/>
-            <w:r>
-              <w:rPr>
-                <w:lang w:val="en-US"/>
-              </w:rPr>
-              <w:t>dataverse</w:t>
-            </w:r>
-            <w:proofErr w:type="spellEnd"/>
-            <w:r>
-              <w:rPr>
-                <w:lang w:val="en-US"/>
-              </w:rPr>
-              <w:t xml:space="preserve"> (e.g., will there be future deposits?)</w:t>
+              <w:t>or that they actually require a dataverse (e.g., will there be future deposits?)</w:t>
             </w:r>
           </w:p>
         </w:tc>
@@ -3097,91 +2780,63 @@
               <w:rPr>
                 <w:lang w:val="en-US"/>
               </w:rPr>
-              <w:t xml:space="preserve">{% if </w:t>
-            </w:r>
-            <w:proofErr w:type="spellStart"/>
-            <w:r>
-              <w:rPr>
-                <w:lang w:val="en-US"/>
-              </w:rPr>
-              <w:t>template_dict.file_ext.comments|length</w:t>
-            </w:r>
-            <w:proofErr w:type="spellEnd"/>
-            <w:r>
-              <w:rPr>
-                <w:lang w:val="en-US"/>
-              </w:rPr>
-              <w:t xml:space="preserve"> == 0 %}X{% endif %}</w:t>
-            </w:r>
-          </w:p>
-        </w:tc>
-        <w:tc>
-          <w:tcPr>
-            <w:tcW w:w="0" w:type="auto"/>
-            <w:tcBorders>
-              <w:top w:val="single" w:sz="8" w:space="0" w:color="000000"/>
-              <w:left w:val="single" w:sz="8" w:space="0" w:color="000000"/>
-              <w:bottom w:val="single" w:sz="8" w:space="0" w:color="000000"/>
-              <w:right w:val="single" w:sz="8" w:space="0" w:color="000000"/>
-            </w:tcBorders>
-            <w:tcMar>
-              <w:top w:w="100" w:type="dxa"/>
-              <w:left w:w="100" w:type="dxa"/>
-              <w:bottom w:w="100" w:type="dxa"/>
-              <w:right w:w="100" w:type="dxa"/>
-            </w:tcMar>
-            <w:hideMark/>
-          </w:tcPr>
-          <w:p>
-            <w:pPr>
-              <w:rPr>
-                <w:lang w:val="en-US"/>
-              </w:rPr>
-            </w:pPr>
-          </w:p>
-        </w:tc>
-        <w:tc>
-          <w:tcPr>
-            <w:tcW w:w="0" w:type="auto"/>
-            <w:tcBorders>
-              <w:top w:val="single" w:sz="8" w:space="0" w:color="000000"/>
-              <w:left w:val="single" w:sz="8" w:space="0" w:color="000000"/>
-              <w:bottom w:val="single" w:sz="8" w:space="0" w:color="000000"/>
-              <w:right w:val="single" w:sz="8" w:space="0" w:color="000000"/>
-            </w:tcBorders>
-            <w:tcMar>
-              <w:top w:w="100" w:type="dxa"/>
-              <w:left w:w="100" w:type="dxa"/>
-              <w:bottom w:w="100" w:type="dxa"/>
-              <w:right w:w="100" w:type="dxa"/>
-            </w:tcMar>
-            <w:hideMark/>
-          </w:tcPr>
-          <w:p>
-            <w:pPr>
-              <w:rPr>
-                <w:lang w:val="en-US"/>
-              </w:rPr>
-            </w:pPr>
-            <w:r>
-              <w:rPr>
-                <w:lang w:val="en-US"/>
-              </w:rPr>
-              <w:t xml:space="preserve">{% if </w:t>
-            </w:r>
-            <w:proofErr w:type="spellStart"/>
-            <w:r>
-              <w:rPr>
-                <w:lang w:val="en-US"/>
-              </w:rPr>
-              <w:t>template_dict.file_ext.comments|length</w:t>
-            </w:r>
-            <w:proofErr w:type="spellEnd"/>
-            <w:r>
-              <w:rPr>
-                <w:lang w:val="en-US"/>
-              </w:rPr>
-              <w:t xml:space="preserve"> &gt; 0 %}X{% endif %}</w:t>
+              <w:t>{% if template_dict.file_ext.comments|length == 0 %}X{% endif %}</w:t>
+            </w:r>
+          </w:p>
+        </w:tc>
+        <w:tc>
+          <w:tcPr>
+            <w:tcW w:w="0" w:type="auto"/>
+            <w:tcBorders>
+              <w:top w:val="single" w:sz="8" w:space="0" w:color="000000"/>
+              <w:left w:val="single" w:sz="8" w:space="0" w:color="000000"/>
+              <w:bottom w:val="single" w:sz="8" w:space="0" w:color="000000"/>
+              <w:right w:val="single" w:sz="8" w:space="0" w:color="000000"/>
+            </w:tcBorders>
+            <w:tcMar>
+              <w:top w:w="100" w:type="dxa"/>
+              <w:left w:w="100" w:type="dxa"/>
+              <w:bottom w:w="100" w:type="dxa"/>
+              <w:right w:w="100" w:type="dxa"/>
+            </w:tcMar>
+            <w:hideMark/>
+          </w:tcPr>
+          <w:p>
+            <w:pPr>
+              <w:rPr>
+                <w:lang w:val="en-US"/>
+              </w:rPr>
+            </w:pPr>
+          </w:p>
+        </w:tc>
+        <w:tc>
+          <w:tcPr>
+            <w:tcW w:w="0" w:type="auto"/>
+            <w:tcBorders>
+              <w:top w:val="single" w:sz="8" w:space="0" w:color="000000"/>
+              <w:left w:val="single" w:sz="8" w:space="0" w:color="000000"/>
+              <w:bottom w:val="single" w:sz="8" w:space="0" w:color="000000"/>
+              <w:right w:val="single" w:sz="8" w:space="0" w:color="000000"/>
+            </w:tcBorders>
+            <w:tcMar>
+              <w:top w:w="100" w:type="dxa"/>
+              <w:left w:w="100" w:type="dxa"/>
+              <w:bottom w:w="100" w:type="dxa"/>
+              <w:right w:w="100" w:type="dxa"/>
+            </w:tcMar>
+            <w:hideMark/>
+          </w:tcPr>
+          <w:p>
+            <w:pPr>
+              <w:rPr>
+                <w:lang w:val="en-US"/>
+              </w:rPr>
+            </w:pPr>
+            <w:r>
+              <w:rPr>
+                <w:lang w:val="en-US"/>
+              </w:rPr>
+              <w:t>{% if template_dict.file_ext.comments|length &gt; 0 %}X{% endif %}</w:t>
             </w:r>
           </w:p>
         </w:tc>
@@ -3274,21 +2929,7 @@
               <w:rPr>
                 <w:lang w:val="en-US"/>
               </w:rPr>
-              <w:t xml:space="preserve">{% for item in </w:t>
-            </w:r>
-            <w:proofErr w:type="spellStart"/>
-            <w:r>
-              <w:rPr>
-                <w:lang w:val="en-US"/>
-              </w:rPr>
-              <w:t>template_dict.file_open.comments</w:t>
-            </w:r>
-            <w:proofErr w:type="spellEnd"/>
-            <w:r>
-              <w:rPr>
-                <w:lang w:val="en-US"/>
-              </w:rPr>
-              <w:t xml:space="preserve"> %}</w:t>
+              <w:t>{% for item in template_dict.file_open.comments %}</w:t>
             </w:r>
           </w:p>
           <w:p>
@@ -3306,41 +2947,13 @@
               <w:rPr>
                 <w:lang w:val="en-US"/>
               </w:rPr>
-              <w:t xml:space="preserve">{{ </w:t>
-            </w:r>
-            <w:proofErr w:type="spellStart"/>
-            <w:r>
-              <w:rPr>
-                <w:lang w:val="en-US"/>
-              </w:rPr>
-              <w:t>item.file_name</w:t>
-            </w:r>
-            <w:proofErr w:type="spellEnd"/>
-            <w:r>
-              <w:rPr>
-                <w:lang w:val="en-US"/>
-              </w:rPr>
-              <w:t xml:space="preserve"> }}</w:t>
-            </w:r>
-            <w:r>
-              <w:rPr>
-                <w:lang w:val="en-US"/>
-              </w:rPr>
-              <w:t xml:space="preserve">{% </w:t>
-            </w:r>
-            <w:proofErr w:type="spellStart"/>
-            <w:r>
-              <w:rPr>
-                <w:lang w:val="en-US"/>
-              </w:rPr>
-              <w:t>endfor</w:t>
-            </w:r>
-            <w:proofErr w:type="spellEnd"/>
-            <w:r>
-              <w:rPr>
-                <w:lang w:val="en-US"/>
-              </w:rPr>
-              <w:t xml:space="preserve"> %}</w:t>
+              <w:t>{{ item.file_name }}</w:t>
+            </w:r>
+            <w:r>
+              <w:rPr>
+                <w:lang w:val="en-US"/>
+              </w:rPr>
+              <w:t>{% endfor %}</w:t>
             </w:r>
           </w:p>
           <w:p>
@@ -3373,21 +2986,7 @@
               <w:rPr>
                 <w:lang w:val="en-US"/>
               </w:rPr>
-              <w:t xml:space="preserve">{% for item in </w:t>
-            </w:r>
-            <w:proofErr w:type="spellStart"/>
-            <w:r>
-              <w:rPr>
-                <w:lang w:val="en-US"/>
-              </w:rPr>
-              <w:t>template_dict.file_open.not_checked</w:t>
-            </w:r>
-            <w:proofErr w:type="spellEnd"/>
-            <w:r>
-              <w:rPr>
-                <w:lang w:val="en-US"/>
-              </w:rPr>
-              <w:t xml:space="preserve"> %}</w:t>
+              <w:t>{% for item in template_dict.file_open.not_checked %}</w:t>
             </w:r>
           </w:p>
           <w:p>
@@ -3405,35 +3004,7 @@
               <w:rPr>
                 <w:lang w:val="en-US"/>
               </w:rPr>
-              <w:t xml:space="preserve">{{ </w:t>
-            </w:r>
-            <w:proofErr w:type="spellStart"/>
-            <w:r>
-              <w:rPr>
-                <w:lang w:val="en-US"/>
-              </w:rPr>
-              <w:t>item.file_name</w:t>
-            </w:r>
-            <w:proofErr w:type="spellEnd"/>
-            <w:r>
-              <w:rPr>
-                <w:lang w:val="en-US"/>
-              </w:rPr>
-              <w:t xml:space="preserve"> }}{% </w:t>
-            </w:r>
-            <w:proofErr w:type="spellStart"/>
-            <w:r>
-              <w:rPr>
-                <w:lang w:val="en-US"/>
-              </w:rPr>
-              <w:t>endfor</w:t>
-            </w:r>
-            <w:proofErr w:type="spellEnd"/>
-            <w:r>
-              <w:rPr>
-                <w:lang w:val="en-US"/>
-              </w:rPr>
-              <w:t xml:space="preserve"> %}</w:t>
+              <w:t>{{ item.file_name }}{% endfor %}</w:t>
             </w:r>
           </w:p>
           <w:p>
@@ -3647,91 +3218,63 @@
               <w:rPr>
                 <w:lang w:val="en-US"/>
               </w:rPr>
-              <w:t xml:space="preserve">{% if </w:t>
-            </w:r>
-            <w:proofErr w:type="spellStart"/>
-            <w:r>
-              <w:rPr>
-                <w:lang w:val="en-US"/>
-              </w:rPr>
-              <w:t>template_dict.special_characters.comments|length</w:t>
-            </w:r>
-            <w:proofErr w:type="spellEnd"/>
-            <w:r>
-              <w:rPr>
-                <w:lang w:val="en-US"/>
-              </w:rPr>
-              <w:t xml:space="preserve"> == 0 %}X{% endif %}</w:t>
-            </w:r>
-          </w:p>
-        </w:tc>
-        <w:tc>
-          <w:tcPr>
-            <w:tcW w:w="0" w:type="auto"/>
-            <w:tcBorders>
-              <w:top w:val="single" w:sz="8" w:space="0" w:color="000000"/>
-              <w:left w:val="single" w:sz="8" w:space="0" w:color="000000"/>
-              <w:bottom w:val="single" w:sz="8" w:space="0" w:color="000000"/>
-              <w:right w:val="single" w:sz="8" w:space="0" w:color="000000"/>
-            </w:tcBorders>
-            <w:tcMar>
-              <w:top w:w="100" w:type="dxa"/>
-              <w:left w:w="100" w:type="dxa"/>
-              <w:bottom w:w="100" w:type="dxa"/>
-              <w:right w:w="100" w:type="dxa"/>
-            </w:tcMar>
-            <w:hideMark/>
-          </w:tcPr>
-          <w:p>
-            <w:pPr>
-              <w:rPr>
-                <w:lang w:val="en-US"/>
-              </w:rPr>
-            </w:pPr>
-          </w:p>
-        </w:tc>
-        <w:tc>
-          <w:tcPr>
-            <w:tcW w:w="0" w:type="auto"/>
-            <w:tcBorders>
-              <w:top w:val="single" w:sz="8" w:space="0" w:color="000000"/>
-              <w:left w:val="single" w:sz="8" w:space="0" w:color="000000"/>
-              <w:bottom w:val="single" w:sz="8" w:space="0" w:color="000000"/>
-              <w:right w:val="single" w:sz="8" w:space="0" w:color="000000"/>
-            </w:tcBorders>
-            <w:tcMar>
-              <w:top w:w="100" w:type="dxa"/>
-              <w:left w:w="100" w:type="dxa"/>
-              <w:bottom w:w="100" w:type="dxa"/>
-              <w:right w:w="100" w:type="dxa"/>
-            </w:tcMar>
-            <w:hideMark/>
-          </w:tcPr>
-          <w:p>
-            <w:pPr>
-              <w:rPr>
-                <w:lang w:val="en-US"/>
-              </w:rPr>
-            </w:pPr>
-            <w:r>
-              <w:rPr>
-                <w:lang w:val="en-US"/>
-              </w:rPr>
-              <w:t xml:space="preserve">{% if </w:t>
-            </w:r>
-            <w:proofErr w:type="spellStart"/>
-            <w:r>
-              <w:rPr>
-                <w:lang w:val="en-US"/>
-              </w:rPr>
-              <w:t>template_dict.special_characters.comments|length</w:t>
-            </w:r>
-            <w:proofErr w:type="spellEnd"/>
-            <w:r>
-              <w:rPr>
-                <w:lang w:val="en-US"/>
-              </w:rPr>
-              <w:t xml:space="preserve"> &gt; 0 %}X{% endif %}</w:t>
+              <w:t>{% if template_dict.special_characters.comments|length == 0 %}X{% endif %}</w:t>
+            </w:r>
+          </w:p>
+        </w:tc>
+        <w:tc>
+          <w:tcPr>
+            <w:tcW w:w="0" w:type="auto"/>
+            <w:tcBorders>
+              <w:top w:val="single" w:sz="8" w:space="0" w:color="000000"/>
+              <w:left w:val="single" w:sz="8" w:space="0" w:color="000000"/>
+              <w:bottom w:val="single" w:sz="8" w:space="0" w:color="000000"/>
+              <w:right w:val="single" w:sz="8" w:space="0" w:color="000000"/>
+            </w:tcBorders>
+            <w:tcMar>
+              <w:top w:w="100" w:type="dxa"/>
+              <w:left w:w="100" w:type="dxa"/>
+              <w:bottom w:w="100" w:type="dxa"/>
+              <w:right w:w="100" w:type="dxa"/>
+            </w:tcMar>
+            <w:hideMark/>
+          </w:tcPr>
+          <w:p>
+            <w:pPr>
+              <w:rPr>
+                <w:lang w:val="en-US"/>
+              </w:rPr>
+            </w:pPr>
+          </w:p>
+        </w:tc>
+        <w:tc>
+          <w:tcPr>
+            <w:tcW w:w="0" w:type="auto"/>
+            <w:tcBorders>
+              <w:top w:val="single" w:sz="8" w:space="0" w:color="000000"/>
+              <w:left w:val="single" w:sz="8" w:space="0" w:color="000000"/>
+              <w:bottom w:val="single" w:sz="8" w:space="0" w:color="000000"/>
+              <w:right w:val="single" w:sz="8" w:space="0" w:color="000000"/>
+            </w:tcBorders>
+            <w:tcMar>
+              <w:top w:w="100" w:type="dxa"/>
+              <w:left w:w="100" w:type="dxa"/>
+              <w:bottom w:w="100" w:type="dxa"/>
+              <w:right w:w="100" w:type="dxa"/>
+            </w:tcMar>
+            <w:hideMark/>
+          </w:tcPr>
+          <w:p>
+            <w:pPr>
+              <w:rPr>
+                <w:lang w:val="en-US"/>
+              </w:rPr>
+            </w:pPr>
+            <w:r>
+              <w:rPr>
+                <w:lang w:val="en-US"/>
+              </w:rPr>
+              <w:t>{% if template_dict.special_characters.comments|length &gt; 0 %}X{% endif %}</w:t>
             </w:r>
           </w:p>
         </w:tc>
@@ -3824,21 +3367,7 @@
               <w:rPr>
                 <w:lang w:val="en-US"/>
               </w:rPr>
-              <w:t xml:space="preserve">{% for item in </w:t>
-            </w:r>
-            <w:proofErr w:type="spellStart"/>
-            <w:r>
-              <w:rPr>
-                <w:lang w:val="en-US"/>
-              </w:rPr>
-              <w:t>template_dict.special_characters.comments</w:t>
-            </w:r>
-            <w:proofErr w:type="spellEnd"/>
-            <w:r>
-              <w:rPr>
-                <w:lang w:val="en-US"/>
-              </w:rPr>
-              <w:t xml:space="preserve"> %}</w:t>
+              <w:t>{% for item in template_dict.special_characters.comments %}</w:t>
             </w:r>
           </w:p>
           <w:p>
@@ -3856,35 +3385,7 @@
               <w:rPr>
                 <w:lang w:val="en-US"/>
               </w:rPr>
-              <w:t xml:space="preserve">{{ </w:t>
-            </w:r>
-            <w:proofErr w:type="spellStart"/>
-            <w:r>
-              <w:rPr>
-                <w:lang w:val="en-US"/>
-              </w:rPr>
-              <w:t>item.file_name</w:t>
-            </w:r>
-            <w:proofErr w:type="spellEnd"/>
-            <w:r>
-              <w:rPr>
-                <w:lang w:val="en-US"/>
-              </w:rPr>
-              <w:t xml:space="preserve"> }}{% </w:t>
-            </w:r>
-            <w:proofErr w:type="spellStart"/>
-            <w:r>
-              <w:rPr>
-                <w:lang w:val="en-US"/>
-              </w:rPr>
-              <w:t>endfor</w:t>
-            </w:r>
-            <w:proofErr w:type="spellEnd"/>
-            <w:r>
-              <w:rPr>
-                <w:lang w:val="en-US"/>
-              </w:rPr>
-              <w:t xml:space="preserve"> %}</w:t>
+              <w:t>{{ item.file_name }}{% endfor %}</w:t>
             </w:r>
           </w:p>
         </w:tc>
@@ -4077,21 +3578,7 @@
               <w:rPr>
                 <w:lang w:val="en-US"/>
               </w:rPr>
-              <w:t xml:space="preserve">{% if </w:t>
-            </w:r>
-            <w:proofErr w:type="spellStart"/>
-            <w:r>
-              <w:rPr>
-                <w:lang w:val="en-US"/>
-              </w:rPr>
-              <w:t>template_dict.readme_file.comments|length</w:t>
-            </w:r>
-            <w:proofErr w:type="spellEnd"/>
-            <w:r>
-              <w:rPr>
-                <w:lang w:val="en-US"/>
-              </w:rPr>
-              <w:t xml:space="preserve"> </w:t>
+              <w:t xml:space="preserve">{% if template_dict.readme_file.comments|length </w:t>
             </w:r>
             <w:r>
               <w:rPr>
@@ -4160,21 +3647,7 @@
               <w:rPr>
                 <w:lang w:val="en-US"/>
               </w:rPr>
-              <w:t xml:space="preserve">{% if </w:t>
-            </w:r>
-            <w:proofErr w:type="spellStart"/>
-            <w:r>
-              <w:rPr>
-                <w:lang w:val="en-US"/>
-              </w:rPr>
-              <w:t>template_dict.file_ext.comments|length</w:t>
-            </w:r>
-            <w:proofErr w:type="spellEnd"/>
-            <w:r>
-              <w:rPr>
-                <w:lang w:val="en-US"/>
-              </w:rPr>
-              <w:t xml:space="preserve"> &gt; 0 %}X{% endif %}</w:t>
+              <w:t>{% if template_dict.file_ext.comments|length &gt; 0 %}X{% endif %}</w:t>
             </w:r>
           </w:p>
         </w:tc>
@@ -4267,21 +3740,7 @@
               <w:rPr>
                 <w:lang w:val="en-US"/>
               </w:rPr>
-              <w:t xml:space="preserve">{% for item in </w:t>
-            </w:r>
-            <w:proofErr w:type="spellStart"/>
-            <w:r>
-              <w:rPr>
-                <w:lang w:val="en-US"/>
-              </w:rPr>
-              <w:t>template_dict.file_ext.comments</w:t>
-            </w:r>
-            <w:proofErr w:type="spellEnd"/>
-            <w:r>
-              <w:rPr>
-                <w:lang w:val="en-US"/>
-              </w:rPr>
-              <w:t xml:space="preserve"> %}</w:t>
+              <w:t>{% for item in template_dict.file_ext.comments %}</w:t>
             </w:r>
           </w:p>
           <w:p>
@@ -4299,35 +3758,7 @@
               <w:rPr>
                 <w:lang w:val="en-US"/>
               </w:rPr>
-              <w:t xml:space="preserve">{{ </w:t>
-            </w:r>
-            <w:proofErr w:type="spellStart"/>
-            <w:r>
-              <w:rPr>
-                <w:lang w:val="en-US"/>
-              </w:rPr>
-              <w:t>item.file_name</w:t>
-            </w:r>
-            <w:proofErr w:type="spellEnd"/>
-            <w:r>
-              <w:rPr>
-                <w:lang w:val="en-US"/>
-              </w:rPr>
-              <w:t xml:space="preserve"> }}{% </w:t>
-            </w:r>
-            <w:proofErr w:type="spellStart"/>
-            <w:r>
-              <w:rPr>
-                <w:lang w:val="en-US"/>
-              </w:rPr>
-              <w:t>endfor</w:t>
-            </w:r>
-            <w:proofErr w:type="spellEnd"/>
-            <w:r>
-              <w:rPr>
-                <w:lang w:val="en-US"/>
-              </w:rPr>
-              <w:t xml:space="preserve"> %}</w:t>
+              <w:t>{{ item.file_name }}{% endfor %}</w:t>
             </w:r>
           </w:p>
         </w:tc>
@@ -4649,42 +4080,46 @@
           </w:p>
           <w:p>
             <w:pPr>
-              <w:ind w:left="720"/>
-              <w:rPr>
-                <w:sz w:val="40"/>
-                <w:szCs w:val="40"/>
-                <w:lang w:val="en-US"/>
-              </w:rPr>
-            </w:pPr>
-            <w:r>
+              <w:rPr>
+                <w:lang w:val="en-US"/>
+              </w:rPr>
+            </w:pPr>
+            <w:r>
+              <w:rPr>
+                <w:lang w:val="en-US"/>
+              </w:rPr>
+              <w:t>{% for item in template_dict.</w:t>
+            </w:r>
+            <w:r>
+              <w:rPr>
+                <w:lang w:val="en-US"/>
+              </w:rPr>
+              <w:t>common_file_format</w:t>
+            </w:r>
+            <w:r>
+              <w:rPr>
+                <w:lang w:val="en-US"/>
+              </w:rPr>
+              <w:t>.comments %}</w:t>
+            </w:r>
+          </w:p>
+          <w:p>
+            <w:pPr>
+              <w:pStyle w:val="ListParagraph"/>
+              <w:numPr>
+                <w:ilvl w:val="0"/>
+                <w:numId w:val="32"/>
+              </w:numPr>
               <w:rPr>
                 <w:rFonts w:hint="eastAsia"/>
-                <w:color w:val="FF0000"/>
-                <w:sz w:val="40"/>
-                <w:szCs w:val="40"/>
-                <w:lang w:val="en-US"/>
-              </w:rPr>
-              <w:t>-</w:t>
-            </w:r>
-            <w:r>
-              <w:rPr>
-                <w:rFonts w:hint="eastAsia"/>
-                <w:color w:val="FF0000"/>
-                <w:sz w:val="40"/>
-                <w:szCs w:val="40"/>
-                <w:lang w:val="en-US"/>
-              </w:rPr>
-              <w:t>TBD</w:t>
-            </w:r>
-            <w:r>
-              <w:rPr>
-                <w:rFonts w:hint="eastAsia"/>
-                <w:color w:val="FF0000"/>
-                <w:sz w:val="40"/>
-                <w:szCs w:val="40"/>
-                <w:lang w:val="en-US"/>
-              </w:rPr>
-              <w:t>-</w:t>
+                <w:lang w:val="en-US"/>
+              </w:rPr>
+            </w:pPr>
+            <w:r>
+              <w:rPr>
+                <w:lang w:val="en-US"/>
+              </w:rPr>
+              <w:t>{{ item.file_name }}{% endfor %}</w:t>
             </w:r>
           </w:p>
         </w:tc>
@@ -5521,37 +4956,47 @@
                 <w:bCs/>
                 <w:lang w:val="en-US"/>
               </w:rPr>
-              <w:t>Does the dataset include a separate README file?</w:t>
-            </w:r>
-          </w:p>
-        </w:tc>
-        <w:tc>
-          <w:tcPr>
-            <w:tcW w:w="0" w:type="auto"/>
-            <w:tcBorders>
-              <w:top w:val="single" w:sz="8" w:space="0" w:color="000000"/>
-              <w:left w:val="single" w:sz="8" w:space="0" w:color="000000"/>
-              <w:bottom w:val="single" w:sz="8" w:space="0" w:color="000000"/>
-              <w:right w:val="single" w:sz="8" w:space="0" w:color="000000"/>
-            </w:tcBorders>
-            <w:tcMar>
-              <w:top w:w="100" w:type="dxa"/>
-              <w:left w:w="100" w:type="dxa"/>
-              <w:bottom w:w="100" w:type="dxa"/>
-              <w:right w:w="100" w:type="dxa"/>
-            </w:tcMar>
-            <w:hideMark/>
-          </w:tcPr>
-          <w:p>
-            <w:pPr>
-              <w:rPr>
-                <w:lang w:val="en-US"/>
-              </w:rPr>
-            </w:pPr>
-            <w:r>
-              <w:rPr>
-                <w:lang w:val="en-US"/>
-              </w:rPr>
+              <w:t xml:space="preserve">Does the dataset include a separate </w:t>
+            </w:r>
+            <w:r>
+              <w:rPr>
+                <w:b/>
+                <w:bCs/>
+                <w:lang w:val="en-US"/>
+              </w:rPr>
+              <w:lastRenderedPageBreak/>
+              <w:t>README file?</w:t>
+            </w:r>
+          </w:p>
+        </w:tc>
+        <w:tc>
+          <w:tcPr>
+            <w:tcW w:w="0" w:type="auto"/>
+            <w:tcBorders>
+              <w:top w:val="single" w:sz="8" w:space="0" w:color="000000"/>
+              <w:left w:val="single" w:sz="8" w:space="0" w:color="000000"/>
+              <w:bottom w:val="single" w:sz="8" w:space="0" w:color="000000"/>
+              <w:right w:val="single" w:sz="8" w:space="0" w:color="000000"/>
+            </w:tcBorders>
+            <w:tcMar>
+              <w:top w:w="100" w:type="dxa"/>
+              <w:left w:w="100" w:type="dxa"/>
+              <w:bottom w:w="100" w:type="dxa"/>
+              <w:right w:w="100" w:type="dxa"/>
+            </w:tcMar>
+            <w:hideMark/>
+          </w:tcPr>
+          <w:p>
+            <w:pPr>
+              <w:rPr>
+                <w:lang w:val="en-US"/>
+              </w:rPr>
+            </w:pPr>
+            <w:r>
+              <w:rPr>
+                <w:lang w:val="en-US"/>
+              </w:rPr>
+              <w:lastRenderedPageBreak/>
               <w:t>Python scripted.</w:t>
             </w:r>
           </w:p>
@@ -5583,66 +5028,38 @@
               <w:rPr>
                 <w:lang w:val="en-US"/>
               </w:rPr>
-              <w:t xml:space="preserve">{% if </w:t>
-            </w:r>
-            <w:proofErr w:type="spellStart"/>
-            <w:r>
-              <w:rPr>
-                <w:lang w:val="en-US"/>
-              </w:rPr>
-              <w:t>template_dict.readme_file.comments|length</w:t>
-            </w:r>
-            <w:proofErr w:type="spellEnd"/>
-            <w:r>
-              <w:rPr>
-                <w:lang w:val="en-US"/>
-              </w:rPr>
-              <w:t xml:space="preserve"> &gt; 0 %}X{% endif %}</w:t>
-            </w:r>
-          </w:p>
-        </w:tc>
-        <w:tc>
-          <w:tcPr>
-            <w:tcW w:w="0" w:type="auto"/>
-            <w:tcBorders>
-              <w:top w:val="single" w:sz="8" w:space="0" w:color="000000"/>
-              <w:left w:val="single" w:sz="8" w:space="0" w:color="000000"/>
-              <w:bottom w:val="single" w:sz="8" w:space="0" w:color="000000"/>
-              <w:right w:val="single" w:sz="8" w:space="0" w:color="000000"/>
-            </w:tcBorders>
-            <w:tcMar>
-              <w:top w:w="100" w:type="dxa"/>
-              <w:left w:w="100" w:type="dxa"/>
-              <w:bottom w:w="100" w:type="dxa"/>
-              <w:right w:w="100" w:type="dxa"/>
-            </w:tcMar>
-            <w:hideMark/>
-          </w:tcPr>
-          <w:p>
-            <w:pPr>
-              <w:rPr>
-                <w:lang w:val="en-US"/>
-              </w:rPr>
-            </w:pPr>
-            <w:r>
-              <w:rPr>
-                <w:lang w:val="en-US"/>
-              </w:rPr>
-              <w:t xml:space="preserve">{% if </w:t>
-            </w:r>
-            <w:proofErr w:type="spellStart"/>
-            <w:r>
-              <w:rPr>
-                <w:lang w:val="en-US"/>
-              </w:rPr>
-              <w:t>template_dict.readme_file.comments|length</w:t>
-            </w:r>
-            <w:proofErr w:type="spellEnd"/>
-            <w:r>
-              <w:rPr>
-                <w:lang w:val="en-US"/>
-              </w:rPr>
-              <w:t xml:space="preserve"> == 0 %}X{% endif %}</w:t>
+              <w:t>{% if template_dict.readme_file.comments|length &gt; 0 %}X{% endif %}</w:t>
+            </w:r>
+          </w:p>
+        </w:tc>
+        <w:tc>
+          <w:tcPr>
+            <w:tcW w:w="0" w:type="auto"/>
+            <w:tcBorders>
+              <w:top w:val="single" w:sz="8" w:space="0" w:color="000000"/>
+              <w:left w:val="single" w:sz="8" w:space="0" w:color="000000"/>
+              <w:bottom w:val="single" w:sz="8" w:space="0" w:color="000000"/>
+              <w:right w:val="single" w:sz="8" w:space="0" w:color="000000"/>
+            </w:tcBorders>
+            <w:tcMar>
+              <w:top w:w="100" w:type="dxa"/>
+              <w:left w:w="100" w:type="dxa"/>
+              <w:bottom w:w="100" w:type="dxa"/>
+              <w:right w:w="100" w:type="dxa"/>
+            </w:tcMar>
+            <w:hideMark/>
+          </w:tcPr>
+          <w:p>
+            <w:pPr>
+              <w:rPr>
+                <w:lang w:val="en-US"/>
+              </w:rPr>
+            </w:pPr>
+            <w:r>
+              <w:rPr>
+                <w:lang w:val="en-US"/>
+              </w:rPr>
+              <w:t>{% if template_dict.readme_file.comments|length == 0 %}X{% endif %}</w:t>
             </w:r>
           </w:p>
         </w:tc>
@@ -5760,32 +5177,10 @@
               <w:rPr>
                 <w:lang w:val="en-US"/>
               </w:rPr>
-              <w:t xml:space="preserve">{% for item in </w:t>
-            </w:r>
-            <w:proofErr w:type="spellStart"/>
-            <w:r>
-              <w:rPr>
-                <w:lang w:val="en-US"/>
-              </w:rPr>
-              <w:t>template_dict.readme_file.comments</w:t>
-            </w:r>
-            <w:proofErr w:type="spellEnd"/>
-            <w:r>
-              <w:rPr>
-                <w:lang w:val="en-US"/>
-              </w:rPr>
-              <w:t xml:space="preserve"> %}</w:t>
-            </w:r>
-            <w:r>
-              <w:t xml:space="preserve">{{ </w:t>
-            </w:r>
-            <w:proofErr w:type="spellStart"/>
-            <w:r>
-              <w:t>loop.index</w:t>
-            </w:r>
-            <w:proofErr w:type="spellEnd"/>
-            <w:r>
-              <w:t xml:space="preserve"> }}.</w:t>
+              <w:t>{% for item in template_dict.readme_file.comments %}</w:t>
+            </w:r>
+            <w:r>
+              <w:t>{{ loop.index }}.</w:t>
             </w:r>
             <w:r>
               <w:rPr>
@@ -5797,21 +5192,7 @@
               <w:rPr>
                 <w:lang w:val="en-US"/>
               </w:rPr>
-              <w:t xml:space="preserve">{{ </w:t>
-            </w:r>
-            <w:proofErr w:type="spellStart"/>
-            <w:r>
-              <w:rPr>
-                <w:lang w:val="en-US"/>
-              </w:rPr>
-              <w:t>item.file_name</w:t>
-            </w:r>
-            <w:proofErr w:type="spellEnd"/>
-            <w:r>
-              <w:rPr>
-                <w:lang w:val="en-US"/>
-              </w:rPr>
-              <w:t xml:space="preserve"> }}</w:t>
+              <w:t>{{ item.file_name }}</w:t>
             </w:r>
             <w:r>
               <w:rPr>
@@ -5823,21 +5204,7 @@
               <w:rPr>
                 <w:lang w:val="en-US"/>
               </w:rPr>
-              <w:t xml:space="preserve">{% </w:t>
-            </w:r>
-            <w:proofErr w:type="spellStart"/>
-            <w:r>
-              <w:rPr>
-                <w:lang w:val="en-US"/>
-              </w:rPr>
-              <w:t>endfor</w:t>
-            </w:r>
-            <w:proofErr w:type="spellEnd"/>
-            <w:r>
-              <w:rPr>
-                <w:lang w:val="en-US"/>
-              </w:rPr>
-              <w:t xml:space="preserve"> %}</w:t>
+              <w:t>{% endfor %}</w:t>
             </w:r>
           </w:p>
         </w:tc>
@@ -5938,7 +5305,6 @@
                 <w:bCs/>
                 <w:lang w:val="en-US"/>
               </w:rPr>
-              <w:lastRenderedPageBreak/>
               <w:t>4.0</w:t>
             </w:r>
           </w:p>
@@ -6636,21 +6002,7 @@
               <w:rPr>
                 <w:lang w:val="en-US"/>
               </w:rPr>
-              <w:t xml:space="preserve">{% for item in </w:t>
-            </w:r>
-            <w:proofErr w:type="spellStart"/>
-            <w:r>
-              <w:rPr>
-                <w:lang w:val="en-US"/>
-              </w:rPr>
-              <w:t>template_dict.typo.comments</w:t>
-            </w:r>
-            <w:proofErr w:type="spellEnd"/>
-            <w:r>
-              <w:rPr>
-                <w:lang w:val="en-US"/>
-              </w:rPr>
-              <w:t xml:space="preserve"> %}</w:t>
+              <w:t>{% for item in template_dict.typo.comments %}</w:t>
             </w:r>
           </w:p>
           <w:p>
@@ -6665,21 +6017,7 @@
               <w:rPr>
                 <w:lang w:val="en-US"/>
               </w:rPr>
-              <w:t xml:space="preserve">{{ item }}{% </w:t>
-            </w:r>
-            <w:proofErr w:type="spellStart"/>
-            <w:r>
-              <w:rPr>
-                <w:lang w:val="en-US"/>
-              </w:rPr>
-              <w:t>endfor</w:t>
-            </w:r>
-            <w:proofErr w:type="spellEnd"/>
-            <w:r>
-              <w:rPr>
-                <w:lang w:val="en-US"/>
-              </w:rPr>
-              <w:t xml:space="preserve"> %}</w:t>
+              <w:t>{{ item }}{% endfor %}</w:t>
             </w:r>
           </w:p>
           <w:p>
@@ -7230,37 +6568,47 @@
                 <w:bCs/>
                 <w:lang w:val="en-US"/>
               </w:rPr>
-              <w:t>Does at least one author have an institutional affiliation listed?</w:t>
-            </w:r>
-          </w:p>
-        </w:tc>
-        <w:tc>
-          <w:tcPr>
-            <w:tcW w:w="0" w:type="auto"/>
-            <w:tcBorders>
-              <w:top w:val="single" w:sz="8" w:space="0" w:color="000000"/>
-              <w:left w:val="single" w:sz="8" w:space="0" w:color="000000"/>
-              <w:bottom w:val="single" w:sz="8" w:space="0" w:color="000000"/>
-              <w:right w:val="single" w:sz="8" w:space="0" w:color="000000"/>
-            </w:tcBorders>
-            <w:tcMar>
-              <w:top w:w="100" w:type="dxa"/>
-              <w:left w:w="100" w:type="dxa"/>
-              <w:bottom w:w="100" w:type="dxa"/>
-              <w:right w:w="100" w:type="dxa"/>
-            </w:tcMar>
-            <w:hideMark/>
-          </w:tcPr>
-          <w:p>
-            <w:pPr>
-              <w:rPr>
-                <w:lang w:val="en-US"/>
-              </w:rPr>
-            </w:pPr>
-            <w:r>
-              <w:rPr>
-                <w:lang w:val="en-US"/>
-              </w:rPr>
+              <w:t xml:space="preserve">Does at least one author have an institutional </w:t>
+            </w:r>
+            <w:r>
+              <w:rPr>
+                <w:b/>
+                <w:bCs/>
+                <w:lang w:val="en-US"/>
+              </w:rPr>
+              <w:lastRenderedPageBreak/>
+              <w:t>affiliation listed?</w:t>
+            </w:r>
+          </w:p>
+        </w:tc>
+        <w:tc>
+          <w:tcPr>
+            <w:tcW w:w="0" w:type="auto"/>
+            <w:tcBorders>
+              <w:top w:val="single" w:sz="8" w:space="0" w:color="000000"/>
+              <w:left w:val="single" w:sz="8" w:space="0" w:color="000000"/>
+              <w:bottom w:val="single" w:sz="8" w:space="0" w:color="000000"/>
+              <w:right w:val="single" w:sz="8" w:space="0" w:color="000000"/>
+            </w:tcBorders>
+            <w:tcMar>
+              <w:top w:w="100" w:type="dxa"/>
+              <w:left w:w="100" w:type="dxa"/>
+              <w:bottom w:w="100" w:type="dxa"/>
+              <w:right w:w="100" w:type="dxa"/>
+            </w:tcMar>
+            <w:hideMark/>
+          </w:tcPr>
+          <w:p>
+            <w:pPr>
+              <w:rPr>
+                <w:lang w:val="en-US"/>
+              </w:rPr>
+            </w:pPr>
+            <w:r>
+              <w:rPr>
+                <w:lang w:val="en-US"/>
+              </w:rPr>
+              <w:lastRenderedPageBreak/>
               <w:t>Python scripted.</w:t>
             </w:r>
           </w:p>
@@ -7289,13 +6637,8 @@
             <w:r>
               <w:t xml:space="preserve">not </w:t>
             </w:r>
-            <w:proofErr w:type="spellStart"/>
-            <w:r>
-              <w:t>template_dict.none_author_affiliation</w:t>
-            </w:r>
-            <w:proofErr w:type="spellEnd"/>
-            <w:r>
-              <w:t xml:space="preserve"> %}X{% endif %}</w:t>
+            <w:r>
+              <w:t>template_dict.none_author_affiliation %}X{% endif %}</w:t>
             </w:r>
           </w:p>
         </w:tc>
@@ -7328,13 +6671,8 @@
             <w:r>
               <w:t xml:space="preserve"> </w:t>
             </w:r>
-            <w:proofErr w:type="spellStart"/>
-            <w:r>
-              <w:t>template_dict.none_author_affiliation</w:t>
-            </w:r>
-            <w:proofErr w:type="spellEnd"/>
-            <w:r>
-              <w:t xml:space="preserve"> %}X{% endif %}</w:t>
+            <w:r>
+              <w:t>template_dict.none_author_affiliation %}X{% endif %}</w:t>
             </w:r>
           </w:p>
         </w:tc>
@@ -7547,7 +6885,6 @@
                 <w:bCs/>
                 <w:lang w:val="en-US"/>
               </w:rPr>
-              <w:lastRenderedPageBreak/>
               <w:t>5.0</w:t>
             </w:r>
           </w:p>
@@ -8287,7 +7624,7 @@
                 <w:bCs/>
                 <w:lang w:val="en-US"/>
               </w:rPr>
-              <w:t xml:space="preserve">*If something is flagged in the sensitive data review, does the </w:t>
+              <w:t xml:space="preserve">*If something is flagged in the sensitive </w:t>
             </w:r>
             <w:r>
               <w:rPr>
@@ -8296,7 +7633,7 @@
                 <w:lang w:val="en-US"/>
               </w:rPr>
               <w:lastRenderedPageBreak/>
-              <w:t>depositor have REB approval to share the dataset?</w:t>
+              <w:t>data review, does the depositor have REB approval to share the dataset?</w:t>
             </w:r>
           </w:p>
         </w:tc>
@@ -8332,14 +7669,14 @@
                 <w:lang w:val="en-US"/>
               </w:rPr>
               <w:lastRenderedPageBreak/>
-              <w:t xml:space="preserve">If something is flagged in the sensitive data review </w:t>
+              <w:t xml:space="preserve">If something is flagged in the </w:t>
             </w:r>
             <w:r>
               <w:rPr>
                 <w:lang w:val="en-US"/>
               </w:rPr>
               <w:lastRenderedPageBreak/>
-              <w:t>(see question above), check the intake form to confirm information about their REB status.</w:t>
+              <w:t>sensitive data review (see question above), check the intake form to confirm information about their REB status.</w:t>
             </w:r>
           </w:p>
         </w:tc>
@@ -8835,11 +8172,7 @@
               <w:br/>
             </w:r>
             <w:r>
-              <w:t xml:space="preserve">{% if </w:t>
-            </w:r>
-            <w:proofErr w:type="spellStart"/>
-            <w:r>
-              <w:t>template_dict.restricted_files.comment</w:t>
+              <w:t>{% if template_dict.restricted_files.comment</w:t>
             </w:r>
             <w:r>
               <w:rPr>
@@ -8848,22 +8181,10 @@
               <w:t>s</w:t>
             </w:r>
             <w:r>
-              <w:t>|length</w:t>
-            </w:r>
-            <w:proofErr w:type="spellEnd"/>
-            <w:r>
-              <w:t xml:space="preserve"> &gt; 0</w:t>
-            </w:r>
-            <w:r>
-              <w:t xml:space="preserve"> %} {% for item in </w:t>
-            </w:r>
-            <w:proofErr w:type="spellStart"/>
-            <w:r>
-              <w:t>template_dict.restricted_files.comments</w:t>
-            </w:r>
-            <w:proofErr w:type="spellEnd"/>
-            <w:r>
-              <w:t xml:space="preserve"> %} </w:t>
+              <w:t>|length &gt; 0</w:t>
+            </w:r>
+            <w:r>
+              <w:t xml:space="preserve"> %} {% for item in template_dict.restricted_files.comments %} </w:t>
             </w:r>
           </w:p>
           <w:p>
@@ -8875,23 +8196,7 @@
               </w:numPr>
             </w:pPr>
             <w:r>
-              <w:t xml:space="preserve">{{ </w:t>
-            </w:r>
-            <w:proofErr w:type="spellStart"/>
-            <w:r>
-              <w:t>item.file_name</w:t>
-            </w:r>
-            <w:proofErr w:type="spellEnd"/>
-            <w:r>
-              <w:t xml:space="preserve"> }} {% </w:t>
-            </w:r>
-            <w:proofErr w:type="spellStart"/>
-            <w:r>
-              <w:t>endfor</w:t>
-            </w:r>
-            <w:proofErr w:type="spellEnd"/>
-            <w:r>
-              <w:t xml:space="preserve"> %}</w:t>
+              <w:t>{{ item.file_name }} {% endfor %}</w:t>
             </w:r>
           </w:p>
           <w:p>
@@ -8924,23 +8229,7 @@
               </w:rPr>
             </w:pPr>
             <w:r>
-              <w:t xml:space="preserve">{% if </w:t>
-            </w:r>
-            <w:proofErr w:type="spellStart"/>
-            <w:r>
-              <w:t>template_dict.terms_license.licenseName</w:t>
-            </w:r>
-            <w:proofErr w:type="spellEnd"/>
-            <w:r>
-              <w:t xml:space="preserve"> is not none %}{{ </w:t>
-            </w:r>
-            <w:proofErr w:type="spellStart"/>
-            <w:r>
-              <w:t>template_dict.terms_license.licenseName</w:t>
-            </w:r>
-            <w:proofErr w:type="spellEnd"/>
-            <w:r>
-              <w:t xml:space="preserve"> }}{% else %}(NONE){% endif %}</w:t>
+              <w:t>{% if template_dict.terms_license.licenseName is not none %}{{ template_dict.terms_license.licenseName }}{% else %}(NONE){% endif %}</w:t>
             </w:r>
           </w:p>
           <w:p>
@@ -8981,27 +8270,17 @@
                     </w:rPr>
                   </w:pPr>
                   <w:r>
-                    <w:t xml:space="preserve">{% if </w:t>
-                  </w:r>
-                  <w:proofErr w:type="spellStart"/>
-                  <w:r>
-                    <w:t>template_dict.terms_license.</w:t>
+                    <w:t>{% if template_dict.terms_license.</w:t>
                   </w:r>
                   <w:r>
                     <w:t>termsOfUse</w:t>
                   </w:r>
-                  <w:proofErr w:type="spellEnd"/>
                   <w:r>
-                    <w:t xml:space="preserve"> is not none %}{{ </w:t>
-                  </w:r>
-                  <w:proofErr w:type="spellStart"/>
-                  <w:r>
-                    <w:t>template_dict.terms_license.</w:t>
+                    <w:t xml:space="preserve"> is not none %}{{ template_dict.terms_license.</w:t>
                   </w:r>
                   <w:r>
                     <w:t>termsOfUse</w:t>
                   </w:r>
-                  <w:proofErr w:type="spellEnd"/>
                   <w:r>
                     <w:t xml:space="preserve"> }}{% else %}(NONE){% endif %}</w:t>
                   </w:r>
@@ -9219,30 +8498,21 @@
           <w:p>
             <w:pPr>
               <w:rPr>
+                <w:lang w:val="en-US"/>
+              </w:rPr>
+            </w:pPr>
+            <w:r>
+              <w:rPr>
                 <w:rFonts w:hint="eastAsia"/>
                 <w:lang w:val="en-US"/>
               </w:rPr>
-            </w:pPr>
-            <w:r>
-              <w:rPr>
-                <w:rFonts w:hint="eastAsia"/>
-                <w:lang w:val="en-US"/>
-              </w:rPr>
               <w:t xml:space="preserve">{% if </w:t>
             </w:r>
-            <w:proofErr w:type="spellStart"/>
-            <w:r>
-              <w:rPr>
-                <w:lang w:val="en-US"/>
-              </w:rPr>
-              <w:t>template_dict</w:t>
-            </w:r>
-            <w:proofErr w:type="spellEnd"/>
-            <w:r>
-              <w:rPr>
-                <w:lang w:val="en-US"/>
-              </w:rPr>
-              <w:t>.</w:t>
+            <w:r>
+              <w:rPr>
+                <w:lang w:val="en-US"/>
+              </w:rPr>
+              <w:t>template_dict.</w:t>
             </w:r>
             <w:r>
               <w:rPr>
@@ -9255,124 +8525,90 @@
               </w:rPr>
               <w:t xml:space="preserve"> </w:t>
             </w:r>
-            <w:proofErr w:type="spellStart"/>
             <w:r>
               <w:t>restricted_files</w:t>
             </w:r>
-            <w:proofErr w:type="spellEnd"/>
-            <w:r>
-              <w:rPr>
-                <w:lang w:val="en-US"/>
-              </w:rPr>
-              <w:t>.</w:t>
-            </w:r>
-            <w:proofErr w:type="spellStart"/>
-            <w:r>
-              <w:rPr>
-                <w:lang w:val="en-US"/>
-              </w:rPr>
-              <w:t>comments</w:t>
+            <w:r>
+              <w:rPr>
+                <w:lang w:val="en-US"/>
+              </w:rPr>
+              <w:t>.comments</w:t>
             </w:r>
             <w:r>
               <w:rPr>
                 <w:rFonts w:hint="eastAsia"/>
                 <w:lang w:val="en-US"/>
               </w:rPr>
-              <w:t>|length</w:t>
-            </w:r>
-            <w:proofErr w:type="spellEnd"/>
+              <w:t>|length &gt;</w:t>
+            </w:r>
+            <w:r>
+              <w:rPr>
+                <w:lang w:val="en-US"/>
+              </w:rPr>
+              <w:t xml:space="preserve"> 0 </w:t>
+            </w:r>
             <w:r>
               <w:rPr>
                 <w:rFonts w:hint="eastAsia"/>
                 <w:lang w:val="en-US"/>
               </w:rPr>
-              <w:t xml:space="preserve"> </w:t>
-            </w:r>
+              <w:t xml:space="preserve">and </w:t>
+            </w:r>
+            <w:r>
+              <w:t>template_dict.terms_license.</w:t>
+            </w:r>
+            <w:r>
+              <w:t>termsOfAccess</w:t>
+            </w:r>
+            <w:r>
+              <w:t xml:space="preserve"> is not none</w:t>
+            </w:r>
+            <w:r>
+              <w:rPr>
+                <w:lang w:val="en-US"/>
+              </w:rPr>
+              <w:t xml:space="preserve"> %}</w:t>
+            </w:r>
+            <w:r>
+              <w:t>X{% endif %}</w:t>
+            </w:r>
+          </w:p>
+        </w:tc>
+        <w:tc>
+          <w:tcPr>
+            <w:tcW w:w="0" w:type="auto"/>
+            <w:tcBorders>
+              <w:top w:val="single" w:sz="8" w:space="0" w:color="000000"/>
+              <w:left w:val="single" w:sz="8" w:space="0" w:color="000000"/>
+              <w:bottom w:val="single" w:sz="8" w:space="0" w:color="000000"/>
+              <w:right w:val="single" w:sz="8" w:space="0" w:color="000000"/>
+            </w:tcBorders>
+            <w:tcMar>
+              <w:top w:w="100" w:type="dxa"/>
+              <w:left w:w="100" w:type="dxa"/>
+              <w:bottom w:w="100" w:type="dxa"/>
+              <w:right w:w="100" w:type="dxa"/>
+            </w:tcMar>
+            <w:hideMark/>
+          </w:tcPr>
+          <w:p>
+            <w:pPr>
+              <w:rPr>
+                <w:lang w:val="en-US"/>
+              </w:rPr>
+            </w:pPr>
             <w:r>
               <w:rPr>
                 <w:rFonts w:hint="eastAsia"/>
                 <w:lang w:val="en-US"/>
               </w:rPr>
-              <w:t>&gt;</w:t>
-            </w:r>
-            <w:r>
-              <w:rPr>
-                <w:lang w:val="en-US"/>
-              </w:rPr>
-              <w:t xml:space="preserve"> 0 </w:t>
-            </w:r>
-            <w:r>
-              <w:rPr>
-                <w:rFonts w:hint="eastAsia"/>
-                <w:lang w:val="en-US"/>
-              </w:rPr>
-              <w:t xml:space="preserve">and </w:t>
-            </w:r>
-            <w:proofErr w:type="spellStart"/>
-            <w:r>
-              <w:t>template_dict.terms_license.</w:t>
-            </w:r>
-            <w:r>
-              <w:t>termsOfAccess</w:t>
-            </w:r>
-            <w:proofErr w:type="spellEnd"/>
-            <w:r>
-              <w:t xml:space="preserve"> is not none</w:t>
-            </w:r>
-            <w:r>
-              <w:rPr>
-                <w:lang w:val="en-US"/>
-              </w:rPr>
-              <w:t xml:space="preserve"> %}</w:t>
-            </w:r>
-            <w:r>
-              <w:t>X{% endif %}</w:t>
-            </w:r>
-          </w:p>
-        </w:tc>
-        <w:tc>
-          <w:tcPr>
-            <w:tcW w:w="0" w:type="auto"/>
-            <w:tcBorders>
-              <w:top w:val="single" w:sz="8" w:space="0" w:color="000000"/>
-              <w:left w:val="single" w:sz="8" w:space="0" w:color="000000"/>
-              <w:bottom w:val="single" w:sz="8" w:space="0" w:color="000000"/>
-              <w:right w:val="single" w:sz="8" w:space="0" w:color="000000"/>
-            </w:tcBorders>
-            <w:tcMar>
-              <w:top w:w="100" w:type="dxa"/>
-              <w:left w:w="100" w:type="dxa"/>
-              <w:bottom w:w="100" w:type="dxa"/>
-              <w:right w:w="100" w:type="dxa"/>
-            </w:tcMar>
-            <w:hideMark/>
-          </w:tcPr>
-          <w:p>
-            <w:pPr>
-              <w:rPr>
-                <w:lang w:val="en-US"/>
-              </w:rPr>
-            </w:pPr>
-            <w:r>
-              <w:rPr>
-                <w:rFonts w:hint="eastAsia"/>
-                <w:lang w:val="en-US"/>
-              </w:rPr>
               <w:t xml:space="preserve">{% if </w:t>
             </w:r>
-            <w:proofErr w:type="spellStart"/>
-            <w:r>
-              <w:rPr>
-                <w:lang w:val="en-US"/>
-              </w:rPr>
-              <w:t>template_dict</w:t>
-            </w:r>
-            <w:proofErr w:type="spellEnd"/>
-            <w:r>
-              <w:rPr>
-                <w:lang w:val="en-US"/>
-              </w:rPr>
-              <w:t>.</w:t>
+            <w:r>
+              <w:rPr>
+                <w:lang w:val="en-US"/>
+              </w:rPr>
+              <w:t>template_dict.</w:t>
             </w:r>
             <w:r>
               <w:rPr>
@@ -9385,168 +8621,140 @@
               </w:rPr>
               <w:t xml:space="preserve"> </w:t>
             </w:r>
-            <w:proofErr w:type="spellStart"/>
             <w:r>
               <w:t>restricted_files</w:t>
             </w:r>
-            <w:proofErr w:type="spellEnd"/>
-            <w:r>
-              <w:rPr>
-                <w:lang w:val="en-US"/>
-              </w:rPr>
-              <w:t>.</w:t>
-            </w:r>
-            <w:proofErr w:type="spellStart"/>
-            <w:r>
-              <w:rPr>
-                <w:lang w:val="en-US"/>
-              </w:rPr>
-              <w:t>comments</w:t>
+            <w:r>
+              <w:rPr>
+                <w:lang w:val="en-US"/>
+              </w:rPr>
+              <w:t>.comments</w:t>
             </w:r>
             <w:r>
               <w:rPr>
                 <w:rFonts w:hint="eastAsia"/>
                 <w:lang w:val="en-US"/>
               </w:rPr>
-              <w:t>|length</w:t>
-            </w:r>
-            <w:proofErr w:type="spellEnd"/>
+              <w:t>|length &gt;</w:t>
+            </w:r>
+            <w:r>
+              <w:rPr>
+                <w:lang w:val="en-US"/>
+              </w:rPr>
+              <w:t xml:space="preserve"> 0 </w:t>
+            </w:r>
             <w:r>
               <w:rPr>
                 <w:rFonts w:hint="eastAsia"/>
                 <w:lang w:val="en-US"/>
               </w:rPr>
-              <w:t xml:space="preserve"> &gt;</w:t>
-            </w:r>
-            <w:r>
-              <w:rPr>
-                <w:lang w:val="en-US"/>
-              </w:rPr>
-              <w:t xml:space="preserve"> 0 </w:t>
-            </w:r>
+              <w:t xml:space="preserve">and </w:t>
+            </w:r>
+            <w:r>
+              <w:t>template_dict.terms_license.</w:t>
+            </w:r>
+            <w:r>
+              <w:t>termsOfAccess</w:t>
+            </w:r>
+            <w:r>
+              <w:t xml:space="preserve"> is none</w:t>
+            </w:r>
+            <w:r>
+              <w:rPr>
+                <w:lang w:val="en-US"/>
+              </w:rPr>
+              <w:t xml:space="preserve"> %}</w:t>
+            </w:r>
+            <w:r>
+              <w:t>X{% endif %}</w:t>
+            </w:r>
+          </w:p>
+        </w:tc>
+        <w:tc>
+          <w:tcPr>
+            <w:tcW w:w="0" w:type="auto"/>
+            <w:tcBorders>
+              <w:top w:val="single" w:sz="8" w:space="0" w:color="000000"/>
+              <w:left w:val="single" w:sz="8" w:space="0" w:color="000000"/>
+              <w:bottom w:val="single" w:sz="8" w:space="0" w:color="000000"/>
+              <w:right w:val="single" w:sz="8" w:space="0" w:color="000000"/>
+            </w:tcBorders>
+            <w:tcMar>
+              <w:top w:w="100" w:type="dxa"/>
+              <w:left w:w="100" w:type="dxa"/>
+              <w:bottom w:w="100" w:type="dxa"/>
+              <w:right w:w="100" w:type="dxa"/>
+            </w:tcMar>
+            <w:hideMark/>
+          </w:tcPr>
+          <w:p>
+            <w:pPr>
+              <w:rPr>
+                <w:lang w:val="en-US"/>
+              </w:rPr>
+            </w:pPr>
+          </w:p>
+        </w:tc>
+        <w:tc>
+          <w:tcPr>
+            <w:tcW w:w="0" w:type="auto"/>
+            <w:tcBorders>
+              <w:top w:val="single" w:sz="8" w:space="0" w:color="000000"/>
+              <w:left w:val="single" w:sz="8" w:space="0" w:color="000000"/>
+              <w:bottom w:val="single" w:sz="8" w:space="0" w:color="000000"/>
+              <w:right w:val="single" w:sz="8" w:space="0" w:color="000000"/>
+            </w:tcBorders>
+            <w:tcMar>
+              <w:top w:w="100" w:type="dxa"/>
+              <w:left w:w="100" w:type="dxa"/>
+              <w:bottom w:w="100" w:type="dxa"/>
+              <w:right w:w="100" w:type="dxa"/>
+            </w:tcMar>
+            <w:hideMark/>
+          </w:tcPr>
+          <w:p>
+            <w:pPr>
+              <w:rPr>
+                <w:lang w:val="en-US"/>
+              </w:rPr>
+            </w:pPr>
+          </w:p>
+        </w:tc>
+        <w:tc>
+          <w:tcPr>
+            <w:tcW w:w="0" w:type="auto"/>
+            <w:tcBorders>
+              <w:top w:val="single" w:sz="8" w:space="0" w:color="000000"/>
+              <w:left w:val="single" w:sz="8" w:space="0" w:color="000000"/>
+              <w:bottom w:val="single" w:sz="8" w:space="0" w:color="000000"/>
+              <w:right w:val="single" w:sz="8" w:space="0" w:color="000000"/>
+            </w:tcBorders>
+            <w:tcMar>
+              <w:top w:w="100" w:type="dxa"/>
+              <w:left w:w="100" w:type="dxa"/>
+              <w:bottom w:w="100" w:type="dxa"/>
+              <w:right w:w="100" w:type="dxa"/>
+            </w:tcMar>
+            <w:hideMark/>
+          </w:tcPr>
+          <w:p>
+            <w:pPr>
+              <w:rPr>
+                <w:lang w:val="en-US"/>
+              </w:rPr>
+            </w:pPr>
             <w:r>
               <w:rPr>
                 <w:rFonts w:hint="eastAsia"/>
                 <w:lang w:val="en-US"/>
               </w:rPr>
-              <w:t xml:space="preserve">and </w:t>
-            </w:r>
-            <w:proofErr w:type="spellStart"/>
-            <w:r>
-              <w:t>template_dict.terms_license.</w:t>
-            </w:r>
-            <w:r>
-              <w:t>termsOfAccess</w:t>
-            </w:r>
-            <w:proofErr w:type="spellEnd"/>
-            <w:r>
-              <w:t xml:space="preserve"> is none</w:t>
-            </w:r>
-            <w:r>
-              <w:rPr>
-                <w:lang w:val="en-US"/>
-              </w:rPr>
-              <w:t xml:space="preserve"> %}</w:t>
-            </w:r>
-            <w:r>
-              <w:t>X{% endif %}</w:t>
-            </w:r>
-          </w:p>
-        </w:tc>
-        <w:tc>
-          <w:tcPr>
-            <w:tcW w:w="0" w:type="auto"/>
-            <w:tcBorders>
-              <w:top w:val="single" w:sz="8" w:space="0" w:color="000000"/>
-              <w:left w:val="single" w:sz="8" w:space="0" w:color="000000"/>
-              <w:bottom w:val="single" w:sz="8" w:space="0" w:color="000000"/>
-              <w:right w:val="single" w:sz="8" w:space="0" w:color="000000"/>
-            </w:tcBorders>
-            <w:tcMar>
-              <w:top w:w="100" w:type="dxa"/>
-              <w:left w:w="100" w:type="dxa"/>
-              <w:bottom w:w="100" w:type="dxa"/>
-              <w:right w:w="100" w:type="dxa"/>
-            </w:tcMar>
-            <w:hideMark/>
-          </w:tcPr>
-          <w:p>
-            <w:pPr>
-              <w:rPr>
-                <w:lang w:val="en-US"/>
-              </w:rPr>
-            </w:pPr>
-          </w:p>
-        </w:tc>
-        <w:tc>
-          <w:tcPr>
-            <w:tcW w:w="0" w:type="auto"/>
-            <w:tcBorders>
-              <w:top w:val="single" w:sz="8" w:space="0" w:color="000000"/>
-              <w:left w:val="single" w:sz="8" w:space="0" w:color="000000"/>
-              <w:bottom w:val="single" w:sz="8" w:space="0" w:color="000000"/>
-              <w:right w:val="single" w:sz="8" w:space="0" w:color="000000"/>
-            </w:tcBorders>
-            <w:tcMar>
-              <w:top w:w="100" w:type="dxa"/>
-              <w:left w:w="100" w:type="dxa"/>
-              <w:bottom w:w="100" w:type="dxa"/>
-              <w:right w:w="100" w:type="dxa"/>
-            </w:tcMar>
-            <w:hideMark/>
-          </w:tcPr>
-          <w:p>
-            <w:pPr>
-              <w:rPr>
-                <w:lang w:val="en-US"/>
-              </w:rPr>
-            </w:pPr>
-          </w:p>
-        </w:tc>
-        <w:tc>
-          <w:tcPr>
-            <w:tcW w:w="0" w:type="auto"/>
-            <w:tcBorders>
-              <w:top w:val="single" w:sz="8" w:space="0" w:color="000000"/>
-              <w:left w:val="single" w:sz="8" w:space="0" w:color="000000"/>
-              <w:bottom w:val="single" w:sz="8" w:space="0" w:color="000000"/>
-              <w:right w:val="single" w:sz="8" w:space="0" w:color="000000"/>
-            </w:tcBorders>
-            <w:tcMar>
-              <w:top w:w="100" w:type="dxa"/>
-              <w:left w:w="100" w:type="dxa"/>
-              <w:bottom w:w="100" w:type="dxa"/>
-              <w:right w:w="100" w:type="dxa"/>
-            </w:tcMar>
-            <w:hideMark/>
-          </w:tcPr>
-          <w:p>
-            <w:pPr>
-              <w:rPr>
-                <w:rFonts w:hint="eastAsia"/>
-                <w:lang w:val="en-US"/>
-              </w:rPr>
-            </w:pPr>
-            <w:r>
-              <w:rPr>
-                <w:rFonts w:hint="eastAsia"/>
-                <w:lang w:val="en-US"/>
-              </w:rPr>
               <w:t xml:space="preserve">{% if </w:t>
             </w:r>
-            <w:proofErr w:type="spellStart"/>
-            <w:r>
-              <w:rPr>
-                <w:lang w:val="en-US"/>
-              </w:rPr>
-              <w:t>template_dict</w:t>
-            </w:r>
-            <w:proofErr w:type="spellEnd"/>
-            <w:r>
-              <w:rPr>
-                <w:lang w:val="en-US"/>
-              </w:rPr>
-              <w:t>.</w:t>
+            <w:r>
+              <w:rPr>
+                <w:lang w:val="en-US"/>
+              </w:rPr>
+              <w:t>template_dict.</w:t>
             </w:r>
             <w:r>
               <w:rPr>
@@ -9559,45 +8767,21 @@
               </w:rPr>
               <w:t xml:space="preserve"> </w:t>
             </w:r>
-            <w:proofErr w:type="spellStart"/>
             <w:r>
               <w:t>restricted_files</w:t>
             </w:r>
-            <w:proofErr w:type="spellEnd"/>
-            <w:r>
-              <w:rPr>
-                <w:lang w:val="en-US"/>
-              </w:rPr>
-              <w:t>.</w:t>
-            </w:r>
-            <w:proofErr w:type="spellStart"/>
-            <w:r>
-              <w:rPr>
-                <w:lang w:val="en-US"/>
-              </w:rPr>
-              <w:t>comments</w:t>
+            <w:r>
+              <w:rPr>
+                <w:lang w:val="en-US"/>
+              </w:rPr>
+              <w:t>.comments</w:t>
             </w:r>
             <w:r>
               <w:rPr>
                 <w:rFonts w:hint="eastAsia"/>
                 <w:lang w:val="en-US"/>
               </w:rPr>
-              <w:t>|length</w:t>
-            </w:r>
-            <w:proofErr w:type="spellEnd"/>
-            <w:r>
-              <w:rPr>
-                <w:rFonts w:hint="eastAsia"/>
-                <w:lang w:val="en-US"/>
-              </w:rPr>
-              <w:t xml:space="preserve"> </w:t>
-            </w:r>
-            <w:r>
-              <w:rPr>
-                <w:rFonts w:hint="eastAsia"/>
-                <w:lang w:val="en-US"/>
-              </w:rPr>
-              <w:t>==</w:t>
+              <w:t>|length ==</w:t>
             </w:r>
             <w:r>
               <w:rPr>
@@ -9672,27 +8856,17 @@
                     </w:rPr>
                   </w:pPr>
                   <w:r>
-                    <w:t xml:space="preserve">{% if </w:t>
-                  </w:r>
-                  <w:proofErr w:type="spellStart"/>
-                  <w:r>
-                    <w:t>template_dict.terms_license.</w:t>
+                    <w:t>{% if template_dict.terms_license.</w:t>
                   </w:r>
                   <w:r>
                     <w:t>termsOfAccess</w:t>
                   </w:r>
-                  <w:proofErr w:type="spellEnd"/>
                   <w:r>
-                    <w:t xml:space="preserve"> is not none %}{{ </w:t>
-                  </w:r>
-                  <w:proofErr w:type="spellStart"/>
-                  <w:r>
-                    <w:t>template_dict.terms_license.</w:t>
+                    <w:t xml:space="preserve"> is not none %}{{ template_dict.terms_license.</w:t>
                   </w:r>
                   <w:r>
                     <w:t>termsOfAccess</w:t>
                   </w:r>
-                  <w:proofErr w:type="spellEnd"/>
                   <w:r>
                     <w:t xml:space="preserve"> }}{% else %}(NONE){% endif %}</w:t>
                   </w:r>
@@ -9939,6 +9113,95 @@
     </w:lvl>
   </w:abstractNum>
   <w:abstractNum w:abstractNumId="1" w15:restartNumberingAfterBreak="0">
+    <w:nsid w:val="06EE142D"/>
+    <w:multiLevelType w:val="hybridMultilevel"/>
+    <w:tmpl w:val="E7929300"/>
+    <w:lvl w:ilvl="0" w:tplc="0409000F">
+      <w:start w:val="1"/>
+      <w:numFmt w:val="decimal"/>
+      <w:lvlText w:val="%1."/>
+      <w:lvlJc w:val="left"/>
+      <w:pPr>
+        <w:ind w:left="720" w:hanging="360"/>
+      </w:pPr>
+      <w:rPr>
+        <w:rFonts w:hint="default"/>
+      </w:rPr>
+    </w:lvl>
+    <w:lvl w:ilvl="1" w:tplc="04090019" w:tentative="1">
+      <w:start w:val="1"/>
+      <w:numFmt w:val="lowerLetter"/>
+      <w:lvlText w:val="%2."/>
+      <w:lvlJc w:val="left"/>
+      <w:pPr>
+        <w:ind w:left="1440" w:hanging="360"/>
+      </w:pPr>
+    </w:lvl>
+    <w:lvl w:ilvl="2" w:tplc="0409001B" w:tentative="1">
+      <w:start w:val="1"/>
+      <w:numFmt w:val="lowerRoman"/>
+      <w:lvlText w:val="%3."/>
+      <w:lvlJc w:val="right"/>
+      <w:pPr>
+        <w:ind w:left="2160" w:hanging="180"/>
+      </w:pPr>
+    </w:lvl>
+    <w:lvl w:ilvl="3" w:tplc="0409000F" w:tentative="1">
+      <w:start w:val="1"/>
+      <w:numFmt w:val="decimal"/>
+      <w:lvlText w:val="%4."/>
+      <w:lvlJc w:val="left"/>
+      <w:pPr>
+        <w:ind w:left="2880" w:hanging="360"/>
+      </w:pPr>
+    </w:lvl>
+    <w:lvl w:ilvl="4" w:tplc="04090019" w:tentative="1">
+      <w:start w:val="1"/>
+      <w:numFmt w:val="lowerLetter"/>
+      <w:lvlText w:val="%5."/>
+      <w:lvlJc w:val="left"/>
+      <w:pPr>
+        <w:ind w:left="3600" w:hanging="360"/>
+      </w:pPr>
+    </w:lvl>
+    <w:lvl w:ilvl="5" w:tplc="0409001B" w:tentative="1">
+      <w:start w:val="1"/>
+      <w:numFmt w:val="lowerRoman"/>
+      <w:lvlText w:val="%6."/>
+      <w:lvlJc w:val="right"/>
+      <w:pPr>
+        <w:ind w:left="4320" w:hanging="180"/>
+      </w:pPr>
+    </w:lvl>
+    <w:lvl w:ilvl="6" w:tplc="0409000F" w:tentative="1">
+      <w:start w:val="1"/>
+      <w:numFmt w:val="decimal"/>
+      <w:lvlText w:val="%7."/>
+      <w:lvlJc w:val="left"/>
+      <w:pPr>
+        <w:ind w:left="5040" w:hanging="360"/>
+      </w:pPr>
+    </w:lvl>
+    <w:lvl w:ilvl="7" w:tplc="04090019" w:tentative="1">
+      <w:start w:val="1"/>
+      <w:numFmt w:val="lowerLetter"/>
+      <w:lvlText w:val="%8."/>
+      <w:lvlJc w:val="left"/>
+      <w:pPr>
+        <w:ind w:left="5760" w:hanging="360"/>
+      </w:pPr>
+    </w:lvl>
+    <w:lvl w:ilvl="8" w:tplc="0409001B" w:tentative="1">
+      <w:start w:val="1"/>
+      <w:numFmt w:val="lowerRoman"/>
+      <w:lvlText w:val="%9."/>
+      <w:lvlJc w:val="right"/>
+      <w:pPr>
+        <w:ind w:left="6480" w:hanging="180"/>
+      </w:pPr>
+    </w:lvl>
+  </w:abstractNum>
+  <w:abstractNum w:abstractNumId="2" w15:restartNumberingAfterBreak="0">
     <w:nsid w:val="077418B8"/>
     <w:multiLevelType w:val="hybridMultilevel"/>
     <w:tmpl w:val="36443B76"/>
@@ -10027,7 +9290,7 @@
       </w:pPr>
     </w:lvl>
   </w:abstractNum>
-  <w:abstractNum w:abstractNumId="2" w15:restartNumberingAfterBreak="0">
+  <w:abstractNum w:abstractNumId="3" w15:restartNumberingAfterBreak="0">
     <w:nsid w:val="0C873FE0"/>
     <w:multiLevelType w:val="multilevel"/>
     <w:tmpl w:val="D7C8CDC0"/>
@@ -10172,7 +9435,7 @@
       </w:rPr>
     </w:lvl>
   </w:abstractNum>
-  <w:abstractNum w:abstractNumId="3" w15:restartNumberingAfterBreak="0">
+  <w:abstractNum w:abstractNumId="4" w15:restartNumberingAfterBreak="0">
     <w:nsid w:val="0D0F3C3D"/>
     <w:multiLevelType w:val="multilevel"/>
     <w:tmpl w:val="3D820090"/>
@@ -10285,7 +9548,7 @@
       </w:pPr>
     </w:lvl>
   </w:abstractNum>
-  <w:abstractNum w:abstractNumId="4" w15:restartNumberingAfterBreak="0">
+  <w:abstractNum w:abstractNumId="5" w15:restartNumberingAfterBreak="0">
     <w:nsid w:val="0F0200C6"/>
     <w:multiLevelType w:val="multilevel"/>
     <w:tmpl w:val="B4EA1CA8"/>
@@ -10398,7 +9661,7 @@
       </w:pPr>
     </w:lvl>
   </w:abstractNum>
-  <w:abstractNum w:abstractNumId="5" w15:restartNumberingAfterBreak="0">
+  <w:abstractNum w:abstractNumId="6" w15:restartNumberingAfterBreak="0">
     <w:nsid w:val="10735190"/>
     <w:multiLevelType w:val="hybridMultilevel"/>
     <w:tmpl w:val="D42AF0FA"/>
@@ -10487,7 +9750,7 @@
       </w:pPr>
     </w:lvl>
   </w:abstractNum>
-  <w:abstractNum w:abstractNumId="6" w15:restartNumberingAfterBreak="0">
+  <w:abstractNum w:abstractNumId="7" w15:restartNumberingAfterBreak="0">
     <w:nsid w:val="10D74393"/>
     <w:multiLevelType w:val="hybridMultilevel"/>
     <w:tmpl w:val="646E37D8"/>
@@ -10573,7 +9836,7 @@
       </w:pPr>
     </w:lvl>
   </w:abstractNum>
-  <w:abstractNum w:abstractNumId="7" w15:restartNumberingAfterBreak="0">
+  <w:abstractNum w:abstractNumId="8" w15:restartNumberingAfterBreak="0">
     <w:nsid w:val="11A52C9B"/>
     <w:multiLevelType w:val="multilevel"/>
     <w:tmpl w:val="D0944634"/>
@@ -10722,7 +9985,96 @@
       </w:rPr>
     </w:lvl>
   </w:abstractNum>
-  <w:abstractNum w:abstractNumId="8" w15:restartNumberingAfterBreak="0">
+  <w:abstractNum w:abstractNumId="9" w15:restartNumberingAfterBreak="0">
+    <w:nsid w:val="12A444A9"/>
+    <w:multiLevelType w:val="hybridMultilevel"/>
+    <w:tmpl w:val="0D9C62AE"/>
+    <w:lvl w:ilvl="0" w:tplc="FFFFFFFF">
+      <w:start w:val="1"/>
+      <w:numFmt w:val="decimal"/>
+      <w:lvlText w:val="%1."/>
+      <w:lvlJc w:val="left"/>
+      <w:pPr>
+        <w:ind w:left="720" w:hanging="360"/>
+      </w:pPr>
+      <w:rPr>
+        <w:rFonts w:hint="default"/>
+      </w:rPr>
+    </w:lvl>
+    <w:lvl w:ilvl="1" w:tplc="FFFFFFFF" w:tentative="1">
+      <w:start w:val="1"/>
+      <w:numFmt w:val="lowerLetter"/>
+      <w:lvlText w:val="%2."/>
+      <w:lvlJc w:val="left"/>
+      <w:pPr>
+        <w:ind w:left="1440" w:hanging="360"/>
+      </w:pPr>
+    </w:lvl>
+    <w:lvl w:ilvl="2" w:tplc="FFFFFFFF" w:tentative="1">
+      <w:start w:val="1"/>
+      <w:numFmt w:val="lowerRoman"/>
+      <w:lvlText w:val="%3."/>
+      <w:lvlJc w:val="right"/>
+      <w:pPr>
+        <w:ind w:left="2160" w:hanging="180"/>
+      </w:pPr>
+    </w:lvl>
+    <w:lvl w:ilvl="3" w:tplc="FFFFFFFF" w:tentative="1">
+      <w:start w:val="1"/>
+      <w:numFmt w:val="decimal"/>
+      <w:lvlText w:val="%4."/>
+      <w:lvlJc w:val="left"/>
+      <w:pPr>
+        <w:ind w:left="2880" w:hanging="360"/>
+      </w:pPr>
+    </w:lvl>
+    <w:lvl w:ilvl="4" w:tplc="FFFFFFFF" w:tentative="1">
+      <w:start w:val="1"/>
+      <w:numFmt w:val="lowerLetter"/>
+      <w:lvlText w:val="%5."/>
+      <w:lvlJc w:val="left"/>
+      <w:pPr>
+        <w:ind w:left="3600" w:hanging="360"/>
+      </w:pPr>
+    </w:lvl>
+    <w:lvl w:ilvl="5" w:tplc="FFFFFFFF" w:tentative="1">
+      <w:start w:val="1"/>
+      <w:numFmt w:val="lowerRoman"/>
+      <w:lvlText w:val="%6."/>
+      <w:lvlJc w:val="right"/>
+      <w:pPr>
+        <w:ind w:left="4320" w:hanging="180"/>
+      </w:pPr>
+    </w:lvl>
+    <w:lvl w:ilvl="6" w:tplc="FFFFFFFF" w:tentative="1">
+      <w:start w:val="1"/>
+      <w:numFmt w:val="decimal"/>
+      <w:lvlText w:val="%7."/>
+      <w:lvlJc w:val="left"/>
+      <w:pPr>
+        <w:ind w:left="5040" w:hanging="360"/>
+      </w:pPr>
+    </w:lvl>
+    <w:lvl w:ilvl="7" w:tplc="FFFFFFFF" w:tentative="1">
+      <w:start w:val="1"/>
+      <w:numFmt w:val="lowerLetter"/>
+      <w:lvlText w:val="%8."/>
+      <w:lvlJc w:val="left"/>
+      <w:pPr>
+        <w:ind w:left="5760" w:hanging="360"/>
+      </w:pPr>
+    </w:lvl>
+    <w:lvl w:ilvl="8" w:tplc="FFFFFFFF" w:tentative="1">
+      <w:start w:val="1"/>
+      <w:numFmt w:val="lowerRoman"/>
+      <w:lvlText w:val="%9."/>
+      <w:lvlJc w:val="right"/>
+      <w:pPr>
+        <w:ind w:left="6480" w:hanging="180"/>
+      </w:pPr>
+    </w:lvl>
+  </w:abstractNum>
+  <w:abstractNum w:abstractNumId="10" w15:restartNumberingAfterBreak="0">
     <w:nsid w:val="178D3689"/>
     <w:multiLevelType w:val="multilevel"/>
     <w:tmpl w:val="C29A1B32"/>
@@ -10835,7 +10187,7 @@
       </w:pPr>
     </w:lvl>
   </w:abstractNum>
-  <w:abstractNum w:abstractNumId="9" w15:restartNumberingAfterBreak="0">
+  <w:abstractNum w:abstractNumId="11" w15:restartNumberingAfterBreak="0">
     <w:nsid w:val="1A6C6797"/>
     <w:multiLevelType w:val="multilevel"/>
     <w:tmpl w:val="A964D450"/>
@@ -10948,7 +10300,7 @@
       </w:pPr>
     </w:lvl>
   </w:abstractNum>
-  <w:abstractNum w:abstractNumId="10" w15:restartNumberingAfterBreak="0">
+  <w:abstractNum w:abstractNumId="12" w15:restartNumberingAfterBreak="0">
     <w:nsid w:val="1ACD68EC"/>
     <w:multiLevelType w:val="multilevel"/>
     <w:tmpl w:val="EAB6E042"/>
@@ -11097,7 +10449,7 @@
       </w:rPr>
     </w:lvl>
   </w:abstractNum>
-  <w:abstractNum w:abstractNumId="11" w15:restartNumberingAfterBreak="0">
+  <w:abstractNum w:abstractNumId="13" w15:restartNumberingAfterBreak="0">
     <w:nsid w:val="24B73AAA"/>
     <w:multiLevelType w:val="hybridMultilevel"/>
     <w:tmpl w:val="4C4C890E"/>
@@ -11186,7 +10538,7 @@
       </w:pPr>
     </w:lvl>
   </w:abstractNum>
-  <w:abstractNum w:abstractNumId="12" w15:restartNumberingAfterBreak="0">
+  <w:abstractNum w:abstractNumId="14" w15:restartNumberingAfterBreak="0">
     <w:nsid w:val="32790B27"/>
     <w:multiLevelType w:val="multilevel"/>
     <w:tmpl w:val="237CAD18"/>
@@ -11335,7 +10687,7 @@
       </w:rPr>
     </w:lvl>
   </w:abstractNum>
-  <w:abstractNum w:abstractNumId="13" w15:restartNumberingAfterBreak="0">
+  <w:abstractNum w:abstractNumId="15" w15:restartNumberingAfterBreak="0">
     <w:nsid w:val="371428FE"/>
     <w:multiLevelType w:val="multilevel"/>
     <w:tmpl w:val="B83EAA3E"/>
@@ -11448,7 +10800,7 @@
       </w:pPr>
     </w:lvl>
   </w:abstractNum>
-  <w:abstractNum w:abstractNumId="14" w15:restartNumberingAfterBreak="0">
+  <w:abstractNum w:abstractNumId="16" w15:restartNumberingAfterBreak="0">
     <w:nsid w:val="3AF51956"/>
     <w:multiLevelType w:val="multilevel"/>
     <w:tmpl w:val="71B816E4"/>
@@ -11561,7 +10913,7 @@
       </w:pPr>
     </w:lvl>
   </w:abstractNum>
-  <w:abstractNum w:abstractNumId="15" w15:restartNumberingAfterBreak="0">
+  <w:abstractNum w:abstractNumId="17" w15:restartNumberingAfterBreak="0">
     <w:nsid w:val="472F23DD"/>
     <w:multiLevelType w:val="hybridMultilevel"/>
     <w:tmpl w:val="03DEC164"/>
@@ -11674,7 +11026,7 @@
       </w:rPr>
     </w:lvl>
   </w:abstractNum>
-  <w:abstractNum w:abstractNumId="16" w15:restartNumberingAfterBreak="0">
+  <w:abstractNum w:abstractNumId="18" w15:restartNumberingAfterBreak="0">
     <w:nsid w:val="48F76F1E"/>
     <w:multiLevelType w:val="hybridMultilevel"/>
     <w:tmpl w:val="03DEC164"/>
@@ -11787,7 +11139,7 @@
       </w:rPr>
     </w:lvl>
   </w:abstractNum>
-  <w:abstractNum w:abstractNumId="17" w15:restartNumberingAfterBreak="0">
+  <w:abstractNum w:abstractNumId="19" w15:restartNumberingAfterBreak="0">
     <w:nsid w:val="4F996F26"/>
     <w:multiLevelType w:val="multilevel"/>
     <w:tmpl w:val="C00C3956"/>
@@ -11936,7 +11288,7 @@
       </w:rPr>
     </w:lvl>
   </w:abstractNum>
-  <w:abstractNum w:abstractNumId="18" w15:restartNumberingAfterBreak="0">
+  <w:abstractNum w:abstractNumId="20" w15:restartNumberingAfterBreak="0">
     <w:nsid w:val="561074E4"/>
     <w:multiLevelType w:val="hybridMultilevel"/>
     <w:tmpl w:val="4C4C890E"/>
@@ -12025,7 +11377,7 @@
       </w:pPr>
     </w:lvl>
   </w:abstractNum>
-  <w:abstractNum w:abstractNumId="19" w15:restartNumberingAfterBreak="0">
+  <w:abstractNum w:abstractNumId="21" w15:restartNumberingAfterBreak="0">
     <w:nsid w:val="572A226F"/>
     <w:multiLevelType w:val="multilevel"/>
     <w:tmpl w:val="81FC1D9E"/>
@@ -12138,7 +11490,7 @@
       </w:pPr>
     </w:lvl>
   </w:abstractNum>
-  <w:abstractNum w:abstractNumId="20" w15:restartNumberingAfterBreak="0">
+  <w:abstractNum w:abstractNumId="22" w15:restartNumberingAfterBreak="0">
     <w:nsid w:val="5BF5117B"/>
     <w:multiLevelType w:val="multilevel"/>
     <w:tmpl w:val="8A1481F6"/>
@@ -12251,7 +11603,7 @@
       </w:pPr>
     </w:lvl>
   </w:abstractNum>
-  <w:abstractNum w:abstractNumId="21" w15:restartNumberingAfterBreak="0">
+  <w:abstractNum w:abstractNumId="23" w15:restartNumberingAfterBreak="0">
     <w:nsid w:val="5D3E6FA0"/>
     <w:multiLevelType w:val="multilevel"/>
     <w:tmpl w:val="1DD496E8"/>
@@ -12364,7 +11716,7 @@
       </w:pPr>
     </w:lvl>
   </w:abstractNum>
-  <w:abstractNum w:abstractNumId="22" w15:restartNumberingAfterBreak="0">
+  <w:abstractNum w:abstractNumId="24" w15:restartNumberingAfterBreak="0">
     <w:nsid w:val="5F935511"/>
     <w:multiLevelType w:val="multilevel"/>
     <w:tmpl w:val="44AE5600"/>
@@ -12477,7 +11829,7 @@
       </w:pPr>
     </w:lvl>
   </w:abstractNum>
-  <w:abstractNum w:abstractNumId="23" w15:restartNumberingAfterBreak="0">
+  <w:abstractNum w:abstractNumId="25" w15:restartNumberingAfterBreak="0">
     <w:nsid w:val="62330FFA"/>
     <w:multiLevelType w:val="multilevel"/>
     <w:tmpl w:val="1354050A"/>
@@ -12590,7 +11942,7 @@
       </w:pPr>
     </w:lvl>
   </w:abstractNum>
-  <w:abstractNum w:abstractNumId="24" w15:restartNumberingAfterBreak="0">
+  <w:abstractNum w:abstractNumId="26" w15:restartNumberingAfterBreak="0">
     <w:nsid w:val="653571BB"/>
     <w:multiLevelType w:val="multilevel"/>
     <w:tmpl w:val="E0F0DCF4"/>
@@ -12703,7 +12055,7 @@
       </w:pPr>
     </w:lvl>
   </w:abstractNum>
-  <w:abstractNum w:abstractNumId="25" w15:restartNumberingAfterBreak="0">
+  <w:abstractNum w:abstractNumId="27" w15:restartNumberingAfterBreak="0">
     <w:nsid w:val="69731E7F"/>
     <w:multiLevelType w:val="multilevel"/>
     <w:tmpl w:val="4FEA352E"/>
@@ -12852,10 +12204,10 @@
       </w:rPr>
     </w:lvl>
   </w:abstractNum>
-  <w:abstractNum w:abstractNumId="26" w15:restartNumberingAfterBreak="0">
+  <w:abstractNum w:abstractNumId="28" w15:restartNumberingAfterBreak="0">
     <w:nsid w:val="6DE2596E"/>
     <w:multiLevelType w:val="hybridMultilevel"/>
-    <w:tmpl w:val="4C4C890E"/>
+    <w:tmpl w:val="0D9C62AE"/>
     <w:lvl w:ilvl="0" w:tplc="0409000F">
       <w:start w:val="1"/>
       <w:numFmt w:val="decimal"/>
@@ -12941,7 +12293,7 @@
       </w:pPr>
     </w:lvl>
   </w:abstractNum>
-  <w:abstractNum w:abstractNumId="27" w15:restartNumberingAfterBreak="0">
+  <w:abstractNum w:abstractNumId="29" w15:restartNumberingAfterBreak="0">
     <w:nsid w:val="75520C24"/>
     <w:multiLevelType w:val="hybridMultilevel"/>
     <w:tmpl w:val="FCCE1BF6"/>
@@ -13030,7 +12382,7 @@
       </w:pPr>
     </w:lvl>
   </w:abstractNum>
-  <w:abstractNum w:abstractNumId="28" w15:restartNumberingAfterBreak="0">
+  <w:abstractNum w:abstractNumId="30" w15:restartNumberingAfterBreak="0">
     <w:nsid w:val="76FC0259"/>
     <w:multiLevelType w:val="multilevel"/>
     <w:tmpl w:val="79680AA4"/>
@@ -13143,7 +12495,7 @@
       </w:pPr>
     </w:lvl>
   </w:abstractNum>
-  <w:abstractNum w:abstractNumId="29" w15:restartNumberingAfterBreak="0">
+  <w:abstractNum w:abstractNumId="31" w15:restartNumberingAfterBreak="0">
     <w:nsid w:val="77A70C23"/>
     <w:multiLevelType w:val="multilevel"/>
     <w:tmpl w:val="8E221C46"/>
@@ -13260,91 +12612,97 @@
     <w:abstractNumId w:val="0"/>
   </w:num>
   <w:num w:numId="2" w16cid:durableId="1361010676">
+    <w:abstractNumId w:val="8"/>
+  </w:num>
+  <w:num w:numId="3" w16cid:durableId="1561554637">
+    <w:abstractNumId w:val="21"/>
+  </w:num>
+  <w:num w:numId="4" w16cid:durableId="1987002333">
+    <w:abstractNumId w:val="31"/>
+  </w:num>
+  <w:num w:numId="5" w16cid:durableId="1029794338">
+    <w:abstractNumId w:val="15"/>
+  </w:num>
+  <w:num w:numId="6" w16cid:durableId="1650086756">
+    <w:abstractNumId w:val="23"/>
+  </w:num>
+  <w:num w:numId="7" w16cid:durableId="1476222975">
+    <w:abstractNumId w:val="30"/>
+  </w:num>
+  <w:num w:numId="8" w16cid:durableId="1533764241">
+    <w:abstractNumId w:val="3"/>
+  </w:num>
+  <w:num w:numId="9" w16cid:durableId="1439301835">
+    <w:abstractNumId w:val="5"/>
+  </w:num>
+  <w:num w:numId="10" w16cid:durableId="1801418588">
+    <w:abstractNumId w:val="4"/>
+  </w:num>
+  <w:num w:numId="11" w16cid:durableId="793057457">
+    <w:abstractNumId w:val="22"/>
+  </w:num>
+  <w:num w:numId="12" w16cid:durableId="2146773725">
+    <w:abstractNumId w:val="26"/>
+  </w:num>
+  <w:num w:numId="13" w16cid:durableId="1026561013">
+    <w:abstractNumId w:val="11"/>
+  </w:num>
+  <w:num w:numId="14" w16cid:durableId="1192110950">
+    <w:abstractNumId w:val="24"/>
+  </w:num>
+  <w:num w:numId="15" w16cid:durableId="1262841238">
+    <w:abstractNumId w:val="10"/>
+  </w:num>
+  <w:num w:numId="16" w16cid:durableId="155341019">
+    <w:abstractNumId w:val="19"/>
+  </w:num>
+  <w:num w:numId="17" w16cid:durableId="1040785662">
+    <w:abstractNumId w:val="16"/>
+  </w:num>
+  <w:num w:numId="18" w16cid:durableId="1409767320">
+    <w:abstractNumId w:val="27"/>
+  </w:num>
+  <w:num w:numId="19" w16cid:durableId="2045591211">
+    <w:abstractNumId w:val="12"/>
+  </w:num>
+  <w:num w:numId="20" w16cid:durableId="1764063768">
+    <w:abstractNumId w:val="25"/>
+  </w:num>
+  <w:num w:numId="21" w16cid:durableId="218832961">
+    <w:abstractNumId w:val="14"/>
+  </w:num>
+  <w:num w:numId="22" w16cid:durableId="2045669289">
+    <w:abstractNumId w:val="29"/>
+  </w:num>
+  <w:num w:numId="23" w16cid:durableId="953443745">
     <w:abstractNumId w:val="7"/>
   </w:num>
-  <w:num w:numId="3" w16cid:durableId="1561554637">
-    <w:abstractNumId w:val="19"/>
+  <w:num w:numId="24" w16cid:durableId="1489975285">
+    <w:abstractNumId w:val="6"/>
   </w:num>
-  <w:num w:numId="4" w16cid:durableId="1987002333">
-    <w:abstractNumId w:val="29"/>
+  <w:num w:numId="25" w16cid:durableId="2023780096">
+    <w:abstractNumId w:val="2"/>
   </w:num>
-  <w:num w:numId="5" w16cid:durableId="1029794338">
+  <w:num w:numId="26" w16cid:durableId="1365129283">
+    <w:abstractNumId w:val="28"/>
+  </w:num>
+  <w:num w:numId="27" w16cid:durableId="1202403600">
     <w:abstractNumId w:val="13"/>
   </w:num>
-  <w:num w:numId="6" w16cid:durableId="1650086756">
-    <w:abstractNumId w:val="21"/>
-  </w:num>
-  <w:num w:numId="7" w16cid:durableId="1476222975">
-    <w:abstractNumId w:val="28"/>
-  </w:num>
-  <w:num w:numId="8" w16cid:durableId="1533764241">
-    <w:abstractNumId w:val="2"/>
-  </w:num>
-  <w:num w:numId="9" w16cid:durableId="1439301835">
-    <w:abstractNumId w:val="4"/>
-  </w:num>
-  <w:num w:numId="10" w16cid:durableId="1801418588">
-    <w:abstractNumId w:val="3"/>
-  </w:num>
-  <w:num w:numId="11" w16cid:durableId="793057457">
+  <w:num w:numId="28" w16cid:durableId="282420373">
     <w:abstractNumId w:val="20"/>
   </w:num>
-  <w:num w:numId="12" w16cid:durableId="2146773725">
-    <w:abstractNumId w:val="24"/>
+  <w:num w:numId="29" w16cid:durableId="101195959">
+    <w:abstractNumId w:val="17"/>
   </w:num>
-  <w:num w:numId="13" w16cid:durableId="1026561013">
+  <w:num w:numId="30" w16cid:durableId="395199757">
+    <w:abstractNumId w:val="18"/>
+  </w:num>
+  <w:num w:numId="31" w16cid:durableId="1063218980">
     <w:abstractNumId w:val="9"/>
   </w:num>
-  <w:num w:numId="14" w16cid:durableId="1192110950">
-    <w:abstractNumId w:val="22"/>
-  </w:num>
-  <w:num w:numId="15" w16cid:durableId="1262841238">
-    <w:abstractNumId w:val="8"/>
-  </w:num>
-  <w:num w:numId="16" w16cid:durableId="155341019">
-    <w:abstractNumId w:val="17"/>
-  </w:num>
-  <w:num w:numId="17" w16cid:durableId="1040785662">
-    <w:abstractNumId w:val="14"/>
-  </w:num>
-  <w:num w:numId="18" w16cid:durableId="1409767320">
-    <w:abstractNumId w:val="25"/>
-  </w:num>
-  <w:num w:numId="19" w16cid:durableId="2045591211">
-    <w:abstractNumId w:val="10"/>
-  </w:num>
-  <w:num w:numId="20" w16cid:durableId="1764063768">
-    <w:abstractNumId w:val="23"/>
-  </w:num>
-  <w:num w:numId="21" w16cid:durableId="218832961">
-    <w:abstractNumId w:val="12"/>
-  </w:num>
-  <w:num w:numId="22" w16cid:durableId="2045669289">
-    <w:abstractNumId w:val="27"/>
-  </w:num>
-  <w:num w:numId="23" w16cid:durableId="953443745">
-    <w:abstractNumId w:val="6"/>
-  </w:num>
-  <w:num w:numId="24" w16cid:durableId="1489975285">
-    <w:abstractNumId w:val="5"/>
-  </w:num>
-  <w:num w:numId="25" w16cid:durableId="2023780096">
+  <w:num w:numId="32" w16cid:durableId="197356490">
     <w:abstractNumId w:val="1"/>
-  </w:num>
-  <w:num w:numId="26" w16cid:durableId="1365129283">
-    <w:abstractNumId w:val="26"/>
-  </w:num>
-  <w:num w:numId="27" w16cid:durableId="1202403600">
-    <w:abstractNumId w:val="11"/>
-  </w:num>
-  <w:num w:numId="28" w16cid:durableId="282420373">
-    <w:abstractNumId w:val="18"/>
-  </w:num>
-  <w:num w:numId="29" w16cid:durableId="101195959">
-    <w:abstractNumId w:val="15"/>
-  </w:num>
-  <w:num w:numId="30" w16cid:durableId="395199757">
-    <w:abstractNumId w:val="16"/>
   </w:num>
 </w:numbering>
 </file>
@@ -13749,7 +13107,7 @@
   <w:style w:type="paragraph" w:default="1" w:styleId="Normal">
     <w:name w:val="Normal"/>
     <w:qFormat/>
-    <w:rsid w:val="008953D9"/>
+    <w:rsid w:val="00F77164"/>
     <w:rPr>
       <w:lang w:val="en-CA"/>
     </w:rPr>

</xml_diff>